<commit_message>
feat: add some data into the task report
</commit_message>
<xml_diff>
--- a/backend/templates/task/CDOGS-TDR-TEMPLATE-v1.docx
+++ b/backend/templates/task/CDOGS-TDR-TEMPLATE-v1.docx
@@ -4,16 +4,422 @@
   <w:body>
     <w:p>
       <w:pPr>
+        <w:jc w:val="center"/>
         <w:rPr>
           <w:rFonts w:ascii="Comic Sans MS" w:hAnsi="Comic Sans MS"/>
+          <w:b/>
+          <w:bCs/>
+          <w:color w:val="EE0000"/>
         </w:rPr>
       </w:pPr>
       <w:r>
         <w:rPr>
           <w:rFonts w:ascii="Comic Sans MS" w:hAnsi="Comic Sans MS"/>
+          <w:b/>
+          <w:bCs/>
+          <w:color w:val="EE0000"/>
         </w:rPr>
-        <w:t>TASK DEFINITION REPORT</w:t>
+        <w:t>TASK DETAIL FORM (TDF)</w:t>
       </w:r>
+    </w:p>
+    <w:tbl>
+      <w:tblPr>
+        <w:tblStyle w:val="TableGrid"/>
+        <w:tblW w:w="0" w:type="auto"/>
+        <w:tblLook w:val="04A0" w:firstRow="1" w:lastRow="0" w:firstColumn="1" w:lastColumn="0" w:noHBand="0" w:noVBand="1"/>
+      </w:tblPr>
+      <w:tblGrid>
+        <w:gridCol w:w="2695"/>
+        <w:gridCol w:w="6655"/>
+      </w:tblGrid>
+      <w:tr>
+        <w:tc>
+          <w:tcPr>
+            <w:tcW w:w="2695" w:type="dxa"/>
+            <w:shd w:val="clear" w:color="auto" w:fill="00B050"/>
+          </w:tcPr>
+          <w:p>
+            <w:pPr>
+              <w:rPr>
+                <w:rFonts w:ascii="Comic Sans MS" w:hAnsi="Comic Sans MS"/>
+                <w:b/>
+                <w:bCs/>
+                <w:color w:val="000000" w:themeColor="text1"/>
+              </w:rPr>
+            </w:pPr>
+            <w:r>
+              <w:rPr>
+                <w:rFonts w:ascii="Comic Sans MS" w:hAnsi="Comic Sans MS"/>
+                <w:b/>
+                <w:bCs/>
+                <w:color w:val="000000" w:themeColor="text1"/>
+              </w:rPr>
+              <w:t>Investigation number</w:t>
+            </w:r>
+          </w:p>
+        </w:tc>
+        <w:tc>
+          <w:tcPr>
+            <w:tcW w:w="6655" w:type="dxa"/>
+            <w:shd w:val="clear" w:color="auto" w:fill="EE0000"/>
+          </w:tcPr>
+          <w:p>
+            <w:pPr>
+              <w:rPr>
+                <w:color w:val="000000" w:themeColor="text1"/>
+              </w:rPr>
+            </w:pPr>
+            <w:r>
+              <w:rPr>
+                <w:color w:val="000000" w:themeColor="text1"/>
+              </w:rPr>
+              <w:t>{d.investigationIdentifier}</w:t>
+            </w:r>
+          </w:p>
+        </w:tc>
+      </w:tr>
+      <w:tr>
+        <w:tc>
+          <w:tcPr>
+            <w:tcW w:w="2695" w:type="dxa"/>
+            <w:shd w:val="clear" w:color="auto" w:fill="00B050"/>
+          </w:tcPr>
+          <w:p>
+            <w:pPr>
+              <w:rPr>
+                <w:rFonts w:ascii="Comic Sans MS" w:hAnsi="Comic Sans MS"/>
+                <w:b/>
+                <w:bCs/>
+                <w:color w:val="000000" w:themeColor="text1"/>
+              </w:rPr>
+            </w:pPr>
+            <w:r>
+              <w:rPr>
+                <w:rFonts w:ascii="Comic Sans MS" w:hAnsi="Comic Sans MS"/>
+                <w:b/>
+                <w:bCs/>
+                <w:color w:val="000000" w:themeColor="text1"/>
+              </w:rPr>
+              <w:t>Task number</w:t>
+            </w:r>
+          </w:p>
+        </w:tc>
+        <w:tc>
+          <w:tcPr>
+            <w:tcW w:w="6655" w:type="dxa"/>
+            <w:shd w:val="clear" w:color="auto" w:fill="FFFF00"/>
+          </w:tcPr>
+          <w:p>
+            <w:pPr>
+              <w:rPr>
+                <w:color w:val="000000" w:themeColor="text1"/>
+              </w:rPr>
+            </w:pPr>
+            <w:r>
+              <w:rPr>
+                <w:color w:val="000000" w:themeColor="text1"/>
+              </w:rPr>
+              <w:t>{d.taskNumber}</w:t>
+            </w:r>
+          </w:p>
+        </w:tc>
+      </w:tr>
+      <w:tr>
+        <w:tc>
+          <w:tcPr>
+            <w:tcW w:w="2695" w:type="dxa"/>
+            <w:shd w:val="clear" w:color="auto" w:fill="00B050"/>
+          </w:tcPr>
+          <w:p>
+            <w:pPr>
+              <w:rPr>
+                <w:rFonts w:ascii="Comic Sans MS" w:hAnsi="Comic Sans MS"/>
+                <w:b/>
+                <w:bCs/>
+                <w:color w:val="000000" w:themeColor="text1"/>
+              </w:rPr>
+            </w:pPr>
+            <w:r>
+              <w:rPr>
+                <w:rFonts w:ascii="Comic Sans MS" w:hAnsi="Comic Sans MS"/>
+                <w:b/>
+                <w:bCs/>
+                <w:color w:val="000000" w:themeColor="text1"/>
+              </w:rPr>
+              <w:t>Task category</w:t>
+            </w:r>
+          </w:p>
+        </w:tc>
+        <w:tc>
+          <w:tcPr>
+            <w:tcW w:w="6655" w:type="dxa"/>
+            <w:shd w:val="clear" w:color="auto" w:fill="EE0000"/>
+          </w:tcPr>
+          <w:p>
+            <w:pPr>
+              <w:rPr>
+                <w:color w:val="000000" w:themeColor="text1"/>
+              </w:rPr>
+            </w:pPr>
+            <w:r>
+              <w:rPr>
+                <w:color w:val="000000" w:themeColor="text1"/>
+              </w:rPr>
+              <w:t>{d.taskCategoryTypeCode}</w:t>
+            </w:r>
+          </w:p>
+        </w:tc>
+      </w:tr>
+      <w:tr>
+        <w:tc>
+          <w:tcPr>
+            <w:tcW w:w="2695" w:type="dxa"/>
+            <w:shd w:val="clear" w:color="auto" w:fill="00B050"/>
+          </w:tcPr>
+          <w:p>
+            <w:pPr>
+              <w:rPr>
+                <w:rFonts w:ascii="Comic Sans MS" w:hAnsi="Comic Sans MS"/>
+                <w:b/>
+                <w:bCs/>
+                <w:color w:val="000000" w:themeColor="text1"/>
+              </w:rPr>
+            </w:pPr>
+            <w:r>
+              <w:rPr>
+                <w:rFonts w:ascii="Comic Sans MS" w:hAnsi="Comic Sans MS"/>
+                <w:b/>
+                <w:bCs/>
+                <w:color w:val="000000" w:themeColor="text1"/>
+              </w:rPr>
+              <w:t>Task sub category</w:t>
+            </w:r>
+          </w:p>
+        </w:tc>
+        <w:tc>
+          <w:tcPr>
+            <w:tcW w:w="6655" w:type="dxa"/>
+            <w:shd w:val="clear" w:color="auto" w:fill="FFFF00"/>
+          </w:tcPr>
+          <w:p>
+            <w:pPr>
+              <w:rPr>
+                <w:color w:val="000000" w:themeColor="text1"/>
+              </w:rPr>
+            </w:pPr>
+            <w:r>
+              <w:rPr>
+                <w:color w:val="000000" w:themeColor="text1"/>
+              </w:rPr>
+              <w:t>{d.taskTypeCode}</w:t>
+            </w:r>
+          </w:p>
+        </w:tc>
+      </w:tr>
+      <w:tr>
+        <w:tc>
+          <w:tcPr>
+            <w:tcW w:w="2695" w:type="dxa"/>
+            <w:shd w:val="clear" w:color="auto" w:fill="00B050"/>
+          </w:tcPr>
+          <w:p>
+            <w:pPr>
+              <w:rPr>
+                <w:rFonts w:ascii="Comic Sans MS" w:hAnsi="Comic Sans MS"/>
+                <w:b/>
+                <w:bCs/>
+                <w:color w:val="000000" w:themeColor="text1"/>
+              </w:rPr>
+            </w:pPr>
+            <w:r>
+              <w:rPr>
+                <w:rFonts w:ascii="Comic Sans MS" w:hAnsi="Comic Sans MS"/>
+                <w:b/>
+                <w:bCs/>
+                <w:color w:val="000000" w:themeColor="text1"/>
+              </w:rPr>
+              <w:t>Remarks</w:t>
+            </w:r>
+          </w:p>
+        </w:tc>
+        <w:tc>
+          <w:tcPr>
+            <w:tcW w:w="6655" w:type="dxa"/>
+            <w:shd w:val="clear" w:color="auto" w:fill="EE0000"/>
+          </w:tcPr>
+          <w:p>
+            <w:pPr>
+              <w:rPr>
+                <w:color w:val="000000" w:themeColor="text1"/>
+              </w:rPr>
+            </w:pPr>
+            <w:r>
+              <w:rPr>
+                <w:color w:val="000000" w:themeColor="text1"/>
+              </w:rPr>
+              <w:t>{d.remarks}</w:t>
+            </w:r>
+          </w:p>
+        </w:tc>
+      </w:tr>
+      <w:tr>
+        <w:tc>
+          <w:tcPr>
+            <w:tcW w:w="2695" w:type="dxa"/>
+            <w:shd w:val="clear" w:color="auto" w:fill="00B050"/>
+          </w:tcPr>
+          <w:p>
+            <w:pPr>
+              <w:rPr>
+                <w:rFonts w:ascii="Comic Sans MS" w:hAnsi="Comic Sans MS"/>
+                <w:b/>
+                <w:bCs/>
+                <w:color w:val="000000" w:themeColor="text1"/>
+              </w:rPr>
+            </w:pPr>
+            <w:r>
+              <w:rPr>
+                <w:rFonts w:ascii="Comic Sans MS" w:hAnsi="Comic Sans MS"/>
+                <w:b/>
+                <w:bCs/>
+                <w:color w:val="000000" w:themeColor="text1"/>
+              </w:rPr>
+              <w:t>Officer assigned</w:t>
+            </w:r>
+          </w:p>
+        </w:tc>
+        <w:tc>
+          <w:tcPr>
+            <w:tcW w:w="6655" w:type="dxa"/>
+            <w:shd w:val="clear" w:color="auto" w:fill="FFFF00"/>
+          </w:tcPr>
+          <w:p>
+            <w:pPr>
+              <w:rPr>
+                <w:color w:val="000000" w:themeColor="text1"/>
+              </w:rPr>
+            </w:pPr>
+            <w:r>
+              <w:rPr>
+                <w:color w:val="000000" w:themeColor="text1"/>
+              </w:rPr>
+              <w:t>{d.assignedUserIdentifier}</w:t>
+            </w:r>
+          </w:p>
+        </w:tc>
+      </w:tr>
+      <w:tr>
+        <w:tc>
+          <w:tcPr>
+            <w:tcW w:w="2695" w:type="dxa"/>
+            <w:shd w:val="clear" w:color="auto" w:fill="00B050"/>
+          </w:tcPr>
+          <w:p>
+            <w:pPr>
+              <w:rPr>
+                <w:rFonts w:ascii="Comic Sans MS" w:hAnsi="Comic Sans MS"/>
+                <w:b/>
+                <w:bCs/>
+                <w:color w:val="000000" w:themeColor="text1"/>
+              </w:rPr>
+            </w:pPr>
+            <w:r>
+              <w:rPr>
+                <w:rFonts w:ascii="Comic Sans MS" w:hAnsi="Comic Sans MS"/>
+                <w:b/>
+                <w:bCs/>
+                <w:color w:val="000000" w:themeColor="text1"/>
+              </w:rPr>
+              <w:t>Due date</w:t>
+            </w:r>
+          </w:p>
+        </w:tc>
+        <w:tc>
+          <w:tcPr>
+            <w:tcW w:w="6655" w:type="dxa"/>
+            <w:shd w:val="clear" w:color="auto" w:fill="EE0000"/>
+          </w:tcPr>
+          <w:p>
+            <w:pPr>
+              <w:rPr>
+                <w:color w:val="000000" w:themeColor="text1"/>
+              </w:rPr>
+            </w:pPr>
+            <w:r>
+              <w:rPr>
+                <w:color w:val="000000" w:themeColor="text1"/>
+              </w:rPr>
+              <w:t>{d.dueDate}</w:t>
+            </w:r>
+          </w:p>
+        </w:tc>
+      </w:tr>
+      <w:tr>
+        <w:tc>
+          <w:tcPr>
+            <w:tcW w:w="2695" w:type="dxa"/>
+            <w:shd w:val="clear" w:color="auto" w:fill="00B050"/>
+          </w:tcPr>
+          <w:p>
+            <w:pPr>
+              <w:rPr>
+                <w:rFonts w:ascii="Comic Sans MS" w:hAnsi="Comic Sans MS"/>
+                <w:b/>
+                <w:bCs/>
+                <w:color w:val="000000" w:themeColor="text1"/>
+              </w:rPr>
+            </w:pPr>
+            <w:r>
+              <w:rPr>
+                <w:rFonts w:ascii="Comic Sans MS" w:hAnsi="Comic Sans MS"/>
+                <w:b/>
+                <w:bCs/>
+                <w:color w:val="000000" w:themeColor="text1"/>
+              </w:rPr>
+              <w:t>Task details</w:t>
+            </w:r>
+          </w:p>
+        </w:tc>
+        <w:tc>
+          <w:tcPr>
+            <w:tcW w:w="6655" w:type="dxa"/>
+            <w:shd w:val="clear" w:color="auto" w:fill="FFFF00"/>
+          </w:tcPr>
+          <w:p>
+            <w:pPr>
+              <w:rPr>
+                <w:color w:val="000000" w:themeColor="text1"/>
+              </w:rPr>
+            </w:pPr>
+            <w:r>
+              <w:rPr>
+                <w:color w:val="000000" w:themeColor="text1"/>
+              </w:rPr>
+              <w:t>{d.</w:t>
+            </w:r>
+            <w:r>
+              <w:rPr>
+                <w:color w:val="000000" w:themeColor="text1"/>
+              </w:rPr>
+              <w:t>description</w:t>
+            </w:r>
+            <w:r>
+              <w:rPr>
+                <w:color w:val="000000" w:themeColor="text1"/>
+              </w:rPr>
+              <w:t>}</w:t>
+            </w:r>
+          </w:p>
+        </w:tc>
+      </w:tr>
+    </w:tbl>
+    <w:p>
+      <w:pPr>
+        <w:jc w:val="center"/>
+        <w:rPr>
+          <w:color w:val="EE0000"/>
+        </w:rPr>
+      </w:pPr>
     </w:p>
     <w:sectPr>
       <w:pgSz w:w="12240" w:h="15840"/>
@@ -628,7 +1034,6 @@
   <w:style w:type="character" w:default="1" w:styleId="DefaultParagraphFont">
     <w:name w:val="Default Paragraph Font"/>
     <w:uiPriority w:val="1"/>
-    <w:semiHidden/>
     <w:unhideWhenUsed/>
   </w:style>
   <w:style w:type="table" w:default="1" w:styleId="TableNormal">
@@ -941,6 +1346,25 @@
       <w:color w:val="0F4761" w:themeColor="accent1" w:themeShade="BF"/>
       <w:spacing w:val="5"/>
     </w:rPr>
+  </w:style>
+  <w:style w:type="table" w:styleId="TableGrid">
+    <w:name w:val="Table Grid"/>
+    <w:basedOn w:val="TableNormal"/>
+    <w:uiPriority w:val="39"/>
+    <w:rsid w:val="008E5E0C"/>
+    <w:pPr>
+      <w:spacing w:after="0" w:line="240" w:lineRule="auto"/>
+    </w:pPr>
+    <w:tblPr>
+      <w:tblBorders>
+        <w:top w:val="single" w:sz="4" w:space="0" w:color="auto"/>
+        <w:left w:val="single" w:sz="4" w:space="0" w:color="auto"/>
+        <w:bottom w:val="single" w:sz="4" w:space="0" w:color="auto"/>
+        <w:right w:val="single" w:sz="4" w:space="0" w:color="auto"/>
+        <w:insideH w:val="single" w:sz="4" w:space="0" w:color="auto"/>
+        <w:insideV w:val="single" w:sz="4" w:space="0" w:color="auto"/>
+      </w:tblBorders>
+    </w:tblPr>
   </w:style>
 </w:styles>
 </file>

</xml_diff>

<commit_message>
feat: Bunch of report fields
</commit_message>
<xml_diff>
--- a/backend/templates/task/CDOGS-TDR-TEMPLATE-v1.docx
+++ b/backend/templates/task/CDOGS-TDR-TEMPLATE-v1.docx
@@ -130,7 +130,18 @@
                 <w:sz w:val="20"/>
                 <w:szCs w:val="20"/>
               </w:rPr>
-              <w:t>investigationIdentifier</w:t>
+              <w:t>investigation</w:t>
+            </w:r>
+            <w:r>
+              <w:rPr>
+                <w:rFonts w:ascii="BC Sans" w:eastAsia="Times New Roman" w:hAnsi="BC Sans" w:cs="Times New Roman"/>
+                <w:b w:val="0"/>
+                <w:bCs w:val="0"/>
+                <w:color w:val="000000" w:themeColor="text1"/>
+                <w:sz w:val="20"/>
+                <w:szCs w:val="20"/>
+              </w:rPr>
+              <w:t>Label</w:t>
             </w:r>
             <w:proofErr w:type="spellEnd"/>
             <w:r>
@@ -933,22 +944,64 @@
         <w:spacing w:after="0"/>
         <w:rPr>
           <w:rFonts w:ascii="BC Sans" w:hAnsi="BC Sans"/>
-          <w:sz w:val="20"/>
-          <w:szCs w:val="20"/>
-        </w:rPr>
-      </w:pPr>
-    </w:p>
-    <w:p>
-      <w:pPr>
-        <w:spacing w:after="0"/>
-        <w:rPr>
-          <w:rFonts w:ascii="BC Sans" w:hAnsi="BC Sans"/>
           <w:b/>
           <w:bCs/>
           <w:sz w:val="20"/>
           <w:szCs w:val="20"/>
         </w:rPr>
       </w:pPr>
+      <w:r>
+        <w:rPr>
+          <w:rFonts w:ascii="BC Sans" w:hAnsi="BC Sans"/>
+          <w:sz w:val="20"/>
+          <w:szCs w:val="20"/>
+        </w:rPr>
+        <w:t>{</w:t>
+      </w:r>
+      <w:proofErr w:type="spellStart"/>
+      <w:r>
+        <w:rPr>
+          <w:rFonts w:ascii="BC Sans" w:hAnsi="BC Sans"/>
+          <w:sz w:val="20"/>
+          <w:szCs w:val="20"/>
+        </w:rPr>
+        <w:t>d.hasDiaryDates:ifEQ</w:t>
+      </w:r>
+      <w:proofErr w:type="spellEnd"/>
+      <w:r>
+        <w:rPr>
+          <w:rFonts w:ascii="BC Sans" w:hAnsi="BC Sans"/>
+          <w:sz w:val="20"/>
+          <w:szCs w:val="20"/>
+        </w:rPr>
+        <w:t>(true):</w:t>
+      </w:r>
+      <w:proofErr w:type="spellStart"/>
+      <w:r>
+        <w:rPr>
+          <w:rFonts w:ascii="BC Sans" w:hAnsi="BC Sans"/>
+          <w:sz w:val="20"/>
+          <w:szCs w:val="20"/>
+        </w:rPr>
+        <w:t>showBegin</w:t>
+      </w:r>
+      <w:proofErr w:type="spellEnd"/>
+      <w:r>
+        <w:rPr>
+          <w:rFonts w:ascii="BC Sans" w:hAnsi="BC Sans"/>
+          <w:sz w:val="20"/>
+          <w:szCs w:val="20"/>
+        </w:rPr>
+        <w:t>}</w:t>
+      </w:r>
+      <w:r>
+        <w:rPr>
+          <w:rFonts w:ascii="BC Sans" w:hAnsi="BC Sans"/>
+          <w:sz w:val="20"/>
+          <w:szCs w:val="20"/>
+        </w:rPr>
+        <w:br/>
+      </w:r>
       <w:r>
         <w:rPr>
           <w:rFonts w:ascii="BC Sans" w:hAnsi="BC Sans"/>
@@ -1363,22 +1416,44 @@
         <w:spacing w:after="0"/>
         <w:rPr>
           <w:rFonts w:ascii="BC Sans" w:hAnsi="BC Sans"/>
-          <w:sz w:val="20"/>
-          <w:szCs w:val="20"/>
-        </w:rPr>
-      </w:pPr>
-    </w:p>
-    <w:p>
-      <w:pPr>
-        <w:spacing w:after="0"/>
-        <w:rPr>
-          <w:rFonts w:ascii="BC Sans" w:hAnsi="BC Sans"/>
           <w:b/>
           <w:bCs/>
           <w:sz w:val="20"/>
           <w:szCs w:val="20"/>
         </w:rPr>
       </w:pPr>
+      <w:r>
+        <w:rPr>
+          <w:rFonts w:ascii="BC Sans" w:hAnsi="BC Sans"/>
+          <w:sz w:val="20"/>
+          <w:szCs w:val="20"/>
+        </w:rPr>
+        <w:t>{d.hasDiaryDates:showEnd}{d.</w:t>
+      </w:r>
+      <w:r>
+        <w:rPr>
+          <w:rFonts w:ascii="BC Sans" w:hAnsi="BC Sans"/>
+          <w:sz w:val="20"/>
+          <w:szCs w:val="20"/>
+        </w:rPr>
+        <w:t>hasActivityNotes</w:t>
+      </w:r>
+      <w:r>
+        <w:rPr>
+          <w:rFonts w:ascii="BC Sans" w:hAnsi="BC Sans"/>
+          <w:sz w:val="20"/>
+          <w:szCs w:val="20"/>
+        </w:rPr>
+        <w:t>:ifEQ(true):showBegin}</w:t>
+      </w:r>
+      <w:r>
+        <w:rPr>
+          <w:rFonts w:ascii="BC Sans" w:hAnsi="BC Sans"/>
+          <w:sz w:val="20"/>
+          <w:szCs w:val="20"/>
+        </w:rPr>
+        <w:br/>
+      </w:r>
       <w:r>
         <w:rPr>
           <w:rFonts w:ascii="BC Sans" w:hAnsi="BC Sans"/>
@@ -1397,9 +1472,9 @@
         <w:tblLook w:val="04A0" w:firstRow="1" w:lastRow="0" w:firstColumn="1" w:lastColumn="0" w:noHBand="0" w:noVBand="1"/>
       </w:tblPr>
       <w:tblGrid>
-        <w:gridCol w:w="5040"/>
-        <w:gridCol w:w="3690"/>
-        <w:gridCol w:w="2070"/>
+        <w:gridCol w:w="6493"/>
+        <w:gridCol w:w="2586"/>
+        <w:gridCol w:w="1721"/>
       </w:tblGrid>
       <w:tr>
         <w:trPr>
@@ -1409,7 +1484,7 @@
         <w:tc>
           <w:tcPr>
             <w:cnfStyle w:val="001000000100" w:firstRow="0" w:lastRow="0" w:firstColumn="1" w:lastColumn="0" w:oddVBand="0" w:evenVBand="0" w:oddHBand="0" w:evenHBand="0" w:firstRowFirstColumn="1" w:firstRowLastColumn="0" w:lastRowFirstColumn="0" w:lastRowLastColumn="0"/>
-            <w:tcW w:w="5040" w:type="dxa"/>
+            <w:tcW w:w="7549" w:type="dxa"/>
           </w:tcPr>
           <w:p>
             <w:pPr>
@@ -1439,7 +1514,7 @@
         </w:tc>
         <w:tc>
           <w:tcPr>
-            <w:tcW w:w="3690" w:type="dxa"/>
+            <w:tcW w:w="1181" w:type="dxa"/>
           </w:tcPr>
           <w:p>
             <w:pPr>
@@ -1508,7 +1583,7 @@
         <w:tc>
           <w:tcPr>
             <w:cnfStyle w:val="001000000000" w:firstRow="0" w:lastRow="0" w:firstColumn="1" w:lastColumn="0" w:oddVBand="0" w:evenVBand="0" w:oddHBand="0" w:evenHBand="0" w:firstRowFirstColumn="0" w:firstRowLastColumn="0" w:lastRowFirstColumn="0" w:lastRowLastColumn="0"/>
-            <w:tcW w:w="5040" w:type="dxa"/>
+            <w:tcW w:w="7549" w:type="dxa"/>
             <w:noWrap/>
             <w:vAlign w:val="center"/>
           </w:tcPr>
@@ -1611,7 +1686,7 @@
         </w:tc>
         <w:tc>
           <w:tcPr>
-            <w:tcW w:w="3690" w:type="dxa"/>
+            <w:tcW w:w="1181" w:type="dxa"/>
             <w:tcBorders>
               <w:right w:val="single" w:sz="4" w:space="0" w:color="7F7F7F" w:themeColor="text1" w:themeTint="80"/>
             </w:tcBorders>
@@ -1687,6 +1762,75 @@
                 <w:szCs w:val="18"/>
               </w:rPr>
               <w:t>actionedDate</w:t>
+            </w:r>
+            <w:proofErr w:type="spellEnd"/>
+            <w:r>
+              <w:rPr>
+                <w:rFonts w:ascii="BC Sans" w:eastAsia="Times New Roman" w:hAnsi="BC Sans" w:cs="Times New Roman"/>
+                <w:color w:val="000000" w:themeColor="text1"/>
+                <w:sz w:val="18"/>
+                <w:szCs w:val="18"/>
+              </w:rPr>
+              <w:t>}</w:t>
+            </w:r>
+            <w:r>
+              <w:rPr>
+                <w:rFonts w:ascii="BC Sans" w:eastAsia="Times New Roman" w:hAnsi="BC Sans" w:cs="Times New Roman"/>
+                <w:color w:val="000000" w:themeColor="text1"/>
+                <w:sz w:val="18"/>
+                <w:szCs w:val="18"/>
+              </w:rPr>
+              <w:t xml:space="preserve"> {</w:t>
+            </w:r>
+            <w:proofErr w:type="spellStart"/>
+            <w:r>
+              <w:rPr>
+                <w:rFonts w:ascii="BC Sans" w:eastAsia="Times New Roman" w:hAnsi="BC Sans" w:cs="Times New Roman"/>
+                <w:color w:val="000000" w:themeColor="text1"/>
+                <w:sz w:val="18"/>
+                <w:szCs w:val="18"/>
+              </w:rPr>
+              <w:t>d.activityNotes</w:t>
+            </w:r>
+            <w:proofErr w:type="spellEnd"/>
+            <w:r>
+              <w:rPr>
+                <w:rFonts w:ascii="BC Sans" w:eastAsia="Times New Roman" w:hAnsi="BC Sans" w:cs="Times New Roman"/>
+                <w:color w:val="000000" w:themeColor="text1"/>
+                <w:sz w:val="18"/>
+                <w:szCs w:val="18"/>
+              </w:rPr>
+              <w:t>[</w:t>
+            </w:r>
+            <w:proofErr w:type="spellStart"/>
+            <w:r>
+              <w:rPr>
+                <w:rFonts w:ascii="BC Sans" w:eastAsia="Times New Roman" w:hAnsi="BC Sans" w:cs="Times New Roman"/>
+                <w:color w:val="000000" w:themeColor="text1"/>
+                <w:sz w:val="18"/>
+                <w:szCs w:val="18"/>
+              </w:rPr>
+              <w:t>i</w:t>
+            </w:r>
+            <w:proofErr w:type="spellEnd"/>
+            <w:r>
+              <w:rPr>
+                <w:rFonts w:ascii="BC Sans" w:eastAsia="Times New Roman" w:hAnsi="BC Sans" w:cs="Times New Roman"/>
+                <w:color w:val="000000" w:themeColor="text1"/>
+                <w:sz w:val="18"/>
+                <w:szCs w:val="18"/>
+              </w:rPr>
+              <w:t>].</w:t>
+            </w:r>
+            <w:proofErr w:type="spellStart"/>
+            <w:r>
+              <w:rPr>
+                <w:rFonts w:ascii="BC Sans" w:eastAsia="Times New Roman" w:hAnsi="BC Sans" w:cs="Times New Roman"/>
+                <w:color w:val="000000" w:themeColor="text1"/>
+                <w:sz w:val="18"/>
+                <w:szCs w:val="18"/>
+              </w:rPr>
+              <w:t>actionedTime</w:t>
             </w:r>
             <w:proofErr w:type="spellEnd"/>
             <w:r>
@@ -1896,7 +2040,7 @@
         <w:tc>
           <w:tcPr>
             <w:cnfStyle w:val="001000000000" w:firstRow="0" w:lastRow="0" w:firstColumn="1" w:lastColumn="0" w:oddVBand="0" w:evenVBand="0" w:oddHBand="0" w:evenHBand="0" w:firstRowFirstColumn="0" w:firstRowLastColumn="0" w:lastRowFirstColumn="0" w:lastRowLastColumn="0"/>
-            <w:tcW w:w="5040" w:type="dxa"/>
+            <w:tcW w:w="7549" w:type="dxa"/>
             <w:noWrap/>
             <w:vAlign w:val="center"/>
           </w:tcPr>
@@ -1974,7 +2118,7 @@
         </w:tc>
         <w:tc>
           <w:tcPr>
-            <w:tcW w:w="3690" w:type="dxa"/>
+            <w:tcW w:w="1181" w:type="dxa"/>
             <w:tcBorders>
               <w:right w:val="single" w:sz="4" w:space="0" w:color="7F7F7F" w:themeColor="text1" w:themeTint="80"/>
             </w:tcBorders>
@@ -2029,6 +2173,55 @@
                 <w:szCs w:val="18"/>
               </w:rPr>
               <w:t>actionedDate</w:t>
+            </w:r>
+            <w:proofErr w:type="spellEnd"/>
+            <w:r>
+              <w:rPr>
+                <w:rFonts w:ascii="BC Sans" w:eastAsia="Times New Roman" w:hAnsi="BC Sans" w:cs="Times New Roman"/>
+                <w:color w:val="000000" w:themeColor="text1"/>
+                <w:sz w:val="18"/>
+                <w:szCs w:val="18"/>
+              </w:rPr>
+              <w:t>}</w:t>
+            </w:r>
+            <w:r>
+              <w:rPr>
+                <w:rFonts w:ascii="BC Sans" w:eastAsia="Times New Roman" w:hAnsi="BC Sans" w:cs="Times New Roman"/>
+                <w:color w:val="000000" w:themeColor="text1"/>
+                <w:sz w:val="18"/>
+                <w:szCs w:val="18"/>
+              </w:rPr>
+              <w:t xml:space="preserve"> {</w:t>
+            </w:r>
+            <w:proofErr w:type="spellStart"/>
+            <w:r>
+              <w:rPr>
+                <w:rFonts w:ascii="BC Sans" w:eastAsia="Times New Roman" w:hAnsi="BC Sans" w:cs="Times New Roman"/>
+                <w:color w:val="000000" w:themeColor="text1"/>
+                <w:sz w:val="18"/>
+                <w:szCs w:val="18"/>
+              </w:rPr>
+              <w:t>d.activityNotes</w:t>
+            </w:r>
+            <w:proofErr w:type="spellEnd"/>
+            <w:r>
+              <w:rPr>
+                <w:rFonts w:ascii="BC Sans" w:eastAsia="Times New Roman" w:hAnsi="BC Sans" w:cs="Times New Roman"/>
+                <w:color w:val="000000" w:themeColor="text1"/>
+                <w:sz w:val="18"/>
+                <w:szCs w:val="18"/>
+              </w:rPr>
+              <w:t>[i+1].</w:t>
+            </w:r>
+            <w:proofErr w:type="spellStart"/>
+            <w:r>
+              <w:rPr>
+                <w:rFonts w:ascii="BC Sans" w:eastAsia="Times New Roman" w:hAnsi="BC Sans" w:cs="Times New Roman"/>
+                <w:color w:val="000000" w:themeColor="text1"/>
+                <w:sz w:val="18"/>
+                <w:szCs w:val="18"/>
+              </w:rPr>
+              <w:t>actionedTime</w:t>
             </w:r>
             <w:proofErr w:type="spellEnd"/>
             <w:r>
@@ -2201,6 +2394,48 @@
           <w:szCs w:val="20"/>
         </w:rPr>
       </w:pPr>
+      <w:r>
+        <w:rPr>
+          <w:rFonts w:ascii="BC Sans" w:hAnsi="BC Sans"/>
+          <w:sz w:val="20"/>
+          <w:szCs w:val="20"/>
+        </w:rPr>
+        <w:t>{</w:t>
+      </w:r>
+      <w:proofErr w:type="spellStart"/>
+      <w:r>
+        <w:rPr>
+          <w:rFonts w:ascii="BC Sans" w:hAnsi="BC Sans"/>
+          <w:sz w:val="20"/>
+          <w:szCs w:val="20"/>
+        </w:rPr>
+        <w:t>d.</w:t>
+      </w:r>
+      <w:r>
+        <w:rPr>
+          <w:rFonts w:ascii="BC Sans" w:hAnsi="BC Sans"/>
+          <w:sz w:val="20"/>
+          <w:szCs w:val="20"/>
+        </w:rPr>
+        <w:t>hasActivityNotes</w:t>
+      </w:r>
+      <w:r>
+        <w:rPr>
+          <w:rFonts w:ascii="BC Sans" w:hAnsi="BC Sans"/>
+          <w:sz w:val="20"/>
+          <w:szCs w:val="20"/>
+        </w:rPr>
+        <w:t>:showEnd</w:t>
+      </w:r>
+      <w:proofErr w:type="spellEnd"/>
+      <w:r>
+        <w:rPr>
+          <w:rFonts w:ascii="BC Sans" w:hAnsi="BC Sans"/>
+          <w:sz w:val="20"/>
+          <w:szCs w:val="20"/>
+        </w:rPr>
+        <w:t>}</w:t>
+      </w:r>
     </w:p>
     <w:tbl>
       <w:tblPr>
@@ -2939,6 +3174,52 @@
             <w:pStyle w:val="Header"/>
             <w:ind w:left="-115"/>
           </w:pPr>
+          <w:r>
+            <w:rPr>
+              <w:noProof/>
+            </w:rPr>
+            <w:drawing>
+              <wp:inline distT="0" distB="0" distL="0" distR="0" wp14:anchorId="31FA1709" wp14:editId="6252712F">
+                <wp:extent cx="1009859" cy="479515"/>
+                <wp:effectExtent l="0" t="0" r="0" b="0"/>
+                <wp:docPr id="805052819" name="Graphic 2"/>
+                <wp:cNvGraphicFramePr>
+                  <a:graphicFrameLocks xmlns:a="http://schemas.openxmlformats.org/drawingml/2006/main" noChangeAspect="1"/>
+                </wp:cNvGraphicFramePr>
+                <a:graphic xmlns:a="http://schemas.openxmlformats.org/drawingml/2006/main">
+                  <a:graphicData uri="http://schemas.openxmlformats.org/drawingml/2006/picture">
+                    <pic:pic xmlns:pic="http://schemas.openxmlformats.org/drawingml/2006/picture">
+                      <pic:nvPicPr>
+                        <pic:cNvPr id="805052819" name="Graphic 805052819"/>
+                        <pic:cNvPicPr/>
+                      </pic:nvPicPr>
+                      <pic:blipFill>
+                        <a:blip r:embed="rId1">
+                          <a:extLst>
+                            <a:ext uri="{96DAC541-7B7A-43D3-8B79-37D633B846F1}">
+                              <asvg:svgBlip xmlns:asvg="http://schemas.microsoft.com/office/drawing/2016/SVG/main" r:embed="rId2"/>
+                            </a:ext>
+                          </a:extLst>
+                        </a:blip>
+                        <a:stretch>
+                          <a:fillRect/>
+                        </a:stretch>
+                      </pic:blipFill>
+                      <pic:spPr>
+                        <a:xfrm>
+                          <a:off x="0" y="0"/>
+                          <a:ext cx="1051704" cy="499384"/>
+                        </a:xfrm>
+                        <a:prstGeom prst="rect">
+                          <a:avLst/>
+                        </a:prstGeom>
+                      </pic:spPr>
+                    </pic:pic>
+                  </a:graphicData>
+                </a:graphic>
+              </wp:inline>
+            </w:drawing>
+          </w:r>
         </w:p>
       </w:tc>
       <w:tc>
@@ -3422,7 +3703,7 @@
   <w:style w:type="paragraph" w:default="1" w:styleId="Normal">
     <w:name w:val="Normal"/>
     <w:qFormat/>
-    <w:rsid w:val="0031143D"/>
+    <w:rsid w:val="004E62FC"/>
   </w:style>
   <w:style w:type="paragraph" w:styleId="Heading1">
     <w:name w:val="heading 1"/>
@@ -4528,12 +4809,21 @@
 </file>
 
 <file path=customXml/item1.xml><?xml version="1.0" encoding="utf-8"?>
-<?mso-contentType ?>
-<FormTemplates xmlns="http://schemas.microsoft.com/sharepoint/v3/contenttype/forms">
-  <Display>DocumentLibraryForm</Display>
-  <Edit>DocumentLibraryForm</Edit>
-  <New>DocumentLibraryForm</New>
-</FormTemplates>
+<p:properties xmlns:p="http://schemas.microsoft.com/office/2006/metadata/properties" xmlns:xsi="http://www.w3.org/2001/XMLSchema-instance" xmlns:pc="http://schemas.microsoft.com/office/infopath/2007/PartnerControls">
+  <documentManagement>
+    <TaxCatchAll xmlns="cbeac988-4fd5-47cf-ad03-89cc7678fa90" xsi:nil="true"/>
+    <lcf76f155ced4ddcb4097134ff3c332f xmlns="aa9c99c1-69c1-4b58-9df5-4d4796c46f8a">
+      <Terms xmlns="http://schemas.microsoft.com/office/infopath/2007/PartnerControls"/>
+    </lcf76f155ced4ddcb4097134ff3c332f>
+    <SharedWithUsers xmlns="cbeac988-4fd5-47cf-ad03-89cc7678fa90">
+      <UserInfo>
+        <DisplayName/>
+        <AccountId xsi:nil="true"/>
+        <AccountType/>
+      </UserInfo>
+    </SharedWithUsers>
+  </documentManagement>
+</p:properties>
 </file>
 
 <file path=customXml/item2.xml><?xml version="1.0" encoding="utf-8"?>
@@ -4772,27 +5062,21 @@
 </file>
 
 <file path=customXml/item3.xml><?xml version="1.0" encoding="utf-8"?>
-<p:properties xmlns:p="http://schemas.microsoft.com/office/2006/metadata/properties" xmlns:xsi="http://www.w3.org/2001/XMLSchema-instance" xmlns:pc="http://schemas.microsoft.com/office/infopath/2007/PartnerControls">
-  <documentManagement>
-    <TaxCatchAll xmlns="cbeac988-4fd5-47cf-ad03-89cc7678fa90" xsi:nil="true"/>
-    <lcf76f155ced4ddcb4097134ff3c332f xmlns="aa9c99c1-69c1-4b58-9df5-4d4796c46f8a">
-      <Terms xmlns="http://schemas.microsoft.com/office/infopath/2007/PartnerControls"/>
-    </lcf76f155ced4ddcb4097134ff3c332f>
-    <SharedWithUsers xmlns="cbeac988-4fd5-47cf-ad03-89cc7678fa90">
-      <UserInfo>
-        <DisplayName/>
-        <AccountId xsi:nil="true"/>
-        <AccountType/>
-      </UserInfo>
-    </SharedWithUsers>
-  </documentManagement>
-</p:properties>
+<?mso-contentType ?>
+<FormTemplates xmlns="http://schemas.microsoft.com/sharepoint/v3/contenttype/forms">
+  <Display>DocumentLibraryForm</Display>
+  <Edit>DocumentLibraryForm</Edit>
+  <New>DocumentLibraryForm</New>
+</FormTemplates>
 </file>
 
 <file path=customXml/itemProps1.xml><?xml version="1.0" encoding="utf-8"?>
-<ds:datastoreItem xmlns:ds="http://schemas.openxmlformats.org/officeDocument/2006/customXml" ds:itemID="{4BECF9F2-3A10-48CC-8D31-4F6E8664527E}">
+<ds:datastoreItem xmlns:ds="http://schemas.openxmlformats.org/officeDocument/2006/customXml" ds:itemID="{C6C5DCE0-D69C-4B6E-96D9-C69B23DE6D4A}">
   <ds:schemaRefs>
-    <ds:schemaRef ds:uri="http://schemas.microsoft.com/sharepoint/v3/contenttype/forms"/>
+    <ds:schemaRef ds:uri="http://schemas.microsoft.com/office/2006/metadata/properties"/>
+    <ds:schemaRef ds:uri="http://schemas.microsoft.com/office/infopath/2007/PartnerControls"/>
+    <ds:schemaRef ds:uri="cbeac988-4fd5-47cf-ad03-89cc7678fa90"/>
+    <ds:schemaRef ds:uri="aa9c99c1-69c1-4b58-9df5-4d4796c46f8a"/>
   </ds:schemaRefs>
 </ds:datastoreItem>
 </file>
@@ -4817,12 +5101,9 @@
 </file>
 
 <file path=customXml/itemProps3.xml><?xml version="1.0" encoding="utf-8"?>
-<ds:datastoreItem xmlns:ds="http://schemas.openxmlformats.org/officeDocument/2006/customXml" ds:itemID="{C6C5DCE0-D69C-4B6E-96D9-C69B23DE6D4A}">
+<ds:datastoreItem xmlns:ds="http://schemas.openxmlformats.org/officeDocument/2006/customXml" ds:itemID="{4BECF9F2-3A10-48CC-8D31-4F6E8664527E}">
   <ds:schemaRefs>
-    <ds:schemaRef ds:uri="http://schemas.microsoft.com/office/2006/metadata/properties"/>
-    <ds:schemaRef ds:uri="http://schemas.microsoft.com/office/infopath/2007/PartnerControls"/>
-    <ds:schemaRef ds:uri="cbeac988-4fd5-47cf-ad03-89cc7678fa90"/>
-    <ds:schemaRef ds:uri="aa9c99c1-69c1-4b58-9df5-4d4796c46f8a"/>
+    <ds:schemaRef ds:uri="http://schemas.microsoft.com/sharepoint/v3/contenttype/forms"/>
   </ds:schemaRefs>
 </ds:datastoreItem>
 </file>
</xml_diff>

<commit_message>
feat: don't display rows in template
</commit_message>
<xml_diff>
--- a/backend/templates/task/CDOGS-TDR-TEMPLATE-v1.docx
+++ b/backend/templates/task/CDOGS-TDR-TEMPLATE-v1.docx
@@ -252,6 +252,7 @@
       <w:tblPr>
         <w:tblStyle w:val="PlainTable3"/>
         <w:tblW w:w="10916" w:type="dxa"/>
+        <w:tblLayout w:type="fixed"/>
         <w:tblLook w:val="04A0" w:firstRow="1" w:lastRow="0" w:firstColumn="1" w:lastColumn="0" w:noHBand="0" w:noVBand="1"/>
       </w:tblPr>
       <w:tblGrid>
@@ -427,6 +428,42 @@
               </w:rPr>
               <w:t>}</w:t>
             </w:r>
+            <w:r>
+              <w:rPr>
+                <w:rFonts w:ascii="BC Sans" w:eastAsia="Times New Roman" w:hAnsi="BC Sans" w:cs="Times New Roman"/>
+                <w:color w:val="000000" w:themeColor="text1"/>
+                <w:sz w:val="20"/>
+                <w:szCs w:val="20"/>
+              </w:rPr>
+              <w:t>{</w:t>
+            </w:r>
+            <w:r>
+              <w:rPr>
+                <w:rFonts w:ascii="BC Sans" w:eastAsia="Times New Roman" w:hAnsi="BC Sans" w:cs="Times New Roman"/>
+                <w:color w:val="000000" w:themeColor="text1"/>
+                <w:sz w:val="20"/>
+                <w:szCs w:val="20"/>
+              </w:rPr>
+              <w:t>d.</w:t>
+            </w:r>
+            <w:r>
+              <w:rPr>
+                <w:rFonts w:ascii="BC Sans" w:eastAsia="Times New Roman" w:hAnsi="BC Sans" w:cs="Times New Roman"/>
+                <w:color w:val="000000" w:themeColor="text1"/>
+                <w:sz w:val="20"/>
+                <w:szCs w:val="20"/>
+                <w:lang w:val="en-CA"/>
+              </w:rPr>
+              <w:t>taskType.type.longDescription:ifEM:hideBegin</w:t>
+            </w:r>
+            <w:r>
+              <w:rPr>
+                <w:rFonts w:ascii="BC Sans" w:hAnsi="BC Sans"/>
+                <w:sz w:val="20"/>
+                <w:szCs w:val="20"/>
+              </w:rPr>
+              <w:t>}</w:t>
+            </w:r>
           </w:p>
         </w:tc>
       </w:tr>
@@ -562,6 +599,17 @@
                 <w:sz w:val="20"/>
                 <w:szCs w:val="20"/>
               </w:rPr>
+              <w:t>{d.taskType.type.longDescription:hideEnd}</w:t>
+            </w:r>
+            <w:r>
+              <w:rPr>
+                <w:rFonts w:ascii="BC Sans" w:hAnsi="BC Sans"/>
+                <w:b w:val="0"/>
+                <w:bCs w:val="0"/>
+                <w:caps w:val="0"/>
+                <w:sz w:val="20"/>
+                <w:szCs w:val="20"/>
+              </w:rPr>
               <w:t>Remarks</w:t>
             </w:r>
           </w:p>
@@ -805,6 +853,42 @@
               </w:rPr>
               <w:t>{d.dueDate}</w:t>
             </w:r>
+            <w:r>
+              <w:rPr>
+                <w:rFonts w:ascii="BC Sans" w:eastAsia="Times New Roman" w:hAnsi="BC Sans" w:cs="Times New Roman"/>
+                <w:color w:val="000000" w:themeColor="text1"/>
+                <w:sz w:val="20"/>
+                <w:szCs w:val="20"/>
+              </w:rPr>
+              <w:t>{</w:t>
+            </w:r>
+            <w:r>
+              <w:rPr>
+                <w:rFonts w:ascii="BC Sans" w:eastAsia="Times New Roman" w:hAnsi="BC Sans" w:cs="Times New Roman"/>
+                <w:color w:val="000000" w:themeColor="text1"/>
+                <w:sz w:val="20"/>
+                <w:szCs w:val="20"/>
+              </w:rPr>
+              <w:t>d.</w:t>
+            </w:r>
+            <w:r>
+              <w:rPr>
+                <w:rFonts w:ascii="BC Sans" w:eastAsia="Times New Roman" w:hAnsi="BC Sans" w:cs="Times New Roman"/>
+                <w:color w:val="000000" w:themeColor="text1"/>
+                <w:sz w:val="20"/>
+                <w:szCs w:val="20"/>
+                <w:lang w:val="en-CA"/>
+              </w:rPr>
+              <w:t>description:ifEM:hideBegin</w:t>
+            </w:r>
+            <w:r>
+              <w:rPr>
+                <w:rFonts w:ascii="BC Sans" w:hAnsi="BC Sans"/>
+                <w:sz w:val="20"/>
+                <w:szCs w:val="20"/>
+              </w:rPr>
+              <w:t>}</w:t>
+            </w:r>
           </w:p>
         </w:tc>
       </w:tr>
@@ -862,6 +946,14 @@
                 <w:szCs w:val="20"/>
               </w:rPr>
               <w:t>{d.description}</w:t>
+            </w:r>
+            <w:r>
+              <w:rPr>
+                <w:rFonts w:ascii="BC Sans" w:hAnsi="BC Sans" w:cs="BC Sans Light"/>
+                <w:sz w:val="20"/>
+                <w:szCs w:val="20"/>
+              </w:rPr>
+              <w:t xml:space="preserve"> </w:t>
             </w:r>
           </w:p>
         </w:tc>
@@ -878,6 +970,42 @@
           <w:szCs w:val="20"/>
         </w:rPr>
       </w:pPr>
+      <w:r>
+        <w:rPr>
+          <w:rFonts w:ascii="BC Sans" w:eastAsia="Times New Roman" w:hAnsi="BC Sans" w:cs="Times New Roman"/>
+          <w:color w:val="000000" w:themeColor="text1"/>
+          <w:sz w:val="20"/>
+          <w:szCs w:val="20"/>
+        </w:rPr>
+        <w:t>{</w:t>
+      </w:r>
+      <w:r>
+        <w:rPr>
+          <w:rFonts w:ascii="BC Sans" w:eastAsia="Times New Roman" w:hAnsi="BC Sans" w:cs="Times New Roman"/>
+          <w:color w:val="000000" w:themeColor="text1"/>
+          <w:sz w:val="20"/>
+          <w:szCs w:val="20"/>
+        </w:rPr>
+        <w:t>d.</w:t>
+      </w:r>
+      <w:r>
+        <w:rPr>
+          <w:rFonts w:ascii="BC Sans" w:eastAsia="Times New Roman" w:hAnsi="BC Sans" w:cs="Times New Roman"/>
+          <w:color w:val="000000" w:themeColor="text1"/>
+          <w:sz w:val="20"/>
+          <w:szCs w:val="20"/>
+          <w:lang w:val="en-CA"/>
+        </w:rPr>
+        <w:t>description:ifEM:hideEnd</w:t>
+      </w:r>
+      <w:r>
+        <w:rPr>
+          <w:rFonts w:ascii="BC Sans" w:hAnsi="BC Sans"/>
+          <w:sz w:val="20"/>
+          <w:szCs w:val="20"/>
+        </w:rPr>
+        <w:t>}</w:t>
+      </w:r>
       <w:r>
         <w:rPr>
           <w:rFonts w:ascii="BC Sans" w:hAnsi="BC Sans"/>
@@ -2004,7 +2132,8 @@
     <w:tbl>
       <w:tblPr>
         <w:tblStyle w:val="PlainTable3"/>
-        <w:tblW w:w="10800" w:type="dxa"/>
+        <w:tblW w:w="0" w:type="auto"/>
+        <w:tblLayout w:type="fixed"/>
         <w:tblLook w:val="04A0" w:firstRow="1" w:lastRow="0" w:firstColumn="1" w:lastColumn="0" w:noHBand="0" w:noVBand="1"/>
       </w:tblPr>
       <w:tblGrid>
@@ -2283,6 +2412,7 @@
                 <w:szCs w:val="20"/>
                 <w:lang w:val="en-CA"/>
               </w:rPr>
+              <w:lastRenderedPageBreak/>
               <w:t>Title</w:t>
             </w:r>
           </w:p>
@@ -2346,7 +2476,6 @@
                 <w:szCs w:val="20"/>
                 <w:lang w:val="en-CA"/>
               </w:rPr>
-              <w:lastRenderedPageBreak/>
               <w:t>Date</w:t>
             </w:r>
           </w:p>
@@ -2373,6 +2502,15 @@
                 <w:lang w:val="en-CA"/>
               </w:rPr>
               <w:t>{d.attachments[i].date}</w:t>
+            </w:r>
+            <w:r>
+              <w:rPr>
+                <w:rFonts w:ascii="BC Sans" w:hAnsi="BC Sans"/>
+                <w:sz w:val="20"/>
+                <w:szCs w:val="20"/>
+                <w:lang w:val="en-CA"/>
+              </w:rPr>
+              <w:t>{d.attachments[i].takenBy.lastName:ifEM:hideBegin}</w:t>
             </w:r>
           </w:p>
         </w:tc>
@@ -2433,15 +2571,6 @@
                 <w:szCs w:val="20"/>
                 <w:lang w:val="en-CA"/>
               </w:rPr>
-              <w:t>{d.attachments[i].takenBy.lastName:ifEM:hideBegin}</w:t>
-            </w:r>
-            <w:r>
-              <w:rPr>
-                <w:rFonts w:ascii="BC Sans" w:hAnsi="BC Sans"/>
-                <w:sz w:val="20"/>
-                <w:szCs w:val="20"/>
-                <w:lang w:val="en-CA"/>
-              </w:rPr>
               <w:t>{d.attachments[i].takenBy</w:t>
             </w:r>
             <w:r>
@@ -2478,7 +2607,25 @@
                 <w:szCs w:val="20"/>
                 <w:lang w:val="en-CA"/>
               </w:rPr>
-              <w:t>{d.attachments[i].takenBy.lastName:hideEnd}</w:t>
+              <w:t>{d.attachments[i].takenBy.</w:t>
+            </w:r>
+            <w:r>
+              <w:rPr>
+                <w:rFonts w:ascii="BC Sans" w:hAnsi="BC Sans"/>
+                <w:sz w:val="20"/>
+                <w:szCs w:val="20"/>
+                <w:lang w:val="en-CA"/>
+              </w:rPr>
+              <w:t>location</w:t>
+            </w:r>
+            <w:r>
+              <w:rPr>
+                <w:rFonts w:ascii="BC Sans" w:hAnsi="BC Sans"/>
+                <w:sz w:val="20"/>
+                <w:szCs w:val="20"/>
+                <w:lang w:val="en-CA"/>
+              </w:rPr>
+              <w:t>:ifEM:hideBegin}</w:t>
             </w:r>
           </w:p>
         </w:tc>
@@ -2515,6 +2662,18 @@
                 <w:szCs w:val="20"/>
                 <w:lang w:val="en-CA"/>
               </w:rPr>
+              <w:t>{d.attachments[i].takenBy.lastName:hideEnd}</w:t>
+            </w:r>
+            <w:r>
+              <w:rPr>
+                <w:rFonts w:ascii="BC Sans" w:hAnsi="BC Sans"/>
+                <w:b w:val="0"/>
+                <w:bCs w:val="0"/>
+                <w:caps w:val="0"/>
+                <w:sz w:val="20"/>
+                <w:szCs w:val="20"/>
+                <w:lang w:val="en-CA"/>
+              </w:rPr>
               <w:t>Location</w:t>
             </w:r>
           </w:p>
@@ -2541,6 +2700,51 @@
                 <w:lang w:val="en-CA"/>
               </w:rPr>
               <w:t>{d.attachments[i].location}</w:t>
+            </w:r>
+            <w:r>
+              <w:rPr>
+                <w:rFonts w:ascii="BC Sans" w:hAnsi="BC Sans"/>
+                <w:sz w:val="20"/>
+                <w:szCs w:val="20"/>
+                <w:lang w:val="en-CA"/>
+              </w:rPr>
+              <w:t>{d.attachments[i].takenBy.</w:t>
+            </w:r>
+            <w:r>
+              <w:rPr>
+                <w:rFonts w:ascii="BC Sans" w:hAnsi="BC Sans"/>
+                <w:sz w:val="20"/>
+                <w:szCs w:val="20"/>
+                <w:lang w:val="en-CA"/>
+              </w:rPr>
+              <w:t>location</w:t>
+            </w:r>
+            <w:r>
+              <w:rPr>
+                <w:rFonts w:ascii="BC Sans" w:hAnsi="BC Sans"/>
+                <w:sz w:val="20"/>
+                <w:szCs w:val="20"/>
+                <w:lang w:val="en-CA"/>
+              </w:rPr>
+              <w:t>:hide</w:t>
+            </w:r>
+            <w:r>
+              <w:rPr>
+                <w:rFonts w:ascii="BC Sans" w:hAnsi="BC Sans"/>
+                <w:sz w:val="20"/>
+                <w:szCs w:val="20"/>
+                <w:lang w:val="en-CA"/>
+              </w:rPr>
+              <w:t>End</w:t>
+            </w:r>
+            <w:r>
+              <w:rPr>
+                <w:rFonts w:ascii="BC Sans" w:hAnsi="BC Sans"/>
+                <w:sz w:val="20"/>
+                <w:szCs w:val="20"/>
+                <w:lang w:val="en-CA"/>
+              </w:rPr>
+              <w:t>}</w:t>
             </w:r>
           </w:p>
         </w:tc>
@@ -2553,6 +2757,7 @@
           <w:rFonts w:ascii="BC Sans" w:hAnsi="BC Sans"/>
           <w:sz w:val="20"/>
           <w:szCs w:val="20"/>
+          <w:lang w:val="en-CA"/>
         </w:rPr>
       </w:pPr>
     </w:p>
@@ -4444,15 +4649,6 @@
 </file>
 
 <file path=customXml/item2.xml><?xml version="1.0" encoding="utf-8"?>
-<?mso-contentType ?>
-<FormTemplates xmlns="http://schemas.microsoft.com/sharepoint/v3/contenttype/forms">
-  <Display>DocumentLibraryForm</Display>
-  <Edit>DocumentLibraryForm</Edit>
-  <New>DocumentLibraryForm</New>
-</FormTemplates>
-</file>
-
-<file path=customXml/item3.xml><?xml version="1.0" encoding="utf-8"?>
 <ct:contentTypeSchema xmlns:ct="http://schemas.microsoft.com/office/2006/metadata/contentType" xmlns:ma="http://schemas.microsoft.com/office/2006/metadata/properties/metaAttributes" ct:_="" ma:_="" ma:contentTypeName="Document" ma:contentTypeID="0x010100ED0089B3ED392A4CB3C10705735CFAD3" ma:contentTypeVersion="15" ma:contentTypeDescription="Create a new document." ma:contentTypeScope="" ma:versionID="e9715c4352d5d9c94cf397f6db7911f6">
   <xsd:schema xmlns:xsd="http://www.w3.org/2001/XMLSchema" xmlns:xs="http://www.w3.org/2001/XMLSchema" xmlns:p="http://schemas.microsoft.com/office/2006/metadata/properties" xmlns:ns2="aa9c99c1-69c1-4b58-9df5-4d4796c46f8a" xmlns:ns3="cbeac988-4fd5-47cf-ad03-89cc7678fa90" targetNamespace="http://schemas.microsoft.com/office/2006/metadata/properties" ma:root="true" ma:fieldsID="4a7b24a40f906d6832371abf7aef78d6" ns2:_="" ns3:_="">
     <xsd:import namespace="aa9c99c1-69c1-4b58-9df5-4d4796c46f8a"/>
@@ -4687,6 +4883,15 @@
 </ct:contentTypeSchema>
 </file>
 
+<file path=customXml/item3.xml><?xml version="1.0" encoding="utf-8"?>
+<?mso-contentType ?>
+<FormTemplates xmlns="http://schemas.microsoft.com/sharepoint/v3/contenttype/forms">
+  <Display>DocumentLibraryForm</Display>
+  <Edit>DocumentLibraryForm</Edit>
+  <New>DocumentLibraryForm</New>
+</FormTemplates>
+</file>
+
 <file path=customXml/itemProps1.xml><?xml version="1.0" encoding="utf-8"?>
 <ds:datastoreItem xmlns:ds="http://schemas.openxmlformats.org/officeDocument/2006/customXml" ds:itemID="{C6C5DCE0-D69C-4B6E-96D9-C69B23DE6D4A}">
   <ds:schemaRefs>
@@ -4699,14 +4904,6 @@
 </file>
 
 <file path=customXml/itemProps2.xml><?xml version="1.0" encoding="utf-8"?>
-<ds:datastoreItem xmlns:ds="http://schemas.openxmlformats.org/officeDocument/2006/customXml" ds:itemID="{4BECF9F2-3A10-48CC-8D31-4F6E8664527E}">
-  <ds:schemaRefs>
-    <ds:schemaRef ds:uri="http://schemas.microsoft.com/sharepoint/v3/contenttype/forms"/>
-  </ds:schemaRefs>
-</ds:datastoreItem>
-</file>
-
-<file path=customXml/itemProps3.xml><?xml version="1.0" encoding="utf-8"?>
 <ds:datastoreItem xmlns:ds="http://schemas.openxmlformats.org/officeDocument/2006/customXml" ds:itemID="{26FF9410-7F49-4DD5-9478-D670A139DF54}">
   <ds:schemaRefs>
     <ds:schemaRef ds:uri="http://schemas.microsoft.com/office/2006/metadata/contentType"/>
@@ -4723,4 +4920,12 @@
     <ds:schemaRef ds:uri="http://schemas.microsoft.com/internal/obd"/>
   </ds:schemaRefs>
 </ds:datastoreItem>
+</file>
+
+<file path=customXml/itemProps3.xml><?xml version="1.0" encoding="utf-8"?>
+<ds:datastoreItem xmlns:ds="http://schemas.openxmlformats.org/officeDocument/2006/customXml" ds:itemID="{4BECF9F2-3A10-48CC-8D31-4F6E8664527E}">
+  <ds:schemaRefs>
+    <ds:schemaRef ds:uri="http://schemas.microsoft.com/sharepoint/v3/contenttype/forms"/>
+  </ds:schemaRefs>
+</ds:datastoreItem>
 </file>
</xml_diff>

<commit_message>
feat: updates to TDF
</commit_message>
<xml_diff>
--- a/backend/templates/task/CDOGS-TDR-TEMPLATE-v1.docx
+++ b/backend/templates/task/CDOGS-TDR-TEMPLATE-v1.docx
@@ -22,7 +22,18 @@
           <w:szCs w:val="32"/>
           <w:lang w:val="en-CA"/>
         </w:rPr>
-        <w:t>Task Detail Form (TDF)</w:t>
+        <w:t xml:space="preserve">Task </w:t>
+      </w:r>
+      <w:r>
+        <w:rPr>
+          <w:rFonts w:ascii="BC Sans" w:hAnsi="BC Sans"/>
+          <w:b/>
+          <w:bCs/>
+          <w:sz w:val="32"/>
+          <w:szCs w:val="32"/>
+          <w:lang w:val="en-CA"/>
+        </w:rPr>
+        <w:t>Report</w:t>
       </w:r>
     </w:p>
     <w:tbl>
@@ -2227,7 +2238,7 @@
                 <w:szCs w:val="20"/>
                 <w:lang w:val="en-CA"/>
               </w:rPr>
-              <w:t>Sequence number</w:t>
+              <w:t>File type</w:t>
             </w:r>
           </w:p>
         </w:tc>
@@ -2253,7 +2264,7 @@
                 <w:szCs w:val="20"/>
                 <w:lang w:val="en-CA"/>
               </w:rPr>
-              <w:t>{d.attachments[i].sequenceNumber}</w:t>
+              <w:t>{d.attachments[i].fileType}</w:t>
             </w:r>
           </w:p>
         </w:tc>
@@ -2286,7 +2297,19 @@
                 <w:szCs w:val="20"/>
                 <w:lang w:val="en-CA"/>
               </w:rPr>
-              <w:t>File type</w:t>
+              <w:t>I</w:t>
+            </w:r>
+            <w:r>
+              <w:rPr>
+                <w:rFonts w:ascii="BC Sans" w:hAnsi="BC Sans"/>
+                <w:b w:val="0"/>
+                <w:bCs w:val="0"/>
+                <w:caps w:val="0"/>
+                <w:sz w:val="20"/>
+                <w:szCs w:val="20"/>
+                <w:lang w:val="en-CA"/>
+              </w:rPr>
+              <w:t>D</w:t>
             </w:r>
           </w:p>
         </w:tc>
@@ -2311,7 +2334,7 @@
                 <w:szCs w:val="20"/>
                 <w:lang w:val="en-CA"/>
               </w:rPr>
-              <w:t>{d.attachments[i].fileType}</w:t>
+              <w:t>{d.attachments[i].sequenceNumber}</w:t>
             </w:r>
           </w:p>
         </w:tc>
@@ -4649,6 +4672,15 @@
 </file>
 
 <file path=customXml/item2.xml><?xml version="1.0" encoding="utf-8"?>
+<?mso-contentType ?>
+<FormTemplates xmlns="http://schemas.microsoft.com/sharepoint/v3/contenttype/forms">
+  <Display>DocumentLibraryForm</Display>
+  <Edit>DocumentLibraryForm</Edit>
+  <New>DocumentLibraryForm</New>
+</FormTemplates>
+</file>
+
+<file path=customXml/item3.xml><?xml version="1.0" encoding="utf-8"?>
 <ct:contentTypeSchema xmlns:ct="http://schemas.microsoft.com/office/2006/metadata/contentType" xmlns:ma="http://schemas.microsoft.com/office/2006/metadata/properties/metaAttributes" ct:_="" ma:_="" ma:contentTypeName="Document" ma:contentTypeID="0x010100ED0089B3ED392A4CB3C10705735CFAD3" ma:contentTypeVersion="15" ma:contentTypeDescription="Create a new document." ma:contentTypeScope="" ma:versionID="e9715c4352d5d9c94cf397f6db7911f6">
   <xsd:schema xmlns:xsd="http://www.w3.org/2001/XMLSchema" xmlns:xs="http://www.w3.org/2001/XMLSchema" xmlns:p="http://schemas.microsoft.com/office/2006/metadata/properties" xmlns:ns2="aa9c99c1-69c1-4b58-9df5-4d4796c46f8a" xmlns:ns3="cbeac988-4fd5-47cf-ad03-89cc7678fa90" targetNamespace="http://schemas.microsoft.com/office/2006/metadata/properties" ma:root="true" ma:fieldsID="4a7b24a40f906d6832371abf7aef78d6" ns2:_="" ns3:_="">
     <xsd:import namespace="aa9c99c1-69c1-4b58-9df5-4d4796c46f8a"/>
@@ -4883,15 +4915,6 @@
 </ct:contentTypeSchema>
 </file>
 
-<file path=customXml/item3.xml><?xml version="1.0" encoding="utf-8"?>
-<?mso-contentType ?>
-<FormTemplates xmlns="http://schemas.microsoft.com/sharepoint/v3/contenttype/forms">
-  <Display>DocumentLibraryForm</Display>
-  <Edit>DocumentLibraryForm</Edit>
-  <New>DocumentLibraryForm</New>
-</FormTemplates>
-</file>
-
 <file path=customXml/itemProps1.xml><?xml version="1.0" encoding="utf-8"?>
 <ds:datastoreItem xmlns:ds="http://schemas.openxmlformats.org/officeDocument/2006/customXml" ds:itemID="{C6C5DCE0-D69C-4B6E-96D9-C69B23DE6D4A}">
   <ds:schemaRefs>
@@ -4904,6 +4927,14 @@
 </file>
 
 <file path=customXml/itemProps2.xml><?xml version="1.0" encoding="utf-8"?>
+<ds:datastoreItem xmlns:ds="http://schemas.openxmlformats.org/officeDocument/2006/customXml" ds:itemID="{4BECF9F2-3A10-48CC-8D31-4F6E8664527E}">
+  <ds:schemaRefs>
+    <ds:schemaRef ds:uri="http://schemas.microsoft.com/sharepoint/v3/contenttype/forms"/>
+  </ds:schemaRefs>
+</ds:datastoreItem>
+</file>
+
+<file path=customXml/itemProps3.xml><?xml version="1.0" encoding="utf-8"?>
 <ds:datastoreItem xmlns:ds="http://schemas.openxmlformats.org/officeDocument/2006/customXml" ds:itemID="{26FF9410-7F49-4DD5-9478-D670A139DF54}">
   <ds:schemaRefs>
     <ds:schemaRef ds:uri="http://schemas.microsoft.com/office/2006/metadata/contentType"/>
@@ -4920,12 +4951,4 @@
     <ds:schemaRef ds:uri="http://schemas.microsoft.com/internal/obd"/>
   </ds:schemaRefs>
 </ds:datastoreItem>
-</file>
-
-<file path=customXml/itemProps3.xml><?xml version="1.0" encoding="utf-8"?>
-<ds:datastoreItem xmlns:ds="http://schemas.openxmlformats.org/officeDocument/2006/customXml" ds:itemID="{4BECF9F2-3A10-48CC-8D31-4F6E8664527E}">
-  <ds:schemaRefs>
-    <ds:schemaRef ds:uri="http://schemas.microsoft.com/sharepoint/v3/contenttype/forms"/>
-  </ds:schemaRefs>
-</ds:datastoreItem>
 </file>
</xml_diff>

<commit_message>
feat: updates to TDF (#1532)
Co-authored-by: team-wolverine-nrm-repo-updater[bot] <203337993+team-wolverine-nrm-repo-updater[bot]@users.noreply.github.com>
</commit_message>
<xml_diff>
--- a/backend/templates/task/CDOGS-TDR-TEMPLATE-v1.docx
+++ b/backend/templates/task/CDOGS-TDR-TEMPLATE-v1.docx
@@ -22,7 +22,18 @@
           <w:szCs w:val="32"/>
           <w:lang w:val="en-CA"/>
         </w:rPr>
-        <w:t>Task Detail Form (TDF)</w:t>
+        <w:t xml:space="preserve">Task </w:t>
+      </w:r>
+      <w:r>
+        <w:rPr>
+          <w:rFonts w:ascii="BC Sans" w:hAnsi="BC Sans"/>
+          <w:b/>
+          <w:bCs/>
+          <w:sz w:val="32"/>
+          <w:szCs w:val="32"/>
+          <w:lang w:val="en-CA"/>
+        </w:rPr>
+        <w:t>Report</w:t>
       </w:r>
     </w:p>
     <w:tbl>
@@ -2227,7 +2238,7 @@
                 <w:szCs w:val="20"/>
                 <w:lang w:val="en-CA"/>
               </w:rPr>
-              <w:t>Sequence number</w:t>
+              <w:t>File type</w:t>
             </w:r>
           </w:p>
         </w:tc>
@@ -2253,7 +2264,7 @@
                 <w:szCs w:val="20"/>
                 <w:lang w:val="en-CA"/>
               </w:rPr>
-              <w:t>{d.attachments[i].sequenceNumber}</w:t>
+              <w:t>{d.attachments[i].fileType}</w:t>
             </w:r>
           </w:p>
         </w:tc>
@@ -2286,7 +2297,19 @@
                 <w:szCs w:val="20"/>
                 <w:lang w:val="en-CA"/>
               </w:rPr>
-              <w:t>File type</w:t>
+              <w:t>I</w:t>
+            </w:r>
+            <w:r>
+              <w:rPr>
+                <w:rFonts w:ascii="BC Sans" w:hAnsi="BC Sans"/>
+                <w:b w:val="0"/>
+                <w:bCs w:val="0"/>
+                <w:caps w:val="0"/>
+                <w:sz w:val="20"/>
+                <w:szCs w:val="20"/>
+                <w:lang w:val="en-CA"/>
+              </w:rPr>
+              <w:t>D</w:t>
             </w:r>
           </w:p>
         </w:tc>
@@ -2311,7 +2334,7 @@
                 <w:szCs w:val="20"/>
                 <w:lang w:val="en-CA"/>
               </w:rPr>
-              <w:t>{d.attachments[i].fileType}</w:t>
+              <w:t>{d.attachments[i].sequenceNumber}</w:t>
             </w:r>
           </w:p>
         </w:tc>
@@ -4649,6 +4672,15 @@
 </file>
 
 <file path=customXml/item2.xml><?xml version="1.0" encoding="utf-8"?>
+<?mso-contentType ?>
+<FormTemplates xmlns="http://schemas.microsoft.com/sharepoint/v3/contenttype/forms">
+  <Display>DocumentLibraryForm</Display>
+  <Edit>DocumentLibraryForm</Edit>
+  <New>DocumentLibraryForm</New>
+</FormTemplates>
+</file>
+
+<file path=customXml/item3.xml><?xml version="1.0" encoding="utf-8"?>
 <ct:contentTypeSchema xmlns:ct="http://schemas.microsoft.com/office/2006/metadata/contentType" xmlns:ma="http://schemas.microsoft.com/office/2006/metadata/properties/metaAttributes" ct:_="" ma:_="" ma:contentTypeName="Document" ma:contentTypeID="0x010100ED0089B3ED392A4CB3C10705735CFAD3" ma:contentTypeVersion="15" ma:contentTypeDescription="Create a new document." ma:contentTypeScope="" ma:versionID="e9715c4352d5d9c94cf397f6db7911f6">
   <xsd:schema xmlns:xsd="http://www.w3.org/2001/XMLSchema" xmlns:xs="http://www.w3.org/2001/XMLSchema" xmlns:p="http://schemas.microsoft.com/office/2006/metadata/properties" xmlns:ns2="aa9c99c1-69c1-4b58-9df5-4d4796c46f8a" xmlns:ns3="cbeac988-4fd5-47cf-ad03-89cc7678fa90" targetNamespace="http://schemas.microsoft.com/office/2006/metadata/properties" ma:root="true" ma:fieldsID="4a7b24a40f906d6832371abf7aef78d6" ns2:_="" ns3:_="">
     <xsd:import namespace="aa9c99c1-69c1-4b58-9df5-4d4796c46f8a"/>
@@ -4883,15 +4915,6 @@
 </ct:contentTypeSchema>
 </file>
 
-<file path=customXml/item3.xml><?xml version="1.0" encoding="utf-8"?>
-<?mso-contentType ?>
-<FormTemplates xmlns="http://schemas.microsoft.com/sharepoint/v3/contenttype/forms">
-  <Display>DocumentLibraryForm</Display>
-  <Edit>DocumentLibraryForm</Edit>
-  <New>DocumentLibraryForm</New>
-</FormTemplates>
-</file>
-
 <file path=customXml/itemProps1.xml><?xml version="1.0" encoding="utf-8"?>
 <ds:datastoreItem xmlns:ds="http://schemas.openxmlformats.org/officeDocument/2006/customXml" ds:itemID="{C6C5DCE0-D69C-4B6E-96D9-C69B23DE6D4A}">
   <ds:schemaRefs>
@@ -4904,6 +4927,14 @@
 </file>
 
 <file path=customXml/itemProps2.xml><?xml version="1.0" encoding="utf-8"?>
+<ds:datastoreItem xmlns:ds="http://schemas.openxmlformats.org/officeDocument/2006/customXml" ds:itemID="{4BECF9F2-3A10-48CC-8D31-4F6E8664527E}">
+  <ds:schemaRefs>
+    <ds:schemaRef ds:uri="http://schemas.microsoft.com/sharepoint/v3/contenttype/forms"/>
+  </ds:schemaRefs>
+</ds:datastoreItem>
+</file>
+
+<file path=customXml/itemProps3.xml><?xml version="1.0" encoding="utf-8"?>
 <ds:datastoreItem xmlns:ds="http://schemas.openxmlformats.org/officeDocument/2006/customXml" ds:itemID="{26FF9410-7F49-4DD5-9478-D670A139DF54}">
   <ds:schemaRefs>
     <ds:schemaRef ds:uri="http://schemas.microsoft.com/office/2006/metadata/contentType"/>
@@ -4920,12 +4951,4 @@
     <ds:schemaRef ds:uri="http://schemas.microsoft.com/internal/obd"/>
   </ds:schemaRefs>
 </ds:datastoreItem>
-</file>
-
-<file path=customXml/itemProps3.xml><?xml version="1.0" encoding="utf-8"?>
-<ds:datastoreItem xmlns:ds="http://schemas.openxmlformats.org/officeDocument/2006/customXml" ds:itemID="{4BECF9F2-3A10-48CC-8D31-4F6E8664527E}">
-  <ds:schemaRefs>
-    <ds:schemaRef ds:uri="http://schemas.microsoft.com/sharepoint/v3/contenttype/forms"/>
-  </ds:schemaRefs>
-</ds:datastoreItem>
 </file>
</xml_diff>

<commit_message>
feat: update to task export
</commit_message>
<xml_diff>
--- a/backend/templates/task/CDOGS-TDR-TEMPLATE-v1.docx
+++ b/backend/templates/task/CDOGS-TDR-TEMPLATE-v1.docx
@@ -1901,7 +1901,7 @@
                 <w:szCs w:val="20"/>
                 <w:lang w:val="en-CA"/>
               </w:rPr>
-              <w:t>Description</w:t>
+              <w:t>Property type</w:t>
             </w:r>
           </w:p>
         </w:tc>
@@ -1915,7 +1915,6 @@
               <w:right w:val="nil"/>
             </w:tcBorders>
             <w:shd w:val="clear" w:color="auto" w:fill="F2F2F2"/>
-            <w:hideMark/>
           </w:tcPr>
           <w:p>
             <w:pPr>
@@ -1934,7 +1933,292 @@
                 <w:szCs w:val="20"/>
                 <w:lang w:val="en-CA"/>
               </w:rPr>
+              <w:t>{d.exhibits[i].propertyType}</w:t>
+            </w:r>
+          </w:p>
+        </w:tc>
+      </w:tr>
+      <w:tr>
+        <w:trPr>
+          <w:trHeight w:val="300"/>
+        </w:trPr>
+        <w:tc>
+          <w:tcPr>
+            <w:tcW w:w="2700" w:type="dxa"/>
+            <w:tcBorders>
+              <w:top w:val="nil"/>
+              <w:left w:val="nil"/>
+              <w:bottom w:val="nil"/>
+              <w:right w:val="single" w:sz="6" w:space="0" w:color="7F7F7F"/>
+            </w:tcBorders>
+            <w:shd w:val="clear" w:color="auto" w:fill="FFFFFF" w:themeFill="background1"/>
+          </w:tcPr>
+          <w:p>
+            <w:pPr>
+              <w:spacing w:after="0"/>
+              <w:rPr>
+                <w:rFonts w:ascii="BC Sans" w:hAnsi="BC Sans"/>
+                <w:sz w:val="20"/>
+                <w:szCs w:val="20"/>
+                <w:lang w:val="en-CA"/>
+              </w:rPr>
+            </w:pPr>
+            <w:r>
+              <w:rPr>
+                <w:rFonts w:ascii="BC Sans" w:hAnsi="BC Sans"/>
+                <w:sz w:val="20"/>
+                <w:szCs w:val="20"/>
+                <w:lang w:val="en-CA"/>
+              </w:rPr>
+              <w:t>Item description</w:t>
+            </w:r>
+          </w:p>
+        </w:tc>
+        <w:tc>
+          <w:tcPr>
+            <w:tcW w:w="8100" w:type="dxa"/>
+            <w:tcBorders>
+              <w:top w:val="nil"/>
+              <w:left w:val="nil"/>
+              <w:bottom w:val="nil"/>
+              <w:right w:val="nil"/>
+            </w:tcBorders>
+            <w:shd w:val="clear" w:color="auto" w:fill="FFFFFF" w:themeFill="background1"/>
+          </w:tcPr>
+          <w:p>
+            <w:pPr>
+              <w:spacing w:after="0"/>
+              <w:rPr>
+                <w:rFonts w:ascii="BC Sans" w:hAnsi="BC Sans"/>
+                <w:sz w:val="20"/>
+                <w:szCs w:val="20"/>
+                <w:lang w:val="en-CA"/>
+              </w:rPr>
+            </w:pPr>
+            <w:r>
+              <w:rPr>
+                <w:rFonts w:ascii="BC Sans" w:hAnsi="BC Sans"/>
+                <w:sz w:val="20"/>
+                <w:szCs w:val="20"/>
+                <w:lang w:val="en-CA"/>
+              </w:rPr>
               <w:t>{d.exhibits[i].description}</w:t>
+            </w:r>
+          </w:p>
+        </w:tc>
+      </w:tr>
+      <w:tr>
+        <w:trPr>
+          <w:trHeight w:val="300"/>
+        </w:trPr>
+        <w:tc>
+          <w:tcPr>
+            <w:tcW w:w="2700" w:type="dxa"/>
+            <w:tcBorders>
+              <w:top w:val="nil"/>
+              <w:left w:val="nil"/>
+              <w:bottom w:val="nil"/>
+              <w:right w:val="single" w:sz="6" w:space="0" w:color="7F7F7F"/>
+            </w:tcBorders>
+            <w:shd w:val="clear" w:color="auto" w:fill="F2F2F2"/>
+          </w:tcPr>
+          <w:p>
+            <w:pPr>
+              <w:spacing w:after="0"/>
+              <w:rPr>
+                <w:rFonts w:ascii="BC Sans" w:hAnsi="BC Sans"/>
+                <w:sz w:val="20"/>
+                <w:szCs w:val="20"/>
+                <w:lang w:val="en-CA"/>
+              </w:rPr>
+            </w:pPr>
+            <w:r>
+              <w:rPr>
+                <w:rFonts w:ascii="BC Sans" w:hAnsi="BC Sans"/>
+                <w:sz w:val="20"/>
+                <w:szCs w:val="20"/>
+                <w:lang w:val="en-CA"/>
+              </w:rPr>
+              <w:t>Quantity</w:t>
+            </w:r>
+          </w:p>
+        </w:tc>
+        <w:tc>
+          <w:tcPr>
+            <w:tcW w:w="8100" w:type="dxa"/>
+            <w:tcBorders>
+              <w:top w:val="nil"/>
+              <w:left w:val="nil"/>
+              <w:bottom w:val="nil"/>
+              <w:right w:val="nil"/>
+            </w:tcBorders>
+            <w:shd w:val="clear" w:color="auto" w:fill="F2F2F2"/>
+          </w:tcPr>
+          <w:p>
+            <w:pPr>
+              <w:spacing w:after="0"/>
+              <w:rPr>
+                <w:rFonts w:ascii="BC Sans" w:hAnsi="BC Sans"/>
+                <w:sz w:val="20"/>
+                <w:szCs w:val="20"/>
+                <w:lang w:val="en-CA"/>
+              </w:rPr>
+            </w:pPr>
+            <w:r>
+              <w:rPr>
+                <w:rFonts w:ascii="BC Sans" w:hAnsi="BC Sans"/>
+                <w:sz w:val="20"/>
+                <w:szCs w:val="20"/>
+                <w:lang w:val="en-CA"/>
+              </w:rPr>
+              <w:t>{d.exhibits[i].quantity}</w:t>
+            </w:r>
+          </w:p>
+        </w:tc>
+      </w:tr>
+      <w:tr>
+        <w:trPr>
+          <w:trHeight w:val="300"/>
+        </w:trPr>
+        <w:tc>
+          <w:tcPr>
+            <w:tcW w:w="2700" w:type="dxa"/>
+            <w:tcBorders>
+              <w:top w:val="nil"/>
+              <w:left w:val="nil"/>
+              <w:bottom w:val="nil"/>
+              <w:right w:val="single" w:sz="6" w:space="0" w:color="7F7F7F"/>
+            </w:tcBorders>
+            <w:shd w:val="clear" w:color="auto" w:fill="FFFFFF" w:themeFill="background1"/>
+          </w:tcPr>
+          <w:p>
+            <w:pPr>
+              <w:spacing w:after="0"/>
+              <w:rPr>
+                <w:rFonts w:ascii="BC Sans" w:hAnsi="BC Sans"/>
+                <w:sz w:val="20"/>
+                <w:szCs w:val="20"/>
+                <w:lang w:val="en-CA"/>
+              </w:rPr>
+            </w:pPr>
+            <w:r>
+              <w:rPr>
+                <w:rFonts w:ascii="BC Sans" w:hAnsi="BC Sans"/>
+                <w:sz w:val="20"/>
+                <w:szCs w:val="20"/>
+                <w:lang w:val="en-CA"/>
+              </w:rPr>
+              <w:t>Officer</w:t>
+            </w:r>
+          </w:p>
+        </w:tc>
+        <w:tc>
+          <w:tcPr>
+            <w:tcW w:w="8100" w:type="dxa"/>
+            <w:tcBorders>
+              <w:top w:val="nil"/>
+              <w:left w:val="nil"/>
+              <w:bottom w:val="nil"/>
+              <w:right w:val="nil"/>
+            </w:tcBorders>
+            <w:shd w:val="clear" w:color="auto" w:fill="FFFFFF" w:themeFill="background1"/>
+          </w:tcPr>
+          <w:p>
+            <w:pPr>
+              <w:spacing w:after="0"/>
+              <w:rPr>
+                <w:rFonts w:ascii="BC Sans" w:hAnsi="BC Sans"/>
+                <w:sz w:val="20"/>
+                <w:szCs w:val="20"/>
+                <w:lang w:val="en-CA"/>
+              </w:rPr>
+            </w:pPr>
+            <w:r>
+              <w:rPr>
+                <w:rFonts w:ascii="BC Sans" w:hAnsi="BC Sans"/>
+                <w:sz w:val="20"/>
+                <w:szCs w:val="20"/>
+                <w:lang w:val="en-CA"/>
+              </w:rPr>
+              <w:t>{d.exhibits[i].collectedBy.lastName}, {d.exhibits[i].collectedBy.firstName}</w:t>
+            </w:r>
+          </w:p>
+        </w:tc>
+      </w:tr>
+      <w:tr>
+        <w:trPr>
+          <w:trHeight w:val="300"/>
+        </w:trPr>
+        <w:tc>
+          <w:tcPr>
+            <w:tcW w:w="2700" w:type="dxa"/>
+            <w:tcBorders>
+              <w:top w:val="nil"/>
+              <w:left w:val="nil"/>
+              <w:bottom w:val="nil"/>
+              <w:right w:val="single" w:sz="6" w:space="0" w:color="7F7F7F"/>
+            </w:tcBorders>
+            <w:shd w:val="clear" w:color="auto" w:fill="F2F2F2"/>
+          </w:tcPr>
+          <w:p>
+            <w:pPr>
+              <w:spacing w:after="0"/>
+              <w:rPr>
+                <w:rFonts w:ascii="BC Sans" w:hAnsi="BC Sans"/>
+                <w:sz w:val="20"/>
+                <w:szCs w:val="20"/>
+                <w:lang w:val="en-CA"/>
+              </w:rPr>
+            </w:pPr>
+            <w:r>
+              <w:rPr>
+                <w:rFonts w:ascii="BC Sans" w:hAnsi="BC Sans"/>
+                <w:sz w:val="20"/>
+                <w:szCs w:val="20"/>
+                <w:lang w:val="en-CA"/>
+              </w:rPr>
+              <w:t>Date/time of intake</w:t>
+            </w:r>
+          </w:p>
+        </w:tc>
+        <w:tc>
+          <w:tcPr>
+            <w:tcW w:w="8100" w:type="dxa"/>
+            <w:tcBorders>
+              <w:top w:val="nil"/>
+              <w:left w:val="nil"/>
+              <w:bottom w:val="nil"/>
+              <w:right w:val="nil"/>
+            </w:tcBorders>
+            <w:shd w:val="clear" w:color="auto" w:fill="F2F2F2"/>
+          </w:tcPr>
+          <w:p>
+            <w:pPr>
+              <w:spacing w:after="0"/>
+              <w:rPr>
+                <w:rFonts w:ascii="BC Sans" w:hAnsi="BC Sans"/>
+                <w:sz w:val="20"/>
+                <w:szCs w:val="20"/>
+                <w:lang w:val="en-CA"/>
+              </w:rPr>
+            </w:pPr>
+            <w:r>
+              <w:rPr>
+                <w:rFonts w:ascii="BC Sans" w:hAnsi="BC Sans"/>
+                <w:sz w:val="20"/>
+                <w:szCs w:val="20"/>
+                <w:lang w:val="en-CA"/>
+              </w:rPr>
+              <w:t>{d.exhibits[i].dateCollected}</w:t>
+            </w:r>
+            <w:r>
+              <w:rPr>
+                <w:rFonts w:ascii="BC Sans" w:hAnsi="BC Sans"/>
+                <w:sz w:val="20"/>
+                <w:szCs w:val="20"/>
+                <w:lang w:val="en-CA"/>
+              </w:rPr>
+              <w:t xml:space="preserve"> {d.exhibits[i].intakeTime }</w:t>
             </w:r>
           </w:p>
         </w:tc>
@@ -1971,7 +2255,7 @@
                 <w:szCs w:val="20"/>
                 <w:lang w:val="en-CA"/>
               </w:rPr>
-              <w:t>Date collected</w:t>
+              <w:t>Location of intake</w:t>
             </w:r>
           </w:p>
         </w:tc>
@@ -2003,7 +2287,7 @@
                 <w:szCs w:val="20"/>
                 <w:lang w:val="en-CA"/>
               </w:rPr>
-              <w:t>{d.exhibits[i].dateCollected}</w:t>
+              <w:t>{d.exhibits[i].locationOfIntake}</w:t>
             </w:r>
           </w:p>
         </w:tc>
@@ -2041,7 +2325,7 @@
                 <w:szCs w:val="20"/>
                 <w:lang w:val="en-CA"/>
               </w:rPr>
-              <w:t>Officer collected</w:t>
+              <w:t>Property tag number</w:t>
             </w:r>
           </w:p>
         </w:tc>
@@ -2055,7 +2339,6 @@
               <w:right w:val="nil"/>
             </w:tcBorders>
             <w:shd w:val="clear" w:color="auto" w:fill="F2F2F2"/>
-            <w:hideMark/>
           </w:tcPr>
           <w:p>
             <w:pPr>
@@ -2074,7 +2357,410 @@
                 <w:szCs w:val="20"/>
                 <w:lang w:val="en-CA"/>
               </w:rPr>
-              <w:t>{d.exhibits[i].collectedBy.lastName}, {d.exhibits[i].collectedBy.firstName}</w:t>
+              <w:t>{d.exhibits[i].propertyTagNumber}</w:t>
+            </w:r>
+            <w:r>
+              <w:rPr>
+                <w:rFonts w:ascii="BC Sans" w:hAnsi="BC Sans"/>
+                <w:sz w:val="20"/>
+                <w:szCs w:val="20"/>
+                <w:lang w:val="en-CA"/>
+              </w:rPr>
+              <w:t>{d.</w:t>
+            </w:r>
+            <w:r>
+              <w:rPr>
+                <w:rFonts w:ascii="BC Sans" w:hAnsi="BC Sans"/>
+                <w:sz w:val="20"/>
+                <w:szCs w:val="20"/>
+                <w:lang w:val="en-CA"/>
+              </w:rPr>
+              <w:t>exhibits</w:t>
+            </w:r>
+            <w:r>
+              <w:rPr>
+                <w:rFonts w:ascii="BC Sans" w:hAnsi="BC Sans"/>
+                <w:sz w:val="20"/>
+                <w:szCs w:val="20"/>
+                <w:lang w:val="en-CA"/>
+              </w:rPr>
+              <w:t>[i].</w:t>
+            </w:r>
+            <w:r>
+              <w:rPr>
+                <w:rFonts w:ascii="BC Sans" w:hAnsi="BC Sans"/>
+                <w:sz w:val="20"/>
+                <w:szCs w:val="20"/>
+                <w:lang w:val="en-CA"/>
+              </w:rPr>
+              <w:t>isSeized</w:t>
+            </w:r>
+            <w:r>
+              <w:rPr>
+                <w:rFonts w:ascii="BC Sans" w:hAnsi="BC Sans"/>
+                <w:sz w:val="20"/>
+                <w:szCs w:val="20"/>
+                <w:lang w:val="en-CA"/>
+              </w:rPr>
+              <w:t>:ifE</w:t>
+            </w:r>
+            <w:r>
+              <w:rPr>
+                <w:rFonts w:ascii="BC Sans" w:hAnsi="BC Sans"/>
+                <w:sz w:val="20"/>
+                <w:szCs w:val="20"/>
+                <w:lang w:val="en-CA"/>
+              </w:rPr>
+              <w:t>Q(false)</w:t>
+            </w:r>
+            <w:r>
+              <w:rPr>
+                <w:rFonts w:ascii="BC Sans" w:hAnsi="BC Sans"/>
+                <w:sz w:val="20"/>
+                <w:szCs w:val="20"/>
+                <w:lang w:val="en-CA"/>
+              </w:rPr>
+              <w:t>:hideBegin}</w:t>
+            </w:r>
+          </w:p>
+        </w:tc>
+      </w:tr>
+      <w:tr>
+        <w:trPr>
+          <w:trHeight w:val="300"/>
+        </w:trPr>
+        <w:tc>
+          <w:tcPr>
+            <w:tcW w:w="2700" w:type="dxa"/>
+            <w:tcBorders>
+              <w:top w:val="nil"/>
+              <w:left w:val="nil"/>
+              <w:bottom w:val="nil"/>
+              <w:right w:val="single" w:sz="6" w:space="0" w:color="7F7F7F"/>
+            </w:tcBorders>
+            <w:shd w:val="clear" w:color="auto" w:fill="FFFFFF" w:themeFill="background1"/>
+          </w:tcPr>
+          <w:p>
+            <w:pPr>
+              <w:spacing w:after="0"/>
+              <w:rPr>
+                <w:rFonts w:ascii="BC Sans" w:hAnsi="BC Sans"/>
+                <w:sz w:val="20"/>
+                <w:szCs w:val="20"/>
+                <w:lang w:val="en-CA"/>
+              </w:rPr>
+            </w:pPr>
+            <w:r>
+              <w:rPr>
+                <w:rFonts w:ascii="BC Sans" w:hAnsi="BC Sans"/>
+                <w:sz w:val="20"/>
+                <w:szCs w:val="20"/>
+                <w:lang w:val="en-CA"/>
+              </w:rPr>
+              <w:t>Seized from first name</w:t>
+            </w:r>
+          </w:p>
+        </w:tc>
+        <w:tc>
+          <w:tcPr>
+            <w:tcW w:w="8100" w:type="dxa"/>
+            <w:tcBorders>
+              <w:top w:val="nil"/>
+              <w:left w:val="nil"/>
+              <w:bottom w:val="nil"/>
+              <w:right w:val="nil"/>
+            </w:tcBorders>
+            <w:shd w:val="clear" w:color="auto" w:fill="FFFFFF" w:themeFill="background1"/>
+          </w:tcPr>
+          <w:p>
+            <w:pPr>
+              <w:spacing w:after="0"/>
+              <w:rPr>
+                <w:rFonts w:ascii="BC Sans" w:hAnsi="BC Sans"/>
+                <w:sz w:val="20"/>
+                <w:szCs w:val="20"/>
+                <w:lang w:val="en-CA"/>
+              </w:rPr>
+            </w:pPr>
+            <w:r>
+              <w:rPr>
+                <w:rFonts w:ascii="BC Sans" w:hAnsi="BC Sans"/>
+                <w:sz w:val="20"/>
+                <w:szCs w:val="20"/>
+                <w:lang w:val="en-CA"/>
+              </w:rPr>
+              <w:t>{d.exhibits[i].seizedFromFirstName}</w:t>
+            </w:r>
+          </w:p>
+        </w:tc>
+      </w:tr>
+      <w:tr>
+        <w:trPr>
+          <w:trHeight w:val="300"/>
+        </w:trPr>
+        <w:tc>
+          <w:tcPr>
+            <w:tcW w:w="2700" w:type="dxa"/>
+            <w:tcBorders>
+              <w:top w:val="nil"/>
+              <w:left w:val="nil"/>
+              <w:bottom w:val="nil"/>
+              <w:right w:val="single" w:sz="6" w:space="0" w:color="7F7F7F"/>
+            </w:tcBorders>
+            <w:shd w:val="clear" w:color="auto" w:fill="F2F2F2"/>
+          </w:tcPr>
+          <w:p>
+            <w:pPr>
+              <w:spacing w:after="0"/>
+              <w:rPr>
+                <w:rFonts w:ascii="BC Sans" w:hAnsi="BC Sans"/>
+                <w:sz w:val="20"/>
+                <w:szCs w:val="20"/>
+                <w:lang w:val="en-CA"/>
+              </w:rPr>
+            </w:pPr>
+            <w:r>
+              <w:rPr>
+                <w:rFonts w:ascii="BC Sans" w:hAnsi="BC Sans"/>
+                <w:sz w:val="20"/>
+                <w:szCs w:val="20"/>
+                <w:lang w:val="en-CA"/>
+              </w:rPr>
+              <w:t>Seized from last name</w:t>
+            </w:r>
+          </w:p>
+        </w:tc>
+        <w:tc>
+          <w:tcPr>
+            <w:tcW w:w="8100" w:type="dxa"/>
+            <w:tcBorders>
+              <w:top w:val="nil"/>
+              <w:left w:val="nil"/>
+              <w:bottom w:val="nil"/>
+              <w:right w:val="nil"/>
+            </w:tcBorders>
+            <w:shd w:val="clear" w:color="auto" w:fill="F2F2F2"/>
+          </w:tcPr>
+          <w:p>
+            <w:pPr>
+              <w:spacing w:after="0"/>
+              <w:rPr>
+                <w:rFonts w:ascii="BC Sans" w:hAnsi="BC Sans"/>
+                <w:sz w:val="20"/>
+                <w:szCs w:val="20"/>
+                <w:lang w:val="en-CA"/>
+              </w:rPr>
+            </w:pPr>
+            <w:r>
+              <w:rPr>
+                <w:rFonts w:ascii="BC Sans" w:hAnsi="BC Sans"/>
+                <w:sz w:val="20"/>
+                <w:szCs w:val="20"/>
+                <w:lang w:val="en-CA"/>
+              </w:rPr>
+              <w:t>{d.exhibits[i].seizedFromLastName}</w:t>
+            </w:r>
+          </w:p>
+        </w:tc>
+      </w:tr>
+      <w:tr>
+        <w:trPr>
+          <w:trHeight w:val="300"/>
+        </w:trPr>
+        <w:tc>
+          <w:tcPr>
+            <w:tcW w:w="2700" w:type="dxa"/>
+            <w:tcBorders>
+              <w:top w:val="nil"/>
+              <w:left w:val="nil"/>
+              <w:bottom w:val="nil"/>
+              <w:right w:val="single" w:sz="6" w:space="0" w:color="7F7F7F"/>
+            </w:tcBorders>
+            <w:shd w:val="clear" w:color="auto" w:fill="FFFFFF" w:themeFill="background1"/>
+          </w:tcPr>
+          <w:p>
+            <w:pPr>
+              <w:spacing w:after="0"/>
+              <w:rPr>
+                <w:rFonts w:ascii="BC Sans" w:hAnsi="BC Sans"/>
+                <w:sz w:val="20"/>
+                <w:szCs w:val="20"/>
+                <w:lang w:val="en-CA"/>
+              </w:rPr>
+            </w:pPr>
+            <w:r>
+              <w:rPr>
+                <w:rFonts w:ascii="BC Sans" w:hAnsi="BC Sans"/>
+                <w:sz w:val="20"/>
+                <w:szCs w:val="20"/>
+                <w:lang w:val="en-CA"/>
+              </w:rPr>
+              <w:lastRenderedPageBreak/>
+              <w:t>Seized from address</w:t>
+            </w:r>
+          </w:p>
+        </w:tc>
+        <w:tc>
+          <w:tcPr>
+            <w:tcW w:w="8100" w:type="dxa"/>
+            <w:tcBorders>
+              <w:top w:val="nil"/>
+              <w:left w:val="nil"/>
+              <w:bottom w:val="nil"/>
+              <w:right w:val="nil"/>
+            </w:tcBorders>
+            <w:shd w:val="clear" w:color="auto" w:fill="FFFFFF" w:themeFill="background1"/>
+          </w:tcPr>
+          <w:p>
+            <w:pPr>
+              <w:spacing w:after="0"/>
+              <w:rPr>
+                <w:rFonts w:ascii="BC Sans" w:hAnsi="BC Sans"/>
+                <w:sz w:val="20"/>
+                <w:szCs w:val="20"/>
+                <w:lang w:val="en-CA"/>
+              </w:rPr>
+            </w:pPr>
+            <w:r>
+              <w:rPr>
+                <w:rFonts w:ascii="BC Sans" w:hAnsi="BC Sans"/>
+                <w:sz w:val="20"/>
+                <w:szCs w:val="20"/>
+                <w:lang w:val="en-CA"/>
+              </w:rPr>
+              <w:t>{d.exhibits[i].seizedFromAddress}</w:t>
+            </w:r>
+          </w:p>
+        </w:tc>
+      </w:tr>
+      <w:tr>
+        <w:trPr>
+          <w:trHeight w:val="300"/>
+        </w:trPr>
+        <w:tc>
+          <w:tcPr>
+            <w:tcW w:w="2700" w:type="dxa"/>
+            <w:tcBorders>
+              <w:top w:val="nil"/>
+              <w:left w:val="nil"/>
+              <w:bottom w:val="nil"/>
+              <w:right w:val="single" w:sz="6" w:space="0" w:color="7F7F7F"/>
+            </w:tcBorders>
+            <w:shd w:val="clear" w:color="auto" w:fill="F2F2F2"/>
+          </w:tcPr>
+          <w:p>
+            <w:pPr>
+              <w:spacing w:after="0"/>
+              <w:rPr>
+                <w:rFonts w:ascii="BC Sans" w:hAnsi="BC Sans"/>
+                <w:sz w:val="20"/>
+                <w:szCs w:val="20"/>
+                <w:lang w:val="en-CA"/>
+              </w:rPr>
+            </w:pPr>
+            <w:r>
+              <w:rPr>
+                <w:rFonts w:ascii="BC Sans" w:hAnsi="BC Sans"/>
+                <w:sz w:val="20"/>
+                <w:szCs w:val="20"/>
+                <w:lang w:val="en-CA"/>
+              </w:rPr>
+              <w:t>Seized from phone number</w:t>
+            </w:r>
+          </w:p>
+        </w:tc>
+        <w:tc>
+          <w:tcPr>
+            <w:tcW w:w="8100" w:type="dxa"/>
+            <w:tcBorders>
+              <w:top w:val="nil"/>
+              <w:left w:val="nil"/>
+              <w:bottom w:val="nil"/>
+              <w:right w:val="nil"/>
+            </w:tcBorders>
+            <w:shd w:val="clear" w:color="auto" w:fill="F2F2F2"/>
+          </w:tcPr>
+          <w:p>
+            <w:pPr>
+              <w:spacing w:after="0"/>
+              <w:rPr>
+                <w:rFonts w:ascii="BC Sans" w:hAnsi="BC Sans"/>
+                <w:sz w:val="20"/>
+                <w:szCs w:val="20"/>
+                <w:lang w:val="en-CA"/>
+              </w:rPr>
+            </w:pPr>
+            <w:r>
+              <w:rPr>
+                <w:rFonts w:ascii="BC Sans" w:hAnsi="BC Sans"/>
+                <w:sz w:val="20"/>
+                <w:szCs w:val="20"/>
+                <w:lang w:val="en-CA"/>
+              </w:rPr>
+              <w:t>{d.exhibits[i].seizedFromPhoneNumber}</w:t>
+            </w:r>
+            <w:r>
+              <w:rPr>
+                <w:rFonts w:ascii="BC Sans" w:hAnsi="BC Sans"/>
+                <w:sz w:val="20"/>
+                <w:szCs w:val="20"/>
+                <w:lang w:val="en-CA"/>
+              </w:rPr>
+              <w:t>{d.</w:t>
+            </w:r>
+            <w:r>
+              <w:rPr>
+                <w:rFonts w:ascii="BC Sans" w:hAnsi="BC Sans"/>
+                <w:sz w:val="20"/>
+                <w:szCs w:val="20"/>
+                <w:lang w:val="en-CA"/>
+              </w:rPr>
+              <w:t>exhibits</w:t>
+            </w:r>
+            <w:r>
+              <w:rPr>
+                <w:rFonts w:ascii="BC Sans" w:hAnsi="BC Sans"/>
+                <w:sz w:val="20"/>
+                <w:szCs w:val="20"/>
+                <w:lang w:val="en-CA"/>
+              </w:rPr>
+              <w:t>[i].</w:t>
+            </w:r>
+            <w:r>
+              <w:rPr>
+                <w:rFonts w:ascii="BC Sans" w:hAnsi="BC Sans"/>
+                <w:sz w:val="20"/>
+                <w:szCs w:val="20"/>
+                <w:lang w:val="en-CA"/>
+              </w:rPr>
+              <w:t>isSeized</w:t>
+            </w:r>
+            <w:r>
+              <w:rPr>
+                <w:rFonts w:ascii="BC Sans" w:hAnsi="BC Sans"/>
+                <w:sz w:val="20"/>
+                <w:szCs w:val="20"/>
+                <w:lang w:val="en-CA"/>
+              </w:rPr>
+              <w:t>:hid</w:t>
+            </w:r>
+            <w:r>
+              <w:rPr>
+                <w:rFonts w:ascii="BC Sans" w:hAnsi="BC Sans"/>
+                <w:sz w:val="20"/>
+                <w:szCs w:val="20"/>
+                <w:lang w:val="en-CA"/>
+              </w:rPr>
+              <w:t>eEnd</w:t>
+            </w:r>
+            <w:r>
+              <w:rPr>
+                <w:rFonts w:ascii="BC Sans" w:hAnsi="BC Sans"/>
+                <w:sz w:val="20"/>
+                <w:szCs w:val="20"/>
+                <w:lang w:val="en-CA"/>
+              </w:rPr>
+              <w:t>}</w:t>
             </w:r>
           </w:p>
         </w:tc>
@@ -2435,7 +3121,6 @@
                 <w:szCs w:val="20"/>
                 <w:lang w:val="en-CA"/>
               </w:rPr>
-              <w:lastRenderedPageBreak/>
               <w:t>Title</w:t>
             </w:r>
           </w:p>
@@ -4672,15 +5357,6 @@
 </file>
 
 <file path=customXml/item2.xml><?xml version="1.0" encoding="utf-8"?>
-<?mso-contentType ?>
-<FormTemplates xmlns="http://schemas.microsoft.com/sharepoint/v3/contenttype/forms">
-  <Display>DocumentLibraryForm</Display>
-  <Edit>DocumentLibraryForm</Edit>
-  <New>DocumentLibraryForm</New>
-</FormTemplates>
-</file>
-
-<file path=customXml/item3.xml><?xml version="1.0" encoding="utf-8"?>
 <ct:contentTypeSchema xmlns:ct="http://schemas.microsoft.com/office/2006/metadata/contentType" xmlns:ma="http://schemas.microsoft.com/office/2006/metadata/properties/metaAttributes" ct:_="" ma:_="" ma:contentTypeName="Document" ma:contentTypeID="0x010100ED0089B3ED392A4CB3C10705735CFAD3" ma:contentTypeVersion="15" ma:contentTypeDescription="Create a new document." ma:contentTypeScope="" ma:versionID="e9715c4352d5d9c94cf397f6db7911f6">
   <xsd:schema xmlns:xsd="http://www.w3.org/2001/XMLSchema" xmlns:xs="http://www.w3.org/2001/XMLSchema" xmlns:p="http://schemas.microsoft.com/office/2006/metadata/properties" xmlns:ns2="aa9c99c1-69c1-4b58-9df5-4d4796c46f8a" xmlns:ns3="cbeac988-4fd5-47cf-ad03-89cc7678fa90" targetNamespace="http://schemas.microsoft.com/office/2006/metadata/properties" ma:root="true" ma:fieldsID="4a7b24a40f906d6832371abf7aef78d6" ns2:_="" ns3:_="">
     <xsd:import namespace="aa9c99c1-69c1-4b58-9df5-4d4796c46f8a"/>
@@ -4915,6 +5591,15 @@
 </ct:contentTypeSchema>
 </file>
 
+<file path=customXml/item3.xml><?xml version="1.0" encoding="utf-8"?>
+<?mso-contentType ?>
+<FormTemplates xmlns="http://schemas.microsoft.com/sharepoint/v3/contenttype/forms">
+  <Display>DocumentLibraryForm</Display>
+  <Edit>DocumentLibraryForm</Edit>
+  <New>DocumentLibraryForm</New>
+</FormTemplates>
+</file>
+
 <file path=customXml/itemProps1.xml><?xml version="1.0" encoding="utf-8"?>
 <ds:datastoreItem xmlns:ds="http://schemas.openxmlformats.org/officeDocument/2006/customXml" ds:itemID="{C6C5DCE0-D69C-4B6E-96D9-C69B23DE6D4A}">
   <ds:schemaRefs>
@@ -4927,14 +5612,6 @@
 </file>
 
 <file path=customXml/itemProps2.xml><?xml version="1.0" encoding="utf-8"?>
-<ds:datastoreItem xmlns:ds="http://schemas.openxmlformats.org/officeDocument/2006/customXml" ds:itemID="{4BECF9F2-3A10-48CC-8D31-4F6E8664527E}">
-  <ds:schemaRefs>
-    <ds:schemaRef ds:uri="http://schemas.microsoft.com/sharepoint/v3/contenttype/forms"/>
-  </ds:schemaRefs>
-</ds:datastoreItem>
-</file>
-
-<file path=customXml/itemProps3.xml><?xml version="1.0" encoding="utf-8"?>
 <ds:datastoreItem xmlns:ds="http://schemas.openxmlformats.org/officeDocument/2006/customXml" ds:itemID="{26FF9410-7F49-4DD5-9478-D670A139DF54}">
   <ds:schemaRefs>
     <ds:schemaRef ds:uri="http://schemas.microsoft.com/office/2006/metadata/contentType"/>
@@ -4951,4 +5628,12 @@
     <ds:schemaRef ds:uri="http://schemas.microsoft.com/internal/obd"/>
   </ds:schemaRefs>
 </ds:datastoreItem>
+</file>
+
+<file path=customXml/itemProps3.xml><?xml version="1.0" encoding="utf-8"?>
+<ds:datastoreItem xmlns:ds="http://schemas.openxmlformats.org/officeDocument/2006/customXml" ds:itemID="{4BECF9F2-3A10-48CC-8D31-4F6E8664527E}">
+  <ds:schemaRefs>
+    <ds:schemaRef ds:uri="http://schemas.microsoft.com/sharepoint/v3/contenttype/forms"/>
+  </ds:schemaRefs>
+</ds:datastoreItem>
 </file>
</xml_diff>

<commit_message>
chore: store display number for sort and search
</commit_message>
<xml_diff>
--- a/backend/templates/task/CDOGS-TDR-TEMPLATE-v1.docx
+++ b/backend/templates/task/CDOGS-TDR-TEMPLATE-v1.docx
@@ -68,6 +68,7 @@
                 <w:szCs w:val="20"/>
               </w:rPr>
             </w:pPr>
+            <w:proofErr w:type="gramStart"/>
             <w:r>
               <w:rPr>
                 <w:rFonts w:ascii="BC Sans" w:eastAsia="Times New Roman" w:hAnsi="BC Sans" w:cs="Times New Roman"/>
@@ -112,6 +113,7 @@
               </w:rPr>
               <w:t>{</w:t>
             </w:r>
+            <w:proofErr w:type="spellStart"/>
             <w:r>
               <w:rPr>
                 <w:rFonts w:ascii="BC Sans" w:eastAsia="Times New Roman" w:hAnsi="BC Sans" w:cs="Times New Roman"/>
@@ -153,6 +155,8 @@
               </w:rPr>
               <w:t>Label</w:t>
             </w:r>
+            <w:proofErr w:type="spellEnd"/>
+            <w:proofErr w:type="gramEnd"/>
             <w:r>
               <w:rPr>
                 <w:rFonts w:ascii="BC Sans" w:eastAsia="Times New Roman" w:hAnsi="BC Sans" w:cs="Times New Roman"/>
@@ -184,7 +188,19 @@
                 <w:sz w:val="20"/>
                 <w:szCs w:val="20"/>
               </w:rPr>
-              <w:t>Task number</w:t>
+              <w:t xml:space="preserve">Task </w:t>
+            </w:r>
+            <w:proofErr w:type="gramStart"/>
+            <w:r>
+              <w:rPr>
+                <w:rFonts w:ascii="BC Sans" w:eastAsia="Times New Roman" w:hAnsi="BC Sans" w:cs="Times New Roman"/>
+                <w:b w:val="0"/>
+                <w:bCs w:val="0"/>
+                <w:color w:val="000000" w:themeColor="text1"/>
+                <w:sz w:val="20"/>
+                <w:szCs w:val="20"/>
+              </w:rPr>
+              <w:t>number</w:t>
             </w:r>
             <w:r>
               <w:rPr>
@@ -197,6 +213,7 @@
               </w:rPr>
               <w:t>: {</w:t>
             </w:r>
+            <w:proofErr w:type="spellStart"/>
             <w:r>
               <w:rPr>
                 <w:rFonts w:ascii="BC Sans" w:eastAsia="Times New Roman" w:hAnsi="BC Sans" w:cs="Times New Roman"/>
@@ -229,6 +246,8 @@
               </w:rPr>
               <w:t>taskNumber</w:t>
             </w:r>
+            <w:proofErr w:type="spellEnd"/>
+            <w:proofErr w:type="gramEnd"/>
             <w:r>
               <w:rPr>
                 <w:rFonts w:ascii="BC Sans" w:eastAsia="Times New Roman" w:hAnsi="BC Sans" w:cs="Times New Roman"/>
@@ -403,6 +422,8 @@
               </w:rPr>
               <w:t>{</w:t>
             </w:r>
+            <w:proofErr w:type="spellStart"/>
+            <w:proofErr w:type="gramStart"/>
             <w:r>
               <w:rPr>
                 <w:rFonts w:ascii="BC Sans" w:eastAsia="Times New Roman" w:hAnsi="BC Sans" w:cs="Times New Roman"/>
@@ -428,8 +449,29 @@
                 <w:sz w:val="20"/>
                 <w:szCs w:val="20"/>
               </w:rPr>
-              <w:t>taskType.category.longDescription</w:t>
-            </w:r>
+              <w:t>taskType.category</w:t>
+            </w:r>
+            <w:proofErr w:type="gramEnd"/>
+            <w:r>
+              <w:rPr>
+                <w:rFonts w:ascii="BC Sans" w:eastAsia="Times New Roman" w:hAnsi="BC Sans" w:cs="Times New Roman"/>
+                <w:color w:val="000000" w:themeColor="text1"/>
+                <w:sz w:val="20"/>
+                <w:szCs w:val="20"/>
+              </w:rPr>
+              <w:t>.</w:t>
+            </w:r>
+            <w:proofErr w:type="gramStart"/>
+            <w:r>
+              <w:rPr>
+                <w:rFonts w:ascii="BC Sans" w:eastAsia="Times New Roman" w:hAnsi="BC Sans" w:cs="Times New Roman"/>
+                <w:color w:val="000000" w:themeColor="text1"/>
+                <w:sz w:val="20"/>
+                <w:szCs w:val="20"/>
+              </w:rPr>
+              <w:t>longDescription</w:t>
+            </w:r>
+            <w:proofErr w:type="spellEnd"/>
             <w:r>
               <w:rPr>
                 <w:rFonts w:ascii="BC Sans" w:eastAsia="Times New Roman" w:hAnsi="BC Sans" w:cs="Times New Roman"/>
@@ -457,16 +499,51 @@
               </w:rPr>
               <w:t>d.</w:t>
             </w:r>
-            <w:r>
-              <w:rPr>
-                <w:rFonts w:ascii="BC Sans" w:eastAsia="Times New Roman" w:hAnsi="BC Sans" w:cs="Times New Roman"/>
-                <w:color w:val="000000" w:themeColor="text1"/>
-                <w:sz w:val="20"/>
-                <w:szCs w:val="20"/>
-                <w:lang w:val="en-CA"/>
-              </w:rPr>
-              <w:t>taskType.type.longDescription:ifEM:hideBegin</w:t>
-            </w:r>
+            <w:proofErr w:type="spellStart"/>
+            <w:r>
+              <w:rPr>
+                <w:rFonts w:ascii="BC Sans" w:eastAsia="Times New Roman" w:hAnsi="BC Sans" w:cs="Times New Roman"/>
+                <w:color w:val="000000" w:themeColor="text1"/>
+                <w:sz w:val="20"/>
+                <w:szCs w:val="20"/>
+                <w:lang w:val="en-CA"/>
+              </w:rPr>
+              <w:t>taskType.type</w:t>
+            </w:r>
+            <w:proofErr w:type="gramEnd"/>
+            <w:r>
+              <w:rPr>
+                <w:rFonts w:ascii="BC Sans" w:eastAsia="Times New Roman" w:hAnsi="BC Sans" w:cs="Times New Roman"/>
+                <w:color w:val="000000" w:themeColor="text1"/>
+                <w:sz w:val="20"/>
+                <w:szCs w:val="20"/>
+                <w:lang w:val="en-CA"/>
+              </w:rPr>
+              <w:t>.</w:t>
+            </w:r>
+            <w:proofErr w:type="gramStart"/>
+            <w:r>
+              <w:rPr>
+                <w:rFonts w:ascii="BC Sans" w:eastAsia="Times New Roman" w:hAnsi="BC Sans" w:cs="Times New Roman"/>
+                <w:color w:val="000000" w:themeColor="text1"/>
+                <w:sz w:val="20"/>
+                <w:szCs w:val="20"/>
+                <w:lang w:val="en-CA"/>
+              </w:rPr>
+              <w:t>longDescription:ifEM</w:t>
+            </w:r>
+            <w:proofErr w:type="gramEnd"/>
+            <w:r>
+              <w:rPr>
+                <w:rFonts w:ascii="BC Sans" w:eastAsia="Times New Roman" w:hAnsi="BC Sans" w:cs="Times New Roman"/>
+                <w:color w:val="000000" w:themeColor="text1"/>
+                <w:sz w:val="20"/>
+                <w:szCs w:val="20"/>
+                <w:lang w:val="en-CA"/>
+              </w:rPr>
+              <w:t>:hideBegin</w:t>
+            </w:r>
+            <w:proofErr w:type="spellEnd"/>
             <w:r>
               <w:rPr>
                 <w:rFonts w:ascii="BC Sans" w:hAnsi="BC Sans"/>
@@ -509,8 +586,21 @@
                 <w:sz w:val="20"/>
                 <w:szCs w:val="20"/>
               </w:rPr>
-              <w:t>Task sub category</w:t>
-            </w:r>
+              <w:t xml:space="preserve">Task </w:t>
+            </w:r>
+            <w:proofErr w:type="gramStart"/>
+            <w:r>
+              <w:rPr>
+                <w:rFonts w:ascii="BC Sans" w:hAnsi="BC Sans"/>
+                <w:b w:val="0"/>
+                <w:bCs w:val="0"/>
+                <w:caps w:val="0"/>
+                <w:sz w:val="20"/>
+                <w:szCs w:val="20"/>
+              </w:rPr>
+              <w:t>sub category</w:t>
+            </w:r>
+            <w:proofErr w:type="gramEnd"/>
           </w:p>
         </w:tc>
         <w:tc>
@@ -538,6 +628,7 @@
               </w:rPr>
               <w:t>{</w:t>
             </w:r>
+            <w:proofErr w:type="gramStart"/>
             <w:r>
               <w:rPr>
                 <w:rFonts w:ascii="BC Sans" w:eastAsia="Times New Roman" w:hAnsi="BC Sans" w:cs="Times New Roman"/>
@@ -556,16 +647,29 @@
               </w:rPr>
               <w:t>.</w:t>
             </w:r>
-            <w:r>
-              <w:rPr>
-                <w:rFonts w:ascii="BC Sans" w:eastAsia="Times New Roman" w:hAnsi="BC Sans" w:cs="Times New Roman"/>
-                <w:color w:val="000000" w:themeColor="text1"/>
-                <w:sz w:val="20"/>
-                <w:szCs w:val="20"/>
-                <w:lang w:val="en-CA"/>
-              </w:rPr>
-              <w:t>taskType.type.longDescription</w:t>
-            </w:r>
+            <w:proofErr w:type="spellStart"/>
+            <w:r>
+              <w:rPr>
+                <w:rFonts w:ascii="BC Sans" w:eastAsia="Times New Roman" w:hAnsi="BC Sans" w:cs="Times New Roman"/>
+                <w:color w:val="000000" w:themeColor="text1"/>
+                <w:sz w:val="20"/>
+                <w:szCs w:val="20"/>
+                <w:lang w:val="en-CA"/>
+              </w:rPr>
+              <w:t>taskType.type</w:t>
+            </w:r>
+            <w:proofErr w:type="gramEnd"/>
+            <w:r>
+              <w:rPr>
+                <w:rFonts w:ascii="BC Sans" w:eastAsia="Times New Roman" w:hAnsi="BC Sans" w:cs="Times New Roman"/>
+                <w:color w:val="000000" w:themeColor="text1"/>
+                <w:sz w:val="20"/>
+                <w:szCs w:val="20"/>
+                <w:lang w:val="en-CA"/>
+              </w:rPr>
+              <w:t>.longDescription</w:t>
+            </w:r>
+            <w:proofErr w:type="spellEnd"/>
             <w:r>
               <w:rPr>
                 <w:rFonts w:ascii="BC Sans" w:hAnsi="BC Sans"/>
@@ -610,7 +714,57 @@
                 <w:sz w:val="20"/>
                 <w:szCs w:val="20"/>
               </w:rPr>
-              <w:t>{d.taskType.type.longDescription:hideEnd}</w:t>
+              <w:t>{</w:t>
+            </w:r>
+            <w:proofErr w:type="spellStart"/>
+            <w:proofErr w:type="gramStart"/>
+            <w:r>
+              <w:rPr>
+                <w:rFonts w:ascii="BC Sans" w:hAnsi="BC Sans"/>
+                <w:b w:val="0"/>
+                <w:bCs w:val="0"/>
+                <w:caps w:val="0"/>
+                <w:sz w:val="20"/>
+                <w:szCs w:val="20"/>
+              </w:rPr>
+              <w:t>d.taskType.type</w:t>
+            </w:r>
+            <w:proofErr w:type="gramEnd"/>
+            <w:r>
+              <w:rPr>
+                <w:rFonts w:ascii="BC Sans" w:hAnsi="BC Sans"/>
+                <w:b w:val="0"/>
+                <w:bCs w:val="0"/>
+                <w:caps w:val="0"/>
+                <w:sz w:val="20"/>
+                <w:szCs w:val="20"/>
+              </w:rPr>
+              <w:t>.</w:t>
+            </w:r>
+            <w:proofErr w:type="gramStart"/>
+            <w:r>
+              <w:rPr>
+                <w:rFonts w:ascii="BC Sans" w:hAnsi="BC Sans"/>
+                <w:b w:val="0"/>
+                <w:bCs w:val="0"/>
+                <w:caps w:val="0"/>
+                <w:sz w:val="20"/>
+                <w:szCs w:val="20"/>
+              </w:rPr>
+              <w:t>longDescription:hideEnd</w:t>
+            </w:r>
+            <w:proofErr w:type="spellEnd"/>
+            <w:proofErr w:type="gramEnd"/>
+            <w:r>
+              <w:rPr>
+                <w:rFonts w:ascii="BC Sans" w:hAnsi="BC Sans"/>
+                <w:b w:val="0"/>
+                <w:bCs w:val="0"/>
+                <w:caps w:val="0"/>
+                <w:sz w:val="20"/>
+                <w:szCs w:val="20"/>
+              </w:rPr>
+              <w:t>}</w:t>
             </w:r>
             <w:r>
               <w:rPr>
@@ -651,6 +805,8 @@
               </w:rPr>
               <w:t>{</w:t>
             </w:r>
+            <w:proofErr w:type="spellStart"/>
+            <w:proofErr w:type="gramStart"/>
             <w:r>
               <w:rPr>
                 <w:rFonts w:ascii="BC Sans" w:eastAsia="Times New Roman" w:hAnsi="BC Sans" w:cs="Times New Roman"/>
@@ -678,6 +834,8 @@
               </w:rPr>
               <w:t>remarks</w:t>
             </w:r>
+            <w:proofErr w:type="spellEnd"/>
+            <w:proofErr w:type="gramEnd"/>
             <w:r>
               <w:rPr>
                 <w:rFonts w:ascii="BC Sans" w:eastAsia="Times New Roman" w:hAnsi="BC Sans" w:cs="Times New Roman"/>
@@ -746,6 +904,8 @@
               </w:rPr>
               <w:t>{</w:t>
             </w:r>
+            <w:proofErr w:type="spellStart"/>
+            <w:proofErr w:type="gramStart"/>
             <w:r>
               <w:rPr>
                 <w:rFonts w:ascii="BC Sans" w:eastAsia="Times New Roman" w:hAnsi="BC Sans" w:cs="Times New Roman"/>
@@ -775,6 +935,8 @@
               </w:rPr>
               <w:t>assignedUser.lastName</w:t>
             </w:r>
+            <w:proofErr w:type="spellEnd"/>
+            <w:proofErr w:type="gramEnd"/>
             <w:r>
               <w:rPr>
                 <w:rFonts w:ascii="BC Sans" w:eastAsia="Times New Roman" w:hAnsi="BC Sans" w:cs="Times New Roman"/>
@@ -795,7 +957,33 @@
                 <w:szCs w:val="20"/>
                 <w14:ligatures w14:val="none"/>
               </w:rPr>
-              <w:t>, {d.assignedUser.firstName}</w:t>
+              <w:t>, {</w:t>
+            </w:r>
+            <w:proofErr w:type="spellStart"/>
+            <w:proofErr w:type="gramStart"/>
+            <w:r>
+              <w:rPr>
+                <w:rFonts w:ascii="BC Sans" w:eastAsia="Times New Roman" w:hAnsi="BC Sans" w:cs="Times New Roman"/>
+                <w:color w:val="000000"/>
+                <w:kern w:val="0"/>
+                <w:sz w:val="20"/>
+                <w:szCs w:val="20"/>
+                <w14:ligatures w14:val="none"/>
+              </w:rPr>
+              <w:t>d.assignedUser.firstName</w:t>
+            </w:r>
+            <w:proofErr w:type="spellEnd"/>
+            <w:proofErr w:type="gramEnd"/>
+            <w:r>
+              <w:rPr>
+                <w:rFonts w:ascii="BC Sans" w:eastAsia="Times New Roman" w:hAnsi="BC Sans" w:cs="Times New Roman"/>
+                <w:color w:val="000000"/>
+                <w:kern w:val="0"/>
+                <w:sz w:val="20"/>
+                <w:szCs w:val="20"/>
+                <w14:ligatures w14:val="none"/>
+              </w:rPr>
+              <w:t>}</w:t>
             </w:r>
           </w:p>
         </w:tc>
@@ -862,17 +1050,38 @@
                 <w:sz w:val="20"/>
                 <w:szCs w:val="20"/>
               </w:rPr>
-              <w:t>{d.dueDate}</w:t>
-            </w:r>
-            <w:r>
-              <w:rPr>
-                <w:rFonts w:ascii="BC Sans" w:eastAsia="Times New Roman" w:hAnsi="BC Sans" w:cs="Times New Roman"/>
-                <w:color w:val="000000" w:themeColor="text1"/>
-                <w:sz w:val="20"/>
-                <w:szCs w:val="20"/>
-              </w:rPr>
               <w:t>{</w:t>
             </w:r>
+            <w:proofErr w:type="spellStart"/>
+            <w:proofErr w:type="gramStart"/>
+            <w:r>
+              <w:rPr>
+                <w:rFonts w:ascii="BC Sans" w:hAnsi="BC Sans" w:cs="BC Sans Light"/>
+                <w:sz w:val="20"/>
+                <w:szCs w:val="20"/>
+              </w:rPr>
+              <w:t>d.dueDate</w:t>
+            </w:r>
+            <w:proofErr w:type="spellEnd"/>
+            <w:proofErr w:type="gramEnd"/>
+            <w:r>
+              <w:rPr>
+                <w:rFonts w:ascii="BC Sans" w:hAnsi="BC Sans" w:cs="BC Sans Light"/>
+                <w:sz w:val="20"/>
+                <w:szCs w:val="20"/>
+              </w:rPr>
+              <w:t>}</w:t>
+            </w:r>
+            <w:r>
+              <w:rPr>
+                <w:rFonts w:ascii="BC Sans" w:eastAsia="Times New Roman" w:hAnsi="BC Sans" w:cs="Times New Roman"/>
+                <w:color w:val="000000" w:themeColor="text1"/>
+                <w:sz w:val="20"/>
+                <w:szCs w:val="20"/>
+              </w:rPr>
+              <w:t>{</w:t>
+            </w:r>
+            <w:proofErr w:type="gramStart"/>
             <w:r>
               <w:rPr>
                 <w:rFonts w:ascii="BC Sans" w:eastAsia="Times New Roman" w:hAnsi="BC Sans" w:cs="Times New Roman"/>
@@ -882,16 +1091,41 @@
               </w:rPr>
               <w:t>d.</w:t>
             </w:r>
-            <w:r>
-              <w:rPr>
-                <w:rFonts w:ascii="BC Sans" w:eastAsia="Times New Roman" w:hAnsi="BC Sans" w:cs="Times New Roman"/>
-                <w:color w:val="000000" w:themeColor="text1"/>
-                <w:sz w:val="20"/>
-                <w:szCs w:val="20"/>
-                <w:lang w:val="en-CA"/>
-              </w:rPr>
-              <w:t>description:ifEM:hideBegin</w:t>
-            </w:r>
+            <w:proofErr w:type="spellStart"/>
+            <w:r>
+              <w:rPr>
+                <w:rFonts w:ascii="BC Sans" w:eastAsia="Times New Roman" w:hAnsi="BC Sans" w:cs="Times New Roman"/>
+                <w:color w:val="000000" w:themeColor="text1"/>
+                <w:sz w:val="20"/>
+                <w:szCs w:val="20"/>
+                <w:lang w:val="en-CA"/>
+              </w:rPr>
+              <w:t>description</w:t>
+            </w:r>
+            <w:proofErr w:type="gramEnd"/>
+            <w:r>
+              <w:rPr>
+                <w:rFonts w:ascii="BC Sans" w:eastAsia="Times New Roman" w:hAnsi="BC Sans" w:cs="Times New Roman"/>
+                <w:color w:val="000000" w:themeColor="text1"/>
+                <w:sz w:val="20"/>
+                <w:szCs w:val="20"/>
+                <w:lang w:val="en-CA"/>
+              </w:rPr>
+              <w:t>:</w:t>
+            </w:r>
+            <w:proofErr w:type="gramStart"/>
+            <w:r>
+              <w:rPr>
+                <w:rFonts w:ascii="BC Sans" w:eastAsia="Times New Roman" w:hAnsi="BC Sans" w:cs="Times New Roman"/>
+                <w:color w:val="000000" w:themeColor="text1"/>
+                <w:sz w:val="20"/>
+                <w:szCs w:val="20"/>
+                <w:lang w:val="en-CA"/>
+              </w:rPr>
+              <w:t>ifEM:hideBegin</w:t>
+            </w:r>
+            <w:proofErr w:type="spellEnd"/>
+            <w:proofErr w:type="gramEnd"/>
             <w:r>
               <w:rPr>
                 <w:rFonts w:ascii="BC Sans" w:hAnsi="BC Sans"/>
@@ -956,7 +1190,27 @@
                 <w:sz w:val="20"/>
                 <w:szCs w:val="20"/>
               </w:rPr>
-              <w:t>{d.description}</w:t>
+              <w:t>{</w:t>
+            </w:r>
+            <w:proofErr w:type="spellStart"/>
+            <w:proofErr w:type="gramStart"/>
+            <w:r>
+              <w:rPr>
+                <w:rFonts w:ascii="BC Sans" w:hAnsi="BC Sans" w:cs="BC Sans Light"/>
+                <w:sz w:val="20"/>
+                <w:szCs w:val="20"/>
+              </w:rPr>
+              <w:t>d.description</w:t>
+            </w:r>
+            <w:proofErr w:type="spellEnd"/>
+            <w:proofErr w:type="gramEnd"/>
+            <w:r>
+              <w:rPr>
+                <w:rFonts w:ascii="BC Sans" w:hAnsi="BC Sans" w:cs="BC Sans Light"/>
+                <w:sz w:val="20"/>
+                <w:szCs w:val="20"/>
+              </w:rPr>
+              <w:t>}</w:t>
             </w:r>
             <w:r>
               <w:rPr>
@@ -990,6 +1244,7 @@
         </w:rPr>
         <w:t>{</w:t>
       </w:r>
+      <w:proofErr w:type="gramStart"/>
       <w:r>
         <w:rPr>
           <w:rFonts w:ascii="BC Sans" w:eastAsia="Times New Roman" w:hAnsi="BC Sans" w:cs="Times New Roman"/>
@@ -999,6 +1254,7 @@
         </w:rPr>
         <w:t>d.</w:t>
       </w:r>
+      <w:proofErr w:type="spellStart"/>
       <w:r>
         <w:rPr>
           <w:rFonts w:ascii="BC Sans" w:eastAsia="Times New Roman" w:hAnsi="BC Sans" w:cs="Times New Roman"/>
@@ -1007,8 +1263,32 @@
           <w:szCs w:val="20"/>
           <w:lang w:val="en-CA"/>
         </w:rPr>
-        <w:t>description:ifEM:hideEnd</w:t>
+        <w:t>description</w:t>
       </w:r>
+      <w:proofErr w:type="gramEnd"/>
+      <w:r>
+        <w:rPr>
+          <w:rFonts w:ascii="BC Sans" w:eastAsia="Times New Roman" w:hAnsi="BC Sans" w:cs="Times New Roman"/>
+          <w:color w:val="000000" w:themeColor="text1"/>
+          <w:sz w:val="20"/>
+          <w:szCs w:val="20"/>
+          <w:lang w:val="en-CA"/>
+        </w:rPr>
+        <w:t>:</w:t>
+      </w:r>
+      <w:proofErr w:type="gramStart"/>
+      <w:r>
+        <w:rPr>
+          <w:rFonts w:ascii="BC Sans" w:eastAsia="Times New Roman" w:hAnsi="BC Sans" w:cs="Times New Roman"/>
+          <w:color w:val="000000" w:themeColor="text1"/>
+          <w:sz w:val="20"/>
+          <w:szCs w:val="20"/>
+          <w:lang w:val="en-CA"/>
+        </w:rPr>
+        <w:t>ifEM:hideEnd</w:t>
+      </w:r>
+      <w:proofErr w:type="spellEnd"/>
+      <w:proofErr w:type="gramEnd"/>
       <w:r>
         <w:rPr>
           <w:rFonts w:ascii="BC Sans" w:hAnsi="BC Sans"/>
@@ -1023,7 +1303,63 @@
           <w:sz w:val="20"/>
           <w:szCs w:val="20"/>
         </w:rPr>
-        <w:t>{d.hasDiaryDates:ifEQ(true):showBegin}</w:t>
+        <w:t>{</w:t>
+      </w:r>
+      <w:proofErr w:type="spellStart"/>
+      <w:proofErr w:type="gramStart"/>
+      <w:r>
+        <w:rPr>
+          <w:rFonts w:ascii="BC Sans" w:hAnsi="BC Sans"/>
+          <w:sz w:val="20"/>
+          <w:szCs w:val="20"/>
+        </w:rPr>
+        <w:t>d.hasDiaryDates</w:t>
+      </w:r>
+      <w:proofErr w:type="gramEnd"/>
+      <w:r>
+        <w:rPr>
+          <w:rFonts w:ascii="BC Sans" w:hAnsi="BC Sans"/>
+          <w:sz w:val="20"/>
+          <w:szCs w:val="20"/>
+        </w:rPr>
+        <w:t>:ifEQ</w:t>
+      </w:r>
+      <w:proofErr w:type="spellEnd"/>
+      <w:r>
+        <w:rPr>
+          <w:rFonts w:ascii="BC Sans" w:hAnsi="BC Sans"/>
+          <w:sz w:val="20"/>
+          <w:szCs w:val="20"/>
+        </w:rPr>
+        <w:t>(true</w:t>
+      </w:r>
+      <w:proofErr w:type="gramStart"/>
+      <w:r>
+        <w:rPr>
+          <w:rFonts w:ascii="BC Sans" w:hAnsi="BC Sans"/>
+          <w:sz w:val="20"/>
+          <w:szCs w:val="20"/>
+        </w:rPr>
+        <w:t>):</w:t>
+      </w:r>
+      <w:proofErr w:type="spellStart"/>
+      <w:r>
+        <w:rPr>
+          <w:rFonts w:ascii="BC Sans" w:hAnsi="BC Sans"/>
+          <w:sz w:val="20"/>
+          <w:szCs w:val="20"/>
+        </w:rPr>
+        <w:t>showBegin</w:t>
+      </w:r>
+      <w:proofErr w:type="spellEnd"/>
+      <w:proofErr w:type="gramEnd"/>
+      <w:r>
+        <w:rPr>
+          <w:rFonts w:ascii="BC Sans" w:hAnsi="BC Sans"/>
+          <w:sz w:val="20"/>
+          <w:szCs w:val="20"/>
+        </w:rPr>
+        <w:t>}</w:t>
       </w:r>
     </w:p>
     <w:tbl>
@@ -1197,7 +1533,83 @@
                 <w:sz w:val="20"/>
                 <w:szCs w:val="20"/>
               </w:rPr>
-              <w:t>{d.diaryDates[i].dueDate}</w:t>
+              <w:t>{</w:t>
+            </w:r>
+            <w:proofErr w:type="spellStart"/>
+            <w:proofErr w:type="gramStart"/>
+            <w:r>
+              <w:rPr>
+                <w:rFonts w:ascii="BC Sans" w:hAnsi="BC Sans"/>
+                <w:b w:val="0"/>
+                <w:bCs w:val="0"/>
+                <w:caps w:val="0"/>
+                <w:sz w:val="20"/>
+                <w:szCs w:val="20"/>
+              </w:rPr>
+              <w:t>d.diaryDates</w:t>
+            </w:r>
+            <w:proofErr w:type="spellEnd"/>
+            <w:proofErr w:type="gramEnd"/>
+            <w:r>
+              <w:rPr>
+                <w:rFonts w:ascii="BC Sans" w:hAnsi="BC Sans"/>
+                <w:b w:val="0"/>
+                <w:bCs w:val="0"/>
+                <w:caps w:val="0"/>
+                <w:sz w:val="20"/>
+                <w:szCs w:val="20"/>
+              </w:rPr>
+              <w:t>[</w:t>
+            </w:r>
+            <w:proofErr w:type="spellStart"/>
+            <w:r>
+              <w:rPr>
+                <w:rFonts w:ascii="BC Sans" w:hAnsi="BC Sans"/>
+                <w:b w:val="0"/>
+                <w:bCs w:val="0"/>
+                <w:caps w:val="0"/>
+                <w:sz w:val="20"/>
+                <w:szCs w:val="20"/>
+              </w:rPr>
+              <w:t>i</w:t>
+            </w:r>
+            <w:proofErr w:type="spellEnd"/>
+            <w:proofErr w:type="gramStart"/>
+            <w:r>
+              <w:rPr>
+                <w:rFonts w:ascii="BC Sans" w:hAnsi="BC Sans"/>
+                <w:b w:val="0"/>
+                <w:bCs w:val="0"/>
+                <w:caps w:val="0"/>
+                <w:sz w:val="20"/>
+                <w:szCs w:val="20"/>
+              </w:rPr>
+              <w:t>].</w:t>
+            </w:r>
+            <w:proofErr w:type="spellStart"/>
+            <w:r>
+              <w:rPr>
+                <w:rFonts w:ascii="BC Sans" w:hAnsi="BC Sans"/>
+                <w:b w:val="0"/>
+                <w:bCs w:val="0"/>
+                <w:caps w:val="0"/>
+                <w:sz w:val="20"/>
+                <w:szCs w:val="20"/>
+              </w:rPr>
+              <w:t>dueDate</w:t>
+            </w:r>
+            <w:proofErr w:type="spellEnd"/>
+            <w:proofErr w:type="gramEnd"/>
+            <w:r>
+              <w:rPr>
+                <w:rFonts w:ascii="BC Sans" w:hAnsi="BC Sans"/>
+                <w:b w:val="0"/>
+                <w:bCs w:val="0"/>
+                <w:caps w:val="0"/>
+                <w:sz w:val="20"/>
+                <w:szCs w:val="20"/>
+              </w:rPr>
+              <w:t>}</w:t>
             </w:r>
           </w:p>
         </w:tc>
@@ -1225,7 +1637,60 @@
                 <w:sz w:val="18"/>
                 <w:szCs w:val="18"/>
               </w:rPr>
-              <w:t>{d.diaryDates[i].description}</w:t>
+              <w:t>{</w:t>
+            </w:r>
+            <w:proofErr w:type="spellStart"/>
+            <w:proofErr w:type="gramStart"/>
+            <w:r>
+              <w:rPr>
+                <w:rFonts w:ascii="BC Sans" w:eastAsia="Times New Roman" w:hAnsi="BC Sans" w:cs="Times New Roman"/>
+                <w:color w:val="000000" w:themeColor="text1"/>
+                <w:sz w:val="18"/>
+                <w:szCs w:val="18"/>
+              </w:rPr>
+              <w:t>d.diaryDates</w:t>
+            </w:r>
+            <w:proofErr w:type="spellEnd"/>
+            <w:proofErr w:type="gramEnd"/>
+            <w:r>
+              <w:rPr>
+                <w:rFonts w:ascii="BC Sans" w:eastAsia="Times New Roman" w:hAnsi="BC Sans" w:cs="Times New Roman"/>
+                <w:color w:val="000000" w:themeColor="text1"/>
+                <w:sz w:val="18"/>
+                <w:szCs w:val="18"/>
+              </w:rPr>
+              <w:t>[</w:t>
+            </w:r>
+            <w:proofErr w:type="spellStart"/>
+            <w:r>
+              <w:rPr>
+                <w:rFonts w:ascii="BC Sans" w:eastAsia="Times New Roman" w:hAnsi="BC Sans" w:cs="Times New Roman"/>
+                <w:color w:val="000000" w:themeColor="text1"/>
+                <w:sz w:val="18"/>
+                <w:szCs w:val="18"/>
+              </w:rPr>
+              <w:t>i</w:t>
+            </w:r>
+            <w:proofErr w:type="spellEnd"/>
+            <w:proofErr w:type="gramStart"/>
+            <w:r>
+              <w:rPr>
+                <w:rFonts w:ascii="BC Sans" w:eastAsia="Times New Roman" w:hAnsi="BC Sans" w:cs="Times New Roman"/>
+                <w:color w:val="000000" w:themeColor="text1"/>
+                <w:sz w:val="18"/>
+                <w:szCs w:val="18"/>
+              </w:rPr>
+              <w:t>].description</w:t>
+            </w:r>
+            <w:proofErr w:type="gramEnd"/>
+            <w:r>
+              <w:rPr>
+                <w:rFonts w:ascii="BC Sans" w:eastAsia="Times New Roman" w:hAnsi="BC Sans" w:cs="Times New Roman"/>
+                <w:color w:val="000000" w:themeColor="text1"/>
+                <w:sz w:val="18"/>
+                <w:szCs w:val="18"/>
+              </w:rPr>
+              <w:t>}</w:t>
             </w:r>
           </w:p>
         </w:tc>
@@ -1261,7 +1726,70 @@
                 <w:sz w:val="20"/>
                 <w:szCs w:val="20"/>
               </w:rPr>
-              <w:t>{d.diaryDates[i+1].dueDate}</w:t>
+              <w:t>{</w:t>
+            </w:r>
+            <w:proofErr w:type="spellStart"/>
+            <w:proofErr w:type="gramStart"/>
+            <w:r>
+              <w:rPr>
+                <w:rFonts w:ascii="BC Sans" w:hAnsi="BC Sans"/>
+                <w:b w:val="0"/>
+                <w:bCs w:val="0"/>
+                <w:caps w:val="0"/>
+                <w:sz w:val="20"/>
+                <w:szCs w:val="20"/>
+              </w:rPr>
+              <w:t>d.diaryDates</w:t>
+            </w:r>
+            <w:proofErr w:type="spellEnd"/>
+            <w:proofErr w:type="gramEnd"/>
+            <w:r>
+              <w:rPr>
+                <w:rFonts w:ascii="BC Sans" w:hAnsi="BC Sans"/>
+                <w:b w:val="0"/>
+                <w:bCs w:val="0"/>
+                <w:caps w:val="0"/>
+                <w:sz w:val="20"/>
+                <w:szCs w:val="20"/>
+              </w:rPr>
+              <w:t>[i+1</w:t>
+            </w:r>
+            <w:proofErr w:type="gramStart"/>
+            <w:r>
+              <w:rPr>
+                <w:rFonts w:ascii="BC Sans" w:hAnsi="BC Sans"/>
+                <w:b w:val="0"/>
+                <w:bCs w:val="0"/>
+                <w:caps w:val="0"/>
+                <w:sz w:val="20"/>
+                <w:szCs w:val="20"/>
+              </w:rPr>
+              <w:t>].</w:t>
+            </w:r>
+            <w:proofErr w:type="spellStart"/>
+            <w:r>
+              <w:rPr>
+                <w:rFonts w:ascii="BC Sans" w:hAnsi="BC Sans"/>
+                <w:b w:val="0"/>
+                <w:bCs w:val="0"/>
+                <w:caps w:val="0"/>
+                <w:sz w:val="20"/>
+                <w:szCs w:val="20"/>
+              </w:rPr>
+              <w:t>dueDate</w:t>
+            </w:r>
+            <w:proofErr w:type="spellEnd"/>
+            <w:proofErr w:type="gramEnd"/>
+            <w:r>
+              <w:rPr>
+                <w:rFonts w:ascii="BC Sans" w:hAnsi="BC Sans"/>
+                <w:b w:val="0"/>
+                <w:bCs w:val="0"/>
+                <w:caps w:val="0"/>
+                <w:sz w:val="20"/>
+                <w:szCs w:val="20"/>
+              </w:rPr>
+              <w:t>}</w:t>
             </w:r>
           </w:p>
         </w:tc>
@@ -1288,7 +1816,49 @@
                 <w:sz w:val="18"/>
                 <w:szCs w:val="18"/>
               </w:rPr>
-              <w:t>{d.diaryDates[i+1].description}</w:t>
+              <w:t>{</w:t>
+            </w:r>
+            <w:proofErr w:type="spellStart"/>
+            <w:proofErr w:type="gramStart"/>
+            <w:r>
+              <w:rPr>
+                <w:rFonts w:ascii="BC Sans" w:eastAsia="Times New Roman" w:hAnsi="BC Sans" w:cs="Times New Roman"/>
+                <w:color w:val="000000" w:themeColor="text1"/>
+                <w:sz w:val="18"/>
+                <w:szCs w:val="18"/>
+              </w:rPr>
+              <w:t>d.diaryDates</w:t>
+            </w:r>
+            <w:proofErr w:type="spellEnd"/>
+            <w:proofErr w:type="gramEnd"/>
+            <w:r>
+              <w:rPr>
+                <w:rFonts w:ascii="BC Sans" w:eastAsia="Times New Roman" w:hAnsi="BC Sans" w:cs="Times New Roman"/>
+                <w:color w:val="000000" w:themeColor="text1"/>
+                <w:sz w:val="18"/>
+                <w:szCs w:val="18"/>
+              </w:rPr>
+              <w:t>[i+1</w:t>
+            </w:r>
+            <w:proofErr w:type="gramStart"/>
+            <w:r>
+              <w:rPr>
+                <w:rFonts w:ascii="BC Sans" w:eastAsia="Times New Roman" w:hAnsi="BC Sans" w:cs="Times New Roman"/>
+                <w:color w:val="000000" w:themeColor="text1"/>
+                <w:sz w:val="18"/>
+                <w:szCs w:val="18"/>
+              </w:rPr>
+              <w:t>].description</w:t>
+            </w:r>
+            <w:proofErr w:type="gramEnd"/>
+            <w:r>
+              <w:rPr>
+                <w:rFonts w:ascii="BC Sans" w:eastAsia="Times New Roman" w:hAnsi="BC Sans" w:cs="Times New Roman"/>
+                <w:color w:val="000000" w:themeColor="text1"/>
+                <w:sz w:val="18"/>
+                <w:szCs w:val="18"/>
+              </w:rPr>
+              <w:t>}</w:t>
             </w:r>
           </w:p>
         </w:tc>
@@ -1311,7 +1881,34 @@
           <w:sz w:val="20"/>
           <w:szCs w:val="20"/>
         </w:rPr>
-        <w:t>{d.hasDiaryDates:showEnd}{d.</w:t>
+        <w:t>{</w:t>
+      </w:r>
+      <w:proofErr w:type="gramStart"/>
+      <w:r>
+        <w:rPr>
+          <w:rFonts w:ascii="BC Sans" w:hAnsi="BC Sans"/>
+          <w:sz w:val="20"/>
+          <w:szCs w:val="20"/>
+        </w:rPr>
+        <w:t>d.hasDiaryDates</w:t>
+      </w:r>
+      <w:proofErr w:type="gramEnd"/>
+      <w:r>
+        <w:rPr>
+          <w:rFonts w:ascii="BC Sans" w:hAnsi="BC Sans"/>
+          <w:sz w:val="20"/>
+          <w:szCs w:val="20"/>
+        </w:rPr>
+        <w:t>:</w:t>
+      </w:r>
+      <w:proofErr w:type="gramStart"/>
+      <w:r>
+        <w:rPr>
+          <w:rFonts w:ascii="BC Sans" w:hAnsi="BC Sans"/>
+          <w:sz w:val="20"/>
+          <w:szCs w:val="20"/>
+        </w:rPr>
+        <w:t>showEnd}{d.</w:t>
       </w:r>
       <w:r>
         <w:rPr>
@@ -1321,13 +1918,32 @@
         </w:rPr>
         <w:t>hasActivityNotes</w:t>
       </w:r>
+      <w:proofErr w:type="gramEnd"/>
       <w:r>
         <w:rPr>
           <w:rFonts w:ascii="BC Sans" w:hAnsi="BC Sans"/>
           <w:sz w:val="20"/>
           <w:szCs w:val="20"/>
         </w:rPr>
-        <w:t>:ifEQ(true):showBegin}</w:t>
+        <w:t>:ifEQ(true</w:t>
+      </w:r>
+      <w:proofErr w:type="gramStart"/>
+      <w:r>
+        <w:rPr>
+          <w:rFonts w:ascii="BC Sans" w:hAnsi="BC Sans"/>
+          <w:sz w:val="20"/>
+          <w:szCs w:val="20"/>
+        </w:rPr>
+        <w:t>):showBegin</w:t>
+      </w:r>
+      <w:proofErr w:type="gramEnd"/>
+      <w:r>
+        <w:rPr>
+          <w:rFonts w:ascii="BC Sans" w:hAnsi="BC Sans"/>
+          <w:sz w:val="20"/>
+          <w:szCs w:val="20"/>
+        </w:rPr>
+        <w:t>}</w:t>
       </w:r>
     </w:p>
     <w:tbl>
@@ -1485,7 +2101,83 @@
                 <w:sz w:val="20"/>
                 <w:szCs w:val="20"/>
               </w:rPr>
-              <w:t>{d.activityNotes[i].contentText}</w:t>
+              <w:t>{</w:t>
+            </w:r>
+            <w:proofErr w:type="spellStart"/>
+            <w:proofErr w:type="gramStart"/>
+            <w:r>
+              <w:rPr>
+                <w:rFonts w:ascii="BC Sans" w:hAnsi="BC Sans"/>
+                <w:b w:val="0"/>
+                <w:bCs w:val="0"/>
+                <w:caps w:val="0"/>
+                <w:sz w:val="20"/>
+                <w:szCs w:val="20"/>
+              </w:rPr>
+              <w:t>d.activityNotes</w:t>
+            </w:r>
+            <w:proofErr w:type="spellEnd"/>
+            <w:proofErr w:type="gramEnd"/>
+            <w:r>
+              <w:rPr>
+                <w:rFonts w:ascii="BC Sans" w:hAnsi="BC Sans"/>
+                <w:b w:val="0"/>
+                <w:bCs w:val="0"/>
+                <w:caps w:val="0"/>
+                <w:sz w:val="20"/>
+                <w:szCs w:val="20"/>
+              </w:rPr>
+              <w:t>[</w:t>
+            </w:r>
+            <w:proofErr w:type="spellStart"/>
+            <w:r>
+              <w:rPr>
+                <w:rFonts w:ascii="BC Sans" w:hAnsi="BC Sans"/>
+                <w:b w:val="0"/>
+                <w:bCs w:val="0"/>
+                <w:caps w:val="0"/>
+                <w:sz w:val="20"/>
+                <w:szCs w:val="20"/>
+              </w:rPr>
+              <w:t>i</w:t>
+            </w:r>
+            <w:proofErr w:type="spellEnd"/>
+            <w:proofErr w:type="gramStart"/>
+            <w:r>
+              <w:rPr>
+                <w:rFonts w:ascii="BC Sans" w:hAnsi="BC Sans"/>
+                <w:b w:val="0"/>
+                <w:bCs w:val="0"/>
+                <w:caps w:val="0"/>
+                <w:sz w:val="20"/>
+                <w:szCs w:val="20"/>
+              </w:rPr>
+              <w:t>].</w:t>
+            </w:r>
+            <w:proofErr w:type="spellStart"/>
+            <w:r>
+              <w:rPr>
+                <w:rFonts w:ascii="BC Sans" w:hAnsi="BC Sans"/>
+                <w:b w:val="0"/>
+                <w:bCs w:val="0"/>
+                <w:caps w:val="0"/>
+                <w:sz w:val="20"/>
+                <w:szCs w:val="20"/>
+              </w:rPr>
+              <w:t>contentText</w:t>
+            </w:r>
+            <w:proofErr w:type="spellEnd"/>
+            <w:proofErr w:type="gramEnd"/>
+            <w:r>
+              <w:rPr>
+                <w:rFonts w:ascii="BC Sans" w:hAnsi="BC Sans"/>
+                <w:b w:val="0"/>
+                <w:bCs w:val="0"/>
+                <w:caps w:val="0"/>
+                <w:sz w:val="20"/>
+                <w:szCs w:val="20"/>
+              </w:rPr>
+              <w:t>}</w:t>
             </w:r>
           </w:p>
         </w:tc>
@@ -1516,8 +2208,10 @@
                 <w:sz w:val="18"/>
                 <w:szCs w:val="18"/>
               </w:rPr>
-              <w:t>{d.activityNotes[i].actionedDate}</w:t>
-            </w:r>
+              <w:t>{</w:t>
+            </w:r>
+            <w:proofErr w:type="spellStart"/>
+            <w:proofErr w:type="gramStart"/>
             <w:r>
               <w:rPr>
                 <w:rFonts w:ascii="BC Sans" w:eastAsia="Times New Roman" w:hAnsi="BC Sans" w:cs="Times New Roman"/>
@@ -1525,7 +2219,133 @@
                 <w:sz w:val="18"/>
                 <w:szCs w:val="18"/>
               </w:rPr>
-              <w:t xml:space="preserve"> {d.activityNotes[i].actionedTime}</w:t>
+              <w:t>d.activityNotes</w:t>
+            </w:r>
+            <w:proofErr w:type="spellEnd"/>
+            <w:proofErr w:type="gramEnd"/>
+            <w:r>
+              <w:rPr>
+                <w:rFonts w:ascii="BC Sans" w:eastAsia="Times New Roman" w:hAnsi="BC Sans" w:cs="Times New Roman"/>
+                <w:color w:val="000000" w:themeColor="text1"/>
+                <w:sz w:val="18"/>
+                <w:szCs w:val="18"/>
+              </w:rPr>
+              <w:t>[</w:t>
+            </w:r>
+            <w:proofErr w:type="spellStart"/>
+            <w:r>
+              <w:rPr>
+                <w:rFonts w:ascii="BC Sans" w:eastAsia="Times New Roman" w:hAnsi="BC Sans" w:cs="Times New Roman"/>
+                <w:color w:val="000000" w:themeColor="text1"/>
+                <w:sz w:val="18"/>
+                <w:szCs w:val="18"/>
+              </w:rPr>
+              <w:t>i</w:t>
+            </w:r>
+            <w:proofErr w:type="spellEnd"/>
+            <w:proofErr w:type="gramStart"/>
+            <w:r>
+              <w:rPr>
+                <w:rFonts w:ascii="BC Sans" w:eastAsia="Times New Roman" w:hAnsi="BC Sans" w:cs="Times New Roman"/>
+                <w:color w:val="000000" w:themeColor="text1"/>
+                <w:sz w:val="18"/>
+                <w:szCs w:val="18"/>
+              </w:rPr>
+              <w:t>].</w:t>
+            </w:r>
+            <w:proofErr w:type="spellStart"/>
+            <w:r>
+              <w:rPr>
+                <w:rFonts w:ascii="BC Sans" w:eastAsia="Times New Roman" w:hAnsi="BC Sans" w:cs="Times New Roman"/>
+                <w:color w:val="000000" w:themeColor="text1"/>
+                <w:sz w:val="18"/>
+                <w:szCs w:val="18"/>
+              </w:rPr>
+              <w:t>actionedDate</w:t>
+            </w:r>
+            <w:proofErr w:type="spellEnd"/>
+            <w:proofErr w:type="gramEnd"/>
+            <w:r>
+              <w:rPr>
+                <w:rFonts w:ascii="BC Sans" w:eastAsia="Times New Roman" w:hAnsi="BC Sans" w:cs="Times New Roman"/>
+                <w:color w:val="000000" w:themeColor="text1"/>
+                <w:sz w:val="18"/>
+                <w:szCs w:val="18"/>
+              </w:rPr>
+              <w:t>}</w:t>
+            </w:r>
+            <w:r>
+              <w:rPr>
+                <w:rFonts w:ascii="BC Sans" w:eastAsia="Times New Roman" w:hAnsi="BC Sans" w:cs="Times New Roman"/>
+                <w:color w:val="000000" w:themeColor="text1"/>
+                <w:sz w:val="18"/>
+                <w:szCs w:val="18"/>
+              </w:rPr>
+              <w:t xml:space="preserve"> {</w:t>
+            </w:r>
+            <w:proofErr w:type="spellStart"/>
+            <w:proofErr w:type="gramStart"/>
+            <w:r>
+              <w:rPr>
+                <w:rFonts w:ascii="BC Sans" w:eastAsia="Times New Roman" w:hAnsi="BC Sans" w:cs="Times New Roman"/>
+                <w:color w:val="000000" w:themeColor="text1"/>
+                <w:sz w:val="18"/>
+                <w:szCs w:val="18"/>
+              </w:rPr>
+              <w:t>d.activityNotes</w:t>
+            </w:r>
+            <w:proofErr w:type="spellEnd"/>
+            <w:proofErr w:type="gramEnd"/>
+            <w:r>
+              <w:rPr>
+                <w:rFonts w:ascii="BC Sans" w:eastAsia="Times New Roman" w:hAnsi="BC Sans" w:cs="Times New Roman"/>
+                <w:color w:val="000000" w:themeColor="text1"/>
+                <w:sz w:val="18"/>
+                <w:szCs w:val="18"/>
+              </w:rPr>
+              <w:t>[</w:t>
+            </w:r>
+            <w:proofErr w:type="spellStart"/>
+            <w:r>
+              <w:rPr>
+                <w:rFonts w:ascii="BC Sans" w:eastAsia="Times New Roman" w:hAnsi="BC Sans" w:cs="Times New Roman"/>
+                <w:color w:val="000000" w:themeColor="text1"/>
+                <w:sz w:val="18"/>
+                <w:szCs w:val="18"/>
+              </w:rPr>
+              <w:t>i</w:t>
+            </w:r>
+            <w:proofErr w:type="spellEnd"/>
+            <w:proofErr w:type="gramStart"/>
+            <w:r>
+              <w:rPr>
+                <w:rFonts w:ascii="BC Sans" w:eastAsia="Times New Roman" w:hAnsi="BC Sans" w:cs="Times New Roman"/>
+                <w:color w:val="000000" w:themeColor="text1"/>
+                <w:sz w:val="18"/>
+                <w:szCs w:val="18"/>
+              </w:rPr>
+              <w:t>].</w:t>
+            </w:r>
+            <w:proofErr w:type="spellStart"/>
+            <w:r>
+              <w:rPr>
+                <w:rFonts w:ascii="BC Sans" w:eastAsia="Times New Roman" w:hAnsi="BC Sans" w:cs="Times New Roman"/>
+                <w:color w:val="000000" w:themeColor="text1"/>
+                <w:sz w:val="18"/>
+                <w:szCs w:val="18"/>
+              </w:rPr>
+              <w:t>actionedTime</w:t>
+            </w:r>
+            <w:proofErr w:type="spellEnd"/>
+            <w:proofErr w:type="gramEnd"/>
+            <w:r>
+              <w:rPr>
+                <w:rFonts w:ascii="BC Sans" w:eastAsia="Times New Roman" w:hAnsi="BC Sans" w:cs="Times New Roman"/>
+                <w:color w:val="000000" w:themeColor="text1"/>
+                <w:sz w:val="18"/>
+                <w:szCs w:val="18"/>
+              </w:rPr>
+              <w:t>}</w:t>
             </w:r>
           </w:p>
         </w:tc>
@@ -1553,7 +2373,49 @@
                 <w:sz w:val="18"/>
                 <w:szCs w:val="18"/>
               </w:rPr>
-              <w:t>{d.activityNotes[i].</w:t>
+              <w:t>{</w:t>
+            </w:r>
+            <w:proofErr w:type="spellStart"/>
+            <w:proofErr w:type="gramStart"/>
+            <w:r>
+              <w:rPr>
+                <w:rFonts w:ascii="BC Sans" w:eastAsia="Times New Roman" w:hAnsi="BC Sans" w:cs="Times New Roman"/>
+                <w:color w:val="000000" w:themeColor="text1"/>
+                <w:sz w:val="18"/>
+                <w:szCs w:val="18"/>
+              </w:rPr>
+              <w:t>d.activityNotes</w:t>
+            </w:r>
+            <w:proofErr w:type="spellEnd"/>
+            <w:proofErr w:type="gramEnd"/>
+            <w:r>
+              <w:rPr>
+                <w:rFonts w:ascii="BC Sans" w:eastAsia="Times New Roman" w:hAnsi="BC Sans" w:cs="Times New Roman"/>
+                <w:color w:val="000000" w:themeColor="text1"/>
+                <w:sz w:val="18"/>
+                <w:szCs w:val="18"/>
+              </w:rPr>
+              <w:t>[</w:t>
+            </w:r>
+            <w:proofErr w:type="spellStart"/>
+            <w:r>
+              <w:rPr>
+                <w:rFonts w:ascii="BC Sans" w:eastAsia="Times New Roman" w:hAnsi="BC Sans" w:cs="Times New Roman"/>
+                <w:color w:val="000000" w:themeColor="text1"/>
+                <w:sz w:val="18"/>
+                <w:szCs w:val="18"/>
+              </w:rPr>
+              <w:t>i</w:t>
+            </w:r>
+            <w:proofErr w:type="spellEnd"/>
+            <w:r>
+              <w:rPr>
+                <w:rFonts w:ascii="BC Sans" w:eastAsia="Times New Roman" w:hAnsi="BC Sans" w:cs="Times New Roman"/>
+                <w:color w:val="000000" w:themeColor="text1"/>
+                <w:sz w:val="18"/>
+                <w:szCs w:val="18"/>
+              </w:rPr>
+              <w:t>].</w:t>
             </w:r>
             <w:r>
               <w:rPr>
@@ -1566,6 +2428,7 @@
               </w:rPr>
               <w:t xml:space="preserve"> </w:t>
             </w:r>
+            <w:proofErr w:type="spellStart"/>
             <w:r>
               <w:rPr>
                 <w:rFonts w:ascii="BC Sans" w:eastAsia="Times New Roman" w:hAnsi="BC Sans" w:cs="Times New Roman"/>
@@ -1582,7 +2445,68 @@
                 <w:sz w:val="18"/>
                 <w:szCs w:val="18"/>
               </w:rPr>
-              <w:t>.lastName}, {d.activityNotes[i].</w:t>
+              <w:t>.</w:t>
+            </w:r>
+            <w:proofErr w:type="gramStart"/>
+            <w:r>
+              <w:rPr>
+                <w:rFonts w:ascii="BC Sans" w:eastAsia="Times New Roman" w:hAnsi="BC Sans" w:cs="Times New Roman"/>
+                <w:color w:val="000000" w:themeColor="text1"/>
+                <w:sz w:val="18"/>
+                <w:szCs w:val="18"/>
+              </w:rPr>
+              <w:t>lastName</w:t>
+            </w:r>
+            <w:proofErr w:type="spellEnd"/>
+            <w:r>
+              <w:rPr>
+                <w:rFonts w:ascii="BC Sans" w:eastAsia="Times New Roman" w:hAnsi="BC Sans" w:cs="Times New Roman"/>
+                <w:color w:val="000000" w:themeColor="text1"/>
+                <w:sz w:val="18"/>
+                <w:szCs w:val="18"/>
+              </w:rPr>
+              <w:t>}, {</w:t>
+            </w:r>
+            <w:proofErr w:type="spellStart"/>
+            <w:r>
+              <w:rPr>
+                <w:rFonts w:ascii="BC Sans" w:eastAsia="Times New Roman" w:hAnsi="BC Sans" w:cs="Times New Roman"/>
+                <w:color w:val="000000" w:themeColor="text1"/>
+                <w:sz w:val="18"/>
+                <w:szCs w:val="18"/>
+              </w:rPr>
+              <w:t>d.activityNotes</w:t>
+            </w:r>
+            <w:proofErr w:type="spellEnd"/>
+            <w:proofErr w:type="gramEnd"/>
+            <w:r>
+              <w:rPr>
+                <w:rFonts w:ascii="BC Sans" w:eastAsia="Times New Roman" w:hAnsi="BC Sans" w:cs="Times New Roman"/>
+                <w:color w:val="000000" w:themeColor="text1"/>
+                <w:sz w:val="18"/>
+                <w:szCs w:val="18"/>
+              </w:rPr>
+              <w:t>[</w:t>
+            </w:r>
+            <w:proofErr w:type="spellStart"/>
+            <w:r>
+              <w:rPr>
+                <w:rFonts w:ascii="BC Sans" w:eastAsia="Times New Roman" w:hAnsi="BC Sans" w:cs="Times New Roman"/>
+                <w:color w:val="000000" w:themeColor="text1"/>
+                <w:sz w:val="18"/>
+                <w:szCs w:val="18"/>
+              </w:rPr>
+              <w:t>i</w:t>
+            </w:r>
+            <w:proofErr w:type="spellEnd"/>
+            <w:r>
+              <w:rPr>
+                <w:rFonts w:ascii="BC Sans" w:eastAsia="Times New Roman" w:hAnsi="BC Sans" w:cs="Times New Roman"/>
+                <w:color w:val="000000" w:themeColor="text1"/>
+                <w:sz w:val="18"/>
+                <w:szCs w:val="18"/>
+              </w:rPr>
+              <w:t>].</w:t>
             </w:r>
             <w:r>
               <w:rPr>
@@ -1595,6 +2519,7 @@
               </w:rPr>
               <w:t xml:space="preserve"> </w:t>
             </w:r>
+            <w:proofErr w:type="spellStart"/>
             <w:r>
               <w:rPr>
                 <w:rFonts w:ascii="BC Sans" w:eastAsia="Times New Roman" w:hAnsi="BC Sans" w:cs="Times New Roman"/>
@@ -1611,7 +2536,17 @@
                 <w:sz w:val="18"/>
                 <w:szCs w:val="18"/>
               </w:rPr>
-              <w:t>.firstName}</w:t>
+              <w:t>.firstName</w:t>
+            </w:r>
+            <w:proofErr w:type="spellEnd"/>
+            <w:r>
+              <w:rPr>
+                <w:rFonts w:ascii="BC Sans" w:eastAsia="Times New Roman" w:hAnsi="BC Sans" w:cs="Times New Roman"/>
+                <w:color w:val="000000" w:themeColor="text1"/>
+                <w:sz w:val="18"/>
+                <w:szCs w:val="18"/>
+              </w:rPr>
+              <w:t>}</w:t>
             </w:r>
           </w:p>
         </w:tc>
@@ -1647,7 +2582,70 @@
                 <w:sz w:val="20"/>
                 <w:szCs w:val="20"/>
               </w:rPr>
-              <w:t>{d.activityNotes[i+1].contentText}</w:t>
+              <w:t>{</w:t>
+            </w:r>
+            <w:proofErr w:type="spellStart"/>
+            <w:proofErr w:type="gramStart"/>
+            <w:r>
+              <w:rPr>
+                <w:rFonts w:ascii="BC Sans" w:hAnsi="BC Sans"/>
+                <w:b w:val="0"/>
+                <w:bCs w:val="0"/>
+                <w:caps w:val="0"/>
+                <w:sz w:val="20"/>
+                <w:szCs w:val="20"/>
+              </w:rPr>
+              <w:t>d.activityNotes</w:t>
+            </w:r>
+            <w:proofErr w:type="spellEnd"/>
+            <w:proofErr w:type="gramEnd"/>
+            <w:r>
+              <w:rPr>
+                <w:rFonts w:ascii="BC Sans" w:hAnsi="BC Sans"/>
+                <w:b w:val="0"/>
+                <w:bCs w:val="0"/>
+                <w:caps w:val="0"/>
+                <w:sz w:val="20"/>
+                <w:szCs w:val="20"/>
+              </w:rPr>
+              <w:t>[i+1</w:t>
+            </w:r>
+            <w:proofErr w:type="gramStart"/>
+            <w:r>
+              <w:rPr>
+                <w:rFonts w:ascii="BC Sans" w:hAnsi="BC Sans"/>
+                <w:b w:val="0"/>
+                <w:bCs w:val="0"/>
+                <w:caps w:val="0"/>
+                <w:sz w:val="20"/>
+                <w:szCs w:val="20"/>
+              </w:rPr>
+              <w:t>].</w:t>
+            </w:r>
+            <w:proofErr w:type="spellStart"/>
+            <w:r>
+              <w:rPr>
+                <w:rFonts w:ascii="BC Sans" w:hAnsi="BC Sans"/>
+                <w:b w:val="0"/>
+                <w:bCs w:val="0"/>
+                <w:caps w:val="0"/>
+                <w:sz w:val="20"/>
+                <w:szCs w:val="20"/>
+              </w:rPr>
+              <w:t>contentText</w:t>
+            </w:r>
+            <w:proofErr w:type="spellEnd"/>
+            <w:proofErr w:type="gramEnd"/>
+            <w:r>
+              <w:rPr>
+                <w:rFonts w:ascii="BC Sans" w:hAnsi="BC Sans"/>
+                <w:b w:val="0"/>
+                <w:bCs w:val="0"/>
+                <w:caps w:val="0"/>
+                <w:sz w:val="20"/>
+                <w:szCs w:val="20"/>
+              </w:rPr>
+              <w:t>}</w:t>
             </w:r>
           </w:p>
         </w:tc>
@@ -1677,8 +2675,10 @@
                 <w:sz w:val="18"/>
                 <w:szCs w:val="18"/>
               </w:rPr>
-              <w:t>{d.activityNotes[i+1].actionedDate}</w:t>
-            </w:r>
+              <w:t>{</w:t>
+            </w:r>
+            <w:proofErr w:type="spellStart"/>
+            <w:proofErr w:type="gramStart"/>
             <w:r>
               <w:rPr>
                 <w:rFonts w:ascii="BC Sans" w:eastAsia="Times New Roman" w:hAnsi="BC Sans" w:cs="Times New Roman"/>
@@ -1686,7 +2686,111 @@
                 <w:sz w:val="18"/>
                 <w:szCs w:val="18"/>
               </w:rPr>
-              <w:t xml:space="preserve"> {d.activityNotes[i+1].actionedTime}</w:t>
+              <w:t>d.activityNotes</w:t>
+            </w:r>
+            <w:proofErr w:type="spellEnd"/>
+            <w:proofErr w:type="gramEnd"/>
+            <w:r>
+              <w:rPr>
+                <w:rFonts w:ascii="BC Sans" w:eastAsia="Times New Roman" w:hAnsi="BC Sans" w:cs="Times New Roman"/>
+                <w:color w:val="000000" w:themeColor="text1"/>
+                <w:sz w:val="18"/>
+                <w:szCs w:val="18"/>
+              </w:rPr>
+              <w:t>[i+1</w:t>
+            </w:r>
+            <w:proofErr w:type="gramStart"/>
+            <w:r>
+              <w:rPr>
+                <w:rFonts w:ascii="BC Sans" w:eastAsia="Times New Roman" w:hAnsi="BC Sans" w:cs="Times New Roman"/>
+                <w:color w:val="000000" w:themeColor="text1"/>
+                <w:sz w:val="18"/>
+                <w:szCs w:val="18"/>
+              </w:rPr>
+              <w:t>].</w:t>
+            </w:r>
+            <w:proofErr w:type="spellStart"/>
+            <w:r>
+              <w:rPr>
+                <w:rFonts w:ascii="BC Sans" w:eastAsia="Times New Roman" w:hAnsi="BC Sans" w:cs="Times New Roman"/>
+                <w:color w:val="000000" w:themeColor="text1"/>
+                <w:sz w:val="18"/>
+                <w:szCs w:val="18"/>
+              </w:rPr>
+              <w:t>actionedDate</w:t>
+            </w:r>
+            <w:proofErr w:type="spellEnd"/>
+            <w:proofErr w:type="gramEnd"/>
+            <w:r>
+              <w:rPr>
+                <w:rFonts w:ascii="BC Sans" w:eastAsia="Times New Roman" w:hAnsi="BC Sans" w:cs="Times New Roman"/>
+                <w:color w:val="000000" w:themeColor="text1"/>
+                <w:sz w:val="18"/>
+                <w:szCs w:val="18"/>
+              </w:rPr>
+              <w:t>}</w:t>
+            </w:r>
+            <w:r>
+              <w:rPr>
+                <w:rFonts w:ascii="BC Sans" w:eastAsia="Times New Roman" w:hAnsi="BC Sans" w:cs="Times New Roman"/>
+                <w:color w:val="000000" w:themeColor="text1"/>
+                <w:sz w:val="18"/>
+                <w:szCs w:val="18"/>
+              </w:rPr>
+              <w:t xml:space="preserve"> {</w:t>
+            </w:r>
+            <w:proofErr w:type="spellStart"/>
+            <w:proofErr w:type="gramStart"/>
+            <w:r>
+              <w:rPr>
+                <w:rFonts w:ascii="BC Sans" w:eastAsia="Times New Roman" w:hAnsi="BC Sans" w:cs="Times New Roman"/>
+                <w:color w:val="000000" w:themeColor="text1"/>
+                <w:sz w:val="18"/>
+                <w:szCs w:val="18"/>
+              </w:rPr>
+              <w:t>d.activityNotes</w:t>
+            </w:r>
+            <w:proofErr w:type="spellEnd"/>
+            <w:proofErr w:type="gramEnd"/>
+            <w:r>
+              <w:rPr>
+                <w:rFonts w:ascii="BC Sans" w:eastAsia="Times New Roman" w:hAnsi="BC Sans" w:cs="Times New Roman"/>
+                <w:color w:val="000000" w:themeColor="text1"/>
+                <w:sz w:val="18"/>
+                <w:szCs w:val="18"/>
+              </w:rPr>
+              <w:t>[i+1</w:t>
+            </w:r>
+            <w:proofErr w:type="gramStart"/>
+            <w:r>
+              <w:rPr>
+                <w:rFonts w:ascii="BC Sans" w:eastAsia="Times New Roman" w:hAnsi="BC Sans" w:cs="Times New Roman"/>
+                <w:color w:val="000000" w:themeColor="text1"/>
+                <w:sz w:val="18"/>
+                <w:szCs w:val="18"/>
+              </w:rPr>
+              <w:t>].</w:t>
+            </w:r>
+            <w:proofErr w:type="spellStart"/>
+            <w:r>
+              <w:rPr>
+                <w:rFonts w:ascii="BC Sans" w:eastAsia="Times New Roman" w:hAnsi="BC Sans" w:cs="Times New Roman"/>
+                <w:color w:val="000000" w:themeColor="text1"/>
+                <w:sz w:val="18"/>
+                <w:szCs w:val="18"/>
+              </w:rPr>
+              <w:t>actionedTime</w:t>
+            </w:r>
+            <w:proofErr w:type="spellEnd"/>
+            <w:proofErr w:type="gramEnd"/>
+            <w:r>
+              <w:rPr>
+                <w:rFonts w:ascii="BC Sans" w:eastAsia="Times New Roman" w:hAnsi="BC Sans" w:cs="Times New Roman"/>
+                <w:color w:val="000000" w:themeColor="text1"/>
+                <w:sz w:val="18"/>
+                <w:szCs w:val="18"/>
+              </w:rPr>
+              <w:t>}</w:t>
             </w:r>
           </w:p>
         </w:tc>
@@ -1714,7 +2818,29 @@
                 <w:sz w:val="18"/>
                 <w:szCs w:val="18"/>
               </w:rPr>
-              <w:t>{d.activityNotes[i+1].</w:t>
+              <w:t>{</w:t>
+            </w:r>
+            <w:proofErr w:type="spellStart"/>
+            <w:proofErr w:type="gramStart"/>
+            <w:r>
+              <w:rPr>
+                <w:rFonts w:ascii="BC Sans" w:eastAsia="Times New Roman" w:hAnsi="BC Sans" w:cs="Times New Roman"/>
+                <w:color w:val="000000" w:themeColor="text1"/>
+                <w:sz w:val="18"/>
+                <w:szCs w:val="18"/>
+              </w:rPr>
+              <w:t>d.activityNotes</w:t>
+            </w:r>
+            <w:proofErr w:type="spellEnd"/>
+            <w:proofErr w:type="gramEnd"/>
+            <w:r>
+              <w:rPr>
+                <w:rFonts w:ascii="BC Sans" w:eastAsia="Times New Roman" w:hAnsi="BC Sans" w:cs="Times New Roman"/>
+                <w:color w:val="000000" w:themeColor="text1"/>
+                <w:sz w:val="18"/>
+                <w:szCs w:val="18"/>
+              </w:rPr>
+              <w:t>[i+1].</w:t>
             </w:r>
             <w:r>
               <w:rPr>
@@ -1727,6 +2853,7 @@
               </w:rPr>
               <w:t xml:space="preserve"> </w:t>
             </w:r>
+            <w:proofErr w:type="spellStart"/>
             <w:r>
               <w:rPr>
                 <w:rFonts w:ascii="BC Sans" w:eastAsia="Times New Roman" w:hAnsi="BC Sans" w:cs="Times New Roman"/>
@@ -1743,7 +2870,48 @@
                 <w:sz w:val="18"/>
                 <w:szCs w:val="18"/>
               </w:rPr>
-              <w:t>.lastName}, {d.activityNotes[i+1].</w:t>
+              <w:t>.</w:t>
+            </w:r>
+            <w:proofErr w:type="gramStart"/>
+            <w:r>
+              <w:rPr>
+                <w:rFonts w:ascii="BC Sans" w:eastAsia="Times New Roman" w:hAnsi="BC Sans" w:cs="Times New Roman"/>
+                <w:color w:val="000000" w:themeColor="text1"/>
+                <w:sz w:val="18"/>
+                <w:szCs w:val="18"/>
+              </w:rPr>
+              <w:t>lastName</w:t>
+            </w:r>
+            <w:proofErr w:type="spellEnd"/>
+            <w:r>
+              <w:rPr>
+                <w:rFonts w:ascii="BC Sans" w:eastAsia="Times New Roman" w:hAnsi="BC Sans" w:cs="Times New Roman"/>
+                <w:color w:val="000000" w:themeColor="text1"/>
+                <w:sz w:val="18"/>
+                <w:szCs w:val="18"/>
+              </w:rPr>
+              <w:t>}, {</w:t>
+            </w:r>
+            <w:proofErr w:type="spellStart"/>
+            <w:r>
+              <w:rPr>
+                <w:rFonts w:ascii="BC Sans" w:eastAsia="Times New Roman" w:hAnsi="BC Sans" w:cs="Times New Roman"/>
+                <w:color w:val="000000" w:themeColor="text1"/>
+                <w:sz w:val="18"/>
+                <w:szCs w:val="18"/>
+              </w:rPr>
+              <w:t>d.activityNotes</w:t>
+            </w:r>
+            <w:proofErr w:type="spellEnd"/>
+            <w:proofErr w:type="gramEnd"/>
+            <w:r>
+              <w:rPr>
+                <w:rFonts w:ascii="BC Sans" w:eastAsia="Times New Roman" w:hAnsi="BC Sans" w:cs="Times New Roman"/>
+                <w:color w:val="000000" w:themeColor="text1"/>
+                <w:sz w:val="18"/>
+                <w:szCs w:val="18"/>
+              </w:rPr>
+              <w:t>[i+1].</w:t>
             </w:r>
             <w:r>
               <w:rPr>
@@ -1756,6 +2924,7 @@
               </w:rPr>
               <w:t xml:space="preserve"> </w:t>
             </w:r>
+            <w:proofErr w:type="spellStart"/>
             <w:r>
               <w:rPr>
                 <w:rFonts w:ascii="BC Sans" w:eastAsia="Times New Roman" w:hAnsi="BC Sans" w:cs="Times New Roman"/>
@@ -1772,7 +2941,17 @@
                 <w:sz w:val="18"/>
                 <w:szCs w:val="18"/>
               </w:rPr>
-              <w:t>.firstName}</w:t>
+              <w:t>.firstName</w:t>
+            </w:r>
+            <w:proofErr w:type="spellEnd"/>
+            <w:r>
+              <w:rPr>
+                <w:rFonts w:ascii="BC Sans" w:eastAsia="Times New Roman" w:hAnsi="BC Sans" w:cs="Times New Roman"/>
+                <w:color w:val="000000" w:themeColor="text1"/>
+                <w:sz w:val="18"/>
+                <w:szCs w:val="18"/>
+              </w:rPr>
+              <w:t>}</w:t>
             </w:r>
           </w:p>
         </w:tc>
@@ -1793,7 +2972,17 @@
           <w:sz w:val="20"/>
           <w:szCs w:val="20"/>
         </w:rPr>
-        <w:t>{d.</w:t>
+        <w:t>{</w:t>
+      </w:r>
+      <w:proofErr w:type="spellStart"/>
+      <w:proofErr w:type="gramStart"/>
+      <w:r>
+        <w:rPr>
+          <w:rFonts w:ascii="BC Sans" w:hAnsi="BC Sans"/>
+          <w:sz w:val="20"/>
+          <w:szCs w:val="20"/>
+        </w:rPr>
+        <w:t>d.</w:t>
       </w:r>
       <w:r>
         <w:rPr>
@@ -1803,13 +2992,23 @@
         </w:rPr>
         <w:t>hasActivityNotes</w:t>
       </w:r>
+      <w:proofErr w:type="gramEnd"/>
       <w:r>
         <w:rPr>
           <w:rFonts w:ascii="BC Sans" w:hAnsi="BC Sans"/>
           <w:sz w:val="20"/>
           <w:szCs w:val="20"/>
         </w:rPr>
-        <w:t>:showEnd}</w:t>
+        <w:t>:showEnd</w:t>
+      </w:r>
+      <w:proofErr w:type="spellEnd"/>
+      <w:r>
+        <w:rPr>
+          <w:rFonts w:ascii="BC Sans" w:hAnsi="BC Sans"/>
+          <w:sz w:val="20"/>
+          <w:szCs w:val="20"/>
+        </w:rPr>
+        <w:t>}</w:t>
       </w:r>
     </w:p>
     <w:tbl>
@@ -1863,7 +3062,71 @@
                 <w:sz w:val="20"/>
                 <w:szCs w:val="20"/>
               </w:rPr>
-              <w:t>Exhibit #{d.exhibits[i].exhibitNumber}</w:t>
+              <w:t>Exhibit #{</w:t>
+            </w:r>
+            <w:proofErr w:type="gramStart"/>
+            <w:r>
+              <w:rPr>
+                <w:rFonts w:ascii="BC Sans" w:hAnsi="BC Sans"/>
+                <w:b/>
+                <w:bCs/>
+                <w:sz w:val="20"/>
+                <w:szCs w:val="20"/>
+              </w:rPr>
+              <w:t>d.exhibits</w:t>
+            </w:r>
+            <w:proofErr w:type="gramEnd"/>
+            <w:r>
+              <w:rPr>
+                <w:rFonts w:ascii="BC Sans" w:hAnsi="BC Sans"/>
+                <w:b/>
+                <w:bCs/>
+                <w:sz w:val="20"/>
+                <w:szCs w:val="20"/>
+              </w:rPr>
+              <w:t>[i</w:t>
+            </w:r>
+            <w:proofErr w:type="gramStart"/>
+            <w:r>
+              <w:rPr>
+                <w:rFonts w:ascii="BC Sans" w:hAnsi="BC Sans"/>
+                <w:b/>
+                <w:bCs/>
+                <w:sz w:val="20"/>
+                <w:szCs w:val="20"/>
+              </w:rPr>
+              <w:t>].exhibit</w:t>
+            </w:r>
+            <w:r>
+              <w:rPr>
+                <w:rFonts w:ascii="BC Sans" w:hAnsi="BC Sans"/>
+                <w:b/>
+                <w:bCs/>
+                <w:sz w:val="20"/>
+                <w:szCs w:val="20"/>
+              </w:rPr>
+              <w:t>Display</w:t>
+            </w:r>
+            <w:r>
+              <w:rPr>
+                <w:rFonts w:ascii="BC Sans" w:hAnsi="BC Sans"/>
+                <w:b/>
+                <w:bCs/>
+                <w:sz w:val="20"/>
+                <w:szCs w:val="20"/>
+              </w:rPr>
+              <w:t>Number</w:t>
+            </w:r>
+            <w:proofErr w:type="gramEnd"/>
+            <w:r>
+              <w:rPr>
+                <w:rFonts w:ascii="BC Sans" w:hAnsi="BC Sans"/>
+                <w:b/>
+                <w:bCs/>
+                <w:sz w:val="20"/>
+                <w:szCs w:val="20"/>
+              </w:rPr>
+              <w:t>}</w:t>
             </w:r>
           </w:p>
         </w:tc>
@@ -1933,7 +3196,71 @@
                 <w:szCs w:val="20"/>
                 <w:lang w:val="en-CA"/>
               </w:rPr>
-              <w:t>{d.exhibits[i].propertyType}</w:t>
+              <w:t>{</w:t>
+            </w:r>
+            <w:proofErr w:type="spellStart"/>
+            <w:proofErr w:type="gramStart"/>
+            <w:r>
+              <w:rPr>
+                <w:rFonts w:ascii="BC Sans" w:hAnsi="BC Sans"/>
+                <w:sz w:val="20"/>
+                <w:szCs w:val="20"/>
+                <w:lang w:val="en-CA"/>
+              </w:rPr>
+              <w:t>d.exhibits</w:t>
+            </w:r>
+            <w:proofErr w:type="spellEnd"/>
+            <w:proofErr w:type="gramEnd"/>
+            <w:r>
+              <w:rPr>
+                <w:rFonts w:ascii="BC Sans" w:hAnsi="BC Sans"/>
+                <w:sz w:val="20"/>
+                <w:szCs w:val="20"/>
+                <w:lang w:val="en-CA"/>
+              </w:rPr>
+              <w:t>[</w:t>
+            </w:r>
+            <w:proofErr w:type="spellStart"/>
+            <w:r>
+              <w:rPr>
+                <w:rFonts w:ascii="BC Sans" w:hAnsi="BC Sans"/>
+                <w:sz w:val="20"/>
+                <w:szCs w:val="20"/>
+                <w:lang w:val="en-CA"/>
+              </w:rPr>
+              <w:t>i</w:t>
+            </w:r>
+            <w:proofErr w:type="spellEnd"/>
+            <w:proofErr w:type="gramStart"/>
+            <w:r>
+              <w:rPr>
+                <w:rFonts w:ascii="BC Sans" w:hAnsi="BC Sans"/>
+                <w:sz w:val="20"/>
+                <w:szCs w:val="20"/>
+                <w:lang w:val="en-CA"/>
+              </w:rPr>
+              <w:t>].</w:t>
+            </w:r>
+            <w:proofErr w:type="spellStart"/>
+            <w:r>
+              <w:rPr>
+                <w:rFonts w:ascii="BC Sans" w:hAnsi="BC Sans"/>
+                <w:sz w:val="20"/>
+                <w:szCs w:val="20"/>
+                <w:lang w:val="en-CA"/>
+              </w:rPr>
+              <w:t>propertyType</w:t>
+            </w:r>
+            <w:proofErr w:type="spellEnd"/>
+            <w:proofErr w:type="gramEnd"/>
+            <w:r>
+              <w:rPr>
+                <w:rFonts w:ascii="BC Sans" w:hAnsi="BC Sans"/>
+                <w:sz w:val="20"/>
+                <w:szCs w:val="20"/>
+                <w:lang w:val="en-CA"/>
+              </w:rPr>
+              <w:t>}</w:t>
             </w:r>
           </w:p>
         </w:tc>
@@ -2002,7 +3329,60 @@
                 <w:szCs w:val="20"/>
                 <w:lang w:val="en-CA"/>
               </w:rPr>
-              <w:t>{d.exhibits[i].description}</w:t>
+              <w:t>{</w:t>
+            </w:r>
+            <w:proofErr w:type="spellStart"/>
+            <w:proofErr w:type="gramStart"/>
+            <w:r>
+              <w:rPr>
+                <w:rFonts w:ascii="BC Sans" w:hAnsi="BC Sans"/>
+                <w:sz w:val="20"/>
+                <w:szCs w:val="20"/>
+                <w:lang w:val="en-CA"/>
+              </w:rPr>
+              <w:t>d.exhibits</w:t>
+            </w:r>
+            <w:proofErr w:type="spellEnd"/>
+            <w:proofErr w:type="gramEnd"/>
+            <w:r>
+              <w:rPr>
+                <w:rFonts w:ascii="BC Sans" w:hAnsi="BC Sans"/>
+                <w:sz w:val="20"/>
+                <w:szCs w:val="20"/>
+                <w:lang w:val="en-CA"/>
+              </w:rPr>
+              <w:t>[</w:t>
+            </w:r>
+            <w:proofErr w:type="spellStart"/>
+            <w:r>
+              <w:rPr>
+                <w:rFonts w:ascii="BC Sans" w:hAnsi="BC Sans"/>
+                <w:sz w:val="20"/>
+                <w:szCs w:val="20"/>
+                <w:lang w:val="en-CA"/>
+              </w:rPr>
+              <w:t>i</w:t>
+            </w:r>
+            <w:proofErr w:type="spellEnd"/>
+            <w:proofErr w:type="gramStart"/>
+            <w:r>
+              <w:rPr>
+                <w:rFonts w:ascii="BC Sans" w:hAnsi="BC Sans"/>
+                <w:sz w:val="20"/>
+                <w:szCs w:val="20"/>
+                <w:lang w:val="en-CA"/>
+              </w:rPr>
+              <w:t>].description</w:t>
+            </w:r>
+            <w:proofErr w:type="gramEnd"/>
+            <w:r>
+              <w:rPr>
+                <w:rFonts w:ascii="BC Sans" w:hAnsi="BC Sans"/>
+                <w:sz w:val="20"/>
+                <w:szCs w:val="20"/>
+                <w:lang w:val="en-CA"/>
+              </w:rPr>
+              <w:t>}</w:t>
             </w:r>
           </w:p>
         </w:tc>
@@ -2071,7 +3451,60 @@
                 <w:szCs w:val="20"/>
                 <w:lang w:val="en-CA"/>
               </w:rPr>
-              <w:t>{d.exhibits[i].quantity}</w:t>
+              <w:t>{</w:t>
+            </w:r>
+            <w:proofErr w:type="spellStart"/>
+            <w:proofErr w:type="gramStart"/>
+            <w:r>
+              <w:rPr>
+                <w:rFonts w:ascii="BC Sans" w:hAnsi="BC Sans"/>
+                <w:sz w:val="20"/>
+                <w:szCs w:val="20"/>
+                <w:lang w:val="en-CA"/>
+              </w:rPr>
+              <w:t>d.exhibits</w:t>
+            </w:r>
+            <w:proofErr w:type="spellEnd"/>
+            <w:proofErr w:type="gramEnd"/>
+            <w:r>
+              <w:rPr>
+                <w:rFonts w:ascii="BC Sans" w:hAnsi="BC Sans"/>
+                <w:sz w:val="20"/>
+                <w:szCs w:val="20"/>
+                <w:lang w:val="en-CA"/>
+              </w:rPr>
+              <w:t>[</w:t>
+            </w:r>
+            <w:proofErr w:type="spellStart"/>
+            <w:r>
+              <w:rPr>
+                <w:rFonts w:ascii="BC Sans" w:hAnsi="BC Sans"/>
+                <w:sz w:val="20"/>
+                <w:szCs w:val="20"/>
+                <w:lang w:val="en-CA"/>
+              </w:rPr>
+              <w:t>i</w:t>
+            </w:r>
+            <w:proofErr w:type="spellEnd"/>
+            <w:proofErr w:type="gramStart"/>
+            <w:r>
+              <w:rPr>
+                <w:rFonts w:ascii="BC Sans" w:hAnsi="BC Sans"/>
+                <w:sz w:val="20"/>
+                <w:szCs w:val="20"/>
+                <w:lang w:val="en-CA"/>
+              </w:rPr>
+              <w:t>].quantity</w:t>
+            </w:r>
+            <w:proofErr w:type="gramEnd"/>
+            <w:r>
+              <w:rPr>
+                <w:rFonts w:ascii="BC Sans" w:hAnsi="BC Sans"/>
+                <w:sz w:val="20"/>
+                <w:szCs w:val="20"/>
+                <w:lang w:val="en-CA"/>
+              </w:rPr>
+              <w:t>}</w:t>
             </w:r>
           </w:p>
         </w:tc>
@@ -2140,7 +3573,135 @@
                 <w:szCs w:val="20"/>
                 <w:lang w:val="en-CA"/>
               </w:rPr>
-              <w:t>{d.exhibits[i].collectedBy.lastName}, {d.exhibits[i].collectedBy.firstName}</w:t>
+              <w:t>{</w:t>
+            </w:r>
+            <w:proofErr w:type="spellStart"/>
+            <w:proofErr w:type="gramStart"/>
+            <w:r>
+              <w:rPr>
+                <w:rFonts w:ascii="BC Sans" w:hAnsi="BC Sans"/>
+                <w:sz w:val="20"/>
+                <w:szCs w:val="20"/>
+                <w:lang w:val="en-CA"/>
+              </w:rPr>
+              <w:t>d.exhibits</w:t>
+            </w:r>
+            <w:proofErr w:type="spellEnd"/>
+            <w:proofErr w:type="gramEnd"/>
+            <w:r>
+              <w:rPr>
+                <w:rFonts w:ascii="BC Sans" w:hAnsi="BC Sans"/>
+                <w:sz w:val="20"/>
+                <w:szCs w:val="20"/>
+                <w:lang w:val="en-CA"/>
+              </w:rPr>
+              <w:t>[</w:t>
+            </w:r>
+            <w:proofErr w:type="spellStart"/>
+            <w:r>
+              <w:rPr>
+                <w:rFonts w:ascii="BC Sans" w:hAnsi="BC Sans"/>
+                <w:sz w:val="20"/>
+                <w:szCs w:val="20"/>
+                <w:lang w:val="en-CA"/>
+              </w:rPr>
+              <w:t>i</w:t>
+            </w:r>
+            <w:proofErr w:type="spellEnd"/>
+            <w:proofErr w:type="gramStart"/>
+            <w:r>
+              <w:rPr>
+                <w:rFonts w:ascii="BC Sans" w:hAnsi="BC Sans"/>
+                <w:sz w:val="20"/>
+                <w:szCs w:val="20"/>
+                <w:lang w:val="en-CA"/>
+              </w:rPr>
+              <w:t>].</w:t>
+            </w:r>
+            <w:proofErr w:type="spellStart"/>
+            <w:r>
+              <w:rPr>
+                <w:rFonts w:ascii="BC Sans" w:hAnsi="BC Sans"/>
+                <w:sz w:val="20"/>
+                <w:szCs w:val="20"/>
+                <w:lang w:val="en-CA"/>
+              </w:rPr>
+              <w:t>collectedBy.lastName</w:t>
+            </w:r>
+            <w:proofErr w:type="spellEnd"/>
+            <w:proofErr w:type="gramEnd"/>
+            <w:r>
+              <w:rPr>
+                <w:rFonts w:ascii="BC Sans" w:hAnsi="BC Sans"/>
+                <w:sz w:val="20"/>
+                <w:szCs w:val="20"/>
+                <w:lang w:val="en-CA"/>
+              </w:rPr>
+              <w:t>}, {</w:t>
+            </w:r>
+            <w:proofErr w:type="spellStart"/>
+            <w:proofErr w:type="gramStart"/>
+            <w:r>
+              <w:rPr>
+                <w:rFonts w:ascii="BC Sans" w:hAnsi="BC Sans"/>
+                <w:sz w:val="20"/>
+                <w:szCs w:val="20"/>
+                <w:lang w:val="en-CA"/>
+              </w:rPr>
+              <w:t>d.exhibits</w:t>
+            </w:r>
+            <w:proofErr w:type="spellEnd"/>
+            <w:proofErr w:type="gramEnd"/>
+            <w:r>
+              <w:rPr>
+                <w:rFonts w:ascii="BC Sans" w:hAnsi="BC Sans"/>
+                <w:sz w:val="20"/>
+                <w:szCs w:val="20"/>
+                <w:lang w:val="en-CA"/>
+              </w:rPr>
+              <w:t>[</w:t>
+            </w:r>
+            <w:proofErr w:type="spellStart"/>
+            <w:r>
+              <w:rPr>
+                <w:rFonts w:ascii="BC Sans" w:hAnsi="BC Sans"/>
+                <w:sz w:val="20"/>
+                <w:szCs w:val="20"/>
+                <w:lang w:val="en-CA"/>
+              </w:rPr>
+              <w:t>i</w:t>
+            </w:r>
+            <w:proofErr w:type="spellEnd"/>
+            <w:proofErr w:type="gramStart"/>
+            <w:r>
+              <w:rPr>
+                <w:rFonts w:ascii="BC Sans" w:hAnsi="BC Sans"/>
+                <w:sz w:val="20"/>
+                <w:szCs w:val="20"/>
+                <w:lang w:val="en-CA"/>
+              </w:rPr>
+              <w:t>].</w:t>
+            </w:r>
+            <w:proofErr w:type="spellStart"/>
+            <w:r>
+              <w:rPr>
+                <w:rFonts w:ascii="BC Sans" w:hAnsi="BC Sans"/>
+                <w:sz w:val="20"/>
+                <w:szCs w:val="20"/>
+                <w:lang w:val="en-CA"/>
+              </w:rPr>
+              <w:t>collectedBy.firstName</w:t>
+            </w:r>
+            <w:proofErr w:type="spellEnd"/>
+            <w:proofErr w:type="gramEnd"/>
+            <w:r>
+              <w:rPr>
+                <w:rFonts w:ascii="BC Sans" w:hAnsi="BC Sans"/>
+                <w:sz w:val="20"/>
+                <w:szCs w:val="20"/>
+                <w:lang w:val="en-CA"/>
+              </w:rPr>
+              <w:t>}</w:t>
             </w:r>
           </w:p>
         </w:tc>
@@ -2209,16 +3770,144 @@
                 <w:szCs w:val="20"/>
                 <w:lang w:val="en-CA"/>
               </w:rPr>
-              <w:t>{d.exhibits[i].dateCollected}</w:t>
-            </w:r>
-            <w:r>
-              <w:rPr>
-                <w:rFonts w:ascii="BC Sans" w:hAnsi="BC Sans"/>
-                <w:sz w:val="20"/>
-                <w:szCs w:val="20"/>
-                <w:lang w:val="en-CA"/>
-              </w:rPr>
-              <w:t xml:space="preserve"> {d.exhibits[i].intakeTime }</w:t>
+              <w:t>{</w:t>
+            </w:r>
+            <w:proofErr w:type="spellStart"/>
+            <w:proofErr w:type="gramStart"/>
+            <w:r>
+              <w:rPr>
+                <w:rFonts w:ascii="BC Sans" w:hAnsi="BC Sans"/>
+                <w:sz w:val="20"/>
+                <w:szCs w:val="20"/>
+                <w:lang w:val="en-CA"/>
+              </w:rPr>
+              <w:t>d.exhibits</w:t>
+            </w:r>
+            <w:proofErr w:type="spellEnd"/>
+            <w:proofErr w:type="gramEnd"/>
+            <w:r>
+              <w:rPr>
+                <w:rFonts w:ascii="BC Sans" w:hAnsi="BC Sans"/>
+                <w:sz w:val="20"/>
+                <w:szCs w:val="20"/>
+                <w:lang w:val="en-CA"/>
+              </w:rPr>
+              <w:t>[</w:t>
+            </w:r>
+            <w:proofErr w:type="spellStart"/>
+            <w:r>
+              <w:rPr>
+                <w:rFonts w:ascii="BC Sans" w:hAnsi="BC Sans"/>
+                <w:sz w:val="20"/>
+                <w:szCs w:val="20"/>
+                <w:lang w:val="en-CA"/>
+              </w:rPr>
+              <w:t>i</w:t>
+            </w:r>
+            <w:proofErr w:type="spellEnd"/>
+            <w:proofErr w:type="gramStart"/>
+            <w:r>
+              <w:rPr>
+                <w:rFonts w:ascii="BC Sans" w:hAnsi="BC Sans"/>
+                <w:sz w:val="20"/>
+                <w:szCs w:val="20"/>
+                <w:lang w:val="en-CA"/>
+              </w:rPr>
+              <w:t>].</w:t>
+            </w:r>
+            <w:proofErr w:type="spellStart"/>
+            <w:r>
+              <w:rPr>
+                <w:rFonts w:ascii="BC Sans" w:hAnsi="BC Sans"/>
+                <w:sz w:val="20"/>
+                <w:szCs w:val="20"/>
+                <w:lang w:val="en-CA"/>
+              </w:rPr>
+              <w:t>dateCollected</w:t>
+            </w:r>
+            <w:proofErr w:type="spellEnd"/>
+            <w:proofErr w:type="gramEnd"/>
+            <w:r>
+              <w:rPr>
+                <w:rFonts w:ascii="BC Sans" w:hAnsi="BC Sans"/>
+                <w:sz w:val="20"/>
+                <w:szCs w:val="20"/>
+                <w:lang w:val="en-CA"/>
+              </w:rPr>
+              <w:t>}</w:t>
+            </w:r>
+            <w:r>
+              <w:rPr>
+                <w:rFonts w:ascii="BC Sans" w:hAnsi="BC Sans"/>
+                <w:sz w:val="20"/>
+                <w:szCs w:val="20"/>
+                <w:lang w:val="en-CA"/>
+              </w:rPr>
+              <w:t xml:space="preserve"> {</w:t>
+            </w:r>
+            <w:proofErr w:type="spellStart"/>
+            <w:proofErr w:type="gramStart"/>
+            <w:r>
+              <w:rPr>
+                <w:rFonts w:ascii="BC Sans" w:hAnsi="BC Sans"/>
+                <w:sz w:val="20"/>
+                <w:szCs w:val="20"/>
+                <w:lang w:val="en-CA"/>
+              </w:rPr>
+              <w:t>d.exhibits</w:t>
+            </w:r>
+            <w:proofErr w:type="spellEnd"/>
+            <w:proofErr w:type="gramEnd"/>
+            <w:r>
+              <w:rPr>
+                <w:rFonts w:ascii="BC Sans" w:hAnsi="BC Sans"/>
+                <w:sz w:val="20"/>
+                <w:szCs w:val="20"/>
+                <w:lang w:val="en-CA"/>
+              </w:rPr>
+              <w:t>[</w:t>
+            </w:r>
+            <w:proofErr w:type="spellStart"/>
+            <w:r>
+              <w:rPr>
+                <w:rFonts w:ascii="BC Sans" w:hAnsi="BC Sans"/>
+                <w:sz w:val="20"/>
+                <w:szCs w:val="20"/>
+                <w:lang w:val="en-CA"/>
+              </w:rPr>
+              <w:t>i</w:t>
+            </w:r>
+            <w:proofErr w:type="spellEnd"/>
+            <w:proofErr w:type="gramStart"/>
+            <w:r>
+              <w:rPr>
+                <w:rFonts w:ascii="BC Sans" w:hAnsi="BC Sans"/>
+                <w:sz w:val="20"/>
+                <w:szCs w:val="20"/>
+                <w:lang w:val="en-CA"/>
+              </w:rPr>
+              <w:t>].</w:t>
+            </w:r>
+            <w:proofErr w:type="spellStart"/>
+            <w:r>
+              <w:rPr>
+                <w:rFonts w:ascii="BC Sans" w:hAnsi="BC Sans"/>
+                <w:sz w:val="20"/>
+                <w:szCs w:val="20"/>
+                <w:lang w:val="en-CA"/>
+              </w:rPr>
+              <w:t>intakeTime</w:t>
+            </w:r>
+            <w:proofErr w:type="spellEnd"/>
+            <w:proofErr w:type="gramEnd"/>
+            <w:r>
+              <w:rPr>
+                <w:rFonts w:ascii="BC Sans" w:hAnsi="BC Sans"/>
+                <w:sz w:val="20"/>
+                <w:szCs w:val="20"/>
+                <w:lang w:val="en-CA"/>
+              </w:rPr>
+              <w:t xml:space="preserve"> }</w:t>
             </w:r>
           </w:p>
         </w:tc>
@@ -2287,7 +3976,71 @@
                 <w:szCs w:val="20"/>
                 <w:lang w:val="en-CA"/>
               </w:rPr>
-              <w:t>{d.exhibits[i].locationOfIntake}</w:t>
+              <w:t>{</w:t>
+            </w:r>
+            <w:proofErr w:type="spellStart"/>
+            <w:proofErr w:type="gramStart"/>
+            <w:r>
+              <w:rPr>
+                <w:rFonts w:ascii="BC Sans" w:hAnsi="BC Sans"/>
+                <w:sz w:val="20"/>
+                <w:szCs w:val="20"/>
+                <w:lang w:val="en-CA"/>
+              </w:rPr>
+              <w:t>d.exhibits</w:t>
+            </w:r>
+            <w:proofErr w:type="spellEnd"/>
+            <w:proofErr w:type="gramEnd"/>
+            <w:r>
+              <w:rPr>
+                <w:rFonts w:ascii="BC Sans" w:hAnsi="BC Sans"/>
+                <w:sz w:val="20"/>
+                <w:szCs w:val="20"/>
+                <w:lang w:val="en-CA"/>
+              </w:rPr>
+              <w:t>[</w:t>
+            </w:r>
+            <w:proofErr w:type="spellStart"/>
+            <w:r>
+              <w:rPr>
+                <w:rFonts w:ascii="BC Sans" w:hAnsi="BC Sans"/>
+                <w:sz w:val="20"/>
+                <w:szCs w:val="20"/>
+                <w:lang w:val="en-CA"/>
+              </w:rPr>
+              <w:t>i</w:t>
+            </w:r>
+            <w:proofErr w:type="spellEnd"/>
+            <w:proofErr w:type="gramStart"/>
+            <w:r>
+              <w:rPr>
+                <w:rFonts w:ascii="BC Sans" w:hAnsi="BC Sans"/>
+                <w:sz w:val="20"/>
+                <w:szCs w:val="20"/>
+                <w:lang w:val="en-CA"/>
+              </w:rPr>
+              <w:t>].</w:t>
+            </w:r>
+            <w:proofErr w:type="spellStart"/>
+            <w:r>
+              <w:rPr>
+                <w:rFonts w:ascii="BC Sans" w:hAnsi="BC Sans"/>
+                <w:sz w:val="20"/>
+                <w:szCs w:val="20"/>
+                <w:lang w:val="en-CA"/>
+              </w:rPr>
+              <w:t>locationOfIntake</w:t>
+            </w:r>
+            <w:proofErr w:type="spellEnd"/>
+            <w:proofErr w:type="gramEnd"/>
+            <w:r>
+              <w:rPr>
+                <w:rFonts w:ascii="BC Sans" w:hAnsi="BC Sans"/>
+                <w:sz w:val="20"/>
+                <w:szCs w:val="20"/>
+                <w:lang w:val="en-CA"/>
+              </w:rPr>
+              <w:t>}</w:t>
             </w:r>
           </w:p>
         </w:tc>
@@ -2357,16 +4110,66 @@
                 <w:szCs w:val="20"/>
                 <w:lang w:val="en-CA"/>
               </w:rPr>
-              <w:t>{d.exhibits[i].propertyTagNumber}</w:t>
-            </w:r>
-            <w:r>
-              <w:rPr>
-                <w:rFonts w:ascii="BC Sans" w:hAnsi="BC Sans"/>
-                <w:sz w:val="20"/>
-                <w:szCs w:val="20"/>
-                <w:lang w:val="en-CA"/>
-              </w:rPr>
-              <w:t>{d.</w:t>
+              <w:t>{</w:t>
+            </w:r>
+            <w:proofErr w:type="gramStart"/>
+            <w:r>
+              <w:rPr>
+                <w:rFonts w:ascii="BC Sans" w:hAnsi="BC Sans"/>
+                <w:sz w:val="20"/>
+                <w:szCs w:val="20"/>
+                <w:lang w:val="en-CA"/>
+              </w:rPr>
+              <w:t>d.exhibits</w:t>
+            </w:r>
+            <w:proofErr w:type="gramEnd"/>
+            <w:r>
+              <w:rPr>
+                <w:rFonts w:ascii="BC Sans" w:hAnsi="BC Sans"/>
+                <w:sz w:val="20"/>
+                <w:szCs w:val="20"/>
+                <w:lang w:val="en-CA"/>
+              </w:rPr>
+              <w:t>[i</w:t>
+            </w:r>
+            <w:proofErr w:type="gramStart"/>
+            <w:r>
+              <w:rPr>
+                <w:rFonts w:ascii="BC Sans" w:hAnsi="BC Sans"/>
+                <w:sz w:val="20"/>
+                <w:szCs w:val="20"/>
+                <w:lang w:val="en-CA"/>
+              </w:rPr>
+              <w:t>].propertyTagNumber</w:t>
+            </w:r>
+            <w:proofErr w:type="gramEnd"/>
+            <w:r>
+              <w:rPr>
+                <w:rFonts w:ascii="BC Sans" w:hAnsi="BC Sans"/>
+                <w:sz w:val="20"/>
+                <w:szCs w:val="20"/>
+                <w:lang w:val="en-CA"/>
+              </w:rPr>
+              <w:t>}</w:t>
+            </w:r>
+            <w:r>
+              <w:rPr>
+                <w:rFonts w:ascii="BC Sans" w:hAnsi="BC Sans"/>
+                <w:sz w:val="20"/>
+                <w:szCs w:val="20"/>
+                <w:lang w:val="en-CA"/>
+              </w:rPr>
+              <w:t>{</w:t>
+            </w:r>
+            <w:proofErr w:type="gramStart"/>
+            <w:r>
+              <w:rPr>
+                <w:rFonts w:ascii="BC Sans" w:hAnsi="BC Sans"/>
+                <w:sz w:val="20"/>
+                <w:szCs w:val="20"/>
+                <w:lang w:val="en-CA"/>
+              </w:rPr>
+              <w:t>d.</w:t>
             </w:r>
             <w:r>
               <w:rPr>
@@ -2377,14 +4180,25 @@
               </w:rPr>
               <w:t>exhibits</w:t>
             </w:r>
-            <w:r>
-              <w:rPr>
-                <w:rFonts w:ascii="BC Sans" w:hAnsi="BC Sans"/>
-                <w:sz w:val="20"/>
-                <w:szCs w:val="20"/>
-                <w:lang w:val="en-CA"/>
-              </w:rPr>
-              <w:t>[i].</w:t>
+            <w:proofErr w:type="gramEnd"/>
+            <w:r>
+              <w:rPr>
+                <w:rFonts w:ascii="BC Sans" w:hAnsi="BC Sans"/>
+                <w:sz w:val="20"/>
+                <w:szCs w:val="20"/>
+                <w:lang w:val="en-CA"/>
+              </w:rPr>
+              <w:t>[i</w:t>
+            </w:r>
+            <w:proofErr w:type="gramStart"/>
+            <w:r>
+              <w:rPr>
+                <w:rFonts w:ascii="BC Sans" w:hAnsi="BC Sans"/>
+                <w:sz w:val="20"/>
+                <w:szCs w:val="20"/>
+                <w:lang w:val="en-CA"/>
+              </w:rPr>
+              <w:t>].</w:t>
             </w:r>
             <w:r>
               <w:rPr>
@@ -2395,6 +4209,7 @@
               </w:rPr>
               <w:t>isSeized</w:t>
             </w:r>
+            <w:proofErr w:type="gramEnd"/>
             <w:r>
               <w:rPr>
                 <w:rFonts w:ascii="BC Sans" w:hAnsi="BC Sans"/>
@@ -2411,16 +4226,36 @@
                 <w:szCs w:val="20"/>
                 <w:lang w:val="en-CA"/>
               </w:rPr>
-              <w:t>Q(false)</w:t>
-            </w:r>
-            <w:r>
-              <w:rPr>
-                <w:rFonts w:ascii="BC Sans" w:hAnsi="BC Sans"/>
-                <w:sz w:val="20"/>
-                <w:szCs w:val="20"/>
-                <w:lang w:val="en-CA"/>
-              </w:rPr>
-              <w:t>:hideBegin}</w:t>
+              <w:t>Q(false</w:t>
+            </w:r>
+            <w:proofErr w:type="gramStart"/>
+            <w:r>
+              <w:rPr>
+                <w:rFonts w:ascii="BC Sans" w:hAnsi="BC Sans"/>
+                <w:sz w:val="20"/>
+                <w:szCs w:val="20"/>
+                <w:lang w:val="en-CA"/>
+              </w:rPr>
+              <w:t>)</w:t>
+            </w:r>
+            <w:r>
+              <w:rPr>
+                <w:rFonts w:ascii="BC Sans" w:hAnsi="BC Sans"/>
+                <w:sz w:val="20"/>
+                <w:szCs w:val="20"/>
+                <w:lang w:val="en-CA"/>
+              </w:rPr>
+              <w:t>:hideBegin</w:t>
+            </w:r>
+            <w:proofErr w:type="gramEnd"/>
+            <w:r>
+              <w:rPr>
+                <w:rFonts w:ascii="BC Sans" w:hAnsi="BC Sans"/>
+                <w:sz w:val="20"/>
+                <w:szCs w:val="20"/>
+                <w:lang w:val="en-CA"/>
+              </w:rPr>
+              <w:t>}</w:t>
             </w:r>
           </w:p>
         </w:tc>
@@ -2489,7 +4324,71 @@
                 <w:szCs w:val="20"/>
                 <w:lang w:val="en-CA"/>
               </w:rPr>
-              <w:t>{d.exhibits[i].seizedFromFirstName}</w:t>
+              <w:t>{</w:t>
+            </w:r>
+            <w:proofErr w:type="spellStart"/>
+            <w:proofErr w:type="gramStart"/>
+            <w:r>
+              <w:rPr>
+                <w:rFonts w:ascii="BC Sans" w:hAnsi="BC Sans"/>
+                <w:sz w:val="20"/>
+                <w:szCs w:val="20"/>
+                <w:lang w:val="en-CA"/>
+              </w:rPr>
+              <w:t>d.exhibits</w:t>
+            </w:r>
+            <w:proofErr w:type="spellEnd"/>
+            <w:proofErr w:type="gramEnd"/>
+            <w:r>
+              <w:rPr>
+                <w:rFonts w:ascii="BC Sans" w:hAnsi="BC Sans"/>
+                <w:sz w:val="20"/>
+                <w:szCs w:val="20"/>
+                <w:lang w:val="en-CA"/>
+              </w:rPr>
+              <w:t>[</w:t>
+            </w:r>
+            <w:proofErr w:type="spellStart"/>
+            <w:r>
+              <w:rPr>
+                <w:rFonts w:ascii="BC Sans" w:hAnsi="BC Sans"/>
+                <w:sz w:val="20"/>
+                <w:szCs w:val="20"/>
+                <w:lang w:val="en-CA"/>
+              </w:rPr>
+              <w:t>i</w:t>
+            </w:r>
+            <w:proofErr w:type="spellEnd"/>
+            <w:proofErr w:type="gramStart"/>
+            <w:r>
+              <w:rPr>
+                <w:rFonts w:ascii="BC Sans" w:hAnsi="BC Sans"/>
+                <w:sz w:val="20"/>
+                <w:szCs w:val="20"/>
+                <w:lang w:val="en-CA"/>
+              </w:rPr>
+              <w:t>].</w:t>
+            </w:r>
+            <w:proofErr w:type="spellStart"/>
+            <w:r>
+              <w:rPr>
+                <w:rFonts w:ascii="BC Sans" w:hAnsi="BC Sans"/>
+                <w:sz w:val="20"/>
+                <w:szCs w:val="20"/>
+                <w:lang w:val="en-CA"/>
+              </w:rPr>
+              <w:t>seizedFromFirstName</w:t>
+            </w:r>
+            <w:proofErr w:type="spellEnd"/>
+            <w:proofErr w:type="gramEnd"/>
+            <w:r>
+              <w:rPr>
+                <w:rFonts w:ascii="BC Sans" w:hAnsi="BC Sans"/>
+                <w:sz w:val="20"/>
+                <w:szCs w:val="20"/>
+                <w:lang w:val="en-CA"/>
+              </w:rPr>
+              <w:t>}</w:t>
             </w:r>
           </w:p>
         </w:tc>
@@ -2558,7 +4457,71 @@
                 <w:szCs w:val="20"/>
                 <w:lang w:val="en-CA"/>
               </w:rPr>
-              <w:t>{d.exhibits[i].seizedFromLastName}</w:t>
+              <w:t>{</w:t>
+            </w:r>
+            <w:proofErr w:type="spellStart"/>
+            <w:proofErr w:type="gramStart"/>
+            <w:r>
+              <w:rPr>
+                <w:rFonts w:ascii="BC Sans" w:hAnsi="BC Sans"/>
+                <w:sz w:val="20"/>
+                <w:szCs w:val="20"/>
+                <w:lang w:val="en-CA"/>
+              </w:rPr>
+              <w:t>d.exhibits</w:t>
+            </w:r>
+            <w:proofErr w:type="spellEnd"/>
+            <w:proofErr w:type="gramEnd"/>
+            <w:r>
+              <w:rPr>
+                <w:rFonts w:ascii="BC Sans" w:hAnsi="BC Sans"/>
+                <w:sz w:val="20"/>
+                <w:szCs w:val="20"/>
+                <w:lang w:val="en-CA"/>
+              </w:rPr>
+              <w:t>[</w:t>
+            </w:r>
+            <w:proofErr w:type="spellStart"/>
+            <w:r>
+              <w:rPr>
+                <w:rFonts w:ascii="BC Sans" w:hAnsi="BC Sans"/>
+                <w:sz w:val="20"/>
+                <w:szCs w:val="20"/>
+                <w:lang w:val="en-CA"/>
+              </w:rPr>
+              <w:t>i</w:t>
+            </w:r>
+            <w:proofErr w:type="spellEnd"/>
+            <w:proofErr w:type="gramStart"/>
+            <w:r>
+              <w:rPr>
+                <w:rFonts w:ascii="BC Sans" w:hAnsi="BC Sans"/>
+                <w:sz w:val="20"/>
+                <w:szCs w:val="20"/>
+                <w:lang w:val="en-CA"/>
+              </w:rPr>
+              <w:t>].</w:t>
+            </w:r>
+            <w:proofErr w:type="spellStart"/>
+            <w:r>
+              <w:rPr>
+                <w:rFonts w:ascii="BC Sans" w:hAnsi="BC Sans"/>
+                <w:sz w:val="20"/>
+                <w:szCs w:val="20"/>
+                <w:lang w:val="en-CA"/>
+              </w:rPr>
+              <w:t>seizedFromLastName</w:t>
+            </w:r>
+            <w:proofErr w:type="spellEnd"/>
+            <w:proofErr w:type="gramEnd"/>
+            <w:r>
+              <w:rPr>
+                <w:rFonts w:ascii="BC Sans" w:hAnsi="BC Sans"/>
+                <w:sz w:val="20"/>
+                <w:szCs w:val="20"/>
+                <w:lang w:val="en-CA"/>
+              </w:rPr>
+              <w:t>}</w:t>
             </w:r>
           </w:p>
         </w:tc>
@@ -2628,7 +4591,71 @@
                 <w:szCs w:val="20"/>
                 <w:lang w:val="en-CA"/>
               </w:rPr>
-              <w:t>{d.exhibits[i].seizedFromAddress}</w:t>
+              <w:t>{</w:t>
+            </w:r>
+            <w:proofErr w:type="spellStart"/>
+            <w:proofErr w:type="gramStart"/>
+            <w:r>
+              <w:rPr>
+                <w:rFonts w:ascii="BC Sans" w:hAnsi="BC Sans"/>
+                <w:sz w:val="20"/>
+                <w:szCs w:val="20"/>
+                <w:lang w:val="en-CA"/>
+              </w:rPr>
+              <w:t>d.exhibits</w:t>
+            </w:r>
+            <w:proofErr w:type="spellEnd"/>
+            <w:proofErr w:type="gramEnd"/>
+            <w:r>
+              <w:rPr>
+                <w:rFonts w:ascii="BC Sans" w:hAnsi="BC Sans"/>
+                <w:sz w:val="20"/>
+                <w:szCs w:val="20"/>
+                <w:lang w:val="en-CA"/>
+              </w:rPr>
+              <w:t>[</w:t>
+            </w:r>
+            <w:proofErr w:type="spellStart"/>
+            <w:r>
+              <w:rPr>
+                <w:rFonts w:ascii="BC Sans" w:hAnsi="BC Sans"/>
+                <w:sz w:val="20"/>
+                <w:szCs w:val="20"/>
+                <w:lang w:val="en-CA"/>
+              </w:rPr>
+              <w:t>i</w:t>
+            </w:r>
+            <w:proofErr w:type="spellEnd"/>
+            <w:proofErr w:type="gramStart"/>
+            <w:r>
+              <w:rPr>
+                <w:rFonts w:ascii="BC Sans" w:hAnsi="BC Sans"/>
+                <w:sz w:val="20"/>
+                <w:szCs w:val="20"/>
+                <w:lang w:val="en-CA"/>
+              </w:rPr>
+              <w:t>].</w:t>
+            </w:r>
+            <w:proofErr w:type="spellStart"/>
+            <w:r>
+              <w:rPr>
+                <w:rFonts w:ascii="BC Sans" w:hAnsi="BC Sans"/>
+                <w:sz w:val="20"/>
+                <w:szCs w:val="20"/>
+                <w:lang w:val="en-CA"/>
+              </w:rPr>
+              <w:t>seizedFromAddress</w:t>
+            </w:r>
+            <w:proofErr w:type="spellEnd"/>
+            <w:proofErr w:type="gramEnd"/>
+            <w:r>
+              <w:rPr>
+                <w:rFonts w:ascii="BC Sans" w:hAnsi="BC Sans"/>
+                <w:sz w:val="20"/>
+                <w:szCs w:val="20"/>
+                <w:lang w:val="en-CA"/>
+              </w:rPr>
+              <w:t>}</w:t>
             </w:r>
           </w:p>
         </w:tc>
@@ -2697,16 +4724,66 @@
                 <w:szCs w:val="20"/>
                 <w:lang w:val="en-CA"/>
               </w:rPr>
-              <w:t>{d.exhibits[i].seizedFromPhoneNumber}</w:t>
-            </w:r>
-            <w:r>
-              <w:rPr>
-                <w:rFonts w:ascii="BC Sans" w:hAnsi="BC Sans"/>
-                <w:sz w:val="20"/>
-                <w:szCs w:val="20"/>
-                <w:lang w:val="en-CA"/>
-              </w:rPr>
-              <w:t>{d.</w:t>
+              <w:t>{</w:t>
+            </w:r>
+            <w:proofErr w:type="gramStart"/>
+            <w:r>
+              <w:rPr>
+                <w:rFonts w:ascii="BC Sans" w:hAnsi="BC Sans"/>
+                <w:sz w:val="20"/>
+                <w:szCs w:val="20"/>
+                <w:lang w:val="en-CA"/>
+              </w:rPr>
+              <w:t>d.exhibits</w:t>
+            </w:r>
+            <w:proofErr w:type="gramEnd"/>
+            <w:r>
+              <w:rPr>
+                <w:rFonts w:ascii="BC Sans" w:hAnsi="BC Sans"/>
+                <w:sz w:val="20"/>
+                <w:szCs w:val="20"/>
+                <w:lang w:val="en-CA"/>
+              </w:rPr>
+              <w:t>[i</w:t>
+            </w:r>
+            <w:proofErr w:type="gramStart"/>
+            <w:r>
+              <w:rPr>
+                <w:rFonts w:ascii="BC Sans" w:hAnsi="BC Sans"/>
+                <w:sz w:val="20"/>
+                <w:szCs w:val="20"/>
+                <w:lang w:val="en-CA"/>
+              </w:rPr>
+              <w:t>].seizedFromPhoneNumber</w:t>
+            </w:r>
+            <w:proofErr w:type="gramEnd"/>
+            <w:r>
+              <w:rPr>
+                <w:rFonts w:ascii="BC Sans" w:hAnsi="BC Sans"/>
+                <w:sz w:val="20"/>
+                <w:szCs w:val="20"/>
+                <w:lang w:val="en-CA"/>
+              </w:rPr>
+              <w:t>}</w:t>
+            </w:r>
+            <w:r>
+              <w:rPr>
+                <w:rFonts w:ascii="BC Sans" w:hAnsi="BC Sans"/>
+                <w:sz w:val="20"/>
+                <w:szCs w:val="20"/>
+                <w:lang w:val="en-CA"/>
+              </w:rPr>
+              <w:t>{</w:t>
+            </w:r>
+            <w:proofErr w:type="gramStart"/>
+            <w:r>
+              <w:rPr>
+                <w:rFonts w:ascii="BC Sans" w:hAnsi="BC Sans"/>
+                <w:sz w:val="20"/>
+                <w:szCs w:val="20"/>
+                <w:lang w:val="en-CA"/>
+              </w:rPr>
+              <w:t>d.</w:t>
             </w:r>
             <w:r>
               <w:rPr>
@@ -2717,14 +4794,25 @@
               </w:rPr>
               <w:t>exhibits</w:t>
             </w:r>
-            <w:r>
-              <w:rPr>
-                <w:rFonts w:ascii="BC Sans" w:hAnsi="BC Sans"/>
-                <w:sz w:val="20"/>
-                <w:szCs w:val="20"/>
-                <w:lang w:val="en-CA"/>
-              </w:rPr>
-              <w:t>[i].</w:t>
+            <w:proofErr w:type="gramEnd"/>
+            <w:r>
+              <w:rPr>
+                <w:rFonts w:ascii="BC Sans" w:hAnsi="BC Sans"/>
+                <w:sz w:val="20"/>
+                <w:szCs w:val="20"/>
+                <w:lang w:val="en-CA"/>
+              </w:rPr>
+              <w:t>[i</w:t>
+            </w:r>
+            <w:proofErr w:type="gramStart"/>
+            <w:r>
+              <w:rPr>
+                <w:rFonts w:ascii="BC Sans" w:hAnsi="BC Sans"/>
+                <w:sz w:val="20"/>
+                <w:szCs w:val="20"/>
+                <w:lang w:val="en-CA"/>
+              </w:rPr>
+              <w:t>].</w:t>
             </w:r>
             <w:r>
               <w:rPr>
@@ -2735,6 +4823,7 @@
               </w:rPr>
               <w:t>isSeized</w:t>
             </w:r>
+            <w:proofErr w:type="gramEnd"/>
             <w:r>
               <w:rPr>
                 <w:rFonts w:ascii="BC Sans" w:hAnsi="BC Sans"/>
@@ -2791,7 +4880,17 @@
           <w:sz w:val="20"/>
           <w:szCs w:val="20"/>
         </w:rPr>
-        <w:t>{d.</w:t>
+        <w:t>{</w:t>
+      </w:r>
+      <w:proofErr w:type="spellStart"/>
+      <w:proofErr w:type="gramStart"/>
+      <w:r>
+        <w:rPr>
+          <w:rFonts w:ascii="BC Sans" w:hAnsi="BC Sans"/>
+          <w:sz w:val="20"/>
+          <w:szCs w:val="20"/>
+        </w:rPr>
+        <w:t>d.</w:t>
       </w:r>
       <w:r>
         <w:rPr>
@@ -2801,13 +4900,24 @@
         </w:rPr>
         <w:t>exhibits</w:t>
       </w:r>
+      <w:proofErr w:type="spellEnd"/>
+      <w:proofErr w:type="gramEnd"/>
       <w:r>
         <w:rPr>
           <w:rFonts w:ascii="BC Sans" w:hAnsi="BC Sans"/>
           <w:sz w:val="20"/>
           <w:szCs w:val="20"/>
         </w:rPr>
-        <w:t>[i+1]</w:t>
+        <w:t>[i+1</w:t>
+      </w:r>
+      <w:proofErr w:type="gramStart"/>
+      <w:r>
+        <w:rPr>
+          <w:rFonts w:ascii="BC Sans" w:hAnsi="BC Sans"/>
+          <w:sz w:val="20"/>
+          <w:szCs w:val="20"/>
+        </w:rPr>
+        <w:t>]</w:t>
       </w:r>
       <w:r>
         <w:rPr>
@@ -2815,8 +4925,35 @@
           <w:sz w:val="20"/>
           <w:szCs w:val="20"/>
         </w:rPr>
-        <w:t>.exhibitNumber</w:t>
+        <w:t>.</w:t>
       </w:r>
+      <w:proofErr w:type="spellStart"/>
+      <w:r>
+        <w:rPr>
+          <w:rFonts w:ascii="BC Sans" w:hAnsi="BC Sans"/>
+          <w:sz w:val="20"/>
+          <w:szCs w:val="20"/>
+        </w:rPr>
+        <w:t>exhibit</w:t>
+      </w:r>
+      <w:r>
+        <w:rPr>
+          <w:rFonts w:ascii="BC Sans" w:hAnsi="BC Sans"/>
+          <w:sz w:val="20"/>
+          <w:szCs w:val="20"/>
+        </w:rPr>
+        <w:t>Display</w:t>
+      </w:r>
+      <w:r>
+        <w:rPr>
+          <w:rFonts w:ascii="BC Sans" w:hAnsi="BC Sans"/>
+          <w:sz w:val="20"/>
+          <w:szCs w:val="20"/>
+        </w:rPr>
+        <w:t>Number</w:t>
+      </w:r>
+      <w:proofErr w:type="spellEnd"/>
+      <w:proofErr w:type="gramEnd"/>
       <w:r>
         <w:rPr>
           <w:rFonts w:ascii="BC Sans" w:hAnsi="BC Sans"/>
@@ -2868,7 +5005,49 @@
                 <w:sz w:val="20"/>
                 <w:szCs w:val="20"/>
               </w:rPr>
-              <w:t>Attachment {d.attachments[i].</w:t>
+              <w:t>Attachment {</w:t>
+            </w:r>
+            <w:proofErr w:type="spellStart"/>
+            <w:proofErr w:type="gramStart"/>
+            <w:r>
+              <w:rPr>
+                <w:rFonts w:ascii="BC Sans" w:hAnsi="BC Sans"/>
+                <w:caps w:val="0"/>
+                <w:sz w:val="20"/>
+                <w:szCs w:val="20"/>
+              </w:rPr>
+              <w:t>d.attachments</w:t>
+            </w:r>
+            <w:proofErr w:type="spellEnd"/>
+            <w:proofErr w:type="gramEnd"/>
+            <w:r>
+              <w:rPr>
+                <w:rFonts w:ascii="BC Sans" w:hAnsi="BC Sans"/>
+                <w:caps w:val="0"/>
+                <w:sz w:val="20"/>
+                <w:szCs w:val="20"/>
+              </w:rPr>
+              <w:t>[</w:t>
+            </w:r>
+            <w:proofErr w:type="spellStart"/>
+            <w:r>
+              <w:rPr>
+                <w:rFonts w:ascii="BC Sans" w:hAnsi="BC Sans"/>
+                <w:caps w:val="0"/>
+                <w:sz w:val="20"/>
+                <w:szCs w:val="20"/>
+              </w:rPr>
+              <w:t>i</w:t>
+            </w:r>
+            <w:proofErr w:type="spellEnd"/>
+            <w:r>
+              <w:rPr>
+                <w:rFonts w:ascii="BC Sans" w:hAnsi="BC Sans"/>
+                <w:caps w:val="0"/>
+                <w:sz w:val="20"/>
+                <w:szCs w:val="20"/>
+              </w:rPr>
+              <w:t>].</w:t>
             </w:r>
             <w:r>
               <w:rPr>
@@ -2950,7 +5129,71 @@
                 <w:szCs w:val="20"/>
                 <w:lang w:val="en-CA"/>
               </w:rPr>
-              <w:t>{d.attachments[i].fileType}</w:t>
+              <w:t>{</w:t>
+            </w:r>
+            <w:proofErr w:type="spellStart"/>
+            <w:proofErr w:type="gramStart"/>
+            <w:r>
+              <w:rPr>
+                <w:rFonts w:ascii="BC Sans" w:hAnsi="BC Sans"/>
+                <w:sz w:val="20"/>
+                <w:szCs w:val="20"/>
+                <w:lang w:val="en-CA"/>
+              </w:rPr>
+              <w:t>d.attachments</w:t>
+            </w:r>
+            <w:proofErr w:type="spellEnd"/>
+            <w:proofErr w:type="gramEnd"/>
+            <w:r>
+              <w:rPr>
+                <w:rFonts w:ascii="BC Sans" w:hAnsi="BC Sans"/>
+                <w:sz w:val="20"/>
+                <w:szCs w:val="20"/>
+                <w:lang w:val="en-CA"/>
+              </w:rPr>
+              <w:t>[</w:t>
+            </w:r>
+            <w:proofErr w:type="spellStart"/>
+            <w:r>
+              <w:rPr>
+                <w:rFonts w:ascii="BC Sans" w:hAnsi="BC Sans"/>
+                <w:sz w:val="20"/>
+                <w:szCs w:val="20"/>
+                <w:lang w:val="en-CA"/>
+              </w:rPr>
+              <w:t>i</w:t>
+            </w:r>
+            <w:proofErr w:type="spellEnd"/>
+            <w:proofErr w:type="gramStart"/>
+            <w:r>
+              <w:rPr>
+                <w:rFonts w:ascii="BC Sans" w:hAnsi="BC Sans"/>
+                <w:sz w:val="20"/>
+                <w:szCs w:val="20"/>
+                <w:lang w:val="en-CA"/>
+              </w:rPr>
+              <w:t>].</w:t>
+            </w:r>
+            <w:proofErr w:type="spellStart"/>
+            <w:r>
+              <w:rPr>
+                <w:rFonts w:ascii="BC Sans" w:hAnsi="BC Sans"/>
+                <w:sz w:val="20"/>
+                <w:szCs w:val="20"/>
+                <w:lang w:val="en-CA"/>
+              </w:rPr>
+              <w:t>fileType</w:t>
+            </w:r>
+            <w:proofErr w:type="spellEnd"/>
+            <w:proofErr w:type="gramEnd"/>
+            <w:r>
+              <w:rPr>
+                <w:rFonts w:ascii="BC Sans" w:hAnsi="BC Sans"/>
+                <w:sz w:val="20"/>
+                <w:szCs w:val="20"/>
+                <w:lang w:val="en-CA"/>
+              </w:rPr>
+              <w:t>}</w:t>
             </w:r>
           </w:p>
         </w:tc>
@@ -3020,7 +5263,71 @@
                 <w:szCs w:val="20"/>
                 <w:lang w:val="en-CA"/>
               </w:rPr>
-              <w:t>{d.attachments[i].sequenceNumber}</w:t>
+              <w:t>{</w:t>
+            </w:r>
+            <w:proofErr w:type="spellStart"/>
+            <w:proofErr w:type="gramStart"/>
+            <w:r>
+              <w:rPr>
+                <w:rFonts w:ascii="BC Sans" w:hAnsi="BC Sans"/>
+                <w:sz w:val="20"/>
+                <w:szCs w:val="20"/>
+                <w:lang w:val="en-CA"/>
+              </w:rPr>
+              <w:t>d.attachments</w:t>
+            </w:r>
+            <w:proofErr w:type="spellEnd"/>
+            <w:proofErr w:type="gramEnd"/>
+            <w:r>
+              <w:rPr>
+                <w:rFonts w:ascii="BC Sans" w:hAnsi="BC Sans"/>
+                <w:sz w:val="20"/>
+                <w:szCs w:val="20"/>
+                <w:lang w:val="en-CA"/>
+              </w:rPr>
+              <w:t>[</w:t>
+            </w:r>
+            <w:proofErr w:type="spellStart"/>
+            <w:r>
+              <w:rPr>
+                <w:rFonts w:ascii="BC Sans" w:hAnsi="BC Sans"/>
+                <w:sz w:val="20"/>
+                <w:szCs w:val="20"/>
+                <w:lang w:val="en-CA"/>
+              </w:rPr>
+              <w:t>i</w:t>
+            </w:r>
+            <w:proofErr w:type="spellEnd"/>
+            <w:proofErr w:type="gramStart"/>
+            <w:r>
+              <w:rPr>
+                <w:rFonts w:ascii="BC Sans" w:hAnsi="BC Sans"/>
+                <w:sz w:val="20"/>
+                <w:szCs w:val="20"/>
+                <w:lang w:val="en-CA"/>
+              </w:rPr>
+              <w:t>].</w:t>
+            </w:r>
+            <w:proofErr w:type="spellStart"/>
+            <w:r>
+              <w:rPr>
+                <w:rFonts w:ascii="BC Sans" w:hAnsi="BC Sans"/>
+                <w:sz w:val="20"/>
+                <w:szCs w:val="20"/>
+                <w:lang w:val="en-CA"/>
+              </w:rPr>
+              <w:t>sequenceNumber</w:t>
+            </w:r>
+            <w:proofErr w:type="spellEnd"/>
+            <w:proofErr w:type="gramEnd"/>
+            <w:r>
+              <w:rPr>
+                <w:rFonts w:ascii="BC Sans" w:hAnsi="BC Sans"/>
+                <w:sz w:val="20"/>
+                <w:szCs w:val="20"/>
+                <w:lang w:val="en-CA"/>
+              </w:rPr>
+              <w:t>}</w:t>
             </w:r>
           </w:p>
         </w:tc>
@@ -3084,7 +5391,60 @@
                 <w:szCs w:val="20"/>
                 <w:lang w:val="en-CA"/>
               </w:rPr>
-              <w:t>{d.attachments[i].description}</w:t>
+              <w:t>{</w:t>
+            </w:r>
+            <w:proofErr w:type="spellStart"/>
+            <w:proofErr w:type="gramStart"/>
+            <w:r>
+              <w:rPr>
+                <w:rFonts w:ascii="BC Sans" w:hAnsi="BC Sans"/>
+                <w:sz w:val="20"/>
+                <w:szCs w:val="20"/>
+                <w:lang w:val="en-CA"/>
+              </w:rPr>
+              <w:t>d.attachments</w:t>
+            </w:r>
+            <w:proofErr w:type="spellEnd"/>
+            <w:proofErr w:type="gramEnd"/>
+            <w:r>
+              <w:rPr>
+                <w:rFonts w:ascii="BC Sans" w:hAnsi="BC Sans"/>
+                <w:sz w:val="20"/>
+                <w:szCs w:val="20"/>
+                <w:lang w:val="en-CA"/>
+              </w:rPr>
+              <w:t>[</w:t>
+            </w:r>
+            <w:proofErr w:type="spellStart"/>
+            <w:r>
+              <w:rPr>
+                <w:rFonts w:ascii="BC Sans" w:hAnsi="BC Sans"/>
+                <w:sz w:val="20"/>
+                <w:szCs w:val="20"/>
+                <w:lang w:val="en-CA"/>
+              </w:rPr>
+              <w:t>i</w:t>
+            </w:r>
+            <w:proofErr w:type="spellEnd"/>
+            <w:proofErr w:type="gramStart"/>
+            <w:r>
+              <w:rPr>
+                <w:rFonts w:ascii="BC Sans" w:hAnsi="BC Sans"/>
+                <w:sz w:val="20"/>
+                <w:szCs w:val="20"/>
+                <w:lang w:val="en-CA"/>
+              </w:rPr>
+              <w:t>].description</w:t>
+            </w:r>
+            <w:proofErr w:type="gramEnd"/>
+            <w:r>
+              <w:rPr>
+                <w:rFonts w:ascii="BC Sans" w:hAnsi="BC Sans"/>
+                <w:sz w:val="20"/>
+                <w:szCs w:val="20"/>
+                <w:lang w:val="en-CA"/>
+              </w:rPr>
+              <w:t>}</w:t>
             </w:r>
           </w:p>
         </w:tc>
@@ -3147,7 +5507,60 @@
                 <w:szCs w:val="20"/>
                 <w:lang w:val="en-CA"/>
               </w:rPr>
-              <w:t>{d.attachments[i].title}</w:t>
+              <w:t>{</w:t>
+            </w:r>
+            <w:proofErr w:type="spellStart"/>
+            <w:proofErr w:type="gramStart"/>
+            <w:r>
+              <w:rPr>
+                <w:rFonts w:ascii="BC Sans" w:hAnsi="BC Sans"/>
+                <w:sz w:val="20"/>
+                <w:szCs w:val="20"/>
+                <w:lang w:val="en-CA"/>
+              </w:rPr>
+              <w:t>d.attachments</w:t>
+            </w:r>
+            <w:proofErr w:type="spellEnd"/>
+            <w:proofErr w:type="gramEnd"/>
+            <w:r>
+              <w:rPr>
+                <w:rFonts w:ascii="BC Sans" w:hAnsi="BC Sans"/>
+                <w:sz w:val="20"/>
+                <w:szCs w:val="20"/>
+                <w:lang w:val="en-CA"/>
+              </w:rPr>
+              <w:t>[</w:t>
+            </w:r>
+            <w:proofErr w:type="spellStart"/>
+            <w:r>
+              <w:rPr>
+                <w:rFonts w:ascii="BC Sans" w:hAnsi="BC Sans"/>
+                <w:sz w:val="20"/>
+                <w:szCs w:val="20"/>
+                <w:lang w:val="en-CA"/>
+              </w:rPr>
+              <w:t>i</w:t>
+            </w:r>
+            <w:proofErr w:type="spellEnd"/>
+            <w:proofErr w:type="gramStart"/>
+            <w:r>
+              <w:rPr>
+                <w:rFonts w:ascii="BC Sans" w:hAnsi="BC Sans"/>
+                <w:sz w:val="20"/>
+                <w:szCs w:val="20"/>
+                <w:lang w:val="en-CA"/>
+              </w:rPr>
+              <w:t>].title</w:t>
+            </w:r>
+            <w:proofErr w:type="gramEnd"/>
+            <w:r>
+              <w:rPr>
+                <w:rFonts w:ascii="BC Sans" w:hAnsi="BC Sans"/>
+                <w:sz w:val="20"/>
+                <w:szCs w:val="20"/>
+                <w:lang w:val="en-CA"/>
+              </w:rPr>
+              <w:t>}</w:t>
             </w:r>
           </w:p>
         </w:tc>
@@ -3209,16 +5622,116 @@
                 <w:szCs w:val="20"/>
                 <w:lang w:val="en-CA"/>
               </w:rPr>
-              <w:t>{d.attachments[i].date}</w:t>
-            </w:r>
-            <w:r>
-              <w:rPr>
-                <w:rFonts w:ascii="BC Sans" w:hAnsi="BC Sans"/>
-                <w:sz w:val="20"/>
-                <w:szCs w:val="20"/>
-                <w:lang w:val="en-CA"/>
-              </w:rPr>
-              <w:t>{d.attachments[i].takenBy.lastName:ifEM:hideBegin}</w:t>
+              <w:t>{</w:t>
+            </w:r>
+            <w:proofErr w:type="gramStart"/>
+            <w:r>
+              <w:rPr>
+                <w:rFonts w:ascii="BC Sans" w:hAnsi="BC Sans"/>
+                <w:sz w:val="20"/>
+                <w:szCs w:val="20"/>
+                <w:lang w:val="en-CA"/>
+              </w:rPr>
+              <w:t>d.attachments</w:t>
+            </w:r>
+            <w:proofErr w:type="gramEnd"/>
+            <w:r>
+              <w:rPr>
+                <w:rFonts w:ascii="BC Sans" w:hAnsi="BC Sans"/>
+                <w:sz w:val="20"/>
+                <w:szCs w:val="20"/>
+                <w:lang w:val="en-CA"/>
+              </w:rPr>
+              <w:t>[i</w:t>
+            </w:r>
+            <w:proofErr w:type="gramStart"/>
+            <w:r>
+              <w:rPr>
+                <w:rFonts w:ascii="BC Sans" w:hAnsi="BC Sans"/>
+                <w:sz w:val="20"/>
+                <w:szCs w:val="20"/>
+                <w:lang w:val="en-CA"/>
+              </w:rPr>
+              <w:t>].date</w:t>
+            </w:r>
+            <w:proofErr w:type="gramEnd"/>
+            <w:r>
+              <w:rPr>
+                <w:rFonts w:ascii="BC Sans" w:hAnsi="BC Sans"/>
+                <w:sz w:val="20"/>
+                <w:szCs w:val="20"/>
+                <w:lang w:val="en-CA"/>
+              </w:rPr>
+              <w:t>}</w:t>
+            </w:r>
+            <w:r>
+              <w:rPr>
+                <w:rFonts w:ascii="BC Sans" w:hAnsi="BC Sans"/>
+                <w:sz w:val="20"/>
+                <w:szCs w:val="20"/>
+                <w:lang w:val="en-CA"/>
+              </w:rPr>
+              <w:t>{</w:t>
+            </w:r>
+            <w:proofErr w:type="gramStart"/>
+            <w:r>
+              <w:rPr>
+                <w:rFonts w:ascii="BC Sans" w:hAnsi="BC Sans"/>
+                <w:sz w:val="20"/>
+                <w:szCs w:val="20"/>
+                <w:lang w:val="en-CA"/>
+              </w:rPr>
+              <w:t>d.attachments</w:t>
+            </w:r>
+            <w:proofErr w:type="gramEnd"/>
+            <w:r>
+              <w:rPr>
+                <w:rFonts w:ascii="BC Sans" w:hAnsi="BC Sans"/>
+                <w:sz w:val="20"/>
+                <w:szCs w:val="20"/>
+                <w:lang w:val="en-CA"/>
+              </w:rPr>
+              <w:t>[i</w:t>
+            </w:r>
+            <w:proofErr w:type="gramStart"/>
+            <w:r>
+              <w:rPr>
+                <w:rFonts w:ascii="BC Sans" w:hAnsi="BC Sans"/>
+                <w:sz w:val="20"/>
+                <w:szCs w:val="20"/>
+                <w:lang w:val="en-CA"/>
+              </w:rPr>
+              <w:t>].takenBy.lastName</w:t>
+            </w:r>
+            <w:proofErr w:type="gramEnd"/>
+            <w:r>
+              <w:rPr>
+                <w:rFonts w:ascii="BC Sans" w:hAnsi="BC Sans"/>
+                <w:sz w:val="20"/>
+                <w:szCs w:val="20"/>
+                <w:lang w:val="en-CA"/>
+              </w:rPr>
+              <w:t>:</w:t>
+            </w:r>
+            <w:proofErr w:type="gramStart"/>
+            <w:r>
+              <w:rPr>
+                <w:rFonts w:ascii="BC Sans" w:hAnsi="BC Sans"/>
+                <w:sz w:val="20"/>
+                <w:szCs w:val="20"/>
+                <w:lang w:val="en-CA"/>
+              </w:rPr>
+              <w:t>ifEM:hideBegin</w:t>
+            </w:r>
+            <w:proofErr w:type="gramEnd"/>
+            <w:r>
+              <w:rPr>
+                <w:rFonts w:ascii="BC Sans" w:hAnsi="BC Sans"/>
+                <w:sz w:val="20"/>
+                <w:szCs w:val="20"/>
+                <w:lang w:val="en-CA"/>
+              </w:rPr>
+              <w:t>}</w:t>
             </w:r>
           </w:p>
         </w:tc>
@@ -3279,7 +5792,60 @@
                 <w:szCs w:val="20"/>
                 <w:lang w:val="en-CA"/>
               </w:rPr>
-              <w:t>{d.attachments[i].takenBy</w:t>
+              <w:t>{</w:t>
+            </w:r>
+            <w:proofErr w:type="spellStart"/>
+            <w:proofErr w:type="gramStart"/>
+            <w:r>
+              <w:rPr>
+                <w:rFonts w:ascii="BC Sans" w:hAnsi="BC Sans"/>
+                <w:sz w:val="20"/>
+                <w:szCs w:val="20"/>
+                <w:lang w:val="en-CA"/>
+              </w:rPr>
+              <w:t>d.attachments</w:t>
+            </w:r>
+            <w:proofErr w:type="spellEnd"/>
+            <w:proofErr w:type="gramEnd"/>
+            <w:r>
+              <w:rPr>
+                <w:rFonts w:ascii="BC Sans" w:hAnsi="BC Sans"/>
+                <w:sz w:val="20"/>
+                <w:szCs w:val="20"/>
+                <w:lang w:val="en-CA"/>
+              </w:rPr>
+              <w:t>[</w:t>
+            </w:r>
+            <w:proofErr w:type="spellStart"/>
+            <w:r>
+              <w:rPr>
+                <w:rFonts w:ascii="BC Sans" w:hAnsi="BC Sans"/>
+                <w:sz w:val="20"/>
+                <w:szCs w:val="20"/>
+                <w:lang w:val="en-CA"/>
+              </w:rPr>
+              <w:t>i</w:t>
+            </w:r>
+            <w:proofErr w:type="spellEnd"/>
+            <w:proofErr w:type="gramStart"/>
+            <w:r>
+              <w:rPr>
+                <w:rFonts w:ascii="BC Sans" w:hAnsi="BC Sans"/>
+                <w:sz w:val="20"/>
+                <w:szCs w:val="20"/>
+                <w:lang w:val="en-CA"/>
+              </w:rPr>
+              <w:t>].</w:t>
+            </w:r>
+            <w:proofErr w:type="spellStart"/>
+            <w:r>
+              <w:rPr>
+                <w:rFonts w:ascii="BC Sans" w:hAnsi="BC Sans"/>
+                <w:sz w:val="20"/>
+                <w:szCs w:val="20"/>
+                <w:lang w:val="en-CA"/>
+              </w:rPr>
+              <w:t>takenBy</w:t>
             </w:r>
             <w:r>
               <w:rPr>
@@ -3290,6 +5856,8 @@
               </w:rPr>
               <w:t>.lastName</w:t>
             </w:r>
+            <w:proofErr w:type="spellEnd"/>
+            <w:proofErr w:type="gramEnd"/>
             <w:r>
               <w:rPr>
                 <w:rFonts w:ascii="BC Sans" w:hAnsi="BC Sans"/>
@@ -3306,16 +5874,86 @@
                 <w:szCs w:val="20"/>
                 <w:lang w:val="en-CA"/>
               </w:rPr>
-              <w:t>, {d.attachments[i].takenBy.firstName}</w:t>
-            </w:r>
-            <w:r>
-              <w:rPr>
-                <w:rFonts w:ascii="BC Sans" w:hAnsi="BC Sans"/>
-                <w:sz w:val="20"/>
-                <w:szCs w:val="20"/>
-                <w:lang w:val="en-CA"/>
-              </w:rPr>
-              <w:t>{d.attachments[i].takenBy.</w:t>
+              <w:t>, {</w:t>
+            </w:r>
+            <w:proofErr w:type="gramStart"/>
+            <w:r>
+              <w:rPr>
+                <w:rFonts w:ascii="BC Sans" w:hAnsi="BC Sans"/>
+                <w:sz w:val="20"/>
+                <w:szCs w:val="20"/>
+                <w:lang w:val="en-CA"/>
+              </w:rPr>
+              <w:t>d.attachments</w:t>
+            </w:r>
+            <w:proofErr w:type="gramEnd"/>
+            <w:r>
+              <w:rPr>
+                <w:rFonts w:ascii="BC Sans" w:hAnsi="BC Sans"/>
+                <w:sz w:val="20"/>
+                <w:szCs w:val="20"/>
+                <w:lang w:val="en-CA"/>
+              </w:rPr>
+              <w:t>[i</w:t>
+            </w:r>
+            <w:proofErr w:type="gramStart"/>
+            <w:r>
+              <w:rPr>
+                <w:rFonts w:ascii="BC Sans" w:hAnsi="BC Sans"/>
+                <w:sz w:val="20"/>
+                <w:szCs w:val="20"/>
+                <w:lang w:val="en-CA"/>
+              </w:rPr>
+              <w:t>].takenBy.firstName</w:t>
+            </w:r>
+            <w:proofErr w:type="gramEnd"/>
+            <w:r>
+              <w:rPr>
+                <w:rFonts w:ascii="BC Sans" w:hAnsi="BC Sans"/>
+                <w:sz w:val="20"/>
+                <w:szCs w:val="20"/>
+                <w:lang w:val="en-CA"/>
+              </w:rPr>
+              <w:t>}</w:t>
+            </w:r>
+            <w:r>
+              <w:rPr>
+                <w:rFonts w:ascii="BC Sans" w:hAnsi="BC Sans"/>
+                <w:sz w:val="20"/>
+                <w:szCs w:val="20"/>
+                <w:lang w:val="en-CA"/>
+              </w:rPr>
+              <w:t>{</w:t>
+            </w:r>
+            <w:proofErr w:type="gramStart"/>
+            <w:r>
+              <w:rPr>
+                <w:rFonts w:ascii="BC Sans" w:hAnsi="BC Sans"/>
+                <w:sz w:val="20"/>
+                <w:szCs w:val="20"/>
+                <w:lang w:val="en-CA"/>
+              </w:rPr>
+              <w:t>d.attachments</w:t>
+            </w:r>
+            <w:proofErr w:type="gramEnd"/>
+            <w:r>
+              <w:rPr>
+                <w:rFonts w:ascii="BC Sans" w:hAnsi="BC Sans"/>
+                <w:sz w:val="20"/>
+                <w:szCs w:val="20"/>
+                <w:lang w:val="en-CA"/>
+              </w:rPr>
+              <w:t>[i</w:t>
+            </w:r>
+            <w:proofErr w:type="gramStart"/>
+            <w:r>
+              <w:rPr>
+                <w:rFonts w:ascii="BC Sans" w:hAnsi="BC Sans"/>
+                <w:sz w:val="20"/>
+                <w:szCs w:val="20"/>
+                <w:lang w:val="en-CA"/>
+              </w:rPr>
+              <w:t>].takenBy.</w:t>
             </w:r>
             <w:r>
               <w:rPr>
@@ -3326,14 +5964,35 @@
               </w:rPr>
               <w:t>location</w:t>
             </w:r>
-            <w:r>
-              <w:rPr>
-                <w:rFonts w:ascii="BC Sans" w:hAnsi="BC Sans"/>
-                <w:sz w:val="20"/>
-                <w:szCs w:val="20"/>
-                <w:lang w:val="en-CA"/>
-              </w:rPr>
-              <w:t>:ifEM:hideBegin}</w:t>
+            <w:proofErr w:type="gramEnd"/>
+            <w:r>
+              <w:rPr>
+                <w:rFonts w:ascii="BC Sans" w:hAnsi="BC Sans"/>
+                <w:sz w:val="20"/>
+                <w:szCs w:val="20"/>
+                <w:lang w:val="en-CA"/>
+              </w:rPr>
+              <w:t>:</w:t>
+            </w:r>
+            <w:proofErr w:type="gramStart"/>
+            <w:r>
+              <w:rPr>
+                <w:rFonts w:ascii="BC Sans" w:hAnsi="BC Sans"/>
+                <w:sz w:val="20"/>
+                <w:szCs w:val="20"/>
+                <w:lang w:val="en-CA"/>
+              </w:rPr>
+              <w:t>ifEM:hideBegin</w:t>
+            </w:r>
+            <w:proofErr w:type="gramEnd"/>
+            <w:r>
+              <w:rPr>
+                <w:rFonts w:ascii="BC Sans" w:hAnsi="BC Sans"/>
+                <w:sz w:val="20"/>
+                <w:szCs w:val="20"/>
+                <w:lang w:val="en-CA"/>
+              </w:rPr>
+              <w:t>}</w:t>
             </w:r>
           </w:p>
         </w:tc>
@@ -3370,7 +6029,114 @@
                 <w:szCs w:val="20"/>
                 <w:lang w:val="en-CA"/>
               </w:rPr>
-              <w:t>{d.attachments[i].takenBy.lastName:hideEnd}</w:t>
+              <w:t>{</w:t>
+            </w:r>
+            <w:proofErr w:type="spellStart"/>
+            <w:proofErr w:type="gramStart"/>
+            <w:r>
+              <w:rPr>
+                <w:rFonts w:ascii="BC Sans" w:hAnsi="BC Sans"/>
+                <w:b w:val="0"/>
+                <w:bCs w:val="0"/>
+                <w:caps w:val="0"/>
+                <w:sz w:val="20"/>
+                <w:szCs w:val="20"/>
+                <w:lang w:val="en-CA"/>
+              </w:rPr>
+              <w:t>d.attachments</w:t>
+            </w:r>
+            <w:proofErr w:type="spellEnd"/>
+            <w:proofErr w:type="gramEnd"/>
+            <w:r>
+              <w:rPr>
+                <w:rFonts w:ascii="BC Sans" w:hAnsi="BC Sans"/>
+                <w:b w:val="0"/>
+                <w:bCs w:val="0"/>
+                <w:caps w:val="0"/>
+                <w:sz w:val="20"/>
+                <w:szCs w:val="20"/>
+                <w:lang w:val="en-CA"/>
+              </w:rPr>
+              <w:t>[</w:t>
+            </w:r>
+            <w:proofErr w:type="spellStart"/>
+            <w:r>
+              <w:rPr>
+                <w:rFonts w:ascii="BC Sans" w:hAnsi="BC Sans"/>
+                <w:b w:val="0"/>
+                <w:bCs w:val="0"/>
+                <w:caps w:val="0"/>
+                <w:sz w:val="20"/>
+                <w:szCs w:val="20"/>
+                <w:lang w:val="en-CA"/>
+              </w:rPr>
+              <w:t>i</w:t>
+            </w:r>
+            <w:proofErr w:type="spellEnd"/>
+            <w:proofErr w:type="gramStart"/>
+            <w:r>
+              <w:rPr>
+                <w:rFonts w:ascii="BC Sans" w:hAnsi="BC Sans"/>
+                <w:b w:val="0"/>
+                <w:bCs w:val="0"/>
+                <w:caps w:val="0"/>
+                <w:sz w:val="20"/>
+                <w:szCs w:val="20"/>
+                <w:lang w:val="en-CA"/>
+              </w:rPr>
+              <w:t>].</w:t>
+            </w:r>
+            <w:proofErr w:type="spellStart"/>
+            <w:r>
+              <w:rPr>
+                <w:rFonts w:ascii="BC Sans" w:hAnsi="BC Sans"/>
+                <w:b w:val="0"/>
+                <w:bCs w:val="0"/>
+                <w:caps w:val="0"/>
+                <w:sz w:val="20"/>
+                <w:szCs w:val="20"/>
+                <w:lang w:val="en-CA"/>
+              </w:rPr>
+              <w:t>takenBy.lastName</w:t>
+            </w:r>
+            <w:proofErr w:type="gramEnd"/>
+            <w:r>
+              <w:rPr>
+                <w:rFonts w:ascii="BC Sans" w:hAnsi="BC Sans"/>
+                <w:b w:val="0"/>
+                <w:bCs w:val="0"/>
+                <w:caps w:val="0"/>
+                <w:sz w:val="20"/>
+                <w:szCs w:val="20"/>
+                <w:lang w:val="en-CA"/>
+              </w:rPr>
+              <w:t>:</w:t>
+            </w:r>
+            <w:proofErr w:type="gramStart"/>
+            <w:r>
+              <w:rPr>
+                <w:rFonts w:ascii="BC Sans" w:hAnsi="BC Sans"/>
+                <w:b w:val="0"/>
+                <w:bCs w:val="0"/>
+                <w:caps w:val="0"/>
+                <w:sz w:val="20"/>
+                <w:szCs w:val="20"/>
+                <w:lang w:val="en-CA"/>
+              </w:rPr>
+              <w:t>hideEnd</w:t>
+            </w:r>
+            <w:proofErr w:type="spellEnd"/>
+            <w:r>
+              <w:rPr>
+                <w:rFonts w:ascii="BC Sans" w:hAnsi="BC Sans"/>
+                <w:b w:val="0"/>
+                <w:bCs w:val="0"/>
+                <w:caps w:val="0"/>
+                <w:sz w:val="20"/>
+                <w:szCs w:val="20"/>
+                <w:lang w:val="en-CA"/>
+              </w:rPr>
+              <w:t>}</w:t>
             </w:r>
             <w:r>
               <w:rPr>
@@ -3384,6 +6150,7 @@
               </w:rPr>
               <w:t>Location</w:t>
             </w:r>
+            <w:proofErr w:type="gramEnd"/>
           </w:p>
         </w:tc>
         <w:tc>
@@ -3407,16 +6174,86 @@
                 <w:szCs w:val="20"/>
                 <w:lang w:val="en-CA"/>
               </w:rPr>
-              <w:t>{d.attachments[i].location}</w:t>
-            </w:r>
-            <w:r>
-              <w:rPr>
-                <w:rFonts w:ascii="BC Sans" w:hAnsi="BC Sans"/>
-                <w:sz w:val="20"/>
-                <w:szCs w:val="20"/>
-                <w:lang w:val="en-CA"/>
-              </w:rPr>
-              <w:t>{d.attachments[i].takenBy.</w:t>
+              <w:t>{</w:t>
+            </w:r>
+            <w:proofErr w:type="gramStart"/>
+            <w:r>
+              <w:rPr>
+                <w:rFonts w:ascii="BC Sans" w:hAnsi="BC Sans"/>
+                <w:sz w:val="20"/>
+                <w:szCs w:val="20"/>
+                <w:lang w:val="en-CA"/>
+              </w:rPr>
+              <w:t>d.attachments</w:t>
+            </w:r>
+            <w:proofErr w:type="gramEnd"/>
+            <w:r>
+              <w:rPr>
+                <w:rFonts w:ascii="BC Sans" w:hAnsi="BC Sans"/>
+                <w:sz w:val="20"/>
+                <w:szCs w:val="20"/>
+                <w:lang w:val="en-CA"/>
+              </w:rPr>
+              <w:t>[i</w:t>
+            </w:r>
+            <w:proofErr w:type="gramStart"/>
+            <w:r>
+              <w:rPr>
+                <w:rFonts w:ascii="BC Sans" w:hAnsi="BC Sans"/>
+                <w:sz w:val="20"/>
+                <w:szCs w:val="20"/>
+                <w:lang w:val="en-CA"/>
+              </w:rPr>
+              <w:t>].location</w:t>
+            </w:r>
+            <w:proofErr w:type="gramEnd"/>
+            <w:r>
+              <w:rPr>
+                <w:rFonts w:ascii="BC Sans" w:hAnsi="BC Sans"/>
+                <w:sz w:val="20"/>
+                <w:szCs w:val="20"/>
+                <w:lang w:val="en-CA"/>
+              </w:rPr>
+              <w:t>}</w:t>
+            </w:r>
+            <w:r>
+              <w:rPr>
+                <w:rFonts w:ascii="BC Sans" w:hAnsi="BC Sans"/>
+                <w:sz w:val="20"/>
+                <w:szCs w:val="20"/>
+                <w:lang w:val="en-CA"/>
+              </w:rPr>
+              <w:t>{</w:t>
+            </w:r>
+            <w:proofErr w:type="gramStart"/>
+            <w:r>
+              <w:rPr>
+                <w:rFonts w:ascii="BC Sans" w:hAnsi="BC Sans"/>
+                <w:sz w:val="20"/>
+                <w:szCs w:val="20"/>
+                <w:lang w:val="en-CA"/>
+              </w:rPr>
+              <w:t>d.attachments</w:t>
+            </w:r>
+            <w:proofErr w:type="gramEnd"/>
+            <w:r>
+              <w:rPr>
+                <w:rFonts w:ascii="BC Sans" w:hAnsi="BC Sans"/>
+                <w:sz w:val="20"/>
+                <w:szCs w:val="20"/>
+                <w:lang w:val="en-CA"/>
+              </w:rPr>
+              <w:t>[i</w:t>
+            </w:r>
+            <w:proofErr w:type="gramStart"/>
+            <w:r>
+              <w:rPr>
+                <w:rFonts w:ascii="BC Sans" w:hAnsi="BC Sans"/>
+                <w:sz w:val="20"/>
+                <w:szCs w:val="20"/>
+                <w:lang w:val="en-CA"/>
+              </w:rPr>
+              <w:t>].takenBy.</w:t>
             </w:r>
             <w:r>
               <w:rPr>
@@ -3427,6 +6264,7 @@
               </w:rPr>
               <w:t>location</w:t>
             </w:r>
+            <w:proofErr w:type="gramEnd"/>
             <w:r>
               <w:rPr>
                 <w:rFonts w:ascii="BC Sans" w:hAnsi="BC Sans"/>
@@ -3484,7 +6322,17 @@
           <w:sz w:val="20"/>
           <w:szCs w:val="20"/>
         </w:rPr>
-        <w:t>{d.</w:t>
+        <w:t>{</w:t>
+      </w:r>
+      <w:proofErr w:type="spellStart"/>
+      <w:proofErr w:type="gramStart"/>
+      <w:r>
+        <w:rPr>
+          <w:rFonts w:ascii="BC Sans" w:hAnsi="BC Sans"/>
+          <w:sz w:val="20"/>
+          <w:szCs w:val="20"/>
+        </w:rPr>
+        <w:t>d.</w:t>
       </w:r>
       <w:r>
         <w:rPr>
@@ -3494,6 +6342,8 @@
         </w:rPr>
         <w:t>attachments</w:t>
       </w:r>
+      <w:proofErr w:type="spellEnd"/>
+      <w:proofErr w:type="gramEnd"/>
       <w:r>
         <w:rPr>
           <w:rFonts w:ascii="BC Sans" w:hAnsi="BC Sans"/>
@@ -3789,6 +6639,8 @@
             </w:rPr>
             <w:t>Report printed on {</w:t>
           </w:r>
+          <w:proofErr w:type="spellStart"/>
+          <w:proofErr w:type="gramStart"/>
           <w:r>
             <w:rPr>
               <w:rFonts w:ascii="BC Sans" w:eastAsia="BC Sans" w:hAnsi="BC Sans" w:cs="BC Sans"/>
@@ -3813,6 +6665,8 @@
             </w:rPr>
             <w:t>generatedOn</w:t>
           </w:r>
+          <w:proofErr w:type="spellEnd"/>
+          <w:proofErr w:type="gramEnd"/>
           <w:r>
             <w:rPr>
               <w:rFonts w:ascii="BC Sans" w:eastAsia="BC Sans" w:hAnsi="BC Sans" w:cs="BC Sans"/>
@@ -5357,6 +8211,15 @@
 </file>
 
 <file path=customXml/item2.xml><?xml version="1.0" encoding="utf-8"?>
+<?mso-contentType ?>
+<FormTemplates xmlns="http://schemas.microsoft.com/sharepoint/v3/contenttype/forms">
+  <Display>DocumentLibraryForm</Display>
+  <Edit>DocumentLibraryForm</Edit>
+  <New>DocumentLibraryForm</New>
+</FormTemplates>
+</file>
+
+<file path=customXml/item3.xml><?xml version="1.0" encoding="utf-8"?>
 <ct:contentTypeSchema xmlns:ct="http://schemas.microsoft.com/office/2006/metadata/contentType" xmlns:ma="http://schemas.microsoft.com/office/2006/metadata/properties/metaAttributes" ct:_="" ma:_="" ma:contentTypeName="Document" ma:contentTypeID="0x010100ED0089B3ED392A4CB3C10705735CFAD3" ma:contentTypeVersion="15" ma:contentTypeDescription="Create a new document." ma:contentTypeScope="" ma:versionID="e9715c4352d5d9c94cf397f6db7911f6">
   <xsd:schema xmlns:xsd="http://www.w3.org/2001/XMLSchema" xmlns:xs="http://www.w3.org/2001/XMLSchema" xmlns:p="http://schemas.microsoft.com/office/2006/metadata/properties" xmlns:ns2="aa9c99c1-69c1-4b58-9df5-4d4796c46f8a" xmlns:ns3="cbeac988-4fd5-47cf-ad03-89cc7678fa90" targetNamespace="http://schemas.microsoft.com/office/2006/metadata/properties" ma:root="true" ma:fieldsID="4a7b24a40f906d6832371abf7aef78d6" ns2:_="" ns3:_="">
     <xsd:import namespace="aa9c99c1-69c1-4b58-9df5-4d4796c46f8a"/>
@@ -5591,15 +8454,6 @@
 </ct:contentTypeSchema>
 </file>
 
-<file path=customXml/item3.xml><?xml version="1.0" encoding="utf-8"?>
-<?mso-contentType ?>
-<FormTemplates xmlns="http://schemas.microsoft.com/sharepoint/v3/contenttype/forms">
-  <Display>DocumentLibraryForm</Display>
-  <Edit>DocumentLibraryForm</Edit>
-  <New>DocumentLibraryForm</New>
-</FormTemplates>
-</file>
-
 <file path=customXml/itemProps1.xml><?xml version="1.0" encoding="utf-8"?>
 <ds:datastoreItem xmlns:ds="http://schemas.openxmlformats.org/officeDocument/2006/customXml" ds:itemID="{C6C5DCE0-D69C-4B6E-96D9-C69B23DE6D4A}">
   <ds:schemaRefs>
@@ -5612,6 +8466,14 @@
 </file>
 
 <file path=customXml/itemProps2.xml><?xml version="1.0" encoding="utf-8"?>
+<ds:datastoreItem xmlns:ds="http://schemas.openxmlformats.org/officeDocument/2006/customXml" ds:itemID="{4BECF9F2-3A10-48CC-8D31-4F6E8664527E}">
+  <ds:schemaRefs>
+    <ds:schemaRef ds:uri="http://schemas.microsoft.com/sharepoint/v3/contenttype/forms"/>
+  </ds:schemaRefs>
+</ds:datastoreItem>
+</file>
+
+<file path=customXml/itemProps3.xml><?xml version="1.0" encoding="utf-8"?>
 <ds:datastoreItem xmlns:ds="http://schemas.openxmlformats.org/officeDocument/2006/customXml" ds:itemID="{26FF9410-7F49-4DD5-9478-D670A139DF54}">
   <ds:schemaRefs>
     <ds:schemaRef ds:uri="http://schemas.microsoft.com/office/2006/metadata/contentType"/>
@@ -5628,12 +8490,4 @@
     <ds:schemaRef ds:uri="http://schemas.microsoft.com/internal/obd"/>
   </ds:schemaRefs>
 </ds:datastoreItem>
-</file>
-
-<file path=customXml/itemProps3.xml><?xml version="1.0" encoding="utf-8"?>
-<ds:datastoreItem xmlns:ds="http://schemas.openxmlformats.org/officeDocument/2006/customXml" ds:itemID="{4BECF9F2-3A10-48CC-8D31-4F6E8664527E}">
-  <ds:schemaRefs>
-    <ds:schemaRef ds:uri="http://schemas.microsoft.com/sharepoint/v3/contenttype/forms"/>
-  </ds:schemaRefs>
-</ds:datastoreItem>
 </file>
</xml_diff>

<commit_message>
feat: Expanded Exhibits (#1641)
Co-authored-by: team-wolverine-nrm-repo-updater[bot] <203337993+team-wolverine-nrm-repo-updater[bot]@users.noreply.github.com>
</commit_message>
<xml_diff>
--- a/backend/templates/task/CDOGS-TDR-TEMPLATE-v1.docx
+++ b/backend/templates/task/CDOGS-TDR-TEMPLATE-v1.docx
@@ -68,6 +68,7 @@
                 <w:szCs w:val="20"/>
               </w:rPr>
             </w:pPr>
+            <w:proofErr w:type="gramStart"/>
             <w:r>
               <w:rPr>
                 <w:rFonts w:ascii="BC Sans" w:eastAsia="Times New Roman" w:hAnsi="BC Sans" w:cs="Times New Roman"/>
@@ -112,6 +113,7 @@
               </w:rPr>
               <w:t>{</w:t>
             </w:r>
+            <w:proofErr w:type="spellStart"/>
             <w:r>
               <w:rPr>
                 <w:rFonts w:ascii="BC Sans" w:eastAsia="Times New Roman" w:hAnsi="BC Sans" w:cs="Times New Roman"/>
@@ -153,6 +155,8 @@
               </w:rPr>
               <w:t>Label</w:t>
             </w:r>
+            <w:proofErr w:type="spellEnd"/>
+            <w:proofErr w:type="gramEnd"/>
             <w:r>
               <w:rPr>
                 <w:rFonts w:ascii="BC Sans" w:eastAsia="Times New Roman" w:hAnsi="BC Sans" w:cs="Times New Roman"/>
@@ -184,7 +188,19 @@
                 <w:sz w:val="20"/>
                 <w:szCs w:val="20"/>
               </w:rPr>
-              <w:t>Task number</w:t>
+              <w:t xml:space="preserve">Task </w:t>
+            </w:r>
+            <w:proofErr w:type="gramStart"/>
+            <w:r>
+              <w:rPr>
+                <w:rFonts w:ascii="BC Sans" w:eastAsia="Times New Roman" w:hAnsi="BC Sans" w:cs="Times New Roman"/>
+                <w:b w:val="0"/>
+                <w:bCs w:val="0"/>
+                <w:color w:val="000000" w:themeColor="text1"/>
+                <w:sz w:val="20"/>
+                <w:szCs w:val="20"/>
+              </w:rPr>
+              <w:t>number</w:t>
             </w:r>
             <w:r>
               <w:rPr>
@@ -197,6 +213,7 @@
               </w:rPr>
               <w:t>: {</w:t>
             </w:r>
+            <w:proofErr w:type="spellStart"/>
             <w:r>
               <w:rPr>
                 <w:rFonts w:ascii="BC Sans" w:eastAsia="Times New Roman" w:hAnsi="BC Sans" w:cs="Times New Roman"/>
@@ -229,6 +246,8 @@
               </w:rPr>
               <w:t>taskNumber</w:t>
             </w:r>
+            <w:proofErr w:type="spellEnd"/>
+            <w:proofErr w:type="gramEnd"/>
             <w:r>
               <w:rPr>
                 <w:rFonts w:ascii="BC Sans" w:eastAsia="Times New Roman" w:hAnsi="BC Sans" w:cs="Times New Roman"/>
@@ -403,6 +422,8 @@
               </w:rPr>
               <w:t>{</w:t>
             </w:r>
+            <w:proofErr w:type="spellStart"/>
+            <w:proofErr w:type="gramStart"/>
             <w:r>
               <w:rPr>
                 <w:rFonts w:ascii="BC Sans" w:eastAsia="Times New Roman" w:hAnsi="BC Sans" w:cs="Times New Roman"/>
@@ -428,8 +449,29 @@
                 <w:sz w:val="20"/>
                 <w:szCs w:val="20"/>
               </w:rPr>
-              <w:t>taskType.category.longDescription</w:t>
-            </w:r>
+              <w:t>taskType.category</w:t>
+            </w:r>
+            <w:proofErr w:type="gramEnd"/>
+            <w:r>
+              <w:rPr>
+                <w:rFonts w:ascii="BC Sans" w:eastAsia="Times New Roman" w:hAnsi="BC Sans" w:cs="Times New Roman"/>
+                <w:color w:val="000000" w:themeColor="text1"/>
+                <w:sz w:val="20"/>
+                <w:szCs w:val="20"/>
+              </w:rPr>
+              <w:t>.</w:t>
+            </w:r>
+            <w:proofErr w:type="gramStart"/>
+            <w:r>
+              <w:rPr>
+                <w:rFonts w:ascii="BC Sans" w:eastAsia="Times New Roman" w:hAnsi="BC Sans" w:cs="Times New Roman"/>
+                <w:color w:val="000000" w:themeColor="text1"/>
+                <w:sz w:val="20"/>
+                <w:szCs w:val="20"/>
+              </w:rPr>
+              <w:t>longDescription</w:t>
+            </w:r>
+            <w:proofErr w:type="spellEnd"/>
             <w:r>
               <w:rPr>
                 <w:rFonts w:ascii="BC Sans" w:eastAsia="Times New Roman" w:hAnsi="BC Sans" w:cs="Times New Roman"/>
@@ -457,16 +499,51 @@
               </w:rPr>
               <w:t>d.</w:t>
             </w:r>
-            <w:r>
-              <w:rPr>
-                <w:rFonts w:ascii="BC Sans" w:eastAsia="Times New Roman" w:hAnsi="BC Sans" w:cs="Times New Roman"/>
-                <w:color w:val="000000" w:themeColor="text1"/>
-                <w:sz w:val="20"/>
-                <w:szCs w:val="20"/>
-                <w:lang w:val="en-CA"/>
-              </w:rPr>
-              <w:t>taskType.type.longDescription:ifEM:hideBegin</w:t>
-            </w:r>
+            <w:proofErr w:type="spellStart"/>
+            <w:r>
+              <w:rPr>
+                <w:rFonts w:ascii="BC Sans" w:eastAsia="Times New Roman" w:hAnsi="BC Sans" w:cs="Times New Roman"/>
+                <w:color w:val="000000" w:themeColor="text1"/>
+                <w:sz w:val="20"/>
+                <w:szCs w:val="20"/>
+                <w:lang w:val="en-CA"/>
+              </w:rPr>
+              <w:t>taskType.type</w:t>
+            </w:r>
+            <w:proofErr w:type="gramEnd"/>
+            <w:r>
+              <w:rPr>
+                <w:rFonts w:ascii="BC Sans" w:eastAsia="Times New Roman" w:hAnsi="BC Sans" w:cs="Times New Roman"/>
+                <w:color w:val="000000" w:themeColor="text1"/>
+                <w:sz w:val="20"/>
+                <w:szCs w:val="20"/>
+                <w:lang w:val="en-CA"/>
+              </w:rPr>
+              <w:t>.</w:t>
+            </w:r>
+            <w:proofErr w:type="gramStart"/>
+            <w:r>
+              <w:rPr>
+                <w:rFonts w:ascii="BC Sans" w:eastAsia="Times New Roman" w:hAnsi="BC Sans" w:cs="Times New Roman"/>
+                <w:color w:val="000000" w:themeColor="text1"/>
+                <w:sz w:val="20"/>
+                <w:szCs w:val="20"/>
+                <w:lang w:val="en-CA"/>
+              </w:rPr>
+              <w:t>longDescription:ifEM</w:t>
+            </w:r>
+            <w:proofErr w:type="gramEnd"/>
+            <w:r>
+              <w:rPr>
+                <w:rFonts w:ascii="BC Sans" w:eastAsia="Times New Roman" w:hAnsi="BC Sans" w:cs="Times New Roman"/>
+                <w:color w:val="000000" w:themeColor="text1"/>
+                <w:sz w:val="20"/>
+                <w:szCs w:val="20"/>
+                <w:lang w:val="en-CA"/>
+              </w:rPr>
+              <w:t>:hideBegin</w:t>
+            </w:r>
+            <w:proofErr w:type="spellEnd"/>
             <w:r>
               <w:rPr>
                 <w:rFonts w:ascii="BC Sans" w:hAnsi="BC Sans"/>
@@ -509,8 +586,21 @@
                 <w:sz w:val="20"/>
                 <w:szCs w:val="20"/>
               </w:rPr>
-              <w:t>Task sub category</w:t>
-            </w:r>
+              <w:t xml:space="preserve">Task </w:t>
+            </w:r>
+            <w:proofErr w:type="gramStart"/>
+            <w:r>
+              <w:rPr>
+                <w:rFonts w:ascii="BC Sans" w:hAnsi="BC Sans"/>
+                <w:b w:val="0"/>
+                <w:bCs w:val="0"/>
+                <w:caps w:val="0"/>
+                <w:sz w:val="20"/>
+                <w:szCs w:val="20"/>
+              </w:rPr>
+              <w:t>sub category</w:t>
+            </w:r>
+            <w:proofErr w:type="gramEnd"/>
           </w:p>
         </w:tc>
         <w:tc>
@@ -538,6 +628,7 @@
               </w:rPr>
               <w:t>{</w:t>
             </w:r>
+            <w:proofErr w:type="gramStart"/>
             <w:r>
               <w:rPr>
                 <w:rFonts w:ascii="BC Sans" w:eastAsia="Times New Roman" w:hAnsi="BC Sans" w:cs="Times New Roman"/>
@@ -556,16 +647,29 @@
               </w:rPr>
               <w:t>.</w:t>
             </w:r>
-            <w:r>
-              <w:rPr>
-                <w:rFonts w:ascii="BC Sans" w:eastAsia="Times New Roman" w:hAnsi="BC Sans" w:cs="Times New Roman"/>
-                <w:color w:val="000000" w:themeColor="text1"/>
-                <w:sz w:val="20"/>
-                <w:szCs w:val="20"/>
-                <w:lang w:val="en-CA"/>
-              </w:rPr>
-              <w:t>taskType.type.longDescription</w:t>
-            </w:r>
+            <w:proofErr w:type="spellStart"/>
+            <w:r>
+              <w:rPr>
+                <w:rFonts w:ascii="BC Sans" w:eastAsia="Times New Roman" w:hAnsi="BC Sans" w:cs="Times New Roman"/>
+                <w:color w:val="000000" w:themeColor="text1"/>
+                <w:sz w:val="20"/>
+                <w:szCs w:val="20"/>
+                <w:lang w:val="en-CA"/>
+              </w:rPr>
+              <w:t>taskType.type</w:t>
+            </w:r>
+            <w:proofErr w:type="gramEnd"/>
+            <w:r>
+              <w:rPr>
+                <w:rFonts w:ascii="BC Sans" w:eastAsia="Times New Roman" w:hAnsi="BC Sans" w:cs="Times New Roman"/>
+                <w:color w:val="000000" w:themeColor="text1"/>
+                <w:sz w:val="20"/>
+                <w:szCs w:val="20"/>
+                <w:lang w:val="en-CA"/>
+              </w:rPr>
+              <w:t>.longDescription</w:t>
+            </w:r>
+            <w:proofErr w:type="spellEnd"/>
             <w:r>
               <w:rPr>
                 <w:rFonts w:ascii="BC Sans" w:hAnsi="BC Sans"/>
@@ -610,7 +714,57 @@
                 <w:sz w:val="20"/>
                 <w:szCs w:val="20"/>
               </w:rPr>
-              <w:t>{d.taskType.type.longDescription:hideEnd}</w:t>
+              <w:t>{</w:t>
+            </w:r>
+            <w:proofErr w:type="spellStart"/>
+            <w:proofErr w:type="gramStart"/>
+            <w:r>
+              <w:rPr>
+                <w:rFonts w:ascii="BC Sans" w:hAnsi="BC Sans"/>
+                <w:b w:val="0"/>
+                <w:bCs w:val="0"/>
+                <w:caps w:val="0"/>
+                <w:sz w:val="20"/>
+                <w:szCs w:val="20"/>
+              </w:rPr>
+              <w:t>d.taskType.type</w:t>
+            </w:r>
+            <w:proofErr w:type="gramEnd"/>
+            <w:r>
+              <w:rPr>
+                <w:rFonts w:ascii="BC Sans" w:hAnsi="BC Sans"/>
+                <w:b w:val="0"/>
+                <w:bCs w:val="0"/>
+                <w:caps w:val="0"/>
+                <w:sz w:val="20"/>
+                <w:szCs w:val="20"/>
+              </w:rPr>
+              <w:t>.</w:t>
+            </w:r>
+            <w:proofErr w:type="gramStart"/>
+            <w:r>
+              <w:rPr>
+                <w:rFonts w:ascii="BC Sans" w:hAnsi="BC Sans"/>
+                <w:b w:val="0"/>
+                <w:bCs w:val="0"/>
+                <w:caps w:val="0"/>
+                <w:sz w:val="20"/>
+                <w:szCs w:val="20"/>
+              </w:rPr>
+              <w:t>longDescription:hideEnd</w:t>
+            </w:r>
+            <w:proofErr w:type="spellEnd"/>
+            <w:proofErr w:type="gramEnd"/>
+            <w:r>
+              <w:rPr>
+                <w:rFonts w:ascii="BC Sans" w:hAnsi="BC Sans"/>
+                <w:b w:val="0"/>
+                <w:bCs w:val="0"/>
+                <w:caps w:val="0"/>
+                <w:sz w:val="20"/>
+                <w:szCs w:val="20"/>
+              </w:rPr>
+              <w:t>}</w:t>
             </w:r>
             <w:r>
               <w:rPr>
@@ -651,6 +805,8 @@
               </w:rPr>
               <w:t>{</w:t>
             </w:r>
+            <w:proofErr w:type="spellStart"/>
+            <w:proofErr w:type="gramStart"/>
             <w:r>
               <w:rPr>
                 <w:rFonts w:ascii="BC Sans" w:eastAsia="Times New Roman" w:hAnsi="BC Sans" w:cs="Times New Roman"/>
@@ -678,6 +834,8 @@
               </w:rPr>
               <w:t>remarks</w:t>
             </w:r>
+            <w:proofErr w:type="spellEnd"/>
+            <w:proofErr w:type="gramEnd"/>
             <w:r>
               <w:rPr>
                 <w:rFonts w:ascii="BC Sans" w:eastAsia="Times New Roman" w:hAnsi="BC Sans" w:cs="Times New Roman"/>
@@ -746,6 +904,8 @@
               </w:rPr>
               <w:t>{</w:t>
             </w:r>
+            <w:proofErr w:type="spellStart"/>
+            <w:proofErr w:type="gramStart"/>
             <w:r>
               <w:rPr>
                 <w:rFonts w:ascii="BC Sans" w:eastAsia="Times New Roman" w:hAnsi="BC Sans" w:cs="Times New Roman"/>
@@ -775,6 +935,8 @@
               </w:rPr>
               <w:t>assignedUser.lastName</w:t>
             </w:r>
+            <w:proofErr w:type="spellEnd"/>
+            <w:proofErr w:type="gramEnd"/>
             <w:r>
               <w:rPr>
                 <w:rFonts w:ascii="BC Sans" w:eastAsia="Times New Roman" w:hAnsi="BC Sans" w:cs="Times New Roman"/>
@@ -795,7 +957,33 @@
                 <w:szCs w:val="20"/>
                 <w14:ligatures w14:val="none"/>
               </w:rPr>
-              <w:t>, {d.assignedUser.firstName}</w:t>
+              <w:t>, {</w:t>
+            </w:r>
+            <w:proofErr w:type="spellStart"/>
+            <w:proofErr w:type="gramStart"/>
+            <w:r>
+              <w:rPr>
+                <w:rFonts w:ascii="BC Sans" w:eastAsia="Times New Roman" w:hAnsi="BC Sans" w:cs="Times New Roman"/>
+                <w:color w:val="000000"/>
+                <w:kern w:val="0"/>
+                <w:sz w:val="20"/>
+                <w:szCs w:val="20"/>
+                <w14:ligatures w14:val="none"/>
+              </w:rPr>
+              <w:t>d.assignedUser.firstName</w:t>
+            </w:r>
+            <w:proofErr w:type="spellEnd"/>
+            <w:proofErr w:type="gramEnd"/>
+            <w:r>
+              <w:rPr>
+                <w:rFonts w:ascii="BC Sans" w:eastAsia="Times New Roman" w:hAnsi="BC Sans" w:cs="Times New Roman"/>
+                <w:color w:val="000000"/>
+                <w:kern w:val="0"/>
+                <w:sz w:val="20"/>
+                <w:szCs w:val="20"/>
+                <w14:ligatures w14:val="none"/>
+              </w:rPr>
+              <w:t>}</w:t>
             </w:r>
           </w:p>
         </w:tc>
@@ -862,17 +1050,38 @@
                 <w:sz w:val="20"/>
                 <w:szCs w:val="20"/>
               </w:rPr>
-              <w:t>{d.dueDate}</w:t>
-            </w:r>
-            <w:r>
-              <w:rPr>
-                <w:rFonts w:ascii="BC Sans" w:eastAsia="Times New Roman" w:hAnsi="BC Sans" w:cs="Times New Roman"/>
-                <w:color w:val="000000" w:themeColor="text1"/>
-                <w:sz w:val="20"/>
-                <w:szCs w:val="20"/>
-              </w:rPr>
               <w:t>{</w:t>
             </w:r>
+            <w:proofErr w:type="spellStart"/>
+            <w:proofErr w:type="gramStart"/>
+            <w:r>
+              <w:rPr>
+                <w:rFonts w:ascii="BC Sans" w:hAnsi="BC Sans" w:cs="BC Sans Light"/>
+                <w:sz w:val="20"/>
+                <w:szCs w:val="20"/>
+              </w:rPr>
+              <w:t>d.dueDate</w:t>
+            </w:r>
+            <w:proofErr w:type="spellEnd"/>
+            <w:proofErr w:type="gramEnd"/>
+            <w:r>
+              <w:rPr>
+                <w:rFonts w:ascii="BC Sans" w:hAnsi="BC Sans" w:cs="BC Sans Light"/>
+                <w:sz w:val="20"/>
+                <w:szCs w:val="20"/>
+              </w:rPr>
+              <w:t>}</w:t>
+            </w:r>
+            <w:r>
+              <w:rPr>
+                <w:rFonts w:ascii="BC Sans" w:eastAsia="Times New Roman" w:hAnsi="BC Sans" w:cs="Times New Roman"/>
+                <w:color w:val="000000" w:themeColor="text1"/>
+                <w:sz w:val="20"/>
+                <w:szCs w:val="20"/>
+              </w:rPr>
+              <w:t>{</w:t>
+            </w:r>
+            <w:proofErr w:type="gramStart"/>
             <w:r>
               <w:rPr>
                 <w:rFonts w:ascii="BC Sans" w:eastAsia="Times New Roman" w:hAnsi="BC Sans" w:cs="Times New Roman"/>
@@ -882,16 +1091,41 @@
               </w:rPr>
               <w:t>d.</w:t>
             </w:r>
-            <w:r>
-              <w:rPr>
-                <w:rFonts w:ascii="BC Sans" w:eastAsia="Times New Roman" w:hAnsi="BC Sans" w:cs="Times New Roman"/>
-                <w:color w:val="000000" w:themeColor="text1"/>
-                <w:sz w:val="20"/>
-                <w:szCs w:val="20"/>
-                <w:lang w:val="en-CA"/>
-              </w:rPr>
-              <w:t>description:ifEM:hideBegin</w:t>
-            </w:r>
+            <w:proofErr w:type="spellStart"/>
+            <w:r>
+              <w:rPr>
+                <w:rFonts w:ascii="BC Sans" w:eastAsia="Times New Roman" w:hAnsi="BC Sans" w:cs="Times New Roman"/>
+                <w:color w:val="000000" w:themeColor="text1"/>
+                <w:sz w:val="20"/>
+                <w:szCs w:val="20"/>
+                <w:lang w:val="en-CA"/>
+              </w:rPr>
+              <w:t>description</w:t>
+            </w:r>
+            <w:proofErr w:type="gramEnd"/>
+            <w:r>
+              <w:rPr>
+                <w:rFonts w:ascii="BC Sans" w:eastAsia="Times New Roman" w:hAnsi="BC Sans" w:cs="Times New Roman"/>
+                <w:color w:val="000000" w:themeColor="text1"/>
+                <w:sz w:val="20"/>
+                <w:szCs w:val="20"/>
+                <w:lang w:val="en-CA"/>
+              </w:rPr>
+              <w:t>:</w:t>
+            </w:r>
+            <w:proofErr w:type="gramStart"/>
+            <w:r>
+              <w:rPr>
+                <w:rFonts w:ascii="BC Sans" w:eastAsia="Times New Roman" w:hAnsi="BC Sans" w:cs="Times New Roman"/>
+                <w:color w:val="000000" w:themeColor="text1"/>
+                <w:sz w:val="20"/>
+                <w:szCs w:val="20"/>
+                <w:lang w:val="en-CA"/>
+              </w:rPr>
+              <w:t>ifEM:hideBegin</w:t>
+            </w:r>
+            <w:proofErr w:type="spellEnd"/>
+            <w:proofErr w:type="gramEnd"/>
             <w:r>
               <w:rPr>
                 <w:rFonts w:ascii="BC Sans" w:hAnsi="BC Sans"/>
@@ -956,7 +1190,27 @@
                 <w:sz w:val="20"/>
                 <w:szCs w:val="20"/>
               </w:rPr>
-              <w:t>{d.description}</w:t>
+              <w:t>{</w:t>
+            </w:r>
+            <w:proofErr w:type="spellStart"/>
+            <w:proofErr w:type="gramStart"/>
+            <w:r>
+              <w:rPr>
+                <w:rFonts w:ascii="BC Sans" w:hAnsi="BC Sans" w:cs="BC Sans Light"/>
+                <w:sz w:val="20"/>
+                <w:szCs w:val="20"/>
+              </w:rPr>
+              <w:t>d.description</w:t>
+            </w:r>
+            <w:proofErr w:type="spellEnd"/>
+            <w:proofErr w:type="gramEnd"/>
+            <w:r>
+              <w:rPr>
+                <w:rFonts w:ascii="BC Sans" w:hAnsi="BC Sans" w:cs="BC Sans Light"/>
+                <w:sz w:val="20"/>
+                <w:szCs w:val="20"/>
+              </w:rPr>
+              <w:t>}</w:t>
             </w:r>
             <w:r>
               <w:rPr>
@@ -990,6 +1244,7 @@
         </w:rPr>
         <w:t>{</w:t>
       </w:r>
+      <w:proofErr w:type="gramStart"/>
       <w:r>
         <w:rPr>
           <w:rFonts w:ascii="BC Sans" w:eastAsia="Times New Roman" w:hAnsi="BC Sans" w:cs="Times New Roman"/>
@@ -999,6 +1254,7 @@
         </w:rPr>
         <w:t>d.</w:t>
       </w:r>
+      <w:proofErr w:type="spellStart"/>
       <w:r>
         <w:rPr>
           <w:rFonts w:ascii="BC Sans" w:eastAsia="Times New Roman" w:hAnsi="BC Sans" w:cs="Times New Roman"/>
@@ -1007,8 +1263,32 @@
           <w:szCs w:val="20"/>
           <w:lang w:val="en-CA"/>
         </w:rPr>
-        <w:t>description:ifEM:hideEnd</w:t>
+        <w:t>description</w:t>
       </w:r>
+      <w:proofErr w:type="gramEnd"/>
+      <w:r>
+        <w:rPr>
+          <w:rFonts w:ascii="BC Sans" w:eastAsia="Times New Roman" w:hAnsi="BC Sans" w:cs="Times New Roman"/>
+          <w:color w:val="000000" w:themeColor="text1"/>
+          <w:sz w:val="20"/>
+          <w:szCs w:val="20"/>
+          <w:lang w:val="en-CA"/>
+        </w:rPr>
+        <w:t>:</w:t>
+      </w:r>
+      <w:proofErr w:type="gramStart"/>
+      <w:r>
+        <w:rPr>
+          <w:rFonts w:ascii="BC Sans" w:eastAsia="Times New Roman" w:hAnsi="BC Sans" w:cs="Times New Roman"/>
+          <w:color w:val="000000" w:themeColor="text1"/>
+          <w:sz w:val="20"/>
+          <w:szCs w:val="20"/>
+          <w:lang w:val="en-CA"/>
+        </w:rPr>
+        <w:t>ifEM:hideEnd</w:t>
+      </w:r>
+      <w:proofErr w:type="spellEnd"/>
+      <w:proofErr w:type="gramEnd"/>
       <w:r>
         <w:rPr>
           <w:rFonts w:ascii="BC Sans" w:hAnsi="BC Sans"/>
@@ -1023,7 +1303,63 @@
           <w:sz w:val="20"/>
           <w:szCs w:val="20"/>
         </w:rPr>
-        <w:t>{d.hasDiaryDates:ifEQ(true):showBegin}</w:t>
+        <w:t>{</w:t>
+      </w:r>
+      <w:proofErr w:type="spellStart"/>
+      <w:proofErr w:type="gramStart"/>
+      <w:r>
+        <w:rPr>
+          <w:rFonts w:ascii="BC Sans" w:hAnsi="BC Sans"/>
+          <w:sz w:val="20"/>
+          <w:szCs w:val="20"/>
+        </w:rPr>
+        <w:t>d.hasDiaryDates</w:t>
+      </w:r>
+      <w:proofErr w:type="gramEnd"/>
+      <w:r>
+        <w:rPr>
+          <w:rFonts w:ascii="BC Sans" w:hAnsi="BC Sans"/>
+          <w:sz w:val="20"/>
+          <w:szCs w:val="20"/>
+        </w:rPr>
+        <w:t>:ifEQ</w:t>
+      </w:r>
+      <w:proofErr w:type="spellEnd"/>
+      <w:r>
+        <w:rPr>
+          <w:rFonts w:ascii="BC Sans" w:hAnsi="BC Sans"/>
+          <w:sz w:val="20"/>
+          <w:szCs w:val="20"/>
+        </w:rPr>
+        <w:t>(true</w:t>
+      </w:r>
+      <w:proofErr w:type="gramStart"/>
+      <w:r>
+        <w:rPr>
+          <w:rFonts w:ascii="BC Sans" w:hAnsi="BC Sans"/>
+          <w:sz w:val="20"/>
+          <w:szCs w:val="20"/>
+        </w:rPr>
+        <w:t>):</w:t>
+      </w:r>
+      <w:proofErr w:type="spellStart"/>
+      <w:r>
+        <w:rPr>
+          <w:rFonts w:ascii="BC Sans" w:hAnsi="BC Sans"/>
+          <w:sz w:val="20"/>
+          <w:szCs w:val="20"/>
+        </w:rPr>
+        <w:t>showBegin</w:t>
+      </w:r>
+      <w:proofErr w:type="spellEnd"/>
+      <w:proofErr w:type="gramEnd"/>
+      <w:r>
+        <w:rPr>
+          <w:rFonts w:ascii="BC Sans" w:hAnsi="BC Sans"/>
+          <w:sz w:val="20"/>
+          <w:szCs w:val="20"/>
+        </w:rPr>
+        <w:t>}</w:t>
       </w:r>
     </w:p>
     <w:tbl>
@@ -1197,7 +1533,83 @@
                 <w:sz w:val="20"/>
                 <w:szCs w:val="20"/>
               </w:rPr>
-              <w:t>{d.diaryDates[i].dueDate}</w:t>
+              <w:t>{</w:t>
+            </w:r>
+            <w:proofErr w:type="spellStart"/>
+            <w:proofErr w:type="gramStart"/>
+            <w:r>
+              <w:rPr>
+                <w:rFonts w:ascii="BC Sans" w:hAnsi="BC Sans"/>
+                <w:b w:val="0"/>
+                <w:bCs w:val="0"/>
+                <w:caps w:val="0"/>
+                <w:sz w:val="20"/>
+                <w:szCs w:val="20"/>
+              </w:rPr>
+              <w:t>d.diaryDates</w:t>
+            </w:r>
+            <w:proofErr w:type="spellEnd"/>
+            <w:proofErr w:type="gramEnd"/>
+            <w:r>
+              <w:rPr>
+                <w:rFonts w:ascii="BC Sans" w:hAnsi="BC Sans"/>
+                <w:b w:val="0"/>
+                <w:bCs w:val="0"/>
+                <w:caps w:val="0"/>
+                <w:sz w:val="20"/>
+                <w:szCs w:val="20"/>
+              </w:rPr>
+              <w:t>[</w:t>
+            </w:r>
+            <w:proofErr w:type="spellStart"/>
+            <w:r>
+              <w:rPr>
+                <w:rFonts w:ascii="BC Sans" w:hAnsi="BC Sans"/>
+                <w:b w:val="0"/>
+                <w:bCs w:val="0"/>
+                <w:caps w:val="0"/>
+                <w:sz w:val="20"/>
+                <w:szCs w:val="20"/>
+              </w:rPr>
+              <w:t>i</w:t>
+            </w:r>
+            <w:proofErr w:type="spellEnd"/>
+            <w:proofErr w:type="gramStart"/>
+            <w:r>
+              <w:rPr>
+                <w:rFonts w:ascii="BC Sans" w:hAnsi="BC Sans"/>
+                <w:b w:val="0"/>
+                <w:bCs w:val="0"/>
+                <w:caps w:val="0"/>
+                <w:sz w:val="20"/>
+                <w:szCs w:val="20"/>
+              </w:rPr>
+              <w:t>].</w:t>
+            </w:r>
+            <w:proofErr w:type="spellStart"/>
+            <w:r>
+              <w:rPr>
+                <w:rFonts w:ascii="BC Sans" w:hAnsi="BC Sans"/>
+                <w:b w:val="0"/>
+                <w:bCs w:val="0"/>
+                <w:caps w:val="0"/>
+                <w:sz w:val="20"/>
+                <w:szCs w:val="20"/>
+              </w:rPr>
+              <w:t>dueDate</w:t>
+            </w:r>
+            <w:proofErr w:type="spellEnd"/>
+            <w:proofErr w:type="gramEnd"/>
+            <w:r>
+              <w:rPr>
+                <w:rFonts w:ascii="BC Sans" w:hAnsi="BC Sans"/>
+                <w:b w:val="0"/>
+                <w:bCs w:val="0"/>
+                <w:caps w:val="0"/>
+                <w:sz w:val="20"/>
+                <w:szCs w:val="20"/>
+              </w:rPr>
+              <w:t>}</w:t>
             </w:r>
           </w:p>
         </w:tc>
@@ -1225,7 +1637,60 @@
                 <w:sz w:val="18"/>
                 <w:szCs w:val="18"/>
               </w:rPr>
-              <w:t>{d.diaryDates[i].description}</w:t>
+              <w:t>{</w:t>
+            </w:r>
+            <w:proofErr w:type="spellStart"/>
+            <w:proofErr w:type="gramStart"/>
+            <w:r>
+              <w:rPr>
+                <w:rFonts w:ascii="BC Sans" w:eastAsia="Times New Roman" w:hAnsi="BC Sans" w:cs="Times New Roman"/>
+                <w:color w:val="000000" w:themeColor="text1"/>
+                <w:sz w:val="18"/>
+                <w:szCs w:val="18"/>
+              </w:rPr>
+              <w:t>d.diaryDates</w:t>
+            </w:r>
+            <w:proofErr w:type="spellEnd"/>
+            <w:proofErr w:type="gramEnd"/>
+            <w:r>
+              <w:rPr>
+                <w:rFonts w:ascii="BC Sans" w:eastAsia="Times New Roman" w:hAnsi="BC Sans" w:cs="Times New Roman"/>
+                <w:color w:val="000000" w:themeColor="text1"/>
+                <w:sz w:val="18"/>
+                <w:szCs w:val="18"/>
+              </w:rPr>
+              <w:t>[</w:t>
+            </w:r>
+            <w:proofErr w:type="spellStart"/>
+            <w:r>
+              <w:rPr>
+                <w:rFonts w:ascii="BC Sans" w:eastAsia="Times New Roman" w:hAnsi="BC Sans" w:cs="Times New Roman"/>
+                <w:color w:val="000000" w:themeColor="text1"/>
+                <w:sz w:val="18"/>
+                <w:szCs w:val="18"/>
+              </w:rPr>
+              <w:t>i</w:t>
+            </w:r>
+            <w:proofErr w:type="spellEnd"/>
+            <w:proofErr w:type="gramStart"/>
+            <w:r>
+              <w:rPr>
+                <w:rFonts w:ascii="BC Sans" w:eastAsia="Times New Roman" w:hAnsi="BC Sans" w:cs="Times New Roman"/>
+                <w:color w:val="000000" w:themeColor="text1"/>
+                <w:sz w:val="18"/>
+                <w:szCs w:val="18"/>
+              </w:rPr>
+              <w:t>].description</w:t>
+            </w:r>
+            <w:proofErr w:type="gramEnd"/>
+            <w:r>
+              <w:rPr>
+                <w:rFonts w:ascii="BC Sans" w:eastAsia="Times New Roman" w:hAnsi="BC Sans" w:cs="Times New Roman"/>
+                <w:color w:val="000000" w:themeColor="text1"/>
+                <w:sz w:val="18"/>
+                <w:szCs w:val="18"/>
+              </w:rPr>
+              <w:t>}</w:t>
             </w:r>
           </w:p>
         </w:tc>
@@ -1261,7 +1726,70 @@
                 <w:sz w:val="20"/>
                 <w:szCs w:val="20"/>
               </w:rPr>
-              <w:t>{d.diaryDates[i+1].dueDate}</w:t>
+              <w:t>{</w:t>
+            </w:r>
+            <w:proofErr w:type="spellStart"/>
+            <w:proofErr w:type="gramStart"/>
+            <w:r>
+              <w:rPr>
+                <w:rFonts w:ascii="BC Sans" w:hAnsi="BC Sans"/>
+                <w:b w:val="0"/>
+                <w:bCs w:val="0"/>
+                <w:caps w:val="0"/>
+                <w:sz w:val="20"/>
+                <w:szCs w:val="20"/>
+              </w:rPr>
+              <w:t>d.diaryDates</w:t>
+            </w:r>
+            <w:proofErr w:type="spellEnd"/>
+            <w:proofErr w:type="gramEnd"/>
+            <w:r>
+              <w:rPr>
+                <w:rFonts w:ascii="BC Sans" w:hAnsi="BC Sans"/>
+                <w:b w:val="0"/>
+                <w:bCs w:val="0"/>
+                <w:caps w:val="0"/>
+                <w:sz w:val="20"/>
+                <w:szCs w:val="20"/>
+              </w:rPr>
+              <w:t>[i+1</w:t>
+            </w:r>
+            <w:proofErr w:type="gramStart"/>
+            <w:r>
+              <w:rPr>
+                <w:rFonts w:ascii="BC Sans" w:hAnsi="BC Sans"/>
+                <w:b w:val="0"/>
+                <w:bCs w:val="0"/>
+                <w:caps w:val="0"/>
+                <w:sz w:val="20"/>
+                <w:szCs w:val="20"/>
+              </w:rPr>
+              <w:t>].</w:t>
+            </w:r>
+            <w:proofErr w:type="spellStart"/>
+            <w:r>
+              <w:rPr>
+                <w:rFonts w:ascii="BC Sans" w:hAnsi="BC Sans"/>
+                <w:b w:val="0"/>
+                <w:bCs w:val="0"/>
+                <w:caps w:val="0"/>
+                <w:sz w:val="20"/>
+                <w:szCs w:val="20"/>
+              </w:rPr>
+              <w:t>dueDate</w:t>
+            </w:r>
+            <w:proofErr w:type="spellEnd"/>
+            <w:proofErr w:type="gramEnd"/>
+            <w:r>
+              <w:rPr>
+                <w:rFonts w:ascii="BC Sans" w:hAnsi="BC Sans"/>
+                <w:b w:val="0"/>
+                <w:bCs w:val="0"/>
+                <w:caps w:val="0"/>
+                <w:sz w:val="20"/>
+                <w:szCs w:val="20"/>
+              </w:rPr>
+              <w:t>}</w:t>
             </w:r>
           </w:p>
         </w:tc>
@@ -1288,7 +1816,49 @@
                 <w:sz w:val="18"/>
                 <w:szCs w:val="18"/>
               </w:rPr>
-              <w:t>{d.diaryDates[i+1].description}</w:t>
+              <w:t>{</w:t>
+            </w:r>
+            <w:proofErr w:type="spellStart"/>
+            <w:proofErr w:type="gramStart"/>
+            <w:r>
+              <w:rPr>
+                <w:rFonts w:ascii="BC Sans" w:eastAsia="Times New Roman" w:hAnsi="BC Sans" w:cs="Times New Roman"/>
+                <w:color w:val="000000" w:themeColor="text1"/>
+                <w:sz w:val="18"/>
+                <w:szCs w:val="18"/>
+              </w:rPr>
+              <w:t>d.diaryDates</w:t>
+            </w:r>
+            <w:proofErr w:type="spellEnd"/>
+            <w:proofErr w:type="gramEnd"/>
+            <w:r>
+              <w:rPr>
+                <w:rFonts w:ascii="BC Sans" w:eastAsia="Times New Roman" w:hAnsi="BC Sans" w:cs="Times New Roman"/>
+                <w:color w:val="000000" w:themeColor="text1"/>
+                <w:sz w:val="18"/>
+                <w:szCs w:val="18"/>
+              </w:rPr>
+              <w:t>[i+1</w:t>
+            </w:r>
+            <w:proofErr w:type="gramStart"/>
+            <w:r>
+              <w:rPr>
+                <w:rFonts w:ascii="BC Sans" w:eastAsia="Times New Roman" w:hAnsi="BC Sans" w:cs="Times New Roman"/>
+                <w:color w:val="000000" w:themeColor="text1"/>
+                <w:sz w:val="18"/>
+                <w:szCs w:val="18"/>
+              </w:rPr>
+              <w:t>].description</w:t>
+            </w:r>
+            <w:proofErr w:type="gramEnd"/>
+            <w:r>
+              <w:rPr>
+                <w:rFonts w:ascii="BC Sans" w:eastAsia="Times New Roman" w:hAnsi="BC Sans" w:cs="Times New Roman"/>
+                <w:color w:val="000000" w:themeColor="text1"/>
+                <w:sz w:val="18"/>
+                <w:szCs w:val="18"/>
+              </w:rPr>
+              <w:t>}</w:t>
             </w:r>
           </w:p>
         </w:tc>
@@ -1311,7 +1881,34 @@
           <w:sz w:val="20"/>
           <w:szCs w:val="20"/>
         </w:rPr>
-        <w:t>{d.hasDiaryDates:showEnd}{d.</w:t>
+        <w:t>{</w:t>
+      </w:r>
+      <w:proofErr w:type="gramStart"/>
+      <w:r>
+        <w:rPr>
+          <w:rFonts w:ascii="BC Sans" w:hAnsi="BC Sans"/>
+          <w:sz w:val="20"/>
+          <w:szCs w:val="20"/>
+        </w:rPr>
+        <w:t>d.hasDiaryDates</w:t>
+      </w:r>
+      <w:proofErr w:type="gramEnd"/>
+      <w:r>
+        <w:rPr>
+          <w:rFonts w:ascii="BC Sans" w:hAnsi="BC Sans"/>
+          <w:sz w:val="20"/>
+          <w:szCs w:val="20"/>
+        </w:rPr>
+        <w:t>:</w:t>
+      </w:r>
+      <w:proofErr w:type="gramStart"/>
+      <w:r>
+        <w:rPr>
+          <w:rFonts w:ascii="BC Sans" w:hAnsi="BC Sans"/>
+          <w:sz w:val="20"/>
+          <w:szCs w:val="20"/>
+        </w:rPr>
+        <w:t>showEnd}{d.</w:t>
       </w:r>
       <w:r>
         <w:rPr>
@@ -1321,13 +1918,32 @@
         </w:rPr>
         <w:t>hasActivityNotes</w:t>
       </w:r>
+      <w:proofErr w:type="gramEnd"/>
       <w:r>
         <w:rPr>
           <w:rFonts w:ascii="BC Sans" w:hAnsi="BC Sans"/>
           <w:sz w:val="20"/>
           <w:szCs w:val="20"/>
         </w:rPr>
-        <w:t>:ifEQ(true):showBegin}</w:t>
+        <w:t>:ifEQ(true</w:t>
+      </w:r>
+      <w:proofErr w:type="gramStart"/>
+      <w:r>
+        <w:rPr>
+          <w:rFonts w:ascii="BC Sans" w:hAnsi="BC Sans"/>
+          <w:sz w:val="20"/>
+          <w:szCs w:val="20"/>
+        </w:rPr>
+        <w:t>):showBegin</w:t>
+      </w:r>
+      <w:proofErr w:type="gramEnd"/>
+      <w:r>
+        <w:rPr>
+          <w:rFonts w:ascii="BC Sans" w:hAnsi="BC Sans"/>
+          <w:sz w:val="20"/>
+          <w:szCs w:val="20"/>
+        </w:rPr>
+        <w:t>}</w:t>
       </w:r>
     </w:p>
     <w:tbl>
@@ -1485,7 +2101,83 @@
                 <w:sz w:val="20"/>
                 <w:szCs w:val="20"/>
               </w:rPr>
-              <w:t>{d.activityNotes[i].contentText}</w:t>
+              <w:t>{</w:t>
+            </w:r>
+            <w:proofErr w:type="spellStart"/>
+            <w:proofErr w:type="gramStart"/>
+            <w:r>
+              <w:rPr>
+                <w:rFonts w:ascii="BC Sans" w:hAnsi="BC Sans"/>
+                <w:b w:val="0"/>
+                <w:bCs w:val="0"/>
+                <w:caps w:val="0"/>
+                <w:sz w:val="20"/>
+                <w:szCs w:val="20"/>
+              </w:rPr>
+              <w:t>d.activityNotes</w:t>
+            </w:r>
+            <w:proofErr w:type="spellEnd"/>
+            <w:proofErr w:type="gramEnd"/>
+            <w:r>
+              <w:rPr>
+                <w:rFonts w:ascii="BC Sans" w:hAnsi="BC Sans"/>
+                <w:b w:val="0"/>
+                <w:bCs w:val="0"/>
+                <w:caps w:val="0"/>
+                <w:sz w:val="20"/>
+                <w:szCs w:val="20"/>
+              </w:rPr>
+              <w:t>[</w:t>
+            </w:r>
+            <w:proofErr w:type="spellStart"/>
+            <w:r>
+              <w:rPr>
+                <w:rFonts w:ascii="BC Sans" w:hAnsi="BC Sans"/>
+                <w:b w:val="0"/>
+                <w:bCs w:val="0"/>
+                <w:caps w:val="0"/>
+                <w:sz w:val="20"/>
+                <w:szCs w:val="20"/>
+              </w:rPr>
+              <w:t>i</w:t>
+            </w:r>
+            <w:proofErr w:type="spellEnd"/>
+            <w:proofErr w:type="gramStart"/>
+            <w:r>
+              <w:rPr>
+                <w:rFonts w:ascii="BC Sans" w:hAnsi="BC Sans"/>
+                <w:b w:val="0"/>
+                <w:bCs w:val="0"/>
+                <w:caps w:val="0"/>
+                <w:sz w:val="20"/>
+                <w:szCs w:val="20"/>
+              </w:rPr>
+              <w:t>].</w:t>
+            </w:r>
+            <w:proofErr w:type="spellStart"/>
+            <w:r>
+              <w:rPr>
+                <w:rFonts w:ascii="BC Sans" w:hAnsi="BC Sans"/>
+                <w:b w:val="0"/>
+                <w:bCs w:val="0"/>
+                <w:caps w:val="0"/>
+                <w:sz w:val="20"/>
+                <w:szCs w:val="20"/>
+              </w:rPr>
+              <w:t>contentText</w:t>
+            </w:r>
+            <w:proofErr w:type="spellEnd"/>
+            <w:proofErr w:type="gramEnd"/>
+            <w:r>
+              <w:rPr>
+                <w:rFonts w:ascii="BC Sans" w:hAnsi="BC Sans"/>
+                <w:b w:val="0"/>
+                <w:bCs w:val="0"/>
+                <w:caps w:val="0"/>
+                <w:sz w:val="20"/>
+                <w:szCs w:val="20"/>
+              </w:rPr>
+              <w:t>}</w:t>
             </w:r>
           </w:p>
         </w:tc>
@@ -1516,8 +2208,10 @@
                 <w:sz w:val="18"/>
                 <w:szCs w:val="18"/>
               </w:rPr>
-              <w:t>{d.activityNotes[i].actionedDate}</w:t>
-            </w:r>
+              <w:t>{</w:t>
+            </w:r>
+            <w:proofErr w:type="spellStart"/>
+            <w:proofErr w:type="gramStart"/>
             <w:r>
               <w:rPr>
                 <w:rFonts w:ascii="BC Sans" w:eastAsia="Times New Roman" w:hAnsi="BC Sans" w:cs="Times New Roman"/>
@@ -1525,7 +2219,133 @@
                 <w:sz w:val="18"/>
                 <w:szCs w:val="18"/>
               </w:rPr>
-              <w:t xml:space="preserve"> {d.activityNotes[i].actionedTime}</w:t>
+              <w:t>d.activityNotes</w:t>
+            </w:r>
+            <w:proofErr w:type="spellEnd"/>
+            <w:proofErr w:type="gramEnd"/>
+            <w:r>
+              <w:rPr>
+                <w:rFonts w:ascii="BC Sans" w:eastAsia="Times New Roman" w:hAnsi="BC Sans" w:cs="Times New Roman"/>
+                <w:color w:val="000000" w:themeColor="text1"/>
+                <w:sz w:val="18"/>
+                <w:szCs w:val="18"/>
+              </w:rPr>
+              <w:t>[</w:t>
+            </w:r>
+            <w:proofErr w:type="spellStart"/>
+            <w:r>
+              <w:rPr>
+                <w:rFonts w:ascii="BC Sans" w:eastAsia="Times New Roman" w:hAnsi="BC Sans" w:cs="Times New Roman"/>
+                <w:color w:val="000000" w:themeColor="text1"/>
+                <w:sz w:val="18"/>
+                <w:szCs w:val="18"/>
+              </w:rPr>
+              <w:t>i</w:t>
+            </w:r>
+            <w:proofErr w:type="spellEnd"/>
+            <w:proofErr w:type="gramStart"/>
+            <w:r>
+              <w:rPr>
+                <w:rFonts w:ascii="BC Sans" w:eastAsia="Times New Roman" w:hAnsi="BC Sans" w:cs="Times New Roman"/>
+                <w:color w:val="000000" w:themeColor="text1"/>
+                <w:sz w:val="18"/>
+                <w:szCs w:val="18"/>
+              </w:rPr>
+              <w:t>].</w:t>
+            </w:r>
+            <w:proofErr w:type="spellStart"/>
+            <w:r>
+              <w:rPr>
+                <w:rFonts w:ascii="BC Sans" w:eastAsia="Times New Roman" w:hAnsi="BC Sans" w:cs="Times New Roman"/>
+                <w:color w:val="000000" w:themeColor="text1"/>
+                <w:sz w:val="18"/>
+                <w:szCs w:val="18"/>
+              </w:rPr>
+              <w:t>actionedDate</w:t>
+            </w:r>
+            <w:proofErr w:type="spellEnd"/>
+            <w:proofErr w:type="gramEnd"/>
+            <w:r>
+              <w:rPr>
+                <w:rFonts w:ascii="BC Sans" w:eastAsia="Times New Roman" w:hAnsi="BC Sans" w:cs="Times New Roman"/>
+                <w:color w:val="000000" w:themeColor="text1"/>
+                <w:sz w:val="18"/>
+                <w:szCs w:val="18"/>
+              </w:rPr>
+              <w:t>}</w:t>
+            </w:r>
+            <w:r>
+              <w:rPr>
+                <w:rFonts w:ascii="BC Sans" w:eastAsia="Times New Roman" w:hAnsi="BC Sans" w:cs="Times New Roman"/>
+                <w:color w:val="000000" w:themeColor="text1"/>
+                <w:sz w:val="18"/>
+                <w:szCs w:val="18"/>
+              </w:rPr>
+              <w:t xml:space="preserve"> {</w:t>
+            </w:r>
+            <w:proofErr w:type="spellStart"/>
+            <w:proofErr w:type="gramStart"/>
+            <w:r>
+              <w:rPr>
+                <w:rFonts w:ascii="BC Sans" w:eastAsia="Times New Roman" w:hAnsi="BC Sans" w:cs="Times New Roman"/>
+                <w:color w:val="000000" w:themeColor="text1"/>
+                <w:sz w:val="18"/>
+                <w:szCs w:val="18"/>
+              </w:rPr>
+              <w:t>d.activityNotes</w:t>
+            </w:r>
+            <w:proofErr w:type="spellEnd"/>
+            <w:proofErr w:type="gramEnd"/>
+            <w:r>
+              <w:rPr>
+                <w:rFonts w:ascii="BC Sans" w:eastAsia="Times New Roman" w:hAnsi="BC Sans" w:cs="Times New Roman"/>
+                <w:color w:val="000000" w:themeColor="text1"/>
+                <w:sz w:val="18"/>
+                <w:szCs w:val="18"/>
+              </w:rPr>
+              <w:t>[</w:t>
+            </w:r>
+            <w:proofErr w:type="spellStart"/>
+            <w:r>
+              <w:rPr>
+                <w:rFonts w:ascii="BC Sans" w:eastAsia="Times New Roman" w:hAnsi="BC Sans" w:cs="Times New Roman"/>
+                <w:color w:val="000000" w:themeColor="text1"/>
+                <w:sz w:val="18"/>
+                <w:szCs w:val="18"/>
+              </w:rPr>
+              <w:t>i</w:t>
+            </w:r>
+            <w:proofErr w:type="spellEnd"/>
+            <w:proofErr w:type="gramStart"/>
+            <w:r>
+              <w:rPr>
+                <w:rFonts w:ascii="BC Sans" w:eastAsia="Times New Roman" w:hAnsi="BC Sans" w:cs="Times New Roman"/>
+                <w:color w:val="000000" w:themeColor="text1"/>
+                <w:sz w:val="18"/>
+                <w:szCs w:val="18"/>
+              </w:rPr>
+              <w:t>].</w:t>
+            </w:r>
+            <w:proofErr w:type="spellStart"/>
+            <w:r>
+              <w:rPr>
+                <w:rFonts w:ascii="BC Sans" w:eastAsia="Times New Roman" w:hAnsi="BC Sans" w:cs="Times New Roman"/>
+                <w:color w:val="000000" w:themeColor="text1"/>
+                <w:sz w:val="18"/>
+                <w:szCs w:val="18"/>
+              </w:rPr>
+              <w:t>actionedTime</w:t>
+            </w:r>
+            <w:proofErr w:type="spellEnd"/>
+            <w:proofErr w:type="gramEnd"/>
+            <w:r>
+              <w:rPr>
+                <w:rFonts w:ascii="BC Sans" w:eastAsia="Times New Roman" w:hAnsi="BC Sans" w:cs="Times New Roman"/>
+                <w:color w:val="000000" w:themeColor="text1"/>
+                <w:sz w:val="18"/>
+                <w:szCs w:val="18"/>
+              </w:rPr>
+              <w:t>}</w:t>
             </w:r>
           </w:p>
         </w:tc>
@@ -1553,7 +2373,49 @@
                 <w:sz w:val="18"/>
                 <w:szCs w:val="18"/>
               </w:rPr>
-              <w:t>{d.activityNotes[i].</w:t>
+              <w:t>{</w:t>
+            </w:r>
+            <w:proofErr w:type="spellStart"/>
+            <w:proofErr w:type="gramStart"/>
+            <w:r>
+              <w:rPr>
+                <w:rFonts w:ascii="BC Sans" w:eastAsia="Times New Roman" w:hAnsi="BC Sans" w:cs="Times New Roman"/>
+                <w:color w:val="000000" w:themeColor="text1"/>
+                <w:sz w:val="18"/>
+                <w:szCs w:val="18"/>
+              </w:rPr>
+              <w:t>d.activityNotes</w:t>
+            </w:r>
+            <w:proofErr w:type="spellEnd"/>
+            <w:proofErr w:type="gramEnd"/>
+            <w:r>
+              <w:rPr>
+                <w:rFonts w:ascii="BC Sans" w:eastAsia="Times New Roman" w:hAnsi="BC Sans" w:cs="Times New Roman"/>
+                <w:color w:val="000000" w:themeColor="text1"/>
+                <w:sz w:val="18"/>
+                <w:szCs w:val="18"/>
+              </w:rPr>
+              <w:t>[</w:t>
+            </w:r>
+            <w:proofErr w:type="spellStart"/>
+            <w:r>
+              <w:rPr>
+                <w:rFonts w:ascii="BC Sans" w:eastAsia="Times New Roman" w:hAnsi="BC Sans" w:cs="Times New Roman"/>
+                <w:color w:val="000000" w:themeColor="text1"/>
+                <w:sz w:val="18"/>
+                <w:szCs w:val="18"/>
+              </w:rPr>
+              <w:t>i</w:t>
+            </w:r>
+            <w:proofErr w:type="spellEnd"/>
+            <w:r>
+              <w:rPr>
+                <w:rFonts w:ascii="BC Sans" w:eastAsia="Times New Roman" w:hAnsi="BC Sans" w:cs="Times New Roman"/>
+                <w:color w:val="000000" w:themeColor="text1"/>
+                <w:sz w:val="18"/>
+                <w:szCs w:val="18"/>
+              </w:rPr>
+              <w:t>].</w:t>
             </w:r>
             <w:r>
               <w:rPr>
@@ -1566,6 +2428,7 @@
               </w:rPr>
               <w:t xml:space="preserve"> </w:t>
             </w:r>
+            <w:proofErr w:type="spellStart"/>
             <w:r>
               <w:rPr>
                 <w:rFonts w:ascii="BC Sans" w:eastAsia="Times New Roman" w:hAnsi="BC Sans" w:cs="Times New Roman"/>
@@ -1582,7 +2445,68 @@
                 <w:sz w:val="18"/>
                 <w:szCs w:val="18"/>
               </w:rPr>
-              <w:t>.lastName}, {d.activityNotes[i].</w:t>
+              <w:t>.</w:t>
+            </w:r>
+            <w:proofErr w:type="gramStart"/>
+            <w:r>
+              <w:rPr>
+                <w:rFonts w:ascii="BC Sans" w:eastAsia="Times New Roman" w:hAnsi="BC Sans" w:cs="Times New Roman"/>
+                <w:color w:val="000000" w:themeColor="text1"/>
+                <w:sz w:val="18"/>
+                <w:szCs w:val="18"/>
+              </w:rPr>
+              <w:t>lastName</w:t>
+            </w:r>
+            <w:proofErr w:type="spellEnd"/>
+            <w:r>
+              <w:rPr>
+                <w:rFonts w:ascii="BC Sans" w:eastAsia="Times New Roman" w:hAnsi="BC Sans" w:cs="Times New Roman"/>
+                <w:color w:val="000000" w:themeColor="text1"/>
+                <w:sz w:val="18"/>
+                <w:szCs w:val="18"/>
+              </w:rPr>
+              <w:t>}, {</w:t>
+            </w:r>
+            <w:proofErr w:type="spellStart"/>
+            <w:r>
+              <w:rPr>
+                <w:rFonts w:ascii="BC Sans" w:eastAsia="Times New Roman" w:hAnsi="BC Sans" w:cs="Times New Roman"/>
+                <w:color w:val="000000" w:themeColor="text1"/>
+                <w:sz w:val="18"/>
+                <w:szCs w:val="18"/>
+              </w:rPr>
+              <w:t>d.activityNotes</w:t>
+            </w:r>
+            <w:proofErr w:type="spellEnd"/>
+            <w:proofErr w:type="gramEnd"/>
+            <w:r>
+              <w:rPr>
+                <w:rFonts w:ascii="BC Sans" w:eastAsia="Times New Roman" w:hAnsi="BC Sans" w:cs="Times New Roman"/>
+                <w:color w:val="000000" w:themeColor="text1"/>
+                <w:sz w:val="18"/>
+                <w:szCs w:val="18"/>
+              </w:rPr>
+              <w:t>[</w:t>
+            </w:r>
+            <w:proofErr w:type="spellStart"/>
+            <w:r>
+              <w:rPr>
+                <w:rFonts w:ascii="BC Sans" w:eastAsia="Times New Roman" w:hAnsi="BC Sans" w:cs="Times New Roman"/>
+                <w:color w:val="000000" w:themeColor="text1"/>
+                <w:sz w:val="18"/>
+                <w:szCs w:val="18"/>
+              </w:rPr>
+              <w:t>i</w:t>
+            </w:r>
+            <w:proofErr w:type="spellEnd"/>
+            <w:r>
+              <w:rPr>
+                <w:rFonts w:ascii="BC Sans" w:eastAsia="Times New Roman" w:hAnsi="BC Sans" w:cs="Times New Roman"/>
+                <w:color w:val="000000" w:themeColor="text1"/>
+                <w:sz w:val="18"/>
+                <w:szCs w:val="18"/>
+              </w:rPr>
+              <w:t>].</w:t>
             </w:r>
             <w:r>
               <w:rPr>
@@ -1595,6 +2519,7 @@
               </w:rPr>
               <w:t xml:space="preserve"> </w:t>
             </w:r>
+            <w:proofErr w:type="spellStart"/>
             <w:r>
               <w:rPr>
                 <w:rFonts w:ascii="BC Sans" w:eastAsia="Times New Roman" w:hAnsi="BC Sans" w:cs="Times New Roman"/>
@@ -1611,7 +2536,17 @@
                 <w:sz w:val="18"/>
                 <w:szCs w:val="18"/>
               </w:rPr>
-              <w:t>.firstName}</w:t>
+              <w:t>.firstName</w:t>
+            </w:r>
+            <w:proofErr w:type="spellEnd"/>
+            <w:r>
+              <w:rPr>
+                <w:rFonts w:ascii="BC Sans" w:eastAsia="Times New Roman" w:hAnsi="BC Sans" w:cs="Times New Roman"/>
+                <w:color w:val="000000" w:themeColor="text1"/>
+                <w:sz w:val="18"/>
+                <w:szCs w:val="18"/>
+              </w:rPr>
+              <w:t>}</w:t>
             </w:r>
           </w:p>
         </w:tc>
@@ -1647,7 +2582,70 @@
                 <w:sz w:val="20"/>
                 <w:szCs w:val="20"/>
               </w:rPr>
-              <w:t>{d.activityNotes[i+1].contentText}</w:t>
+              <w:t>{</w:t>
+            </w:r>
+            <w:proofErr w:type="spellStart"/>
+            <w:proofErr w:type="gramStart"/>
+            <w:r>
+              <w:rPr>
+                <w:rFonts w:ascii="BC Sans" w:hAnsi="BC Sans"/>
+                <w:b w:val="0"/>
+                <w:bCs w:val="0"/>
+                <w:caps w:val="0"/>
+                <w:sz w:val="20"/>
+                <w:szCs w:val="20"/>
+              </w:rPr>
+              <w:t>d.activityNotes</w:t>
+            </w:r>
+            <w:proofErr w:type="spellEnd"/>
+            <w:proofErr w:type="gramEnd"/>
+            <w:r>
+              <w:rPr>
+                <w:rFonts w:ascii="BC Sans" w:hAnsi="BC Sans"/>
+                <w:b w:val="0"/>
+                <w:bCs w:val="0"/>
+                <w:caps w:val="0"/>
+                <w:sz w:val="20"/>
+                <w:szCs w:val="20"/>
+              </w:rPr>
+              <w:t>[i+1</w:t>
+            </w:r>
+            <w:proofErr w:type="gramStart"/>
+            <w:r>
+              <w:rPr>
+                <w:rFonts w:ascii="BC Sans" w:hAnsi="BC Sans"/>
+                <w:b w:val="0"/>
+                <w:bCs w:val="0"/>
+                <w:caps w:val="0"/>
+                <w:sz w:val="20"/>
+                <w:szCs w:val="20"/>
+              </w:rPr>
+              <w:t>].</w:t>
+            </w:r>
+            <w:proofErr w:type="spellStart"/>
+            <w:r>
+              <w:rPr>
+                <w:rFonts w:ascii="BC Sans" w:hAnsi="BC Sans"/>
+                <w:b w:val="0"/>
+                <w:bCs w:val="0"/>
+                <w:caps w:val="0"/>
+                <w:sz w:val="20"/>
+                <w:szCs w:val="20"/>
+              </w:rPr>
+              <w:t>contentText</w:t>
+            </w:r>
+            <w:proofErr w:type="spellEnd"/>
+            <w:proofErr w:type="gramEnd"/>
+            <w:r>
+              <w:rPr>
+                <w:rFonts w:ascii="BC Sans" w:hAnsi="BC Sans"/>
+                <w:b w:val="0"/>
+                <w:bCs w:val="0"/>
+                <w:caps w:val="0"/>
+                <w:sz w:val="20"/>
+                <w:szCs w:val="20"/>
+              </w:rPr>
+              <w:t>}</w:t>
             </w:r>
           </w:p>
         </w:tc>
@@ -1677,8 +2675,10 @@
                 <w:sz w:val="18"/>
                 <w:szCs w:val="18"/>
               </w:rPr>
-              <w:t>{d.activityNotes[i+1].actionedDate}</w:t>
-            </w:r>
+              <w:t>{</w:t>
+            </w:r>
+            <w:proofErr w:type="spellStart"/>
+            <w:proofErr w:type="gramStart"/>
             <w:r>
               <w:rPr>
                 <w:rFonts w:ascii="BC Sans" w:eastAsia="Times New Roman" w:hAnsi="BC Sans" w:cs="Times New Roman"/>
@@ -1686,7 +2686,111 @@
                 <w:sz w:val="18"/>
                 <w:szCs w:val="18"/>
               </w:rPr>
-              <w:t xml:space="preserve"> {d.activityNotes[i+1].actionedTime}</w:t>
+              <w:t>d.activityNotes</w:t>
+            </w:r>
+            <w:proofErr w:type="spellEnd"/>
+            <w:proofErr w:type="gramEnd"/>
+            <w:r>
+              <w:rPr>
+                <w:rFonts w:ascii="BC Sans" w:eastAsia="Times New Roman" w:hAnsi="BC Sans" w:cs="Times New Roman"/>
+                <w:color w:val="000000" w:themeColor="text1"/>
+                <w:sz w:val="18"/>
+                <w:szCs w:val="18"/>
+              </w:rPr>
+              <w:t>[i+1</w:t>
+            </w:r>
+            <w:proofErr w:type="gramStart"/>
+            <w:r>
+              <w:rPr>
+                <w:rFonts w:ascii="BC Sans" w:eastAsia="Times New Roman" w:hAnsi="BC Sans" w:cs="Times New Roman"/>
+                <w:color w:val="000000" w:themeColor="text1"/>
+                <w:sz w:val="18"/>
+                <w:szCs w:val="18"/>
+              </w:rPr>
+              <w:t>].</w:t>
+            </w:r>
+            <w:proofErr w:type="spellStart"/>
+            <w:r>
+              <w:rPr>
+                <w:rFonts w:ascii="BC Sans" w:eastAsia="Times New Roman" w:hAnsi="BC Sans" w:cs="Times New Roman"/>
+                <w:color w:val="000000" w:themeColor="text1"/>
+                <w:sz w:val="18"/>
+                <w:szCs w:val="18"/>
+              </w:rPr>
+              <w:t>actionedDate</w:t>
+            </w:r>
+            <w:proofErr w:type="spellEnd"/>
+            <w:proofErr w:type="gramEnd"/>
+            <w:r>
+              <w:rPr>
+                <w:rFonts w:ascii="BC Sans" w:eastAsia="Times New Roman" w:hAnsi="BC Sans" w:cs="Times New Roman"/>
+                <w:color w:val="000000" w:themeColor="text1"/>
+                <w:sz w:val="18"/>
+                <w:szCs w:val="18"/>
+              </w:rPr>
+              <w:t>}</w:t>
+            </w:r>
+            <w:r>
+              <w:rPr>
+                <w:rFonts w:ascii="BC Sans" w:eastAsia="Times New Roman" w:hAnsi="BC Sans" w:cs="Times New Roman"/>
+                <w:color w:val="000000" w:themeColor="text1"/>
+                <w:sz w:val="18"/>
+                <w:szCs w:val="18"/>
+              </w:rPr>
+              <w:t xml:space="preserve"> {</w:t>
+            </w:r>
+            <w:proofErr w:type="spellStart"/>
+            <w:proofErr w:type="gramStart"/>
+            <w:r>
+              <w:rPr>
+                <w:rFonts w:ascii="BC Sans" w:eastAsia="Times New Roman" w:hAnsi="BC Sans" w:cs="Times New Roman"/>
+                <w:color w:val="000000" w:themeColor="text1"/>
+                <w:sz w:val="18"/>
+                <w:szCs w:val="18"/>
+              </w:rPr>
+              <w:t>d.activityNotes</w:t>
+            </w:r>
+            <w:proofErr w:type="spellEnd"/>
+            <w:proofErr w:type="gramEnd"/>
+            <w:r>
+              <w:rPr>
+                <w:rFonts w:ascii="BC Sans" w:eastAsia="Times New Roman" w:hAnsi="BC Sans" w:cs="Times New Roman"/>
+                <w:color w:val="000000" w:themeColor="text1"/>
+                <w:sz w:val="18"/>
+                <w:szCs w:val="18"/>
+              </w:rPr>
+              <w:t>[i+1</w:t>
+            </w:r>
+            <w:proofErr w:type="gramStart"/>
+            <w:r>
+              <w:rPr>
+                <w:rFonts w:ascii="BC Sans" w:eastAsia="Times New Roman" w:hAnsi="BC Sans" w:cs="Times New Roman"/>
+                <w:color w:val="000000" w:themeColor="text1"/>
+                <w:sz w:val="18"/>
+                <w:szCs w:val="18"/>
+              </w:rPr>
+              <w:t>].</w:t>
+            </w:r>
+            <w:proofErr w:type="spellStart"/>
+            <w:r>
+              <w:rPr>
+                <w:rFonts w:ascii="BC Sans" w:eastAsia="Times New Roman" w:hAnsi="BC Sans" w:cs="Times New Roman"/>
+                <w:color w:val="000000" w:themeColor="text1"/>
+                <w:sz w:val="18"/>
+                <w:szCs w:val="18"/>
+              </w:rPr>
+              <w:t>actionedTime</w:t>
+            </w:r>
+            <w:proofErr w:type="spellEnd"/>
+            <w:proofErr w:type="gramEnd"/>
+            <w:r>
+              <w:rPr>
+                <w:rFonts w:ascii="BC Sans" w:eastAsia="Times New Roman" w:hAnsi="BC Sans" w:cs="Times New Roman"/>
+                <w:color w:val="000000" w:themeColor="text1"/>
+                <w:sz w:val="18"/>
+                <w:szCs w:val="18"/>
+              </w:rPr>
+              <w:t>}</w:t>
             </w:r>
           </w:p>
         </w:tc>
@@ -1714,7 +2818,29 @@
                 <w:sz w:val="18"/>
                 <w:szCs w:val="18"/>
               </w:rPr>
-              <w:t>{d.activityNotes[i+1].</w:t>
+              <w:t>{</w:t>
+            </w:r>
+            <w:proofErr w:type="spellStart"/>
+            <w:proofErr w:type="gramStart"/>
+            <w:r>
+              <w:rPr>
+                <w:rFonts w:ascii="BC Sans" w:eastAsia="Times New Roman" w:hAnsi="BC Sans" w:cs="Times New Roman"/>
+                <w:color w:val="000000" w:themeColor="text1"/>
+                <w:sz w:val="18"/>
+                <w:szCs w:val="18"/>
+              </w:rPr>
+              <w:t>d.activityNotes</w:t>
+            </w:r>
+            <w:proofErr w:type="spellEnd"/>
+            <w:proofErr w:type="gramEnd"/>
+            <w:r>
+              <w:rPr>
+                <w:rFonts w:ascii="BC Sans" w:eastAsia="Times New Roman" w:hAnsi="BC Sans" w:cs="Times New Roman"/>
+                <w:color w:val="000000" w:themeColor="text1"/>
+                <w:sz w:val="18"/>
+                <w:szCs w:val="18"/>
+              </w:rPr>
+              <w:t>[i+1].</w:t>
             </w:r>
             <w:r>
               <w:rPr>
@@ -1727,6 +2853,7 @@
               </w:rPr>
               <w:t xml:space="preserve"> </w:t>
             </w:r>
+            <w:proofErr w:type="spellStart"/>
             <w:r>
               <w:rPr>
                 <w:rFonts w:ascii="BC Sans" w:eastAsia="Times New Roman" w:hAnsi="BC Sans" w:cs="Times New Roman"/>
@@ -1743,7 +2870,48 @@
                 <w:sz w:val="18"/>
                 <w:szCs w:val="18"/>
               </w:rPr>
-              <w:t>.lastName}, {d.activityNotes[i+1].</w:t>
+              <w:t>.</w:t>
+            </w:r>
+            <w:proofErr w:type="gramStart"/>
+            <w:r>
+              <w:rPr>
+                <w:rFonts w:ascii="BC Sans" w:eastAsia="Times New Roman" w:hAnsi="BC Sans" w:cs="Times New Roman"/>
+                <w:color w:val="000000" w:themeColor="text1"/>
+                <w:sz w:val="18"/>
+                <w:szCs w:val="18"/>
+              </w:rPr>
+              <w:t>lastName</w:t>
+            </w:r>
+            <w:proofErr w:type="spellEnd"/>
+            <w:r>
+              <w:rPr>
+                <w:rFonts w:ascii="BC Sans" w:eastAsia="Times New Roman" w:hAnsi="BC Sans" w:cs="Times New Roman"/>
+                <w:color w:val="000000" w:themeColor="text1"/>
+                <w:sz w:val="18"/>
+                <w:szCs w:val="18"/>
+              </w:rPr>
+              <w:t>}, {</w:t>
+            </w:r>
+            <w:proofErr w:type="spellStart"/>
+            <w:r>
+              <w:rPr>
+                <w:rFonts w:ascii="BC Sans" w:eastAsia="Times New Roman" w:hAnsi="BC Sans" w:cs="Times New Roman"/>
+                <w:color w:val="000000" w:themeColor="text1"/>
+                <w:sz w:val="18"/>
+                <w:szCs w:val="18"/>
+              </w:rPr>
+              <w:t>d.activityNotes</w:t>
+            </w:r>
+            <w:proofErr w:type="spellEnd"/>
+            <w:proofErr w:type="gramEnd"/>
+            <w:r>
+              <w:rPr>
+                <w:rFonts w:ascii="BC Sans" w:eastAsia="Times New Roman" w:hAnsi="BC Sans" w:cs="Times New Roman"/>
+                <w:color w:val="000000" w:themeColor="text1"/>
+                <w:sz w:val="18"/>
+                <w:szCs w:val="18"/>
+              </w:rPr>
+              <w:t>[i+1].</w:t>
             </w:r>
             <w:r>
               <w:rPr>
@@ -1756,6 +2924,7 @@
               </w:rPr>
               <w:t xml:space="preserve"> </w:t>
             </w:r>
+            <w:proofErr w:type="spellStart"/>
             <w:r>
               <w:rPr>
                 <w:rFonts w:ascii="BC Sans" w:eastAsia="Times New Roman" w:hAnsi="BC Sans" w:cs="Times New Roman"/>
@@ -1772,7 +2941,17 @@
                 <w:sz w:val="18"/>
                 <w:szCs w:val="18"/>
               </w:rPr>
-              <w:t>.firstName}</w:t>
+              <w:t>.firstName</w:t>
+            </w:r>
+            <w:proofErr w:type="spellEnd"/>
+            <w:r>
+              <w:rPr>
+                <w:rFonts w:ascii="BC Sans" w:eastAsia="Times New Roman" w:hAnsi="BC Sans" w:cs="Times New Roman"/>
+                <w:color w:val="000000" w:themeColor="text1"/>
+                <w:sz w:val="18"/>
+                <w:szCs w:val="18"/>
+              </w:rPr>
+              <w:t>}</w:t>
             </w:r>
           </w:p>
         </w:tc>
@@ -1793,7 +2972,17 @@
           <w:sz w:val="20"/>
           <w:szCs w:val="20"/>
         </w:rPr>
-        <w:t>{d.</w:t>
+        <w:t>{</w:t>
+      </w:r>
+      <w:proofErr w:type="spellStart"/>
+      <w:proofErr w:type="gramStart"/>
+      <w:r>
+        <w:rPr>
+          <w:rFonts w:ascii="BC Sans" w:hAnsi="BC Sans"/>
+          <w:sz w:val="20"/>
+          <w:szCs w:val="20"/>
+        </w:rPr>
+        <w:t>d.</w:t>
       </w:r>
       <w:r>
         <w:rPr>
@@ -1803,13 +2992,23 @@
         </w:rPr>
         <w:t>hasActivityNotes</w:t>
       </w:r>
+      <w:proofErr w:type="gramEnd"/>
       <w:r>
         <w:rPr>
           <w:rFonts w:ascii="BC Sans" w:hAnsi="BC Sans"/>
           <w:sz w:val="20"/>
           <w:szCs w:val="20"/>
         </w:rPr>
-        <w:t>:showEnd}</w:t>
+        <w:t>:showEnd</w:t>
+      </w:r>
+      <w:proofErr w:type="spellEnd"/>
+      <w:r>
+        <w:rPr>
+          <w:rFonts w:ascii="BC Sans" w:hAnsi="BC Sans"/>
+          <w:sz w:val="20"/>
+          <w:szCs w:val="20"/>
+        </w:rPr>
+        <w:t>}</w:t>
       </w:r>
     </w:p>
     <w:tbl>
@@ -1863,7 +3062,71 @@
                 <w:sz w:val="20"/>
                 <w:szCs w:val="20"/>
               </w:rPr>
-              <w:t>Exhibit #{d.exhibits[i].exhibitNumber}</w:t>
+              <w:t>Exhibit #{</w:t>
+            </w:r>
+            <w:proofErr w:type="gramStart"/>
+            <w:r>
+              <w:rPr>
+                <w:rFonts w:ascii="BC Sans" w:hAnsi="BC Sans"/>
+                <w:b/>
+                <w:bCs/>
+                <w:sz w:val="20"/>
+                <w:szCs w:val="20"/>
+              </w:rPr>
+              <w:t>d.exhibits</w:t>
+            </w:r>
+            <w:proofErr w:type="gramEnd"/>
+            <w:r>
+              <w:rPr>
+                <w:rFonts w:ascii="BC Sans" w:hAnsi="BC Sans"/>
+                <w:b/>
+                <w:bCs/>
+                <w:sz w:val="20"/>
+                <w:szCs w:val="20"/>
+              </w:rPr>
+              <w:t>[i</w:t>
+            </w:r>
+            <w:proofErr w:type="gramStart"/>
+            <w:r>
+              <w:rPr>
+                <w:rFonts w:ascii="BC Sans" w:hAnsi="BC Sans"/>
+                <w:b/>
+                <w:bCs/>
+                <w:sz w:val="20"/>
+                <w:szCs w:val="20"/>
+              </w:rPr>
+              <w:t>].exhibit</w:t>
+            </w:r>
+            <w:r>
+              <w:rPr>
+                <w:rFonts w:ascii="BC Sans" w:hAnsi="BC Sans"/>
+                <w:b/>
+                <w:bCs/>
+                <w:sz w:val="20"/>
+                <w:szCs w:val="20"/>
+              </w:rPr>
+              <w:t>Display</w:t>
+            </w:r>
+            <w:r>
+              <w:rPr>
+                <w:rFonts w:ascii="BC Sans" w:hAnsi="BC Sans"/>
+                <w:b/>
+                <w:bCs/>
+                <w:sz w:val="20"/>
+                <w:szCs w:val="20"/>
+              </w:rPr>
+              <w:t>Number</w:t>
+            </w:r>
+            <w:proofErr w:type="gramEnd"/>
+            <w:r>
+              <w:rPr>
+                <w:rFonts w:ascii="BC Sans" w:hAnsi="BC Sans"/>
+                <w:b/>
+                <w:bCs/>
+                <w:sz w:val="20"/>
+                <w:szCs w:val="20"/>
+              </w:rPr>
+              <w:t>}</w:t>
             </w:r>
           </w:p>
         </w:tc>
@@ -1901,7 +3164,7 @@
                 <w:szCs w:val="20"/>
                 <w:lang w:val="en-CA"/>
               </w:rPr>
-              <w:t>Description</w:t>
+              <w:t>Property type</w:t>
             </w:r>
           </w:p>
         </w:tc>
@@ -1915,7 +3178,6 @@
               <w:right w:val="nil"/>
             </w:tcBorders>
             <w:shd w:val="clear" w:color="auto" w:fill="F2F2F2"/>
-            <w:hideMark/>
           </w:tcPr>
           <w:p>
             <w:pPr>
@@ -1934,7 +3196,718 @@
                 <w:szCs w:val="20"/>
                 <w:lang w:val="en-CA"/>
               </w:rPr>
-              <w:t>{d.exhibits[i].description}</w:t>
+              <w:t>{</w:t>
+            </w:r>
+            <w:proofErr w:type="spellStart"/>
+            <w:proofErr w:type="gramStart"/>
+            <w:r>
+              <w:rPr>
+                <w:rFonts w:ascii="BC Sans" w:hAnsi="BC Sans"/>
+                <w:sz w:val="20"/>
+                <w:szCs w:val="20"/>
+                <w:lang w:val="en-CA"/>
+              </w:rPr>
+              <w:t>d.exhibits</w:t>
+            </w:r>
+            <w:proofErr w:type="spellEnd"/>
+            <w:proofErr w:type="gramEnd"/>
+            <w:r>
+              <w:rPr>
+                <w:rFonts w:ascii="BC Sans" w:hAnsi="BC Sans"/>
+                <w:sz w:val="20"/>
+                <w:szCs w:val="20"/>
+                <w:lang w:val="en-CA"/>
+              </w:rPr>
+              <w:t>[</w:t>
+            </w:r>
+            <w:proofErr w:type="spellStart"/>
+            <w:r>
+              <w:rPr>
+                <w:rFonts w:ascii="BC Sans" w:hAnsi="BC Sans"/>
+                <w:sz w:val="20"/>
+                <w:szCs w:val="20"/>
+                <w:lang w:val="en-CA"/>
+              </w:rPr>
+              <w:t>i</w:t>
+            </w:r>
+            <w:proofErr w:type="spellEnd"/>
+            <w:proofErr w:type="gramStart"/>
+            <w:r>
+              <w:rPr>
+                <w:rFonts w:ascii="BC Sans" w:hAnsi="BC Sans"/>
+                <w:sz w:val="20"/>
+                <w:szCs w:val="20"/>
+                <w:lang w:val="en-CA"/>
+              </w:rPr>
+              <w:t>].</w:t>
+            </w:r>
+            <w:proofErr w:type="spellStart"/>
+            <w:r>
+              <w:rPr>
+                <w:rFonts w:ascii="BC Sans" w:hAnsi="BC Sans"/>
+                <w:sz w:val="20"/>
+                <w:szCs w:val="20"/>
+                <w:lang w:val="en-CA"/>
+              </w:rPr>
+              <w:t>propertyType</w:t>
+            </w:r>
+            <w:proofErr w:type="spellEnd"/>
+            <w:proofErr w:type="gramEnd"/>
+            <w:r>
+              <w:rPr>
+                <w:rFonts w:ascii="BC Sans" w:hAnsi="BC Sans"/>
+                <w:sz w:val="20"/>
+                <w:szCs w:val="20"/>
+                <w:lang w:val="en-CA"/>
+              </w:rPr>
+              <w:t>}</w:t>
+            </w:r>
+          </w:p>
+        </w:tc>
+      </w:tr>
+      <w:tr>
+        <w:trPr>
+          <w:trHeight w:val="300"/>
+        </w:trPr>
+        <w:tc>
+          <w:tcPr>
+            <w:tcW w:w="2700" w:type="dxa"/>
+            <w:tcBorders>
+              <w:top w:val="nil"/>
+              <w:left w:val="nil"/>
+              <w:bottom w:val="nil"/>
+              <w:right w:val="single" w:sz="6" w:space="0" w:color="7F7F7F"/>
+            </w:tcBorders>
+            <w:shd w:val="clear" w:color="auto" w:fill="FFFFFF" w:themeFill="background1"/>
+          </w:tcPr>
+          <w:p>
+            <w:pPr>
+              <w:spacing w:after="0"/>
+              <w:rPr>
+                <w:rFonts w:ascii="BC Sans" w:hAnsi="BC Sans"/>
+                <w:sz w:val="20"/>
+                <w:szCs w:val="20"/>
+                <w:lang w:val="en-CA"/>
+              </w:rPr>
+            </w:pPr>
+            <w:r>
+              <w:rPr>
+                <w:rFonts w:ascii="BC Sans" w:hAnsi="BC Sans"/>
+                <w:sz w:val="20"/>
+                <w:szCs w:val="20"/>
+                <w:lang w:val="en-CA"/>
+              </w:rPr>
+              <w:t>Item description</w:t>
+            </w:r>
+          </w:p>
+        </w:tc>
+        <w:tc>
+          <w:tcPr>
+            <w:tcW w:w="8100" w:type="dxa"/>
+            <w:tcBorders>
+              <w:top w:val="nil"/>
+              <w:left w:val="nil"/>
+              <w:bottom w:val="nil"/>
+              <w:right w:val="nil"/>
+            </w:tcBorders>
+            <w:shd w:val="clear" w:color="auto" w:fill="FFFFFF" w:themeFill="background1"/>
+          </w:tcPr>
+          <w:p>
+            <w:pPr>
+              <w:spacing w:after="0"/>
+              <w:rPr>
+                <w:rFonts w:ascii="BC Sans" w:hAnsi="BC Sans"/>
+                <w:sz w:val="20"/>
+                <w:szCs w:val="20"/>
+                <w:lang w:val="en-CA"/>
+              </w:rPr>
+            </w:pPr>
+            <w:r>
+              <w:rPr>
+                <w:rFonts w:ascii="BC Sans" w:hAnsi="BC Sans"/>
+                <w:sz w:val="20"/>
+                <w:szCs w:val="20"/>
+                <w:lang w:val="en-CA"/>
+              </w:rPr>
+              <w:t>{</w:t>
+            </w:r>
+            <w:proofErr w:type="spellStart"/>
+            <w:proofErr w:type="gramStart"/>
+            <w:r>
+              <w:rPr>
+                <w:rFonts w:ascii="BC Sans" w:hAnsi="BC Sans"/>
+                <w:sz w:val="20"/>
+                <w:szCs w:val="20"/>
+                <w:lang w:val="en-CA"/>
+              </w:rPr>
+              <w:t>d.exhibits</w:t>
+            </w:r>
+            <w:proofErr w:type="spellEnd"/>
+            <w:proofErr w:type="gramEnd"/>
+            <w:r>
+              <w:rPr>
+                <w:rFonts w:ascii="BC Sans" w:hAnsi="BC Sans"/>
+                <w:sz w:val="20"/>
+                <w:szCs w:val="20"/>
+                <w:lang w:val="en-CA"/>
+              </w:rPr>
+              <w:t>[</w:t>
+            </w:r>
+            <w:proofErr w:type="spellStart"/>
+            <w:r>
+              <w:rPr>
+                <w:rFonts w:ascii="BC Sans" w:hAnsi="BC Sans"/>
+                <w:sz w:val="20"/>
+                <w:szCs w:val="20"/>
+                <w:lang w:val="en-CA"/>
+              </w:rPr>
+              <w:t>i</w:t>
+            </w:r>
+            <w:proofErr w:type="spellEnd"/>
+            <w:proofErr w:type="gramStart"/>
+            <w:r>
+              <w:rPr>
+                <w:rFonts w:ascii="BC Sans" w:hAnsi="BC Sans"/>
+                <w:sz w:val="20"/>
+                <w:szCs w:val="20"/>
+                <w:lang w:val="en-CA"/>
+              </w:rPr>
+              <w:t>].description</w:t>
+            </w:r>
+            <w:proofErr w:type="gramEnd"/>
+            <w:r>
+              <w:rPr>
+                <w:rFonts w:ascii="BC Sans" w:hAnsi="BC Sans"/>
+                <w:sz w:val="20"/>
+                <w:szCs w:val="20"/>
+                <w:lang w:val="en-CA"/>
+              </w:rPr>
+              <w:t>}</w:t>
+            </w:r>
+          </w:p>
+        </w:tc>
+      </w:tr>
+      <w:tr>
+        <w:trPr>
+          <w:trHeight w:val="300"/>
+        </w:trPr>
+        <w:tc>
+          <w:tcPr>
+            <w:tcW w:w="2700" w:type="dxa"/>
+            <w:tcBorders>
+              <w:top w:val="nil"/>
+              <w:left w:val="nil"/>
+              <w:bottom w:val="nil"/>
+              <w:right w:val="single" w:sz="6" w:space="0" w:color="7F7F7F"/>
+            </w:tcBorders>
+            <w:shd w:val="clear" w:color="auto" w:fill="F2F2F2"/>
+          </w:tcPr>
+          <w:p>
+            <w:pPr>
+              <w:spacing w:after="0"/>
+              <w:rPr>
+                <w:rFonts w:ascii="BC Sans" w:hAnsi="BC Sans"/>
+                <w:sz w:val="20"/>
+                <w:szCs w:val="20"/>
+                <w:lang w:val="en-CA"/>
+              </w:rPr>
+            </w:pPr>
+            <w:r>
+              <w:rPr>
+                <w:rFonts w:ascii="BC Sans" w:hAnsi="BC Sans"/>
+                <w:sz w:val="20"/>
+                <w:szCs w:val="20"/>
+                <w:lang w:val="en-CA"/>
+              </w:rPr>
+              <w:t>Quantity</w:t>
+            </w:r>
+          </w:p>
+        </w:tc>
+        <w:tc>
+          <w:tcPr>
+            <w:tcW w:w="8100" w:type="dxa"/>
+            <w:tcBorders>
+              <w:top w:val="nil"/>
+              <w:left w:val="nil"/>
+              <w:bottom w:val="nil"/>
+              <w:right w:val="nil"/>
+            </w:tcBorders>
+            <w:shd w:val="clear" w:color="auto" w:fill="F2F2F2"/>
+          </w:tcPr>
+          <w:p>
+            <w:pPr>
+              <w:spacing w:after="0"/>
+              <w:rPr>
+                <w:rFonts w:ascii="BC Sans" w:hAnsi="BC Sans"/>
+                <w:sz w:val="20"/>
+                <w:szCs w:val="20"/>
+                <w:lang w:val="en-CA"/>
+              </w:rPr>
+            </w:pPr>
+            <w:r>
+              <w:rPr>
+                <w:rFonts w:ascii="BC Sans" w:hAnsi="BC Sans"/>
+                <w:sz w:val="20"/>
+                <w:szCs w:val="20"/>
+                <w:lang w:val="en-CA"/>
+              </w:rPr>
+              <w:t>{</w:t>
+            </w:r>
+            <w:proofErr w:type="spellStart"/>
+            <w:proofErr w:type="gramStart"/>
+            <w:r>
+              <w:rPr>
+                <w:rFonts w:ascii="BC Sans" w:hAnsi="BC Sans"/>
+                <w:sz w:val="20"/>
+                <w:szCs w:val="20"/>
+                <w:lang w:val="en-CA"/>
+              </w:rPr>
+              <w:t>d.exhibits</w:t>
+            </w:r>
+            <w:proofErr w:type="spellEnd"/>
+            <w:proofErr w:type="gramEnd"/>
+            <w:r>
+              <w:rPr>
+                <w:rFonts w:ascii="BC Sans" w:hAnsi="BC Sans"/>
+                <w:sz w:val="20"/>
+                <w:szCs w:val="20"/>
+                <w:lang w:val="en-CA"/>
+              </w:rPr>
+              <w:t>[</w:t>
+            </w:r>
+            <w:proofErr w:type="spellStart"/>
+            <w:r>
+              <w:rPr>
+                <w:rFonts w:ascii="BC Sans" w:hAnsi="BC Sans"/>
+                <w:sz w:val="20"/>
+                <w:szCs w:val="20"/>
+                <w:lang w:val="en-CA"/>
+              </w:rPr>
+              <w:t>i</w:t>
+            </w:r>
+            <w:proofErr w:type="spellEnd"/>
+            <w:proofErr w:type="gramStart"/>
+            <w:r>
+              <w:rPr>
+                <w:rFonts w:ascii="BC Sans" w:hAnsi="BC Sans"/>
+                <w:sz w:val="20"/>
+                <w:szCs w:val="20"/>
+                <w:lang w:val="en-CA"/>
+              </w:rPr>
+              <w:t>].quantity</w:t>
+            </w:r>
+            <w:proofErr w:type="gramEnd"/>
+            <w:r>
+              <w:rPr>
+                <w:rFonts w:ascii="BC Sans" w:hAnsi="BC Sans"/>
+                <w:sz w:val="20"/>
+                <w:szCs w:val="20"/>
+                <w:lang w:val="en-CA"/>
+              </w:rPr>
+              <w:t>}</w:t>
+            </w:r>
+          </w:p>
+        </w:tc>
+      </w:tr>
+      <w:tr>
+        <w:trPr>
+          <w:trHeight w:val="300"/>
+        </w:trPr>
+        <w:tc>
+          <w:tcPr>
+            <w:tcW w:w="2700" w:type="dxa"/>
+            <w:tcBorders>
+              <w:top w:val="nil"/>
+              <w:left w:val="nil"/>
+              <w:bottom w:val="nil"/>
+              <w:right w:val="single" w:sz="6" w:space="0" w:color="7F7F7F"/>
+            </w:tcBorders>
+            <w:shd w:val="clear" w:color="auto" w:fill="FFFFFF" w:themeFill="background1"/>
+          </w:tcPr>
+          <w:p>
+            <w:pPr>
+              <w:spacing w:after="0"/>
+              <w:rPr>
+                <w:rFonts w:ascii="BC Sans" w:hAnsi="BC Sans"/>
+                <w:sz w:val="20"/>
+                <w:szCs w:val="20"/>
+                <w:lang w:val="en-CA"/>
+              </w:rPr>
+            </w:pPr>
+            <w:r>
+              <w:rPr>
+                <w:rFonts w:ascii="BC Sans" w:hAnsi="BC Sans"/>
+                <w:sz w:val="20"/>
+                <w:szCs w:val="20"/>
+                <w:lang w:val="en-CA"/>
+              </w:rPr>
+              <w:t>Officer</w:t>
+            </w:r>
+          </w:p>
+        </w:tc>
+        <w:tc>
+          <w:tcPr>
+            <w:tcW w:w="8100" w:type="dxa"/>
+            <w:tcBorders>
+              <w:top w:val="nil"/>
+              <w:left w:val="nil"/>
+              <w:bottom w:val="nil"/>
+              <w:right w:val="nil"/>
+            </w:tcBorders>
+            <w:shd w:val="clear" w:color="auto" w:fill="FFFFFF" w:themeFill="background1"/>
+          </w:tcPr>
+          <w:p>
+            <w:pPr>
+              <w:spacing w:after="0"/>
+              <w:rPr>
+                <w:rFonts w:ascii="BC Sans" w:hAnsi="BC Sans"/>
+                <w:sz w:val="20"/>
+                <w:szCs w:val="20"/>
+                <w:lang w:val="en-CA"/>
+              </w:rPr>
+            </w:pPr>
+            <w:r>
+              <w:rPr>
+                <w:rFonts w:ascii="BC Sans" w:hAnsi="BC Sans"/>
+                <w:sz w:val="20"/>
+                <w:szCs w:val="20"/>
+                <w:lang w:val="en-CA"/>
+              </w:rPr>
+              <w:t>{</w:t>
+            </w:r>
+            <w:proofErr w:type="spellStart"/>
+            <w:proofErr w:type="gramStart"/>
+            <w:r>
+              <w:rPr>
+                <w:rFonts w:ascii="BC Sans" w:hAnsi="BC Sans"/>
+                <w:sz w:val="20"/>
+                <w:szCs w:val="20"/>
+                <w:lang w:val="en-CA"/>
+              </w:rPr>
+              <w:t>d.exhibits</w:t>
+            </w:r>
+            <w:proofErr w:type="spellEnd"/>
+            <w:proofErr w:type="gramEnd"/>
+            <w:r>
+              <w:rPr>
+                <w:rFonts w:ascii="BC Sans" w:hAnsi="BC Sans"/>
+                <w:sz w:val="20"/>
+                <w:szCs w:val="20"/>
+                <w:lang w:val="en-CA"/>
+              </w:rPr>
+              <w:t>[</w:t>
+            </w:r>
+            <w:proofErr w:type="spellStart"/>
+            <w:r>
+              <w:rPr>
+                <w:rFonts w:ascii="BC Sans" w:hAnsi="BC Sans"/>
+                <w:sz w:val="20"/>
+                <w:szCs w:val="20"/>
+                <w:lang w:val="en-CA"/>
+              </w:rPr>
+              <w:t>i</w:t>
+            </w:r>
+            <w:proofErr w:type="spellEnd"/>
+            <w:proofErr w:type="gramStart"/>
+            <w:r>
+              <w:rPr>
+                <w:rFonts w:ascii="BC Sans" w:hAnsi="BC Sans"/>
+                <w:sz w:val="20"/>
+                <w:szCs w:val="20"/>
+                <w:lang w:val="en-CA"/>
+              </w:rPr>
+              <w:t>].</w:t>
+            </w:r>
+            <w:proofErr w:type="spellStart"/>
+            <w:r>
+              <w:rPr>
+                <w:rFonts w:ascii="BC Sans" w:hAnsi="BC Sans"/>
+                <w:sz w:val="20"/>
+                <w:szCs w:val="20"/>
+                <w:lang w:val="en-CA"/>
+              </w:rPr>
+              <w:t>collectedBy.lastName</w:t>
+            </w:r>
+            <w:proofErr w:type="spellEnd"/>
+            <w:proofErr w:type="gramEnd"/>
+            <w:r>
+              <w:rPr>
+                <w:rFonts w:ascii="BC Sans" w:hAnsi="BC Sans"/>
+                <w:sz w:val="20"/>
+                <w:szCs w:val="20"/>
+                <w:lang w:val="en-CA"/>
+              </w:rPr>
+              <w:t>}, {</w:t>
+            </w:r>
+            <w:proofErr w:type="spellStart"/>
+            <w:proofErr w:type="gramStart"/>
+            <w:r>
+              <w:rPr>
+                <w:rFonts w:ascii="BC Sans" w:hAnsi="BC Sans"/>
+                <w:sz w:val="20"/>
+                <w:szCs w:val="20"/>
+                <w:lang w:val="en-CA"/>
+              </w:rPr>
+              <w:t>d.exhibits</w:t>
+            </w:r>
+            <w:proofErr w:type="spellEnd"/>
+            <w:proofErr w:type="gramEnd"/>
+            <w:r>
+              <w:rPr>
+                <w:rFonts w:ascii="BC Sans" w:hAnsi="BC Sans"/>
+                <w:sz w:val="20"/>
+                <w:szCs w:val="20"/>
+                <w:lang w:val="en-CA"/>
+              </w:rPr>
+              <w:t>[</w:t>
+            </w:r>
+            <w:proofErr w:type="spellStart"/>
+            <w:r>
+              <w:rPr>
+                <w:rFonts w:ascii="BC Sans" w:hAnsi="BC Sans"/>
+                <w:sz w:val="20"/>
+                <w:szCs w:val="20"/>
+                <w:lang w:val="en-CA"/>
+              </w:rPr>
+              <w:t>i</w:t>
+            </w:r>
+            <w:proofErr w:type="spellEnd"/>
+            <w:proofErr w:type="gramStart"/>
+            <w:r>
+              <w:rPr>
+                <w:rFonts w:ascii="BC Sans" w:hAnsi="BC Sans"/>
+                <w:sz w:val="20"/>
+                <w:szCs w:val="20"/>
+                <w:lang w:val="en-CA"/>
+              </w:rPr>
+              <w:t>].</w:t>
+            </w:r>
+            <w:proofErr w:type="spellStart"/>
+            <w:r>
+              <w:rPr>
+                <w:rFonts w:ascii="BC Sans" w:hAnsi="BC Sans"/>
+                <w:sz w:val="20"/>
+                <w:szCs w:val="20"/>
+                <w:lang w:val="en-CA"/>
+              </w:rPr>
+              <w:t>collectedBy.firstName</w:t>
+            </w:r>
+            <w:proofErr w:type="spellEnd"/>
+            <w:proofErr w:type="gramEnd"/>
+            <w:r>
+              <w:rPr>
+                <w:rFonts w:ascii="BC Sans" w:hAnsi="BC Sans"/>
+                <w:sz w:val="20"/>
+                <w:szCs w:val="20"/>
+                <w:lang w:val="en-CA"/>
+              </w:rPr>
+              <w:t>}</w:t>
+            </w:r>
+          </w:p>
+        </w:tc>
+      </w:tr>
+      <w:tr>
+        <w:trPr>
+          <w:trHeight w:val="300"/>
+        </w:trPr>
+        <w:tc>
+          <w:tcPr>
+            <w:tcW w:w="2700" w:type="dxa"/>
+            <w:tcBorders>
+              <w:top w:val="nil"/>
+              <w:left w:val="nil"/>
+              <w:bottom w:val="nil"/>
+              <w:right w:val="single" w:sz="6" w:space="0" w:color="7F7F7F"/>
+            </w:tcBorders>
+            <w:shd w:val="clear" w:color="auto" w:fill="F2F2F2"/>
+          </w:tcPr>
+          <w:p>
+            <w:pPr>
+              <w:spacing w:after="0"/>
+              <w:rPr>
+                <w:rFonts w:ascii="BC Sans" w:hAnsi="BC Sans"/>
+                <w:sz w:val="20"/>
+                <w:szCs w:val="20"/>
+                <w:lang w:val="en-CA"/>
+              </w:rPr>
+            </w:pPr>
+            <w:r>
+              <w:rPr>
+                <w:rFonts w:ascii="BC Sans" w:hAnsi="BC Sans"/>
+                <w:sz w:val="20"/>
+                <w:szCs w:val="20"/>
+                <w:lang w:val="en-CA"/>
+              </w:rPr>
+              <w:t>Date/time of intake</w:t>
+            </w:r>
+          </w:p>
+        </w:tc>
+        <w:tc>
+          <w:tcPr>
+            <w:tcW w:w="8100" w:type="dxa"/>
+            <w:tcBorders>
+              <w:top w:val="nil"/>
+              <w:left w:val="nil"/>
+              <w:bottom w:val="nil"/>
+              <w:right w:val="nil"/>
+            </w:tcBorders>
+            <w:shd w:val="clear" w:color="auto" w:fill="F2F2F2"/>
+          </w:tcPr>
+          <w:p>
+            <w:pPr>
+              <w:spacing w:after="0"/>
+              <w:rPr>
+                <w:rFonts w:ascii="BC Sans" w:hAnsi="BC Sans"/>
+                <w:sz w:val="20"/>
+                <w:szCs w:val="20"/>
+                <w:lang w:val="en-CA"/>
+              </w:rPr>
+            </w:pPr>
+            <w:r>
+              <w:rPr>
+                <w:rFonts w:ascii="BC Sans" w:hAnsi="BC Sans"/>
+                <w:sz w:val="20"/>
+                <w:szCs w:val="20"/>
+                <w:lang w:val="en-CA"/>
+              </w:rPr>
+              <w:t>{</w:t>
+            </w:r>
+            <w:proofErr w:type="spellStart"/>
+            <w:proofErr w:type="gramStart"/>
+            <w:r>
+              <w:rPr>
+                <w:rFonts w:ascii="BC Sans" w:hAnsi="BC Sans"/>
+                <w:sz w:val="20"/>
+                <w:szCs w:val="20"/>
+                <w:lang w:val="en-CA"/>
+              </w:rPr>
+              <w:t>d.exhibits</w:t>
+            </w:r>
+            <w:proofErr w:type="spellEnd"/>
+            <w:proofErr w:type="gramEnd"/>
+            <w:r>
+              <w:rPr>
+                <w:rFonts w:ascii="BC Sans" w:hAnsi="BC Sans"/>
+                <w:sz w:val="20"/>
+                <w:szCs w:val="20"/>
+                <w:lang w:val="en-CA"/>
+              </w:rPr>
+              <w:t>[</w:t>
+            </w:r>
+            <w:proofErr w:type="spellStart"/>
+            <w:r>
+              <w:rPr>
+                <w:rFonts w:ascii="BC Sans" w:hAnsi="BC Sans"/>
+                <w:sz w:val="20"/>
+                <w:szCs w:val="20"/>
+                <w:lang w:val="en-CA"/>
+              </w:rPr>
+              <w:t>i</w:t>
+            </w:r>
+            <w:proofErr w:type="spellEnd"/>
+            <w:proofErr w:type="gramStart"/>
+            <w:r>
+              <w:rPr>
+                <w:rFonts w:ascii="BC Sans" w:hAnsi="BC Sans"/>
+                <w:sz w:val="20"/>
+                <w:szCs w:val="20"/>
+                <w:lang w:val="en-CA"/>
+              </w:rPr>
+              <w:t>].</w:t>
+            </w:r>
+            <w:proofErr w:type="spellStart"/>
+            <w:r>
+              <w:rPr>
+                <w:rFonts w:ascii="BC Sans" w:hAnsi="BC Sans"/>
+                <w:sz w:val="20"/>
+                <w:szCs w:val="20"/>
+                <w:lang w:val="en-CA"/>
+              </w:rPr>
+              <w:t>dateCollected</w:t>
+            </w:r>
+            <w:proofErr w:type="spellEnd"/>
+            <w:proofErr w:type="gramEnd"/>
+            <w:r>
+              <w:rPr>
+                <w:rFonts w:ascii="BC Sans" w:hAnsi="BC Sans"/>
+                <w:sz w:val="20"/>
+                <w:szCs w:val="20"/>
+                <w:lang w:val="en-CA"/>
+              </w:rPr>
+              <w:t>}</w:t>
+            </w:r>
+            <w:r>
+              <w:rPr>
+                <w:rFonts w:ascii="BC Sans" w:hAnsi="BC Sans"/>
+                <w:sz w:val="20"/>
+                <w:szCs w:val="20"/>
+                <w:lang w:val="en-CA"/>
+              </w:rPr>
+              <w:t xml:space="preserve"> {</w:t>
+            </w:r>
+            <w:proofErr w:type="spellStart"/>
+            <w:proofErr w:type="gramStart"/>
+            <w:r>
+              <w:rPr>
+                <w:rFonts w:ascii="BC Sans" w:hAnsi="BC Sans"/>
+                <w:sz w:val="20"/>
+                <w:szCs w:val="20"/>
+                <w:lang w:val="en-CA"/>
+              </w:rPr>
+              <w:t>d.exhibits</w:t>
+            </w:r>
+            <w:proofErr w:type="spellEnd"/>
+            <w:proofErr w:type="gramEnd"/>
+            <w:r>
+              <w:rPr>
+                <w:rFonts w:ascii="BC Sans" w:hAnsi="BC Sans"/>
+                <w:sz w:val="20"/>
+                <w:szCs w:val="20"/>
+                <w:lang w:val="en-CA"/>
+              </w:rPr>
+              <w:t>[</w:t>
+            </w:r>
+            <w:proofErr w:type="spellStart"/>
+            <w:r>
+              <w:rPr>
+                <w:rFonts w:ascii="BC Sans" w:hAnsi="BC Sans"/>
+                <w:sz w:val="20"/>
+                <w:szCs w:val="20"/>
+                <w:lang w:val="en-CA"/>
+              </w:rPr>
+              <w:t>i</w:t>
+            </w:r>
+            <w:proofErr w:type="spellEnd"/>
+            <w:proofErr w:type="gramStart"/>
+            <w:r>
+              <w:rPr>
+                <w:rFonts w:ascii="BC Sans" w:hAnsi="BC Sans"/>
+                <w:sz w:val="20"/>
+                <w:szCs w:val="20"/>
+                <w:lang w:val="en-CA"/>
+              </w:rPr>
+              <w:t>].</w:t>
+            </w:r>
+            <w:proofErr w:type="spellStart"/>
+            <w:r>
+              <w:rPr>
+                <w:rFonts w:ascii="BC Sans" w:hAnsi="BC Sans"/>
+                <w:sz w:val="20"/>
+                <w:szCs w:val="20"/>
+                <w:lang w:val="en-CA"/>
+              </w:rPr>
+              <w:t>intakeTime</w:t>
+            </w:r>
+            <w:proofErr w:type="spellEnd"/>
+            <w:proofErr w:type="gramEnd"/>
+            <w:r>
+              <w:rPr>
+                <w:rFonts w:ascii="BC Sans" w:hAnsi="BC Sans"/>
+                <w:sz w:val="20"/>
+                <w:szCs w:val="20"/>
+                <w:lang w:val="en-CA"/>
+              </w:rPr>
+              <w:t xml:space="preserve"> }</w:t>
             </w:r>
           </w:p>
         </w:tc>
@@ -1971,7 +3944,7 @@
                 <w:szCs w:val="20"/>
                 <w:lang w:val="en-CA"/>
               </w:rPr>
-              <w:t>Date collected</w:t>
+              <w:t>Location of intake</w:t>
             </w:r>
           </w:p>
         </w:tc>
@@ -2003,7 +3976,71 @@
                 <w:szCs w:val="20"/>
                 <w:lang w:val="en-CA"/>
               </w:rPr>
-              <w:t>{d.exhibits[i].dateCollected}</w:t>
+              <w:t>{</w:t>
+            </w:r>
+            <w:proofErr w:type="spellStart"/>
+            <w:proofErr w:type="gramStart"/>
+            <w:r>
+              <w:rPr>
+                <w:rFonts w:ascii="BC Sans" w:hAnsi="BC Sans"/>
+                <w:sz w:val="20"/>
+                <w:szCs w:val="20"/>
+                <w:lang w:val="en-CA"/>
+              </w:rPr>
+              <w:t>d.exhibits</w:t>
+            </w:r>
+            <w:proofErr w:type="spellEnd"/>
+            <w:proofErr w:type="gramEnd"/>
+            <w:r>
+              <w:rPr>
+                <w:rFonts w:ascii="BC Sans" w:hAnsi="BC Sans"/>
+                <w:sz w:val="20"/>
+                <w:szCs w:val="20"/>
+                <w:lang w:val="en-CA"/>
+              </w:rPr>
+              <w:t>[</w:t>
+            </w:r>
+            <w:proofErr w:type="spellStart"/>
+            <w:r>
+              <w:rPr>
+                <w:rFonts w:ascii="BC Sans" w:hAnsi="BC Sans"/>
+                <w:sz w:val="20"/>
+                <w:szCs w:val="20"/>
+                <w:lang w:val="en-CA"/>
+              </w:rPr>
+              <w:t>i</w:t>
+            </w:r>
+            <w:proofErr w:type="spellEnd"/>
+            <w:proofErr w:type="gramStart"/>
+            <w:r>
+              <w:rPr>
+                <w:rFonts w:ascii="BC Sans" w:hAnsi="BC Sans"/>
+                <w:sz w:val="20"/>
+                <w:szCs w:val="20"/>
+                <w:lang w:val="en-CA"/>
+              </w:rPr>
+              <w:t>].</w:t>
+            </w:r>
+            <w:proofErr w:type="spellStart"/>
+            <w:r>
+              <w:rPr>
+                <w:rFonts w:ascii="BC Sans" w:hAnsi="BC Sans"/>
+                <w:sz w:val="20"/>
+                <w:szCs w:val="20"/>
+                <w:lang w:val="en-CA"/>
+              </w:rPr>
+              <w:t>locationOfIntake</w:t>
+            </w:r>
+            <w:proofErr w:type="spellEnd"/>
+            <w:proofErr w:type="gramEnd"/>
+            <w:r>
+              <w:rPr>
+                <w:rFonts w:ascii="BC Sans" w:hAnsi="BC Sans"/>
+                <w:sz w:val="20"/>
+                <w:szCs w:val="20"/>
+                <w:lang w:val="en-CA"/>
+              </w:rPr>
+              <w:t>}</w:t>
             </w:r>
           </w:p>
         </w:tc>
@@ -2041,7 +4078,7 @@
                 <w:szCs w:val="20"/>
                 <w:lang w:val="en-CA"/>
               </w:rPr>
-              <w:t>Officer collected</w:t>
+              <w:t>Property tag number</w:t>
             </w:r>
           </w:p>
         </w:tc>
@@ -2055,7 +4092,6 @@
               <w:right w:val="nil"/>
             </w:tcBorders>
             <w:shd w:val="clear" w:color="auto" w:fill="F2F2F2"/>
-            <w:hideMark/>
           </w:tcPr>
           <w:p>
             <w:pPr>
@@ -2074,7 +4110,746 @@
                 <w:szCs w:val="20"/>
                 <w:lang w:val="en-CA"/>
               </w:rPr>
-              <w:t>{d.exhibits[i].collectedBy.lastName}, {d.exhibits[i].collectedBy.firstName}</w:t>
+              <w:t>{</w:t>
+            </w:r>
+            <w:proofErr w:type="gramStart"/>
+            <w:r>
+              <w:rPr>
+                <w:rFonts w:ascii="BC Sans" w:hAnsi="BC Sans"/>
+                <w:sz w:val="20"/>
+                <w:szCs w:val="20"/>
+                <w:lang w:val="en-CA"/>
+              </w:rPr>
+              <w:t>d.exhibits</w:t>
+            </w:r>
+            <w:proofErr w:type="gramEnd"/>
+            <w:r>
+              <w:rPr>
+                <w:rFonts w:ascii="BC Sans" w:hAnsi="BC Sans"/>
+                <w:sz w:val="20"/>
+                <w:szCs w:val="20"/>
+                <w:lang w:val="en-CA"/>
+              </w:rPr>
+              <w:t>[i</w:t>
+            </w:r>
+            <w:proofErr w:type="gramStart"/>
+            <w:r>
+              <w:rPr>
+                <w:rFonts w:ascii="BC Sans" w:hAnsi="BC Sans"/>
+                <w:sz w:val="20"/>
+                <w:szCs w:val="20"/>
+                <w:lang w:val="en-CA"/>
+              </w:rPr>
+              <w:t>].propertyTagNumber</w:t>
+            </w:r>
+            <w:proofErr w:type="gramEnd"/>
+            <w:r>
+              <w:rPr>
+                <w:rFonts w:ascii="BC Sans" w:hAnsi="BC Sans"/>
+                <w:sz w:val="20"/>
+                <w:szCs w:val="20"/>
+                <w:lang w:val="en-CA"/>
+              </w:rPr>
+              <w:t>}</w:t>
+            </w:r>
+            <w:r>
+              <w:rPr>
+                <w:rFonts w:ascii="BC Sans" w:hAnsi="BC Sans"/>
+                <w:sz w:val="20"/>
+                <w:szCs w:val="20"/>
+                <w:lang w:val="en-CA"/>
+              </w:rPr>
+              <w:t>{</w:t>
+            </w:r>
+            <w:proofErr w:type="gramStart"/>
+            <w:r>
+              <w:rPr>
+                <w:rFonts w:ascii="BC Sans" w:hAnsi="BC Sans"/>
+                <w:sz w:val="20"/>
+                <w:szCs w:val="20"/>
+                <w:lang w:val="en-CA"/>
+              </w:rPr>
+              <w:t>d.</w:t>
+            </w:r>
+            <w:r>
+              <w:rPr>
+                <w:rFonts w:ascii="BC Sans" w:hAnsi="BC Sans"/>
+                <w:sz w:val="20"/>
+                <w:szCs w:val="20"/>
+                <w:lang w:val="en-CA"/>
+              </w:rPr>
+              <w:t>exhibits</w:t>
+            </w:r>
+            <w:proofErr w:type="gramEnd"/>
+            <w:r>
+              <w:rPr>
+                <w:rFonts w:ascii="BC Sans" w:hAnsi="BC Sans"/>
+                <w:sz w:val="20"/>
+                <w:szCs w:val="20"/>
+                <w:lang w:val="en-CA"/>
+              </w:rPr>
+              <w:t>[i</w:t>
+            </w:r>
+            <w:proofErr w:type="gramStart"/>
+            <w:r>
+              <w:rPr>
+                <w:rFonts w:ascii="BC Sans" w:hAnsi="BC Sans"/>
+                <w:sz w:val="20"/>
+                <w:szCs w:val="20"/>
+                <w:lang w:val="en-CA"/>
+              </w:rPr>
+              <w:t>].</w:t>
+            </w:r>
+            <w:r>
+              <w:rPr>
+                <w:rFonts w:ascii="BC Sans" w:hAnsi="BC Sans"/>
+                <w:sz w:val="20"/>
+                <w:szCs w:val="20"/>
+                <w:lang w:val="en-CA"/>
+              </w:rPr>
+              <w:t>isSeized</w:t>
+            </w:r>
+            <w:proofErr w:type="gramEnd"/>
+            <w:r>
+              <w:rPr>
+                <w:rFonts w:ascii="BC Sans" w:hAnsi="BC Sans"/>
+                <w:sz w:val="20"/>
+                <w:szCs w:val="20"/>
+                <w:lang w:val="en-CA"/>
+              </w:rPr>
+              <w:t>:ifE</w:t>
+            </w:r>
+            <w:r>
+              <w:rPr>
+                <w:rFonts w:ascii="BC Sans" w:hAnsi="BC Sans"/>
+                <w:sz w:val="20"/>
+                <w:szCs w:val="20"/>
+                <w:lang w:val="en-CA"/>
+              </w:rPr>
+              <w:t>Q(false</w:t>
+            </w:r>
+            <w:proofErr w:type="gramStart"/>
+            <w:r>
+              <w:rPr>
+                <w:rFonts w:ascii="BC Sans" w:hAnsi="BC Sans"/>
+                <w:sz w:val="20"/>
+                <w:szCs w:val="20"/>
+                <w:lang w:val="en-CA"/>
+              </w:rPr>
+              <w:t>)</w:t>
+            </w:r>
+            <w:r>
+              <w:rPr>
+                <w:rFonts w:ascii="BC Sans" w:hAnsi="BC Sans"/>
+                <w:sz w:val="20"/>
+                <w:szCs w:val="20"/>
+                <w:lang w:val="en-CA"/>
+              </w:rPr>
+              <w:t>:hideBegin</w:t>
+            </w:r>
+            <w:proofErr w:type="gramEnd"/>
+            <w:r>
+              <w:rPr>
+                <w:rFonts w:ascii="BC Sans" w:hAnsi="BC Sans"/>
+                <w:sz w:val="20"/>
+                <w:szCs w:val="20"/>
+                <w:lang w:val="en-CA"/>
+              </w:rPr>
+              <w:t>}</w:t>
+            </w:r>
+          </w:p>
+        </w:tc>
+      </w:tr>
+      <w:tr>
+        <w:trPr>
+          <w:trHeight w:val="300"/>
+        </w:trPr>
+        <w:tc>
+          <w:tcPr>
+            <w:tcW w:w="2700" w:type="dxa"/>
+            <w:tcBorders>
+              <w:top w:val="nil"/>
+              <w:left w:val="nil"/>
+              <w:bottom w:val="nil"/>
+              <w:right w:val="single" w:sz="6" w:space="0" w:color="7F7F7F"/>
+            </w:tcBorders>
+            <w:shd w:val="clear" w:color="auto" w:fill="FFFFFF" w:themeFill="background1"/>
+          </w:tcPr>
+          <w:p>
+            <w:pPr>
+              <w:spacing w:after="0"/>
+              <w:rPr>
+                <w:rFonts w:ascii="BC Sans" w:hAnsi="BC Sans"/>
+                <w:sz w:val="20"/>
+                <w:szCs w:val="20"/>
+                <w:lang w:val="en-CA"/>
+              </w:rPr>
+            </w:pPr>
+            <w:r>
+              <w:rPr>
+                <w:rFonts w:ascii="BC Sans" w:hAnsi="BC Sans"/>
+                <w:sz w:val="20"/>
+                <w:szCs w:val="20"/>
+                <w:lang w:val="en-CA"/>
+              </w:rPr>
+              <w:t>Seized from first name</w:t>
+            </w:r>
+          </w:p>
+        </w:tc>
+        <w:tc>
+          <w:tcPr>
+            <w:tcW w:w="8100" w:type="dxa"/>
+            <w:tcBorders>
+              <w:top w:val="nil"/>
+              <w:left w:val="nil"/>
+              <w:bottom w:val="nil"/>
+              <w:right w:val="nil"/>
+            </w:tcBorders>
+            <w:shd w:val="clear" w:color="auto" w:fill="FFFFFF" w:themeFill="background1"/>
+          </w:tcPr>
+          <w:p>
+            <w:pPr>
+              <w:spacing w:after="0"/>
+              <w:rPr>
+                <w:rFonts w:ascii="BC Sans" w:hAnsi="BC Sans"/>
+                <w:sz w:val="20"/>
+                <w:szCs w:val="20"/>
+                <w:lang w:val="en-CA"/>
+              </w:rPr>
+            </w:pPr>
+            <w:r>
+              <w:rPr>
+                <w:rFonts w:ascii="BC Sans" w:hAnsi="BC Sans"/>
+                <w:sz w:val="20"/>
+                <w:szCs w:val="20"/>
+                <w:lang w:val="en-CA"/>
+              </w:rPr>
+              <w:t>{</w:t>
+            </w:r>
+            <w:proofErr w:type="spellStart"/>
+            <w:proofErr w:type="gramStart"/>
+            <w:r>
+              <w:rPr>
+                <w:rFonts w:ascii="BC Sans" w:hAnsi="BC Sans"/>
+                <w:sz w:val="20"/>
+                <w:szCs w:val="20"/>
+                <w:lang w:val="en-CA"/>
+              </w:rPr>
+              <w:t>d.exhibits</w:t>
+            </w:r>
+            <w:proofErr w:type="spellEnd"/>
+            <w:proofErr w:type="gramEnd"/>
+            <w:r>
+              <w:rPr>
+                <w:rFonts w:ascii="BC Sans" w:hAnsi="BC Sans"/>
+                <w:sz w:val="20"/>
+                <w:szCs w:val="20"/>
+                <w:lang w:val="en-CA"/>
+              </w:rPr>
+              <w:t>[</w:t>
+            </w:r>
+            <w:proofErr w:type="spellStart"/>
+            <w:r>
+              <w:rPr>
+                <w:rFonts w:ascii="BC Sans" w:hAnsi="BC Sans"/>
+                <w:sz w:val="20"/>
+                <w:szCs w:val="20"/>
+                <w:lang w:val="en-CA"/>
+              </w:rPr>
+              <w:t>i</w:t>
+            </w:r>
+            <w:proofErr w:type="spellEnd"/>
+            <w:proofErr w:type="gramStart"/>
+            <w:r>
+              <w:rPr>
+                <w:rFonts w:ascii="BC Sans" w:hAnsi="BC Sans"/>
+                <w:sz w:val="20"/>
+                <w:szCs w:val="20"/>
+                <w:lang w:val="en-CA"/>
+              </w:rPr>
+              <w:t>].</w:t>
+            </w:r>
+            <w:proofErr w:type="spellStart"/>
+            <w:r>
+              <w:rPr>
+                <w:rFonts w:ascii="BC Sans" w:hAnsi="BC Sans"/>
+                <w:sz w:val="20"/>
+                <w:szCs w:val="20"/>
+                <w:lang w:val="en-CA"/>
+              </w:rPr>
+              <w:t>seizedFromFirstName</w:t>
+            </w:r>
+            <w:proofErr w:type="spellEnd"/>
+            <w:proofErr w:type="gramEnd"/>
+            <w:r>
+              <w:rPr>
+                <w:rFonts w:ascii="BC Sans" w:hAnsi="BC Sans"/>
+                <w:sz w:val="20"/>
+                <w:szCs w:val="20"/>
+                <w:lang w:val="en-CA"/>
+              </w:rPr>
+              <w:t>}</w:t>
+            </w:r>
+          </w:p>
+        </w:tc>
+      </w:tr>
+      <w:tr>
+        <w:trPr>
+          <w:trHeight w:val="300"/>
+        </w:trPr>
+        <w:tc>
+          <w:tcPr>
+            <w:tcW w:w="2700" w:type="dxa"/>
+            <w:tcBorders>
+              <w:top w:val="nil"/>
+              <w:left w:val="nil"/>
+              <w:bottom w:val="nil"/>
+              <w:right w:val="single" w:sz="6" w:space="0" w:color="7F7F7F"/>
+            </w:tcBorders>
+            <w:shd w:val="clear" w:color="auto" w:fill="F2F2F2"/>
+          </w:tcPr>
+          <w:p>
+            <w:pPr>
+              <w:spacing w:after="0"/>
+              <w:rPr>
+                <w:rFonts w:ascii="BC Sans" w:hAnsi="BC Sans"/>
+                <w:sz w:val="20"/>
+                <w:szCs w:val="20"/>
+                <w:lang w:val="en-CA"/>
+              </w:rPr>
+            </w:pPr>
+            <w:r>
+              <w:rPr>
+                <w:rFonts w:ascii="BC Sans" w:hAnsi="BC Sans"/>
+                <w:sz w:val="20"/>
+                <w:szCs w:val="20"/>
+                <w:lang w:val="en-CA"/>
+              </w:rPr>
+              <w:t>Seized from last name</w:t>
+            </w:r>
+          </w:p>
+        </w:tc>
+        <w:tc>
+          <w:tcPr>
+            <w:tcW w:w="8100" w:type="dxa"/>
+            <w:tcBorders>
+              <w:top w:val="nil"/>
+              <w:left w:val="nil"/>
+              <w:bottom w:val="nil"/>
+              <w:right w:val="nil"/>
+            </w:tcBorders>
+            <w:shd w:val="clear" w:color="auto" w:fill="F2F2F2"/>
+          </w:tcPr>
+          <w:p>
+            <w:pPr>
+              <w:spacing w:after="0"/>
+              <w:rPr>
+                <w:rFonts w:ascii="BC Sans" w:hAnsi="BC Sans"/>
+                <w:sz w:val="20"/>
+                <w:szCs w:val="20"/>
+                <w:lang w:val="en-CA"/>
+              </w:rPr>
+            </w:pPr>
+            <w:r>
+              <w:rPr>
+                <w:rFonts w:ascii="BC Sans" w:hAnsi="BC Sans"/>
+                <w:sz w:val="20"/>
+                <w:szCs w:val="20"/>
+                <w:lang w:val="en-CA"/>
+              </w:rPr>
+              <w:t>{</w:t>
+            </w:r>
+            <w:proofErr w:type="spellStart"/>
+            <w:proofErr w:type="gramStart"/>
+            <w:r>
+              <w:rPr>
+                <w:rFonts w:ascii="BC Sans" w:hAnsi="BC Sans"/>
+                <w:sz w:val="20"/>
+                <w:szCs w:val="20"/>
+                <w:lang w:val="en-CA"/>
+              </w:rPr>
+              <w:t>d.exhibits</w:t>
+            </w:r>
+            <w:proofErr w:type="spellEnd"/>
+            <w:proofErr w:type="gramEnd"/>
+            <w:r>
+              <w:rPr>
+                <w:rFonts w:ascii="BC Sans" w:hAnsi="BC Sans"/>
+                <w:sz w:val="20"/>
+                <w:szCs w:val="20"/>
+                <w:lang w:val="en-CA"/>
+              </w:rPr>
+              <w:t>[</w:t>
+            </w:r>
+            <w:proofErr w:type="spellStart"/>
+            <w:r>
+              <w:rPr>
+                <w:rFonts w:ascii="BC Sans" w:hAnsi="BC Sans"/>
+                <w:sz w:val="20"/>
+                <w:szCs w:val="20"/>
+                <w:lang w:val="en-CA"/>
+              </w:rPr>
+              <w:t>i</w:t>
+            </w:r>
+            <w:proofErr w:type="spellEnd"/>
+            <w:proofErr w:type="gramStart"/>
+            <w:r>
+              <w:rPr>
+                <w:rFonts w:ascii="BC Sans" w:hAnsi="BC Sans"/>
+                <w:sz w:val="20"/>
+                <w:szCs w:val="20"/>
+                <w:lang w:val="en-CA"/>
+              </w:rPr>
+              <w:t>].</w:t>
+            </w:r>
+            <w:proofErr w:type="spellStart"/>
+            <w:r>
+              <w:rPr>
+                <w:rFonts w:ascii="BC Sans" w:hAnsi="BC Sans"/>
+                <w:sz w:val="20"/>
+                <w:szCs w:val="20"/>
+                <w:lang w:val="en-CA"/>
+              </w:rPr>
+              <w:t>seizedFromLastName</w:t>
+            </w:r>
+            <w:proofErr w:type="spellEnd"/>
+            <w:proofErr w:type="gramEnd"/>
+            <w:r>
+              <w:rPr>
+                <w:rFonts w:ascii="BC Sans" w:hAnsi="BC Sans"/>
+                <w:sz w:val="20"/>
+                <w:szCs w:val="20"/>
+                <w:lang w:val="en-CA"/>
+              </w:rPr>
+              <w:t>}</w:t>
+            </w:r>
+          </w:p>
+        </w:tc>
+      </w:tr>
+      <w:tr>
+        <w:trPr>
+          <w:trHeight w:val="300"/>
+        </w:trPr>
+        <w:tc>
+          <w:tcPr>
+            <w:tcW w:w="2700" w:type="dxa"/>
+            <w:tcBorders>
+              <w:top w:val="nil"/>
+              <w:left w:val="nil"/>
+              <w:bottom w:val="nil"/>
+              <w:right w:val="single" w:sz="6" w:space="0" w:color="7F7F7F"/>
+            </w:tcBorders>
+            <w:shd w:val="clear" w:color="auto" w:fill="FFFFFF" w:themeFill="background1"/>
+          </w:tcPr>
+          <w:p>
+            <w:pPr>
+              <w:spacing w:after="0"/>
+              <w:rPr>
+                <w:rFonts w:ascii="BC Sans" w:hAnsi="BC Sans"/>
+                <w:sz w:val="20"/>
+                <w:szCs w:val="20"/>
+                <w:lang w:val="en-CA"/>
+              </w:rPr>
+            </w:pPr>
+            <w:r>
+              <w:rPr>
+                <w:rFonts w:ascii="BC Sans" w:hAnsi="BC Sans"/>
+                <w:sz w:val="20"/>
+                <w:szCs w:val="20"/>
+                <w:lang w:val="en-CA"/>
+              </w:rPr>
+              <w:lastRenderedPageBreak/>
+              <w:t>Seized from address</w:t>
+            </w:r>
+          </w:p>
+        </w:tc>
+        <w:tc>
+          <w:tcPr>
+            <w:tcW w:w="8100" w:type="dxa"/>
+            <w:tcBorders>
+              <w:top w:val="nil"/>
+              <w:left w:val="nil"/>
+              <w:bottom w:val="nil"/>
+              <w:right w:val="nil"/>
+            </w:tcBorders>
+            <w:shd w:val="clear" w:color="auto" w:fill="FFFFFF" w:themeFill="background1"/>
+          </w:tcPr>
+          <w:p>
+            <w:pPr>
+              <w:spacing w:after="0"/>
+              <w:rPr>
+                <w:rFonts w:ascii="BC Sans" w:hAnsi="BC Sans"/>
+                <w:sz w:val="20"/>
+                <w:szCs w:val="20"/>
+                <w:lang w:val="en-CA"/>
+              </w:rPr>
+            </w:pPr>
+            <w:r>
+              <w:rPr>
+                <w:rFonts w:ascii="BC Sans" w:hAnsi="BC Sans"/>
+                <w:sz w:val="20"/>
+                <w:szCs w:val="20"/>
+                <w:lang w:val="en-CA"/>
+              </w:rPr>
+              <w:t>{</w:t>
+            </w:r>
+            <w:proofErr w:type="spellStart"/>
+            <w:proofErr w:type="gramStart"/>
+            <w:r>
+              <w:rPr>
+                <w:rFonts w:ascii="BC Sans" w:hAnsi="BC Sans"/>
+                <w:sz w:val="20"/>
+                <w:szCs w:val="20"/>
+                <w:lang w:val="en-CA"/>
+              </w:rPr>
+              <w:t>d.exhibits</w:t>
+            </w:r>
+            <w:proofErr w:type="spellEnd"/>
+            <w:proofErr w:type="gramEnd"/>
+            <w:r>
+              <w:rPr>
+                <w:rFonts w:ascii="BC Sans" w:hAnsi="BC Sans"/>
+                <w:sz w:val="20"/>
+                <w:szCs w:val="20"/>
+                <w:lang w:val="en-CA"/>
+              </w:rPr>
+              <w:t>[</w:t>
+            </w:r>
+            <w:proofErr w:type="spellStart"/>
+            <w:r>
+              <w:rPr>
+                <w:rFonts w:ascii="BC Sans" w:hAnsi="BC Sans"/>
+                <w:sz w:val="20"/>
+                <w:szCs w:val="20"/>
+                <w:lang w:val="en-CA"/>
+              </w:rPr>
+              <w:t>i</w:t>
+            </w:r>
+            <w:proofErr w:type="spellEnd"/>
+            <w:proofErr w:type="gramStart"/>
+            <w:r>
+              <w:rPr>
+                <w:rFonts w:ascii="BC Sans" w:hAnsi="BC Sans"/>
+                <w:sz w:val="20"/>
+                <w:szCs w:val="20"/>
+                <w:lang w:val="en-CA"/>
+              </w:rPr>
+              <w:t>].</w:t>
+            </w:r>
+            <w:proofErr w:type="spellStart"/>
+            <w:r>
+              <w:rPr>
+                <w:rFonts w:ascii="BC Sans" w:hAnsi="BC Sans"/>
+                <w:sz w:val="20"/>
+                <w:szCs w:val="20"/>
+                <w:lang w:val="en-CA"/>
+              </w:rPr>
+              <w:t>seizedFromAddress</w:t>
+            </w:r>
+            <w:proofErr w:type="spellEnd"/>
+            <w:proofErr w:type="gramEnd"/>
+            <w:r>
+              <w:rPr>
+                <w:rFonts w:ascii="BC Sans" w:hAnsi="BC Sans"/>
+                <w:sz w:val="20"/>
+                <w:szCs w:val="20"/>
+                <w:lang w:val="en-CA"/>
+              </w:rPr>
+              <w:t>}</w:t>
+            </w:r>
+          </w:p>
+        </w:tc>
+      </w:tr>
+      <w:tr>
+        <w:trPr>
+          <w:trHeight w:val="300"/>
+        </w:trPr>
+        <w:tc>
+          <w:tcPr>
+            <w:tcW w:w="2700" w:type="dxa"/>
+            <w:tcBorders>
+              <w:top w:val="nil"/>
+              <w:left w:val="nil"/>
+              <w:bottom w:val="nil"/>
+              <w:right w:val="single" w:sz="6" w:space="0" w:color="7F7F7F"/>
+            </w:tcBorders>
+            <w:shd w:val="clear" w:color="auto" w:fill="F2F2F2"/>
+          </w:tcPr>
+          <w:p>
+            <w:pPr>
+              <w:spacing w:after="0"/>
+              <w:rPr>
+                <w:rFonts w:ascii="BC Sans" w:hAnsi="BC Sans"/>
+                <w:sz w:val="20"/>
+                <w:szCs w:val="20"/>
+                <w:lang w:val="en-CA"/>
+              </w:rPr>
+            </w:pPr>
+            <w:r>
+              <w:rPr>
+                <w:rFonts w:ascii="BC Sans" w:hAnsi="BC Sans"/>
+                <w:sz w:val="20"/>
+                <w:szCs w:val="20"/>
+                <w:lang w:val="en-CA"/>
+              </w:rPr>
+              <w:t>Seized from phone number</w:t>
+            </w:r>
+          </w:p>
+        </w:tc>
+        <w:tc>
+          <w:tcPr>
+            <w:tcW w:w="8100" w:type="dxa"/>
+            <w:tcBorders>
+              <w:top w:val="nil"/>
+              <w:left w:val="nil"/>
+              <w:bottom w:val="nil"/>
+              <w:right w:val="nil"/>
+            </w:tcBorders>
+            <w:shd w:val="clear" w:color="auto" w:fill="F2F2F2"/>
+          </w:tcPr>
+          <w:p>
+            <w:pPr>
+              <w:spacing w:after="0"/>
+              <w:rPr>
+                <w:rFonts w:ascii="BC Sans" w:hAnsi="BC Sans"/>
+                <w:sz w:val="20"/>
+                <w:szCs w:val="20"/>
+                <w:lang w:val="en-CA"/>
+              </w:rPr>
+            </w:pPr>
+            <w:r>
+              <w:rPr>
+                <w:rFonts w:ascii="BC Sans" w:hAnsi="BC Sans"/>
+                <w:sz w:val="20"/>
+                <w:szCs w:val="20"/>
+                <w:lang w:val="en-CA"/>
+              </w:rPr>
+              <w:t>{</w:t>
+            </w:r>
+            <w:proofErr w:type="gramStart"/>
+            <w:r>
+              <w:rPr>
+                <w:rFonts w:ascii="BC Sans" w:hAnsi="BC Sans"/>
+                <w:sz w:val="20"/>
+                <w:szCs w:val="20"/>
+                <w:lang w:val="en-CA"/>
+              </w:rPr>
+              <w:t>d.exhibits</w:t>
+            </w:r>
+            <w:proofErr w:type="gramEnd"/>
+            <w:r>
+              <w:rPr>
+                <w:rFonts w:ascii="BC Sans" w:hAnsi="BC Sans"/>
+                <w:sz w:val="20"/>
+                <w:szCs w:val="20"/>
+                <w:lang w:val="en-CA"/>
+              </w:rPr>
+              <w:t>[i</w:t>
+            </w:r>
+            <w:proofErr w:type="gramStart"/>
+            <w:r>
+              <w:rPr>
+                <w:rFonts w:ascii="BC Sans" w:hAnsi="BC Sans"/>
+                <w:sz w:val="20"/>
+                <w:szCs w:val="20"/>
+                <w:lang w:val="en-CA"/>
+              </w:rPr>
+              <w:t>].seizedFromPhoneNumber</w:t>
+            </w:r>
+            <w:proofErr w:type="gramEnd"/>
+            <w:r>
+              <w:rPr>
+                <w:rFonts w:ascii="BC Sans" w:hAnsi="BC Sans"/>
+                <w:sz w:val="20"/>
+                <w:szCs w:val="20"/>
+                <w:lang w:val="en-CA"/>
+              </w:rPr>
+              <w:t>}</w:t>
+            </w:r>
+            <w:r>
+              <w:rPr>
+                <w:rFonts w:ascii="BC Sans" w:hAnsi="BC Sans"/>
+                <w:sz w:val="20"/>
+                <w:szCs w:val="20"/>
+                <w:lang w:val="en-CA"/>
+              </w:rPr>
+              <w:t>{</w:t>
+            </w:r>
+            <w:proofErr w:type="gramStart"/>
+            <w:r>
+              <w:rPr>
+                <w:rFonts w:ascii="BC Sans" w:hAnsi="BC Sans"/>
+                <w:sz w:val="20"/>
+                <w:szCs w:val="20"/>
+                <w:lang w:val="en-CA"/>
+              </w:rPr>
+              <w:t>d.</w:t>
+            </w:r>
+            <w:r>
+              <w:rPr>
+                <w:rFonts w:ascii="BC Sans" w:hAnsi="BC Sans"/>
+                <w:sz w:val="20"/>
+                <w:szCs w:val="20"/>
+                <w:lang w:val="en-CA"/>
+              </w:rPr>
+              <w:t>exhibits</w:t>
+            </w:r>
+            <w:proofErr w:type="gramEnd"/>
+            <w:r>
+              <w:rPr>
+                <w:rFonts w:ascii="BC Sans" w:hAnsi="BC Sans"/>
+                <w:sz w:val="20"/>
+                <w:szCs w:val="20"/>
+                <w:lang w:val="en-CA"/>
+              </w:rPr>
+              <w:t>[i</w:t>
+            </w:r>
+            <w:proofErr w:type="gramStart"/>
+            <w:r>
+              <w:rPr>
+                <w:rFonts w:ascii="BC Sans" w:hAnsi="BC Sans"/>
+                <w:sz w:val="20"/>
+                <w:szCs w:val="20"/>
+                <w:lang w:val="en-CA"/>
+              </w:rPr>
+              <w:t>].</w:t>
+            </w:r>
+            <w:r>
+              <w:rPr>
+                <w:rFonts w:ascii="BC Sans" w:hAnsi="BC Sans"/>
+                <w:sz w:val="20"/>
+                <w:szCs w:val="20"/>
+                <w:lang w:val="en-CA"/>
+              </w:rPr>
+              <w:t>isSeized</w:t>
+            </w:r>
+            <w:proofErr w:type="gramEnd"/>
+            <w:r>
+              <w:rPr>
+                <w:rFonts w:ascii="BC Sans" w:hAnsi="BC Sans"/>
+                <w:sz w:val="20"/>
+                <w:szCs w:val="20"/>
+                <w:lang w:val="en-CA"/>
+              </w:rPr>
+              <w:t>:hid</w:t>
+            </w:r>
+            <w:r>
+              <w:rPr>
+                <w:rFonts w:ascii="BC Sans" w:hAnsi="BC Sans"/>
+                <w:sz w:val="20"/>
+                <w:szCs w:val="20"/>
+                <w:lang w:val="en-CA"/>
+              </w:rPr>
+              <w:t>eEnd</w:t>
+            </w:r>
+            <w:r>
+              <w:rPr>
+                <w:rFonts w:ascii="BC Sans" w:hAnsi="BC Sans"/>
+                <w:sz w:val="20"/>
+                <w:szCs w:val="20"/>
+                <w:lang w:val="en-CA"/>
+              </w:rPr>
+              <w:t>}</w:t>
             </w:r>
           </w:p>
         </w:tc>
@@ -2105,7 +4880,17 @@
           <w:sz w:val="20"/>
           <w:szCs w:val="20"/>
         </w:rPr>
-        <w:t>{d.</w:t>
+        <w:t>{</w:t>
+      </w:r>
+      <w:proofErr w:type="spellStart"/>
+      <w:proofErr w:type="gramStart"/>
+      <w:r>
+        <w:rPr>
+          <w:rFonts w:ascii="BC Sans" w:hAnsi="BC Sans"/>
+          <w:sz w:val="20"/>
+          <w:szCs w:val="20"/>
+        </w:rPr>
+        <w:t>d.</w:t>
       </w:r>
       <w:r>
         <w:rPr>
@@ -2115,13 +4900,24 @@
         </w:rPr>
         <w:t>exhibits</w:t>
       </w:r>
+      <w:proofErr w:type="spellEnd"/>
+      <w:proofErr w:type="gramEnd"/>
       <w:r>
         <w:rPr>
           <w:rFonts w:ascii="BC Sans" w:hAnsi="BC Sans"/>
           <w:sz w:val="20"/>
           <w:szCs w:val="20"/>
         </w:rPr>
-        <w:t>[i+1]</w:t>
+        <w:t>[i+1</w:t>
+      </w:r>
+      <w:proofErr w:type="gramStart"/>
+      <w:r>
+        <w:rPr>
+          <w:rFonts w:ascii="BC Sans" w:hAnsi="BC Sans"/>
+          <w:sz w:val="20"/>
+          <w:szCs w:val="20"/>
+        </w:rPr>
+        <w:t>]</w:t>
       </w:r>
       <w:r>
         <w:rPr>
@@ -2129,8 +4925,35 @@
           <w:sz w:val="20"/>
           <w:szCs w:val="20"/>
         </w:rPr>
-        <w:t>.exhibitNumber</w:t>
+        <w:t>.</w:t>
       </w:r>
+      <w:proofErr w:type="spellStart"/>
+      <w:r>
+        <w:rPr>
+          <w:rFonts w:ascii="BC Sans" w:hAnsi="BC Sans"/>
+          <w:sz w:val="20"/>
+          <w:szCs w:val="20"/>
+        </w:rPr>
+        <w:t>exhibit</w:t>
+      </w:r>
+      <w:r>
+        <w:rPr>
+          <w:rFonts w:ascii="BC Sans" w:hAnsi="BC Sans"/>
+          <w:sz w:val="20"/>
+          <w:szCs w:val="20"/>
+        </w:rPr>
+        <w:t>Display</w:t>
+      </w:r>
+      <w:r>
+        <w:rPr>
+          <w:rFonts w:ascii="BC Sans" w:hAnsi="BC Sans"/>
+          <w:sz w:val="20"/>
+          <w:szCs w:val="20"/>
+        </w:rPr>
+        <w:t>Number</w:t>
+      </w:r>
+      <w:proofErr w:type="spellEnd"/>
+      <w:proofErr w:type="gramEnd"/>
       <w:r>
         <w:rPr>
           <w:rFonts w:ascii="BC Sans" w:hAnsi="BC Sans"/>
@@ -2182,7 +5005,49 @@
                 <w:sz w:val="20"/>
                 <w:szCs w:val="20"/>
               </w:rPr>
-              <w:t>Attachment {d.attachments[i].</w:t>
+              <w:t>Attachment {</w:t>
+            </w:r>
+            <w:proofErr w:type="spellStart"/>
+            <w:proofErr w:type="gramStart"/>
+            <w:r>
+              <w:rPr>
+                <w:rFonts w:ascii="BC Sans" w:hAnsi="BC Sans"/>
+                <w:caps w:val="0"/>
+                <w:sz w:val="20"/>
+                <w:szCs w:val="20"/>
+              </w:rPr>
+              <w:t>d.attachments</w:t>
+            </w:r>
+            <w:proofErr w:type="spellEnd"/>
+            <w:proofErr w:type="gramEnd"/>
+            <w:r>
+              <w:rPr>
+                <w:rFonts w:ascii="BC Sans" w:hAnsi="BC Sans"/>
+                <w:caps w:val="0"/>
+                <w:sz w:val="20"/>
+                <w:szCs w:val="20"/>
+              </w:rPr>
+              <w:t>[</w:t>
+            </w:r>
+            <w:proofErr w:type="spellStart"/>
+            <w:r>
+              <w:rPr>
+                <w:rFonts w:ascii="BC Sans" w:hAnsi="BC Sans"/>
+                <w:caps w:val="0"/>
+                <w:sz w:val="20"/>
+                <w:szCs w:val="20"/>
+              </w:rPr>
+              <w:t>i</w:t>
+            </w:r>
+            <w:proofErr w:type="spellEnd"/>
+            <w:r>
+              <w:rPr>
+                <w:rFonts w:ascii="BC Sans" w:hAnsi="BC Sans"/>
+                <w:caps w:val="0"/>
+                <w:sz w:val="20"/>
+                <w:szCs w:val="20"/>
+              </w:rPr>
+              <w:t>].</w:t>
             </w:r>
             <w:r>
               <w:rPr>
@@ -2264,7 +5129,71 @@
                 <w:szCs w:val="20"/>
                 <w:lang w:val="en-CA"/>
               </w:rPr>
-              <w:t>{d.attachments[i].fileType}</w:t>
+              <w:t>{</w:t>
+            </w:r>
+            <w:proofErr w:type="spellStart"/>
+            <w:proofErr w:type="gramStart"/>
+            <w:r>
+              <w:rPr>
+                <w:rFonts w:ascii="BC Sans" w:hAnsi="BC Sans"/>
+                <w:sz w:val="20"/>
+                <w:szCs w:val="20"/>
+                <w:lang w:val="en-CA"/>
+              </w:rPr>
+              <w:t>d.attachments</w:t>
+            </w:r>
+            <w:proofErr w:type="spellEnd"/>
+            <w:proofErr w:type="gramEnd"/>
+            <w:r>
+              <w:rPr>
+                <w:rFonts w:ascii="BC Sans" w:hAnsi="BC Sans"/>
+                <w:sz w:val="20"/>
+                <w:szCs w:val="20"/>
+                <w:lang w:val="en-CA"/>
+              </w:rPr>
+              <w:t>[</w:t>
+            </w:r>
+            <w:proofErr w:type="spellStart"/>
+            <w:r>
+              <w:rPr>
+                <w:rFonts w:ascii="BC Sans" w:hAnsi="BC Sans"/>
+                <w:sz w:val="20"/>
+                <w:szCs w:val="20"/>
+                <w:lang w:val="en-CA"/>
+              </w:rPr>
+              <w:t>i</w:t>
+            </w:r>
+            <w:proofErr w:type="spellEnd"/>
+            <w:proofErr w:type="gramStart"/>
+            <w:r>
+              <w:rPr>
+                <w:rFonts w:ascii="BC Sans" w:hAnsi="BC Sans"/>
+                <w:sz w:val="20"/>
+                <w:szCs w:val="20"/>
+                <w:lang w:val="en-CA"/>
+              </w:rPr>
+              <w:t>].</w:t>
+            </w:r>
+            <w:proofErr w:type="spellStart"/>
+            <w:r>
+              <w:rPr>
+                <w:rFonts w:ascii="BC Sans" w:hAnsi="BC Sans"/>
+                <w:sz w:val="20"/>
+                <w:szCs w:val="20"/>
+                <w:lang w:val="en-CA"/>
+              </w:rPr>
+              <w:t>fileType</w:t>
+            </w:r>
+            <w:proofErr w:type="spellEnd"/>
+            <w:proofErr w:type="gramEnd"/>
+            <w:r>
+              <w:rPr>
+                <w:rFonts w:ascii="BC Sans" w:hAnsi="BC Sans"/>
+                <w:sz w:val="20"/>
+                <w:szCs w:val="20"/>
+                <w:lang w:val="en-CA"/>
+              </w:rPr>
+              <w:t>}</w:t>
             </w:r>
           </w:p>
         </w:tc>
@@ -2334,7 +5263,71 @@
                 <w:szCs w:val="20"/>
                 <w:lang w:val="en-CA"/>
               </w:rPr>
-              <w:t>{d.attachments[i].sequenceNumber}</w:t>
+              <w:t>{</w:t>
+            </w:r>
+            <w:proofErr w:type="spellStart"/>
+            <w:proofErr w:type="gramStart"/>
+            <w:r>
+              <w:rPr>
+                <w:rFonts w:ascii="BC Sans" w:hAnsi="BC Sans"/>
+                <w:sz w:val="20"/>
+                <w:szCs w:val="20"/>
+                <w:lang w:val="en-CA"/>
+              </w:rPr>
+              <w:t>d.attachments</w:t>
+            </w:r>
+            <w:proofErr w:type="spellEnd"/>
+            <w:proofErr w:type="gramEnd"/>
+            <w:r>
+              <w:rPr>
+                <w:rFonts w:ascii="BC Sans" w:hAnsi="BC Sans"/>
+                <w:sz w:val="20"/>
+                <w:szCs w:val="20"/>
+                <w:lang w:val="en-CA"/>
+              </w:rPr>
+              <w:t>[</w:t>
+            </w:r>
+            <w:proofErr w:type="spellStart"/>
+            <w:r>
+              <w:rPr>
+                <w:rFonts w:ascii="BC Sans" w:hAnsi="BC Sans"/>
+                <w:sz w:val="20"/>
+                <w:szCs w:val="20"/>
+                <w:lang w:val="en-CA"/>
+              </w:rPr>
+              <w:t>i</w:t>
+            </w:r>
+            <w:proofErr w:type="spellEnd"/>
+            <w:proofErr w:type="gramStart"/>
+            <w:r>
+              <w:rPr>
+                <w:rFonts w:ascii="BC Sans" w:hAnsi="BC Sans"/>
+                <w:sz w:val="20"/>
+                <w:szCs w:val="20"/>
+                <w:lang w:val="en-CA"/>
+              </w:rPr>
+              <w:t>].</w:t>
+            </w:r>
+            <w:proofErr w:type="spellStart"/>
+            <w:r>
+              <w:rPr>
+                <w:rFonts w:ascii="BC Sans" w:hAnsi="BC Sans"/>
+                <w:sz w:val="20"/>
+                <w:szCs w:val="20"/>
+                <w:lang w:val="en-CA"/>
+              </w:rPr>
+              <w:t>sequenceNumber</w:t>
+            </w:r>
+            <w:proofErr w:type="spellEnd"/>
+            <w:proofErr w:type="gramEnd"/>
+            <w:r>
+              <w:rPr>
+                <w:rFonts w:ascii="BC Sans" w:hAnsi="BC Sans"/>
+                <w:sz w:val="20"/>
+                <w:szCs w:val="20"/>
+                <w:lang w:val="en-CA"/>
+              </w:rPr>
+              <w:t>}</w:t>
             </w:r>
           </w:p>
         </w:tc>
@@ -2398,7 +5391,60 @@
                 <w:szCs w:val="20"/>
                 <w:lang w:val="en-CA"/>
               </w:rPr>
-              <w:t>{d.attachments[i].description}</w:t>
+              <w:t>{</w:t>
+            </w:r>
+            <w:proofErr w:type="spellStart"/>
+            <w:proofErr w:type="gramStart"/>
+            <w:r>
+              <w:rPr>
+                <w:rFonts w:ascii="BC Sans" w:hAnsi="BC Sans"/>
+                <w:sz w:val="20"/>
+                <w:szCs w:val="20"/>
+                <w:lang w:val="en-CA"/>
+              </w:rPr>
+              <w:t>d.attachments</w:t>
+            </w:r>
+            <w:proofErr w:type="spellEnd"/>
+            <w:proofErr w:type="gramEnd"/>
+            <w:r>
+              <w:rPr>
+                <w:rFonts w:ascii="BC Sans" w:hAnsi="BC Sans"/>
+                <w:sz w:val="20"/>
+                <w:szCs w:val="20"/>
+                <w:lang w:val="en-CA"/>
+              </w:rPr>
+              <w:t>[</w:t>
+            </w:r>
+            <w:proofErr w:type="spellStart"/>
+            <w:r>
+              <w:rPr>
+                <w:rFonts w:ascii="BC Sans" w:hAnsi="BC Sans"/>
+                <w:sz w:val="20"/>
+                <w:szCs w:val="20"/>
+                <w:lang w:val="en-CA"/>
+              </w:rPr>
+              <w:t>i</w:t>
+            </w:r>
+            <w:proofErr w:type="spellEnd"/>
+            <w:proofErr w:type="gramStart"/>
+            <w:r>
+              <w:rPr>
+                <w:rFonts w:ascii="BC Sans" w:hAnsi="BC Sans"/>
+                <w:sz w:val="20"/>
+                <w:szCs w:val="20"/>
+                <w:lang w:val="en-CA"/>
+              </w:rPr>
+              <w:t>].description</w:t>
+            </w:r>
+            <w:proofErr w:type="gramEnd"/>
+            <w:r>
+              <w:rPr>
+                <w:rFonts w:ascii="BC Sans" w:hAnsi="BC Sans"/>
+                <w:sz w:val="20"/>
+                <w:szCs w:val="20"/>
+                <w:lang w:val="en-CA"/>
+              </w:rPr>
+              <w:t>}</w:t>
             </w:r>
           </w:p>
         </w:tc>
@@ -2435,7 +5481,6 @@
                 <w:szCs w:val="20"/>
                 <w:lang w:val="en-CA"/>
               </w:rPr>
-              <w:lastRenderedPageBreak/>
               <w:t>Title</w:t>
             </w:r>
           </w:p>
@@ -2462,7 +5507,60 @@
                 <w:szCs w:val="20"/>
                 <w:lang w:val="en-CA"/>
               </w:rPr>
-              <w:t>{d.attachments[i].title}</w:t>
+              <w:t>{</w:t>
+            </w:r>
+            <w:proofErr w:type="spellStart"/>
+            <w:proofErr w:type="gramStart"/>
+            <w:r>
+              <w:rPr>
+                <w:rFonts w:ascii="BC Sans" w:hAnsi="BC Sans"/>
+                <w:sz w:val="20"/>
+                <w:szCs w:val="20"/>
+                <w:lang w:val="en-CA"/>
+              </w:rPr>
+              <w:t>d.attachments</w:t>
+            </w:r>
+            <w:proofErr w:type="spellEnd"/>
+            <w:proofErr w:type="gramEnd"/>
+            <w:r>
+              <w:rPr>
+                <w:rFonts w:ascii="BC Sans" w:hAnsi="BC Sans"/>
+                <w:sz w:val="20"/>
+                <w:szCs w:val="20"/>
+                <w:lang w:val="en-CA"/>
+              </w:rPr>
+              <w:t>[</w:t>
+            </w:r>
+            <w:proofErr w:type="spellStart"/>
+            <w:r>
+              <w:rPr>
+                <w:rFonts w:ascii="BC Sans" w:hAnsi="BC Sans"/>
+                <w:sz w:val="20"/>
+                <w:szCs w:val="20"/>
+                <w:lang w:val="en-CA"/>
+              </w:rPr>
+              <w:t>i</w:t>
+            </w:r>
+            <w:proofErr w:type="spellEnd"/>
+            <w:proofErr w:type="gramStart"/>
+            <w:r>
+              <w:rPr>
+                <w:rFonts w:ascii="BC Sans" w:hAnsi="BC Sans"/>
+                <w:sz w:val="20"/>
+                <w:szCs w:val="20"/>
+                <w:lang w:val="en-CA"/>
+              </w:rPr>
+              <w:t>].title</w:t>
+            </w:r>
+            <w:proofErr w:type="gramEnd"/>
+            <w:r>
+              <w:rPr>
+                <w:rFonts w:ascii="BC Sans" w:hAnsi="BC Sans"/>
+                <w:sz w:val="20"/>
+                <w:szCs w:val="20"/>
+                <w:lang w:val="en-CA"/>
+              </w:rPr>
+              <w:t>}</w:t>
             </w:r>
           </w:p>
         </w:tc>
@@ -2524,16 +5622,116 @@
                 <w:szCs w:val="20"/>
                 <w:lang w:val="en-CA"/>
               </w:rPr>
-              <w:t>{d.attachments[i].date}</w:t>
-            </w:r>
-            <w:r>
-              <w:rPr>
-                <w:rFonts w:ascii="BC Sans" w:hAnsi="BC Sans"/>
-                <w:sz w:val="20"/>
-                <w:szCs w:val="20"/>
-                <w:lang w:val="en-CA"/>
-              </w:rPr>
-              <w:t>{d.attachments[i].takenBy.lastName:ifEM:hideBegin}</w:t>
+              <w:t>{</w:t>
+            </w:r>
+            <w:proofErr w:type="gramStart"/>
+            <w:r>
+              <w:rPr>
+                <w:rFonts w:ascii="BC Sans" w:hAnsi="BC Sans"/>
+                <w:sz w:val="20"/>
+                <w:szCs w:val="20"/>
+                <w:lang w:val="en-CA"/>
+              </w:rPr>
+              <w:t>d.attachments</w:t>
+            </w:r>
+            <w:proofErr w:type="gramEnd"/>
+            <w:r>
+              <w:rPr>
+                <w:rFonts w:ascii="BC Sans" w:hAnsi="BC Sans"/>
+                <w:sz w:val="20"/>
+                <w:szCs w:val="20"/>
+                <w:lang w:val="en-CA"/>
+              </w:rPr>
+              <w:t>[i</w:t>
+            </w:r>
+            <w:proofErr w:type="gramStart"/>
+            <w:r>
+              <w:rPr>
+                <w:rFonts w:ascii="BC Sans" w:hAnsi="BC Sans"/>
+                <w:sz w:val="20"/>
+                <w:szCs w:val="20"/>
+                <w:lang w:val="en-CA"/>
+              </w:rPr>
+              <w:t>].date</w:t>
+            </w:r>
+            <w:proofErr w:type="gramEnd"/>
+            <w:r>
+              <w:rPr>
+                <w:rFonts w:ascii="BC Sans" w:hAnsi="BC Sans"/>
+                <w:sz w:val="20"/>
+                <w:szCs w:val="20"/>
+                <w:lang w:val="en-CA"/>
+              </w:rPr>
+              <w:t>}</w:t>
+            </w:r>
+            <w:r>
+              <w:rPr>
+                <w:rFonts w:ascii="BC Sans" w:hAnsi="BC Sans"/>
+                <w:sz w:val="20"/>
+                <w:szCs w:val="20"/>
+                <w:lang w:val="en-CA"/>
+              </w:rPr>
+              <w:t>{</w:t>
+            </w:r>
+            <w:proofErr w:type="gramStart"/>
+            <w:r>
+              <w:rPr>
+                <w:rFonts w:ascii="BC Sans" w:hAnsi="BC Sans"/>
+                <w:sz w:val="20"/>
+                <w:szCs w:val="20"/>
+                <w:lang w:val="en-CA"/>
+              </w:rPr>
+              <w:t>d.attachments</w:t>
+            </w:r>
+            <w:proofErr w:type="gramEnd"/>
+            <w:r>
+              <w:rPr>
+                <w:rFonts w:ascii="BC Sans" w:hAnsi="BC Sans"/>
+                <w:sz w:val="20"/>
+                <w:szCs w:val="20"/>
+                <w:lang w:val="en-CA"/>
+              </w:rPr>
+              <w:t>[i</w:t>
+            </w:r>
+            <w:proofErr w:type="gramStart"/>
+            <w:r>
+              <w:rPr>
+                <w:rFonts w:ascii="BC Sans" w:hAnsi="BC Sans"/>
+                <w:sz w:val="20"/>
+                <w:szCs w:val="20"/>
+                <w:lang w:val="en-CA"/>
+              </w:rPr>
+              <w:t>].takenBy.lastName</w:t>
+            </w:r>
+            <w:proofErr w:type="gramEnd"/>
+            <w:r>
+              <w:rPr>
+                <w:rFonts w:ascii="BC Sans" w:hAnsi="BC Sans"/>
+                <w:sz w:val="20"/>
+                <w:szCs w:val="20"/>
+                <w:lang w:val="en-CA"/>
+              </w:rPr>
+              <w:t>:</w:t>
+            </w:r>
+            <w:proofErr w:type="gramStart"/>
+            <w:r>
+              <w:rPr>
+                <w:rFonts w:ascii="BC Sans" w:hAnsi="BC Sans"/>
+                <w:sz w:val="20"/>
+                <w:szCs w:val="20"/>
+                <w:lang w:val="en-CA"/>
+              </w:rPr>
+              <w:t>ifEM:hideBegin</w:t>
+            </w:r>
+            <w:proofErr w:type="gramEnd"/>
+            <w:r>
+              <w:rPr>
+                <w:rFonts w:ascii="BC Sans" w:hAnsi="BC Sans"/>
+                <w:sz w:val="20"/>
+                <w:szCs w:val="20"/>
+                <w:lang w:val="en-CA"/>
+              </w:rPr>
+              <w:t>}</w:t>
             </w:r>
           </w:p>
         </w:tc>
@@ -2594,7 +5792,60 @@
                 <w:szCs w:val="20"/>
                 <w:lang w:val="en-CA"/>
               </w:rPr>
-              <w:t>{d.attachments[i].takenBy</w:t>
+              <w:t>{</w:t>
+            </w:r>
+            <w:proofErr w:type="spellStart"/>
+            <w:proofErr w:type="gramStart"/>
+            <w:r>
+              <w:rPr>
+                <w:rFonts w:ascii="BC Sans" w:hAnsi="BC Sans"/>
+                <w:sz w:val="20"/>
+                <w:szCs w:val="20"/>
+                <w:lang w:val="en-CA"/>
+              </w:rPr>
+              <w:t>d.attachments</w:t>
+            </w:r>
+            <w:proofErr w:type="spellEnd"/>
+            <w:proofErr w:type="gramEnd"/>
+            <w:r>
+              <w:rPr>
+                <w:rFonts w:ascii="BC Sans" w:hAnsi="BC Sans"/>
+                <w:sz w:val="20"/>
+                <w:szCs w:val="20"/>
+                <w:lang w:val="en-CA"/>
+              </w:rPr>
+              <w:t>[</w:t>
+            </w:r>
+            <w:proofErr w:type="spellStart"/>
+            <w:r>
+              <w:rPr>
+                <w:rFonts w:ascii="BC Sans" w:hAnsi="BC Sans"/>
+                <w:sz w:val="20"/>
+                <w:szCs w:val="20"/>
+                <w:lang w:val="en-CA"/>
+              </w:rPr>
+              <w:t>i</w:t>
+            </w:r>
+            <w:proofErr w:type="spellEnd"/>
+            <w:proofErr w:type="gramStart"/>
+            <w:r>
+              <w:rPr>
+                <w:rFonts w:ascii="BC Sans" w:hAnsi="BC Sans"/>
+                <w:sz w:val="20"/>
+                <w:szCs w:val="20"/>
+                <w:lang w:val="en-CA"/>
+              </w:rPr>
+              <w:t>].</w:t>
+            </w:r>
+            <w:proofErr w:type="spellStart"/>
+            <w:r>
+              <w:rPr>
+                <w:rFonts w:ascii="BC Sans" w:hAnsi="BC Sans"/>
+                <w:sz w:val="20"/>
+                <w:szCs w:val="20"/>
+                <w:lang w:val="en-CA"/>
+              </w:rPr>
+              <w:t>takenBy</w:t>
             </w:r>
             <w:r>
               <w:rPr>
@@ -2605,6 +5856,8 @@
               </w:rPr>
               <w:t>.lastName</w:t>
             </w:r>
+            <w:proofErr w:type="spellEnd"/>
+            <w:proofErr w:type="gramEnd"/>
             <w:r>
               <w:rPr>
                 <w:rFonts w:ascii="BC Sans" w:hAnsi="BC Sans"/>
@@ -2621,16 +5874,86 @@
                 <w:szCs w:val="20"/>
                 <w:lang w:val="en-CA"/>
               </w:rPr>
-              <w:t>, {d.attachments[i].takenBy.firstName}</w:t>
-            </w:r>
-            <w:r>
-              <w:rPr>
-                <w:rFonts w:ascii="BC Sans" w:hAnsi="BC Sans"/>
-                <w:sz w:val="20"/>
-                <w:szCs w:val="20"/>
-                <w:lang w:val="en-CA"/>
-              </w:rPr>
-              <w:t>{d.attachments[i].takenBy.</w:t>
+              <w:t>, {</w:t>
+            </w:r>
+            <w:proofErr w:type="gramStart"/>
+            <w:r>
+              <w:rPr>
+                <w:rFonts w:ascii="BC Sans" w:hAnsi="BC Sans"/>
+                <w:sz w:val="20"/>
+                <w:szCs w:val="20"/>
+                <w:lang w:val="en-CA"/>
+              </w:rPr>
+              <w:t>d.attachments</w:t>
+            </w:r>
+            <w:proofErr w:type="gramEnd"/>
+            <w:r>
+              <w:rPr>
+                <w:rFonts w:ascii="BC Sans" w:hAnsi="BC Sans"/>
+                <w:sz w:val="20"/>
+                <w:szCs w:val="20"/>
+                <w:lang w:val="en-CA"/>
+              </w:rPr>
+              <w:t>[i</w:t>
+            </w:r>
+            <w:proofErr w:type="gramStart"/>
+            <w:r>
+              <w:rPr>
+                <w:rFonts w:ascii="BC Sans" w:hAnsi="BC Sans"/>
+                <w:sz w:val="20"/>
+                <w:szCs w:val="20"/>
+                <w:lang w:val="en-CA"/>
+              </w:rPr>
+              <w:t>].takenBy.firstName</w:t>
+            </w:r>
+            <w:proofErr w:type="gramEnd"/>
+            <w:r>
+              <w:rPr>
+                <w:rFonts w:ascii="BC Sans" w:hAnsi="BC Sans"/>
+                <w:sz w:val="20"/>
+                <w:szCs w:val="20"/>
+                <w:lang w:val="en-CA"/>
+              </w:rPr>
+              <w:t>}</w:t>
+            </w:r>
+            <w:r>
+              <w:rPr>
+                <w:rFonts w:ascii="BC Sans" w:hAnsi="BC Sans"/>
+                <w:sz w:val="20"/>
+                <w:szCs w:val="20"/>
+                <w:lang w:val="en-CA"/>
+              </w:rPr>
+              <w:t>{</w:t>
+            </w:r>
+            <w:proofErr w:type="gramStart"/>
+            <w:r>
+              <w:rPr>
+                <w:rFonts w:ascii="BC Sans" w:hAnsi="BC Sans"/>
+                <w:sz w:val="20"/>
+                <w:szCs w:val="20"/>
+                <w:lang w:val="en-CA"/>
+              </w:rPr>
+              <w:t>d.attachments</w:t>
+            </w:r>
+            <w:proofErr w:type="gramEnd"/>
+            <w:r>
+              <w:rPr>
+                <w:rFonts w:ascii="BC Sans" w:hAnsi="BC Sans"/>
+                <w:sz w:val="20"/>
+                <w:szCs w:val="20"/>
+                <w:lang w:val="en-CA"/>
+              </w:rPr>
+              <w:t>[i</w:t>
+            </w:r>
+            <w:proofErr w:type="gramStart"/>
+            <w:r>
+              <w:rPr>
+                <w:rFonts w:ascii="BC Sans" w:hAnsi="BC Sans"/>
+                <w:sz w:val="20"/>
+                <w:szCs w:val="20"/>
+                <w:lang w:val="en-CA"/>
+              </w:rPr>
+              <w:t>].takenBy.</w:t>
             </w:r>
             <w:r>
               <w:rPr>
@@ -2641,14 +5964,35 @@
               </w:rPr>
               <w:t>location</w:t>
             </w:r>
-            <w:r>
-              <w:rPr>
-                <w:rFonts w:ascii="BC Sans" w:hAnsi="BC Sans"/>
-                <w:sz w:val="20"/>
-                <w:szCs w:val="20"/>
-                <w:lang w:val="en-CA"/>
-              </w:rPr>
-              <w:t>:ifEM:hideBegin}</w:t>
+            <w:proofErr w:type="gramEnd"/>
+            <w:r>
+              <w:rPr>
+                <w:rFonts w:ascii="BC Sans" w:hAnsi="BC Sans"/>
+                <w:sz w:val="20"/>
+                <w:szCs w:val="20"/>
+                <w:lang w:val="en-CA"/>
+              </w:rPr>
+              <w:t>:</w:t>
+            </w:r>
+            <w:proofErr w:type="gramStart"/>
+            <w:r>
+              <w:rPr>
+                <w:rFonts w:ascii="BC Sans" w:hAnsi="BC Sans"/>
+                <w:sz w:val="20"/>
+                <w:szCs w:val="20"/>
+                <w:lang w:val="en-CA"/>
+              </w:rPr>
+              <w:t>ifEM:hideBegin</w:t>
+            </w:r>
+            <w:proofErr w:type="gramEnd"/>
+            <w:r>
+              <w:rPr>
+                <w:rFonts w:ascii="BC Sans" w:hAnsi="BC Sans"/>
+                <w:sz w:val="20"/>
+                <w:szCs w:val="20"/>
+                <w:lang w:val="en-CA"/>
+              </w:rPr>
+              <w:t>}</w:t>
             </w:r>
           </w:p>
         </w:tc>
@@ -2685,7 +6029,114 @@
                 <w:szCs w:val="20"/>
                 <w:lang w:val="en-CA"/>
               </w:rPr>
-              <w:t>{d.attachments[i].takenBy.lastName:hideEnd}</w:t>
+              <w:t>{</w:t>
+            </w:r>
+            <w:proofErr w:type="spellStart"/>
+            <w:proofErr w:type="gramStart"/>
+            <w:r>
+              <w:rPr>
+                <w:rFonts w:ascii="BC Sans" w:hAnsi="BC Sans"/>
+                <w:b w:val="0"/>
+                <w:bCs w:val="0"/>
+                <w:caps w:val="0"/>
+                <w:sz w:val="20"/>
+                <w:szCs w:val="20"/>
+                <w:lang w:val="en-CA"/>
+              </w:rPr>
+              <w:t>d.attachments</w:t>
+            </w:r>
+            <w:proofErr w:type="spellEnd"/>
+            <w:proofErr w:type="gramEnd"/>
+            <w:r>
+              <w:rPr>
+                <w:rFonts w:ascii="BC Sans" w:hAnsi="BC Sans"/>
+                <w:b w:val="0"/>
+                <w:bCs w:val="0"/>
+                <w:caps w:val="0"/>
+                <w:sz w:val="20"/>
+                <w:szCs w:val="20"/>
+                <w:lang w:val="en-CA"/>
+              </w:rPr>
+              <w:t>[</w:t>
+            </w:r>
+            <w:proofErr w:type="spellStart"/>
+            <w:r>
+              <w:rPr>
+                <w:rFonts w:ascii="BC Sans" w:hAnsi="BC Sans"/>
+                <w:b w:val="0"/>
+                <w:bCs w:val="0"/>
+                <w:caps w:val="0"/>
+                <w:sz w:val="20"/>
+                <w:szCs w:val="20"/>
+                <w:lang w:val="en-CA"/>
+              </w:rPr>
+              <w:t>i</w:t>
+            </w:r>
+            <w:proofErr w:type="spellEnd"/>
+            <w:proofErr w:type="gramStart"/>
+            <w:r>
+              <w:rPr>
+                <w:rFonts w:ascii="BC Sans" w:hAnsi="BC Sans"/>
+                <w:b w:val="0"/>
+                <w:bCs w:val="0"/>
+                <w:caps w:val="0"/>
+                <w:sz w:val="20"/>
+                <w:szCs w:val="20"/>
+                <w:lang w:val="en-CA"/>
+              </w:rPr>
+              <w:t>].</w:t>
+            </w:r>
+            <w:proofErr w:type="spellStart"/>
+            <w:r>
+              <w:rPr>
+                <w:rFonts w:ascii="BC Sans" w:hAnsi="BC Sans"/>
+                <w:b w:val="0"/>
+                <w:bCs w:val="0"/>
+                <w:caps w:val="0"/>
+                <w:sz w:val="20"/>
+                <w:szCs w:val="20"/>
+                <w:lang w:val="en-CA"/>
+              </w:rPr>
+              <w:t>takenBy.lastName</w:t>
+            </w:r>
+            <w:proofErr w:type="gramEnd"/>
+            <w:r>
+              <w:rPr>
+                <w:rFonts w:ascii="BC Sans" w:hAnsi="BC Sans"/>
+                <w:b w:val="0"/>
+                <w:bCs w:val="0"/>
+                <w:caps w:val="0"/>
+                <w:sz w:val="20"/>
+                <w:szCs w:val="20"/>
+                <w:lang w:val="en-CA"/>
+              </w:rPr>
+              <w:t>:</w:t>
+            </w:r>
+            <w:proofErr w:type="gramStart"/>
+            <w:r>
+              <w:rPr>
+                <w:rFonts w:ascii="BC Sans" w:hAnsi="BC Sans"/>
+                <w:b w:val="0"/>
+                <w:bCs w:val="0"/>
+                <w:caps w:val="0"/>
+                <w:sz w:val="20"/>
+                <w:szCs w:val="20"/>
+                <w:lang w:val="en-CA"/>
+              </w:rPr>
+              <w:t>hideEnd</w:t>
+            </w:r>
+            <w:proofErr w:type="spellEnd"/>
+            <w:r>
+              <w:rPr>
+                <w:rFonts w:ascii="BC Sans" w:hAnsi="BC Sans"/>
+                <w:b w:val="0"/>
+                <w:bCs w:val="0"/>
+                <w:caps w:val="0"/>
+                <w:sz w:val="20"/>
+                <w:szCs w:val="20"/>
+                <w:lang w:val="en-CA"/>
+              </w:rPr>
+              <w:t>}</w:t>
             </w:r>
             <w:r>
               <w:rPr>
@@ -2699,6 +6150,7 @@
               </w:rPr>
               <w:t>Location</w:t>
             </w:r>
+            <w:proofErr w:type="gramEnd"/>
           </w:p>
         </w:tc>
         <w:tc>
@@ -2722,16 +6174,86 @@
                 <w:szCs w:val="20"/>
                 <w:lang w:val="en-CA"/>
               </w:rPr>
-              <w:t>{d.attachments[i].location}</w:t>
-            </w:r>
-            <w:r>
-              <w:rPr>
-                <w:rFonts w:ascii="BC Sans" w:hAnsi="BC Sans"/>
-                <w:sz w:val="20"/>
-                <w:szCs w:val="20"/>
-                <w:lang w:val="en-CA"/>
-              </w:rPr>
-              <w:t>{d.attachments[i].takenBy.</w:t>
+              <w:t>{</w:t>
+            </w:r>
+            <w:proofErr w:type="gramStart"/>
+            <w:r>
+              <w:rPr>
+                <w:rFonts w:ascii="BC Sans" w:hAnsi="BC Sans"/>
+                <w:sz w:val="20"/>
+                <w:szCs w:val="20"/>
+                <w:lang w:val="en-CA"/>
+              </w:rPr>
+              <w:t>d.attachments</w:t>
+            </w:r>
+            <w:proofErr w:type="gramEnd"/>
+            <w:r>
+              <w:rPr>
+                <w:rFonts w:ascii="BC Sans" w:hAnsi="BC Sans"/>
+                <w:sz w:val="20"/>
+                <w:szCs w:val="20"/>
+                <w:lang w:val="en-CA"/>
+              </w:rPr>
+              <w:t>[i</w:t>
+            </w:r>
+            <w:proofErr w:type="gramStart"/>
+            <w:r>
+              <w:rPr>
+                <w:rFonts w:ascii="BC Sans" w:hAnsi="BC Sans"/>
+                <w:sz w:val="20"/>
+                <w:szCs w:val="20"/>
+                <w:lang w:val="en-CA"/>
+              </w:rPr>
+              <w:t>].location</w:t>
+            </w:r>
+            <w:proofErr w:type="gramEnd"/>
+            <w:r>
+              <w:rPr>
+                <w:rFonts w:ascii="BC Sans" w:hAnsi="BC Sans"/>
+                <w:sz w:val="20"/>
+                <w:szCs w:val="20"/>
+                <w:lang w:val="en-CA"/>
+              </w:rPr>
+              <w:t>}</w:t>
+            </w:r>
+            <w:r>
+              <w:rPr>
+                <w:rFonts w:ascii="BC Sans" w:hAnsi="BC Sans"/>
+                <w:sz w:val="20"/>
+                <w:szCs w:val="20"/>
+                <w:lang w:val="en-CA"/>
+              </w:rPr>
+              <w:t>{</w:t>
+            </w:r>
+            <w:proofErr w:type="gramStart"/>
+            <w:r>
+              <w:rPr>
+                <w:rFonts w:ascii="BC Sans" w:hAnsi="BC Sans"/>
+                <w:sz w:val="20"/>
+                <w:szCs w:val="20"/>
+                <w:lang w:val="en-CA"/>
+              </w:rPr>
+              <w:t>d.attachments</w:t>
+            </w:r>
+            <w:proofErr w:type="gramEnd"/>
+            <w:r>
+              <w:rPr>
+                <w:rFonts w:ascii="BC Sans" w:hAnsi="BC Sans"/>
+                <w:sz w:val="20"/>
+                <w:szCs w:val="20"/>
+                <w:lang w:val="en-CA"/>
+              </w:rPr>
+              <w:t>[i</w:t>
+            </w:r>
+            <w:proofErr w:type="gramStart"/>
+            <w:r>
+              <w:rPr>
+                <w:rFonts w:ascii="BC Sans" w:hAnsi="BC Sans"/>
+                <w:sz w:val="20"/>
+                <w:szCs w:val="20"/>
+                <w:lang w:val="en-CA"/>
+              </w:rPr>
+              <w:t>].takenBy.</w:t>
             </w:r>
             <w:r>
               <w:rPr>
@@ -2742,6 +6264,7 @@
               </w:rPr>
               <w:t>location</w:t>
             </w:r>
+            <w:proofErr w:type="gramEnd"/>
             <w:r>
               <w:rPr>
                 <w:rFonts w:ascii="BC Sans" w:hAnsi="BC Sans"/>
@@ -2799,7 +6322,17 @@
           <w:sz w:val="20"/>
           <w:szCs w:val="20"/>
         </w:rPr>
-        <w:t>{d.</w:t>
+        <w:t>{</w:t>
+      </w:r>
+      <w:proofErr w:type="spellStart"/>
+      <w:proofErr w:type="gramStart"/>
+      <w:r>
+        <w:rPr>
+          <w:rFonts w:ascii="BC Sans" w:hAnsi="BC Sans"/>
+          <w:sz w:val="20"/>
+          <w:szCs w:val="20"/>
+        </w:rPr>
+        <w:t>d.</w:t>
       </w:r>
       <w:r>
         <w:rPr>
@@ -2809,6 +6342,8 @@
         </w:rPr>
         <w:t>attachments</w:t>
       </w:r>
+      <w:proofErr w:type="spellEnd"/>
+      <w:proofErr w:type="gramEnd"/>
       <w:r>
         <w:rPr>
           <w:rFonts w:ascii="BC Sans" w:hAnsi="BC Sans"/>
@@ -3104,6 +6639,8 @@
             </w:rPr>
             <w:t>Report printed on {</w:t>
           </w:r>
+          <w:proofErr w:type="spellStart"/>
+          <w:proofErr w:type="gramStart"/>
           <w:r>
             <w:rPr>
               <w:rFonts w:ascii="BC Sans" w:eastAsia="BC Sans" w:hAnsi="BC Sans" w:cs="BC Sans"/>
@@ -3128,6 +6665,8 @@
             </w:rPr>
             <w:t>generatedOn</w:t>
           </w:r>
+          <w:proofErr w:type="spellEnd"/>
+          <w:proofErr w:type="gramEnd"/>
           <w:r>
             <w:rPr>
               <w:rFonts w:ascii="BC Sans" w:eastAsia="BC Sans" w:hAnsi="BC Sans" w:cs="BC Sans"/>

</xml_diff>

<commit_message>
migrations and backend changes
</commit_message>
<xml_diff>
--- a/backend/templates/task/CDOGS-TDR-TEMPLATE-v1.docx
+++ b/backend/templates/task/CDOGS-TDR-TEMPLATE-v1.docx
@@ -1,6 +1,6 @@
 
 <file path=word/document.xml><?xml version="1.0" encoding="utf-8"?>
-<w:document xmlns:wpc="http://schemas.microsoft.com/office/word/2010/wordprocessingCanvas" xmlns:cx="http://schemas.microsoft.com/office/drawing/2014/chartex" xmlns:cx1="http://schemas.microsoft.com/office/drawing/2015/9/8/chartex" xmlns:cx2="http://schemas.microsoft.com/office/drawing/2015/10/21/chartex" xmlns:cx3="http://schemas.microsoft.com/office/drawing/2016/5/9/chartex" xmlns:cx4="http://schemas.microsoft.com/office/drawing/2016/5/10/chartex" xmlns:cx5="http://schemas.microsoft.com/office/drawing/2016/5/11/chartex" xmlns:cx6="http://schemas.microsoft.com/office/drawing/2016/5/12/chartex" xmlns:cx7="http://schemas.microsoft.com/office/drawing/2016/5/13/chartex" xmlns:cx8="http://schemas.microsoft.com/office/drawing/2016/5/14/chartex" xmlns:mc="http://schemas.openxmlformats.org/markup-compatibility/2006" xmlns:aink="http://schemas.microsoft.com/office/drawing/2016/ink" xmlns:am3d="http://schemas.microsoft.com/office/drawing/2017/model3d" xmlns:o="urn:schemas-microsoft-com:office:office" xmlns:oel="http://schemas.microsoft.com/office/2019/extlst" xmlns:r="http://schemas.openxmlformats.org/officeDocument/2006/relationships" xmlns:m="http://schemas.openxmlformats.org/officeDocument/2006/math" xmlns:v="urn:schemas-microsoft-com:vml" xmlns:wp14="http://schemas.microsoft.com/office/word/2010/wordprocessingDrawing" xmlns:wp="http://schemas.openxmlformats.org/drawingml/2006/wordprocessingDrawing" xmlns:w10="urn:schemas-microsoft-com:office:word" xmlns:w="http://schemas.openxmlformats.org/wordprocessingml/2006/main" xmlns:w14="http://schemas.microsoft.com/office/word/2010/wordml" xmlns:w15="http://schemas.microsoft.com/office/word/2012/wordml" xmlns:w16cex="http://schemas.microsoft.com/office/word/2018/wordml/cex" xmlns:w16cid="http://schemas.microsoft.com/office/word/2016/wordml/cid" xmlns:w16="http://schemas.microsoft.com/office/word/2018/wordml" xmlns:w16du="http://schemas.microsoft.com/office/word/2023/wordml/word16du" xmlns:w16sdtdh="http://schemas.microsoft.com/office/word/2020/wordml/sdtdatahash" xmlns:w16sdtfl="http://schemas.microsoft.com/office/word/2024/wordml/sdtformatlock" xmlns:w16se="http://schemas.microsoft.com/office/word/2015/wordml/symex" xmlns:wpg="http://schemas.microsoft.com/office/word/2010/wordprocessingGroup" xmlns:wpi="http://schemas.microsoft.com/office/word/2010/wordprocessingInk" xmlns:wne="http://schemas.microsoft.com/office/word/2006/wordml" xmlns:wps="http://schemas.microsoft.com/office/word/2010/wordprocessingShape" mc:Ignorable="w14 w15 w16se w16cid w16 w16cex w16sdtdh w16sdtfl w16du wp14">
+<w:document xmlns:wpc="http://schemas.microsoft.com/office/word/2010/wordprocessingCanvas" xmlns:cx="http://schemas.microsoft.com/office/drawing/2014/chartex" xmlns:cx1="http://schemas.microsoft.com/office/drawing/2015/9/8/chartex" xmlns:cx2="http://schemas.microsoft.com/office/drawing/2015/10/21/chartex" xmlns:cx3="http://schemas.microsoft.com/office/drawing/2016/5/9/chartex" xmlns:cx4="http://schemas.microsoft.com/office/drawing/2016/5/10/chartex" xmlns:cx5="http://schemas.microsoft.com/office/drawing/2016/5/11/chartex" xmlns:cx6="http://schemas.microsoft.com/office/drawing/2016/5/12/chartex" xmlns:cx7="http://schemas.microsoft.com/office/drawing/2016/5/13/chartex" xmlns:cx8="http://schemas.microsoft.com/office/drawing/2016/5/14/chartex" xmlns:mc="http://schemas.openxmlformats.org/markup-compatibility/2006" xmlns:aink="http://schemas.microsoft.com/office/drawing/2016/ink" xmlns:am3d="http://schemas.microsoft.com/office/drawing/2017/model3d" xmlns:o="urn:schemas-microsoft-com:office:office" xmlns:oel="http://schemas.microsoft.com/office/2019/extlst" xmlns:r="http://schemas.openxmlformats.org/officeDocument/2006/relationships" xmlns:m="http://schemas.openxmlformats.org/officeDocument/2006/math" xmlns:v="urn:schemas-microsoft-com:vml" xmlns:wp14="http://schemas.microsoft.com/office/word/2010/wordprocessingDrawing" xmlns:wp="http://schemas.openxmlformats.org/drawingml/2006/wordprocessingDrawing" xmlns:w10="urn:schemas-microsoft-com:office:word" xmlns:w="http://schemas.openxmlformats.org/wordprocessingml/2006/main" xmlns:w14="http://schemas.microsoft.com/office/word/2010/wordml" xmlns:w15="http://schemas.microsoft.com/office/word/2012/wordml" xmlns:w16cei="http://schemas.microsoft.com/office/word/2026/wordml/cei" xmlns:w16cex="http://schemas.microsoft.com/office/word/2018/wordml/cex" xmlns:w16cid="http://schemas.microsoft.com/office/word/2016/wordml/cid" xmlns:w16="http://schemas.microsoft.com/office/word/2018/wordml" xmlns:w16du="http://schemas.microsoft.com/office/word/2023/wordml/word16du" xmlns:w16sdtdh="http://schemas.microsoft.com/office/word/2020/wordml/sdtdatahash" xmlns:w16sdtfl="http://schemas.microsoft.com/office/word/2024/wordml/sdtformatlock" xmlns:w16se="http://schemas.microsoft.com/office/word/2015/wordml/symex" xmlns:wpg="http://schemas.microsoft.com/office/word/2010/wordprocessingGroup" xmlns:wpi="http://schemas.microsoft.com/office/word/2010/wordprocessingInk" xmlns:wne="http://schemas.microsoft.com/office/word/2006/wordml" xmlns:wps="http://schemas.microsoft.com/office/word/2010/wordprocessingShape" mc:Ignorable="w14 w15 w16se w16cid w16 w16cex w16sdtdh w16sdtfl w16du wp14">
   <w:body>
     <w:p>
       <w:pPr>
@@ -68,7 +68,6 @@
                 <w:szCs w:val="20"/>
               </w:rPr>
             </w:pPr>
-            <w:proofErr w:type="gramStart"/>
             <w:r>
               <w:rPr>
                 <w:rFonts w:ascii="BC Sans" w:eastAsia="Times New Roman" w:hAnsi="BC Sans" w:cs="Times New Roman"/>
@@ -156,7 +155,6 @@
               <w:t>Label</w:t>
             </w:r>
             <w:proofErr w:type="spellEnd"/>
-            <w:proofErr w:type="gramEnd"/>
             <w:r>
               <w:rPr>
                 <w:rFonts w:ascii="BC Sans" w:eastAsia="Times New Roman" w:hAnsi="BC Sans" w:cs="Times New Roman"/>
@@ -188,19 +186,7 @@
                 <w:sz w:val="20"/>
                 <w:szCs w:val="20"/>
               </w:rPr>
-              <w:t xml:space="preserve">Task </w:t>
-            </w:r>
-            <w:proofErr w:type="gramStart"/>
-            <w:r>
-              <w:rPr>
-                <w:rFonts w:ascii="BC Sans" w:eastAsia="Times New Roman" w:hAnsi="BC Sans" w:cs="Times New Roman"/>
-                <w:b w:val="0"/>
-                <w:bCs w:val="0"/>
-                <w:color w:val="000000" w:themeColor="text1"/>
-                <w:sz w:val="20"/>
-                <w:szCs w:val="20"/>
-              </w:rPr>
-              <w:t>number</w:t>
+              <w:t>Task number</w:t>
             </w:r>
             <w:r>
               <w:rPr>
@@ -247,7 +233,6 @@
               <w:t>taskNumber</w:t>
             </w:r>
             <w:proofErr w:type="spellEnd"/>
-            <w:proofErr w:type="gramEnd"/>
             <w:r>
               <w:rPr>
                 <w:rFonts w:ascii="BC Sans" w:eastAsia="Times New Roman" w:hAnsi="BC Sans" w:cs="Times New Roman"/>
@@ -423,7 +408,6 @@
               <w:t>{</w:t>
             </w:r>
             <w:proofErr w:type="spellStart"/>
-            <w:proofErr w:type="gramStart"/>
             <w:r>
               <w:rPr>
                 <w:rFonts w:ascii="BC Sans" w:eastAsia="Times New Roman" w:hAnsi="BC Sans" w:cs="Times New Roman"/>
@@ -449,104 +433,13 @@
                 <w:sz w:val="20"/>
                 <w:szCs w:val="20"/>
               </w:rPr>
-              <w:t>taskType.category</w:t>
-            </w:r>
-            <w:proofErr w:type="gramEnd"/>
-            <w:r>
-              <w:rPr>
-                <w:rFonts w:ascii="BC Sans" w:eastAsia="Times New Roman" w:hAnsi="BC Sans" w:cs="Times New Roman"/>
-                <w:color w:val="000000" w:themeColor="text1"/>
-                <w:sz w:val="20"/>
-                <w:szCs w:val="20"/>
-              </w:rPr>
-              <w:t>.</w:t>
-            </w:r>
-            <w:proofErr w:type="gramStart"/>
-            <w:r>
-              <w:rPr>
-                <w:rFonts w:ascii="BC Sans" w:eastAsia="Times New Roman" w:hAnsi="BC Sans" w:cs="Times New Roman"/>
-                <w:color w:val="000000" w:themeColor="text1"/>
-                <w:sz w:val="20"/>
-                <w:szCs w:val="20"/>
-              </w:rPr>
-              <w:t>longDescription</w:t>
-            </w:r>
-            <w:proofErr w:type="spellEnd"/>
-            <w:r>
-              <w:rPr>
-                <w:rFonts w:ascii="BC Sans" w:eastAsia="Times New Roman" w:hAnsi="BC Sans" w:cs="Times New Roman"/>
-                <w:color w:val="000000" w:themeColor="text1"/>
-                <w:sz w:val="20"/>
-                <w:szCs w:val="20"/>
-              </w:rPr>
-              <w:t>}</w:t>
-            </w:r>
-            <w:r>
-              <w:rPr>
-                <w:rFonts w:ascii="BC Sans" w:eastAsia="Times New Roman" w:hAnsi="BC Sans" w:cs="Times New Roman"/>
-                <w:color w:val="000000" w:themeColor="text1"/>
-                <w:sz w:val="20"/>
-                <w:szCs w:val="20"/>
-              </w:rPr>
-              <w:t>{</w:t>
-            </w:r>
-            <w:r>
-              <w:rPr>
-                <w:rFonts w:ascii="BC Sans" w:eastAsia="Times New Roman" w:hAnsi="BC Sans" w:cs="Times New Roman"/>
-                <w:color w:val="000000" w:themeColor="text1"/>
-                <w:sz w:val="20"/>
-                <w:szCs w:val="20"/>
-              </w:rPr>
-              <w:t>d.</w:t>
-            </w:r>
-            <w:proofErr w:type="spellStart"/>
-            <w:r>
-              <w:rPr>
-                <w:rFonts w:ascii="BC Sans" w:eastAsia="Times New Roman" w:hAnsi="BC Sans" w:cs="Times New Roman"/>
-                <w:color w:val="000000" w:themeColor="text1"/>
-                <w:sz w:val="20"/>
-                <w:szCs w:val="20"/>
-                <w:lang w:val="en-CA"/>
-              </w:rPr>
-              <w:t>taskType.type</w:t>
-            </w:r>
-            <w:proofErr w:type="gramEnd"/>
-            <w:r>
-              <w:rPr>
-                <w:rFonts w:ascii="BC Sans" w:eastAsia="Times New Roman" w:hAnsi="BC Sans" w:cs="Times New Roman"/>
-                <w:color w:val="000000" w:themeColor="text1"/>
-                <w:sz w:val="20"/>
-                <w:szCs w:val="20"/>
-                <w:lang w:val="en-CA"/>
-              </w:rPr>
-              <w:t>.</w:t>
-            </w:r>
-            <w:proofErr w:type="gramStart"/>
-            <w:r>
-              <w:rPr>
-                <w:rFonts w:ascii="BC Sans" w:eastAsia="Times New Roman" w:hAnsi="BC Sans" w:cs="Times New Roman"/>
-                <w:color w:val="000000" w:themeColor="text1"/>
-                <w:sz w:val="20"/>
-                <w:szCs w:val="20"/>
-                <w:lang w:val="en-CA"/>
-              </w:rPr>
-              <w:t>longDescription:ifEM</w:t>
-            </w:r>
-            <w:proofErr w:type="gramEnd"/>
-            <w:r>
-              <w:rPr>
-                <w:rFonts w:ascii="BC Sans" w:eastAsia="Times New Roman" w:hAnsi="BC Sans" w:cs="Times New Roman"/>
-                <w:color w:val="000000" w:themeColor="text1"/>
-                <w:sz w:val="20"/>
-                <w:szCs w:val="20"/>
-                <w:lang w:val="en-CA"/>
-              </w:rPr>
-              <w:t>:hideBegin</w:t>
-            </w:r>
-            <w:proofErr w:type="spellEnd"/>
-            <w:r>
-              <w:rPr>
-                <w:rFonts w:ascii="BC Sans" w:hAnsi="BC Sans"/>
+              <w:t>taskType.category.longDescription</w:t>
+            </w:r>
+            <w:proofErr w:type="spellEnd"/>
+            <w:r>
+              <w:rPr>
+                <w:rFonts w:ascii="BC Sans" w:eastAsia="Times New Roman" w:hAnsi="BC Sans" w:cs="Times New Roman"/>
+                <w:color w:val="000000" w:themeColor="text1"/>
                 <w:sz w:val="20"/>
                 <w:szCs w:val="20"/>
               </w:rPr>
@@ -568,13 +461,14 @@
           </w:tcPr>
           <w:p>
             <w:pPr>
+              <w:spacing w:line="259" w:lineRule="auto"/>
               <w:rPr>
                 <w:rFonts w:ascii="BC Sans" w:hAnsi="BC Sans"/>
                 <w:b w:val="0"/>
                 <w:bCs w:val="0"/>
                 <w:caps w:val="0"/>
-                <w:sz w:val="20"/>
-                <w:szCs w:val="20"/>
+                <w:sz w:val="18"/>
+                <w:szCs w:val="18"/>
               </w:rPr>
             </w:pPr>
             <w:r>
@@ -586,21 +480,8 @@
                 <w:sz w:val="20"/>
                 <w:szCs w:val="20"/>
               </w:rPr>
-              <w:t xml:space="preserve">Task </w:t>
-            </w:r>
-            <w:proofErr w:type="gramStart"/>
-            <w:r>
-              <w:rPr>
-                <w:rFonts w:ascii="BC Sans" w:hAnsi="BC Sans"/>
-                <w:b w:val="0"/>
-                <w:bCs w:val="0"/>
-                <w:caps w:val="0"/>
-                <w:sz w:val="20"/>
-                <w:szCs w:val="20"/>
-              </w:rPr>
-              <w:t>sub category</w:t>
-            </w:r>
-            <w:proofErr w:type="gramEnd"/>
+              <w:t>Remarks</w:t>
+            </w:r>
           </w:p>
         </w:tc>
         <w:tc>
@@ -611,12 +492,13 @@
           </w:tcPr>
           <w:p>
             <w:pPr>
+              <w:spacing w:line="259" w:lineRule="auto"/>
               <w:cnfStyle w:val="000000000000" w:firstRow="0" w:lastRow="0" w:firstColumn="0" w:lastColumn="0" w:oddVBand="0" w:evenVBand="0" w:oddHBand="0" w:evenHBand="0" w:firstRowFirstColumn="0" w:firstRowLastColumn="0" w:lastRowFirstColumn="0" w:lastRowLastColumn="0"/>
               <w:rPr>
                 <w:rFonts w:ascii="BC Sans" w:eastAsia="Times New Roman" w:hAnsi="BC Sans" w:cs="Times New Roman"/>
                 <w:color w:val="000000" w:themeColor="text1"/>
-                <w:sz w:val="20"/>
-                <w:szCs w:val="20"/>
+                <w:sz w:val="18"/>
+                <w:szCs w:val="18"/>
               </w:rPr>
             </w:pPr>
             <w:r>
@@ -628,7 +510,7 @@
               </w:rPr>
               <w:t>{</w:t>
             </w:r>
-            <w:proofErr w:type="gramStart"/>
+            <w:proofErr w:type="spellStart"/>
             <w:r>
               <w:rPr>
                 <w:rFonts w:ascii="BC Sans" w:eastAsia="Times New Roman" w:hAnsi="BC Sans" w:cs="Times New Roman"/>
@@ -647,27 +529,274 @@
               </w:rPr>
               <w:t>.</w:t>
             </w:r>
-            <w:proofErr w:type="spellStart"/>
-            <w:r>
-              <w:rPr>
-                <w:rFonts w:ascii="BC Sans" w:eastAsia="Times New Roman" w:hAnsi="BC Sans" w:cs="Times New Roman"/>
-                <w:color w:val="000000" w:themeColor="text1"/>
-                <w:sz w:val="20"/>
-                <w:szCs w:val="20"/>
-                <w:lang w:val="en-CA"/>
-              </w:rPr>
-              <w:t>taskType.type</w:t>
-            </w:r>
-            <w:proofErr w:type="gramEnd"/>
-            <w:r>
-              <w:rPr>
-                <w:rFonts w:ascii="BC Sans" w:eastAsia="Times New Roman" w:hAnsi="BC Sans" w:cs="Times New Roman"/>
-                <w:color w:val="000000" w:themeColor="text1"/>
-                <w:sz w:val="20"/>
-                <w:szCs w:val="20"/>
-                <w:lang w:val="en-CA"/>
-              </w:rPr>
-              <w:t>.longDescription</w:t>
+            <w:r>
+              <w:rPr>
+                <w:rFonts w:ascii="BC Sans" w:eastAsia="Times New Roman" w:hAnsi="BC Sans" w:cs="Times New Roman"/>
+                <w:color w:val="000000" w:themeColor="text1"/>
+                <w:sz w:val="20"/>
+                <w:szCs w:val="20"/>
+              </w:rPr>
+              <w:t>remarks</w:t>
+            </w:r>
+            <w:proofErr w:type="spellEnd"/>
+            <w:r>
+              <w:rPr>
+                <w:rFonts w:ascii="BC Sans" w:eastAsia="Times New Roman" w:hAnsi="BC Sans" w:cs="Times New Roman"/>
+                <w:color w:val="000000" w:themeColor="text1"/>
+                <w:sz w:val="20"/>
+                <w:szCs w:val="20"/>
+              </w:rPr>
+              <w:t>}</w:t>
+            </w:r>
+          </w:p>
+        </w:tc>
+      </w:tr>
+      <w:tr>
+        <w:trPr>
+          <w:cnfStyle w:val="000000100000" w:firstRow="0" w:lastRow="0" w:firstColumn="0" w:lastColumn="0" w:oddVBand="0" w:evenVBand="0" w:oddHBand="1" w:evenHBand="0" w:firstRowFirstColumn="0" w:firstRowLastColumn="0" w:lastRowFirstColumn="0" w:lastRowLastColumn="0"/>
+          <w:trHeight w:val="360"/>
+        </w:trPr>
+        <w:tc>
+          <w:tcPr>
+            <w:cnfStyle w:val="001000000000" w:firstRow="0" w:lastRow="0" w:firstColumn="1" w:lastColumn="0" w:oddVBand="0" w:evenVBand="0" w:oddHBand="0" w:evenHBand="0" w:firstRowFirstColumn="0" w:firstRowLastColumn="0" w:lastRowFirstColumn="0" w:lastRowLastColumn="0"/>
+            <w:tcW w:w="2700" w:type="dxa"/>
+            <w:noWrap/>
+            <w:vAlign w:val="center"/>
+            <w:hideMark/>
+          </w:tcPr>
+          <w:p>
+            <w:r>
+              <w:rPr>
+                <w:rFonts w:ascii="BC Sans" w:hAnsi="BC Sans"/>
+                <w:b w:val="0"/>
+                <w:bCs w:val="0"/>
+                <w:caps w:val="0"/>
+                <w:sz w:val="20"/>
+                <w:szCs w:val="20"/>
+              </w:rPr>
+              <w:t>Officer assigned</w:t>
+            </w:r>
+          </w:p>
+        </w:tc>
+        <w:tc>
+          <w:tcPr>
+            <w:tcW w:w="8216" w:type="dxa"/>
+            <w:noWrap/>
+            <w:vAlign w:val="center"/>
+            <w:hideMark/>
+          </w:tcPr>
+          <w:p>
+            <w:pPr>
+              <w:cnfStyle w:val="000000100000" w:firstRow="0" w:lastRow="0" w:firstColumn="0" w:lastColumn="0" w:oddVBand="0" w:evenVBand="0" w:oddHBand="1" w:evenHBand="0" w:firstRowFirstColumn="0" w:firstRowLastColumn="0" w:lastRowFirstColumn="0" w:lastRowLastColumn="0"/>
+              <w:rPr>
+                <w:rFonts w:ascii="BC Sans" w:eastAsia="Times New Roman" w:hAnsi="BC Sans" w:cs="Times New Roman"/>
+                <w:color w:val="000000"/>
+                <w:kern w:val="0"/>
+                <w:sz w:val="20"/>
+                <w:szCs w:val="20"/>
+                <w14:ligatures w14:val="none"/>
+              </w:rPr>
+            </w:pPr>
+            <w:r>
+              <w:rPr>
+                <w:rFonts w:ascii="BC Sans" w:eastAsia="Times New Roman" w:hAnsi="BC Sans" w:cs="Times New Roman"/>
+                <w:color w:val="000000"/>
+                <w:kern w:val="0"/>
+                <w:sz w:val="20"/>
+                <w:szCs w:val="20"/>
+                <w14:ligatures w14:val="none"/>
+              </w:rPr>
+              <w:t>{</w:t>
+            </w:r>
+            <w:proofErr w:type="spellStart"/>
+            <w:r>
+              <w:rPr>
+                <w:rFonts w:ascii="BC Sans" w:eastAsia="Times New Roman" w:hAnsi="BC Sans" w:cs="Times New Roman"/>
+                <w:color w:val="000000"/>
+                <w:kern w:val="0"/>
+                <w:sz w:val="20"/>
+                <w:szCs w:val="20"/>
+                <w14:ligatures w14:val="none"/>
+              </w:rPr>
+              <w:t>d</w:t>
+            </w:r>
+            <w:r>
+              <w:rPr>
+                <w:rFonts w:ascii="BC Sans" w:eastAsia="Times New Roman" w:hAnsi="BC Sans" w:cs="Times New Roman"/>
+                <w:color w:val="000000" w:themeColor="text1"/>
+                <w:sz w:val="20"/>
+                <w:szCs w:val="20"/>
+              </w:rPr>
+              <w:t>.</w:t>
+            </w:r>
+            <w:r>
+              <w:rPr>
+                <w:rFonts w:ascii="BC Sans" w:eastAsia="Times New Roman" w:hAnsi="BC Sans" w:cs="Times New Roman"/>
+                <w:color w:val="000000" w:themeColor="text1"/>
+                <w:sz w:val="20"/>
+                <w:szCs w:val="20"/>
+              </w:rPr>
+              <w:t>assignedUser.lastName</w:t>
+            </w:r>
+            <w:proofErr w:type="spellEnd"/>
+            <w:r>
+              <w:rPr>
+                <w:rFonts w:ascii="BC Sans" w:eastAsia="Times New Roman" w:hAnsi="BC Sans" w:cs="Times New Roman"/>
+                <w:color w:val="000000"/>
+                <w:kern w:val="0"/>
+                <w:sz w:val="20"/>
+                <w:szCs w:val="20"/>
+                <w14:ligatures w14:val="none"/>
+              </w:rPr>
+              <w:t>}</w:t>
+            </w:r>
+            <w:r>
+              <w:rPr>
+                <w:rFonts w:ascii="BC Sans" w:eastAsia="Times New Roman" w:hAnsi="BC Sans" w:cs="Times New Roman"/>
+                <w:color w:val="000000"/>
+                <w:kern w:val="0"/>
+                <w:sz w:val="20"/>
+                <w:szCs w:val="20"/>
+                <w14:ligatures w14:val="none"/>
+              </w:rPr>
+              <w:t>, {</w:t>
+            </w:r>
+            <w:proofErr w:type="spellStart"/>
+            <w:r>
+              <w:rPr>
+                <w:rFonts w:ascii="BC Sans" w:eastAsia="Times New Roman" w:hAnsi="BC Sans" w:cs="Times New Roman"/>
+                <w:color w:val="000000"/>
+                <w:kern w:val="0"/>
+                <w:sz w:val="20"/>
+                <w:szCs w:val="20"/>
+                <w14:ligatures w14:val="none"/>
+              </w:rPr>
+              <w:t>d.assignedUser.firstName</w:t>
+            </w:r>
+            <w:proofErr w:type="spellEnd"/>
+            <w:r>
+              <w:rPr>
+                <w:rFonts w:ascii="BC Sans" w:eastAsia="Times New Roman" w:hAnsi="BC Sans" w:cs="Times New Roman"/>
+                <w:color w:val="000000"/>
+                <w:kern w:val="0"/>
+                <w:sz w:val="20"/>
+                <w:szCs w:val="20"/>
+                <w14:ligatures w14:val="none"/>
+              </w:rPr>
+              <w:t>}</w:t>
+            </w:r>
+          </w:p>
+        </w:tc>
+      </w:tr>
+      <w:tr>
+        <w:trPr>
+          <w:trHeight w:val="360"/>
+        </w:trPr>
+        <w:tc>
+          <w:tcPr>
+            <w:cnfStyle w:val="001000000000" w:firstRow="0" w:lastRow="0" w:firstColumn="1" w:lastColumn="0" w:oddVBand="0" w:evenVBand="0" w:oddHBand="0" w:evenHBand="0" w:firstRowFirstColumn="0" w:firstRowLastColumn="0" w:lastRowFirstColumn="0" w:lastRowLastColumn="0"/>
+            <w:tcW w:w="2700" w:type="dxa"/>
+            <w:noWrap/>
+            <w:vAlign w:val="center"/>
+            <w:hideMark/>
+          </w:tcPr>
+          <w:p>
+            <w:pPr>
+              <w:spacing w:line="259" w:lineRule="auto"/>
+              <w:rPr>
+                <w:rFonts w:ascii="BC Sans" w:hAnsi="BC Sans"/>
+                <w:b w:val="0"/>
+                <w:bCs w:val="0"/>
+                <w:caps w:val="0"/>
+                <w:sz w:val="18"/>
+                <w:szCs w:val="18"/>
+              </w:rPr>
+            </w:pPr>
+            <w:r>
+              <w:rPr>
+                <w:rFonts w:ascii="BC Sans" w:hAnsi="BC Sans"/>
+                <w:b w:val="0"/>
+                <w:bCs w:val="0"/>
+                <w:caps w:val="0"/>
+                <w:sz w:val="20"/>
+                <w:szCs w:val="20"/>
+              </w:rPr>
+              <w:t>Due date</w:t>
+            </w:r>
+          </w:p>
+        </w:tc>
+        <w:tc>
+          <w:tcPr>
+            <w:tcW w:w="8216" w:type="dxa"/>
+            <w:noWrap/>
+            <w:vAlign w:val="center"/>
+            <w:hideMark/>
+          </w:tcPr>
+          <w:p>
+            <w:pPr>
+              <w:spacing w:line="259" w:lineRule="auto"/>
+              <w:cnfStyle w:val="000000000000" w:firstRow="0" w:lastRow="0" w:firstColumn="0" w:lastColumn="0" w:oddVBand="0" w:evenVBand="0" w:oddHBand="0" w:evenHBand="0" w:firstRowFirstColumn="0" w:firstRowLastColumn="0" w:lastRowFirstColumn="0" w:lastRowLastColumn="0"/>
+              <w:rPr>
+                <w:rFonts w:ascii="BC Sans" w:eastAsia="Times New Roman" w:hAnsi="BC Sans" w:cs="Times New Roman"/>
+                <w:color w:val="000000" w:themeColor="text1"/>
+                <w:sz w:val="18"/>
+                <w:szCs w:val="18"/>
+              </w:rPr>
+            </w:pPr>
+            <w:r>
+              <w:rPr>
+                <w:rFonts w:ascii="BC Sans" w:hAnsi="BC Sans" w:cs="BC Sans Light"/>
+                <w:sz w:val="20"/>
+                <w:szCs w:val="20"/>
+              </w:rPr>
+              <w:t>{</w:t>
+            </w:r>
+            <w:proofErr w:type="spellStart"/>
+            <w:r>
+              <w:rPr>
+                <w:rFonts w:ascii="BC Sans" w:hAnsi="BC Sans" w:cs="BC Sans Light"/>
+                <w:sz w:val="20"/>
+                <w:szCs w:val="20"/>
+              </w:rPr>
+              <w:t>d.dueDate</w:t>
+            </w:r>
+            <w:proofErr w:type="spellEnd"/>
+            <w:r>
+              <w:rPr>
+                <w:rFonts w:ascii="BC Sans" w:hAnsi="BC Sans" w:cs="BC Sans Light"/>
+                <w:sz w:val="20"/>
+                <w:szCs w:val="20"/>
+              </w:rPr>
+              <w:t>}</w:t>
+            </w:r>
+            <w:r>
+              <w:rPr>
+                <w:rFonts w:ascii="BC Sans" w:eastAsia="Times New Roman" w:hAnsi="BC Sans" w:cs="Times New Roman"/>
+                <w:color w:val="000000" w:themeColor="text1"/>
+                <w:sz w:val="20"/>
+                <w:szCs w:val="20"/>
+              </w:rPr>
+              <w:t>{</w:t>
+            </w:r>
+            <w:r>
+              <w:rPr>
+                <w:rFonts w:ascii="BC Sans" w:eastAsia="Times New Roman" w:hAnsi="BC Sans" w:cs="Times New Roman"/>
+                <w:color w:val="000000" w:themeColor="text1"/>
+                <w:sz w:val="20"/>
+                <w:szCs w:val="20"/>
+              </w:rPr>
+              <w:t>d.</w:t>
+            </w:r>
+            <w:proofErr w:type="spellStart"/>
+            <w:r>
+              <w:rPr>
+                <w:rFonts w:ascii="BC Sans" w:eastAsia="Times New Roman" w:hAnsi="BC Sans" w:cs="Times New Roman"/>
+                <w:color w:val="000000" w:themeColor="text1"/>
+                <w:sz w:val="20"/>
+                <w:szCs w:val="20"/>
+                <w:lang w:val="en-CA"/>
+              </w:rPr>
+              <w:t>description:ifEM:hideBegin</w:t>
             </w:r>
             <w:proofErr w:type="spellEnd"/>
             <w:r>
@@ -695,87 +824,22 @@
           </w:tcPr>
           <w:p>
             <w:pPr>
-              <w:spacing w:line="259" w:lineRule="auto"/>
+              <w:rPr>
+                <w:rFonts w:ascii="BC Sans" w:hAnsi="BC Sans"/>
+                <w:sz w:val="20"/>
+                <w:szCs w:val="20"/>
+              </w:rPr>
+            </w:pPr>
+            <w:r>
               <w:rPr>
                 <w:rFonts w:ascii="BC Sans" w:hAnsi="BC Sans"/>
                 <w:b w:val="0"/>
                 <w:bCs w:val="0"/>
                 <w:caps w:val="0"/>
-                <w:sz w:val="18"/>
-                <w:szCs w:val="18"/>
-              </w:rPr>
-            </w:pPr>
-            <w:r>
-              <w:rPr>
-                <w:rFonts w:ascii="BC Sans" w:hAnsi="BC Sans"/>
-                <w:b w:val="0"/>
-                <w:bCs w:val="0"/>
-                <w:caps w:val="0"/>
-                <w:sz w:val="20"/>
-                <w:szCs w:val="20"/>
-              </w:rPr>
-              <w:t>{</w:t>
-            </w:r>
-            <w:proofErr w:type="spellStart"/>
-            <w:proofErr w:type="gramStart"/>
-            <w:r>
-              <w:rPr>
-                <w:rFonts w:ascii="BC Sans" w:hAnsi="BC Sans"/>
-                <w:b w:val="0"/>
-                <w:bCs w:val="0"/>
-                <w:caps w:val="0"/>
-                <w:sz w:val="20"/>
-                <w:szCs w:val="20"/>
-              </w:rPr>
-              <w:t>d.taskType.type</w:t>
-            </w:r>
-            <w:proofErr w:type="gramEnd"/>
-            <w:r>
-              <w:rPr>
-                <w:rFonts w:ascii="BC Sans" w:hAnsi="BC Sans"/>
-                <w:b w:val="0"/>
-                <w:bCs w:val="0"/>
-                <w:caps w:val="0"/>
-                <w:sz w:val="20"/>
-                <w:szCs w:val="20"/>
-              </w:rPr>
-              <w:t>.</w:t>
-            </w:r>
-            <w:proofErr w:type="gramStart"/>
-            <w:r>
-              <w:rPr>
-                <w:rFonts w:ascii="BC Sans" w:hAnsi="BC Sans"/>
-                <w:b w:val="0"/>
-                <w:bCs w:val="0"/>
-                <w:caps w:val="0"/>
-                <w:sz w:val="20"/>
-                <w:szCs w:val="20"/>
-              </w:rPr>
-              <w:t>longDescription:hideEnd</w:t>
-            </w:r>
-            <w:proofErr w:type="spellEnd"/>
-            <w:proofErr w:type="gramEnd"/>
-            <w:r>
-              <w:rPr>
-                <w:rFonts w:ascii="BC Sans" w:hAnsi="BC Sans"/>
-                <w:b w:val="0"/>
-                <w:bCs w:val="0"/>
-                <w:caps w:val="0"/>
-                <w:sz w:val="20"/>
-                <w:szCs w:val="20"/>
-              </w:rPr>
-              <w:t>}</w:t>
-            </w:r>
-            <w:r>
-              <w:rPr>
-                <w:rFonts w:ascii="BC Sans" w:hAnsi="BC Sans"/>
-                <w:b w:val="0"/>
-                <w:bCs w:val="0"/>
-                <w:caps w:val="0"/>
-                <w:sz w:val="20"/>
-                <w:szCs w:val="20"/>
-              </w:rPr>
-              <w:t>Remarks</w:t>
+                <w:sz w:val="20"/>
+                <w:szCs w:val="20"/>
+              </w:rPr>
+              <w:t>Task detail</w:t>
             </w:r>
           </w:p>
         </w:tc>
@@ -787,423 +851,31 @@
           </w:tcPr>
           <w:p>
             <w:pPr>
-              <w:spacing w:line="259" w:lineRule="auto"/>
               <w:cnfStyle w:val="000000100000" w:firstRow="0" w:lastRow="0" w:firstColumn="0" w:lastColumn="0" w:oddVBand="0" w:evenVBand="0" w:oddHBand="1" w:evenHBand="0" w:firstRowFirstColumn="0" w:firstRowLastColumn="0" w:lastRowFirstColumn="0" w:lastRowLastColumn="0"/>
               <w:rPr>
-                <w:rFonts w:ascii="BC Sans" w:eastAsia="Times New Roman" w:hAnsi="BC Sans" w:cs="Times New Roman"/>
-                <w:color w:val="000000" w:themeColor="text1"/>
-                <w:sz w:val="18"/>
-                <w:szCs w:val="18"/>
+                <w:rFonts w:ascii="BC Sans" w:hAnsi="BC Sans" w:cs="BC Sans Light"/>
+                <w:sz w:val="20"/>
+                <w:szCs w:val="20"/>
               </w:rPr>
             </w:pPr>
             <w:r>
               <w:rPr>
-                <w:rFonts w:ascii="BC Sans" w:eastAsia="Times New Roman" w:hAnsi="BC Sans" w:cs="Times New Roman"/>
-                <w:color w:val="000000" w:themeColor="text1"/>
+                <w:rFonts w:ascii="BC Sans" w:hAnsi="BC Sans" w:cs="BC Sans Light"/>
                 <w:sz w:val="20"/>
                 <w:szCs w:val="20"/>
               </w:rPr>
               <w:t>{</w:t>
             </w:r>
             <w:proofErr w:type="spellStart"/>
-            <w:proofErr w:type="gramStart"/>
-            <w:r>
-              <w:rPr>
-                <w:rFonts w:ascii="BC Sans" w:eastAsia="Times New Roman" w:hAnsi="BC Sans" w:cs="Times New Roman"/>
-                <w:color w:val="000000" w:themeColor="text1"/>
-                <w:sz w:val="20"/>
-                <w:szCs w:val="20"/>
-              </w:rPr>
-              <w:t>d</w:t>
-            </w:r>
-            <w:r>
-              <w:rPr>
-                <w:rFonts w:ascii="BC Sans" w:eastAsia="Times New Roman" w:hAnsi="BC Sans" w:cs="Times New Roman"/>
-                <w:color w:val="000000" w:themeColor="text1"/>
-                <w:sz w:val="20"/>
-                <w:szCs w:val="20"/>
-              </w:rPr>
-              <w:t>.</w:t>
-            </w:r>
-            <w:r>
-              <w:rPr>
-                <w:rFonts w:ascii="BC Sans" w:eastAsia="Times New Roman" w:hAnsi="BC Sans" w:cs="Times New Roman"/>
-                <w:color w:val="000000" w:themeColor="text1"/>
-                <w:sz w:val="20"/>
-                <w:szCs w:val="20"/>
-              </w:rPr>
-              <w:t>remarks</w:t>
-            </w:r>
-            <w:proofErr w:type="spellEnd"/>
-            <w:proofErr w:type="gramEnd"/>
-            <w:r>
-              <w:rPr>
-                <w:rFonts w:ascii="BC Sans" w:eastAsia="Times New Roman" w:hAnsi="BC Sans" w:cs="Times New Roman"/>
-                <w:color w:val="000000" w:themeColor="text1"/>
-                <w:sz w:val="20"/>
-                <w:szCs w:val="20"/>
-              </w:rPr>
-              <w:t>}</w:t>
-            </w:r>
-          </w:p>
-        </w:tc>
-      </w:tr>
-      <w:tr>
-        <w:trPr>
-          <w:trHeight w:val="360"/>
-        </w:trPr>
-        <w:tc>
-          <w:tcPr>
-            <w:cnfStyle w:val="001000000000" w:firstRow="0" w:lastRow="0" w:firstColumn="1" w:lastColumn="0" w:oddVBand="0" w:evenVBand="0" w:oddHBand="0" w:evenHBand="0" w:firstRowFirstColumn="0" w:firstRowLastColumn="0" w:lastRowFirstColumn="0" w:lastRowLastColumn="0"/>
-            <w:tcW w:w="2700" w:type="dxa"/>
-            <w:noWrap/>
-            <w:vAlign w:val="center"/>
-            <w:hideMark/>
-          </w:tcPr>
-          <w:p>
-            <w:r>
-              <w:rPr>
-                <w:rFonts w:ascii="BC Sans" w:hAnsi="BC Sans"/>
-                <w:b w:val="0"/>
-                <w:bCs w:val="0"/>
-                <w:caps w:val="0"/>
-                <w:sz w:val="20"/>
-                <w:szCs w:val="20"/>
-              </w:rPr>
-              <w:t>Officer assigned</w:t>
-            </w:r>
-          </w:p>
-        </w:tc>
-        <w:tc>
-          <w:tcPr>
-            <w:tcW w:w="8216" w:type="dxa"/>
-            <w:noWrap/>
-            <w:vAlign w:val="center"/>
-            <w:hideMark/>
-          </w:tcPr>
-          <w:p>
-            <w:pPr>
-              <w:cnfStyle w:val="000000000000" w:firstRow="0" w:lastRow="0" w:firstColumn="0" w:lastColumn="0" w:oddVBand="0" w:evenVBand="0" w:oddHBand="0" w:evenHBand="0" w:firstRowFirstColumn="0" w:firstRowLastColumn="0" w:lastRowFirstColumn="0" w:lastRowLastColumn="0"/>
-              <w:rPr>
-                <w:rFonts w:ascii="BC Sans" w:eastAsia="Times New Roman" w:hAnsi="BC Sans" w:cs="Times New Roman"/>
-                <w:color w:val="000000"/>
-                <w:kern w:val="0"/>
-                <w:sz w:val="20"/>
-                <w:szCs w:val="20"/>
-                <w14:ligatures w14:val="none"/>
-              </w:rPr>
-            </w:pPr>
-            <w:r>
-              <w:rPr>
-                <w:rFonts w:ascii="BC Sans" w:eastAsia="Times New Roman" w:hAnsi="BC Sans" w:cs="Times New Roman"/>
-                <w:color w:val="000000"/>
-                <w:kern w:val="0"/>
-                <w:sz w:val="20"/>
-                <w:szCs w:val="20"/>
-                <w14:ligatures w14:val="none"/>
-              </w:rPr>
-              <w:t>{</w:t>
-            </w:r>
-            <w:proofErr w:type="spellStart"/>
-            <w:proofErr w:type="gramStart"/>
-            <w:r>
-              <w:rPr>
-                <w:rFonts w:ascii="BC Sans" w:eastAsia="Times New Roman" w:hAnsi="BC Sans" w:cs="Times New Roman"/>
-                <w:color w:val="000000"/>
-                <w:kern w:val="0"/>
-                <w:sz w:val="20"/>
-                <w:szCs w:val="20"/>
-                <w14:ligatures w14:val="none"/>
-              </w:rPr>
-              <w:t>d</w:t>
-            </w:r>
-            <w:r>
-              <w:rPr>
-                <w:rFonts w:ascii="BC Sans" w:eastAsia="Times New Roman" w:hAnsi="BC Sans" w:cs="Times New Roman"/>
-                <w:color w:val="000000" w:themeColor="text1"/>
-                <w:sz w:val="20"/>
-                <w:szCs w:val="20"/>
-              </w:rPr>
-              <w:t>.</w:t>
-            </w:r>
-            <w:r>
-              <w:rPr>
-                <w:rFonts w:ascii="BC Sans" w:eastAsia="Times New Roman" w:hAnsi="BC Sans" w:cs="Times New Roman"/>
-                <w:color w:val="000000" w:themeColor="text1"/>
-                <w:sz w:val="20"/>
-                <w:szCs w:val="20"/>
-              </w:rPr>
-              <w:t>assignedUser.lastName</w:t>
-            </w:r>
-            <w:proofErr w:type="spellEnd"/>
-            <w:proofErr w:type="gramEnd"/>
-            <w:r>
-              <w:rPr>
-                <w:rFonts w:ascii="BC Sans" w:eastAsia="Times New Roman" w:hAnsi="BC Sans" w:cs="Times New Roman"/>
-                <w:color w:val="000000"/>
-                <w:kern w:val="0"/>
-                <w:sz w:val="20"/>
-                <w:szCs w:val="20"/>
-                <w14:ligatures w14:val="none"/>
-              </w:rPr>
-              <w:t>}</w:t>
-            </w:r>
-            <w:r>
-              <w:rPr>
-                <w:rFonts w:ascii="BC Sans" w:eastAsia="Times New Roman" w:hAnsi="BC Sans" w:cs="Times New Roman"/>
-                <w:color w:val="000000"/>
-                <w:kern w:val="0"/>
-                <w:sz w:val="20"/>
-                <w:szCs w:val="20"/>
-                <w14:ligatures w14:val="none"/>
-              </w:rPr>
-              <w:t>, {</w:t>
-            </w:r>
-            <w:proofErr w:type="spellStart"/>
-            <w:proofErr w:type="gramStart"/>
-            <w:r>
-              <w:rPr>
-                <w:rFonts w:ascii="BC Sans" w:eastAsia="Times New Roman" w:hAnsi="BC Sans" w:cs="Times New Roman"/>
-                <w:color w:val="000000"/>
-                <w:kern w:val="0"/>
-                <w:sz w:val="20"/>
-                <w:szCs w:val="20"/>
-                <w14:ligatures w14:val="none"/>
-              </w:rPr>
-              <w:t>d.assignedUser.firstName</w:t>
-            </w:r>
-            <w:proofErr w:type="spellEnd"/>
-            <w:proofErr w:type="gramEnd"/>
-            <w:r>
-              <w:rPr>
-                <w:rFonts w:ascii="BC Sans" w:eastAsia="Times New Roman" w:hAnsi="BC Sans" w:cs="Times New Roman"/>
-                <w:color w:val="000000"/>
-                <w:kern w:val="0"/>
-                <w:sz w:val="20"/>
-                <w:szCs w:val="20"/>
-                <w14:ligatures w14:val="none"/>
-              </w:rPr>
-              <w:t>}</w:t>
-            </w:r>
-          </w:p>
-        </w:tc>
-      </w:tr>
-      <w:tr>
-        <w:trPr>
-          <w:cnfStyle w:val="000000100000" w:firstRow="0" w:lastRow="0" w:firstColumn="0" w:lastColumn="0" w:oddVBand="0" w:evenVBand="0" w:oddHBand="1" w:evenHBand="0" w:firstRowFirstColumn="0" w:firstRowLastColumn="0" w:lastRowFirstColumn="0" w:lastRowLastColumn="0"/>
-          <w:trHeight w:val="360"/>
-        </w:trPr>
-        <w:tc>
-          <w:tcPr>
-            <w:cnfStyle w:val="001000000000" w:firstRow="0" w:lastRow="0" w:firstColumn="1" w:lastColumn="0" w:oddVBand="0" w:evenVBand="0" w:oddHBand="0" w:evenHBand="0" w:firstRowFirstColumn="0" w:firstRowLastColumn="0" w:lastRowFirstColumn="0" w:lastRowLastColumn="0"/>
-            <w:tcW w:w="2700" w:type="dxa"/>
-            <w:noWrap/>
-            <w:vAlign w:val="center"/>
-            <w:hideMark/>
-          </w:tcPr>
-          <w:p>
-            <w:pPr>
-              <w:spacing w:line="259" w:lineRule="auto"/>
-              <w:rPr>
-                <w:rFonts w:ascii="BC Sans" w:hAnsi="BC Sans"/>
-                <w:b w:val="0"/>
-                <w:bCs w:val="0"/>
-                <w:caps w:val="0"/>
-                <w:sz w:val="18"/>
-                <w:szCs w:val="18"/>
-              </w:rPr>
-            </w:pPr>
-            <w:r>
-              <w:rPr>
-                <w:rFonts w:ascii="BC Sans" w:hAnsi="BC Sans"/>
-                <w:b w:val="0"/>
-                <w:bCs w:val="0"/>
-                <w:caps w:val="0"/>
-                <w:sz w:val="20"/>
-                <w:szCs w:val="20"/>
-              </w:rPr>
-              <w:t>Due date</w:t>
-            </w:r>
-          </w:p>
-        </w:tc>
-        <w:tc>
-          <w:tcPr>
-            <w:tcW w:w="8216" w:type="dxa"/>
-            <w:noWrap/>
-            <w:vAlign w:val="center"/>
-            <w:hideMark/>
-          </w:tcPr>
-          <w:p>
-            <w:pPr>
-              <w:spacing w:line="259" w:lineRule="auto"/>
-              <w:cnfStyle w:val="000000100000" w:firstRow="0" w:lastRow="0" w:firstColumn="0" w:lastColumn="0" w:oddVBand="0" w:evenVBand="0" w:oddHBand="1" w:evenHBand="0" w:firstRowFirstColumn="0" w:firstRowLastColumn="0" w:lastRowFirstColumn="0" w:lastRowLastColumn="0"/>
-              <w:rPr>
-                <w:rFonts w:ascii="BC Sans" w:eastAsia="Times New Roman" w:hAnsi="BC Sans" w:cs="Times New Roman"/>
-                <w:color w:val="000000" w:themeColor="text1"/>
-                <w:sz w:val="18"/>
-                <w:szCs w:val="18"/>
-              </w:rPr>
-            </w:pPr>
             <w:r>
               <w:rPr>
                 <w:rFonts w:ascii="BC Sans" w:hAnsi="BC Sans" w:cs="BC Sans Light"/>
                 <w:sz w:val="20"/>
                 <w:szCs w:val="20"/>
               </w:rPr>
-              <w:t>{</w:t>
-            </w:r>
-            <w:proofErr w:type="spellStart"/>
-            <w:proofErr w:type="gramStart"/>
-            <w:r>
-              <w:rPr>
-                <w:rFonts w:ascii="BC Sans" w:hAnsi="BC Sans" w:cs="BC Sans Light"/>
-                <w:sz w:val="20"/>
-                <w:szCs w:val="20"/>
-              </w:rPr>
-              <w:t>d.dueDate</w:t>
-            </w:r>
-            <w:proofErr w:type="spellEnd"/>
-            <w:proofErr w:type="gramEnd"/>
-            <w:r>
-              <w:rPr>
-                <w:rFonts w:ascii="BC Sans" w:hAnsi="BC Sans" w:cs="BC Sans Light"/>
-                <w:sz w:val="20"/>
-                <w:szCs w:val="20"/>
-              </w:rPr>
-              <w:t>}</w:t>
-            </w:r>
-            <w:r>
-              <w:rPr>
-                <w:rFonts w:ascii="BC Sans" w:eastAsia="Times New Roman" w:hAnsi="BC Sans" w:cs="Times New Roman"/>
-                <w:color w:val="000000" w:themeColor="text1"/>
-                <w:sz w:val="20"/>
-                <w:szCs w:val="20"/>
-              </w:rPr>
-              <w:t>{</w:t>
-            </w:r>
-            <w:proofErr w:type="gramStart"/>
-            <w:r>
-              <w:rPr>
-                <w:rFonts w:ascii="BC Sans" w:eastAsia="Times New Roman" w:hAnsi="BC Sans" w:cs="Times New Roman"/>
-                <w:color w:val="000000" w:themeColor="text1"/>
-                <w:sz w:val="20"/>
-                <w:szCs w:val="20"/>
-              </w:rPr>
-              <w:t>d.</w:t>
-            </w:r>
-            <w:proofErr w:type="spellStart"/>
-            <w:r>
-              <w:rPr>
-                <w:rFonts w:ascii="BC Sans" w:eastAsia="Times New Roman" w:hAnsi="BC Sans" w:cs="Times New Roman"/>
-                <w:color w:val="000000" w:themeColor="text1"/>
-                <w:sz w:val="20"/>
-                <w:szCs w:val="20"/>
-                <w:lang w:val="en-CA"/>
-              </w:rPr>
-              <w:t>description</w:t>
-            </w:r>
-            <w:proofErr w:type="gramEnd"/>
-            <w:r>
-              <w:rPr>
-                <w:rFonts w:ascii="BC Sans" w:eastAsia="Times New Roman" w:hAnsi="BC Sans" w:cs="Times New Roman"/>
-                <w:color w:val="000000" w:themeColor="text1"/>
-                <w:sz w:val="20"/>
-                <w:szCs w:val="20"/>
-                <w:lang w:val="en-CA"/>
-              </w:rPr>
-              <w:t>:</w:t>
-            </w:r>
-            <w:proofErr w:type="gramStart"/>
-            <w:r>
-              <w:rPr>
-                <w:rFonts w:ascii="BC Sans" w:eastAsia="Times New Roman" w:hAnsi="BC Sans" w:cs="Times New Roman"/>
-                <w:color w:val="000000" w:themeColor="text1"/>
-                <w:sz w:val="20"/>
-                <w:szCs w:val="20"/>
-                <w:lang w:val="en-CA"/>
-              </w:rPr>
-              <w:t>ifEM:hideBegin</w:t>
-            </w:r>
-            <w:proofErr w:type="spellEnd"/>
-            <w:proofErr w:type="gramEnd"/>
-            <w:r>
-              <w:rPr>
-                <w:rFonts w:ascii="BC Sans" w:hAnsi="BC Sans"/>
-                <w:sz w:val="20"/>
-                <w:szCs w:val="20"/>
-              </w:rPr>
-              <w:t>}</w:t>
-            </w:r>
-          </w:p>
-        </w:tc>
-      </w:tr>
-      <w:tr>
-        <w:trPr>
-          <w:trHeight w:val="360"/>
-        </w:trPr>
-        <w:tc>
-          <w:tcPr>
-            <w:cnfStyle w:val="001000000000" w:firstRow="0" w:lastRow="0" w:firstColumn="1" w:lastColumn="0" w:oddVBand="0" w:evenVBand="0" w:oddHBand="0" w:evenHBand="0" w:firstRowFirstColumn="0" w:firstRowLastColumn="0" w:lastRowFirstColumn="0" w:lastRowLastColumn="0"/>
-            <w:tcW w:w="2700" w:type="dxa"/>
-            <w:noWrap/>
-            <w:vAlign w:val="center"/>
-          </w:tcPr>
-          <w:p>
-            <w:pPr>
-              <w:rPr>
-                <w:rFonts w:ascii="BC Sans" w:hAnsi="BC Sans"/>
-                <w:sz w:val="20"/>
-                <w:szCs w:val="20"/>
-              </w:rPr>
-            </w:pPr>
-            <w:r>
-              <w:rPr>
-                <w:rFonts w:ascii="BC Sans" w:hAnsi="BC Sans"/>
-                <w:b w:val="0"/>
-                <w:bCs w:val="0"/>
-                <w:caps w:val="0"/>
-                <w:sz w:val="20"/>
-                <w:szCs w:val="20"/>
-              </w:rPr>
-              <w:t>Task detail</w:t>
-            </w:r>
-          </w:p>
-        </w:tc>
-        <w:tc>
-          <w:tcPr>
-            <w:tcW w:w="8216" w:type="dxa"/>
-            <w:noWrap/>
-            <w:vAlign w:val="center"/>
-          </w:tcPr>
-          <w:p>
-            <w:pPr>
-              <w:cnfStyle w:val="000000000000" w:firstRow="0" w:lastRow="0" w:firstColumn="0" w:lastColumn="0" w:oddVBand="0" w:evenVBand="0" w:oddHBand="0" w:evenHBand="0" w:firstRowFirstColumn="0" w:firstRowLastColumn="0" w:lastRowFirstColumn="0" w:lastRowLastColumn="0"/>
-              <w:rPr>
-                <w:rFonts w:ascii="BC Sans" w:hAnsi="BC Sans" w:cs="BC Sans Light"/>
-                <w:sz w:val="20"/>
-                <w:szCs w:val="20"/>
-              </w:rPr>
-            </w:pPr>
-            <w:r>
-              <w:rPr>
-                <w:rFonts w:ascii="BC Sans" w:hAnsi="BC Sans" w:cs="BC Sans Light"/>
-                <w:sz w:val="20"/>
-                <w:szCs w:val="20"/>
-              </w:rPr>
-              <w:t>{</w:t>
-            </w:r>
-            <w:proofErr w:type="spellStart"/>
-            <w:proofErr w:type="gramStart"/>
-            <w:r>
-              <w:rPr>
-                <w:rFonts w:ascii="BC Sans" w:hAnsi="BC Sans" w:cs="BC Sans Light"/>
-                <w:sz w:val="20"/>
-                <w:szCs w:val="20"/>
-              </w:rPr>
               <w:t>d.description</w:t>
             </w:r>
             <w:proofErr w:type="spellEnd"/>
-            <w:proofErr w:type="gramEnd"/>
             <w:r>
               <w:rPr>
                 <w:rFonts w:ascii="BC Sans" w:hAnsi="BC Sans" w:cs="BC Sans Light"/>
@@ -1244,7 +916,6 @@
         </w:rPr>
         <w:t>{</w:t>
       </w:r>
-      <w:proofErr w:type="gramStart"/>
       <w:r>
         <w:rPr>
           <w:rFonts w:ascii="BC Sans" w:eastAsia="Times New Roman" w:hAnsi="BC Sans" w:cs="Times New Roman"/>
@@ -1263,32 +934,9 @@
           <w:szCs w:val="20"/>
           <w:lang w:val="en-CA"/>
         </w:rPr>
-        <w:t>description</w:t>
-      </w:r>
-      <w:proofErr w:type="gramEnd"/>
-      <w:r>
-        <w:rPr>
-          <w:rFonts w:ascii="BC Sans" w:eastAsia="Times New Roman" w:hAnsi="BC Sans" w:cs="Times New Roman"/>
-          <w:color w:val="000000" w:themeColor="text1"/>
-          <w:sz w:val="20"/>
-          <w:szCs w:val="20"/>
-          <w:lang w:val="en-CA"/>
-        </w:rPr>
-        <w:t>:</w:t>
-      </w:r>
-      <w:proofErr w:type="gramStart"/>
-      <w:r>
-        <w:rPr>
-          <w:rFonts w:ascii="BC Sans" w:eastAsia="Times New Roman" w:hAnsi="BC Sans" w:cs="Times New Roman"/>
-          <w:color w:val="000000" w:themeColor="text1"/>
-          <w:sz w:val="20"/>
-          <w:szCs w:val="20"/>
-          <w:lang w:val="en-CA"/>
-        </w:rPr>
-        <w:t>ifEM:hideEnd</w:t>
+        <w:t>description:ifEM:hideEnd</w:t>
       </w:r>
       <w:proofErr w:type="spellEnd"/>
-      <w:proofErr w:type="gramEnd"/>
       <w:r>
         <w:rPr>
           <w:rFonts w:ascii="BC Sans" w:hAnsi="BC Sans"/>
@@ -1306,23 +954,13 @@
         <w:t>{</w:t>
       </w:r>
       <w:proofErr w:type="spellStart"/>
-      <w:proofErr w:type="gramStart"/>
       <w:r>
         <w:rPr>
           <w:rFonts w:ascii="BC Sans" w:hAnsi="BC Sans"/>
           <w:sz w:val="20"/>
           <w:szCs w:val="20"/>
         </w:rPr>
-        <w:t>d.hasDiaryDates</w:t>
-      </w:r>
-      <w:proofErr w:type="gramEnd"/>
-      <w:r>
-        <w:rPr>
-          <w:rFonts w:ascii="BC Sans" w:hAnsi="BC Sans"/>
-          <w:sz w:val="20"/>
-          <w:szCs w:val="20"/>
-        </w:rPr>
-        <w:t>:ifEQ</w:t>
+        <w:t>d.hasDiaryDates:ifEQ</w:t>
       </w:r>
       <w:proofErr w:type="spellEnd"/>
       <w:r>
@@ -1331,16 +969,7 @@
           <w:sz w:val="20"/>
           <w:szCs w:val="20"/>
         </w:rPr>
-        <w:t>(true</w:t>
-      </w:r>
-      <w:proofErr w:type="gramStart"/>
-      <w:r>
-        <w:rPr>
-          <w:rFonts w:ascii="BC Sans" w:hAnsi="BC Sans"/>
-          <w:sz w:val="20"/>
-          <w:szCs w:val="20"/>
-        </w:rPr>
-        <w:t>):</w:t>
+        <w:t>(true):</w:t>
       </w:r>
       <w:proofErr w:type="spellStart"/>
       <w:r>
@@ -1352,7 +981,6 @@
         <w:t>showBegin</w:t>
       </w:r>
       <w:proofErr w:type="spellEnd"/>
-      <w:proofErr w:type="gramEnd"/>
       <w:r>
         <w:rPr>
           <w:rFonts w:ascii="BC Sans" w:hAnsi="BC Sans"/>
@@ -1536,7 +1164,6 @@
               <w:t>{</w:t>
             </w:r>
             <w:proofErr w:type="spellStart"/>
-            <w:proofErr w:type="gramStart"/>
             <w:r>
               <w:rPr>
                 <w:rFonts w:ascii="BC Sans" w:hAnsi="BC Sans"/>
@@ -1549,7 +1176,6 @@
               <w:t>d.diaryDates</w:t>
             </w:r>
             <w:proofErr w:type="spellEnd"/>
-            <w:proofErr w:type="gramEnd"/>
             <w:r>
               <w:rPr>
                 <w:rFonts w:ascii="BC Sans" w:hAnsi="BC Sans"/>
@@ -1574,7 +1200,6 @@
               <w:t>i</w:t>
             </w:r>
             <w:proofErr w:type="spellEnd"/>
-            <w:proofErr w:type="gramStart"/>
             <w:r>
               <w:rPr>
                 <w:rFonts w:ascii="BC Sans" w:hAnsi="BC Sans"/>
@@ -1599,7 +1224,6 @@
               <w:t>dueDate</w:t>
             </w:r>
             <w:proofErr w:type="spellEnd"/>
-            <w:proofErr w:type="gramEnd"/>
             <w:r>
               <w:rPr>
                 <w:rFonts w:ascii="BC Sans" w:hAnsi="BC Sans"/>
@@ -1640,7 +1264,6 @@
               <w:t>{</w:t>
             </w:r>
             <w:proofErr w:type="spellStart"/>
-            <w:proofErr w:type="gramStart"/>
             <w:r>
               <w:rPr>
                 <w:rFonts w:ascii="BC Sans" w:eastAsia="Times New Roman" w:hAnsi="BC Sans" w:cs="Times New Roman"/>
@@ -1651,7 +1274,6 @@
               <w:t>d.diaryDates</w:t>
             </w:r>
             <w:proofErr w:type="spellEnd"/>
-            <w:proofErr w:type="gramEnd"/>
             <w:r>
               <w:rPr>
                 <w:rFonts w:ascii="BC Sans" w:eastAsia="Times New Roman" w:hAnsi="BC Sans" w:cs="Times New Roman"/>
@@ -1672,7 +1294,6 @@
               <w:t>i</w:t>
             </w:r>
             <w:proofErr w:type="spellEnd"/>
-            <w:proofErr w:type="gramStart"/>
             <w:r>
               <w:rPr>
                 <w:rFonts w:ascii="BC Sans" w:eastAsia="Times New Roman" w:hAnsi="BC Sans" w:cs="Times New Roman"/>
@@ -1680,17 +1301,7 @@
                 <w:sz w:val="18"/>
                 <w:szCs w:val="18"/>
               </w:rPr>
-              <w:t>].description</w:t>
-            </w:r>
-            <w:proofErr w:type="gramEnd"/>
-            <w:r>
-              <w:rPr>
-                <w:rFonts w:ascii="BC Sans" w:eastAsia="Times New Roman" w:hAnsi="BC Sans" w:cs="Times New Roman"/>
-                <w:color w:val="000000" w:themeColor="text1"/>
-                <w:sz w:val="18"/>
-                <w:szCs w:val="18"/>
-              </w:rPr>
-              <w:t>}</w:t>
+              <w:t>].description}</w:t>
             </w:r>
           </w:p>
         </w:tc>
@@ -1729,7 +1340,6 @@
               <w:t>{</w:t>
             </w:r>
             <w:proofErr w:type="spellStart"/>
-            <w:proofErr w:type="gramStart"/>
             <w:r>
               <w:rPr>
                 <w:rFonts w:ascii="BC Sans" w:hAnsi="BC Sans"/>
@@ -1742,7 +1352,6 @@
               <w:t>d.diaryDates</w:t>
             </w:r>
             <w:proofErr w:type="spellEnd"/>
-            <w:proofErr w:type="gramEnd"/>
             <w:r>
               <w:rPr>
                 <w:rFonts w:ascii="BC Sans" w:hAnsi="BC Sans"/>
@@ -1752,9 +1361,9 @@
                 <w:sz w:val="20"/>
                 <w:szCs w:val="20"/>
               </w:rPr>
-              <w:t>[i+1</w:t>
-            </w:r>
-            <w:proofErr w:type="gramStart"/>
+              <w:t>[i+1].</w:t>
+            </w:r>
+            <w:proofErr w:type="spellStart"/>
             <w:r>
               <w:rPr>
                 <w:rFonts w:ascii="BC Sans" w:hAnsi="BC Sans"/>
@@ -1764,22 +1373,9 @@
                 <w:sz w:val="20"/>
                 <w:szCs w:val="20"/>
               </w:rPr>
-              <w:t>].</w:t>
-            </w:r>
-            <w:proofErr w:type="spellStart"/>
-            <w:r>
-              <w:rPr>
-                <w:rFonts w:ascii="BC Sans" w:hAnsi="BC Sans"/>
-                <w:b w:val="0"/>
-                <w:bCs w:val="0"/>
-                <w:caps w:val="0"/>
-                <w:sz w:val="20"/>
-                <w:szCs w:val="20"/>
-              </w:rPr>
               <w:t>dueDate</w:t>
             </w:r>
             <w:proofErr w:type="spellEnd"/>
-            <w:proofErr w:type="gramEnd"/>
             <w:r>
               <w:rPr>
                 <w:rFonts w:ascii="BC Sans" w:hAnsi="BC Sans"/>
@@ -1819,7 +1415,6 @@
               <w:t>{</w:t>
             </w:r>
             <w:proofErr w:type="spellStart"/>
-            <w:proofErr w:type="gramStart"/>
             <w:r>
               <w:rPr>
                 <w:rFonts w:ascii="BC Sans" w:eastAsia="Times New Roman" w:hAnsi="BC Sans" w:cs="Times New Roman"/>
@@ -1830,7 +1425,6 @@
               <w:t>d.diaryDates</w:t>
             </w:r>
             <w:proofErr w:type="spellEnd"/>
-            <w:proofErr w:type="gramEnd"/>
             <w:r>
               <w:rPr>
                 <w:rFonts w:ascii="BC Sans" w:eastAsia="Times New Roman" w:hAnsi="BC Sans" w:cs="Times New Roman"/>
@@ -1838,27 +1432,7 @@
                 <w:sz w:val="18"/>
                 <w:szCs w:val="18"/>
               </w:rPr>
-              <w:t>[i+1</w:t>
-            </w:r>
-            <w:proofErr w:type="gramStart"/>
-            <w:r>
-              <w:rPr>
-                <w:rFonts w:ascii="BC Sans" w:eastAsia="Times New Roman" w:hAnsi="BC Sans" w:cs="Times New Roman"/>
-                <w:color w:val="000000" w:themeColor="text1"/>
-                <w:sz w:val="18"/>
-                <w:szCs w:val="18"/>
-              </w:rPr>
-              <w:t>].description</w:t>
-            </w:r>
-            <w:proofErr w:type="gramEnd"/>
-            <w:r>
-              <w:rPr>
-                <w:rFonts w:ascii="BC Sans" w:eastAsia="Times New Roman" w:hAnsi="BC Sans" w:cs="Times New Roman"/>
-                <w:color w:val="000000" w:themeColor="text1"/>
-                <w:sz w:val="18"/>
-                <w:szCs w:val="18"/>
-              </w:rPr>
-              <w:t>}</w:t>
+              <w:t>[i+1].description}</w:t>
             </w:r>
           </w:p>
         </w:tc>
@@ -1881,34 +1455,7 @@
           <w:sz w:val="20"/>
           <w:szCs w:val="20"/>
         </w:rPr>
-        <w:t>{</w:t>
-      </w:r>
-      <w:proofErr w:type="gramStart"/>
-      <w:r>
-        <w:rPr>
-          <w:rFonts w:ascii="BC Sans" w:hAnsi="BC Sans"/>
-          <w:sz w:val="20"/>
-          <w:szCs w:val="20"/>
-        </w:rPr>
-        <w:t>d.hasDiaryDates</w:t>
-      </w:r>
-      <w:proofErr w:type="gramEnd"/>
-      <w:r>
-        <w:rPr>
-          <w:rFonts w:ascii="BC Sans" w:hAnsi="BC Sans"/>
-          <w:sz w:val="20"/>
-          <w:szCs w:val="20"/>
-        </w:rPr>
-        <w:t>:</w:t>
-      </w:r>
-      <w:proofErr w:type="gramStart"/>
-      <w:r>
-        <w:rPr>
-          <w:rFonts w:ascii="BC Sans" w:hAnsi="BC Sans"/>
-          <w:sz w:val="20"/>
-          <w:szCs w:val="20"/>
-        </w:rPr>
-        <w:t>showEnd}{d.</w:t>
+        <w:t>{d.hasDiaryDates:showEnd}{d.</w:t>
       </w:r>
       <w:r>
         <w:rPr>
@@ -1918,32 +1465,13 @@
         </w:rPr>
         <w:t>hasActivityNotes</w:t>
       </w:r>
-      <w:proofErr w:type="gramEnd"/>
       <w:r>
         <w:rPr>
           <w:rFonts w:ascii="BC Sans" w:hAnsi="BC Sans"/>
           <w:sz w:val="20"/>
           <w:szCs w:val="20"/>
         </w:rPr>
-        <w:t>:ifEQ(true</w:t>
-      </w:r>
-      <w:proofErr w:type="gramStart"/>
-      <w:r>
-        <w:rPr>
-          <w:rFonts w:ascii="BC Sans" w:hAnsi="BC Sans"/>
-          <w:sz w:val="20"/>
-          <w:szCs w:val="20"/>
-        </w:rPr>
-        <w:t>):showBegin</w:t>
-      </w:r>
-      <w:proofErr w:type="gramEnd"/>
-      <w:r>
-        <w:rPr>
-          <w:rFonts w:ascii="BC Sans" w:hAnsi="BC Sans"/>
-          <w:sz w:val="20"/>
-          <w:szCs w:val="20"/>
-        </w:rPr>
-        <w:t>}</w:t>
+        <w:t>:ifEQ(true):showBegin}</w:t>
       </w:r>
     </w:p>
     <w:tbl>
@@ -2104,7 +1632,6 @@
               <w:t>{</w:t>
             </w:r>
             <w:proofErr w:type="spellStart"/>
-            <w:proofErr w:type="gramStart"/>
             <w:r>
               <w:rPr>
                 <w:rFonts w:ascii="BC Sans" w:hAnsi="BC Sans"/>
@@ -2117,7 +1644,6 @@
               <w:t>d.activityNotes</w:t>
             </w:r>
             <w:proofErr w:type="spellEnd"/>
-            <w:proofErr w:type="gramEnd"/>
             <w:r>
               <w:rPr>
                 <w:rFonts w:ascii="BC Sans" w:hAnsi="BC Sans"/>
@@ -2142,7 +1668,6 @@
               <w:t>i</w:t>
             </w:r>
             <w:proofErr w:type="spellEnd"/>
-            <w:proofErr w:type="gramStart"/>
             <w:r>
               <w:rPr>
                 <w:rFonts w:ascii="BC Sans" w:hAnsi="BC Sans"/>
@@ -2167,7 +1692,6 @@
               <w:t>contentText</w:t>
             </w:r>
             <w:proofErr w:type="spellEnd"/>
-            <w:proofErr w:type="gramEnd"/>
             <w:r>
               <w:rPr>
                 <w:rFonts w:ascii="BC Sans" w:hAnsi="BC Sans"/>
@@ -2211,7 +1735,6 @@
               <w:t>{</w:t>
             </w:r>
             <w:proofErr w:type="spellStart"/>
-            <w:proofErr w:type="gramStart"/>
             <w:r>
               <w:rPr>
                 <w:rFonts w:ascii="BC Sans" w:eastAsia="Times New Roman" w:hAnsi="BC Sans" w:cs="Times New Roman"/>
@@ -2222,7 +1745,6 @@
               <w:t>d.activityNotes</w:t>
             </w:r>
             <w:proofErr w:type="spellEnd"/>
-            <w:proofErr w:type="gramEnd"/>
             <w:r>
               <w:rPr>
                 <w:rFonts w:ascii="BC Sans" w:eastAsia="Times New Roman" w:hAnsi="BC Sans" w:cs="Times New Roman"/>
@@ -2243,7 +1765,6 @@
               <w:t>i</w:t>
             </w:r>
             <w:proofErr w:type="spellEnd"/>
-            <w:proofErr w:type="gramStart"/>
             <w:r>
               <w:rPr>
                 <w:rFonts w:ascii="BC Sans" w:eastAsia="Times New Roman" w:hAnsi="BC Sans" w:cs="Times New Roman"/>
@@ -2264,7 +1785,6 @@
               <w:t>actionedDate</w:t>
             </w:r>
             <w:proofErr w:type="spellEnd"/>
-            <w:proofErr w:type="gramEnd"/>
             <w:r>
               <w:rPr>
                 <w:rFonts w:ascii="BC Sans" w:eastAsia="Times New Roman" w:hAnsi="BC Sans" w:cs="Times New Roman"/>
@@ -2284,7 +1804,6 @@
               <w:t xml:space="preserve"> {</w:t>
             </w:r>
             <w:proofErr w:type="spellStart"/>
-            <w:proofErr w:type="gramStart"/>
             <w:r>
               <w:rPr>
                 <w:rFonts w:ascii="BC Sans" w:eastAsia="Times New Roman" w:hAnsi="BC Sans" w:cs="Times New Roman"/>
@@ -2295,7 +1814,6 @@
               <w:t>d.activityNotes</w:t>
             </w:r>
             <w:proofErr w:type="spellEnd"/>
-            <w:proofErr w:type="gramEnd"/>
             <w:r>
               <w:rPr>
                 <w:rFonts w:ascii="BC Sans" w:eastAsia="Times New Roman" w:hAnsi="BC Sans" w:cs="Times New Roman"/>
@@ -2316,7 +1834,6 @@
               <w:t>i</w:t>
             </w:r>
             <w:proofErr w:type="spellEnd"/>
-            <w:proofErr w:type="gramStart"/>
             <w:r>
               <w:rPr>
                 <w:rFonts w:ascii="BC Sans" w:eastAsia="Times New Roman" w:hAnsi="BC Sans" w:cs="Times New Roman"/>
@@ -2337,7 +1854,6 @@
               <w:t>actionedTime</w:t>
             </w:r>
             <w:proofErr w:type="spellEnd"/>
-            <w:proofErr w:type="gramEnd"/>
             <w:r>
               <w:rPr>
                 <w:rFonts w:ascii="BC Sans" w:eastAsia="Times New Roman" w:hAnsi="BC Sans" w:cs="Times New Roman"/>
@@ -2376,7 +1892,6 @@
               <w:t>{</w:t>
             </w:r>
             <w:proofErr w:type="spellStart"/>
-            <w:proofErr w:type="gramStart"/>
             <w:r>
               <w:rPr>
                 <w:rFonts w:ascii="BC Sans" w:eastAsia="Times New Roman" w:hAnsi="BC Sans" w:cs="Times New Roman"/>
@@ -2387,7 +1902,6 @@
               <w:t>d.activityNotes</w:t>
             </w:r>
             <w:proofErr w:type="spellEnd"/>
-            <w:proofErr w:type="gramEnd"/>
             <w:r>
               <w:rPr>
                 <w:rFonts w:ascii="BC Sans" w:eastAsia="Times New Roman" w:hAnsi="BC Sans" w:cs="Times New Roman"/>
@@ -2445,9 +1959,9 @@
                 <w:sz w:val="18"/>
                 <w:szCs w:val="18"/>
               </w:rPr>
-              <w:t>.</w:t>
-            </w:r>
-            <w:proofErr w:type="gramStart"/>
+              <w:t>.lastName</w:t>
+            </w:r>
+            <w:proofErr w:type="spellEnd"/>
             <w:r>
               <w:rPr>
                 <w:rFonts w:ascii="BC Sans" w:eastAsia="Times New Roman" w:hAnsi="BC Sans" w:cs="Times New Roman"/>
@@ -2455,9 +1969,9 @@
                 <w:sz w:val="18"/>
                 <w:szCs w:val="18"/>
               </w:rPr>
-              <w:t>lastName</w:t>
-            </w:r>
-            <w:proofErr w:type="spellEnd"/>
+              <w:t>}, {</w:t>
+            </w:r>
+            <w:proofErr w:type="spellStart"/>
             <w:r>
               <w:rPr>
                 <w:rFonts w:ascii="BC Sans" w:eastAsia="Times New Roman" w:hAnsi="BC Sans" w:cs="Times New Roman"/>
@@ -2465,20 +1979,9 @@
                 <w:sz w:val="18"/>
                 <w:szCs w:val="18"/>
               </w:rPr>
-              <w:t>}, {</w:t>
-            </w:r>
-            <w:proofErr w:type="spellStart"/>
-            <w:r>
-              <w:rPr>
-                <w:rFonts w:ascii="BC Sans" w:eastAsia="Times New Roman" w:hAnsi="BC Sans" w:cs="Times New Roman"/>
-                <w:color w:val="000000" w:themeColor="text1"/>
-                <w:sz w:val="18"/>
-                <w:szCs w:val="18"/>
-              </w:rPr>
               <w:t>d.activityNotes</w:t>
             </w:r>
             <w:proofErr w:type="spellEnd"/>
-            <w:proofErr w:type="gramEnd"/>
             <w:r>
               <w:rPr>
                 <w:rFonts w:ascii="BC Sans" w:eastAsia="Times New Roman" w:hAnsi="BC Sans" w:cs="Times New Roman"/>
@@ -2585,7 +2088,6 @@
               <w:t>{</w:t>
             </w:r>
             <w:proofErr w:type="spellStart"/>
-            <w:proofErr w:type="gramStart"/>
             <w:r>
               <w:rPr>
                 <w:rFonts w:ascii="BC Sans" w:hAnsi="BC Sans"/>
@@ -2598,7 +2100,6 @@
               <w:t>d.activityNotes</w:t>
             </w:r>
             <w:proofErr w:type="spellEnd"/>
-            <w:proofErr w:type="gramEnd"/>
             <w:r>
               <w:rPr>
                 <w:rFonts w:ascii="BC Sans" w:hAnsi="BC Sans"/>
@@ -2608,9 +2109,9 @@
                 <w:sz w:val="20"/>
                 <w:szCs w:val="20"/>
               </w:rPr>
-              <w:t>[i+1</w:t>
-            </w:r>
-            <w:proofErr w:type="gramStart"/>
+              <w:t>[i+1].</w:t>
+            </w:r>
+            <w:proofErr w:type="spellStart"/>
             <w:r>
               <w:rPr>
                 <w:rFonts w:ascii="BC Sans" w:hAnsi="BC Sans"/>
@@ -2620,22 +2121,9 @@
                 <w:sz w:val="20"/>
                 <w:szCs w:val="20"/>
               </w:rPr>
-              <w:t>].</w:t>
-            </w:r>
-            <w:proofErr w:type="spellStart"/>
-            <w:r>
-              <w:rPr>
-                <w:rFonts w:ascii="BC Sans" w:hAnsi="BC Sans"/>
-                <w:b w:val="0"/>
-                <w:bCs w:val="0"/>
-                <w:caps w:val="0"/>
-                <w:sz w:val="20"/>
-                <w:szCs w:val="20"/>
-              </w:rPr>
               <w:t>contentText</w:t>
             </w:r>
             <w:proofErr w:type="spellEnd"/>
-            <w:proofErr w:type="gramEnd"/>
             <w:r>
               <w:rPr>
                 <w:rFonts w:ascii="BC Sans" w:hAnsi="BC Sans"/>
@@ -2678,7 +2166,6 @@
               <w:t>{</w:t>
             </w:r>
             <w:proofErr w:type="spellStart"/>
-            <w:proofErr w:type="gramStart"/>
             <w:r>
               <w:rPr>
                 <w:rFonts w:ascii="BC Sans" w:eastAsia="Times New Roman" w:hAnsi="BC Sans" w:cs="Times New Roman"/>
@@ -2689,7 +2176,6 @@
               <w:t>d.activityNotes</w:t>
             </w:r>
             <w:proofErr w:type="spellEnd"/>
-            <w:proofErr w:type="gramEnd"/>
             <w:r>
               <w:rPr>
                 <w:rFonts w:ascii="BC Sans" w:eastAsia="Times New Roman" w:hAnsi="BC Sans" w:cs="Times New Roman"/>
@@ -2697,9 +2183,9 @@
                 <w:sz w:val="18"/>
                 <w:szCs w:val="18"/>
               </w:rPr>
-              <w:t>[i+1</w:t>
-            </w:r>
-            <w:proofErr w:type="gramStart"/>
+              <w:t>[i+1].</w:t>
+            </w:r>
+            <w:proofErr w:type="spellStart"/>
             <w:r>
               <w:rPr>
                 <w:rFonts w:ascii="BC Sans" w:eastAsia="Times New Roman" w:hAnsi="BC Sans" w:cs="Times New Roman"/>
@@ -2707,9 +2193,9 @@
                 <w:sz w:val="18"/>
                 <w:szCs w:val="18"/>
               </w:rPr>
-              <w:t>].</w:t>
-            </w:r>
-            <w:proofErr w:type="spellStart"/>
+              <w:t>actionedDate</w:t>
+            </w:r>
+            <w:proofErr w:type="spellEnd"/>
             <w:r>
               <w:rPr>
                 <w:rFonts w:ascii="BC Sans" w:eastAsia="Times New Roman" w:hAnsi="BC Sans" w:cs="Times New Roman"/>
@@ -2717,10 +2203,8 @@
                 <w:sz w:val="18"/>
                 <w:szCs w:val="18"/>
               </w:rPr>
-              <w:t>actionedDate</w:t>
-            </w:r>
-            <w:proofErr w:type="spellEnd"/>
-            <w:proofErr w:type="gramEnd"/>
+              <w:t>}</w:t>
+            </w:r>
             <w:r>
               <w:rPr>
                 <w:rFonts w:ascii="BC Sans" w:eastAsia="Times New Roman" w:hAnsi="BC Sans" w:cs="Times New Roman"/>
@@ -2728,8 +2212,9 @@
                 <w:sz w:val="18"/>
                 <w:szCs w:val="18"/>
               </w:rPr>
-              <w:t>}</w:t>
-            </w:r>
+              <w:t xml:space="preserve"> {</w:t>
+            </w:r>
+            <w:proofErr w:type="spellStart"/>
             <w:r>
               <w:rPr>
                 <w:rFonts w:ascii="BC Sans" w:eastAsia="Times New Roman" w:hAnsi="BC Sans" w:cs="Times New Roman"/>
@@ -2737,10 +2222,9 @@
                 <w:sz w:val="18"/>
                 <w:szCs w:val="18"/>
               </w:rPr>
-              <w:t xml:space="preserve"> {</w:t>
-            </w:r>
-            <w:proofErr w:type="spellStart"/>
-            <w:proofErr w:type="gramStart"/>
+              <w:t>d.activityNotes</w:t>
+            </w:r>
+            <w:proofErr w:type="spellEnd"/>
             <w:r>
               <w:rPr>
                 <w:rFonts w:ascii="BC Sans" w:eastAsia="Times New Roman" w:hAnsi="BC Sans" w:cs="Times New Roman"/>
@@ -2748,10 +2232,9 @@
                 <w:sz w:val="18"/>
                 <w:szCs w:val="18"/>
               </w:rPr>
-              <w:t>d.activityNotes</w:t>
-            </w:r>
-            <w:proofErr w:type="spellEnd"/>
-            <w:proofErr w:type="gramEnd"/>
+              <w:t>[i+1].</w:t>
+            </w:r>
+            <w:proofErr w:type="spellStart"/>
             <w:r>
               <w:rPr>
                 <w:rFonts w:ascii="BC Sans" w:eastAsia="Times New Roman" w:hAnsi="BC Sans" w:cs="Times New Roman"/>
@@ -2759,30 +2242,9 @@
                 <w:sz w:val="18"/>
                 <w:szCs w:val="18"/>
               </w:rPr>
-              <w:t>[i+1</w:t>
-            </w:r>
-            <w:proofErr w:type="gramStart"/>
-            <w:r>
-              <w:rPr>
-                <w:rFonts w:ascii="BC Sans" w:eastAsia="Times New Roman" w:hAnsi="BC Sans" w:cs="Times New Roman"/>
-                <w:color w:val="000000" w:themeColor="text1"/>
-                <w:sz w:val="18"/>
-                <w:szCs w:val="18"/>
-              </w:rPr>
-              <w:t>].</w:t>
-            </w:r>
-            <w:proofErr w:type="spellStart"/>
-            <w:r>
-              <w:rPr>
-                <w:rFonts w:ascii="BC Sans" w:eastAsia="Times New Roman" w:hAnsi="BC Sans" w:cs="Times New Roman"/>
-                <w:color w:val="000000" w:themeColor="text1"/>
-                <w:sz w:val="18"/>
-                <w:szCs w:val="18"/>
-              </w:rPr>
               <w:t>actionedTime</w:t>
             </w:r>
             <w:proofErr w:type="spellEnd"/>
-            <w:proofErr w:type="gramEnd"/>
             <w:r>
               <w:rPr>
                 <w:rFonts w:ascii="BC Sans" w:eastAsia="Times New Roman" w:hAnsi="BC Sans" w:cs="Times New Roman"/>
@@ -2821,7 +2283,6 @@
               <w:t>{</w:t>
             </w:r>
             <w:proofErr w:type="spellStart"/>
-            <w:proofErr w:type="gramStart"/>
             <w:r>
               <w:rPr>
                 <w:rFonts w:ascii="BC Sans" w:eastAsia="Times New Roman" w:hAnsi="BC Sans" w:cs="Times New Roman"/>
@@ -2832,7 +2293,6 @@
               <w:t>d.activityNotes</w:t>
             </w:r>
             <w:proofErr w:type="spellEnd"/>
-            <w:proofErr w:type="gramEnd"/>
             <w:r>
               <w:rPr>
                 <w:rFonts w:ascii="BC Sans" w:eastAsia="Times New Roman" w:hAnsi="BC Sans" w:cs="Times New Roman"/>
@@ -2870,9 +2330,9 @@
                 <w:sz w:val="18"/>
                 <w:szCs w:val="18"/>
               </w:rPr>
-              <w:t>.</w:t>
-            </w:r>
-            <w:proofErr w:type="gramStart"/>
+              <w:t>.lastName</w:t>
+            </w:r>
+            <w:proofErr w:type="spellEnd"/>
             <w:r>
               <w:rPr>
                 <w:rFonts w:ascii="BC Sans" w:eastAsia="Times New Roman" w:hAnsi="BC Sans" w:cs="Times New Roman"/>
@@ -2880,9 +2340,9 @@
                 <w:sz w:val="18"/>
                 <w:szCs w:val="18"/>
               </w:rPr>
-              <w:t>lastName</w:t>
-            </w:r>
-            <w:proofErr w:type="spellEnd"/>
+              <w:t>}, {</w:t>
+            </w:r>
+            <w:proofErr w:type="spellStart"/>
             <w:r>
               <w:rPr>
                 <w:rFonts w:ascii="BC Sans" w:eastAsia="Times New Roman" w:hAnsi="BC Sans" w:cs="Times New Roman"/>
@@ -2890,20 +2350,9 @@
                 <w:sz w:val="18"/>
                 <w:szCs w:val="18"/>
               </w:rPr>
-              <w:t>}, {</w:t>
-            </w:r>
-            <w:proofErr w:type="spellStart"/>
-            <w:r>
-              <w:rPr>
-                <w:rFonts w:ascii="BC Sans" w:eastAsia="Times New Roman" w:hAnsi="BC Sans" w:cs="Times New Roman"/>
-                <w:color w:val="000000" w:themeColor="text1"/>
-                <w:sz w:val="18"/>
-                <w:szCs w:val="18"/>
-              </w:rPr>
               <w:t>d.activityNotes</w:t>
             </w:r>
             <w:proofErr w:type="spellEnd"/>
-            <w:proofErr w:type="gramEnd"/>
             <w:r>
               <w:rPr>
                 <w:rFonts w:ascii="BC Sans" w:eastAsia="Times New Roman" w:hAnsi="BC Sans" w:cs="Times New Roman"/>
@@ -2975,7 +2424,6 @@
         <w:t>{</w:t>
       </w:r>
       <w:proofErr w:type="spellStart"/>
-      <w:proofErr w:type="gramStart"/>
       <w:r>
         <w:rPr>
           <w:rFonts w:ascii="BC Sans" w:hAnsi="BC Sans"/>
@@ -2992,7 +2440,6 @@
         </w:rPr>
         <w:t>hasActivityNotes</w:t>
       </w:r>
-      <w:proofErr w:type="gramEnd"/>
       <w:r>
         <w:rPr>
           <w:rFonts w:ascii="BC Sans" w:hAnsi="BC Sans"/>
@@ -3062,9 +2509,8 @@
                 <w:sz w:val="20"/>
                 <w:szCs w:val="20"/>
               </w:rPr>
-              <w:t>Exhibit #{</w:t>
-            </w:r>
-            <w:proofErr w:type="gramStart"/>
+              <w:t>Exhibit #{d.exhibits[i].exhibit</w:t>
+            </w:r>
             <w:r>
               <w:rPr>
                 <w:rFonts w:ascii="BC Sans" w:hAnsi="BC Sans"/>
@@ -3073,9 +2519,8 @@
                 <w:sz w:val="20"/>
                 <w:szCs w:val="20"/>
               </w:rPr>
-              <w:t>d.exhibits</w:t>
-            </w:r>
-            <w:proofErr w:type="gramEnd"/>
+              <w:t>Display</w:t>
+            </w:r>
             <w:r>
               <w:rPr>
                 <w:rFonts w:ascii="BC Sans" w:hAnsi="BC Sans"/>
@@ -3084,49 +2529,7 @@
                 <w:sz w:val="20"/>
                 <w:szCs w:val="20"/>
               </w:rPr>
-              <w:t>[i</w:t>
-            </w:r>
-            <w:proofErr w:type="gramStart"/>
-            <w:r>
-              <w:rPr>
-                <w:rFonts w:ascii="BC Sans" w:hAnsi="BC Sans"/>
-                <w:b/>
-                <w:bCs/>
-                <w:sz w:val="20"/>
-                <w:szCs w:val="20"/>
-              </w:rPr>
-              <w:t>].exhibit</w:t>
-            </w:r>
-            <w:r>
-              <w:rPr>
-                <w:rFonts w:ascii="BC Sans" w:hAnsi="BC Sans"/>
-                <w:b/>
-                <w:bCs/>
-                <w:sz w:val="20"/>
-                <w:szCs w:val="20"/>
-              </w:rPr>
-              <w:t>Display</w:t>
-            </w:r>
-            <w:r>
-              <w:rPr>
-                <w:rFonts w:ascii="BC Sans" w:hAnsi="BC Sans"/>
-                <w:b/>
-                <w:bCs/>
-                <w:sz w:val="20"/>
-                <w:szCs w:val="20"/>
-              </w:rPr>
-              <w:t>Number</w:t>
-            </w:r>
-            <w:proofErr w:type="gramEnd"/>
-            <w:r>
-              <w:rPr>
-                <w:rFonts w:ascii="BC Sans" w:hAnsi="BC Sans"/>
-                <w:b/>
-                <w:bCs/>
-                <w:sz w:val="20"/>
-                <w:szCs w:val="20"/>
-              </w:rPr>
-              <w:t>}</w:t>
+              <w:t>Number}</w:t>
             </w:r>
           </w:p>
         </w:tc>
@@ -3199,7 +2602,6 @@
               <w:t>{</w:t>
             </w:r>
             <w:proofErr w:type="spellStart"/>
-            <w:proofErr w:type="gramStart"/>
             <w:r>
               <w:rPr>
                 <w:rFonts w:ascii="BC Sans" w:hAnsi="BC Sans"/>
@@ -3210,7 +2612,6 @@
               <w:t>d.exhibits</w:t>
             </w:r>
             <w:proofErr w:type="spellEnd"/>
-            <w:proofErr w:type="gramEnd"/>
             <w:r>
               <w:rPr>
                 <w:rFonts w:ascii="BC Sans" w:hAnsi="BC Sans"/>
@@ -3231,7 +2632,6 @@
               <w:t>i</w:t>
             </w:r>
             <w:proofErr w:type="spellEnd"/>
-            <w:proofErr w:type="gramStart"/>
             <w:r>
               <w:rPr>
                 <w:rFonts w:ascii="BC Sans" w:hAnsi="BC Sans"/>
@@ -3252,7 +2652,6 @@
               <w:t>propertyType</w:t>
             </w:r>
             <w:proofErr w:type="spellEnd"/>
-            <w:proofErr w:type="gramEnd"/>
             <w:r>
               <w:rPr>
                 <w:rFonts w:ascii="BC Sans" w:hAnsi="BC Sans"/>
@@ -3332,7 +2731,6 @@
               <w:t>{</w:t>
             </w:r>
             <w:proofErr w:type="spellStart"/>
-            <w:proofErr w:type="gramStart"/>
             <w:r>
               <w:rPr>
                 <w:rFonts w:ascii="BC Sans" w:hAnsi="BC Sans"/>
@@ -3343,7 +2741,6 @@
               <w:t>d.exhibits</w:t>
             </w:r>
             <w:proofErr w:type="spellEnd"/>
-            <w:proofErr w:type="gramEnd"/>
             <w:r>
               <w:rPr>
                 <w:rFonts w:ascii="BC Sans" w:hAnsi="BC Sans"/>
@@ -3364,25 +2761,14 @@
               <w:t>i</w:t>
             </w:r>
             <w:proofErr w:type="spellEnd"/>
-            <w:proofErr w:type="gramStart"/>
-            <w:r>
-              <w:rPr>
-                <w:rFonts w:ascii="BC Sans" w:hAnsi="BC Sans"/>
-                <w:sz w:val="20"/>
-                <w:szCs w:val="20"/>
-                <w:lang w:val="en-CA"/>
-              </w:rPr>
-              <w:t>].description</w:t>
-            </w:r>
-            <w:proofErr w:type="gramEnd"/>
-            <w:r>
-              <w:rPr>
-                <w:rFonts w:ascii="BC Sans" w:hAnsi="BC Sans"/>
-                <w:sz w:val="20"/>
-                <w:szCs w:val="20"/>
-                <w:lang w:val="en-CA"/>
-              </w:rPr>
-              <w:t>}</w:t>
+            <w:r>
+              <w:rPr>
+                <w:rFonts w:ascii="BC Sans" w:hAnsi="BC Sans"/>
+                <w:sz w:val="20"/>
+                <w:szCs w:val="20"/>
+                <w:lang w:val="en-CA"/>
+              </w:rPr>
+              <w:t>].description}</w:t>
             </w:r>
           </w:p>
         </w:tc>
@@ -3454,7 +2840,6 @@
               <w:t>{</w:t>
             </w:r>
             <w:proofErr w:type="spellStart"/>
-            <w:proofErr w:type="gramStart"/>
             <w:r>
               <w:rPr>
                 <w:rFonts w:ascii="BC Sans" w:hAnsi="BC Sans"/>
@@ -3465,7 +2850,6 @@
               <w:t>d.exhibits</w:t>
             </w:r>
             <w:proofErr w:type="spellEnd"/>
-            <w:proofErr w:type="gramEnd"/>
             <w:r>
               <w:rPr>
                 <w:rFonts w:ascii="BC Sans" w:hAnsi="BC Sans"/>
@@ -3486,25 +2870,14 @@
               <w:t>i</w:t>
             </w:r>
             <w:proofErr w:type="spellEnd"/>
-            <w:proofErr w:type="gramStart"/>
-            <w:r>
-              <w:rPr>
-                <w:rFonts w:ascii="BC Sans" w:hAnsi="BC Sans"/>
-                <w:sz w:val="20"/>
-                <w:szCs w:val="20"/>
-                <w:lang w:val="en-CA"/>
-              </w:rPr>
-              <w:t>].quantity</w:t>
-            </w:r>
-            <w:proofErr w:type="gramEnd"/>
-            <w:r>
-              <w:rPr>
-                <w:rFonts w:ascii="BC Sans" w:hAnsi="BC Sans"/>
-                <w:sz w:val="20"/>
-                <w:szCs w:val="20"/>
-                <w:lang w:val="en-CA"/>
-              </w:rPr>
-              <w:t>}</w:t>
+            <w:r>
+              <w:rPr>
+                <w:rFonts w:ascii="BC Sans" w:hAnsi="BC Sans"/>
+                <w:sz w:val="20"/>
+                <w:szCs w:val="20"/>
+                <w:lang w:val="en-CA"/>
+              </w:rPr>
+              <w:t>].quantity}</w:t>
             </w:r>
           </w:p>
         </w:tc>
@@ -3576,7 +2949,6 @@
               <w:t>{</w:t>
             </w:r>
             <w:proofErr w:type="spellStart"/>
-            <w:proofErr w:type="gramStart"/>
             <w:r>
               <w:rPr>
                 <w:rFonts w:ascii="BC Sans" w:hAnsi="BC Sans"/>
@@ -3587,7 +2959,6 @@
               <w:t>d.exhibits</w:t>
             </w:r>
             <w:proofErr w:type="spellEnd"/>
-            <w:proofErr w:type="gramEnd"/>
             <w:r>
               <w:rPr>
                 <w:rFonts w:ascii="BC Sans" w:hAnsi="BC Sans"/>
@@ -3608,7 +2979,6 @@
               <w:t>i</w:t>
             </w:r>
             <w:proofErr w:type="spellEnd"/>
-            <w:proofErr w:type="gramStart"/>
             <w:r>
               <w:rPr>
                 <w:rFonts w:ascii="BC Sans" w:hAnsi="BC Sans"/>
@@ -3629,7 +2999,6 @@
               <w:t>collectedBy.lastName</w:t>
             </w:r>
             <w:proofErr w:type="spellEnd"/>
-            <w:proofErr w:type="gramEnd"/>
             <w:r>
               <w:rPr>
                 <w:rFonts w:ascii="BC Sans" w:hAnsi="BC Sans"/>
@@ -3640,7 +3009,6 @@
               <w:t>}, {</w:t>
             </w:r>
             <w:proofErr w:type="spellStart"/>
-            <w:proofErr w:type="gramStart"/>
             <w:r>
               <w:rPr>
                 <w:rFonts w:ascii="BC Sans" w:hAnsi="BC Sans"/>
@@ -3651,7 +3019,6 @@
               <w:t>d.exhibits</w:t>
             </w:r>
             <w:proofErr w:type="spellEnd"/>
-            <w:proofErr w:type="gramEnd"/>
             <w:r>
               <w:rPr>
                 <w:rFonts w:ascii="BC Sans" w:hAnsi="BC Sans"/>
@@ -3672,7 +3039,6 @@
               <w:t>i</w:t>
             </w:r>
             <w:proofErr w:type="spellEnd"/>
-            <w:proofErr w:type="gramStart"/>
             <w:r>
               <w:rPr>
                 <w:rFonts w:ascii="BC Sans" w:hAnsi="BC Sans"/>
@@ -3693,7 +3059,6 @@
               <w:t>collectedBy.firstName</w:t>
             </w:r>
             <w:proofErr w:type="spellEnd"/>
-            <w:proofErr w:type="gramEnd"/>
             <w:r>
               <w:rPr>
                 <w:rFonts w:ascii="BC Sans" w:hAnsi="BC Sans"/>
@@ -3773,7 +3138,6 @@
               <w:t>{</w:t>
             </w:r>
             <w:proofErr w:type="spellStart"/>
-            <w:proofErr w:type="gramStart"/>
             <w:r>
               <w:rPr>
                 <w:rFonts w:ascii="BC Sans" w:hAnsi="BC Sans"/>
@@ -3784,7 +3148,6 @@
               <w:t>d.exhibits</w:t>
             </w:r>
             <w:proofErr w:type="spellEnd"/>
-            <w:proofErr w:type="gramEnd"/>
             <w:r>
               <w:rPr>
                 <w:rFonts w:ascii="BC Sans" w:hAnsi="BC Sans"/>
@@ -3805,7 +3168,6 @@
               <w:t>i</w:t>
             </w:r>
             <w:proofErr w:type="spellEnd"/>
-            <w:proofErr w:type="gramStart"/>
             <w:r>
               <w:rPr>
                 <w:rFonts w:ascii="BC Sans" w:hAnsi="BC Sans"/>
@@ -3826,7 +3188,6 @@
               <w:t>dateCollected</w:t>
             </w:r>
             <w:proofErr w:type="spellEnd"/>
-            <w:proofErr w:type="gramEnd"/>
             <w:r>
               <w:rPr>
                 <w:rFonts w:ascii="BC Sans" w:hAnsi="BC Sans"/>
@@ -3846,7 +3207,6 @@
               <w:t xml:space="preserve"> {</w:t>
             </w:r>
             <w:proofErr w:type="spellStart"/>
-            <w:proofErr w:type="gramStart"/>
             <w:r>
               <w:rPr>
                 <w:rFonts w:ascii="BC Sans" w:hAnsi="BC Sans"/>
@@ -3857,7 +3217,6 @@
               <w:t>d.exhibits</w:t>
             </w:r>
             <w:proofErr w:type="spellEnd"/>
-            <w:proofErr w:type="gramEnd"/>
             <w:r>
               <w:rPr>
                 <w:rFonts w:ascii="BC Sans" w:hAnsi="BC Sans"/>
@@ -3878,7 +3237,6 @@
               <w:t>i</w:t>
             </w:r>
             <w:proofErr w:type="spellEnd"/>
-            <w:proofErr w:type="gramStart"/>
             <w:r>
               <w:rPr>
                 <w:rFonts w:ascii="BC Sans" w:hAnsi="BC Sans"/>
@@ -3899,7 +3257,6 @@
               <w:t>intakeTime</w:t>
             </w:r>
             <w:proofErr w:type="spellEnd"/>
-            <w:proofErr w:type="gramEnd"/>
             <w:r>
               <w:rPr>
                 <w:rFonts w:ascii="BC Sans" w:hAnsi="BC Sans"/>
@@ -3979,7 +3336,6 @@
               <w:t>{</w:t>
             </w:r>
             <w:proofErr w:type="spellStart"/>
-            <w:proofErr w:type="gramStart"/>
             <w:r>
               <w:rPr>
                 <w:rFonts w:ascii="BC Sans" w:hAnsi="BC Sans"/>
@@ -3990,7 +3346,6 @@
               <w:t>d.exhibits</w:t>
             </w:r>
             <w:proofErr w:type="spellEnd"/>
-            <w:proofErr w:type="gramEnd"/>
             <w:r>
               <w:rPr>
                 <w:rFonts w:ascii="BC Sans" w:hAnsi="BC Sans"/>
@@ -4011,7 +3366,6 @@
               <w:t>i</w:t>
             </w:r>
             <w:proofErr w:type="spellEnd"/>
-            <w:proofErr w:type="gramStart"/>
             <w:r>
               <w:rPr>
                 <w:rFonts w:ascii="BC Sans" w:hAnsi="BC Sans"/>
@@ -4032,7 +3386,6 @@
               <w:t>locationOfIntake</w:t>
             </w:r>
             <w:proofErr w:type="spellEnd"/>
-            <w:proofErr w:type="gramEnd"/>
             <w:r>
               <w:rPr>
                 <w:rFonts w:ascii="BC Sans" w:hAnsi="BC Sans"/>
@@ -4110,66 +3463,16 @@
                 <w:szCs w:val="20"/>
                 <w:lang w:val="en-CA"/>
               </w:rPr>
-              <w:t>{</w:t>
-            </w:r>
-            <w:proofErr w:type="gramStart"/>
-            <w:r>
-              <w:rPr>
-                <w:rFonts w:ascii="BC Sans" w:hAnsi="BC Sans"/>
-                <w:sz w:val="20"/>
-                <w:szCs w:val="20"/>
-                <w:lang w:val="en-CA"/>
-              </w:rPr>
-              <w:t>d.exhibits</w:t>
-            </w:r>
-            <w:proofErr w:type="gramEnd"/>
-            <w:r>
-              <w:rPr>
-                <w:rFonts w:ascii="BC Sans" w:hAnsi="BC Sans"/>
-                <w:sz w:val="20"/>
-                <w:szCs w:val="20"/>
-                <w:lang w:val="en-CA"/>
-              </w:rPr>
-              <w:t>[i</w:t>
-            </w:r>
-            <w:proofErr w:type="gramStart"/>
-            <w:r>
-              <w:rPr>
-                <w:rFonts w:ascii="BC Sans" w:hAnsi="BC Sans"/>
-                <w:sz w:val="20"/>
-                <w:szCs w:val="20"/>
-                <w:lang w:val="en-CA"/>
-              </w:rPr>
-              <w:t>].propertyTagNumber</w:t>
-            </w:r>
-            <w:proofErr w:type="gramEnd"/>
-            <w:r>
-              <w:rPr>
-                <w:rFonts w:ascii="BC Sans" w:hAnsi="BC Sans"/>
-                <w:sz w:val="20"/>
-                <w:szCs w:val="20"/>
-                <w:lang w:val="en-CA"/>
-              </w:rPr>
-              <w:t>}</w:t>
-            </w:r>
-            <w:r>
-              <w:rPr>
-                <w:rFonts w:ascii="BC Sans" w:hAnsi="BC Sans"/>
-                <w:sz w:val="20"/>
-                <w:szCs w:val="20"/>
-                <w:lang w:val="en-CA"/>
-              </w:rPr>
-              <w:t>{</w:t>
-            </w:r>
-            <w:proofErr w:type="gramStart"/>
-            <w:r>
-              <w:rPr>
-                <w:rFonts w:ascii="BC Sans" w:hAnsi="BC Sans"/>
-                <w:sz w:val="20"/>
-                <w:szCs w:val="20"/>
-                <w:lang w:val="en-CA"/>
-              </w:rPr>
-              <w:t>d.</w:t>
+              <w:t>{d.exhibits[i].propertyTagNumber}</w:t>
+            </w:r>
+            <w:r>
+              <w:rPr>
+                <w:rFonts w:ascii="BC Sans" w:hAnsi="BC Sans"/>
+                <w:sz w:val="20"/>
+                <w:szCs w:val="20"/>
+                <w:lang w:val="en-CA"/>
+              </w:rPr>
+              <w:t>{d.</w:t>
             </w:r>
             <w:r>
               <w:rPr>
@@ -4180,25 +3483,14 @@
               </w:rPr>
               <w:t>exhibits</w:t>
             </w:r>
-            <w:proofErr w:type="gramEnd"/>
-            <w:r>
-              <w:rPr>
-                <w:rFonts w:ascii="BC Sans" w:hAnsi="BC Sans"/>
-                <w:sz w:val="20"/>
-                <w:szCs w:val="20"/>
-                <w:lang w:val="en-CA"/>
-              </w:rPr>
-              <w:t>[i</w:t>
-            </w:r>
-            <w:proofErr w:type="gramStart"/>
-            <w:r>
-              <w:rPr>
-                <w:rFonts w:ascii="BC Sans" w:hAnsi="BC Sans"/>
-                <w:sz w:val="20"/>
-                <w:szCs w:val="20"/>
-                <w:lang w:val="en-CA"/>
-              </w:rPr>
-              <w:t>].</w:t>
+            <w:r>
+              <w:rPr>
+                <w:rFonts w:ascii="BC Sans" w:hAnsi="BC Sans"/>
+                <w:sz w:val="20"/>
+                <w:szCs w:val="20"/>
+                <w:lang w:val="en-CA"/>
+              </w:rPr>
+              <w:t>[i].</w:t>
             </w:r>
             <w:r>
               <w:rPr>
@@ -4209,7 +3501,6 @@
               </w:rPr>
               <w:t>isSeized</w:t>
             </w:r>
-            <w:proofErr w:type="gramEnd"/>
             <w:r>
               <w:rPr>
                 <w:rFonts w:ascii="BC Sans" w:hAnsi="BC Sans"/>
@@ -4226,36 +3517,16 @@
                 <w:szCs w:val="20"/>
                 <w:lang w:val="en-CA"/>
               </w:rPr>
-              <w:t>Q(false</w:t>
-            </w:r>
-            <w:proofErr w:type="gramStart"/>
-            <w:r>
-              <w:rPr>
-                <w:rFonts w:ascii="BC Sans" w:hAnsi="BC Sans"/>
-                <w:sz w:val="20"/>
-                <w:szCs w:val="20"/>
-                <w:lang w:val="en-CA"/>
-              </w:rPr>
-              <w:t>)</w:t>
-            </w:r>
-            <w:r>
-              <w:rPr>
-                <w:rFonts w:ascii="BC Sans" w:hAnsi="BC Sans"/>
-                <w:sz w:val="20"/>
-                <w:szCs w:val="20"/>
-                <w:lang w:val="en-CA"/>
-              </w:rPr>
-              <w:t>:hideBegin</w:t>
-            </w:r>
-            <w:proofErr w:type="gramEnd"/>
-            <w:r>
-              <w:rPr>
-                <w:rFonts w:ascii="BC Sans" w:hAnsi="BC Sans"/>
-                <w:sz w:val="20"/>
-                <w:szCs w:val="20"/>
-                <w:lang w:val="en-CA"/>
-              </w:rPr>
-              <w:t>}</w:t>
+              <w:t>Q(false)</w:t>
+            </w:r>
+            <w:r>
+              <w:rPr>
+                <w:rFonts w:ascii="BC Sans" w:hAnsi="BC Sans"/>
+                <w:sz w:val="20"/>
+                <w:szCs w:val="20"/>
+                <w:lang w:val="en-CA"/>
+              </w:rPr>
+              <w:t>:hideBegin}</w:t>
             </w:r>
           </w:p>
         </w:tc>
@@ -4327,7 +3598,6 @@
               <w:t>{</w:t>
             </w:r>
             <w:proofErr w:type="spellStart"/>
-            <w:proofErr w:type="gramStart"/>
             <w:r>
               <w:rPr>
                 <w:rFonts w:ascii="BC Sans" w:hAnsi="BC Sans"/>
@@ -4338,7 +3608,6 @@
               <w:t>d.exhibits</w:t>
             </w:r>
             <w:proofErr w:type="spellEnd"/>
-            <w:proofErr w:type="gramEnd"/>
             <w:r>
               <w:rPr>
                 <w:rFonts w:ascii="BC Sans" w:hAnsi="BC Sans"/>
@@ -4359,7 +3628,6 @@
               <w:t>i</w:t>
             </w:r>
             <w:proofErr w:type="spellEnd"/>
-            <w:proofErr w:type="gramStart"/>
             <w:r>
               <w:rPr>
                 <w:rFonts w:ascii="BC Sans" w:hAnsi="BC Sans"/>
@@ -4380,7 +3648,6 @@
               <w:t>seizedFromFirstName</w:t>
             </w:r>
             <w:proofErr w:type="spellEnd"/>
-            <w:proofErr w:type="gramEnd"/>
             <w:r>
               <w:rPr>
                 <w:rFonts w:ascii="BC Sans" w:hAnsi="BC Sans"/>
@@ -4460,7 +3727,6 @@
               <w:t>{</w:t>
             </w:r>
             <w:proofErr w:type="spellStart"/>
-            <w:proofErr w:type="gramStart"/>
             <w:r>
               <w:rPr>
                 <w:rFonts w:ascii="BC Sans" w:hAnsi="BC Sans"/>
@@ -4471,7 +3737,6 @@
               <w:t>d.exhibits</w:t>
             </w:r>
             <w:proofErr w:type="spellEnd"/>
-            <w:proofErr w:type="gramEnd"/>
             <w:r>
               <w:rPr>
                 <w:rFonts w:ascii="BC Sans" w:hAnsi="BC Sans"/>
@@ -4492,7 +3757,6 @@
               <w:t>i</w:t>
             </w:r>
             <w:proofErr w:type="spellEnd"/>
-            <w:proofErr w:type="gramStart"/>
             <w:r>
               <w:rPr>
                 <w:rFonts w:ascii="BC Sans" w:hAnsi="BC Sans"/>
@@ -4513,7 +3777,6 @@
               <w:t>seizedFromLastName</w:t>
             </w:r>
             <w:proofErr w:type="spellEnd"/>
-            <w:proofErr w:type="gramEnd"/>
             <w:r>
               <w:rPr>
                 <w:rFonts w:ascii="BC Sans" w:hAnsi="BC Sans"/>
@@ -4558,7 +3821,6 @@
                 <w:szCs w:val="20"/>
                 <w:lang w:val="en-CA"/>
               </w:rPr>
-              <w:lastRenderedPageBreak/>
               <w:t>Seized from address</w:t>
             </w:r>
           </w:p>
@@ -4594,7 +3856,6 @@
               <w:t>{</w:t>
             </w:r>
             <w:proofErr w:type="spellStart"/>
-            <w:proofErr w:type="gramStart"/>
             <w:r>
               <w:rPr>
                 <w:rFonts w:ascii="BC Sans" w:hAnsi="BC Sans"/>
@@ -4605,7 +3866,6 @@
               <w:t>d.exhibits</w:t>
             </w:r>
             <w:proofErr w:type="spellEnd"/>
-            <w:proofErr w:type="gramEnd"/>
             <w:r>
               <w:rPr>
                 <w:rFonts w:ascii="BC Sans" w:hAnsi="BC Sans"/>
@@ -4626,7 +3886,6 @@
               <w:t>i</w:t>
             </w:r>
             <w:proofErr w:type="spellEnd"/>
-            <w:proofErr w:type="gramStart"/>
             <w:r>
               <w:rPr>
                 <w:rFonts w:ascii="BC Sans" w:hAnsi="BC Sans"/>
@@ -4647,7 +3906,6 @@
               <w:t>seizedFromAddress</w:t>
             </w:r>
             <w:proofErr w:type="spellEnd"/>
-            <w:proofErr w:type="gramEnd"/>
             <w:r>
               <w:rPr>
                 <w:rFonts w:ascii="BC Sans" w:hAnsi="BC Sans"/>
@@ -4724,66 +3982,16 @@
                 <w:szCs w:val="20"/>
                 <w:lang w:val="en-CA"/>
               </w:rPr>
-              <w:t>{</w:t>
-            </w:r>
-            <w:proofErr w:type="gramStart"/>
-            <w:r>
-              <w:rPr>
-                <w:rFonts w:ascii="BC Sans" w:hAnsi="BC Sans"/>
-                <w:sz w:val="20"/>
-                <w:szCs w:val="20"/>
-                <w:lang w:val="en-CA"/>
-              </w:rPr>
-              <w:t>d.exhibits</w:t>
-            </w:r>
-            <w:proofErr w:type="gramEnd"/>
-            <w:r>
-              <w:rPr>
-                <w:rFonts w:ascii="BC Sans" w:hAnsi="BC Sans"/>
-                <w:sz w:val="20"/>
-                <w:szCs w:val="20"/>
-                <w:lang w:val="en-CA"/>
-              </w:rPr>
-              <w:t>[i</w:t>
-            </w:r>
-            <w:proofErr w:type="gramStart"/>
-            <w:r>
-              <w:rPr>
-                <w:rFonts w:ascii="BC Sans" w:hAnsi="BC Sans"/>
-                <w:sz w:val="20"/>
-                <w:szCs w:val="20"/>
-                <w:lang w:val="en-CA"/>
-              </w:rPr>
-              <w:t>].seizedFromPhoneNumber</w:t>
-            </w:r>
-            <w:proofErr w:type="gramEnd"/>
-            <w:r>
-              <w:rPr>
-                <w:rFonts w:ascii="BC Sans" w:hAnsi="BC Sans"/>
-                <w:sz w:val="20"/>
-                <w:szCs w:val="20"/>
-                <w:lang w:val="en-CA"/>
-              </w:rPr>
-              <w:t>}</w:t>
-            </w:r>
-            <w:r>
-              <w:rPr>
-                <w:rFonts w:ascii="BC Sans" w:hAnsi="BC Sans"/>
-                <w:sz w:val="20"/>
-                <w:szCs w:val="20"/>
-                <w:lang w:val="en-CA"/>
-              </w:rPr>
-              <w:t>{</w:t>
-            </w:r>
-            <w:proofErr w:type="gramStart"/>
-            <w:r>
-              <w:rPr>
-                <w:rFonts w:ascii="BC Sans" w:hAnsi="BC Sans"/>
-                <w:sz w:val="20"/>
-                <w:szCs w:val="20"/>
-                <w:lang w:val="en-CA"/>
-              </w:rPr>
-              <w:t>d.</w:t>
+              <w:t>{d.exhibits[i].seizedFromPhoneNumber}</w:t>
+            </w:r>
+            <w:r>
+              <w:rPr>
+                <w:rFonts w:ascii="BC Sans" w:hAnsi="BC Sans"/>
+                <w:sz w:val="20"/>
+                <w:szCs w:val="20"/>
+                <w:lang w:val="en-CA"/>
+              </w:rPr>
+              <w:t>{d.</w:t>
             </w:r>
             <w:r>
               <w:rPr>
@@ -4794,25 +4002,14 @@
               </w:rPr>
               <w:t>exhibits</w:t>
             </w:r>
-            <w:proofErr w:type="gramEnd"/>
-            <w:r>
-              <w:rPr>
-                <w:rFonts w:ascii="BC Sans" w:hAnsi="BC Sans"/>
-                <w:sz w:val="20"/>
-                <w:szCs w:val="20"/>
-                <w:lang w:val="en-CA"/>
-              </w:rPr>
-              <w:t>[i</w:t>
-            </w:r>
-            <w:proofErr w:type="gramStart"/>
-            <w:r>
-              <w:rPr>
-                <w:rFonts w:ascii="BC Sans" w:hAnsi="BC Sans"/>
-                <w:sz w:val="20"/>
-                <w:szCs w:val="20"/>
-                <w:lang w:val="en-CA"/>
-              </w:rPr>
-              <w:t>].</w:t>
+            <w:r>
+              <w:rPr>
+                <w:rFonts w:ascii="BC Sans" w:hAnsi="BC Sans"/>
+                <w:sz w:val="20"/>
+                <w:szCs w:val="20"/>
+                <w:lang w:val="en-CA"/>
+              </w:rPr>
+              <w:t>[i].</w:t>
             </w:r>
             <w:r>
               <w:rPr>
@@ -4823,7 +4020,6 @@
               </w:rPr>
               <w:t>isSeized</w:t>
             </w:r>
-            <w:proofErr w:type="gramEnd"/>
             <w:r>
               <w:rPr>
                 <w:rFonts w:ascii="BC Sans" w:hAnsi="BC Sans"/>
@@ -4883,7 +4079,6 @@
         <w:t>{</w:t>
       </w:r>
       <w:proofErr w:type="spellStart"/>
-      <w:proofErr w:type="gramStart"/>
       <w:r>
         <w:rPr>
           <w:rFonts w:ascii="BC Sans" w:hAnsi="BC Sans"/>
@@ -4901,23 +4096,13 @@
         <w:t>exhibits</w:t>
       </w:r>
       <w:proofErr w:type="spellEnd"/>
-      <w:proofErr w:type="gramEnd"/>
       <w:r>
         <w:rPr>
           <w:rFonts w:ascii="BC Sans" w:hAnsi="BC Sans"/>
           <w:sz w:val="20"/>
           <w:szCs w:val="20"/>
         </w:rPr>
-        <w:t>[i+1</w:t>
-      </w:r>
-      <w:proofErr w:type="gramStart"/>
-      <w:r>
-        <w:rPr>
-          <w:rFonts w:ascii="BC Sans" w:hAnsi="BC Sans"/>
-          <w:sz w:val="20"/>
-          <w:szCs w:val="20"/>
-        </w:rPr>
-        <w:t>]</w:t>
+        <w:t>[i+1]</w:t>
       </w:r>
       <w:r>
         <w:rPr>
@@ -4953,7 +4138,6 @@
         <w:t>Number</w:t>
       </w:r>
       <w:proofErr w:type="spellEnd"/>
-      <w:proofErr w:type="gramEnd"/>
       <w:r>
         <w:rPr>
           <w:rFonts w:ascii="BC Sans" w:hAnsi="BC Sans"/>
@@ -5008,7 +4192,6 @@
               <w:t>Attachment {</w:t>
             </w:r>
             <w:proofErr w:type="spellStart"/>
-            <w:proofErr w:type="gramStart"/>
             <w:r>
               <w:rPr>
                 <w:rFonts w:ascii="BC Sans" w:hAnsi="BC Sans"/>
@@ -5019,7 +4202,6 @@
               <w:t>d.attachments</w:t>
             </w:r>
             <w:proofErr w:type="spellEnd"/>
-            <w:proofErr w:type="gramEnd"/>
             <w:r>
               <w:rPr>
                 <w:rFonts w:ascii="BC Sans" w:hAnsi="BC Sans"/>
@@ -5132,7 +4314,6 @@
               <w:t>{</w:t>
             </w:r>
             <w:proofErr w:type="spellStart"/>
-            <w:proofErr w:type="gramStart"/>
             <w:r>
               <w:rPr>
                 <w:rFonts w:ascii="BC Sans" w:hAnsi="BC Sans"/>
@@ -5143,7 +4324,6 @@
               <w:t>d.attachments</w:t>
             </w:r>
             <w:proofErr w:type="spellEnd"/>
-            <w:proofErr w:type="gramEnd"/>
             <w:r>
               <w:rPr>
                 <w:rFonts w:ascii="BC Sans" w:hAnsi="BC Sans"/>
@@ -5164,7 +4344,6 @@
               <w:t>i</w:t>
             </w:r>
             <w:proofErr w:type="spellEnd"/>
-            <w:proofErr w:type="gramStart"/>
             <w:r>
               <w:rPr>
                 <w:rFonts w:ascii="BC Sans" w:hAnsi="BC Sans"/>
@@ -5185,7 +4364,6 @@
               <w:t>fileType</w:t>
             </w:r>
             <w:proofErr w:type="spellEnd"/>
-            <w:proofErr w:type="gramEnd"/>
             <w:r>
               <w:rPr>
                 <w:rFonts w:ascii="BC Sans" w:hAnsi="BC Sans"/>
@@ -5266,7 +4444,6 @@
               <w:t>{</w:t>
             </w:r>
             <w:proofErr w:type="spellStart"/>
-            <w:proofErr w:type="gramStart"/>
             <w:r>
               <w:rPr>
                 <w:rFonts w:ascii="BC Sans" w:hAnsi="BC Sans"/>
@@ -5277,7 +4454,6 @@
               <w:t>d.attachments</w:t>
             </w:r>
             <w:proofErr w:type="spellEnd"/>
-            <w:proofErr w:type="gramEnd"/>
             <w:r>
               <w:rPr>
                 <w:rFonts w:ascii="BC Sans" w:hAnsi="BC Sans"/>
@@ -5298,7 +4474,6 @@
               <w:t>i</w:t>
             </w:r>
             <w:proofErr w:type="spellEnd"/>
-            <w:proofErr w:type="gramStart"/>
             <w:r>
               <w:rPr>
                 <w:rFonts w:ascii="BC Sans" w:hAnsi="BC Sans"/>
@@ -5319,7 +4494,6 @@
               <w:t>sequenceNumber</w:t>
             </w:r>
             <w:proofErr w:type="spellEnd"/>
-            <w:proofErr w:type="gramEnd"/>
             <w:r>
               <w:rPr>
                 <w:rFonts w:ascii="BC Sans" w:hAnsi="BC Sans"/>
@@ -5394,7 +4568,6 @@
               <w:t>{</w:t>
             </w:r>
             <w:proofErr w:type="spellStart"/>
-            <w:proofErr w:type="gramStart"/>
             <w:r>
               <w:rPr>
                 <w:rFonts w:ascii="BC Sans" w:hAnsi="BC Sans"/>
@@ -5405,7 +4578,6 @@
               <w:t>d.attachments</w:t>
             </w:r>
             <w:proofErr w:type="spellEnd"/>
-            <w:proofErr w:type="gramEnd"/>
             <w:r>
               <w:rPr>
                 <w:rFonts w:ascii="BC Sans" w:hAnsi="BC Sans"/>
@@ -5426,25 +4598,14 @@
               <w:t>i</w:t>
             </w:r>
             <w:proofErr w:type="spellEnd"/>
-            <w:proofErr w:type="gramStart"/>
-            <w:r>
-              <w:rPr>
-                <w:rFonts w:ascii="BC Sans" w:hAnsi="BC Sans"/>
-                <w:sz w:val="20"/>
-                <w:szCs w:val="20"/>
-                <w:lang w:val="en-CA"/>
-              </w:rPr>
-              <w:t>].description</w:t>
-            </w:r>
-            <w:proofErr w:type="gramEnd"/>
-            <w:r>
-              <w:rPr>
-                <w:rFonts w:ascii="BC Sans" w:hAnsi="BC Sans"/>
-                <w:sz w:val="20"/>
-                <w:szCs w:val="20"/>
-                <w:lang w:val="en-CA"/>
-              </w:rPr>
-              <w:t>}</w:t>
+            <w:r>
+              <w:rPr>
+                <w:rFonts w:ascii="BC Sans" w:hAnsi="BC Sans"/>
+                <w:sz w:val="20"/>
+                <w:szCs w:val="20"/>
+                <w:lang w:val="en-CA"/>
+              </w:rPr>
+              <w:t>].description}</w:t>
             </w:r>
           </w:p>
         </w:tc>
@@ -5510,7 +4671,6 @@
               <w:t>{</w:t>
             </w:r>
             <w:proofErr w:type="spellStart"/>
-            <w:proofErr w:type="gramStart"/>
             <w:r>
               <w:rPr>
                 <w:rFonts w:ascii="BC Sans" w:hAnsi="BC Sans"/>
@@ -5521,7 +4681,6 @@
               <w:t>d.attachments</w:t>
             </w:r>
             <w:proofErr w:type="spellEnd"/>
-            <w:proofErr w:type="gramEnd"/>
             <w:r>
               <w:rPr>
                 <w:rFonts w:ascii="BC Sans" w:hAnsi="BC Sans"/>
@@ -5542,25 +4701,14 @@
               <w:t>i</w:t>
             </w:r>
             <w:proofErr w:type="spellEnd"/>
-            <w:proofErr w:type="gramStart"/>
-            <w:r>
-              <w:rPr>
-                <w:rFonts w:ascii="BC Sans" w:hAnsi="BC Sans"/>
-                <w:sz w:val="20"/>
-                <w:szCs w:val="20"/>
-                <w:lang w:val="en-CA"/>
-              </w:rPr>
-              <w:t>].title</w:t>
-            </w:r>
-            <w:proofErr w:type="gramEnd"/>
-            <w:r>
-              <w:rPr>
-                <w:rFonts w:ascii="BC Sans" w:hAnsi="BC Sans"/>
-                <w:sz w:val="20"/>
-                <w:szCs w:val="20"/>
-                <w:lang w:val="en-CA"/>
-              </w:rPr>
-              <w:t>}</w:t>
+            <w:r>
+              <w:rPr>
+                <w:rFonts w:ascii="BC Sans" w:hAnsi="BC Sans"/>
+                <w:sz w:val="20"/>
+                <w:szCs w:val="20"/>
+                <w:lang w:val="en-CA"/>
+              </w:rPr>
+              <w:t>].title}</w:t>
             </w:r>
           </w:p>
         </w:tc>
@@ -5622,116 +4770,16 @@
                 <w:szCs w:val="20"/>
                 <w:lang w:val="en-CA"/>
               </w:rPr>
-              <w:t>{</w:t>
-            </w:r>
-            <w:proofErr w:type="gramStart"/>
-            <w:r>
-              <w:rPr>
-                <w:rFonts w:ascii="BC Sans" w:hAnsi="BC Sans"/>
-                <w:sz w:val="20"/>
-                <w:szCs w:val="20"/>
-                <w:lang w:val="en-CA"/>
-              </w:rPr>
-              <w:t>d.attachments</w:t>
-            </w:r>
-            <w:proofErr w:type="gramEnd"/>
-            <w:r>
-              <w:rPr>
-                <w:rFonts w:ascii="BC Sans" w:hAnsi="BC Sans"/>
-                <w:sz w:val="20"/>
-                <w:szCs w:val="20"/>
-                <w:lang w:val="en-CA"/>
-              </w:rPr>
-              <w:t>[i</w:t>
-            </w:r>
-            <w:proofErr w:type="gramStart"/>
-            <w:r>
-              <w:rPr>
-                <w:rFonts w:ascii="BC Sans" w:hAnsi="BC Sans"/>
-                <w:sz w:val="20"/>
-                <w:szCs w:val="20"/>
-                <w:lang w:val="en-CA"/>
-              </w:rPr>
-              <w:t>].date</w:t>
-            </w:r>
-            <w:proofErr w:type="gramEnd"/>
-            <w:r>
-              <w:rPr>
-                <w:rFonts w:ascii="BC Sans" w:hAnsi="BC Sans"/>
-                <w:sz w:val="20"/>
-                <w:szCs w:val="20"/>
-                <w:lang w:val="en-CA"/>
-              </w:rPr>
-              <w:t>}</w:t>
-            </w:r>
-            <w:r>
-              <w:rPr>
-                <w:rFonts w:ascii="BC Sans" w:hAnsi="BC Sans"/>
-                <w:sz w:val="20"/>
-                <w:szCs w:val="20"/>
-                <w:lang w:val="en-CA"/>
-              </w:rPr>
-              <w:t>{</w:t>
-            </w:r>
-            <w:proofErr w:type="gramStart"/>
-            <w:r>
-              <w:rPr>
-                <w:rFonts w:ascii="BC Sans" w:hAnsi="BC Sans"/>
-                <w:sz w:val="20"/>
-                <w:szCs w:val="20"/>
-                <w:lang w:val="en-CA"/>
-              </w:rPr>
-              <w:t>d.attachments</w:t>
-            </w:r>
-            <w:proofErr w:type="gramEnd"/>
-            <w:r>
-              <w:rPr>
-                <w:rFonts w:ascii="BC Sans" w:hAnsi="BC Sans"/>
-                <w:sz w:val="20"/>
-                <w:szCs w:val="20"/>
-                <w:lang w:val="en-CA"/>
-              </w:rPr>
-              <w:t>[i</w:t>
-            </w:r>
-            <w:proofErr w:type="gramStart"/>
-            <w:r>
-              <w:rPr>
-                <w:rFonts w:ascii="BC Sans" w:hAnsi="BC Sans"/>
-                <w:sz w:val="20"/>
-                <w:szCs w:val="20"/>
-                <w:lang w:val="en-CA"/>
-              </w:rPr>
-              <w:t>].takenBy.lastName</w:t>
-            </w:r>
-            <w:proofErr w:type="gramEnd"/>
-            <w:r>
-              <w:rPr>
-                <w:rFonts w:ascii="BC Sans" w:hAnsi="BC Sans"/>
-                <w:sz w:val="20"/>
-                <w:szCs w:val="20"/>
-                <w:lang w:val="en-CA"/>
-              </w:rPr>
-              <w:t>:</w:t>
-            </w:r>
-            <w:proofErr w:type="gramStart"/>
-            <w:r>
-              <w:rPr>
-                <w:rFonts w:ascii="BC Sans" w:hAnsi="BC Sans"/>
-                <w:sz w:val="20"/>
-                <w:szCs w:val="20"/>
-                <w:lang w:val="en-CA"/>
-              </w:rPr>
-              <w:t>ifEM:hideBegin</w:t>
-            </w:r>
-            <w:proofErr w:type="gramEnd"/>
-            <w:r>
-              <w:rPr>
-                <w:rFonts w:ascii="BC Sans" w:hAnsi="BC Sans"/>
-                <w:sz w:val="20"/>
-                <w:szCs w:val="20"/>
-                <w:lang w:val="en-CA"/>
-              </w:rPr>
-              <w:t>}</w:t>
+              <w:t>{d.attachments[i].date}</w:t>
+            </w:r>
+            <w:r>
+              <w:rPr>
+                <w:rFonts w:ascii="BC Sans" w:hAnsi="BC Sans"/>
+                <w:sz w:val="20"/>
+                <w:szCs w:val="20"/>
+                <w:lang w:val="en-CA"/>
+              </w:rPr>
+              <w:t>{d.attachments[i].takenBy.lastName:ifEM:hideBegin}</w:t>
             </w:r>
           </w:p>
         </w:tc>
@@ -5795,7 +4843,6 @@
               <w:t>{</w:t>
             </w:r>
             <w:proofErr w:type="spellStart"/>
-            <w:proofErr w:type="gramStart"/>
             <w:r>
               <w:rPr>
                 <w:rFonts w:ascii="BC Sans" w:hAnsi="BC Sans"/>
@@ -5806,7 +4853,6 @@
               <w:t>d.attachments</w:t>
             </w:r>
             <w:proofErr w:type="spellEnd"/>
-            <w:proofErr w:type="gramEnd"/>
             <w:r>
               <w:rPr>
                 <w:rFonts w:ascii="BC Sans" w:hAnsi="BC Sans"/>
@@ -5827,7 +4873,6 @@
               <w:t>i</w:t>
             </w:r>
             <w:proofErr w:type="spellEnd"/>
-            <w:proofErr w:type="gramStart"/>
             <w:r>
               <w:rPr>
                 <w:rFonts w:ascii="BC Sans" w:hAnsi="BC Sans"/>
@@ -5857,7 +4902,6 @@
               <w:t>.lastName</w:t>
             </w:r>
             <w:proofErr w:type="spellEnd"/>
-            <w:proofErr w:type="gramEnd"/>
             <w:r>
               <w:rPr>
                 <w:rFonts w:ascii="BC Sans" w:hAnsi="BC Sans"/>
@@ -5874,86 +4918,16 @@
                 <w:szCs w:val="20"/>
                 <w:lang w:val="en-CA"/>
               </w:rPr>
-              <w:t>, {</w:t>
-            </w:r>
-            <w:proofErr w:type="gramStart"/>
-            <w:r>
-              <w:rPr>
-                <w:rFonts w:ascii="BC Sans" w:hAnsi="BC Sans"/>
-                <w:sz w:val="20"/>
-                <w:szCs w:val="20"/>
-                <w:lang w:val="en-CA"/>
-              </w:rPr>
-              <w:t>d.attachments</w:t>
-            </w:r>
-            <w:proofErr w:type="gramEnd"/>
-            <w:r>
-              <w:rPr>
-                <w:rFonts w:ascii="BC Sans" w:hAnsi="BC Sans"/>
-                <w:sz w:val="20"/>
-                <w:szCs w:val="20"/>
-                <w:lang w:val="en-CA"/>
-              </w:rPr>
-              <w:t>[i</w:t>
-            </w:r>
-            <w:proofErr w:type="gramStart"/>
-            <w:r>
-              <w:rPr>
-                <w:rFonts w:ascii="BC Sans" w:hAnsi="BC Sans"/>
-                <w:sz w:val="20"/>
-                <w:szCs w:val="20"/>
-                <w:lang w:val="en-CA"/>
-              </w:rPr>
-              <w:t>].takenBy.firstName</w:t>
-            </w:r>
-            <w:proofErr w:type="gramEnd"/>
-            <w:r>
-              <w:rPr>
-                <w:rFonts w:ascii="BC Sans" w:hAnsi="BC Sans"/>
-                <w:sz w:val="20"/>
-                <w:szCs w:val="20"/>
-                <w:lang w:val="en-CA"/>
-              </w:rPr>
-              <w:t>}</w:t>
-            </w:r>
-            <w:r>
-              <w:rPr>
-                <w:rFonts w:ascii="BC Sans" w:hAnsi="BC Sans"/>
-                <w:sz w:val="20"/>
-                <w:szCs w:val="20"/>
-                <w:lang w:val="en-CA"/>
-              </w:rPr>
-              <w:t>{</w:t>
-            </w:r>
-            <w:proofErr w:type="gramStart"/>
-            <w:r>
-              <w:rPr>
-                <w:rFonts w:ascii="BC Sans" w:hAnsi="BC Sans"/>
-                <w:sz w:val="20"/>
-                <w:szCs w:val="20"/>
-                <w:lang w:val="en-CA"/>
-              </w:rPr>
-              <w:t>d.attachments</w:t>
-            </w:r>
-            <w:proofErr w:type="gramEnd"/>
-            <w:r>
-              <w:rPr>
-                <w:rFonts w:ascii="BC Sans" w:hAnsi="BC Sans"/>
-                <w:sz w:val="20"/>
-                <w:szCs w:val="20"/>
-                <w:lang w:val="en-CA"/>
-              </w:rPr>
-              <w:t>[i</w:t>
-            </w:r>
-            <w:proofErr w:type="gramStart"/>
-            <w:r>
-              <w:rPr>
-                <w:rFonts w:ascii="BC Sans" w:hAnsi="BC Sans"/>
-                <w:sz w:val="20"/>
-                <w:szCs w:val="20"/>
-                <w:lang w:val="en-CA"/>
-              </w:rPr>
-              <w:t>].takenBy.</w:t>
+              <w:t>, {d.attachments[i].takenBy.firstName}</w:t>
+            </w:r>
+            <w:r>
+              <w:rPr>
+                <w:rFonts w:ascii="BC Sans" w:hAnsi="BC Sans"/>
+                <w:sz w:val="20"/>
+                <w:szCs w:val="20"/>
+                <w:lang w:val="en-CA"/>
+              </w:rPr>
+              <w:t>{d.attachments[i].takenBy.</w:t>
             </w:r>
             <w:r>
               <w:rPr>
@@ -5964,35 +4938,14 @@
               </w:rPr>
               <w:t>location</w:t>
             </w:r>
-            <w:proofErr w:type="gramEnd"/>
-            <w:r>
-              <w:rPr>
-                <w:rFonts w:ascii="BC Sans" w:hAnsi="BC Sans"/>
-                <w:sz w:val="20"/>
-                <w:szCs w:val="20"/>
-                <w:lang w:val="en-CA"/>
-              </w:rPr>
-              <w:t>:</w:t>
-            </w:r>
-            <w:proofErr w:type="gramStart"/>
-            <w:r>
-              <w:rPr>
-                <w:rFonts w:ascii="BC Sans" w:hAnsi="BC Sans"/>
-                <w:sz w:val="20"/>
-                <w:szCs w:val="20"/>
-                <w:lang w:val="en-CA"/>
-              </w:rPr>
-              <w:t>ifEM:hideBegin</w:t>
-            </w:r>
-            <w:proofErr w:type="gramEnd"/>
-            <w:r>
-              <w:rPr>
-                <w:rFonts w:ascii="BC Sans" w:hAnsi="BC Sans"/>
-                <w:sz w:val="20"/>
-                <w:szCs w:val="20"/>
-                <w:lang w:val="en-CA"/>
-              </w:rPr>
-              <w:t>}</w:t>
+            <w:r>
+              <w:rPr>
+                <w:rFonts w:ascii="BC Sans" w:hAnsi="BC Sans"/>
+                <w:sz w:val="20"/>
+                <w:szCs w:val="20"/>
+                <w:lang w:val="en-CA"/>
+              </w:rPr>
+              <w:t>:ifEM:hideBegin}</w:t>
             </w:r>
           </w:p>
         </w:tc>
@@ -6032,7 +4985,6 @@
               <w:t>{</w:t>
             </w:r>
             <w:proofErr w:type="spellStart"/>
-            <w:proofErr w:type="gramStart"/>
             <w:r>
               <w:rPr>
                 <w:rFonts w:ascii="BC Sans" w:hAnsi="BC Sans"/>
@@ -6046,7 +4998,6 @@
               <w:t>d.attachments</w:t>
             </w:r>
             <w:proofErr w:type="spellEnd"/>
-            <w:proofErr w:type="gramEnd"/>
             <w:r>
               <w:rPr>
                 <w:rFonts w:ascii="BC Sans" w:hAnsi="BC Sans"/>
@@ -6073,7 +5024,6 @@
               <w:t>i</w:t>
             </w:r>
             <w:proofErr w:type="spellEnd"/>
-            <w:proofErr w:type="gramStart"/>
             <w:r>
               <w:rPr>
                 <w:rFonts w:ascii="BC Sans" w:hAnsi="BC Sans"/>
@@ -6097,9 +5047,9 @@
                 <w:szCs w:val="20"/>
                 <w:lang w:val="en-CA"/>
               </w:rPr>
-              <w:t>takenBy.lastName</w:t>
-            </w:r>
-            <w:proofErr w:type="gramEnd"/>
+              <w:t>takenBy.lastName:hideEnd</w:t>
+            </w:r>
+            <w:proofErr w:type="spellEnd"/>
             <w:r>
               <w:rPr>
                 <w:rFonts w:ascii="BC Sans" w:hAnsi="BC Sans"/>
@@ -6110,9 +5060,8 @@
                 <w:szCs w:val="20"/>
                 <w:lang w:val="en-CA"/>
               </w:rPr>
-              <w:t>:</w:t>
-            </w:r>
-            <w:proofErr w:type="gramStart"/>
+              <w:t>}</w:t>
+            </w:r>
             <w:r>
               <w:rPr>
                 <w:rFonts w:ascii="BC Sans" w:hAnsi="BC Sans"/>
@@ -6123,34 +5072,8 @@
                 <w:szCs w:val="20"/>
                 <w:lang w:val="en-CA"/>
               </w:rPr>
-              <w:t>hideEnd</w:t>
-            </w:r>
-            <w:proofErr w:type="spellEnd"/>
-            <w:r>
-              <w:rPr>
-                <w:rFonts w:ascii="BC Sans" w:hAnsi="BC Sans"/>
-                <w:b w:val="0"/>
-                <w:bCs w:val="0"/>
-                <w:caps w:val="0"/>
-                <w:sz w:val="20"/>
-                <w:szCs w:val="20"/>
-                <w:lang w:val="en-CA"/>
-              </w:rPr>
-              <w:t>}</w:t>
-            </w:r>
-            <w:r>
-              <w:rPr>
-                <w:rFonts w:ascii="BC Sans" w:hAnsi="BC Sans"/>
-                <w:b w:val="0"/>
-                <w:bCs w:val="0"/>
-                <w:caps w:val="0"/>
-                <w:sz w:val="20"/>
-                <w:szCs w:val="20"/>
-                <w:lang w:val="en-CA"/>
-              </w:rPr>
               <w:t>Location</w:t>
             </w:r>
-            <w:proofErr w:type="gramEnd"/>
           </w:p>
         </w:tc>
         <w:tc>
@@ -6174,86 +5097,16 @@
                 <w:szCs w:val="20"/>
                 <w:lang w:val="en-CA"/>
               </w:rPr>
-              <w:t>{</w:t>
-            </w:r>
-            <w:proofErr w:type="gramStart"/>
-            <w:r>
-              <w:rPr>
-                <w:rFonts w:ascii="BC Sans" w:hAnsi="BC Sans"/>
-                <w:sz w:val="20"/>
-                <w:szCs w:val="20"/>
-                <w:lang w:val="en-CA"/>
-              </w:rPr>
-              <w:t>d.attachments</w:t>
-            </w:r>
-            <w:proofErr w:type="gramEnd"/>
-            <w:r>
-              <w:rPr>
-                <w:rFonts w:ascii="BC Sans" w:hAnsi="BC Sans"/>
-                <w:sz w:val="20"/>
-                <w:szCs w:val="20"/>
-                <w:lang w:val="en-CA"/>
-              </w:rPr>
-              <w:t>[i</w:t>
-            </w:r>
-            <w:proofErr w:type="gramStart"/>
-            <w:r>
-              <w:rPr>
-                <w:rFonts w:ascii="BC Sans" w:hAnsi="BC Sans"/>
-                <w:sz w:val="20"/>
-                <w:szCs w:val="20"/>
-                <w:lang w:val="en-CA"/>
-              </w:rPr>
-              <w:t>].location</w:t>
-            </w:r>
-            <w:proofErr w:type="gramEnd"/>
-            <w:r>
-              <w:rPr>
-                <w:rFonts w:ascii="BC Sans" w:hAnsi="BC Sans"/>
-                <w:sz w:val="20"/>
-                <w:szCs w:val="20"/>
-                <w:lang w:val="en-CA"/>
-              </w:rPr>
-              <w:t>}</w:t>
-            </w:r>
-            <w:r>
-              <w:rPr>
-                <w:rFonts w:ascii="BC Sans" w:hAnsi="BC Sans"/>
-                <w:sz w:val="20"/>
-                <w:szCs w:val="20"/>
-                <w:lang w:val="en-CA"/>
-              </w:rPr>
-              <w:t>{</w:t>
-            </w:r>
-            <w:proofErr w:type="gramStart"/>
-            <w:r>
-              <w:rPr>
-                <w:rFonts w:ascii="BC Sans" w:hAnsi="BC Sans"/>
-                <w:sz w:val="20"/>
-                <w:szCs w:val="20"/>
-                <w:lang w:val="en-CA"/>
-              </w:rPr>
-              <w:t>d.attachments</w:t>
-            </w:r>
-            <w:proofErr w:type="gramEnd"/>
-            <w:r>
-              <w:rPr>
-                <w:rFonts w:ascii="BC Sans" w:hAnsi="BC Sans"/>
-                <w:sz w:val="20"/>
-                <w:szCs w:val="20"/>
-                <w:lang w:val="en-CA"/>
-              </w:rPr>
-              <w:t>[i</w:t>
-            </w:r>
-            <w:proofErr w:type="gramStart"/>
-            <w:r>
-              <w:rPr>
-                <w:rFonts w:ascii="BC Sans" w:hAnsi="BC Sans"/>
-                <w:sz w:val="20"/>
-                <w:szCs w:val="20"/>
-                <w:lang w:val="en-CA"/>
-              </w:rPr>
-              <w:t>].takenBy.</w:t>
+              <w:t>{d.attachments[i].location}</w:t>
+            </w:r>
+            <w:r>
+              <w:rPr>
+                <w:rFonts w:ascii="BC Sans" w:hAnsi="BC Sans"/>
+                <w:sz w:val="20"/>
+                <w:szCs w:val="20"/>
+                <w:lang w:val="en-CA"/>
+              </w:rPr>
+              <w:t>{d.attachments[i].takenBy.</w:t>
             </w:r>
             <w:r>
               <w:rPr>
@@ -6264,7 +5117,6 @@
               </w:rPr>
               <w:t>location</w:t>
             </w:r>
-            <w:proofErr w:type="gramEnd"/>
             <w:r>
               <w:rPr>
                 <w:rFonts w:ascii="BC Sans" w:hAnsi="BC Sans"/>
@@ -6325,7 +5177,6 @@
         <w:t>{</w:t>
       </w:r>
       <w:proofErr w:type="spellStart"/>
-      <w:proofErr w:type="gramStart"/>
       <w:r>
         <w:rPr>
           <w:rFonts w:ascii="BC Sans" w:hAnsi="BC Sans"/>
@@ -6343,7 +5194,6 @@
         <w:t>attachments</w:t>
       </w:r>
       <w:proofErr w:type="spellEnd"/>
-      <w:proofErr w:type="gramEnd"/>
       <w:r>
         <w:rPr>
           <w:rFonts w:ascii="BC Sans" w:hAnsi="BC Sans"/>
@@ -6420,7 +5270,7 @@
 </file>
 
 <file path=word/endnotes.xml><?xml version="1.0" encoding="utf-8"?>
-<w:endnotes xmlns:wpc="http://schemas.microsoft.com/office/word/2010/wordprocessingCanvas" xmlns:cx="http://schemas.microsoft.com/office/drawing/2014/chartex" xmlns:cx1="http://schemas.microsoft.com/office/drawing/2015/9/8/chartex" xmlns:cx2="http://schemas.microsoft.com/office/drawing/2015/10/21/chartex" xmlns:cx3="http://schemas.microsoft.com/office/drawing/2016/5/9/chartex" xmlns:cx4="http://schemas.microsoft.com/office/drawing/2016/5/10/chartex" xmlns:cx5="http://schemas.microsoft.com/office/drawing/2016/5/11/chartex" xmlns:cx6="http://schemas.microsoft.com/office/drawing/2016/5/12/chartex" xmlns:cx7="http://schemas.microsoft.com/office/drawing/2016/5/13/chartex" xmlns:cx8="http://schemas.microsoft.com/office/drawing/2016/5/14/chartex" xmlns:mc="http://schemas.openxmlformats.org/markup-compatibility/2006" xmlns:aink="http://schemas.microsoft.com/office/drawing/2016/ink" xmlns:am3d="http://schemas.microsoft.com/office/drawing/2017/model3d" xmlns:o="urn:schemas-microsoft-com:office:office" xmlns:oel="http://schemas.microsoft.com/office/2019/extlst" xmlns:r="http://schemas.openxmlformats.org/officeDocument/2006/relationships" xmlns:m="http://schemas.openxmlformats.org/officeDocument/2006/math" xmlns:v="urn:schemas-microsoft-com:vml" xmlns:wp14="http://schemas.microsoft.com/office/word/2010/wordprocessingDrawing" xmlns:wp="http://schemas.openxmlformats.org/drawingml/2006/wordprocessingDrawing" xmlns:w10="urn:schemas-microsoft-com:office:word" xmlns:w="http://schemas.openxmlformats.org/wordprocessingml/2006/main" xmlns:w14="http://schemas.microsoft.com/office/word/2010/wordml" xmlns:w15="http://schemas.microsoft.com/office/word/2012/wordml" xmlns:w16cex="http://schemas.microsoft.com/office/word/2018/wordml/cex" xmlns:w16cid="http://schemas.microsoft.com/office/word/2016/wordml/cid" xmlns:w16="http://schemas.microsoft.com/office/word/2018/wordml" xmlns:w16du="http://schemas.microsoft.com/office/word/2023/wordml/word16du" xmlns:w16sdtdh="http://schemas.microsoft.com/office/word/2020/wordml/sdtdatahash" xmlns:w16sdtfl="http://schemas.microsoft.com/office/word/2024/wordml/sdtformatlock" xmlns:w16se="http://schemas.microsoft.com/office/word/2015/wordml/symex" xmlns:wpg="http://schemas.microsoft.com/office/word/2010/wordprocessingGroup" xmlns:wpi="http://schemas.microsoft.com/office/word/2010/wordprocessingInk" xmlns:wne="http://schemas.microsoft.com/office/word/2006/wordml" xmlns:wps="http://schemas.microsoft.com/office/word/2010/wordprocessingShape" mc:Ignorable="w14 w15 w16se w16cid w16 w16cex w16sdtdh w16sdtfl w16du wp14">
+<w:endnotes xmlns:wpc="http://schemas.microsoft.com/office/word/2010/wordprocessingCanvas" xmlns:cx="http://schemas.microsoft.com/office/drawing/2014/chartex" xmlns:cx1="http://schemas.microsoft.com/office/drawing/2015/9/8/chartex" xmlns:cx2="http://schemas.microsoft.com/office/drawing/2015/10/21/chartex" xmlns:cx3="http://schemas.microsoft.com/office/drawing/2016/5/9/chartex" xmlns:cx4="http://schemas.microsoft.com/office/drawing/2016/5/10/chartex" xmlns:cx5="http://schemas.microsoft.com/office/drawing/2016/5/11/chartex" xmlns:cx6="http://schemas.microsoft.com/office/drawing/2016/5/12/chartex" xmlns:cx7="http://schemas.microsoft.com/office/drawing/2016/5/13/chartex" xmlns:cx8="http://schemas.microsoft.com/office/drawing/2016/5/14/chartex" xmlns:mc="http://schemas.openxmlformats.org/markup-compatibility/2006" xmlns:aink="http://schemas.microsoft.com/office/drawing/2016/ink" xmlns:am3d="http://schemas.microsoft.com/office/drawing/2017/model3d" xmlns:o="urn:schemas-microsoft-com:office:office" xmlns:oel="http://schemas.microsoft.com/office/2019/extlst" xmlns:r="http://schemas.openxmlformats.org/officeDocument/2006/relationships" xmlns:m="http://schemas.openxmlformats.org/officeDocument/2006/math" xmlns:v="urn:schemas-microsoft-com:vml" xmlns:wp14="http://schemas.microsoft.com/office/word/2010/wordprocessingDrawing" xmlns:wp="http://schemas.openxmlformats.org/drawingml/2006/wordprocessingDrawing" xmlns:w10="urn:schemas-microsoft-com:office:word" xmlns:w="http://schemas.openxmlformats.org/wordprocessingml/2006/main" xmlns:w14="http://schemas.microsoft.com/office/word/2010/wordml" xmlns:w15="http://schemas.microsoft.com/office/word/2012/wordml" xmlns:w16cei="http://schemas.microsoft.com/office/word/2026/wordml/cei" xmlns:w16cex="http://schemas.microsoft.com/office/word/2018/wordml/cex" xmlns:w16cid="http://schemas.microsoft.com/office/word/2016/wordml/cid" xmlns:w16="http://schemas.microsoft.com/office/word/2018/wordml" xmlns:w16du="http://schemas.microsoft.com/office/word/2023/wordml/word16du" xmlns:w16sdtdh="http://schemas.microsoft.com/office/word/2020/wordml/sdtdatahash" xmlns:w16sdtfl="http://schemas.microsoft.com/office/word/2024/wordml/sdtformatlock" xmlns:w16se="http://schemas.microsoft.com/office/word/2015/wordml/symex" xmlns:wpg="http://schemas.microsoft.com/office/word/2010/wordprocessingGroup" xmlns:wpi="http://schemas.microsoft.com/office/word/2010/wordprocessingInk" xmlns:wne="http://schemas.microsoft.com/office/word/2006/wordml" xmlns:wps="http://schemas.microsoft.com/office/word/2010/wordprocessingShape" mc:Ignorable="w14 w15 w16se w16cid w16 w16cex w16sdtdh w16sdtfl w16du wp14">
   <w:endnote w:type="separator" w:id="-1">
     <w:p>
       <w:pPr>
@@ -6445,7 +5295,7 @@
 </file>
 
 <file path=word/footer1.xml><?xml version="1.0" encoding="utf-8"?>
-<w:ftr xmlns:wpc="http://schemas.microsoft.com/office/word/2010/wordprocessingCanvas" xmlns:cx="http://schemas.microsoft.com/office/drawing/2014/chartex" xmlns:cx1="http://schemas.microsoft.com/office/drawing/2015/9/8/chartex" xmlns:cx2="http://schemas.microsoft.com/office/drawing/2015/10/21/chartex" xmlns:cx3="http://schemas.microsoft.com/office/drawing/2016/5/9/chartex" xmlns:cx4="http://schemas.microsoft.com/office/drawing/2016/5/10/chartex" xmlns:cx5="http://schemas.microsoft.com/office/drawing/2016/5/11/chartex" xmlns:cx6="http://schemas.microsoft.com/office/drawing/2016/5/12/chartex" xmlns:cx7="http://schemas.microsoft.com/office/drawing/2016/5/13/chartex" xmlns:cx8="http://schemas.microsoft.com/office/drawing/2016/5/14/chartex" xmlns:mc="http://schemas.openxmlformats.org/markup-compatibility/2006" xmlns:aink="http://schemas.microsoft.com/office/drawing/2016/ink" xmlns:am3d="http://schemas.microsoft.com/office/drawing/2017/model3d" xmlns:o="urn:schemas-microsoft-com:office:office" xmlns:oel="http://schemas.microsoft.com/office/2019/extlst" xmlns:r="http://schemas.openxmlformats.org/officeDocument/2006/relationships" xmlns:m="http://schemas.openxmlformats.org/officeDocument/2006/math" xmlns:v="urn:schemas-microsoft-com:vml" xmlns:wp14="http://schemas.microsoft.com/office/word/2010/wordprocessingDrawing" xmlns:wp="http://schemas.openxmlformats.org/drawingml/2006/wordprocessingDrawing" xmlns:w10="urn:schemas-microsoft-com:office:word" xmlns:w="http://schemas.openxmlformats.org/wordprocessingml/2006/main" xmlns:w14="http://schemas.microsoft.com/office/word/2010/wordml" xmlns:w15="http://schemas.microsoft.com/office/word/2012/wordml" xmlns:w16cex="http://schemas.microsoft.com/office/word/2018/wordml/cex" xmlns:w16cid="http://schemas.microsoft.com/office/word/2016/wordml/cid" xmlns:w16="http://schemas.microsoft.com/office/word/2018/wordml" xmlns:w16du="http://schemas.microsoft.com/office/word/2023/wordml/word16du" xmlns:w16sdtdh="http://schemas.microsoft.com/office/word/2020/wordml/sdtdatahash" xmlns:w16sdtfl="http://schemas.microsoft.com/office/word/2024/wordml/sdtformatlock" xmlns:w16se="http://schemas.microsoft.com/office/word/2015/wordml/symex" xmlns:wpg="http://schemas.microsoft.com/office/word/2010/wordprocessingGroup" xmlns:wpi="http://schemas.microsoft.com/office/word/2010/wordprocessingInk" xmlns:wne="http://schemas.microsoft.com/office/word/2006/wordml" xmlns:wps="http://schemas.microsoft.com/office/word/2010/wordprocessingShape" mc:Ignorable="w14 w15 w16se w16cid w16 w16cex w16sdtdh w16sdtfl w16du wp14">
+<w:ftr xmlns:wpc="http://schemas.microsoft.com/office/word/2010/wordprocessingCanvas" xmlns:cx="http://schemas.microsoft.com/office/drawing/2014/chartex" xmlns:cx1="http://schemas.microsoft.com/office/drawing/2015/9/8/chartex" xmlns:cx2="http://schemas.microsoft.com/office/drawing/2015/10/21/chartex" xmlns:cx3="http://schemas.microsoft.com/office/drawing/2016/5/9/chartex" xmlns:cx4="http://schemas.microsoft.com/office/drawing/2016/5/10/chartex" xmlns:cx5="http://schemas.microsoft.com/office/drawing/2016/5/11/chartex" xmlns:cx6="http://schemas.microsoft.com/office/drawing/2016/5/12/chartex" xmlns:cx7="http://schemas.microsoft.com/office/drawing/2016/5/13/chartex" xmlns:cx8="http://schemas.microsoft.com/office/drawing/2016/5/14/chartex" xmlns:mc="http://schemas.openxmlformats.org/markup-compatibility/2006" xmlns:aink="http://schemas.microsoft.com/office/drawing/2016/ink" xmlns:am3d="http://schemas.microsoft.com/office/drawing/2017/model3d" xmlns:o="urn:schemas-microsoft-com:office:office" xmlns:oel="http://schemas.microsoft.com/office/2019/extlst" xmlns:r="http://schemas.openxmlformats.org/officeDocument/2006/relationships" xmlns:m="http://schemas.openxmlformats.org/officeDocument/2006/math" xmlns:v="urn:schemas-microsoft-com:vml" xmlns:wp14="http://schemas.microsoft.com/office/word/2010/wordprocessingDrawing" xmlns:wp="http://schemas.openxmlformats.org/drawingml/2006/wordprocessingDrawing" xmlns:w10="urn:schemas-microsoft-com:office:word" xmlns:w="http://schemas.openxmlformats.org/wordprocessingml/2006/main" xmlns:w14="http://schemas.microsoft.com/office/word/2010/wordml" xmlns:w15="http://schemas.microsoft.com/office/word/2012/wordml" xmlns:w16cei="http://schemas.microsoft.com/office/word/2026/wordml/cei" xmlns:w16cex="http://schemas.microsoft.com/office/word/2018/wordml/cex" xmlns:w16cid="http://schemas.microsoft.com/office/word/2016/wordml/cid" xmlns:w16="http://schemas.microsoft.com/office/word/2018/wordml" xmlns:w16du="http://schemas.microsoft.com/office/word/2023/wordml/word16du" xmlns:w16sdtdh="http://schemas.microsoft.com/office/word/2020/wordml/sdtdatahash" xmlns:w16sdtfl="http://schemas.microsoft.com/office/word/2024/wordml/sdtformatlock" xmlns:w16se="http://schemas.microsoft.com/office/word/2015/wordml/symex" xmlns:wpg="http://schemas.microsoft.com/office/word/2010/wordprocessingGroup" xmlns:wpi="http://schemas.microsoft.com/office/word/2010/wordprocessingInk" xmlns:wne="http://schemas.microsoft.com/office/word/2006/wordml" xmlns:wps="http://schemas.microsoft.com/office/word/2010/wordprocessingShape" mc:Ignorable="w14 w15 w16se w16cid w16 w16cex w16sdtdh w16sdtfl w16du wp14">
   <w:tbl>
     <w:tblPr>
       <w:tblW w:w="0" w:type="auto"/>
@@ -6506,7 +5356,7 @@
 </file>
 
 <file path=word/footnotes.xml><?xml version="1.0" encoding="utf-8"?>
-<w:footnotes xmlns:wpc="http://schemas.microsoft.com/office/word/2010/wordprocessingCanvas" xmlns:cx="http://schemas.microsoft.com/office/drawing/2014/chartex" xmlns:cx1="http://schemas.microsoft.com/office/drawing/2015/9/8/chartex" xmlns:cx2="http://schemas.microsoft.com/office/drawing/2015/10/21/chartex" xmlns:cx3="http://schemas.microsoft.com/office/drawing/2016/5/9/chartex" xmlns:cx4="http://schemas.microsoft.com/office/drawing/2016/5/10/chartex" xmlns:cx5="http://schemas.microsoft.com/office/drawing/2016/5/11/chartex" xmlns:cx6="http://schemas.microsoft.com/office/drawing/2016/5/12/chartex" xmlns:cx7="http://schemas.microsoft.com/office/drawing/2016/5/13/chartex" xmlns:cx8="http://schemas.microsoft.com/office/drawing/2016/5/14/chartex" xmlns:mc="http://schemas.openxmlformats.org/markup-compatibility/2006" xmlns:aink="http://schemas.microsoft.com/office/drawing/2016/ink" xmlns:am3d="http://schemas.microsoft.com/office/drawing/2017/model3d" xmlns:o="urn:schemas-microsoft-com:office:office" xmlns:oel="http://schemas.microsoft.com/office/2019/extlst" xmlns:r="http://schemas.openxmlformats.org/officeDocument/2006/relationships" xmlns:m="http://schemas.openxmlformats.org/officeDocument/2006/math" xmlns:v="urn:schemas-microsoft-com:vml" xmlns:wp14="http://schemas.microsoft.com/office/word/2010/wordprocessingDrawing" xmlns:wp="http://schemas.openxmlformats.org/drawingml/2006/wordprocessingDrawing" xmlns:w10="urn:schemas-microsoft-com:office:word" xmlns:w="http://schemas.openxmlformats.org/wordprocessingml/2006/main" xmlns:w14="http://schemas.microsoft.com/office/word/2010/wordml" xmlns:w15="http://schemas.microsoft.com/office/word/2012/wordml" xmlns:w16cex="http://schemas.microsoft.com/office/word/2018/wordml/cex" xmlns:w16cid="http://schemas.microsoft.com/office/word/2016/wordml/cid" xmlns:w16="http://schemas.microsoft.com/office/word/2018/wordml" xmlns:w16du="http://schemas.microsoft.com/office/word/2023/wordml/word16du" xmlns:w16sdtdh="http://schemas.microsoft.com/office/word/2020/wordml/sdtdatahash" xmlns:w16sdtfl="http://schemas.microsoft.com/office/word/2024/wordml/sdtformatlock" xmlns:w16se="http://schemas.microsoft.com/office/word/2015/wordml/symex" xmlns:wpg="http://schemas.microsoft.com/office/word/2010/wordprocessingGroup" xmlns:wpi="http://schemas.microsoft.com/office/word/2010/wordprocessingInk" xmlns:wne="http://schemas.microsoft.com/office/word/2006/wordml" xmlns:wps="http://schemas.microsoft.com/office/word/2010/wordprocessingShape" mc:Ignorable="w14 w15 w16se w16cid w16 w16cex w16sdtdh w16sdtfl w16du wp14">
+<w:footnotes xmlns:wpc="http://schemas.microsoft.com/office/word/2010/wordprocessingCanvas" xmlns:cx="http://schemas.microsoft.com/office/drawing/2014/chartex" xmlns:cx1="http://schemas.microsoft.com/office/drawing/2015/9/8/chartex" xmlns:cx2="http://schemas.microsoft.com/office/drawing/2015/10/21/chartex" xmlns:cx3="http://schemas.microsoft.com/office/drawing/2016/5/9/chartex" xmlns:cx4="http://schemas.microsoft.com/office/drawing/2016/5/10/chartex" xmlns:cx5="http://schemas.microsoft.com/office/drawing/2016/5/11/chartex" xmlns:cx6="http://schemas.microsoft.com/office/drawing/2016/5/12/chartex" xmlns:cx7="http://schemas.microsoft.com/office/drawing/2016/5/13/chartex" xmlns:cx8="http://schemas.microsoft.com/office/drawing/2016/5/14/chartex" xmlns:mc="http://schemas.openxmlformats.org/markup-compatibility/2006" xmlns:aink="http://schemas.microsoft.com/office/drawing/2016/ink" xmlns:am3d="http://schemas.microsoft.com/office/drawing/2017/model3d" xmlns:o="urn:schemas-microsoft-com:office:office" xmlns:oel="http://schemas.microsoft.com/office/2019/extlst" xmlns:r="http://schemas.openxmlformats.org/officeDocument/2006/relationships" xmlns:m="http://schemas.openxmlformats.org/officeDocument/2006/math" xmlns:v="urn:schemas-microsoft-com:vml" xmlns:wp14="http://schemas.microsoft.com/office/word/2010/wordprocessingDrawing" xmlns:wp="http://schemas.openxmlformats.org/drawingml/2006/wordprocessingDrawing" xmlns:w10="urn:schemas-microsoft-com:office:word" xmlns:w="http://schemas.openxmlformats.org/wordprocessingml/2006/main" xmlns:w14="http://schemas.microsoft.com/office/word/2010/wordml" xmlns:w15="http://schemas.microsoft.com/office/word/2012/wordml" xmlns:w16cei="http://schemas.microsoft.com/office/word/2026/wordml/cei" xmlns:w16cex="http://schemas.microsoft.com/office/word/2018/wordml/cex" xmlns:w16cid="http://schemas.microsoft.com/office/word/2016/wordml/cid" xmlns:w16="http://schemas.microsoft.com/office/word/2018/wordml" xmlns:w16du="http://schemas.microsoft.com/office/word/2023/wordml/word16du" xmlns:w16sdtdh="http://schemas.microsoft.com/office/word/2020/wordml/sdtdatahash" xmlns:w16sdtfl="http://schemas.microsoft.com/office/word/2024/wordml/sdtformatlock" xmlns:w16se="http://schemas.microsoft.com/office/word/2015/wordml/symex" xmlns:wpg="http://schemas.microsoft.com/office/word/2010/wordprocessingGroup" xmlns:wpi="http://schemas.microsoft.com/office/word/2010/wordprocessingInk" xmlns:wne="http://schemas.microsoft.com/office/word/2006/wordml" xmlns:wps="http://schemas.microsoft.com/office/word/2010/wordprocessingShape" mc:Ignorable="w14 w15 w16se w16cid w16 w16cex w16sdtdh w16sdtfl w16du wp14">
   <w:footnote w:type="separator" w:id="-1">
     <w:p>
       <w:pPr>
@@ -6531,7 +5381,7 @@
 </file>
 
 <file path=word/header1.xml><?xml version="1.0" encoding="utf-8"?>
-<w:hdr xmlns:wpc="http://schemas.microsoft.com/office/word/2010/wordprocessingCanvas" xmlns:cx="http://schemas.microsoft.com/office/drawing/2014/chartex" xmlns:cx1="http://schemas.microsoft.com/office/drawing/2015/9/8/chartex" xmlns:cx2="http://schemas.microsoft.com/office/drawing/2015/10/21/chartex" xmlns:cx3="http://schemas.microsoft.com/office/drawing/2016/5/9/chartex" xmlns:cx4="http://schemas.microsoft.com/office/drawing/2016/5/10/chartex" xmlns:cx5="http://schemas.microsoft.com/office/drawing/2016/5/11/chartex" xmlns:cx6="http://schemas.microsoft.com/office/drawing/2016/5/12/chartex" xmlns:cx7="http://schemas.microsoft.com/office/drawing/2016/5/13/chartex" xmlns:cx8="http://schemas.microsoft.com/office/drawing/2016/5/14/chartex" xmlns:mc="http://schemas.openxmlformats.org/markup-compatibility/2006" xmlns:aink="http://schemas.microsoft.com/office/drawing/2016/ink" xmlns:am3d="http://schemas.microsoft.com/office/drawing/2017/model3d" xmlns:o="urn:schemas-microsoft-com:office:office" xmlns:oel="http://schemas.microsoft.com/office/2019/extlst" xmlns:r="http://schemas.openxmlformats.org/officeDocument/2006/relationships" xmlns:m="http://schemas.openxmlformats.org/officeDocument/2006/math" xmlns:v="urn:schemas-microsoft-com:vml" xmlns:wp14="http://schemas.microsoft.com/office/word/2010/wordprocessingDrawing" xmlns:wp="http://schemas.openxmlformats.org/drawingml/2006/wordprocessingDrawing" xmlns:w10="urn:schemas-microsoft-com:office:word" xmlns:w="http://schemas.openxmlformats.org/wordprocessingml/2006/main" xmlns:w14="http://schemas.microsoft.com/office/word/2010/wordml" xmlns:w15="http://schemas.microsoft.com/office/word/2012/wordml" xmlns:w16cex="http://schemas.microsoft.com/office/word/2018/wordml/cex" xmlns:w16cid="http://schemas.microsoft.com/office/word/2016/wordml/cid" xmlns:w16="http://schemas.microsoft.com/office/word/2018/wordml" xmlns:w16du="http://schemas.microsoft.com/office/word/2023/wordml/word16du" xmlns:w16sdtdh="http://schemas.microsoft.com/office/word/2020/wordml/sdtdatahash" xmlns:w16sdtfl="http://schemas.microsoft.com/office/word/2024/wordml/sdtformatlock" xmlns:w16se="http://schemas.microsoft.com/office/word/2015/wordml/symex" xmlns:wpg="http://schemas.microsoft.com/office/word/2010/wordprocessingGroup" xmlns:wpi="http://schemas.microsoft.com/office/word/2010/wordprocessingInk" xmlns:wne="http://schemas.microsoft.com/office/word/2006/wordml" xmlns:wps="http://schemas.microsoft.com/office/word/2010/wordprocessingShape" mc:Ignorable="w14 w15 w16se w16cid w16 w16cex w16sdtdh w16sdtfl w16du wp14">
+<w:hdr xmlns:wpc="http://schemas.microsoft.com/office/word/2010/wordprocessingCanvas" xmlns:cx="http://schemas.microsoft.com/office/drawing/2014/chartex" xmlns:cx1="http://schemas.microsoft.com/office/drawing/2015/9/8/chartex" xmlns:cx2="http://schemas.microsoft.com/office/drawing/2015/10/21/chartex" xmlns:cx3="http://schemas.microsoft.com/office/drawing/2016/5/9/chartex" xmlns:cx4="http://schemas.microsoft.com/office/drawing/2016/5/10/chartex" xmlns:cx5="http://schemas.microsoft.com/office/drawing/2016/5/11/chartex" xmlns:cx6="http://schemas.microsoft.com/office/drawing/2016/5/12/chartex" xmlns:cx7="http://schemas.microsoft.com/office/drawing/2016/5/13/chartex" xmlns:cx8="http://schemas.microsoft.com/office/drawing/2016/5/14/chartex" xmlns:mc="http://schemas.openxmlformats.org/markup-compatibility/2006" xmlns:aink="http://schemas.microsoft.com/office/drawing/2016/ink" xmlns:am3d="http://schemas.microsoft.com/office/drawing/2017/model3d" xmlns:o="urn:schemas-microsoft-com:office:office" xmlns:oel="http://schemas.microsoft.com/office/2019/extlst" xmlns:r="http://schemas.openxmlformats.org/officeDocument/2006/relationships" xmlns:m="http://schemas.openxmlformats.org/officeDocument/2006/math" xmlns:v="urn:schemas-microsoft-com:vml" xmlns:wp14="http://schemas.microsoft.com/office/word/2010/wordprocessingDrawing" xmlns:wp="http://schemas.openxmlformats.org/drawingml/2006/wordprocessingDrawing" xmlns:w10="urn:schemas-microsoft-com:office:word" xmlns:w="http://schemas.openxmlformats.org/wordprocessingml/2006/main" xmlns:w14="http://schemas.microsoft.com/office/word/2010/wordml" xmlns:w15="http://schemas.microsoft.com/office/word/2012/wordml" xmlns:w16cei="http://schemas.microsoft.com/office/word/2026/wordml/cei" xmlns:w16cex="http://schemas.microsoft.com/office/word/2018/wordml/cex" xmlns:w16cid="http://schemas.microsoft.com/office/word/2016/wordml/cid" xmlns:w16="http://schemas.microsoft.com/office/word/2018/wordml" xmlns:w16du="http://schemas.microsoft.com/office/word/2023/wordml/word16du" xmlns:w16sdtdh="http://schemas.microsoft.com/office/word/2020/wordml/sdtdatahash" xmlns:w16sdtfl="http://schemas.microsoft.com/office/word/2024/wordml/sdtformatlock" xmlns:w16se="http://schemas.microsoft.com/office/word/2015/wordml/symex" xmlns:wpg="http://schemas.microsoft.com/office/word/2010/wordprocessingGroup" xmlns:wpi="http://schemas.microsoft.com/office/word/2010/wordprocessingInk" xmlns:wne="http://schemas.microsoft.com/office/word/2006/wordml" xmlns:wps="http://schemas.microsoft.com/office/word/2010/wordprocessingShape" mc:Ignorable="w14 w15 w16se w16cid w16 w16cex w16sdtdh w16sdtfl w16du wp14">
   <w:tbl>
     <w:tblPr>
       <w:tblW w:w="10802" w:type="dxa"/>
@@ -6640,7 +5490,6 @@
             <w:t>Report printed on {</w:t>
           </w:r>
           <w:proofErr w:type="spellStart"/>
-          <w:proofErr w:type="gramStart"/>
           <w:r>
             <w:rPr>
               <w:rFonts w:ascii="BC Sans" w:eastAsia="BC Sans" w:hAnsi="BC Sans" w:cs="BC Sans"/>
@@ -6666,7 +5515,6 @@
             <w:t>generatedOn</w:t>
           </w:r>
           <w:proofErr w:type="spellEnd"/>
-          <w:proofErr w:type="gramEnd"/>
           <w:r>
             <w:rPr>
               <w:rFonts w:ascii="BC Sans" w:eastAsia="BC Sans" w:hAnsi="BC Sans" w:cs="BC Sans"/>
@@ -8211,15 +7059,6 @@
 </file>
 
 <file path=customXml/item2.xml><?xml version="1.0" encoding="utf-8"?>
-<?mso-contentType ?>
-<FormTemplates xmlns="http://schemas.microsoft.com/sharepoint/v3/contenttype/forms">
-  <Display>DocumentLibraryForm</Display>
-  <Edit>DocumentLibraryForm</Edit>
-  <New>DocumentLibraryForm</New>
-</FormTemplates>
-</file>
-
-<file path=customXml/item3.xml><?xml version="1.0" encoding="utf-8"?>
 <ct:contentTypeSchema xmlns:ct="http://schemas.microsoft.com/office/2006/metadata/contentType" xmlns:ma="http://schemas.microsoft.com/office/2006/metadata/properties/metaAttributes" ct:_="" ma:_="" ma:contentTypeName="Document" ma:contentTypeID="0x010100ED0089B3ED392A4CB3C10705735CFAD3" ma:contentTypeVersion="15" ma:contentTypeDescription="Create a new document." ma:contentTypeScope="" ma:versionID="e9715c4352d5d9c94cf397f6db7911f6">
   <xsd:schema xmlns:xsd="http://www.w3.org/2001/XMLSchema" xmlns:xs="http://www.w3.org/2001/XMLSchema" xmlns:p="http://schemas.microsoft.com/office/2006/metadata/properties" xmlns:ns2="aa9c99c1-69c1-4b58-9df5-4d4796c46f8a" xmlns:ns3="cbeac988-4fd5-47cf-ad03-89cc7678fa90" targetNamespace="http://schemas.microsoft.com/office/2006/metadata/properties" ma:root="true" ma:fieldsID="4a7b24a40f906d6832371abf7aef78d6" ns2:_="" ns3:_="">
     <xsd:import namespace="aa9c99c1-69c1-4b58-9df5-4d4796c46f8a"/>
@@ -8454,6 +7293,15 @@
 </ct:contentTypeSchema>
 </file>
 
+<file path=customXml/item3.xml><?xml version="1.0" encoding="utf-8"?>
+<?mso-contentType ?>
+<FormTemplates xmlns="http://schemas.microsoft.com/sharepoint/v3/contenttype/forms">
+  <Display>DocumentLibraryForm</Display>
+  <Edit>DocumentLibraryForm</Edit>
+  <New>DocumentLibraryForm</New>
+</FormTemplates>
+</file>
+
 <file path=customXml/itemProps1.xml><?xml version="1.0" encoding="utf-8"?>
 <ds:datastoreItem xmlns:ds="http://schemas.openxmlformats.org/officeDocument/2006/customXml" ds:itemID="{C6C5DCE0-D69C-4B6E-96D9-C69B23DE6D4A}">
   <ds:schemaRefs>
@@ -8466,14 +7314,6 @@
 </file>
 
 <file path=customXml/itemProps2.xml><?xml version="1.0" encoding="utf-8"?>
-<ds:datastoreItem xmlns:ds="http://schemas.openxmlformats.org/officeDocument/2006/customXml" ds:itemID="{4BECF9F2-3A10-48CC-8D31-4F6E8664527E}">
-  <ds:schemaRefs>
-    <ds:schemaRef ds:uri="http://schemas.microsoft.com/sharepoint/v3/contenttype/forms"/>
-  </ds:schemaRefs>
-</ds:datastoreItem>
-</file>
-
-<file path=customXml/itemProps3.xml><?xml version="1.0" encoding="utf-8"?>
 <ds:datastoreItem xmlns:ds="http://schemas.openxmlformats.org/officeDocument/2006/customXml" ds:itemID="{26FF9410-7F49-4DD5-9478-D670A139DF54}">
   <ds:schemaRefs>
     <ds:schemaRef ds:uri="http://schemas.microsoft.com/office/2006/metadata/contentType"/>
@@ -8490,4 +7330,12 @@
     <ds:schemaRef ds:uri="http://schemas.microsoft.com/internal/obd"/>
   </ds:schemaRefs>
 </ds:datastoreItem>
+</file>
+
+<file path=customXml/itemProps3.xml><?xml version="1.0" encoding="utf-8"?>
+<ds:datastoreItem xmlns:ds="http://schemas.openxmlformats.org/officeDocument/2006/customXml" ds:itemID="{4BECF9F2-3A10-48CC-8D31-4F6E8664527E}">
+  <ds:schemaRefs>
+    <ds:schemaRef ds:uri="http://schemas.microsoft.com/sharepoint/v3/contenttype/forms"/>
+  </ds:schemaRefs>
+</ds:datastoreItem>
 </file>
</xml_diff>

<commit_message>
chore: CE-2337 cleanup task subcats and redefine categories (#1693)
Co-authored-by: team-wolverine-nrm-repo-updater[bot] <203337993+team-wolverine-nrm-repo-updater[bot]@users.noreply.github.com>
</commit_message>
<xml_diff>
--- a/backend/templates/task/CDOGS-TDR-TEMPLATE-v1.docx
+++ b/backend/templates/task/CDOGS-TDR-TEMPLATE-v1.docx
@@ -1,6 +1,6 @@
 
 <file path=word/document.xml><?xml version="1.0" encoding="utf-8"?>
-<w:document xmlns:wpc="http://schemas.microsoft.com/office/word/2010/wordprocessingCanvas" xmlns:cx="http://schemas.microsoft.com/office/drawing/2014/chartex" xmlns:cx1="http://schemas.microsoft.com/office/drawing/2015/9/8/chartex" xmlns:cx2="http://schemas.microsoft.com/office/drawing/2015/10/21/chartex" xmlns:cx3="http://schemas.microsoft.com/office/drawing/2016/5/9/chartex" xmlns:cx4="http://schemas.microsoft.com/office/drawing/2016/5/10/chartex" xmlns:cx5="http://schemas.microsoft.com/office/drawing/2016/5/11/chartex" xmlns:cx6="http://schemas.microsoft.com/office/drawing/2016/5/12/chartex" xmlns:cx7="http://schemas.microsoft.com/office/drawing/2016/5/13/chartex" xmlns:cx8="http://schemas.microsoft.com/office/drawing/2016/5/14/chartex" xmlns:mc="http://schemas.openxmlformats.org/markup-compatibility/2006" xmlns:aink="http://schemas.microsoft.com/office/drawing/2016/ink" xmlns:am3d="http://schemas.microsoft.com/office/drawing/2017/model3d" xmlns:o="urn:schemas-microsoft-com:office:office" xmlns:oel="http://schemas.microsoft.com/office/2019/extlst" xmlns:r="http://schemas.openxmlformats.org/officeDocument/2006/relationships" xmlns:m="http://schemas.openxmlformats.org/officeDocument/2006/math" xmlns:v="urn:schemas-microsoft-com:vml" xmlns:wp14="http://schemas.microsoft.com/office/word/2010/wordprocessingDrawing" xmlns:wp="http://schemas.openxmlformats.org/drawingml/2006/wordprocessingDrawing" xmlns:w10="urn:schemas-microsoft-com:office:word" xmlns:w="http://schemas.openxmlformats.org/wordprocessingml/2006/main" xmlns:w14="http://schemas.microsoft.com/office/word/2010/wordml" xmlns:w15="http://schemas.microsoft.com/office/word/2012/wordml" xmlns:w16cex="http://schemas.microsoft.com/office/word/2018/wordml/cex" xmlns:w16cid="http://schemas.microsoft.com/office/word/2016/wordml/cid" xmlns:w16="http://schemas.microsoft.com/office/word/2018/wordml" xmlns:w16du="http://schemas.microsoft.com/office/word/2023/wordml/word16du" xmlns:w16sdtdh="http://schemas.microsoft.com/office/word/2020/wordml/sdtdatahash" xmlns:w16sdtfl="http://schemas.microsoft.com/office/word/2024/wordml/sdtformatlock" xmlns:w16se="http://schemas.microsoft.com/office/word/2015/wordml/symex" xmlns:wpg="http://schemas.microsoft.com/office/word/2010/wordprocessingGroup" xmlns:wpi="http://schemas.microsoft.com/office/word/2010/wordprocessingInk" xmlns:wne="http://schemas.microsoft.com/office/word/2006/wordml" xmlns:wps="http://schemas.microsoft.com/office/word/2010/wordprocessingShape" mc:Ignorable="w14 w15 w16se w16cid w16 w16cex w16sdtdh w16sdtfl w16du wp14">
+<w:document xmlns:wpc="http://schemas.microsoft.com/office/word/2010/wordprocessingCanvas" xmlns:cx="http://schemas.microsoft.com/office/drawing/2014/chartex" xmlns:cx1="http://schemas.microsoft.com/office/drawing/2015/9/8/chartex" xmlns:cx2="http://schemas.microsoft.com/office/drawing/2015/10/21/chartex" xmlns:cx3="http://schemas.microsoft.com/office/drawing/2016/5/9/chartex" xmlns:cx4="http://schemas.microsoft.com/office/drawing/2016/5/10/chartex" xmlns:cx5="http://schemas.microsoft.com/office/drawing/2016/5/11/chartex" xmlns:cx6="http://schemas.microsoft.com/office/drawing/2016/5/12/chartex" xmlns:cx7="http://schemas.microsoft.com/office/drawing/2016/5/13/chartex" xmlns:cx8="http://schemas.microsoft.com/office/drawing/2016/5/14/chartex" xmlns:mc="http://schemas.openxmlformats.org/markup-compatibility/2006" xmlns:aink="http://schemas.microsoft.com/office/drawing/2016/ink" xmlns:am3d="http://schemas.microsoft.com/office/drawing/2017/model3d" xmlns:o="urn:schemas-microsoft-com:office:office" xmlns:oel="http://schemas.microsoft.com/office/2019/extlst" xmlns:r="http://schemas.openxmlformats.org/officeDocument/2006/relationships" xmlns:m="http://schemas.openxmlformats.org/officeDocument/2006/math" xmlns:v="urn:schemas-microsoft-com:vml" xmlns:wp14="http://schemas.microsoft.com/office/word/2010/wordprocessingDrawing" xmlns:wp="http://schemas.openxmlformats.org/drawingml/2006/wordprocessingDrawing" xmlns:w10="urn:schemas-microsoft-com:office:word" xmlns:w="http://schemas.openxmlformats.org/wordprocessingml/2006/main" xmlns:w14="http://schemas.microsoft.com/office/word/2010/wordml" xmlns:w15="http://schemas.microsoft.com/office/word/2012/wordml" xmlns:w16cei="http://schemas.microsoft.com/office/word/2026/wordml/cei" xmlns:w16cex="http://schemas.microsoft.com/office/word/2018/wordml/cex" xmlns:w16cid="http://schemas.microsoft.com/office/word/2016/wordml/cid" xmlns:w16="http://schemas.microsoft.com/office/word/2018/wordml" xmlns:w16du="http://schemas.microsoft.com/office/word/2023/wordml/word16du" xmlns:w16sdtdh="http://schemas.microsoft.com/office/word/2020/wordml/sdtdatahash" xmlns:w16sdtfl="http://schemas.microsoft.com/office/word/2024/wordml/sdtformatlock" xmlns:w16se="http://schemas.microsoft.com/office/word/2015/wordml/symex" xmlns:wpg="http://schemas.microsoft.com/office/word/2010/wordprocessingGroup" xmlns:wpi="http://schemas.microsoft.com/office/word/2010/wordprocessingInk" xmlns:wne="http://schemas.microsoft.com/office/word/2006/wordml" xmlns:wps="http://schemas.microsoft.com/office/word/2010/wordprocessingShape" mc:Ignorable="w14 w15 w16se w16cid w16 w16cex w16sdtdh w16sdtfl w16du wp14">
   <w:body>
     <w:p>
       <w:pPr>
@@ -68,7 +68,6 @@
                 <w:szCs w:val="20"/>
               </w:rPr>
             </w:pPr>
-            <w:proofErr w:type="gramStart"/>
             <w:r>
               <w:rPr>
                 <w:rFonts w:ascii="BC Sans" w:eastAsia="Times New Roman" w:hAnsi="BC Sans" w:cs="Times New Roman"/>
@@ -113,7 +112,6 @@
               </w:rPr>
               <w:t>{</w:t>
             </w:r>
-            <w:proofErr w:type="spellStart"/>
             <w:r>
               <w:rPr>
                 <w:rFonts w:ascii="BC Sans" w:eastAsia="Times New Roman" w:hAnsi="BC Sans" w:cs="Times New Roman"/>
@@ -155,8 +153,6 @@
               </w:rPr>
               <w:t>Label</w:t>
             </w:r>
-            <w:proofErr w:type="spellEnd"/>
-            <w:proofErr w:type="gramEnd"/>
             <w:r>
               <w:rPr>
                 <w:rFonts w:ascii="BC Sans" w:eastAsia="Times New Roman" w:hAnsi="BC Sans" w:cs="Times New Roman"/>
@@ -188,9 +184,8 @@
                 <w:sz w:val="20"/>
                 <w:szCs w:val="20"/>
               </w:rPr>
-              <w:t xml:space="preserve">Task </w:t>
-            </w:r>
-            <w:proofErr w:type="gramStart"/>
+              <w:t>Task number</w:t>
+            </w:r>
             <w:r>
               <w:rPr>
                 <w:rFonts w:ascii="BC Sans" w:eastAsia="Times New Roman" w:hAnsi="BC Sans" w:cs="Times New Roman"/>
@@ -200,20 +195,8 @@
                 <w:sz w:val="20"/>
                 <w:szCs w:val="20"/>
               </w:rPr>
-              <w:t>number</w:t>
-            </w:r>
-            <w:r>
-              <w:rPr>
-                <w:rFonts w:ascii="BC Sans" w:eastAsia="Times New Roman" w:hAnsi="BC Sans" w:cs="Times New Roman"/>
-                <w:b w:val="0"/>
-                <w:bCs w:val="0"/>
-                <w:color w:val="000000" w:themeColor="text1"/>
-                <w:sz w:val="20"/>
-                <w:szCs w:val="20"/>
-              </w:rPr>
               <w:t>: {</w:t>
             </w:r>
-            <w:proofErr w:type="spellStart"/>
             <w:r>
               <w:rPr>
                 <w:rFonts w:ascii="BC Sans" w:eastAsia="Times New Roman" w:hAnsi="BC Sans" w:cs="Times New Roman"/>
@@ -246,8 +229,6 @@
               </w:rPr>
               <w:t>taskNumber</w:t>
             </w:r>
-            <w:proofErr w:type="spellEnd"/>
-            <w:proofErr w:type="gramEnd"/>
             <w:r>
               <w:rPr>
                 <w:rFonts w:ascii="BC Sans" w:eastAsia="Times New Roman" w:hAnsi="BC Sans" w:cs="Times New Roman"/>
@@ -422,8 +403,6 @@
               </w:rPr>
               <w:t>{</w:t>
             </w:r>
-            <w:proofErr w:type="spellStart"/>
-            <w:proofErr w:type="gramStart"/>
             <w:r>
               <w:rPr>
                 <w:rFonts w:ascii="BC Sans" w:eastAsia="Times New Roman" w:hAnsi="BC Sans" w:cs="Times New Roman"/>
@@ -431,122 +410,12 @@
                 <w:sz w:val="20"/>
                 <w:szCs w:val="20"/>
               </w:rPr>
-              <w:t>d</w:t>
+              <w:t>d.taskCategory</w:t>
             </w:r>
             <w:r>
               <w:rPr>
                 <w:rFonts w:ascii="BC Sans" w:eastAsia="Times New Roman" w:hAnsi="BC Sans" w:cs="Times New Roman"/>
                 <w:color w:val="000000" w:themeColor="text1"/>
-                <w:sz w:val="20"/>
-                <w:szCs w:val="20"/>
-              </w:rPr>
-              <w:t>.</w:t>
-            </w:r>
-            <w:r>
-              <w:rPr>
-                <w:rFonts w:ascii="BC Sans" w:eastAsia="Times New Roman" w:hAnsi="BC Sans" w:cs="Times New Roman"/>
-                <w:color w:val="000000" w:themeColor="text1"/>
-                <w:sz w:val="20"/>
-                <w:szCs w:val="20"/>
-              </w:rPr>
-              <w:t>taskType.category</w:t>
-            </w:r>
-            <w:proofErr w:type="gramEnd"/>
-            <w:r>
-              <w:rPr>
-                <w:rFonts w:ascii="BC Sans" w:eastAsia="Times New Roman" w:hAnsi="BC Sans" w:cs="Times New Roman"/>
-                <w:color w:val="000000" w:themeColor="text1"/>
-                <w:sz w:val="20"/>
-                <w:szCs w:val="20"/>
-              </w:rPr>
-              <w:t>.</w:t>
-            </w:r>
-            <w:proofErr w:type="gramStart"/>
-            <w:r>
-              <w:rPr>
-                <w:rFonts w:ascii="BC Sans" w:eastAsia="Times New Roman" w:hAnsi="BC Sans" w:cs="Times New Roman"/>
-                <w:color w:val="000000" w:themeColor="text1"/>
-                <w:sz w:val="20"/>
-                <w:szCs w:val="20"/>
-              </w:rPr>
-              <w:t>longDescription</w:t>
-            </w:r>
-            <w:proofErr w:type="spellEnd"/>
-            <w:r>
-              <w:rPr>
-                <w:rFonts w:ascii="BC Sans" w:eastAsia="Times New Roman" w:hAnsi="BC Sans" w:cs="Times New Roman"/>
-                <w:color w:val="000000" w:themeColor="text1"/>
-                <w:sz w:val="20"/>
-                <w:szCs w:val="20"/>
-              </w:rPr>
-              <w:t>}</w:t>
-            </w:r>
-            <w:r>
-              <w:rPr>
-                <w:rFonts w:ascii="BC Sans" w:eastAsia="Times New Roman" w:hAnsi="BC Sans" w:cs="Times New Roman"/>
-                <w:color w:val="000000" w:themeColor="text1"/>
-                <w:sz w:val="20"/>
-                <w:szCs w:val="20"/>
-              </w:rPr>
-              <w:t>{</w:t>
-            </w:r>
-            <w:r>
-              <w:rPr>
-                <w:rFonts w:ascii="BC Sans" w:eastAsia="Times New Roman" w:hAnsi="BC Sans" w:cs="Times New Roman"/>
-                <w:color w:val="000000" w:themeColor="text1"/>
-                <w:sz w:val="20"/>
-                <w:szCs w:val="20"/>
-              </w:rPr>
-              <w:t>d.</w:t>
-            </w:r>
-            <w:proofErr w:type="spellStart"/>
-            <w:r>
-              <w:rPr>
-                <w:rFonts w:ascii="BC Sans" w:eastAsia="Times New Roman" w:hAnsi="BC Sans" w:cs="Times New Roman"/>
-                <w:color w:val="000000" w:themeColor="text1"/>
-                <w:sz w:val="20"/>
-                <w:szCs w:val="20"/>
-                <w:lang w:val="en-CA"/>
-              </w:rPr>
-              <w:t>taskType.type</w:t>
-            </w:r>
-            <w:proofErr w:type="gramEnd"/>
-            <w:r>
-              <w:rPr>
-                <w:rFonts w:ascii="BC Sans" w:eastAsia="Times New Roman" w:hAnsi="BC Sans" w:cs="Times New Roman"/>
-                <w:color w:val="000000" w:themeColor="text1"/>
-                <w:sz w:val="20"/>
-                <w:szCs w:val="20"/>
-                <w:lang w:val="en-CA"/>
-              </w:rPr>
-              <w:t>.</w:t>
-            </w:r>
-            <w:proofErr w:type="gramStart"/>
-            <w:r>
-              <w:rPr>
-                <w:rFonts w:ascii="BC Sans" w:eastAsia="Times New Roman" w:hAnsi="BC Sans" w:cs="Times New Roman"/>
-                <w:color w:val="000000" w:themeColor="text1"/>
-                <w:sz w:val="20"/>
-                <w:szCs w:val="20"/>
-                <w:lang w:val="en-CA"/>
-              </w:rPr>
-              <w:t>longDescription:ifEM</w:t>
-            </w:r>
-            <w:proofErr w:type="gramEnd"/>
-            <w:r>
-              <w:rPr>
-                <w:rFonts w:ascii="BC Sans" w:eastAsia="Times New Roman" w:hAnsi="BC Sans" w:cs="Times New Roman"/>
-                <w:color w:val="000000" w:themeColor="text1"/>
-                <w:sz w:val="20"/>
-                <w:szCs w:val="20"/>
-                <w:lang w:val="en-CA"/>
-              </w:rPr>
-              <w:t>:hideBegin</w:t>
-            </w:r>
-            <w:proofErr w:type="spellEnd"/>
-            <w:r>
-              <w:rPr>
-                <w:rFonts w:ascii="BC Sans" w:hAnsi="BC Sans"/>
                 <w:sz w:val="20"/>
                 <w:szCs w:val="20"/>
               </w:rPr>
@@ -568,13 +437,14 @@
           </w:tcPr>
           <w:p>
             <w:pPr>
+              <w:spacing w:line="259" w:lineRule="auto"/>
               <w:rPr>
                 <w:rFonts w:ascii="BC Sans" w:hAnsi="BC Sans"/>
                 <w:b w:val="0"/>
                 <w:bCs w:val="0"/>
                 <w:caps w:val="0"/>
-                <w:sz w:val="20"/>
-                <w:szCs w:val="20"/>
+                <w:sz w:val="18"/>
+                <w:szCs w:val="18"/>
               </w:rPr>
             </w:pPr>
             <w:r>
@@ -586,21 +456,8 @@
                 <w:sz w:val="20"/>
                 <w:szCs w:val="20"/>
               </w:rPr>
-              <w:t xml:space="preserve">Task </w:t>
-            </w:r>
-            <w:proofErr w:type="gramStart"/>
-            <w:r>
-              <w:rPr>
-                <w:rFonts w:ascii="BC Sans" w:hAnsi="BC Sans"/>
-                <w:b w:val="0"/>
-                <w:bCs w:val="0"/>
-                <w:caps w:val="0"/>
-                <w:sz w:val="20"/>
-                <w:szCs w:val="20"/>
-              </w:rPr>
-              <w:t>sub category</w:t>
-            </w:r>
-            <w:proofErr w:type="gramEnd"/>
+              <w:t>Remarks</w:t>
+            </w:r>
           </w:p>
         </w:tc>
         <w:tc>
@@ -611,12 +468,13 @@
           </w:tcPr>
           <w:p>
             <w:pPr>
+              <w:spacing w:line="259" w:lineRule="auto"/>
               <w:cnfStyle w:val="000000000000" w:firstRow="0" w:lastRow="0" w:firstColumn="0" w:lastColumn="0" w:oddVBand="0" w:evenVBand="0" w:oddHBand="0" w:evenHBand="0" w:firstRowFirstColumn="0" w:firstRowLastColumn="0" w:lastRowFirstColumn="0" w:lastRowLastColumn="0"/>
               <w:rPr>
                 <w:rFonts w:ascii="BC Sans" w:eastAsia="Times New Roman" w:hAnsi="BC Sans" w:cs="Times New Roman"/>
                 <w:color w:val="000000" w:themeColor="text1"/>
-                <w:sz w:val="20"/>
-                <w:szCs w:val="20"/>
+                <w:sz w:val="18"/>
+                <w:szCs w:val="18"/>
               </w:rPr>
             </w:pPr>
             <w:r>
@@ -628,7 +486,6 @@
               </w:rPr>
               <w:t>{</w:t>
             </w:r>
-            <w:proofErr w:type="gramStart"/>
             <w:r>
               <w:rPr>
                 <w:rFonts w:ascii="BC Sans" w:eastAsia="Times New Roman" w:hAnsi="BC Sans" w:cs="Times New Roman"/>
@@ -647,32 +504,19 @@
               </w:rPr>
               <w:t>.</w:t>
             </w:r>
-            <w:proofErr w:type="spellStart"/>
             <w:r>
               <w:rPr>
                 <w:rFonts w:ascii="BC Sans" w:eastAsia="Times New Roman" w:hAnsi="BC Sans" w:cs="Times New Roman"/>
                 <w:color w:val="000000" w:themeColor="text1"/>
                 <w:sz w:val="20"/>
                 <w:szCs w:val="20"/>
-                <w:lang w:val="en-CA"/>
-              </w:rPr>
-              <w:t>taskType.type</w:t>
-            </w:r>
-            <w:proofErr w:type="gramEnd"/>
+              </w:rPr>
+              <w:t>remarks</w:t>
+            </w:r>
             <w:r>
               <w:rPr>
                 <w:rFonts w:ascii="BC Sans" w:eastAsia="Times New Roman" w:hAnsi="BC Sans" w:cs="Times New Roman"/>
                 <w:color w:val="000000" w:themeColor="text1"/>
-                <w:sz w:val="20"/>
-                <w:szCs w:val="20"/>
-                <w:lang w:val="en-CA"/>
-              </w:rPr>
-              <w:t>.longDescription</w:t>
-            </w:r>
-            <w:proofErr w:type="spellEnd"/>
-            <w:r>
-              <w:rPr>
-                <w:rFonts w:ascii="BC Sans" w:hAnsi="BC Sans"/>
                 <w:sz w:val="20"/>
                 <w:szCs w:val="20"/>
               </w:rPr>
@@ -692,6 +536,117 @@
             <w:tcW w:w="2700" w:type="dxa"/>
             <w:noWrap/>
             <w:vAlign w:val="center"/>
+            <w:hideMark/>
+          </w:tcPr>
+          <w:p>
+            <w:r>
+              <w:rPr>
+                <w:rFonts w:ascii="BC Sans" w:hAnsi="BC Sans"/>
+                <w:b w:val="0"/>
+                <w:bCs w:val="0"/>
+                <w:caps w:val="0"/>
+                <w:sz w:val="20"/>
+                <w:szCs w:val="20"/>
+              </w:rPr>
+              <w:t>Officer assigned</w:t>
+            </w:r>
+          </w:p>
+        </w:tc>
+        <w:tc>
+          <w:tcPr>
+            <w:tcW w:w="8216" w:type="dxa"/>
+            <w:noWrap/>
+            <w:vAlign w:val="center"/>
+            <w:hideMark/>
+          </w:tcPr>
+          <w:p>
+            <w:pPr>
+              <w:cnfStyle w:val="000000100000" w:firstRow="0" w:lastRow="0" w:firstColumn="0" w:lastColumn="0" w:oddVBand="0" w:evenVBand="0" w:oddHBand="1" w:evenHBand="0" w:firstRowFirstColumn="0" w:firstRowLastColumn="0" w:lastRowFirstColumn="0" w:lastRowLastColumn="0"/>
+              <w:rPr>
+                <w:rFonts w:ascii="BC Sans" w:eastAsia="Times New Roman" w:hAnsi="BC Sans" w:cs="Times New Roman"/>
+                <w:color w:val="000000"/>
+                <w:kern w:val="0"/>
+                <w:sz w:val="20"/>
+                <w:szCs w:val="20"/>
+                <w14:ligatures w14:val="none"/>
+              </w:rPr>
+            </w:pPr>
+            <w:r>
+              <w:rPr>
+                <w:rFonts w:ascii="BC Sans" w:eastAsia="Times New Roman" w:hAnsi="BC Sans" w:cs="Times New Roman"/>
+                <w:color w:val="000000"/>
+                <w:kern w:val="0"/>
+                <w:sz w:val="20"/>
+                <w:szCs w:val="20"/>
+                <w14:ligatures w14:val="none"/>
+              </w:rPr>
+              <w:t>{</w:t>
+            </w:r>
+            <w:r>
+              <w:rPr>
+                <w:rFonts w:ascii="BC Sans" w:eastAsia="Times New Roman" w:hAnsi="BC Sans" w:cs="Times New Roman"/>
+                <w:color w:val="000000"/>
+                <w:kern w:val="0"/>
+                <w:sz w:val="20"/>
+                <w:szCs w:val="20"/>
+                <w14:ligatures w14:val="none"/>
+              </w:rPr>
+              <w:t>d</w:t>
+            </w:r>
+            <w:r>
+              <w:rPr>
+                <w:rFonts w:ascii="BC Sans" w:eastAsia="Times New Roman" w:hAnsi="BC Sans" w:cs="Times New Roman"/>
+                <w:color w:val="000000" w:themeColor="text1"/>
+                <w:sz w:val="20"/>
+                <w:szCs w:val="20"/>
+              </w:rPr>
+              <w:t>.</w:t>
+            </w:r>
+            <w:r>
+              <w:rPr>
+                <w:rFonts w:ascii="BC Sans" w:eastAsia="Times New Roman" w:hAnsi="BC Sans" w:cs="Times New Roman"/>
+                <w:color w:val="000000" w:themeColor="text1"/>
+                <w:sz w:val="20"/>
+                <w:szCs w:val="20"/>
+              </w:rPr>
+              <w:t>assignedUser.lastName</w:t>
+            </w:r>
+            <w:r>
+              <w:rPr>
+                <w:rFonts w:ascii="BC Sans" w:eastAsia="Times New Roman" w:hAnsi="BC Sans" w:cs="Times New Roman"/>
+                <w:color w:val="000000"/>
+                <w:kern w:val="0"/>
+                <w:sz w:val="20"/>
+                <w:szCs w:val="20"/>
+                <w14:ligatures w14:val="none"/>
+              </w:rPr>
+              <w:t>}</w:t>
+            </w:r>
+            <w:r>
+              <w:rPr>
+                <w:rFonts w:ascii="BC Sans" w:eastAsia="Times New Roman" w:hAnsi="BC Sans" w:cs="Times New Roman"/>
+                <w:color w:val="000000"/>
+                <w:kern w:val="0"/>
+                <w:sz w:val="20"/>
+                <w:szCs w:val="20"/>
+                <w14:ligatures w14:val="none"/>
+              </w:rPr>
+              <w:t>, {d.assignedUser.firstName}</w:t>
+            </w:r>
+          </w:p>
+        </w:tc>
+      </w:tr>
+      <w:tr>
+        <w:trPr>
+          <w:trHeight w:val="360"/>
+        </w:trPr>
+        <w:tc>
+          <w:tcPr>
+            <w:cnfStyle w:val="001000000000" w:firstRow="0" w:lastRow="0" w:firstColumn="1" w:lastColumn="0" w:oddVBand="0" w:evenVBand="0" w:oddHBand="0" w:evenHBand="0" w:firstRowFirstColumn="0" w:firstRowLastColumn="0" w:lastRowFirstColumn="0" w:lastRowLastColumn="0"/>
+            <w:tcW w:w="2700" w:type="dxa"/>
+            <w:noWrap/>
+            <w:vAlign w:val="center"/>
+            <w:hideMark/>
           </w:tcPr>
           <w:p>
             <w:pPr>
@@ -714,163 +669,7 @@
                 <w:sz w:val="20"/>
                 <w:szCs w:val="20"/>
               </w:rPr>
-              <w:t>{</w:t>
-            </w:r>
-            <w:proofErr w:type="spellStart"/>
-            <w:proofErr w:type="gramStart"/>
-            <w:r>
-              <w:rPr>
-                <w:rFonts w:ascii="BC Sans" w:hAnsi="BC Sans"/>
-                <w:b w:val="0"/>
-                <w:bCs w:val="0"/>
-                <w:caps w:val="0"/>
-                <w:sz w:val="20"/>
-                <w:szCs w:val="20"/>
-              </w:rPr>
-              <w:t>d.taskType.type</w:t>
-            </w:r>
-            <w:proofErr w:type="gramEnd"/>
-            <w:r>
-              <w:rPr>
-                <w:rFonts w:ascii="BC Sans" w:hAnsi="BC Sans"/>
-                <w:b w:val="0"/>
-                <w:bCs w:val="0"/>
-                <w:caps w:val="0"/>
-                <w:sz w:val="20"/>
-                <w:szCs w:val="20"/>
-              </w:rPr>
-              <w:t>.</w:t>
-            </w:r>
-            <w:proofErr w:type="gramStart"/>
-            <w:r>
-              <w:rPr>
-                <w:rFonts w:ascii="BC Sans" w:hAnsi="BC Sans"/>
-                <w:b w:val="0"/>
-                <w:bCs w:val="0"/>
-                <w:caps w:val="0"/>
-                <w:sz w:val="20"/>
-                <w:szCs w:val="20"/>
-              </w:rPr>
-              <w:t>longDescription:hideEnd</w:t>
-            </w:r>
-            <w:proofErr w:type="spellEnd"/>
-            <w:proofErr w:type="gramEnd"/>
-            <w:r>
-              <w:rPr>
-                <w:rFonts w:ascii="BC Sans" w:hAnsi="BC Sans"/>
-                <w:b w:val="0"/>
-                <w:bCs w:val="0"/>
-                <w:caps w:val="0"/>
-                <w:sz w:val="20"/>
-                <w:szCs w:val="20"/>
-              </w:rPr>
-              <w:t>}</w:t>
-            </w:r>
-            <w:r>
-              <w:rPr>
-                <w:rFonts w:ascii="BC Sans" w:hAnsi="BC Sans"/>
-                <w:b w:val="0"/>
-                <w:bCs w:val="0"/>
-                <w:caps w:val="0"/>
-                <w:sz w:val="20"/>
-                <w:szCs w:val="20"/>
-              </w:rPr>
-              <w:t>Remarks</w:t>
-            </w:r>
-          </w:p>
-        </w:tc>
-        <w:tc>
-          <w:tcPr>
-            <w:tcW w:w="8216" w:type="dxa"/>
-            <w:noWrap/>
-            <w:vAlign w:val="center"/>
-          </w:tcPr>
-          <w:p>
-            <w:pPr>
-              <w:spacing w:line="259" w:lineRule="auto"/>
-              <w:cnfStyle w:val="000000100000" w:firstRow="0" w:lastRow="0" w:firstColumn="0" w:lastColumn="0" w:oddVBand="0" w:evenVBand="0" w:oddHBand="1" w:evenHBand="0" w:firstRowFirstColumn="0" w:firstRowLastColumn="0" w:lastRowFirstColumn="0" w:lastRowLastColumn="0"/>
-              <w:rPr>
-                <w:rFonts w:ascii="BC Sans" w:eastAsia="Times New Roman" w:hAnsi="BC Sans" w:cs="Times New Roman"/>
-                <w:color w:val="000000" w:themeColor="text1"/>
-                <w:sz w:val="18"/>
-                <w:szCs w:val="18"/>
-              </w:rPr>
-            </w:pPr>
-            <w:r>
-              <w:rPr>
-                <w:rFonts w:ascii="BC Sans" w:eastAsia="Times New Roman" w:hAnsi="BC Sans" w:cs="Times New Roman"/>
-                <w:color w:val="000000" w:themeColor="text1"/>
-                <w:sz w:val="20"/>
-                <w:szCs w:val="20"/>
-              </w:rPr>
-              <w:t>{</w:t>
-            </w:r>
-            <w:proofErr w:type="spellStart"/>
-            <w:proofErr w:type="gramStart"/>
-            <w:r>
-              <w:rPr>
-                <w:rFonts w:ascii="BC Sans" w:eastAsia="Times New Roman" w:hAnsi="BC Sans" w:cs="Times New Roman"/>
-                <w:color w:val="000000" w:themeColor="text1"/>
-                <w:sz w:val="20"/>
-                <w:szCs w:val="20"/>
-              </w:rPr>
-              <w:t>d</w:t>
-            </w:r>
-            <w:r>
-              <w:rPr>
-                <w:rFonts w:ascii="BC Sans" w:eastAsia="Times New Roman" w:hAnsi="BC Sans" w:cs="Times New Roman"/>
-                <w:color w:val="000000" w:themeColor="text1"/>
-                <w:sz w:val="20"/>
-                <w:szCs w:val="20"/>
-              </w:rPr>
-              <w:t>.</w:t>
-            </w:r>
-            <w:r>
-              <w:rPr>
-                <w:rFonts w:ascii="BC Sans" w:eastAsia="Times New Roman" w:hAnsi="BC Sans" w:cs="Times New Roman"/>
-                <w:color w:val="000000" w:themeColor="text1"/>
-                <w:sz w:val="20"/>
-                <w:szCs w:val="20"/>
-              </w:rPr>
-              <w:t>remarks</w:t>
-            </w:r>
-            <w:proofErr w:type="spellEnd"/>
-            <w:proofErr w:type="gramEnd"/>
-            <w:r>
-              <w:rPr>
-                <w:rFonts w:ascii="BC Sans" w:eastAsia="Times New Roman" w:hAnsi="BC Sans" w:cs="Times New Roman"/>
-                <w:color w:val="000000" w:themeColor="text1"/>
-                <w:sz w:val="20"/>
-                <w:szCs w:val="20"/>
-              </w:rPr>
-              <w:t>}</w:t>
-            </w:r>
-          </w:p>
-        </w:tc>
-      </w:tr>
-      <w:tr>
-        <w:trPr>
-          <w:trHeight w:val="360"/>
-        </w:trPr>
-        <w:tc>
-          <w:tcPr>
-            <w:cnfStyle w:val="001000000000" w:firstRow="0" w:lastRow="0" w:firstColumn="1" w:lastColumn="0" w:oddVBand="0" w:evenVBand="0" w:oddHBand="0" w:evenHBand="0" w:firstRowFirstColumn="0" w:firstRowLastColumn="0" w:lastRowFirstColumn="0" w:lastRowLastColumn="0"/>
-            <w:tcW w:w="2700" w:type="dxa"/>
-            <w:noWrap/>
-            <w:vAlign w:val="center"/>
-            <w:hideMark/>
-          </w:tcPr>
-          <w:p>
-            <w:r>
-              <w:rPr>
-                <w:rFonts w:ascii="BC Sans" w:hAnsi="BC Sans"/>
-                <w:b w:val="0"/>
-                <w:bCs w:val="0"/>
-                <w:caps w:val="0"/>
-                <w:sz w:val="20"/>
-                <w:szCs w:val="20"/>
-              </w:rPr>
-              <w:t>Officer assigned</w:t>
+              <w:t>Due date</w:t>
             </w:r>
           </w:p>
         </w:tc>
@@ -883,40 +682,32 @@
           </w:tcPr>
           <w:p>
             <w:pPr>
+              <w:spacing w:line="259" w:lineRule="auto"/>
               <w:cnfStyle w:val="000000000000" w:firstRow="0" w:lastRow="0" w:firstColumn="0" w:lastColumn="0" w:oddVBand="0" w:evenVBand="0" w:oddHBand="0" w:evenHBand="0" w:firstRowFirstColumn="0" w:firstRowLastColumn="0" w:lastRowFirstColumn="0" w:lastRowLastColumn="0"/>
               <w:rPr>
                 <w:rFonts w:ascii="BC Sans" w:eastAsia="Times New Roman" w:hAnsi="BC Sans" w:cs="Times New Roman"/>
-                <w:color w:val="000000"/>
-                <w:kern w:val="0"/>
-                <w:sz w:val="20"/>
-                <w:szCs w:val="20"/>
-                <w14:ligatures w14:val="none"/>
-              </w:rPr>
-            </w:pPr>
-            <w:r>
-              <w:rPr>
-                <w:rFonts w:ascii="BC Sans" w:eastAsia="Times New Roman" w:hAnsi="BC Sans" w:cs="Times New Roman"/>
-                <w:color w:val="000000"/>
-                <w:kern w:val="0"/>
-                <w:sz w:val="20"/>
-                <w:szCs w:val="20"/>
-                <w14:ligatures w14:val="none"/>
+                <w:color w:val="000000" w:themeColor="text1"/>
+                <w:sz w:val="18"/>
+                <w:szCs w:val="18"/>
+              </w:rPr>
+            </w:pPr>
+            <w:r>
+              <w:rPr>
+                <w:rFonts w:ascii="BC Sans" w:hAnsi="BC Sans" w:cs="BC Sans Light"/>
+                <w:sz w:val="20"/>
+                <w:szCs w:val="20"/>
+              </w:rPr>
+              <w:t>{d.dueDate}</w:t>
+            </w:r>
+            <w:r>
+              <w:rPr>
+                <w:rFonts w:ascii="BC Sans" w:eastAsia="Times New Roman" w:hAnsi="BC Sans" w:cs="Times New Roman"/>
+                <w:color w:val="000000" w:themeColor="text1"/>
+                <w:sz w:val="20"/>
+                <w:szCs w:val="20"/>
               </w:rPr>
               <w:t>{</w:t>
             </w:r>
-            <w:proofErr w:type="spellStart"/>
-            <w:proofErr w:type="gramStart"/>
-            <w:r>
-              <w:rPr>
-                <w:rFonts w:ascii="BC Sans" w:eastAsia="Times New Roman" w:hAnsi="BC Sans" w:cs="Times New Roman"/>
-                <w:color w:val="000000"/>
-                <w:kern w:val="0"/>
-                <w:sz w:val="20"/>
-                <w:szCs w:val="20"/>
-                <w14:ligatures w14:val="none"/>
-              </w:rPr>
-              <w:t>d</w:t>
-            </w:r>
             <w:r>
               <w:rPr>
                 <w:rFonts w:ascii="BC Sans" w:eastAsia="Times New Roman" w:hAnsi="BC Sans" w:cs="Times New Roman"/>
@@ -924,7 +715,7 @@
                 <w:sz w:val="20"/>
                 <w:szCs w:val="20"/>
               </w:rPr>
-              <w:t>.</w:t>
+              <w:t>d.</w:t>
             </w:r>
             <w:r>
               <w:rPr>
@@ -932,56 +723,15 @@
                 <w:color w:val="000000" w:themeColor="text1"/>
                 <w:sz w:val="20"/>
                 <w:szCs w:val="20"/>
-              </w:rPr>
-              <w:t>assignedUser.lastName</w:t>
-            </w:r>
-            <w:proofErr w:type="spellEnd"/>
-            <w:proofErr w:type="gramEnd"/>
-            <w:r>
-              <w:rPr>
-                <w:rFonts w:ascii="BC Sans" w:eastAsia="Times New Roman" w:hAnsi="BC Sans" w:cs="Times New Roman"/>
-                <w:color w:val="000000"/>
-                <w:kern w:val="0"/>
-                <w:sz w:val="20"/>
-                <w:szCs w:val="20"/>
-                <w14:ligatures w14:val="none"/>
-              </w:rPr>
-              <w:t>}</w:t>
-            </w:r>
-            <w:r>
-              <w:rPr>
-                <w:rFonts w:ascii="BC Sans" w:eastAsia="Times New Roman" w:hAnsi="BC Sans" w:cs="Times New Roman"/>
-                <w:color w:val="000000"/>
-                <w:kern w:val="0"/>
-                <w:sz w:val="20"/>
-                <w:szCs w:val="20"/>
-                <w14:ligatures w14:val="none"/>
-              </w:rPr>
-              <w:t>, {</w:t>
-            </w:r>
-            <w:proofErr w:type="spellStart"/>
-            <w:proofErr w:type="gramStart"/>
-            <w:r>
-              <w:rPr>
-                <w:rFonts w:ascii="BC Sans" w:eastAsia="Times New Roman" w:hAnsi="BC Sans" w:cs="Times New Roman"/>
-                <w:color w:val="000000"/>
-                <w:kern w:val="0"/>
-                <w:sz w:val="20"/>
-                <w:szCs w:val="20"/>
-                <w14:ligatures w14:val="none"/>
-              </w:rPr>
-              <w:t>d.assignedUser.firstName</w:t>
-            </w:r>
-            <w:proofErr w:type="spellEnd"/>
-            <w:proofErr w:type="gramEnd"/>
-            <w:r>
-              <w:rPr>
-                <w:rFonts w:ascii="BC Sans" w:eastAsia="Times New Roman" w:hAnsi="BC Sans" w:cs="Times New Roman"/>
-                <w:color w:val="000000"/>
-                <w:kern w:val="0"/>
-                <w:sz w:val="20"/>
-                <w:szCs w:val="20"/>
-                <w14:ligatures w14:val="none"/>
+                <w:lang w:val="en-CA"/>
+              </w:rPr>
+              <w:t>description:ifEM:hideBegin</w:t>
+            </w:r>
+            <w:r>
+              <w:rPr>
+                <w:rFonts w:ascii="BC Sans" w:hAnsi="BC Sans"/>
+                <w:sz w:val="20"/>
+                <w:szCs w:val="20"/>
               </w:rPr>
               <w:t>}</w:t>
             </w:r>
@@ -999,30 +749,25 @@
             <w:tcW w:w="2700" w:type="dxa"/>
             <w:noWrap/>
             <w:vAlign w:val="center"/>
-            <w:hideMark/>
-          </w:tcPr>
-          <w:p>
-            <w:pPr>
-              <w:spacing w:line="259" w:lineRule="auto"/>
+          </w:tcPr>
+          <w:p>
+            <w:pPr>
+              <w:rPr>
+                <w:rFonts w:ascii="BC Sans" w:hAnsi="BC Sans"/>
+                <w:sz w:val="20"/>
+                <w:szCs w:val="20"/>
+              </w:rPr>
+            </w:pPr>
+            <w:r>
               <w:rPr>
                 <w:rFonts w:ascii="BC Sans" w:hAnsi="BC Sans"/>
                 <w:b w:val="0"/>
                 <w:bCs w:val="0"/>
                 <w:caps w:val="0"/>
-                <w:sz w:val="18"/>
-                <w:szCs w:val="18"/>
-              </w:rPr>
-            </w:pPr>
-            <w:r>
-              <w:rPr>
-                <w:rFonts w:ascii="BC Sans" w:hAnsi="BC Sans"/>
-                <w:b w:val="0"/>
-                <w:bCs w:val="0"/>
-                <w:caps w:val="0"/>
-                <w:sz w:val="20"/>
-                <w:szCs w:val="20"/>
-              </w:rPr>
-              <w:t>Due date</w:t>
+                <w:sz w:val="20"/>
+                <w:szCs w:val="20"/>
+              </w:rPr>
+              <w:t>Task detail</w:t>
             </w:r>
           </w:p>
         </w:tc>
@@ -1031,186 +776,23 @@
             <w:tcW w:w="8216" w:type="dxa"/>
             <w:noWrap/>
             <w:vAlign w:val="center"/>
-            <w:hideMark/>
-          </w:tcPr>
-          <w:p>
-            <w:pPr>
-              <w:spacing w:line="259" w:lineRule="auto"/>
+          </w:tcPr>
+          <w:p>
+            <w:pPr>
               <w:cnfStyle w:val="000000100000" w:firstRow="0" w:lastRow="0" w:firstColumn="0" w:lastColumn="0" w:oddVBand="0" w:evenVBand="0" w:oddHBand="1" w:evenHBand="0" w:firstRowFirstColumn="0" w:firstRowLastColumn="0" w:lastRowFirstColumn="0" w:lastRowLastColumn="0"/>
               <w:rPr>
-                <w:rFonts w:ascii="BC Sans" w:eastAsia="Times New Roman" w:hAnsi="BC Sans" w:cs="Times New Roman"/>
-                <w:color w:val="000000" w:themeColor="text1"/>
-                <w:sz w:val="18"/>
-                <w:szCs w:val="18"/>
-              </w:rPr>
-            </w:pPr>
-            <w:r>
-              <w:rPr>
                 <w:rFonts w:ascii="BC Sans" w:hAnsi="BC Sans" w:cs="BC Sans Light"/>
                 <w:sz w:val="20"/>
                 <w:szCs w:val="20"/>
               </w:rPr>
-              <w:t>{</w:t>
-            </w:r>
-            <w:proofErr w:type="spellStart"/>
-            <w:proofErr w:type="gramStart"/>
+            </w:pPr>
             <w:r>
               <w:rPr>
                 <w:rFonts w:ascii="BC Sans" w:hAnsi="BC Sans" w:cs="BC Sans Light"/>
                 <w:sz w:val="20"/>
                 <w:szCs w:val="20"/>
               </w:rPr>
-              <w:t>d.dueDate</w:t>
-            </w:r>
-            <w:proofErr w:type="spellEnd"/>
-            <w:proofErr w:type="gramEnd"/>
-            <w:r>
-              <w:rPr>
-                <w:rFonts w:ascii="BC Sans" w:hAnsi="BC Sans" w:cs="BC Sans Light"/>
-                <w:sz w:val="20"/>
-                <w:szCs w:val="20"/>
-              </w:rPr>
-              <w:t>}</w:t>
-            </w:r>
-            <w:r>
-              <w:rPr>
-                <w:rFonts w:ascii="BC Sans" w:eastAsia="Times New Roman" w:hAnsi="BC Sans" w:cs="Times New Roman"/>
-                <w:color w:val="000000" w:themeColor="text1"/>
-                <w:sz w:val="20"/>
-                <w:szCs w:val="20"/>
-              </w:rPr>
-              <w:t>{</w:t>
-            </w:r>
-            <w:proofErr w:type="gramStart"/>
-            <w:r>
-              <w:rPr>
-                <w:rFonts w:ascii="BC Sans" w:eastAsia="Times New Roman" w:hAnsi="BC Sans" w:cs="Times New Roman"/>
-                <w:color w:val="000000" w:themeColor="text1"/>
-                <w:sz w:val="20"/>
-                <w:szCs w:val="20"/>
-              </w:rPr>
-              <w:t>d.</w:t>
-            </w:r>
-            <w:proofErr w:type="spellStart"/>
-            <w:r>
-              <w:rPr>
-                <w:rFonts w:ascii="BC Sans" w:eastAsia="Times New Roman" w:hAnsi="BC Sans" w:cs="Times New Roman"/>
-                <w:color w:val="000000" w:themeColor="text1"/>
-                <w:sz w:val="20"/>
-                <w:szCs w:val="20"/>
-                <w:lang w:val="en-CA"/>
-              </w:rPr>
-              <w:t>description</w:t>
-            </w:r>
-            <w:proofErr w:type="gramEnd"/>
-            <w:r>
-              <w:rPr>
-                <w:rFonts w:ascii="BC Sans" w:eastAsia="Times New Roman" w:hAnsi="BC Sans" w:cs="Times New Roman"/>
-                <w:color w:val="000000" w:themeColor="text1"/>
-                <w:sz w:val="20"/>
-                <w:szCs w:val="20"/>
-                <w:lang w:val="en-CA"/>
-              </w:rPr>
-              <w:t>:</w:t>
-            </w:r>
-            <w:proofErr w:type="gramStart"/>
-            <w:r>
-              <w:rPr>
-                <w:rFonts w:ascii="BC Sans" w:eastAsia="Times New Roman" w:hAnsi="BC Sans" w:cs="Times New Roman"/>
-                <w:color w:val="000000" w:themeColor="text1"/>
-                <w:sz w:val="20"/>
-                <w:szCs w:val="20"/>
-                <w:lang w:val="en-CA"/>
-              </w:rPr>
-              <w:t>ifEM:hideBegin</w:t>
-            </w:r>
-            <w:proofErr w:type="spellEnd"/>
-            <w:proofErr w:type="gramEnd"/>
-            <w:r>
-              <w:rPr>
-                <w:rFonts w:ascii="BC Sans" w:hAnsi="BC Sans"/>
-                <w:sz w:val="20"/>
-                <w:szCs w:val="20"/>
-              </w:rPr>
-              <w:t>}</w:t>
-            </w:r>
-          </w:p>
-        </w:tc>
-      </w:tr>
-      <w:tr>
-        <w:trPr>
-          <w:trHeight w:val="360"/>
-        </w:trPr>
-        <w:tc>
-          <w:tcPr>
-            <w:cnfStyle w:val="001000000000" w:firstRow="0" w:lastRow="0" w:firstColumn="1" w:lastColumn="0" w:oddVBand="0" w:evenVBand="0" w:oddHBand="0" w:evenHBand="0" w:firstRowFirstColumn="0" w:firstRowLastColumn="0" w:lastRowFirstColumn="0" w:lastRowLastColumn="0"/>
-            <w:tcW w:w="2700" w:type="dxa"/>
-            <w:noWrap/>
-            <w:vAlign w:val="center"/>
-          </w:tcPr>
-          <w:p>
-            <w:pPr>
-              <w:rPr>
-                <w:rFonts w:ascii="BC Sans" w:hAnsi="BC Sans"/>
-                <w:sz w:val="20"/>
-                <w:szCs w:val="20"/>
-              </w:rPr>
-            </w:pPr>
-            <w:r>
-              <w:rPr>
-                <w:rFonts w:ascii="BC Sans" w:hAnsi="BC Sans"/>
-                <w:b w:val="0"/>
-                <w:bCs w:val="0"/>
-                <w:caps w:val="0"/>
-                <w:sz w:val="20"/>
-                <w:szCs w:val="20"/>
-              </w:rPr>
-              <w:t>Task detail</w:t>
-            </w:r>
-          </w:p>
-        </w:tc>
-        <w:tc>
-          <w:tcPr>
-            <w:tcW w:w="8216" w:type="dxa"/>
-            <w:noWrap/>
-            <w:vAlign w:val="center"/>
-          </w:tcPr>
-          <w:p>
-            <w:pPr>
-              <w:cnfStyle w:val="000000000000" w:firstRow="0" w:lastRow="0" w:firstColumn="0" w:lastColumn="0" w:oddVBand="0" w:evenVBand="0" w:oddHBand="0" w:evenHBand="0" w:firstRowFirstColumn="0" w:firstRowLastColumn="0" w:lastRowFirstColumn="0" w:lastRowLastColumn="0"/>
-              <w:rPr>
-                <w:rFonts w:ascii="BC Sans" w:hAnsi="BC Sans" w:cs="BC Sans Light"/>
-                <w:sz w:val="20"/>
-                <w:szCs w:val="20"/>
-              </w:rPr>
-            </w:pPr>
-            <w:r>
-              <w:rPr>
-                <w:rFonts w:ascii="BC Sans" w:hAnsi="BC Sans" w:cs="BC Sans Light"/>
-                <w:sz w:val="20"/>
-                <w:szCs w:val="20"/>
-              </w:rPr>
-              <w:t>{</w:t>
-            </w:r>
-            <w:proofErr w:type="spellStart"/>
-            <w:proofErr w:type="gramStart"/>
-            <w:r>
-              <w:rPr>
-                <w:rFonts w:ascii="BC Sans" w:hAnsi="BC Sans" w:cs="BC Sans Light"/>
-                <w:sz w:val="20"/>
-                <w:szCs w:val="20"/>
-              </w:rPr>
-              <w:t>d.description</w:t>
-            </w:r>
-            <w:proofErr w:type="spellEnd"/>
-            <w:proofErr w:type="gramEnd"/>
-            <w:r>
-              <w:rPr>
-                <w:rFonts w:ascii="BC Sans" w:hAnsi="BC Sans" w:cs="BC Sans Light"/>
-                <w:sz w:val="20"/>
-                <w:szCs w:val="20"/>
-              </w:rPr>
-              <w:t>}</w:t>
+              <w:t>{d.description}</w:t>
             </w:r>
             <w:r>
               <w:rPr>
@@ -1244,7 +826,6 @@
         </w:rPr>
         <w:t>{</w:t>
       </w:r>
-      <w:proofErr w:type="gramStart"/>
       <w:r>
         <w:rPr>
           <w:rFonts w:ascii="BC Sans" w:eastAsia="Times New Roman" w:hAnsi="BC Sans" w:cs="Times New Roman"/>
@@ -1254,7 +835,6 @@
         </w:rPr>
         <w:t>d.</w:t>
       </w:r>
-      <w:proofErr w:type="spellStart"/>
       <w:r>
         <w:rPr>
           <w:rFonts w:ascii="BC Sans" w:eastAsia="Times New Roman" w:hAnsi="BC Sans" w:cs="Times New Roman"/>
@@ -1263,32 +843,8 @@
           <w:szCs w:val="20"/>
           <w:lang w:val="en-CA"/>
         </w:rPr>
-        <w:t>description</w:t>
+        <w:t>description:ifEM:hideEnd</w:t>
       </w:r>
-      <w:proofErr w:type="gramEnd"/>
-      <w:r>
-        <w:rPr>
-          <w:rFonts w:ascii="BC Sans" w:eastAsia="Times New Roman" w:hAnsi="BC Sans" w:cs="Times New Roman"/>
-          <w:color w:val="000000" w:themeColor="text1"/>
-          <w:sz w:val="20"/>
-          <w:szCs w:val="20"/>
-          <w:lang w:val="en-CA"/>
-        </w:rPr>
-        <w:t>:</w:t>
-      </w:r>
-      <w:proofErr w:type="gramStart"/>
-      <w:r>
-        <w:rPr>
-          <w:rFonts w:ascii="BC Sans" w:eastAsia="Times New Roman" w:hAnsi="BC Sans" w:cs="Times New Roman"/>
-          <w:color w:val="000000" w:themeColor="text1"/>
-          <w:sz w:val="20"/>
-          <w:szCs w:val="20"/>
-          <w:lang w:val="en-CA"/>
-        </w:rPr>
-        <w:t>ifEM:hideEnd</w:t>
-      </w:r>
-      <w:proofErr w:type="spellEnd"/>
-      <w:proofErr w:type="gramEnd"/>
       <w:r>
         <w:rPr>
           <w:rFonts w:ascii="BC Sans" w:hAnsi="BC Sans"/>
@@ -1303,63 +859,7 @@
           <w:sz w:val="20"/>
           <w:szCs w:val="20"/>
         </w:rPr>
-        <w:t>{</w:t>
-      </w:r>
-      <w:proofErr w:type="spellStart"/>
-      <w:proofErr w:type="gramStart"/>
-      <w:r>
-        <w:rPr>
-          <w:rFonts w:ascii="BC Sans" w:hAnsi="BC Sans"/>
-          <w:sz w:val="20"/>
-          <w:szCs w:val="20"/>
-        </w:rPr>
-        <w:t>d.hasDiaryDates</w:t>
-      </w:r>
-      <w:proofErr w:type="gramEnd"/>
-      <w:r>
-        <w:rPr>
-          <w:rFonts w:ascii="BC Sans" w:hAnsi="BC Sans"/>
-          <w:sz w:val="20"/>
-          <w:szCs w:val="20"/>
-        </w:rPr>
-        <w:t>:ifEQ</w:t>
-      </w:r>
-      <w:proofErr w:type="spellEnd"/>
-      <w:r>
-        <w:rPr>
-          <w:rFonts w:ascii="BC Sans" w:hAnsi="BC Sans"/>
-          <w:sz w:val="20"/>
-          <w:szCs w:val="20"/>
-        </w:rPr>
-        <w:t>(true</w:t>
-      </w:r>
-      <w:proofErr w:type="gramStart"/>
-      <w:r>
-        <w:rPr>
-          <w:rFonts w:ascii="BC Sans" w:hAnsi="BC Sans"/>
-          <w:sz w:val="20"/>
-          <w:szCs w:val="20"/>
-        </w:rPr>
-        <w:t>):</w:t>
-      </w:r>
-      <w:proofErr w:type="spellStart"/>
-      <w:r>
-        <w:rPr>
-          <w:rFonts w:ascii="BC Sans" w:hAnsi="BC Sans"/>
-          <w:sz w:val="20"/>
-          <w:szCs w:val="20"/>
-        </w:rPr>
-        <w:t>showBegin</w:t>
-      </w:r>
-      <w:proofErr w:type="spellEnd"/>
-      <w:proofErr w:type="gramEnd"/>
-      <w:r>
-        <w:rPr>
-          <w:rFonts w:ascii="BC Sans" w:hAnsi="BC Sans"/>
-          <w:sz w:val="20"/>
-          <w:szCs w:val="20"/>
-        </w:rPr>
-        <w:t>}</w:t>
+        <w:t>{d.hasDiaryDates:ifEQ(true):showBegin}</w:t>
       </w:r>
     </w:p>
     <w:tbl>
@@ -1533,83 +1033,7 @@
                 <w:sz w:val="20"/>
                 <w:szCs w:val="20"/>
               </w:rPr>
-              <w:t>{</w:t>
-            </w:r>
-            <w:proofErr w:type="spellStart"/>
-            <w:proofErr w:type="gramStart"/>
-            <w:r>
-              <w:rPr>
-                <w:rFonts w:ascii="BC Sans" w:hAnsi="BC Sans"/>
-                <w:b w:val="0"/>
-                <w:bCs w:val="0"/>
-                <w:caps w:val="0"/>
-                <w:sz w:val="20"/>
-                <w:szCs w:val="20"/>
-              </w:rPr>
-              <w:t>d.diaryDates</w:t>
-            </w:r>
-            <w:proofErr w:type="spellEnd"/>
-            <w:proofErr w:type="gramEnd"/>
-            <w:r>
-              <w:rPr>
-                <w:rFonts w:ascii="BC Sans" w:hAnsi="BC Sans"/>
-                <w:b w:val="0"/>
-                <w:bCs w:val="0"/>
-                <w:caps w:val="0"/>
-                <w:sz w:val="20"/>
-                <w:szCs w:val="20"/>
-              </w:rPr>
-              <w:t>[</w:t>
-            </w:r>
-            <w:proofErr w:type="spellStart"/>
-            <w:r>
-              <w:rPr>
-                <w:rFonts w:ascii="BC Sans" w:hAnsi="BC Sans"/>
-                <w:b w:val="0"/>
-                <w:bCs w:val="0"/>
-                <w:caps w:val="0"/>
-                <w:sz w:val="20"/>
-                <w:szCs w:val="20"/>
-              </w:rPr>
-              <w:t>i</w:t>
-            </w:r>
-            <w:proofErr w:type="spellEnd"/>
-            <w:proofErr w:type="gramStart"/>
-            <w:r>
-              <w:rPr>
-                <w:rFonts w:ascii="BC Sans" w:hAnsi="BC Sans"/>
-                <w:b w:val="0"/>
-                <w:bCs w:val="0"/>
-                <w:caps w:val="0"/>
-                <w:sz w:val="20"/>
-                <w:szCs w:val="20"/>
-              </w:rPr>
-              <w:t>].</w:t>
-            </w:r>
-            <w:proofErr w:type="spellStart"/>
-            <w:r>
-              <w:rPr>
-                <w:rFonts w:ascii="BC Sans" w:hAnsi="BC Sans"/>
-                <w:b w:val="0"/>
-                <w:bCs w:val="0"/>
-                <w:caps w:val="0"/>
-                <w:sz w:val="20"/>
-                <w:szCs w:val="20"/>
-              </w:rPr>
-              <w:t>dueDate</w:t>
-            </w:r>
-            <w:proofErr w:type="spellEnd"/>
-            <w:proofErr w:type="gramEnd"/>
-            <w:r>
-              <w:rPr>
-                <w:rFonts w:ascii="BC Sans" w:hAnsi="BC Sans"/>
-                <w:b w:val="0"/>
-                <w:bCs w:val="0"/>
-                <w:caps w:val="0"/>
-                <w:sz w:val="20"/>
-                <w:szCs w:val="20"/>
-              </w:rPr>
-              <w:t>}</w:t>
+              <w:t>{d.diaryDates[i].dueDate}</w:t>
             </w:r>
           </w:p>
         </w:tc>
@@ -1637,60 +1061,7 @@
                 <w:sz w:val="18"/>
                 <w:szCs w:val="18"/>
               </w:rPr>
-              <w:t>{</w:t>
-            </w:r>
-            <w:proofErr w:type="spellStart"/>
-            <w:proofErr w:type="gramStart"/>
-            <w:r>
-              <w:rPr>
-                <w:rFonts w:ascii="BC Sans" w:eastAsia="Times New Roman" w:hAnsi="BC Sans" w:cs="Times New Roman"/>
-                <w:color w:val="000000" w:themeColor="text1"/>
-                <w:sz w:val="18"/>
-                <w:szCs w:val="18"/>
-              </w:rPr>
-              <w:t>d.diaryDates</w:t>
-            </w:r>
-            <w:proofErr w:type="spellEnd"/>
-            <w:proofErr w:type="gramEnd"/>
-            <w:r>
-              <w:rPr>
-                <w:rFonts w:ascii="BC Sans" w:eastAsia="Times New Roman" w:hAnsi="BC Sans" w:cs="Times New Roman"/>
-                <w:color w:val="000000" w:themeColor="text1"/>
-                <w:sz w:val="18"/>
-                <w:szCs w:val="18"/>
-              </w:rPr>
-              <w:t>[</w:t>
-            </w:r>
-            <w:proofErr w:type="spellStart"/>
-            <w:r>
-              <w:rPr>
-                <w:rFonts w:ascii="BC Sans" w:eastAsia="Times New Roman" w:hAnsi="BC Sans" w:cs="Times New Roman"/>
-                <w:color w:val="000000" w:themeColor="text1"/>
-                <w:sz w:val="18"/>
-                <w:szCs w:val="18"/>
-              </w:rPr>
-              <w:t>i</w:t>
-            </w:r>
-            <w:proofErr w:type="spellEnd"/>
-            <w:proofErr w:type="gramStart"/>
-            <w:r>
-              <w:rPr>
-                <w:rFonts w:ascii="BC Sans" w:eastAsia="Times New Roman" w:hAnsi="BC Sans" w:cs="Times New Roman"/>
-                <w:color w:val="000000" w:themeColor="text1"/>
-                <w:sz w:val="18"/>
-                <w:szCs w:val="18"/>
-              </w:rPr>
-              <w:t>].description</w:t>
-            </w:r>
-            <w:proofErr w:type="gramEnd"/>
-            <w:r>
-              <w:rPr>
-                <w:rFonts w:ascii="BC Sans" w:eastAsia="Times New Roman" w:hAnsi="BC Sans" w:cs="Times New Roman"/>
-                <w:color w:val="000000" w:themeColor="text1"/>
-                <w:sz w:val="18"/>
-                <w:szCs w:val="18"/>
-              </w:rPr>
-              <w:t>}</w:t>
+              <w:t>{d.diaryDates[i].description}</w:t>
             </w:r>
           </w:p>
         </w:tc>
@@ -1726,70 +1097,7 @@
                 <w:sz w:val="20"/>
                 <w:szCs w:val="20"/>
               </w:rPr>
-              <w:t>{</w:t>
-            </w:r>
-            <w:proofErr w:type="spellStart"/>
-            <w:proofErr w:type="gramStart"/>
-            <w:r>
-              <w:rPr>
-                <w:rFonts w:ascii="BC Sans" w:hAnsi="BC Sans"/>
-                <w:b w:val="0"/>
-                <w:bCs w:val="0"/>
-                <w:caps w:val="0"/>
-                <w:sz w:val="20"/>
-                <w:szCs w:val="20"/>
-              </w:rPr>
-              <w:t>d.diaryDates</w:t>
-            </w:r>
-            <w:proofErr w:type="spellEnd"/>
-            <w:proofErr w:type="gramEnd"/>
-            <w:r>
-              <w:rPr>
-                <w:rFonts w:ascii="BC Sans" w:hAnsi="BC Sans"/>
-                <w:b w:val="0"/>
-                <w:bCs w:val="0"/>
-                <w:caps w:val="0"/>
-                <w:sz w:val="20"/>
-                <w:szCs w:val="20"/>
-              </w:rPr>
-              <w:t>[i+1</w:t>
-            </w:r>
-            <w:proofErr w:type="gramStart"/>
-            <w:r>
-              <w:rPr>
-                <w:rFonts w:ascii="BC Sans" w:hAnsi="BC Sans"/>
-                <w:b w:val="0"/>
-                <w:bCs w:val="0"/>
-                <w:caps w:val="0"/>
-                <w:sz w:val="20"/>
-                <w:szCs w:val="20"/>
-              </w:rPr>
-              <w:t>].</w:t>
-            </w:r>
-            <w:proofErr w:type="spellStart"/>
-            <w:r>
-              <w:rPr>
-                <w:rFonts w:ascii="BC Sans" w:hAnsi="BC Sans"/>
-                <w:b w:val="0"/>
-                <w:bCs w:val="0"/>
-                <w:caps w:val="0"/>
-                <w:sz w:val="20"/>
-                <w:szCs w:val="20"/>
-              </w:rPr>
-              <w:t>dueDate</w:t>
-            </w:r>
-            <w:proofErr w:type="spellEnd"/>
-            <w:proofErr w:type="gramEnd"/>
-            <w:r>
-              <w:rPr>
-                <w:rFonts w:ascii="BC Sans" w:hAnsi="BC Sans"/>
-                <w:b w:val="0"/>
-                <w:bCs w:val="0"/>
-                <w:caps w:val="0"/>
-                <w:sz w:val="20"/>
-                <w:szCs w:val="20"/>
-              </w:rPr>
-              <w:t>}</w:t>
+              <w:t>{d.diaryDates[i+1].dueDate}</w:t>
             </w:r>
           </w:p>
         </w:tc>
@@ -1816,49 +1124,7 @@
                 <w:sz w:val="18"/>
                 <w:szCs w:val="18"/>
               </w:rPr>
-              <w:t>{</w:t>
-            </w:r>
-            <w:proofErr w:type="spellStart"/>
-            <w:proofErr w:type="gramStart"/>
-            <w:r>
-              <w:rPr>
-                <w:rFonts w:ascii="BC Sans" w:eastAsia="Times New Roman" w:hAnsi="BC Sans" w:cs="Times New Roman"/>
-                <w:color w:val="000000" w:themeColor="text1"/>
-                <w:sz w:val="18"/>
-                <w:szCs w:val="18"/>
-              </w:rPr>
-              <w:t>d.diaryDates</w:t>
-            </w:r>
-            <w:proofErr w:type="spellEnd"/>
-            <w:proofErr w:type="gramEnd"/>
-            <w:r>
-              <w:rPr>
-                <w:rFonts w:ascii="BC Sans" w:eastAsia="Times New Roman" w:hAnsi="BC Sans" w:cs="Times New Roman"/>
-                <w:color w:val="000000" w:themeColor="text1"/>
-                <w:sz w:val="18"/>
-                <w:szCs w:val="18"/>
-              </w:rPr>
-              <w:t>[i+1</w:t>
-            </w:r>
-            <w:proofErr w:type="gramStart"/>
-            <w:r>
-              <w:rPr>
-                <w:rFonts w:ascii="BC Sans" w:eastAsia="Times New Roman" w:hAnsi="BC Sans" w:cs="Times New Roman"/>
-                <w:color w:val="000000" w:themeColor="text1"/>
-                <w:sz w:val="18"/>
-                <w:szCs w:val="18"/>
-              </w:rPr>
-              <w:t>].description</w:t>
-            </w:r>
-            <w:proofErr w:type="gramEnd"/>
-            <w:r>
-              <w:rPr>
-                <w:rFonts w:ascii="BC Sans" w:eastAsia="Times New Roman" w:hAnsi="BC Sans" w:cs="Times New Roman"/>
-                <w:color w:val="000000" w:themeColor="text1"/>
-                <w:sz w:val="18"/>
-                <w:szCs w:val="18"/>
-              </w:rPr>
-              <w:t>}</w:t>
+              <w:t>{d.diaryDates[i+1].description}</w:t>
             </w:r>
           </w:p>
         </w:tc>
@@ -1881,34 +1147,7 @@
           <w:sz w:val="20"/>
           <w:szCs w:val="20"/>
         </w:rPr>
-        <w:t>{</w:t>
-      </w:r>
-      <w:proofErr w:type="gramStart"/>
-      <w:r>
-        <w:rPr>
-          <w:rFonts w:ascii="BC Sans" w:hAnsi="BC Sans"/>
-          <w:sz w:val="20"/>
-          <w:szCs w:val="20"/>
-        </w:rPr>
-        <w:t>d.hasDiaryDates</w:t>
-      </w:r>
-      <w:proofErr w:type="gramEnd"/>
-      <w:r>
-        <w:rPr>
-          <w:rFonts w:ascii="BC Sans" w:hAnsi="BC Sans"/>
-          <w:sz w:val="20"/>
-          <w:szCs w:val="20"/>
-        </w:rPr>
-        <w:t>:</w:t>
-      </w:r>
-      <w:proofErr w:type="gramStart"/>
-      <w:r>
-        <w:rPr>
-          <w:rFonts w:ascii="BC Sans" w:hAnsi="BC Sans"/>
-          <w:sz w:val="20"/>
-          <w:szCs w:val="20"/>
-        </w:rPr>
-        <w:t>showEnd}{d.</w:t>
+        <w:t>{d.hasDiaryDates:showEnd}{d.</w:t>
       </w:r>
       <w:r>
         <w:rPr>
@@ -1918,32 +1157,13 @@
         </w:rPr>
         <w:t>hasActivityNotes</w:t>
       </w:r>
-      <w:proofErr w:type="gramEnd"/>
       <w:r>
         <w:rPr>
           <w:rFonts w:ascii="BC Sans" w:hAnsi="BC Sans"/>
           <w:sz w:val="20"/>
           <w:szCs w:val="20"/>
         </w:rPr>
-        <w:t>:ifEQ(true</w:t>
-      </w:r>
-      <w:proofErr w:type="gramStart"/>
-      <w:r>
-        <w:rPr>
-          <w:rFonts w:ascii="BC Sans" w:hAnsi="BC Sans"/>
-          <w:sz w:val="20"/>
-          <w:szCs w:val="20"/>
-        </w:rPr>
-        <w:t>):showBegin</w:t>
-      </w:r>
-      <w:proofErr w:type="gramEnd"/>
-      <w:r>
-        <w:rPr>
-          <w:rFonts w:ascii="BC Sans" w:hAnsi="BC Sans"/>
-          <w:sz w:val="20"/>
-          <w:szCs w:val="20"/>
-        </w:rPr>
-        <w:t>}</w:t>
+        <w:t>:ifEQ(true):showBegin}</w:t>
       </w:r>
     </w:p>
     <w:tbl>
@@ -2101,83 +1321,7 @@
                 <w:sz w:val="20"/>
                 <w:szCs w:val="20"/>
               </w:rPr>
-              <w:t>{</w:t>
-            </w:r>
-            <w:proofErr w:type="spellStart"/>
-            <w:proofErr w:type="gramStart"/>
-            <w:r>
-              <w:rPr>
-                <w:rFonts w:ascii="BC Sans" w:hAnsi="BC Sans"/>
-                <w:b w:val="0"/>
-                <w:bCs w:val="0"/>
-                <w:caps w:val="0"/>
-                <w:sz w:val="20"/>
-                <w:szCs w:val="20"/>
-              </w:rPr>
-              <w:t>d.activityNotes</w:t>
-            </w:r>
-            <w:proofErr w:type="spellEnd"/>
-            <w:proofErr w:type="gramEnd"/>
-            <w:r>
-              <w:rPr>
-                <w:rFonts w:ascii="BC Sans" w:hAnsi="BC Sans"/>
-                <w:b w:val="0"/>
-                <w:bCs w:val="0"/>
-                <w:caps w:val="0"/>
-                <w:sz w:val="20"/>
-                <w:szCs w:val="20"/>
-              </w:rPr>
-              <w:t>[</w:t>
-            </w:r>
-            <w:proofErr w:type="spellStart"/>
-            <w:r>
-              <w:rPr>
-                <w:rFonts w:ascii="BC Sans" w:hAnsi="BC Sans"/>
-                <w:b w:val="0"/>
-                <w:bCs w:val="0"/>
-                <w:caps w:val="0"/>
-                <w:sz w:val="20"/>
-                <w:szCs w:val="20"/>
-              </w:rPr>
-              <w:t>i</w:t>
-            </w:r>
-            <w:proofErr w:type="spellEnd"/>
-            <w:proofErr w:type="gramStart"/>
-            <w:r>
-              <w:rPr>
-                <w:rFonts w:ascii="BC Sans" w:hAnsi="BC Sans"/>
-                <w:b w:val="0"/>
-                <w:bCs w:val="0"/>
-                <w:caps w:val="0"/>
-                <w:sz w:val="20"/>
-                <w:szCs w:val="20"/>
-              </w:rPr>
-              <w:t>].</w:t>
-            </w:r>
-            <w:proofErr w:type="spellStart"/>
-            <w:r>
-              <w:rPr>
-                <w:rFonts w:ascii="BC Sans" w:hAnsi="BC Sans"/>
-                <w:b w:val="0"/>
-                <w:bCs w:val="0"/>
-                <w:caps w:val="0"/>
-                <w:sz w:val="20"/>
-                <w:szCs w:val="20"/>
-              </w:rPr>
-              <w:t>contentText</w:t>
-            </w:r>
-            <w:proofErr w:type="spellEnd"/>
-            <w:proofErr w:type="gramEnd"/>
-            <w:r>
-              <w:rPr>
-                <w:rFonts w:ascii="BC Sans" w:hAnsi="BC Sans"/>
-                <w:b w:val="0"/>
-                <w:bCs w:val="0"/>
-                <w:caps w:val="0"/>
-                <w:sz w:val="20"/>
-                <w:szCs w:val="20"/>
-              </w:rPr>
-              <w:t>}</w:t>
+              <w:t>{d.activityNotes[i].contentText}</w:t>
             </w:r>
           </w:p>
         </w:tc>
@@ -2208,10 +1352,8 @@
                 <w:sz w:val="18"/>
                 <w:szCs w:val="18"/>
               </w:rPr>
-              <w:t>{</w:t>
-            </w:r>
-            <w:proofErr w:type="spellStart"/>
-            <w:proofErr w:type="gramStart"/>
+              <w:t>{d.activityNotes[i].actionedDate}</w:t>
+            </w:r>
             <w:r>
               <w:rPr>
                 <w:rFonts w:ascii="BC Sans" w:eastAsia="Times New Roman" w:hAnsi="BC Sans" w:cs="Times New Roman"/>
@@ -2219,133 +1361,7 @@
                 <w:sz w:val="18"/>
                 <w:szCs w:val="18"/>
               </w:rPr>
-              <w:t>d.activityNotes</w:t>
-            </w:r>
-            <w:proofErr w:type="spellEnd"/>
-            <w:proofErr w:type="gramEnd"/>
-            <w:r>
-              <w:rPr>
-                <w:rFonts w:ascii="BC Sans" w:eastAsia="Times New Roman" w:hAnsi="BC Sans" w:cs="Times New Roman"/>
-                <w:color w:val="000000" w:themeColor="text1"/>
-                <w:sz w:val="18"/>
-                <w:szCs w:val="18"/>
-              </w:rPr>
-              <w:t>[</w:t>
-            </w:r>
-            <w:proofErr w:type="spellStart"/>
-            <w:r>
-              <w:rPr>
-                <w:rFonts w:ascii="BC Sans" w:eastAsia="Times New Roman" w:hAnsi="BC Sans" w:cs="Times New Roman"/>
-                <w:color w:val="000000" w:themeColor="text1"/>
-                <w:sz w:val="18"/>
-                <w:szCs w:val="18"/>
-              </w:rPr>
-              <w:t>i</w:t>
-            </w:r>
-            <w:proofErr w:type="spellEnd"/>
-            <w:proofErr w:type="gramStart"/>
-            <w:r>
-              <w:rPr>
-                <w:rFonts w:ascii="BC Sans" w:eastAsia="Times New Roman" w:hAnsi="BC Sans" w:cs="Times New Roman"/>
-                <w:color w:val="000000" w:themeColor="text1"/>
-                <w:sz w:val="18"/>
-                <w:szCs w:val="18"/>
-              </w:rPr>
-              <w:t>].</w:t>
-            </w:r>
-            <w:proofErr w:type="spellStart"/>
-            <w:r>
-              <w:rPr>
-                <w:rFonts w:ascii="BC Sans" w:eastAsia="Times New Roman" w:hAnsi="BC Sans" w:cs="Times New Roman"/>
-                <w:color w:val="000000" w:themeColor="text1"/>
-                <w:sz w:val="18"/>
-                <w:szCs w:val="18"/>
-              </w:rPr>
-              <w:t>actionedDate</w:t>
-            </w:r>
-            <w:proofErr w:type="spellEnd"/>
-            <w:proofErr w:type="gramEnd"/>
-            <w:r>
-              <w:rPr>
-                <w:rFonts w:ascii="BC Sans" w:eastAsia="Times New Roman" w:hAnsi="BC Sans" w:cs="Times New Roman"/>
-                <w:color w:val="000000" w:themeColor="text1"/>
-                <w:sz w:val="18"/>
-                <w:szCs w:val="18"/>
-              </w:rPr>
-              <w:t>}</w:t>
-            </w:r>
-            <w:r>
-              <w:rPr>
-                <w:rFonts w:ascii="BC Sans" w:eastAsia="Times New Roman" w:hAnsi="BC Sans" w:cs="Times New Roman"/>
-                <w:color w:val="000000" w:themeColor="text1"/>
-                <w:sz w:val="18"/>
-                <w:szCs w:val="18"/>
-              </w:rPr>
-              <w:t xml:space="preserve"> {</w:t>
-            </w:r>
-            <w:proofErr w:type="spellStart"/>
-            <w:proofErr w:type="gramStart"/>
-            <w:r>
-              <w:rPr>
-                <w:rFonts w:ascii="BC Sans" w:eastAsia="Times New Roman" w:hAnsi="BC Sans" w:cs="Times New Roman"/>
-                <w:color w:val="000000" w:themeColor="text1"/>
-                <w:sz w:val="18"/>
-                <w:szCs w:val="18"/>
-              </w:rPr>
-              <w:t>d.activityNotes</w:t>
-            </w:r>
-            <w:proofErr w:type="spellEnd"/>
-            <w:proofErr w:type="gramEnd"/>
-            <w:r>
-              <w:rPr>
-                <w:rFonts w:ascii="BC Sans" w:eastAsia="Times New Roman" w:hAnsi="BC Sans" w:cs="Times New Roman"/>
-                <w:color w:val="000000" w:themeColor="text1"/>
-                <w:sz w:val="18"/>
-                <w:szCs w:val="18"/>
-              </w:rPr>
-              <w:t>[</w:t>
-            </w:r>
-            <w:proofErr w:type="spellStart"/>
-            <w:r>
-              <w:rPr>
-                <w:rFonts w:ascii="BC Sans" w:eastAsia="Times New Roman" w:hAnsi="BC Sans" w:cs="Times New Roman"/>
-                <w:color w:val="000000" w:themeColor="text1"/>
-                <w:sz w:val="18"/>
-                <w:szCs w:val="18"/>
-              </w:rPr>
-              <w:t>i</w:t>
-            </w:r>
-            <w:proofErr w:type="spellEnd"/>
-            <w:proofErr w:type="gramStart"/>
-            <w:r>
-              <w:rPr>
-                <w:rFonts w:ascii="BC Sans" w:eastAsia="Times New Roman" w:hAnsi="BC Sans" w:cs="Times New Roman"/>
-                <w:color w:val="000000" w:themeColor="text1"/>
-                <w:sz w:val="18"/>
-                <w:szCs w:val="18"/>
-              </w:rPr>
-              <w:t>].</w:t>
-            </w:r>
-            <w:proofErr w:type="spellStart"/>
-            <w:r>
-              <w:rPr>
-                <w:rFonts w:ascii="BC Sans" w:eastAsia="Times New Roman" w:hAnsi="BC Sans" w:cs="Times New Roman"/>
-                <w:color w:val="000000" w:themeColor="text1"/>
-                <w:sz w:val="18"/>
-                <w:szCs w:val="18"/>
-              </w:rPr>
-              <w:t>actionedTime</w:t>
-            </w:r>
-            <w:proofErr w:type="spellEnd"/>
-            <w:proofErr w:type="gramEnd"/>
-            <w:r>
-              <w:rPr>
-                <w:rFonts w:ascii="BC Sans" w:eastAsia="Times New Roman" w:hAnsi="BC Sans" w:cs="Times New Roman"/>
-                <w:color w:val="000000" w:themeColor="text1"/>
-                <w:sz w:val="18"/>
-                <w:szCs w:val="18"/>
-              </w:rPr>
-              <w:t>}</w:t>
+              <w:t xml:space="preserve"> {d.activityNotes[i].actionedTime}</w:t>
             </w:r>
           </w:p>
         </w:tc>
@@ -2373,49 +1389,7 @@
                 <w:sz w:val="18"/>
                 <w:szCs w:val="18"/>
               </w:rPr>
-              <w:t>{</w:t>
-            </w:r>
-            <w:proofErr w:type="spellStart"/>
-            <w:proofErr w:type="gramStart"/>
-            <w:r>
-              <w:rPr>
-                <w:rFonts w:ascii="BC Sans" w:eastAsia="Times New Roman" w:hAnsi="BC Sans" w:cs="Times New Roman"/>
-                <w:color w:val="000000" w:themeColor="text1"/>
-                <w:sz w:val="18"/>
-                <w:szCs w:val="18"/>
-              </w:rPr>
-              <w:t>d.activityNotes</w:t>
-            </w:r>
-            <w:proofErr w:type="spellEnd"/>
-            <w:proofErr w:type="gramEnd"/>
-            <w:r>
-              <w:rPr>
-                <w:rFonts w:ascii="BC Sans" w:eastAsia="Times New Roman" w:hAnsi="BC Sans" w:cs="Times New Roman"/>
-                <w:color w:val="000000" w:themeColor="text1"/>
-                <w:sz w:val="18"/>
-                <w:szCs w:val="18"/>
-              </w:rPr>
-              <w:t>[</w:t>
-            </w:r>
-            <w:proofErr w:type="spellStart"/>
-            <w:r>
-              <w:rPr>
-                <w:rFonts w:ascii="BC Sans" w:eastAsia="Times New Roman" w:hAnsi="BC Sans" w:cs="Times New Roman"/>
-                <w:color w:val="000000" w:themeColor="text1"/>
-                <w:sz w:val="18"/>
-                <w:szCs w:val="18"/>
-              </w:rPr>
-              <w:t>i</w:t>
-            </w:r>
-            <w:proofErr w:type="spellEnd"/>
-            <w:r>
-              <w:rPr>
-                <w:rFonts w:ascii="BC Sans" w:eastAsia="Times New Roman" w:hAnsi="BC Sans" w:cs="Times New Roman"/>
-                <w:color w:val="000000" w:themeColor="text1"/>
-                <w:sz w:val="18"/>
-                <w:szCs w:val="18"/>
-              </w:rPr>
-              <w:t>].</w:t>
+              <w:t>{d.activityNotes[i].</w:t>
             </w:r>
             <w:r>
               <w:rPr>
@@ -2428,7 +1402,6 @@
               </w:rPr>
               <w:t xml:space="preserve"> </w:t>
             </w:r>
-            <w:proofErr w:type="spellStart"/>
             <w:r>
               <w:rPr>
                 <w:rFonts w:ascii="BC Sans" w:eastAsia="Times New Roman" w:hAnsi="BC Sans" w:cs="Times New Roman"/>
@@ -2445,68 +1418,7 @@
                 <w:sz w:val="18"/>
                 <w:szCs w:val="18"/>
               </w:rPr>
-              <w:t>.</w:t>
-            </w:r>
-            <w:proofErr w:type="gramStart"/>
-            <w:r>
-              <w:rPr>
-                <w:rFonts w:ascii="BC Sans" w:eastAsia="Times New Roman" w:hAnsi="BC Sans" w:cs="Times New Roman"/>
-                <w:color w:val="000000" w:themeColor="text1"/>
-                <w:sz w:val="18"/>
-                <w:szCs w:val="18"/>
-              </w:rPr>
-              <w:t>lastName</w:t>
-            </w:r>
-            <w:proofErr w:type="spellEnd"/>
-            <w:r>
-              <w:rPr>
-                <w:rFonts w:ascii="BC Sans" w:eastAsia="Times New Roman" w:hAnsi="BC Sans" w:cs="Times New Roman"/>
-                <w:color w:val="000000" w:themeColor="text1"/>
-                <w:sz w:val="18"/>
-                <w:szCs w:val="18"/>
-              </w:rPr>
-              <w:t>}, {</w:t>
-            </w:r>
-            <w:proofErr w:type="spellStart"/>
-            <w:r>
-              <w:rPr>
-                <w:rFonts w:ascii="BC Sans" w:eastAsia="Times New Roman" w:hAnsi="BC Sans" w:cs="Times New Roman"/>
-                <w:color w:val="000000" w:themeColor="text1"/>
-                <w:sz w:val="18"/>
-                <w:szCs w:val="18"/>
-              </w:rPr>
-              <w:t>d.activityNotes</w:t>
-            </w:r>
-            <w:proofErr w:type="spellEnd"/>
-            <w:proofErr w:type="gramEnd"/>
-            <w:r>
-              <w:rPr>
-                <w:rFonts w:ascii="BC Sans" w:eastAsia="Times New Roman" w:hAnsi="BC Sans" w:cs="Times New Roman"/>
-                <w:color w:val="000000" w:themeColor="text1"/>
-                <w:sz w:val="18"/>
-                <w:szCs w:val="18"/>
-              </w:rPr>
-              <w:t>[</w:t>
-            </w:r>
-            <w:proofErr w:type="spellStart"/>
-            <w:r>
-              <w:rPr>
-                <w:rFonts w:ascii="BC Sans" w:eastAsia="Times New Roman" w:hAnsi="BC Sans" w:cs="Times New Roman"/>
-                <w:color w:val="000000" w:themeColor="text1"/>
-                <w:sz w:val="18"/>
-                <w:szCs w:val="18"/>
-              </w:rPr>
-              <w:t>i</w:t>
-            </w:r>
-            <w:proofErr w:type="spellEnd"/>
-            <w:r>
-              <w:rPr>
-                <w:rFonts w:ascii="BC Sans" w:eastAsia="Times New Roman" w:hAnsi="BC Sans" w:cs="Times New Roman"/>
-                <w:color w:val="000000" w:themeColor="text1"/>
-                <w:sz w:val="18"/>
-                <w:szCs w:val="18"/>
-              </w:rPr>
-              <w:t>].</w:t>
+              <w:t>.lastName}, {d.activityNotes[i].</w:t>
             </w:r>
             <w:r>
               <w:rPr>
@@ -2519,7 +1431,6 @@
               </w:rPr>
               <w:t xml:space="preserve"> </w:t>
             </w:r>
-            <w:proofErr w:type="spellStart"/>
             <w:r>
               <w:rPr>
                 <w:rFonts w:ascii="BC Sans" w:eastAsia="Times New Roman" w:hAnsi="BC Sans" w:cs="Times New Roman"/>
@@ -2536,17 +1447,7 @@
                 <w:sz w:val="18"/>
                 <w:szCs w:val="18"/>
               </w:rPr>
-              <w:t>.firstName</w:t>
-            </w:r>
-            <w:proofErr w:type="spellEnd"/>
-            <w:r>
-              <w:rPr>
-                <w:rFonts w:ascii="BC Sans" w:eastAsia="Times New Roman" w:hAnsi="BC Sans" w:cs="Times New Roman"/>
-                <w:color w:val="000000" w:themeColor="text1"/>
-                <w:sz w:val="18"/>
-                <w:szCs w:val="18"/>
-              </w:rPr>
-              <w:t>}</w:t>
+              <w:t>.firstName}</w:t>
             </w:r>
           </w:p>
         </w:tc>
@@ -2582,70 +1483,7 @@
                 <w:sz w:val="20"/>
                 <w:szCs w:val="20"/>
               </w:rPr>
-              <w:t>{</w:t>
-            </w:r>
-            <w:proofErr w:type="spellStart"/>
-            <w:proofErr w:type="gramStart"/>
-            <w:r>
-              <w:rPr>
-                <w:rFonts w:ascii="BC Sans" w:hAnsi="BC Sans"/>
-                <w:b w:val="0"/>
-                <w:bCs w:val="0"/>
-                <w:caps w:val="0"/>
-                <w:sz w:val="20"/>
-                <w:szCs w:val="20"/>
-              </w:rPr>
-              <w:t>d.activityNotes</w:t>
-            </w:r>
-            <w:proofErr w:type="spellEnd"/>
-            <w:proofErr w:type="gramEnd"/>
-            <w:r>
-              <w:rPr>
-                <w:rFonts w:ascii="BC Sans" w:hAnsi="BC Sans"/>
-                <w:b w:val="0"/>
-                <w:bCs w:val="0"/>
-                <w:caps w:val="0"/>
-                <w:sz w:val="20"/>
-                <w:szCs w:val="20"/>
-              </w:rPr>
-              <w:t>[i+1</w:t>
-            </w:r>
-            <w:proofErr w:type="gramStart"/>
-            <w:r>
-              <w:rPr>
-                <w:rFonts w:ascii="BC Sans" w:hAnsi="BC Sans"/>
-                <w:b w:val="0"/>
-                <w:bCs w:val="0"/>
-                <w:caps w:val="0"/>
-                <w:sz w:val="20"/>
-                <w:szCs w:val="20"/>
-              </w:rPr>
-              <w:t>].</w:t>
-            </w:r>
-            <w:proofErr w:type="spellStart"/>
-            <w:r>
-              <w:rPr>
-                <w:rFonts w:ascii="BC Sans" w:hAnsi="BC Sans"/>
-                <w:b w:val="0"/>
-                <w:bCs w:val="0"/>
-                <w:caps w:val="0"/>
-                <w:sz w:val="20"/>
-                <w:szCs w:val="20"/>
-              </w:rPr>
-              <w:t>contentText</w:t>
-            </w:r>
-            <w:proofErr w:type="spellEnd"/>
-            <w:proofErr w:type="gramEnd"/>
-            <w:r>
-              <w:rPr>
-                <w:rFonts w:ascii="BC Sans" w:hAnsi="BC Sans"/>
-                <w:b w:val="0"/>
-                <w:bCs w:val="0"/>
-                <w:caps w:val="0"/>
-                <w:sz w:val="20"/>
-                <w:szCs w:val="20"/>
-              </w:rPr>
-              <w:t>}</w:t>
+              <w:t>{d.activityNotes[i+1].contentText}</w:t>
             </w:r>
           </w:p>
         </w:tc>
@@ -2675,10 +1513,8 @@
                 <w:sz w:val="18"/>
                 <w:szCs w:val="18"/>
               </w:rPr>
-              <w:t>{</w:t>
-            </w:r>
-            <w:proofErr w:type="spellStart"/>
-            <w:proofErr w:type="gramStart"/>
+              <w:t>{d.activityNotes[i+1].actionedDate}</w:t>
+            </w:r>
             <w:r>
               <w:rPr>
                 <w:rFonts w:ascii="BC Sans" w:eastAsia="Times New Roman" w:hAnsi="BC Sans" w:cs="Times New Roman"/>
@@ -2686,111 +1522,7 @@
                 <w:sz w:val="18"/>
                 <w:szCs w:val="18"/>
               </w:rPr>
-              <w:t>d.activityNotes</w:t>
-            </w:r>
-            <w:proofErr w:type="spellEnd"/>
-            <w:proofErr w:type="gramEnd"/>
-            <w:r>
-              <w:rPr>
-                <w:rFonts w:ascii="BC Sans" w:eastAsia="Times New Roman" w:hAnsi="BC Sans" w:cs="Times New Roman"/>
-                <w:color w:val="000000" w:themeColor="text1"/>
-                <w:sz w:val="18"/>
-                <w:szCs w:val="18"/>
-              </w:rPr>
-              <w:t>[i+1</w:t>
-            </w:r>
-            <w:proofErr w:type="gramStart"/>
-            <w:r>
-              <w:rPr>
-                <w:rFonts w:ascii="BC Sans" w:eastAsia="Times New Roman" w:hAnsi="BC Sans" w:cs="Times New Roman"/>
-                <w:color w:val="000000" w:themeColor="text1"/>
-                <w:sz w:val="18"/>
-                <w:szCs w:val="18"/>
-              </w:rPr>
-              <w:t>].</w:t>
-            </w:r>
-            <w:proofErr w:type="spellStart"/>
-            <w:r>
-              <w:rPr>
-                <w:rFonts w:ascii="BC Sans" w:eastAsia="Times New Roman" w:hAnsi="BC Sans" w:cs="Times New Roman"/>
-                <w:color w:val="000000" w:themeColor="text1"/>
-                <w:sz w:val="18"/>
-                <w:szCs w:val="18"/>
-              </w:rPr>
-              <w:t>actionedDate</w:t>
-            </w:r>
-            <w:proofErr w:type="spellEnd"/>
-            <w:proofErr w:type="gramEnd"/>
-            <w:r>
-              <w:rPr>
-                <w:rFonts w:ascii="BC Sans" w:eastAsia="Times New Roman" w:hAnsi="BC Sans" w:cs="Times New Roman"/>
-                <w:color w:val="000000" w:themeColor="text1"/>
-                <w:sz w:val="18"/>
-                <w:szCs w:val="18"/>
-              </w:rPr>
-              <w:t>}</w:t>
-            </w:r>
-            <w:r>
-              <w:rPr>
-                <w:rFonts w:ascii="BC Sans" w:eastAsia="Times New Roman" w:hAnsi="BC Sans" w:cs="Times New Roman"/>
-                <w:color w:val="000000" w:themeColor="text1"/>
-                <w:sz w:val="18"/>
-                <w:szCs w:val="18"/>
-              </w:rPr>
-              <w:t xml:space="preserve"> {</w:t>
-            </w:r>
-            <w:proofErr w:type="spellStart"/>
-            <w:proofErr w:type="gramStart"/>
-            <w:r>
-              <w:rPr>
-                <w:rFonts w:ascii="BC Sans" w:eastAsia="Times New Roman" w:hAnsi="BC Sans" w:cs="Times New Roman"/>
-                <w:color w:val="000000" w:themeColor="text1"/>
-                <w:sz w:val="18"/>
-                <w:szCs w:val="18"/>
-              </w:rPr>
-              <w:t>d.activityNotes</w:t>
-            </w:r>
-            <w:proofErr w:type="spellEnd"/>
-            <w:proofErr w:type="gramEnd"/>
-            <w:r>
-              <w:rPr>
-                <w:rFonts w:ascii="BC Sans" w:eastAsia="Times New Roman" w:hAnsi="BC Sans" w:cs="Times New Roman"/>
-                <w:color w:val="000000" w:themeColor="text1"/>
-                <w:sz w:val="18"/>
-                <w:szCs w:val="18"/>
-              </w:rPr>
-              <w:t>[i+1</w:t>
-            </w:r>
-            <w:proofErr w:type="gramStart"/>
-            <w:r>
-              <w:rPr>
-                <w:rFonts w:ascii="BC Sans" w:eastAsia="Times New Roman" w:hAnsi="BC Sans" w:cs="Times New Roman"/>
-                <w:color w:val="000000" w:themeColor="text1"/>
-                <w:sz w:val="18"/>
-                <w:szCs w:val="18"/>
-              </w:rPr>
-              <w:t>].</w:t>
-            </w:r>
-            <w:proofErr w:type="spellStart"/>
-            <w:r>
-              <w:rPr>
-                <w:rFonts w:ascii="BC Sans" w:eastAsia="Times New Roman" w:hAnsi="BC Sans" w:cs="Times New Roman"/>
-                <w:color w:val="000000" w:themeColor="text1"/>
-                <w:sz w:val="18"/>
-                <w:szCs w:val="18"/>
-              </w:rPr>
-              <w:t>actionedTime</w:t>
-            </w:r>
-            <w:proofErr w:type="spellEnd"/>
-            <w:proofErr w:type="gramEnd"/>
-            <w:r>
-              <w:rPr>
-                <w:rFonts w:ascii="BC Sans" w:eastAsia="Times New Roman" w:hAnsi="BC Sans" w:cs="Times New Roman"/>
-                <w:color w:val="000000" w:themeColor="text1"/>
-                <w:sz w:val="18"/>
-                <w:szCs w:val="18"/>
-              </w:rPr>
-              <w:t>}</w:t>
+              <w:t xml:space="preserve"> {d.activityNotes[i+1].actionedTime}</w:t>
             </w:r>
           </w:p>
         </w:tc>
@@ -2818,29 +1550,7 @@
                 <w:sz w:val="18"/>
                 <w:szCs w:val="18"/>
               </w:rPr>
-              <w:t>{</w:t>
-            </w:r>
-            <w:proofErr w:type="spellStart"/>
-            <w:proofErr w:type="gramStart"/>
-            <w:r>
-              <w:rPr>
-                <w:rFonts w:ascii="BC Sans" w:eastAsia="Times New Roman" w:hAnsi="BC Sans" w:cs="Times New Roman"/>
-                <w:color w:val="000000" w:themeColor="text1"/>
-                <w:sz w:val="18"/>
-                <w:szCs w:val="18"/>
-              </w:rPr>
-              <w:t>d.activityNotes</w:t>
-            </w:r>
-            <w:proofErr w:type="spellEnd"/>
-            <w:proofErr w:type="gramEnd"/>
-            <w:r>
-              <w:rPr>
-                <w:rFonts w:ascii="BC Sans" w:eastAsia="Times New Roman" w:hAnsi="BC Sans" w:cs="Times New Roman"/>
-                <w:color w:val="000000" w:themeColor="text1"/>
-                <w:sz w:val="18"/>
-                <w:szCs w:val="18"/>
-              </w:rPr>
-              <w:t>[i+1].</w:t>
+              <w:t>{d.activityNotes[i+1].</w:t>
             </w:r>
             <w:r>
               <w:rPr>
@@ -2853,7 +1563,6 @@
               </w:rPr>
               <w:t xml:space="preserve"> </w:t>
             </w:r>
-            <w:proofErr w:type="spellStart"/>
             <w:r>
               <w:rPr>
                 <w:rFonts w:ascii="BC Sans" w:eastAsia="Times New Roman" w:hAnsi="BC Sans" w:cs="Times New Roman"/>
@@ -2870,48 +1579,7 @@
                 <w:sz w:val="18"/>
                 <w:szCs w:val="18"/>
               </w:rPr>
-              <w:t>.</w:t>
-            </w:r>
-            <w:proofErr w:type="gramStart"/>
-            <w:r>
-              <w:rPr>
-                <w:rFonts w:ascii="BC Sans" w:eastAsia="Times New Roman" w:hAnsi="BC Sans" w:cs="Times New Roman"/>
-                <w:color w:val="000000" w:themeColor="text1"/>
-                <w:sz w:val="18"/>
-                <w:szCs w:val="18"/>
-              </w:rPr>
-              <w:t>lastName</w:t>
-            </w:r>
-            <w:proofErr w:type="spellEnd"/>
-            <w:r>
-              <w:rPr>
-                <w:rFonts w:ascii="BC Sans" w:eastAsia="Times New Roman" w:hAnsi="BC Sans" w:cs="Times New Roman"/>
-                <w:color w:val="000000" w:themeColor="text1"/>
-                <w:sz w:val="18"/>
-                <w:szCs w:val="18"/>
-              </w:rPr>
-              <w:t>}, {</w:t>
-            </w:r>
-            <w:proofErr w:type="spellStart"/>
-            <w:r>
-              <w:rPr>
-                <w:rFonts w:ascii="BC Sans" w:eastAsia="Times New Roman" w:hAnsi="BC Sans" w:cs="Times New Roman"/>
-                <w:color w:val="000000" w:themeColor="text1"/>
-                <w:sz w:val="18"/>
-                <w:szCs w:val="18"/>
-              </w:rPr>
-              <w:t>d.activityNotes</w:t>
-            </w:r>
-            <w:proofErr w:type="spellEnd"/>
-            <w:proofErr w:type="gramEnd"/>
-            <w:r>
-              <w:rPr>
-                <w:rFonts w:ascii="BC Sans" w:eastAsia="Times New Roman" w:hAnsi="BC Sans" w:cs="Times New Roman"/>
-                <w:color w:val="000000" w:themeColor="text1"/>
-                <w:sz w:val="18"/>
-                <w:szCs w:val="18"/>
-              </w:rPr>
-              <w:t>[i+1].</w:t>
+              <w:t>.lastName}, {d.activityNotes[i+1].</w:t>
             </w:r>
             <w:r>
               <w:rPr>
@@ -2924,7 +1592,6 @@
               </w:rPr>
               <w:t xml:space="preserve"> </w:t>
             </w:r>
-            <w:proofErr w:type="spellStart"/>
             <w:r>
               <w:rPr>
                 <w:rFonts w:ascii="BC Sans" w:eastAsia="Times New Roman" w:hAnsi="BC Sans" w:cs="Times New Roman"/>
@@ -2941,17 +1608,7 @@
                 <w:sz w:val="18"/>
                 <w:szCs w:val="18"/>
               </w:rPr>
-              <w:t>.firstName</w:t>
-            </w:r>
-            <w:proofErr w:type="spellEnd"/>
-            <w:r>
-              <w:rPr>
-                <w:rFonts w:ascii="BC Sans" w:eastAsia="Times New Roman" w:hAnsi="BC Sans" w:cs="Times New Roman"/>
-                <w:color w:val="000000" w:themeColor="text1"/>
-                <w:sz w:val="18"/>
-                <w:szCs w:val="18"/>
-              </w:rPr>
-              <w:t>}</w:t>
+              <w:t>.firstName}</w:t>
             </w:r>
           </w:p>
         </w:tc>
@@ -2972,17 +1629,7 @@
           <w:sz w:val="20"/>
           <w:szCs w:val="20"/>
         </w:rPr>
-        <w:t>{</w:t>
-      </w:r>
-      <w:proofErr w:type="spellStart"/>
-      <w:proofErr w:type="gramStart"/>
-      <w:r>
-        <w:rPr>
-          <w:rFonts w:ascii="BC Sans" w:hAnsi="BC Sans"/>
-          <w:sz w:val="20"/>
-          <w:szCs w:val="20"/>
-        </w:rPr>
-        <w:t>d.</w:t>
+        <w:t>{d.</w:t>
       </w:r>
       <w:r>
         <w:rPr>
@@ -2992,23 +1639,13 @@
         </w:rPr>
         <w:t>hasActivityNotes</w:t>
       </w:r>
-      <w:proofErr w:type="gramEnd"/>
       <w:r>
         <w:rPr>
           <w:rFonts w:ascii="BC Sans" w:hAnsi="BC Sans"/>
           <w:sz w:val="20"/>
           <w:szCs w:val="20"/>
         </w:rPr>
-        <w:t>:showEnd</w:t>
-      </w:r>
-      <w:proofErr w:type="spellEnd"/>
-      <w:r>
-        <w:rPr>
-          <w:rFonts w:ascii="BC Sans" w:hAnsi="BC Sans"/>
-          <w:sz w:val="20"/>
-          <w:szCs w:val="20"/>
-        </w:rPr>
-        <w:t>}</w:t>
+        <w:t>:showEnd}</w:t>
       </w:r>
     </w:p>
     <w:tbl>
@@ -3062,9 +1699,8 @@
                 <w:sz w:val="20"/>
                 <w:szCs w:val="20"/>
               </w:rPr>
-              <w:t>Exhibit #{</w:t>
-            </w:r>
-            <w:proofErr w:type="gramStart"/>
+              <w:t>Exhibit #{d.exhibits[i].exhibit</w:t>
+            </w:r>
             <w:r>
               <w:rPr>
                 <w:rFonts w:ascii="BC Sans" w:hAnsi="BC Sans"/>
@@ -3073,9 +1709,8 @@
                 <w:sz w:val="20"/>
                 <w:szCs w:val="20"/>
               </w:rPr>
-              <w:t>d.exhibits</w:t>
-            </w:r>
-            <w:proofErr w:type="gramEnd"/>
+              <w:t>Display</w:t>
+            </w:r>
             <w:r>
               <w:rPr>
                 <w:rFonts w:ascii="BC Sans" w:hAnsi="BC Sans"/>
@@ -3084,49 +1719,7 @@
                 <w:sz w:val="20"/>
                 <w:szCs w:val="20"/>
               </w:rPr>
-              <w:t>[i</w:t>
-            </w:r>
-            <w:proofErr w:type="gramStart"/>
-            <w:r>
-              <w:rPr>
-                <w:rFonts w:ascii="BC Sans" w:hAnsi="BC Sans"/>
-                <w:b/>
-                <w:bCs/>
-                <w:sz w:val="20"/>
-                <w:szCs w:val="20"/>
-              </w:rPr>
-              <w:t>].exhibit</w:t>
-            </w:r>
-            <w:r>
-              <w:rPr>
-                <w:rFonts w:ascii="BC Sans" w:hAnsi="BC Sans"/>
-                <w:b/>
-                <w:bCs/>
-                <w:sz w:val="20"/>
-                <w:szCs w:val="20"/>
-              </w:rPr>
-              <w:t>Display</w:t>
-            </w:r>
-            <w:r>
-              <w:rPr>
-                <w:rFonts w:ascii="BC Sans" w:hAnsi="BC Sans"/>
-                <w:b/>
-                <w:bCs/>
-                <w:sz w:val="20"/>
-                <w:szCs w:val="20"/>
-              </w:rPr>
-              <w:t>Number</w:t>
-            </w:r>
-            <w:proofErr w:type="gramEnd"/>
-            <w:r>
-              <w:rPr>
-                <w:rFonts w:ascii="BC Sans" w:hAnsi="BC Sans"/>
-                <w:b/>
-                <w:bCs/>
-                <w:sz w:val="20"/>
-                <w:szCs w:val="20"/>
-              </w:rPr>
-              <w:t>}</w:t>
+              <w:t>Number}</w:t>
             </w:r>
           </w:p>
         </w:tc>
@@ -3196,71 +1789,7 @@
                 <w:szCs w:val="20"/>
                 <w:lang w:val="en-CA"/>
               </w:rPr>
-              <w:t>{</w:t>
-            </w:r>
-            <w:proofErr w:type="spellStart"/>
-            <w:proofErr w:type="gramStart"/>
-            <w:r>
-              <w:rPr>
-                <w:rFonts w:ascii="BC Sans" w:hAnsi="BC Sans"/>
-                <w:sz w:val="20"/>
-                <w:szCs w:val="20"/>
-                <w:lang w:val="en-CA"/>
-              </w:rPr>
-              <w:t>d.exhibits</w:t>
-            </w:r>
-            <w:proofErr w:type="spellEnd"/>
-            <w:proofErr w:type="gramEnd"/>
-            <w:r>
-              <w:rPr>
-                <w:rFonts w:ascii="BC Sans" w:hAnsi="BC Sans"/>
-                <w:sz w:val="20"/>
-                <w:szCs w:val="20"/>
-                <w:lang w:val="en-CA"/>
-              </w:rPr>
-              <w:t>[</w:t>
-            </w:r>
-            <w:proofErr w:type="spellStart"/>
-            <w:r>
-              <w:rPr>
-                <w:rFonts w:ascii="BC Sans" w:hAnsi="BC Sans"/>
-                <w:sz w:val="20"/>
-                <w:szCs w:val="20"/>
-                <w:lang w:val="en-CA"/>
-              </w:rPr>
-              <w:t>i</w:t>
-            </w:r>
-            <w:proofErr w:type="spellEnd"/>
-            <w:proofErr w:type="gramStart"/>
-            <w:r>
-              <w:rPr>
-                <w:rFonts w:ascii="BC Sans" w:hAnsi="BC Sans"/>
-                <w:sz w:val="20"/>
-                <w:szCs w:val="20"/>
-                <w:lang w:val="en-CA"/>
-              </w:rPr>
-              <w:t>].</w:t>
-            </w:r>
-            <w:proofErr w:type="spellStart"/>
-            <w:r>
-              <w:rPr>
-                <w:rFonts w:ascii="BC Sans" w:hAnsi="BC Sans"/>
-                <w:sz w:val="20"/>
-                <w:szCs w:val="20"/>
-                <w:lang w:val="en-CA"/>
-              </w:rPr>
-              <w:t>propertyType</w:t>
-            </w:r>
-            <w:proofErr w:type="spellEnd"/>
-            <w:proofErr w:type="gramEnd"/>
-            <w:r>
-              <w:rPr>
-                <w:rFonts w:ascii="BC Sans" w:hAnsi="BC Sans"/>
-                <w:sz w:val="20"/>
-                <w:szCs w:val="20"/>
-                <w:lang w:val="en-CA"/>
-              </w:rPr>
-              <w:t>}</w:t>
+              <w:t>{d.exhibits[i].propertyType}</w:t>
             </w:r>
           </w:p>
         </w:tc>
@@ -3329,60 +1858,7 @@
                 <w:szCs w:val="20"/>
                 <w:lang w:val="en-CA"/>
               </w:rPr>
-              <w:t>{</w:t>
-            </w:r>
-            <w:proofErr w:type="spellStart"/>
-            <w:proofErr w:type="gramStart"/>
-            <w:r>
-              <w:rPr>
-                <w:rFonts w:ascii="BC Sans" w:hAnsi="BC Sans"/>
-                <w:sz w:val="20"/>
-                <w:szCs w:val="20"/>
-                <w:lang w:val="en-CA"/>
-              </w:rPr>
-              <w:t>d.exhibits</w:t>
-            </w:r>
-            <w:proofErr w:type="spellEnd"/>
-            <w:proofErr w:type="gramEnd"/>
-            <w:r>
-              <w:rPr>
-                <w:rFonts w:ascii="BC Sans" w:hAnsi="BC Sans"/>
-                <w:sz w:val="20"/>
-                <w:szCs w:val="20"/>
-                <w:lang w:val="en-CA"/>
-              </w:rPr>
-              <w:t>[</w:t>
-            </w:r>
-            <w:proofErr w:type="spellStart"/>
-            <w:r>
-              <w:rPr>
-                <w:rFonts w:ascii="BC Sans" w:hAnsi="BC Sans"/>
-                <w:sz w:val="20"/>
-                <w:szCs w:val="20"/>
-                <w:lang w:val="en-CA"/>
-              </w:rPr>
-              <w:t>i</w:t>
-            </w:r>
-            <w:proofErr w:type="spellEnd"/>
-            <w:proofErr w:type="gramStart"/>
-            <w:r>
-              <w:rPr>
-                <w:rFonts w:ascii="BC Sans" w:hAnsi="BC Sans"/>
-                <w:sz w:val="20"/>
-                <w:szCs w:val="20"/>
-                <w:lang w:val="en-CA"/>
-              </w:rPr>
-              <w:t>].description</w:t>
-            </w:r>
-            <w:proofErr w:type="gramEnd"/>
-            <w:r>
-              <w:rPr>
-                <w:rFonts w:ascii="BC Sans" w:hAnsi="BC Sans"/>
-                <w:sz w:val="20"/>
-                <w:szCs w:val="20"/>
-                <w:lang w:val="en-CA"/>
-              </w:rPr>
-              <w:t>}</w:t>
+              <w:t>{d.exhibits[i].description}</w:t>
             </w:r>
           </w:p>
         </w:tc>
@@ -3451,60 +1927,7 @@
                 <w:szCs w:val="20"/>
                 <w:lang w:val="en-CA"/>
               </w:rPr>
-              <w:t>{</w:t>
-            </w:r>
-            <w:proofErr w:type="spellStart"/>
-            <w:proofErr w:type="gramStart"/>
-            <w:r>
-              <w:rPr>
-                <w:rFonts w:ascii="BC Sans" w:hAnsi="BC Sans"/>
-                <w:sz w:val="20"/>
-                <w:szCs w:val="20"/>
-                <w:lang w:val="en-CA"/>
-              </w:rPr>
-              <w:t>d.exhibits</w:t>
-            </w:r>
-            <w:proofErr w:type="spellEnd"/>
-            <w:proofErr w:type="gramEnd"/>
-            <w:r>
-              <w:rPr>
-                <w:rFonts w:ascii="BC Sans" w:hAnsi="BC Sans"/>
-                <w:sz w:val="20"/>
-                <w:szCs w:val="20"/>
-                <w:lang w:val="en-CA"/>
-              </w:rPr>
-              <w:t>[</w:t>
-            </w:r>
-            <w:proofErr w:type="spellStart"/>
-            <w:r>
-              <w:rPr>
-                <w:rFonts w:ascii="BC Sans" w:hAnsi="BC Sans"/>
-                <w:sz w:val="20"/>
-                <w:szCs w:val="20"/>
-                <w:lang w:val="en-CA"/>
-              </w:rPr>
-              <w:t>i</w:t>
-            </w:r>
-            <w:proofErr w:type="spellEnd"/>
-            <w:proofErr w:type="gramStart"/>
-            <w:r>
-              <w:rPr>
-                <w:rFonts w:ascii="BC Sans" w:hAnsi="BC Sans"/>
-                <w:sz w:val="20"/>
-                <w:szCs w:val="20"/>
-                <w:lang w:val="en-CA"/>
-              </w:rPr>
-              <w:t>].quantity</w:t>
-            </w:r>
-            <w:proofErr w:type="gramEnd"/>
-            <w:r>
-              <w:rPr>
-                <w:rFonts w:ascii="BC Sans" w:hAnsi="BC Sans"/>
-                <w:sz w:val="20"/>
-                <w:szCs w:val="20"/>
-                <w:lang w:val="en-CA"/>
-              </w:rPr>
-              <w:t>}</w:t>
+              <w:t>{d.exhibits[i].quantity}</w:t>
             </w:r>
           </w:p>
         </w:tc>
@@ -3573,135 +1996,7 @@
                 <w:szCs w:val="20"/>
                 <w:lang w:val="en-CA"/>
               </w:rPr>
-              <w:t>{</w:t>
-            </w:r>
-            <w:proofErr w:type="spellStart"/>
-            <w:proofErr w:type="gramStart"/>
-            <w:r>
-              <w:rPr>
-                <w:rFonts w:ascii="BC Sans" w:hAnsi="BC Sans"/>
-                <w:sz w:val="20"/>
-                <w:szCs w:val="20"/>
-                <w:lang w:val="en-CA"/>
-              </w:rPr>
-              <w:t>d.exhibits</w:t>
-            </w:r>
-            <w:proofErr w:type="spellEnd"/>
-            <w:proofErr w:type="gramEnd"/>
-            <w:r>
-              <w:rPr>
-                <w:rFonts w:ascii="BC Sans" w:hAnsi="BC Sans"/>
-                <w:sz w:val="20"/>
-                <w:szCs w:val="20"/>
-                <w:lang w:val="en-CA"/>
-              </w:rPr>
-              <w:t>[</w:t>
-            </w:r>
-            <w:proofErr w:type="spellStart"/>
-            <w:r>
-              <w:rPr>
-                <w:rFonts w:ascii="BC Sans" w:hAnsi="BC Sans"/>
-                <w:sz w:val="20"/>
-                <w:szCs w:val="20"/>
-                <w:lang w:val="en-CA"/>
-              </w:rPr>
-              <w:t>i</w:t>
-            </w:r>
-            <w:proofErr w:type="spellEnd"/>
-            <w:proofErr w:type="gramStart"/>
-            <w:r>
-              <w:rPr>
-                <w:rFonts w:ascii="BC Sans" w:hAnsi="BC Sans"/>
-                <w:sz w:val="20"/>
-                <w:szCs w:val="20"/>
-                <w:lang w:val="en-CA"/>
-              </w:rPr>
-              <w:t>].</w:t>
-            </w:r>
-            <w:proofErr w:type="spellStart"/>
-            <w:r>
-              <w:rPr>
-                <w:rFonts w:ascii="BC Sans" w:hAnsi="BC Sans"/>
-                <w:sz w:val="20"/>
-                <w:szCs w:val="20"/>
-                <w:lang w:val="en-CA"/>
-              </w:rPr>
-              <w:t>collectedBy.lastName</w:t>
-            </w:r>
-            <w:proofErr w:type="spellEnd"/>
-            <w:proofErr w:type="gramEnd"/>
-            <w:r>
-              <w:rPr>
-                <w:rFonts w:ascii="BC Sans" w:hAnsi="BC Sans"/>
-                <w:sz w:val="20"/>
-                <w:szCs w:val="20"/>
-                <w:lang w:val="en-CA"/>
-              </w:rPr>
-              <w:t>}, {</w:t>
-            </w:r>
-            <w:proofErr w:type="spellStart"/>
-            <w:proofErr w:type="gramStart"/>
-            <w:r>
-              <w:rPr>
-                <w:rFonts w:ascii="BC Sans" w:hAnsi="BC Sans"/>
-                <w:sz w:val="20"/>
-                <w:szCs w:val="20"/>
-                <w:lang w:val="en-CA"/>
-              </w:rPr>
-              <w:t>d.exhibits</w:t>
-            </w:r>
-            <w:proofErr w:type="spellEnd"/>
-            <w:proofErr w:type="gramEnd"/>
-            <w:r>
-              <w:rPr>
-                <w:rFonts w:ascii="BC Sans" w:hAnsi="BC Sans"/>
-                <w:sz w:val="20"/>
-                <w:szCs w:val="20"/>
-                <w:lang w:val="en-CA"/>
-              </w:rPr>
-              <w:t>[</w:t>
-            </w:r>
-            <w:proofErr w:type="spellStart"/>
-            <w:r>
-              <w:rPr>
-                <w:rFonts w:ascii="BC Sans" w:hAnsi="BC Sans"/>
-                <w:sz w:val="20"/>
-                <w:szCs w:val="20"/>
-                <w:lang w:val="en-CA"/>
-              </w:rPr>
-              <w:t>i</w:t>
-            </w:r>
-            <w:proofErr w:type="spellEnd"/>
-            <w:proofErr w:type="gramStart"/>
-            <w:r>
-              <w:rPr>
-                <w:rFonts w:ascii="BC Sans" w:hAnsi="BC Sans"/>
-                <w:sz w:val="20"/>
-                <w:szCs w:val="20"/>
-                <w:lang w:val="en-CA"/>
-              </w:rPr>
-              <w:t>].</w:t>
-            </w:r>
-            <w:proofErr w:type="spellStart"/>
-            <w:r>
-              <w:rPr>
-                <w:rFonts w:ascii="BC Sans" w:hAnsi="BC Sans"/>
-                <w:sz w:val="20"/>
-                <w:szCs w:val="20"/>
-                <w:lang w:val="en-CA"/>
-              </w:rPr>
-              <w:t>collectedBy.firstName</w:t>
-            </w:r>
-            <w:proofErr w:type="spellEnd"/>
-            <w:proofErr w:type="gramEnd"/>
-            <w:r>
-              <w:rPr>
-                <w:rFonts w:ascii="BC Sans" w:hAnsi="BC Sans"/>
-                <w:sz w:val="20"/>
-                <w:szCs w:val="20"/>
-                <w:lang w:val="en-CA"/>
-              </w:rPr>
-              <w:t>}</w:t>
+              <w:t>{d.exhibits[i].collectedBy.lastName}, {d.exhibits[i].collectedBy.firstName}</w:t>
             </w:r>
           </w:p>
         </w:tc>
@@ -3770,144 +2065,16 @@
                 <w:szCs w:val="20"/>
                 <w:lang w:val="en-CA"/>
               </w:rPr>
-              <w:t>{</w:t>
-            </w:r>
-            <w:proofErr w:type="spellStart"/>
-            <w:proofErr w:type="gramStart"/>
-            <w:r>
-              <w:rPr>
-                <w:rFonts w:ascii="BC Sans" w:hAnsi="BC Sans"/>
-                <w:sz w:val="20"/>
-                <w:szCs w:val="20"/>
-                <w:lang w:val="en-CA"/>
-              </w:rPr>
-              <w:t>d.exhibits</w:t>
-            </w:r>
-            <w:proofErr w:type="spellEnd"/>
-            <w:proofErr w:type="gramEnd"/>
-            <w:r>
-              <w:rPr>
-                <w:rFonts w:ascii="BC Sans" w:hAnsi="BC Sans"/>
-                <w:sz w:val="20"/>
-                <w:szCs w:val="20"/>
-                <w:lang w:val="en-CA"/>
-              </w:rPr>
-              <w:t>[</w:t>
-            </w:r>
-            <w:proofErr w:type="spellStart"/>
-            <w:r>
-              <w:rPr>
-                <w:rFonts w:ascii="BC Sans" w:hAnsi="BC Sans"/>
-                <w:sz w:val="20"/>
-                <w:szCs w:val="20"/>
-                <w:lang w:val="en-CA"/>
-              </w:rPr>
-              <w:t>i</w:t>
-            </w:r>
-            <w:proofErr w:type="spellEnd"/>
-            <w:proofErr w:type="gramStart"/>
-            <w:r>
-              <w:rPr>
-                <w:rFonts w:ascii="BC Sans" w:hAnsi="BC Sans"/>
-                <w:sz w:val="20"/>
-                <w:szCs w:val="20"/>
-                <w:lang w:val="en-CA"/>
-              </w:rPr>
-              <w:t>].</w:t>
-            </w:r>
-            <w:proofErr w:type="spellStart"/>
-            <w:r>
-              <w:rPr>
-                <w:rFonts w:ascii="BC Sans" w:hAnsi="BC Sans"/>
-                <w:sz w:val="20"/>
-                <w:szCs w:val="20"/>
-                <w:lang w:val="en-CA"/>
-              </w:rPr>
-              <w:t>dateCollected</w:t>
-            </w:r>
-            <w:proofErr w:type="spellEnd"/>
-            <w:proofErr w:type="gramEnd"/>
-            <w:r>
-              <w:rPr>
-                <w:rFonts w:ascii="BC Sans" w:hAnsi="BC Sans"/>
-                <w:sz w:val="20"/>
-                <w:szCs w:val="20"/>
-                <w:lang w:val="en-CA"/>
-              </w:rPr>
-              <w:t>}</w:t>
-            </w:r>
-            <w:r>
-              <w:rPr>
-                <w:rFonts w:ascii="BC Sans" w:hAnsi="BC Sans"/>
-                <w:sz w:val="20"/>
-                <w:szCs w:val="20"/>
-                <w:lang w:val="en-CA"/>
-              </w:rPr>
-              <w:t xml:space="preserve"> {</w:t>
-            </w:r>
-            <w:proofErr w:type="spellStart"/>
-            <w:proofErr w:type="gramStart"/>
-            <w:r>
-              <w:rPr>
-                <w:rFonts w:ascii="BC Sans" w:hAnsi="BC Sans"/>
-                <w:sz w:val="20"/>
-                <w:szCs w:val="20"/>
-                <w:lang w:val="en-CA"/>
-              </w:rPr>
-              <w:t>d.exhibits</w:t>
-            </w:r>
-            <w:proofErr w:type="spellEnd"/>
-            <w:proofErr w:type="gramEnd"/>
-            <w:r>
-              <w:rPr>
-                <w:rFonts w:ascii="BC Sans" w:hAnsi="BC Sans"/>
-                <w:sz w:val="20"/>
-                <w:szCs w:val="20"/>
-                <w:lang w:val="en-CA"/>
-              </w:rPr>
-              <w:t>[</w:t>
-            </w:r>
-            <w:proofErr w:type="spellStart"/>
-            <w:r>
-              <w:rPr>
-                <w:rFonts w:ascii="BC Sans" w:hAnsi="BC Sans"/>
-                <w:sz w:val="20"/>
-                <w:szCs w:val="20"/>
-                <w:lang w:val="en-CA"/>
-              </w:rPr>
-              <w:t>i</w:t>
-            </w:r>
-            <w:proofErr w:type="spellEnd"/>
-            <w:proofErr w:type="gramStart"/>
-            <w:r>
-              <w:rPr>
-                <w:rFonts w:ascii="BC Sans" w:hAnsi="BC Sans"/>
-                <w:sz w:val="20"/>
-                <w:szCs w:val="20"/>
-                <w:lang w:val="en-CA"/>
-              </w:rPr>
-              <w:t>].</w:t>
-            </w:r>
-            <w:proofErr w:type="spellStart"/>
-            <w:r>
-              <w:rPr>
-                <w:rFonts w:ascii="BC Sans" w:hAnsi="BC Sans"/>
-                <w:sz w:val="20"/>
-                <w:szCs w:val="20"/>
-                <w:lang w:val="en-CA"/>
-              </w:rPr>
-              <w:t>intakeTime</w:t>
-            </w:r>
-            <w:proofErr w:type="spellEnd"/>
-            <w:proofErr w:type="gramEnd"/>
-            <w:r>
-              <w:rPr>
-                <w:rFonts w:ascii="BC Sans" w:hAnsi="BC Sans"/>
-                <w:sz w:val="20"/>
-                <w:szCs w:val="20"/>
-                <w:lang w:val="en-CA"/>
-              </w:rPr>
-              <w:t xml:space="preserve"> }</w:t>
+              <w:t>{d.exhibits[i].dateCollected}</w:t>
+            </w:r>
+            <w:r>
+              <w:rPr>
+                <w:rFonts w:ascii="BC Sans" w:hAnsi="BC Sans"/>
+                <w:sz w:val="20"/>
+                <w:szCs w:val="20"/>
+                <w:lang w:val="en-CA"/>
+              </w:rPr>
+              <w:t xml:space="preserve"> {d.exhibits[i].intakeTime }</w:t>
             </w:r>
           </w:p>
         </w:tc>
@@ -3976,71 +2143,7 @@
                 <w:szCs w:val="20"/>
                 <w:lang w:val="en-CA"/>
               </w:rPr>
-              <w:t>{</w:t>
-            </w:r>
-            <w:proofErr w:type="spellStart"/>
-            <w:proofErr w:type="gramStart"/>
-            <w:r>
-              <w:rPr>
-                <w:rFonts w:ascii="BC Sans" w:hAnsi="BC Sans"/>
-                <w:sz w:val="20"/>
-                <w:szCs w:val="20"/>
-                <w:lang w:val="en-CA"/>
-              </w:rPr>
-              <w:t>d.exhibits</w:t>
-            </w:r>
-            <w:proofErr w:type="spellEnd"/>
-            <w:proofErr w:type="gramEnd"/>
-            <w:r>
-              <w:rPr>
-                <w:rFonts w:ascii="BC Sans" w:hAnsi="BC Sans"/>
-                <w:sz w:val="20"/>
-                <w:szCs w:val="20"/>
-                <w:lang w:val="en-CA"/>
-              </w:rPr>
-              <w:t>[</w:t>
-            </w:r>
-            <w:proofErr w:type="spellStart"/>
-            <w:r>
-              <w:rPr>
-                <w:rFonts w:ascii="BC Sans" w:hAnsi="BC Sans"/>
-                <w:sz w:val="20"/>
-                <w:szCs w:val="20"/>
-                <w:lang w:val="en-CA"/>
-              </w:rPr>
-              <w:t>i</w:t>
-            </w:r>
-            <w:proofErr w:type="spellEnd"/>
-            <w:proofErr w:type="gramStart"/>
-            <w:r>
-              <w:rPr>
-                <w:rFonts w:ascii="BC Sans" w:hAnsi="BC Sans"/>
-                <w:sz w:val="20"/>
-                <w:szCs w:val="20"/>
-                <w:lang w:val="en-CA"/>
-              </w:rPr>
-              <w:t>].</w:t>
-            </w:r>
-            <w:proofErr w:type="spellStart"/>
-            <w:r>
-              <w:rPr>
-                <w:rFonts w:ascii="BC Sans" w:hAnsi="BC Sans"/>
-                <w:sz w:val="20"/>
-                <w:szCs w:val="20"/>
-                <w:lang w:val="en-CA"/>
-              </w:rPr>
-              <w:t>locationOfIntake</w:t>
-            </w:r>
-            <w:proofErr w:type="spellEnd"/>
-            <w:proofErr w:type="gramEnd"/>
-            <w:r>
-              <w:rPr>
-                <w:rFonts w:ascii="BC Sans" w:hAnsi="BC Sans"/>
-                <w:sz w:val="20"/>
-                <w:szCs w:val="20"/>
-                <w:lang w:val="en-CA"/>
-              </w:rPr>
-              <w:t>}</w:t>
+              <w:t>{d.exhibits[i].locationOfIntake}</w:t>
             </w:r>
           </w:p>
         </w:tc>
@@ -4110,66 +2213,16 @@
                 <w:szCs w:val="20"/>
                 <w:lang w:val="en-CA"/>
               </w:rPr>
-              <w:t>{</w:t>
-            </w:r>
-            <w:proofErr w:type="gramStart"/>
-            <w:r>
-              <w:rPr>
-                <w:rFonts w:ascii="BC Sans" w:hAnsi="BC Sans"/>
-                <w:sz w:val="20"/>
-                <w:szCs w:val="20"/>
-                <w:lang w:val="en-CA"/>
-              </w:rPr>
-              <w:t>d.exhibits</w:t>
-            </w:r>
-            <w:proofErr w:type="gramEnd"/>
-            <w:r>
-              <w:rPr>
-                <w:rFonts w:ascii="BC Sans" w:hAnsi="BC Sans"/>
-                <w:sz w:val="20"/>
-                <w:szCs w:val="20"/>
-                <w:lang w:val="en-CA"/>
-              </w:rPr>
-              <w:t>[i</w:t>
-            </w:r>
-            <w:proofErr w:type="gramStart"/>
-            <w:r>
-              <w:rPr>
-                <w:rFonts w:ascii="BC Sans" w:hAnsi="BC Sans"/>
-                <w:sz w:val="20"/>
-                <w:szCs w:val="20"/>
-                <w:lang w:val="en-CA"/>
-              </w:rPr>
-              <w:t>].propertyTagNumber</w:t>
-            </w:r>
-            <w:proofErr w:type="gramEnd"/>
-            <w:r>
-              <w:rPr>
-                <w:rFonts w:ascii="BC Sans" w:hAnsi="BC Sans"/>
-                <w:sz w:val="20"/>
-                <w:szCs w:val="20"/>
-                <w:lang w:val="en-CA"/>
-              </w:rPr>
-              <w:t>}</w:t>
-            </w:r>
-            <w:r>
-              <w:rPr>
-                <w:rFonts w:ascii="BC Sans" w:hAnsi="BC Sans"/>
-                <w:sz w:val="20"/>
-                <w:szCs w:val="20"/>
-                <w:lang w:val="en-CA"/>
-              </w:rPr>
-              <w:t>{</w:t>
-            </w:r>
-            <w:proofErr w:type="gramStart"/>
-            <w:r>
-              <w:rPr>
-                <w:rFonts w:ascii="BC Sans" w:hAnsi="BC Sans"/>
-                <w:sz w:val="20"/>
-                <w:szCs w:val="20"/>
-                <w:lang w:val="en-CA"/>
-              </w:rPr>
-              <w:t>d.</w:t>
+              <w:t>{d.exhibits[i].propertyTagNumber}</w:t>
+            </w:r>
+            <w:r>
+              <w:rPr>
+                <w:rFonts w:ascii="BC Sans" w:hAnsi="BC Sans"/>
+                <w:sz w:val="20"/>
+                <w:szCs w:val="20"/>
+                <w:lang w:val="en-CA"/>
+              </w:rPr>
+              <w:t>{d.</w:t>
             </w:r>
             <w:r>
               <w:rPr>
@@ -4180,25 +2233,14 @@
               </w:rPr>
               <w:t>exhibits</w:t>
             </w:r>
-            <w:proofErr w:type="gramEnd"/>
-            <w:r>
-              <w:rPr>
-                <w:rFonts w:ascii="BC Sans" w:hAnsi="BC Sans"/>
-                <w:sz w:val="20"/>
-                <w:szCs w:val="20"/>
-                <w:lang w:val="en-CA"/>
-              </w:rPr>
-              <w:t>[i</w:t>
-            </w:r>
-            <w:proofErr w:type="gramStart"/>
-            <w:r>
-              <w:rPr>
-                <w:rFonts w:ascii="BC Sans" w:hAnsi="BC Sans"/>
-                <w:sz w:val="20"/>
-                <w:szCs w:val="20"/>
-                <w:lang w:val="en-CA"/>
-              </w:rPr>
-              <w:t>].</w:t>
+            <w:r>
+              <w:rPr>
+                <w:rFonts w:ascii="BC Sans" w:hAnsi="BC Sans"/>
+                <w:sz w:val="20"/>
+                <w:szCs w:val="20"/>
+                <w:lang w:val="en-CA"/>
+              </w:rPr>
+              <w:t>[i].</w:t>
             </w:r>
             <w:r>
               <w:rPr>
@@ -4209,7 +2251,6 @@
               </w:rPr>
               <w:t>isSeized</w:t>
             </w:r>
-            <w:proofErr w:type="gramEnd"/>
             <w:r>
               <w:rPr>
                 <w:rFonts w:ascii="BC Sans" w:hAnsi="BC Sans"/>
@@ -4226,36 +2267,16 @@
                 <w:szCs w:val="20"/>
                 <w:lang w:val="en-CA"/>
               </w:rPr>
-              <w:t>Q(false</w:t>
-            </w:r>
-            <w:proofErr w:type="gramStart"/>
-            <w:r>
-              <w:rPr>
-                <w:rFonts w:ascii="BC Sans" w:hAnsi="BC Sans"/>
-                <w:sz w:val="20"/>
-                <w:szCs w:val="20"/>
-                <w:lang w:val="en-CA"/>
-              </w:rPr>
-              <w:t>)</w:t>
-            </w:r>
-            <w:r>
-              <w:rPr>
-                <w:rFonts w:ascii="BC Sans" w:hAnsi="BC Sans"/>
-                <w:sz w:val="20"/>
-                <w:szCs w:val="20"/>
-                <w:lang w:val="en-CA"/>
-              </w:rPr>
-              <w:t>:hideBegin</w:t>
-            </w:r>
-            <w:proofErr w:type="gramEnd"/>
-            <w:r>
-              <w:rPr>
-                <w:rFonts w:ascii="BC Sans" w:hAnsi="BC Sans"/>
-                <w:sz w:val="20"/>
-                <w:szCs w:val="20"/>
-                <w:lang w:val="en-CA"/>
-              </w:rPr>
-              <w:t>}</w:t>
+              <w:t>Q(false)</w:t>
+            </w:r>
+            <w:r>
+              <w:rPr>
+                <w:rFonts w:ascii="BC Sans" w:hAnsi="BC Sans"/>
+                <w:sz w:val="20"/>
+                <w:szCs w:val="20"/>
+                <w:lang w:val="en-CA"/>
+              </w:rPr>
+              <w:t>:hideBegin}</w:t>
             </w:r>
           </w:p>
         </w:tc>
@@ -4324,71 +2345,7 @@
                 <w:szCs w:val="20"/>
                 <w:lang w:val="en-CA"/>
               </w:rPr>
-              <w:t>{</w:t>
-            </w:r>
-            <w:proofErr w:type="spellStart"/>
-            <w:proofErr w:type="gramStart"/>
-            <w:r>
-              <w:rPr>
-                <w:rFonts w:ascii="BC Sans" w:hAnsi="BC Sans"/>
-                <w:sz w:val="20"/>
-                <w:szCs w:val="20"/>
-                <w:lang w:val="en-CA"/>
-              </w:rPr>
-              <w:t>d.exhibits</w:t>
-            </w:r>
-            <w:proofErr w:type="spellEnd"/>
-            <w:proofErr w:type="gramEnd"/>
-            <w:r>
-              <w:rPr>
-                <w:rFonts w:ascii="BC Sans" w:hAnsi="BC Sans"/>
-                <w:sz w:val="20"/>
-                <w:szCs w:val="20"/>
-                <w:lang w:val="en-CA"/>
-              </w:rPr>
-              <w:t>[</w:t>
-            </w:r>
-            <w:proofErr w:type="spellStart"/>
-            <w:r>
-              <w:rPr>
-                <w:rFonts w:ascii="BC Sans" w:hAnsi="BC Sans"/>
-                <w:sz w:val="20"/>
-                <w:szCs w:val="20"/>
-                <w:lang w:val="en-CA"/>
-              </w:rPr>
-              <w:t>i</w:t>
-            </w:r>
-            <w:proofErr w:type="spellEnd"/>
-            <w:proofErr w:type="gramStart"/>
-            <w:r>
-              <w:rPr>
-                <w:rFonts w:ascii="BC Sans" w:hAnsi="BC Sans"/>
-                <w:sz w:val="20"/>
-                <w:szCs w:val="20"/>
-                <w:lang w:val="en-CA"/>
-              </w:rPr>
-              <w:t>].</w:t>
-            </w:r>
-            <w:proofErr w:type="spellStart"/>
-            <w:r>
-              <w:rPr>
-                <w:rFonts w:ascii="BC Sans" w:hAnsi="BC Sans"/>
-                <w:sz w:val="20"/>
-                <w:szCs w:val="20"/>
-                <w:lang w:val="en-CA"/>
-              </w:rPr>
-              <w:t>seizedFromFirstName</w:t>
-            </w:r>
-            <w:proofErr w:type="spellEnd"/>
-            <w:proofErr w:type="gramEnd"/>
-            <w:r>
-              <w:rPr>
-                <w:rFonts w:ascii="BC Sans" w:hAnsi="BC Sans"/>
-                <w:sz w:val="20"/>
-                <w:szCs w:val="20"/>
-                <w:lang w:val="en-CA"/>
-              </w:rPr>
-              <w:t>}</w:t>
+              <w:t>{d.exhibits[i].seizedFromFirstName}</w:t>
             </w:r>
           </w:p>
         </w:tc>
@@ -4457,71 +2414,7 @@
                 <w:szCs w:val="20"/>
                 <w:lang w:val="en-CA"/>
               </w:rPr>
-              <w:t>{</w:t>
-            </w:r>
-            <w:proofErr w:type="spellStart"/>
-            <w:proofErr w:type="gramStart"/>
-            <w:r>
-              <w:rPr>
-                <w:rFonts w:ascii="BC Sans" w:hAnsi="BC Sans"/>
-                <w:sz w:val="20"/>
-                <w:szCs w:val="20"/>
-                <w:lang w:val="en-CA"/>
-              </w:rPr>
-              <w:t>d.exhibits</w:t>
-            </w:r>
-            <w:proofErr w:type="spellEnd"/>
-            <w:proofErr w:type="gramEnd"/>
-            <w:r>
-              <w:rPr>
-                <w:rFonts w:ascii="BC Sans" w:hAnsi="BC Sans"/>
-                <w:sz w:val="20"/>
-                <w:szCs w:val="20"/>
-                <w:lang w:val="en-CA"/>
-              </w:rPr>
-              <w:t>[</w:t>
-            </w:r>
-            <w:proofErr w:type="spellStart"/>
-            <w:r>
-              <w:rPr>
-                <w:rFonts w:ascii="BC Sans" w:hAnsi="BC Sans"/>
-                <w:sz w:val="20"/>
-                <w:szCs w:val="20"/>
-                <w:lang w:val="en-CA"/>
-              </w:rPr>
-              <w:t>i</w:t>
-            </w:r>
-            <w:proofErr w:type="spellEnd"/>
-            <w:proofErr w:type="gramStart"/>
-            <w:r>
-              <w:rPr>
-                <w:rFonts w:ascii="BC Sans" w:hAnsi="BC Sans"/>
-                <w:sz w:val="20"/>
-                <w:szCs w:val="20"/>
-                <w:lang w:val="en-CA"/>
-              </w:rPr>
-              <w:t>].</w:t>
-            </w:r>
-            <w:proofErr w:type="spellStart"/>
-            <w:r>
-              <w:rPr>
-                <w:rFonts w:ascii="BC Sans" w:hAnsi="BC Sans"/>
-                <w:sz w:val="20"/>
-                <w:szCs w:val="20"/>
-                <w:lang w:val="en-CA"/>
-              </w:rPr>
-              <w:t>seizedFromLastName</w:t>
-            </w:r>
-            <w:proofErr w:type="spellEnd"/>
-            <w:proofErr w:type="gramEnd"/>
-            <w:r>
-              <w:rPr>
-                <w:rFonts w:ascii="BC Sans" w:hAnsi="BC Sans"/>
-                <w:sz w:val="20"/>
-                <w:szCs w:val="20"/>
-                <w:lang w:val="en-CA"/>
-              </w:rPr>
-              <w:t>}</w:t>
+              <w:t>{d.exhibits[i].seizedFromLastName}</w:t>
             </w:r>
           </w:p>
         </w:tc>
@@ -4558,7 +2451,6 @@
                 <w:szCs w:val="20"/>
                 <w:lang w:val="en-CA"/>
               </w:rPr>
-              <w:lastRenderedPageBreak/>
               <w:t>Seized from address</w:t>
             </w:r>
           </w:p>
@@ -4591,71 +2483,7 @@
                 <w:szCs w:val="20"/>
                 <w:lang w:val="en-CA"/>
               </w:rPr>
-              <w:t>{</w:t>
-            </w:r>
-            <w:proofErr w:type="spellStart"/>
-            <w:proofErr w:type="gramStart"/>
-            <w:r>
-              <w:rPr>
-                <w:rFonts w:ascii="BC Sans" w:hAnsi="BC Sans"/>
-                <w:sz w:val="20"/>
-                <w:szCs w:val="20"/>
-                <w:lang w:val="en-CA"/>
-              </w:rPr>
-              <w:t>d.exhibits</w:t>
-            </w:r>
-            <w:proofErr w:type="spellEnd"/>
-            <w:proofErr w:type="gramEnd"/>
-            <w:r>
-              <w:rPr>
-                <w:rFonts w:ascii="BC Sans" w:hAnsi="BC Sans"/>
-                <w:sz w:val="20"/>
-                <w:szCs w:val="20"/>
-                <w:lang w:val="en-CA"/>
-              </w:rPr>
-              <w:t>[</w:t>
-            </w:r>
-            <w:proofErr w:type="spellStart"/>
-            <w:r>
-              <w:rPr>
-                <w:rFonts w:ascii="BC Sans" w:hAnsi="BC Sans"/>
-                <w:sz w:val="20"/>
-                <w:szCs w:val="20"/>
-                <w:lang w:val="en-CA"/>
-              </w:rPr>
-              <w:t>i</w:t>
-            </w:r>
-            <w:proofErr w:type="spellEnd"/>
-            <w:proofErr w:type="gramStart"/>
-            <w:r>
-              <w:rPr>
-                <w:rFonts w:ascii="BC Sans" w:hAnsi="BC Sans"/>
-                <w:sz w:val="20"/>
-                <w:szCs w:val="20"/>
-                <w:lang w:val="en-CA"/>
-              </w:rPr>
-              <w:t>].</w:t>
-            </w:r>
-            <w:proofErr w:type="spellStart"/>
-            <w:r>
-              <w:rPr>
-                <w:rFonts w:ascii="BC Sans" w:hAnsi="BC Sans"/>
-                <w:sz w:val="20"/>
-                <w:szCs w:val="20"/>
-                <w:lang w:val="en-CA"/>
-              </w:rPr>
-              <w:t>seizedFromAddress</w:t>
-            </w:r>
-            <w:proofErr w:type="spellEnd"/>
-            <w:proofErr w:type="gramEnd"/>
-            <w:r>
-              <w:rPr>
-                <w:rFonts w:ascii="BC Sans" w:hAnsi="BC Sans"/>
-                <w:sz w:val="20"/>
-                <w:szCs w:val="20"/>
-                <w:lang w:val="en-CA"/>
-              </w:rPr>
-              <w:t>}</w:t>
+              <w:t>{d.exhibits[i].seizedFromAddress}</w:t>
             </w:r>
           </w:p>
         </w:tc>
@@ -4724,66 +2552,16 @@
                 <w:szCs w:val="20"/>
                 <w:lang w:val="en-CA"/>
               </w:rPr>
-              <w:t>{</w:t>
-            </w:r>
-            <w:proofErr w:type="gramStart"/>
-            <w:r>
-              <w:rPr>
-                <w:rFonts w:ascii="BC Sans" w:hAnsi="BC Sans"/>
-                <w:sz w:val="20"/>
-                <w:szCs w:val="20"/>
-                <w:lang w:val="en-CA"/>
-              </w:rPr>
-              <w:t>d.exhibits</w:t>
-            </w:r>
-            <w:proofErr w:type="gramEnd"/>
-            <w:r>
-              <w:rPr>
-                <w:rFonts w:ascii="BC Sans" w:hAnsi="BC Sans"/>
-                <w:sz w:val="20"/>
-                <w:szCs w:val="20"/>
-                <w:lang w:val="en-CA"/>
-              </w:rPr>
-              <w:t>[i</w:t>
-            </w:r>
-            <w:proofErr w:type="gramStart"/>
-            <w:r>
-              <w:rPr>
-                <w:rFonts w:ascii="BC Sans" w:hAnsi="BC Sans"/>
-                <w:sz w:val="20"/>
-                <w:szCs w:val="20"/>
-                <w:lang w:val="en-CA"/>
-              </w:rPr>
-              <w:t>].seizedFromPhoneNumber</w:t>
-            </w:r>
-            <w:proofErr w:type="gramEnd"/>
-            <w:r>
-              <w:rPr>
-                <w:rFonts w:ascii="BC Sans" w:hAnsi="BC Sans"/>
-                <w:sz w:val="20"/>
-                <w:szCs w:val="20"/>
-                <w:lang w:val="en-CA"/>
-              </w:rPr>
-              <w:t>}</w:t>
-            </w:r>
-            <w:r>
-              <w:rPr>
-                <w:rFonts w:ascii="BC Sans" w:hAnsi="BC Sans"/>
-                <w:sz w:val="20"/>
-                <w:szCs w:val="20"/>
-                <w:lang w:val="en-CA"/>
-              </w:rPr>
-              <w:t>{</w:t>
-            </w:r>
-            <w:proofErr w:type="gramStart"/>
-            <w:r>
-              <w:rPr>
-                <w:rFonts w:ascii="BC Sans" w:hAnsi="BC Sans"/>
-                <w:sz w:val="20"/>
-                <w:szCs w:val="20"/>
-                <w:lang w:val="en-CA"/>
-              </w:rPr>
-              <w:t>d.</w:t>
+              <w:t>{d.exhibits[i].seizedFromPhoneNumber}</w:t>
+            </w:r>
+            <w:r>
+              <w:rPr>
+                <w:rFonts w:ascii="BC Sans" w:hAnsi="BC Sans"/>
+                <w:sz w:val="20"/>
+                <w:szCs w:val="20"/>
+                <w:lang w:val="en-CA"/>
+              </w:rPr>
+              <w:t>{d.</w:t>
             </w:r>
             <w:r>
               <w:rPr>
@@ -4794,25 +2572,14 @@
               </w:rPr>
               <w:t>exhibits</w:t>
             </w:r>
-            <w:proofErr w:type="gramEnd"/>
-            <w:r>
-              <w:rPr>
-                <w:rFonts w:ascii="BC Sans" w:hAnsi="BC Sans"/>
-                <w:sz w:val="20"/>
-                <w:szCs w:val="20"/>
-                <w:lang w:val="en-CA"/>
-              </w:rPr>
-              <w:t>[i</w:t>
-            </w:r>
-            <w:proofErr w:type="gramStart"/>
-            <w:r>
-              <w:rPr>
-                <w:rFonts w:ascii="BC Sans" w:hAnsi="BC Sans"/>
-                <w:sz w:val="20"/>
-                <w:szCs w:val="20"/>
-                <w:lang w:val="en-CA"/>
-              </w:rPr>
-              <w:t>].</w:t>
+            <w:r>
+              <w:rPr>
+                <w:rFonts w:ascii="BC Sans" w:hAnsi="BC Sans"/>
+                <w:sz w:val="20"/>
+                <w:szCs w:val="20"/>
+                <w:lang w:val="en-CA"/>
+              </w:rPr>
+              <w:t>[i].</w:t>
             </w:r>
             <w:r>
               <w:rPr>
@@ -4823,7 +2590,6 @@
               </w:rPr>
               <w:t>isSeized</w:t>
             </w:r>
-            <w:proofErr w:type="gramEnd"/>
             <w:r>
               <w:rPr>
                 <w:rFonts w:ascii="BC Sans" w:hAnsi="BC Sans"/>
@@ -4880,17 +2646,7 @@
           <w:sz w:val="20"/>
           <w:szCs w:val="20"/>
         </w:rPr>
-        <w:t>{</w:t>
-      </w:r>
-      <w:proofErr w:type="spellStart"/>
-      <w:proofErr w:type="gramStart"/>
-      <w:r>
-        <w:rPr>
-          <w:rFonts w:ascii="BC Sans" w:hAnsi="BC Sans"/>
-          <w:sz w:val="20"/>
-          <w:szCs w:val="20"/>
-        </w:rPr>
-        <w:t>d.</w:t>
+        <w:t>{d.</w:t>
       </w:r>
       <w:r>
         <w:rPr>
@@ -4900,24 +2656,13 @@
         </w:rPr>
         <w:t>exhibits</w:t>
       </w:r>
-      <w:proofErr w:type="spellEnd"/>
-      <w:proofErr w:type="gramEnd"/>
       <w:r>
         <w:rPr>
           <w:rFonts w:ascii="BC Sans" w:hAnsi="BC Sans"/>
           <w:sz w:val="20"/>
           <w:szCs w:val="20"/>
         </w:rPr>
-        <w:t>[i+1</w:t>
-      </w:r>
-      <w:proofErr w:type="gramStart"/>
-      <w:r>
-        <w:rPr>
-          <w:rFonts w:ascii="BC Sans" w:hAnsi="BC Sans"/>
-          <w:sz w:val="20"/>
-          <w:szCs w:val="20"/>
-        </w:rPr>
-        <w:t>]</w:t>
+        <w:t>[i+1]</w:t>
       </w:r>
       <w:r>
         <w:rPr>
@@ -4925,16 +2670,7 @@
           <w:sz w:val="20"/>
           <w:szCs w:val="20"/>
         </w:rPr>
-        <w:t>.</w:t>
-      </w:r>
-      <w:proofErr w:type="spellStart"/>
-      <w:r>
-        <w:rPr>
-          <w:rFonts w:ascii="BC Sans" w:hAnsi="BC Sans"/>
-          <w:sz w:val="20"/>
-          <w:szCs w:val="20"/>
-        </w:rPr>
-        <w:t>exhibit</w:t>
+        <w:t>.exhibit</w:t>
       </w:r>
       <w:r>
         <w:rPr>
@@ -4952,8 +2688,6 @@
         </w:rPr>
         <w:t>Number</w:t>
       </w:r>
-      <w:proofErr w:type="spellEnd"/>
-      <w:proofErr w:type="gramEnd"/>
       <w:r>
         <w:rPr>
           <w:rFonts w:ascii="BC Sans" w:hAnsi="BC Sans"/>
@@ -5005,49 +2739,7 @@
                 <w:sz w:val="20"/>
                 <w:szCs w:val="20"/>
               </w:rPr>
-              <w:t>Attachment {</w:t>
-            </w:r>
-            <w:proofErr w:type="spellStart"/>
-            <w:proofErr w:type="gramStart"/>
-            <w:r>
-              <w:rPr>
-                <w:rFonts w:ascii="BC Sans" w:hAnsi="BC Sans"/>
-                <w:caps w:val="0"/>
-                <w:sz w:val="20"/>
-                <w:szCs w:val="20"/>
-              </w:rPr>
-              <w:t>d.attachments</w:t>
-            </w:r>
-            <w:proofErr w:type="spellEnd"/>
-            <w:proofErr w:type="gramEnd"/>
-            <w:r>
-              <w:rPr>
-                <w:rFonts w:ascii="BC Sans" w:hAnsi="BC Sans"/>
-                <w:caps w:val="0"/>
-                <w:sz w:val="20"/>
-                <w:szCs w:val="20"/>
-              </w:rPr>
-              <w:t>[</w:t>
-            </w:r>
-            <w:proofErr w:type="spellStart"/>
-            <w:r>
-              <w:rPr>
-                <w:rFonts w:ascii="BC Sans" w:hAnsi="BC Sans"/>
-                <w:caps w:val="0"/>
-                <w:sz w:val="20"/>
-                <w:szCs w:val="20"/>
-              </w:rPr>
-              <w:t>i</w:t>
-            </w:r>
-            <w:proofErr w:type="spellEnd"/>
-            <w:r>
-              <w:rPr>
-                <w:rFonts w:ascii="BC Sans" w:hAnsi="BC Sans"/>
-                <w:caps w:val="0"/>
-                <w:sz w:val="20"/>
-                <w:szCs w:val="20"/>
-              </w:rPr>
-              <w:t>].</w:t>
+              <w:t>Attachment {d.attachments[i].</w:t>
             </w:r>
             <w:r>
               <w:rPr>
@@ -5129,71 +2821,7 @@
                 <w:szCs w:val="20"/>
                 <w:lang w:val="en-CA"/>
               </w:rPr>
-              <w:t>{</w:t>
-            </w:r>
-            <w:proofErr w:type="spellStart"/>
-            <w:proofErr w:type="gramStart"/>
-            <w:r>
-              <w:rPr>
-                <w:rFonts w:ascii="BC Sans" w:hAnsi="BC Sans"/>
-                <w:sz w:val="20"/>
-                <w:szCs w:val="20"/>
-                <w:lang w:val="en-CA"/>
-              </w:rPr>
-              <w:t>d.attachments</w:t>
-            </w:r>
-            <w:proofErr w:type="spellEnd"/>
-            <w:proofErr w:type="gramEnd"/>
-            <w:r>
-              <w:rPr>
-                <w:rFonts w:ascii="BC Sans" w:hAnsi="BC Sans"/>
-                <w:sz w:val="20"/>
-                <w:szCs w:val="20"/>
-                <w:lang w:val="en-CA"/>
-              </w:rPr>
-              <w:t>[</w:t>
-            </w:r>
-            <w:proofErr w:type="spellStart"/>
-            <w:r>
-              <w:rPr>
-                <w:rFonts w:ascii="BC Sans" w:hAnsi="BC Sans"/>
-                <w:sz w:val="20"/>
-                <w:szCs w:val="20"/>
-                <w:lang w:val="en-CA"/>
-              </w:rPr>
-              <w:t>i</w:t>
-            </w:r>
-            <w:proofErr w:type="spellEnd"/>
-            <w:proofErr w:type="gramStart"/>
-            <w:r>
-              <w:rPr>
-                <w:rFonts w:ascii="BC Sans" w:hAnsi="BC Sans"/>
-                <w:sz w:val="20"/>
-                <w:szCs w:val="20"/>
-                <w:lang w:val="en-CA"/>
-              </w:rPr>
-              <w:t>].</w:t>
-            </w:r>
-            <w:proofErr w:type="spellStart"/>
-            <w:r>
-              <w:rPr>
-                <w:rFonts w:ascii="BC Sans" w:hAnsi="BC Sans"/>
-                <w:sz w:val="20"/>
-                <w:szCs w:val="20"/>
-                <w:lang w:val="en-CA"/>
-              </w:rPr>
-              <w:t>fileType</w:t>
-            </w:r>
-            <w:proofErr w:type="spellEnd"/>
-            <w:proofErr w:type="gramEnd"/>
-            <w:r>
-              <w:rPr>
-                <w:rFonts w:ascii="BC Sans" w:hAnsi="BC Sans"/>
-                <w:sz w:val="20"/>
-                <w:szCs w:val="20"/>
-                <w:lang w:val="en-CA"/>
-              </w:rPr>
-              <w:t>}</w:t>
+              <w:t>{d.attachments[i].fileType}</w:t>
             </w:r>
           </w:p>
         </w:tc>
@@ -5263,71 +2891,7 @@
                 <w:szCs w:val="20"/>
                 <w:lang w:val="en-CA"/>
               </w:rPr>
-              <w:t>{</w:t>
-            </w:r>
-            <w:proofErr w:type="spellStart"/>
-            <w:proofErr w:type="gramStart"/>
-            <w:r>
-              <w:rPr>
-                <w:rFonts w:ascii="BC Sans" w:hAnsi="BC Sans"/>
-                <w:sz w:val="20"/>
-                <w:szCs w:val="20"/>
-                <w:lang w:val="en-CA"/>
-              </w:rPr>
-              <w:t>d.attachments</w:t>
-            </w:r>
-            <w:proofErr w:type="spellEnd"/>
-            <w:proofErr w:type="gramEnd"/>
-            <w:r>
-              <w:rPr>
-                <w:rFonts w:ascii="BC Sans" w:hAnsi="BC Sans"/>
-                <w:sz w:val="20"/>
-                <w:szCs w:val="20"/>
-                <w:lang w:val="en-CA"/>
-              </w:rPr>
-              <w:t>[</w:t>
-            </w:r>
-            <w:proofErr w:type="spellStart"/>
-            <w:r>
-              <w:rPr>
-                <w:rFonts w:ascii="BC Sans" w:hAnsi="BC Sans"/>
-                <w:sz w:val="20"/>
-                <w:szCs w:val="20"/>
-                <w:lang w:val="en-CA"/>
-              </w:rPr>
-              <w:t>i</w:t>
-            </w:r>
-            <w:proofErr w:type="spellEnd"/>
-            <w:proofErr w:type="gramStart"/>
-            <w:r>
-              <w:rPr>
-                <w:rFonts w:ascii="BC Sans" w:hAnsi="BC Sans"/>
-                <w:sz w:val="20"/>
-                <w:szCs w:val="20"/>
-                <w:lang w:val="en-CA"/>
-              </w:rPr>
-              <w:t>].</w:t>
-            </w:r>
-            <w:proofErr w:type="spellStart"/>
-            <w:r>
-              <w:rPr>
-                <w:rFonts w:ascii="BC Sans" w:hAnsi="BC Sans"/>
-                <w:sz w:val="20"/>
-                <w:szCs w:val="20"/>
-                <w:lang w:val="en-CA"/>
-              </w:rPr>
-              <w:t>sequenceNumber</w:t>
-            </w:r>
-            <w:proofErr w:type="spellEnd"/>
-            <w:proofErr w:type="gramEnd"/>
-            <w:r>
-              <w:rPr>
-                <w:rFonts w:ascii="BC Sans" w:hAnsi="BC Sans"/>
-                <w:sz w:val="20"/>
-                <w:szCs w:val="20"/>
-                <w:lang w:val="en-CA"/>
-              </w:rPr>
-              <w:t>}</w:t>
+              <w:t>{d.attachments[i].sequenceNumber}</w:t>
             </w:r>
           </w:p>
         </w:tc>
@@ -5391,60 +2955,7 @@
                 <w:szCs w:val="20"/>
                 <w:lang w:val="en-CA"/>
               </w:rPr>
-              <w:t>{</w:t>
-            </w:r>
-            <w:proofErr w:type="spellStart"/>
-            <w:proofErr w:type="gramStart"/>
-            <w:r>
-              <w:rPr>
-                <w:rFonts w:ascii="BC Sans" w:hAnsi="BC Sans"/>
-                <w:sz w:val="20"/>
-                <w:szCs w:val="20"/>
-                <w:lang w:val="en-CA"/>
-              </w:rPr>
-              <w:t>d.attachments</w:t>
-            </w:r>
-            <w:proofErr w:type="spellEnd"/>
-            <w:proofErr w:type="gramEnd"/>
-            <w:r>
-              <w:rPr>
-                <w:rFonts w:ascii="BC Sans" w:hAnsi="BC Sans"/>
-                <w:sz w:val="20"/>
-                <w:szCs w:val="20"/>
-                <w:lang w:val="en-CA"/>
-              </w:rPr>
-              <w:t>[</w:t>
-            </w:r>
-            <w:proofErr w:type="spellStart"/>
-            <w:r>
-              <w:rPr>
-                <w:rFonts w:ascii="BC Sans" w:hAnsi="BC Sans"/>
-                <w:sz w:val="20"/>
-                <w:szCs w:val="20"/>
-                <w:lang w:val="en-CA"/>
-              </w:rPr>
-              <w:t>i</w:t>
-            </w:r>
-            <w:proofErr w:type="spellEnd"/>
-            <w:proofErr w:type="gramStart"/>
-            <w:r>
-              <w:rPr>
-                <w:rFonts w:ascii="BC Sans" w:hAnsi="BC Sans"/>
-                <w:sz w:val="20"/>
-                <w:szCs w:val="20"/>
-                <w:lang w:val="en-CA"/>
-              </w:rPr>
-              <w:t>].description</w:t>
-            </w:r>
-            <w:proofErr w:type="gramEnd"/>
-            <w:r>
-              <w:rPr>
-                <w:rFonts w:ascii="BC Sans" w:hAnsi="BC Sans"/>
-                <w:sz w:val="20"/>
-                <w:szCs w:val="20"/>
-                <w:lang w:val="en-CA"/>
-              </w:rPr>
-              <w:t>}</w:t>
+              <w:t>{d.attachments[i].description}</w:t>
             </w:r>
           </w:p>
         </w:tc>
@@ -5507,60 +3018,7 @@
                 <w:szCs w:val="20"/>
                 <w:lang w:val="en-CA"/>
               </w:rPr>
-              <w:t>{</w:t>
-            </w:r>
-            <w:proofErr w:type="spellStart"/>
-            <w:proofErr w:type="gramStart"/>
-            <w:r>
-              <w:rPr>
-                <w:rFonts w:ascii="BC Sans" w:hAnsi="BC Sans"/>
-                <w:sz w:val="20"/>
-                <w:szCs w:val="20"/>
-                <w:lang w:val="en-CA"/>
-              </w:rPr>
-              <w:t>d.attachments</w:t>
-            </w:r>
-            <w:proofErr w:type="spellEnd"/>
-            <w:proofErr w:type="gramEnd"/>
-            <w:r>
-              <w:rPr>
-                <w:rFonts w:ascii="BC Sans" w:hAnsi="BC Sans"/>
-                <w:sz w:val="20"/>
-                <w:szCs w:val="20"/>
-                <w:lang w:val="en-CA"/>
-              </w:rPr>
-              <w:t>[</w:t>
-            </w:r>
-            <w:proofErr w:type="spellStart"/>
-            <w:r>
-              <w:rPr>
-                <w:rFonts w:ascii="BC Sans" w:hAnsi="BC Sans"/>
-                <w:sz w:val="20"/>
-                <w:szCs w:val="20"/>
-                <w:lang w:val="en-CA"/>
-              </w:rPr>
-              <w:t>i</w:t>
-            </w:r>
-            <w:proofErr w:type="spellEnd"/>
-            <w:proofErr w:type="gramStart"/>
-            <w:r>
-              <w:rPr>
-                <w:rFonts w:ascii="BC Sans" w:hAnsi="BC Sans"/>
-                <w:sz w:val="20"/>
-                <w:szCs w:val="20"/>
-                <w:lang w:val="en-CA"/>
-              </w:rPr>
-              <w:t>].title</w:t>
-            </w:r>
-            <w:proofErr w:type="gramEnd"/>
-            <w:r>
-              <w:rPr>
-                <w:rFonts w:ascii="BC Sans" w:hAnsi="BC Sans"/>
-                <w:sz w:val="20"/>
-                <w:szCs w:val="20"/>
-                <w:lang w:val="en-CA"/>
-              </w:rPr>
-              <w:t>}</w:t>
+              <w:t>{d.attachments[i].title}</w:t>
             </w:r>
           </w:p>
         </w:tc>
@@ -5622,116 +3080,16 @@
                 <w:szCs w:val="20"/>
                 <w:lang w:val="en-CA"/>
               </w:rPr>
-              <w:t>{</w:t>
-            </w:r>
-            <w:proofErr w:type="gramStart"/>
-            <w:r>
-              <w:rPr>
-                <w:rFonts w:ascii="BC Sans" w:hAnsi="BC Sans"/>
-                <w:sz w:val="20"/>
-                <w:szCs w:val="20"/>
-                <w:lang w:val="en-CA"/>
-              </w:rPr>
-              <w:t>d.attachments</w:t>
-            </w:r>
-            <w:proofErr w:type="gramEnd"/>
-            <w:r>
-              <w:rPr>
-                <w:rFonts w:ascii="BC Sans" w:hAnsi="BC Sans"/>
-                <w:sz w:val="20"/>
-                <w:szCs w:val="20"/>
-                <w:lang w:val="en-CA"/>
-              </w:rPr>
-              <w:t>[i</w:t>
-            </w:r>
-            <w:proofErr w:type="gramStart"/>
-            <w:r>
-              <w:rPr>
-                <w:rFonts w:ascii="BC Sans" w:hAnsi="BC Sans"/>
-                <w:sz w:val="20"/>
-                <w:szCs w:val="20"/>
-                <w:lang w:val="en-CA"/>
-              </w:rPr>
-              <w:t>].date</w:t>
-            </w:r>
-            <w:proofErr w:type="gramEnd"/>
-            <w:r>
-              <w:rPr>
-                <w:rFonts w:ascii="BC Sans" w:hAnsi="BC Sans"/>
-                <w:sz w:val="20"/>
-                <w:szCs w:val="20"/>
-                <w:lang w:val="en-CA"/>
-              </w:rPr>
-              <w:t>}</w:t>
-            </w:r>
-            <w:r>
-              <w:rPr>
-                <w:rFonts w:ascii="BC Sans" w:hAnsi="BC Sans"/>
-                <w:sz w:val="20"/>
-                <w:szCs w:val="20"/>
-                <w:lang w:val="en-CA"/>
-              </w:rPr>
-              <w:t>{</w:t>
-            </w:r>
-            <w:proofErr w:type="gramStart"/>
-            <w:r>
-              <w:rPr>
-                <w:rFonts w:ascii="BC Sans" w:hAnsi="BC Sans"/>
-                <w:sz w:val="20"/>
-                <w:szCs w:val="20"/>
-                <w:lang w:val="en-CA"/>
-              </w:rPr>
-              <w:t>d.attachments</w:t>
-            </w:r>
-            <w:proofErr w:type="gramEnd"/>
-            <w:r>
-              <w:rPr>
-                <w:rFonts w:ascii="BC Sans" w:hAnsi="BC Sans"/>
-                <w:sz w:val="20"/>
-                <w:szCs w:val="20"/>
-                <w:lang w:val="en-CA"/>
-              </w:rPr>
-              <w:t>[i</w:t>
-            </w:r>
-            <w:proofErr w:type="gramStart"/>
-            <w:r>
-              <w:rPr>
-                <w:rFonts w:ascii="BC Sans" w:hAnsi="BC Sans"/>
-                <w:sz w:val="20"/>
-                <w:szCs w:val="20"/>
-                <w:lang w:val="en-CA"/>
-              </w:rPr>
-              <w:t>].takenBy.lastName</w:t>
-            </w:r>
-            <w:proofErr w:type="gramEnd"/>
-            <w:r>
-              <w:rPr>
-                <w:rFonts w:ascii="BC Sans" w:hAnsi="BC Sans"/>
-                <w:sz w:val="20"/>
-                <w:szCs w:val="20"/>
-                <w:lang w:val="en-CA"/>
-              </w:rPr>
-              <w:t>:</w:t>
-            </w:r>
-            <w:proofErr w:type="gramStart"/>
-            <w:r>
-              <w:rPr>
-                <w:rFonts w:ascii="BC Sans" w:hAnsi="BC Sans"/>
-                <w:sz w:val="20"/>
-                <w:szCs w:val="20"/>
-                <w:lang w:val="en-CA"/>
-              </w:rPr>
-              <w:t>ifEM:hideBegin</w:t>
-            </w:r>
-            <w:proofErr w:type="gramEnd"/>
-            <w:r>
-              <w:rPr>
-                <w:rFonts w:ascii="BC Sans" w:hAnsi="BC Sans"/>
-                <w:sz w:val="20"/>
-                <w:szCs w:val="20"/>
-                <w:lang w:val="en-CA"/>
-              </w:rPr>
-              <w:t>}</w:t>
+              <w:t>{d.attachments[i].date}</w:t>
+            </w:r>
+            <w:r>
+              <w:rPr>
+                <w:rFonts w:ascii="BC Sans" w:hAnsi="BC Sans"/>
+                <w:sz w:val="20"/>
+                <w:szCs w:val="20"/>
+                <w:lang w:val="en-CA"/>
+              </w:rPr>
+              <w:t>{d.attachments[i].takenBy.lastName:ifEM:hideBegin}</w:t>
             </w:r>
           </w:p>
         </w:tc>
@@ -5792,60 +3150,7 @@
                 <w:szCs w:val="20"/>
                 <w:lang w:val="en-CA"/>
               </w:rPr>
-              <w:t>{</w:t>
-            </w:r>
-            <w:proofErr w:type="spellStart"/>
-            <w:proofErr w:type="gramStart"/>
-            <w:r>
-              <w:rPr>
-                <w:rFonts w:ascii="BC Sans" w:hAnsi="BC Sans"/>
-                <w:sz w:val="20"/>
-                <w:szCs w:val="20"/>
-                <w:lang w:val="en-CA"/>
-              </w:rPr>
-              <w:t>d.attachments</w:t>
-            </w:r>
-            <w:proofErr w:type="spellEnd"/>
-            <w:proofErr w:type="gramEnd"/>
-            <w:r>
-              <w:rPr>
-                <w:rFonts w:ascii="BC Sans" w:hAnsi="BC Sans"/>
-                <w:sz w:val="20"/>
-                <w:szCs w:val="20"/>
-                <w:lang w:val="en-CA"/>
-              </w:rPr>
-              <w:t>[</w:t>
-            </w:r>
-            <w:proofErr w:type="spellStart"/>
-            <w:r>
-              <w:rPr>
-                <w:rFonts w:ascii="BC Sans" w:hAnsi="BC Sans"/>
-                <w:sz w:val="20"/>
-                <w:szCs w:val="20"/>
-                <w:lang w:val="en-CA"/>
-              </w:rPr>
-              <w:t>i</w:t>
-            </w:r>
-            <w:proofErr w:type="spellEnd"/>
-            <w:proofErr w:type="gramStart"/>
-            <w:r>
-              <w:rPr>
-                <w:rFonts w:ascii="BC Sans" w:hAnsi="BC Sans"/>
-                <w:sz w:val="20"/>
-                <w:szCs w:val="20"/>
-                <w:lang w:val="en-CA"/>
-              </w:rPr>
-              <w:t>].</w:t>
-            </w:r>
-            <w:proofErr w:type="spellStart"/>
-            <w:r>
-              <w:rPr>
-                <w:rFonts w:ascii="BC Sans" w:hAnsi="BC Sans"/>
-                <w:sz w:val="20"/>
-                <w:szCs w:val="20"/>
-                <w:lang w:val="en-CA"/>
-              </w:rPr>
-              <w:t>takenBy</w:t>
+              <w:t>{d.attachments[i].takenBy</w:t>
             </w:r>
             <w:r>
               <w:rPr>
@@ -5856,8 +3161,6 @@
               </w:rPr>
               <w:t>.lastName</w:t>
             </w:r>
-            <w:proofErr w:type="spellEnd"/>
-            <w:proofErr w:type="gramEnd"/>
             <w:r>
               <w:rPr>
                 <w:rFonts w:ascii="BC Sans" w:hAnsi="BC Sans"/>
@@ -5874,86 +3177,16 @@
                 <w:szCs w:val="20"/>
                 <w:lang w:val="en-CA"/>
               </w:rPr>
-              <w:t>, {</w:t>
-            </w:r>
-            <w:proofErr w:type="gramStart"/>
-            <w:r>
-              <w:rPr>
-                <w:rFonts w:ascii="BC Sans" w:hAnsi="BC Sans"/>
-                <w:sz w:val="20"/>
-                <w:szCs w:val="20"/>
-                <w:lang w:val="en-CA"/>
-              </w:rPr>
-              <w:t>d.attachments</w:t>
-            </w:r>
-            <w:proofErr w:type="gramEnd"/>
-            <w:r>
-              <w:rPr>
-                <w:rFonts w:ascii="BC Sans" w:hAnsi="BC Sans"/>
-                <w:sz w:val="20"/>
-                <w:szCs w:val="20"/>
-                <w:lang w:val="en-CA"/>
-              </w:rPr>
-              <w:t>[i</w:t>
-            </w:r>
-            <w:proofErr w:type="gramStart"/>
-            <w:r>
-              <w:rPr>
-                <w:rFonts w:ascii="BC Sans" w:hAnsi="BC Sans"/>
-                <w:sz w:val="20"/>
-                <w:szCs w:val="20"/>
-                <w:lang w:val="en-CA"/>
-              </w:rPr>
-              <w:t>].takenBy.firstName</w:t>
-            </w:r>
-            <w:proofErr w:type="gramEnd"/>
-            <w:r>
-              <w:rPr>
-                <w:rFonts w:ascii="BC Sans" w:hAnsi="BC Sans"/>
-                <w:sz w:val="20"/>
-                <w:szCs w:val="20"/>
-                <w:lang w:val="en-CA"/>
-              </w:rPr>
-              <w:t>}</w:t>
-            </w:r>
-            <w:r>
-              <w:rPr>
-                <w:rFonts w:ascii="BC Sans" w:hAnsi="BC Sans"/>
-                <w:sz w:val="20"/>
-                <w:szCs w:val="20"/>
-                <w:lang w:val="en-CA"/>
-              </w:rPr>
-              <w:t>{</w:t>
-            </w:r>
-            <w:proofErr w:type="gramStart"/>
-            <w:r>
-              <w:rPr>
-                <w:rFonts w:ascii="BC Sans" w:hAnsi="BC Sans"/>
-                <w:sz w:val="20"/>
-                <w:szCs w:val="20"/>
-                <w:lang w:val="en-CA"/>
-              </w:rPr>
-              <w:t>d.attachments</w:t>
-            </w:r>
-            <w:proofErr w:type="gramEnd"/>
-            <w:r>
-              <w:rPr>
-                <w:rFonts w:ascii="BC Sans" w:hAnsi="BC Sans"/>
-                <w:sz w:val="20"/>
-                <w:szCs w:val="20"/>
-                <w:lang w:val="en-CA"/>
-              </w:rPr>
-              <w:t>[i</w:t>
-            </w:r>
-            <w:proofErr w:type="gramStart"/>
-            <w:r>
-              <w:rPr>
-                <w:rFonts w:ascii="BC Sans" w:hAnsi="BC Sans"/>
-                <w:sz w:val="20"/>
-                <w:szCs w:val="20"/>
-                <w:lang w:val="en-CA"/>
-              </w:rPr>
-              <w:t>].takenBy.</w:t>
+              <w:t>, {d.attachments[i].takenBy.firstName}</w:t>
+            </w:r>
+            <w:r>
+              <w:rPr>
+                <w:rFonts w:ascii="BC Sans" w:hAnsi="BC Sans"/>
+                <w:sz w:val="20"/>
+                <w:szCs w:val="20"/>
+                <w:lang w:val="en-CA"/>
+              </w:rPr>
+              <w:t>{d.attachments[i].takenBy.</w:t>
             </w:r>
             <w:r>
               <w:rPr>
@@ -5964,35 +3197,14 @@
               </w:rPr>
               <w:t>location</w:t>
             </w:r>
-            <w:proofErr w:type="gramEnd"/>
-            <w:r>
-              <w:rPr>
-                <w:rFonts w:ascii="BC Sans" w:hAnsi="BC Sans"/>
-                <w:sz w:val="20"/>
-                <w:szCs w:val="20"/>
-                <w:lang w:val="en-CA"/>
-              </w:rPr>
-              <w:t>:</w:t>
-            </w:r>
-            <w:proofErr w:type="gramStart"/>
-            <w:r>
-              <w:rPr>
-                <w:rFonts w:ascii="BC Sans" w:hAnsi="BC Sans"/>
-                <w:sz w:val="20"/>
-                <w:szCs w:val="20"/>
-                <w:lang w:val="en-CA"/>
-              </w:rPr>
-              <w:t>ifEM:hideBegin</w:t>
-            </w:r>
-            <w:proofErr w:type="gramEnd"/>
-            <w:r>
-              <w:rPr>
-                <w:rFonts w:ascii="BC Sans" w:hAnsi="BC Sans"/>
-                <w:sz w:val="20"/>
-                <w:szCs w:val="20"/>
-                <w:lang w:val="en-CA"/>
-              </w:rPr>
-              <w:t>}</w:t>
+            <w:r>
+              <w:rPr>
+                <w:rFonts w:ascii="BC Sans" w:hAnsi="BC Sans"/>
+                <w:sz w:val="20"/>
+                <w:szCs w:val="20"/>
+                <w:lang w:val="en-CA"/>
+              </w:rPr>
+              <w:t>:ifEM:hideBegin}</w:t>
             </w:r>
           </w:p>
         </w:tc>
@@ -6029,10 +3241,8 @@
                 <w:szCs w:val="20"/>
                 <w:lang w:val="en-CA"/>
               </w:rPr>
-              <w:t>{</w:t>
-            </w:r>
-            <w:proofErr w:type="spellStart"/>
-            <w:proofErr w:type="gramStart"/>
+              <w:t>{d.attachments[i].takenBy.lastName:hideEnd}</w:t>
+            </w:r>
             <w:r>
               <w:rPr>
                 <w:rFonts w:ascii="BC Sans" w:hAnsi="BC Sans"/>
@@ -6043,114 +3253,8 @@
                 <w:szCs w:val="20"/>
                 <w:lang w:val="en-CA"/>
               </w:rPr>
-              <w:t>d.attachments</w:t>
-            </w:r>
-            <w:proofErr w:type="spellEnd"/>
-            <w:proofErr w:type="gramEnd"/>
-            <w:r>
-              <w:rPr>
-                <w:rFonts w:ascii="BC Sans" w:hAnsi="BC Sans"/>
-                <w:b w:val="0"/>
-                <w:bCs w:val="0"/>
-                <w:caps w:val="0"/>
-                <w:sz w:val="20"/>
-                <w:szCs w:val="20"/>
-                <w:lang w:val="en-CA"/>
-              </w:rPr>
-              <w:t>[</w:t>
-            </w:r>
-            <w:proofErr w:type="spellStart"/>
-            <w:r>
-              <w:rPr>
-                <w:rFonts w:ascii="BC Sans" w:hAnsi="BC Sans"/>
-                <w:b w:val="0"/>
-                <w:bCs w:val="0"/>
-                <w:caps w:val="0"/>
-                <w:sz w:val="20"/>
-                <w:szCs w:val="20"/>
-                <w:lang w:val="en-CA"/>
-              </w:rPr>
-              <w:t>i</w:t>
-            </w:r>
-            <w:proofErr w:type="spellEnd"/>
-            <w:proofErr w:type="gramStart"/>
-            <w:r>
-              <w:rPr>
-                <w:rFonts w:ascii="BC Sans" w:hAnsi="BC Sans"/>
-                <w:b w:val="0"/>
-                <w:bCs w:val="0"/>
-                <w:caps w:val="0"/>
-                <w:sz w:val="20"/>
-                <w:szCs w:val="20"/>
-                <w:lang w:val="en-CA"/>
-              </w:rPr>
-              <w:t>].</w:t>
-            </w:r>
-            <w:proofErr w:type="spellStart"/>
-            <w:r>
-              <w:rPr>
-                <w:rFonts w:ascii="BC Sans" w:hAnsi="BC Sans"/>
-                <w:b w:val="0"/>
-                <w:bCs w:val="0"/>
-                <w:caps w:val="0"/>
-                <w:sz w:val="20"/>
-                <w:szCs w:val="20"/>
-                <w:lang w:val="en-CA"/>
-              </w:rPr>
-              <w:t>takenBy.lastName</w:t>
-            </w:r>
-            <w:proofErr w:type="gramEnd"/>
-            <w:r>
-              <w:rPr>
-                <w:rFonts w:ascii="BC Sans" w:hAnsi="BC Sans"/>
-                <w:b w:val="0"/>
-                <w:bCs w:val="0"/>
-                <w:caps w:val="0"/>
-                <w:sz w:val="20"/>
-                <w:szCs w:val="20"/>
-                <w:lang w:val="en-CA"/>
-              </w:rPr>
-              <w:t>:</w:t>
-            </w:r>
-            <w:proofErr w:type="gramStart"/>
-            <w:r>
-              <w:rPr>
-                <w:rFonts w:ascii="BC Sans" w:hAnsi="BC Sans"/>
-                <w:b w:val="0"/>
-                <w:bCs w:val="0"/>
-                <w:caps w:val="0"/>
-                <w:sz w:val="20"/>
-                <w:szCs w:val="20"/>
-                <w:lang w:val="en-CA"/>
-              </w:rPr>
-              <w:t>hideEnd</w:t>
-            </w:r>
-            <w:proofErr w:type="spellEnd"/>
-            <w:r>
-              <w:rPr>
-                <w:rFonts w:ascii="BC Sans" w:hAnsi="BC Sans"/>
-                <w:b w:val="0"/>
-                <w:bCs w:val="0"/>
-                <w:caps w:val="0"/>
-                <w:sz w:val="20"/>
-                <w:szCs w:val="20"/>
-                <w:lang w:val="en-CA"/>
-              </w:rPr>
-              <w:t>}</w:t>
-            </w:r>
-            <w:r>
-              <w:rPr>
-                <w:rFonts w:ascii="BC Sans" w:hAnsi="BC Sans"/>
-                <w:b w:val="0"/>
-                <w:bCs w:val="0"/>
-                <w:caps w:val="0"/>
-                <w:sz w:val="20"/>
-                <w:szCs w:val="20"/>
-                <w:lang w:val="en-CA"/>
-              </w:rPr>
               <w:t>Location</w:t>
             </w:r>
-            <w:proofErr w:type="gramEnd"/>
           </w:p>
         </w:tc>
         <w:tc>
@@ -6174,86 +3278,16 @@
                 <w:szCs w:val="20"/>
                 <w:lang w:val="en-CA"/>
               </w:rPr>
-              <w:t>{</w:t>
-            </w:r>
-            <w:proofErr w:type="gramStart"/>
-            <w:r>
-              <w:rPr>
-                <w:rFonts w:ascii="BC Sans" w:hAnsi="BC Sans"/>
-                <w:sz w:val="20"/>
-                <w:szCs w:val="20"/>
-                <w:lang w:val="en-CA"/>
-              </w:rPr>
-              <w:t>d.attachments</w:t>
-            </w:r>
-            <w:proofErr w:type="gramEnd"/>
-            <w:r>
-              <w:rPr>
-                <w:rFonts w:ascii="BC Sans" w:hAnsi="BC Sans"/>
-                <w:sz w:val="20"/>
-                <w:szCs w:val="20"/>
-                <w:lang w:val="en-CA"/>
-              </w:rPr>
-              <w:t>[i</w:t>
-            </w:r>
-            <w:proofErr w:type="gramStart"/>
-            <w:r>
-              <w:rPr>
-                <w:rFonts w:ascii="BC Sans" w:hAnsi="BC Sans"/>
-                <w:sz w:val="20"/>
-                <w:szCs w:val="20"/>
-                <w:lang w:val="en-CA"/>
-              </w:rPr>
-              <w:t>].location</w:t>
-            </w:r>
-            <w:proofErr w:type="gramEnd"/>
-            <w:r>
-              <w:rPr>
-                <w:rFonts w:ascii="BC Sans" w:hAnsi="BC Sans"/>
-                <w:sz w:val="20"/>
-                <w:szCs w:val="20"/>
-                <w:lang w:val="en-CA"/>
-              </w:rPr>
-              <w:t>}</w:t>
-            </w:r>
-            <w:r>
-              <w:rPr>
-                <w:rFonts w:ascii="BC Sans" w:hAnsi="BC Sans"/>
-                <w:sz w:val="20"/>
-                <w:szCs w:val="20"/>
-                <w:lang w:val="en-CA"/>
-              </w:rPr>
-              <w:t>{</w:t>
-            </w:r>
-            <w:proofErr w:type="gramStart"/>
-            <w:r>
-              <w:rPr>
-                <w:rFonts w:ascii="BC Sans" w:hAnsi="BC Sans"/>
-                <w:sz w:val="20"/>
-                <w:szCs w:val="20"/>
-                <w:lang w:val="en-CA"/>
-              </w:rPr>
-              <w:t>d.attachments</w:t>
-            </w:r>
-            <w:proofErr w:type="gramEnd"/>
-            <w:r>
-              <w:rPr>
-                <w:rFonts w:ascii="BC Sans" w:hAnsi="BC Sans"/>
-                <w:sz w:val="20"/>
-                <w:szCs w:val="20"/>
-                <w:lang w:val="en-CA"/>
-              </w:rPr>
-              <w:t>[i</w:t>
-            </w:r>
-            <w:proofErr w:type="gramStart"/>
-            <w:r>
-              <w:rPr>
-                <w:rFonts w:ascii="BC Sans" w:hAnsi="BC Sans"/>
-                <w:sz w:val="20"/>
-                <w:szCs w:val="20"/>
-                <w:lang w:val="en-CA"/>
-              </w:rPr>
-              <w:t>].takenBy.</w:t>
+              <w:t>{d.attachments[i].location}</w:t>
+            </w:r>
+            <w:r>
+              <w:rPr>
+                <w:rFonts w:ascii="BC Sans" w:hAnsi="BC Sans"/>
+                <w:sz w:val="20"/>
+                <w:szCs w:val="20"/>
+                <w:lang w:val="en-CA"/>
+              </w:rPr>
+              <w:t>{d.attachments[i].takenBy.</w:t>
             </w:r>
             <w:r>
               <w:rPr>
@@ -6264,7 +3298,6 @@
               </w:rPr>
               <w:t>location</w:t>
             </w:r>
-            <w:proofErr w:type="gramEnd"/>
             <w:r>
               <w:rPr>
                 <w:rFonts w:ascii="BC Sans" w:hAnsi="BC Sans"/>
@@ -6322,17 +3355,7 @@
           <w:sz w:val="20"/>
           <w:szCs w:val="20"/>
         </w:rPr>
-        <w:t>{</w:t>
-      </w:r>
-      <w:proofErr w:type="spellStart"/>
-      <w:proofErr w:type="gramStart"/>
-      <w:r>
-        <w:rPr>
-          <w:rFonts w:ascii="BC Sans" w:hAnsi="BC Sans"/>
-          <w:sz w:val="20"/>
-          <w:szCs w:val="20"/>
-        </w:rPr>
-        <w:t>d.</w:t>
+        <w:t>{d.</w:t>
       </w:r>
       <w:r>
         <w:rPr>
@@ -6342,8 +3365,6 @@
         </w:rPr>
         <w:t>attachments</w:t>
       </w:r>
-      <w:proofErr w:type="spellEnd"/>
-      <w:proofErr w:type="gramEnd"/>
       <w:r>
         <w:rPr>
           <w:rFonts w:ascii="BC Sans" w:hAnsi="BC Sans"/>
@@ -6420,7 +3441,7 @@
 </file>
 
 <file path=word/endnotes.xml><?xml version="1.0" encoding="utf-8"?>
-<w:endnotes xmlns:wpc="http://schemas.microsoft.com/office/word/2010/wordprocessingCanvas" xmlns:cx="http://schemas.microsoft.com/office/drawing/2014/chartex" xmlns:cx1="http://schemas.microsoft.com/office/drawing/2015/9/8/chartex" xmlns:cx2="http://schemas.microsoft.com/office/drawing/2015/10/21/chartex" xmlns:cx3="http://schemas.microsoft.com/office/drawing/2016/5/9/chartex" xmlns:cx4="http://schemas.microsoft.com/office/drawing/2016/5/10/chartex" xmlns:cx5="http://schemas.microsoft.com/office/drawing/2016/5/11/chartex" xmlns:cx6="http://schemas.microsoft.com/office/drawing/2016/5/12/chartex" xmlns:cx7="http://schemas.microsoft.com/office/drawing/2016/5/13/chartex" xmlns:cx8="http://schemas.microsoft.com/office/drawing/2016/5/14/chartex" xmlns:mc="http://schemas.openxmlformats.org/markup-compatibility/2006" xmlns:aink="http://schemas.microsoft.com/office/drawing/2016/ink" xmlns:am3d="http://schemas.microsoft.com/office/drawing/2017/model3d" xmlns:o="urn:schemas-microsoft-com:office:office" xmlns:oel="http://schemas.microsoft.com/office/2019/extlst" xmlns:r="http://schemas.openxmlformats.org/officeDocument/2006/relationships" xmlns:m="http://schemas.openxmlformats.org/officeDocument/2006/math" xmlns:v="urn:schemas-microsoft-com:vml" xmlns:wp14="http://schemas.microsoft.com/office/word/2010/wordprocessingDrawing" xmlns:wp="http://schemas.openxmlformats.org/drawingml/2006/wordprocessingDrawing" xmlns:w10="urn:schemas-microsoft-com:office:word" xmlns:w="http://schemas.openxmlformats.org/wordprocessingml/2006/main" xmlns:w14="http://schemas.microsoft.com/office/word/2010/wordml" xmlns:w15="http://schemas.microsoft.com/office/word/2012/wordml" xmlns:w16cex="http://schemas.microsoft.com/office/word/2018/wordml/cex" xmlns:w16cid="http://schemas.microsoft.com/office/word/2016/wordml/cid" xmlns:w16="http://schemas.microsoft.com/office/word/2018/wordml" xmlns:w16du="http://schemas.microsoft.com/office/word/2023/wordml/word16du" xmlns:w16sdtdh="http://schemas.microsoft.com/office/word/2020/wordml/sdtdatahash" xmlns:w16sdtfl="http://schemas.microsoft.com/office/word/2024/wordml/sdtformatlock" xmlns:w16se="http://schemas.microsoft.com/office/word/2015/wordml/symex" xmlns:wpg="http://schemas.microsoft.com/office/word/2010/wordprocessingGroup" xmlns:wpi="http://schemas.microsoft.com/office/word/2010/wordprocessingInk" xmlns:wne="http://schemas.microsoft.com/office/word/2006/wordml" xmlns:wps="http://schemas.microsoft.com/office/word/2010/wordprocessingShape" mc:Ignorable="w14 w15 w16se w16cid w16 w16cex w16sdtdh w16sdtfl w16du wp14">
+<w:endnotes xmlns:wpc="http://schemas.microsoft.com/office/word/2010/wordprocessingCanvas" xmlns:cx="http://schemas.microsoft.com/office/drawing/2014/chartex" xmlns:cx1="http://schemas.microsoft.com/office/drawing/2015/9/8/chartex" xmlns:cx2="http://schemas.microsoft.com/office/drawing/2015/10/21/chartex" xmlns:cx3="http://schemas.microsoft.com/office/drawing/2016/5/9/chartex" xmlns:cx4="http://schemas.microsoft.com/office/drawing/2016/5/10/chartex" xmlns:cx5="http://schemas.microsoft.com/office/drawing/2016/5/11/chartex" xmlns:cx6="http://schemas.microsoft.com/office/drawing/2016/5/12/chartex" xmlns:cx7="http://schemas.microsoft.com/office/drawing/2016/5/13/chartex" xmlns:cx8="http://schemas.microsoft.com/office/drawing/2016/5/14/chartex" xmlns:mc="http://schemas.openxmlformats.org/markup-compatibility/2006" xmlns:aink="http://schemas.microsoft.com/office/drawing/2016/ink" xmlns:am3d="http://schemas.microsoft.com/office/drawing/2017/model3d" xmlns:o="urn:schemas-microsoft-com:office:office" xmlns:oel="http://schemas.microsoft.com/office/2019/extlst" xmlns:r="http://schemas.openxmlformats.org/officeDocument/2006/relationships" xmlns:m="http://schemas.openxmlformats.org/officeDocument/2006/math" xmlns:v="urn:schemas-microsoft-com:vml" xmlns:wp14="http://schemas.microsoft.com/office/word/2010/wordprocessingDrawing" xmlns:wp="http://schemas.openxmlformats.org/drawingml/2006/wordprocessingDrawing" xmlns:w10="urn:schemas-microsoft-com:office:word" xmlns:w="http://schemas.openxmlformats.org/wordprocessingml/2006/main" xmlns:w14="http://schemas.microsoft.com/office/word/2010/wordml" xmlns:w15="http://schemas.microsoft.com/office/word/2012/wordml" xmlns:w16cei="http://schemas.microsoft.com/office/word/2026/wordml/cei" xmlns:w16cex="http://schemas.microsoft.com/office/word/2018/wordml/cex" xmlns:w16cid="http://schemas.microsoft.com/office/word/2016/wordml/cid" xmlns:w16="http://schemas.microsoft.com/office/word/2018/wordml" xmlns:w16du="http://schemas.microsoft.com/office/word/2023/wordml/word16du" xmlns:w16sdtdh="http://schemas.microsoft.com/office/word/2020/wordml/sdtdatahash" xmlns:w16sdtfl="http://schemas.microsoft.com/office/word/2024/wordml/sdtformatlock" xmlns:w16se="http://schemas.microsoft.com/office/word/2015/wordml/symex" xmlns:wpg="http://schemas.microsoft.com/office/word/2010/wordprocessingGroup" xmlns:wpi="http://schemas.microsoft.com/office/word/2010/wordprocessingInk" xmlns:wne="http://schemas.microsoft.com/office/word/2006/wordml" xmlns:wps="http://schemas.microsoft.com/office/word/2010/wordprocessingShape" mc:Ignorable="w14 w15 w16se w16cid w16 w16cex w16sdtdh w16sdtfl w16du wp14">
   <w:endnote w:type="separator" w:id="-1">
     <w:p>
       <w:pPr>
@@ -6445,7 +3466,7 @@
 </file>
 
 <file path=word/footer1.xml><?xml version="1.0" encoding="utf-8"?>
-<w:ftr xmlns:wpc="http://schemas.microsoft.com/office/word/2010/wordprocessingCanvas" xmlns:cx="http://schemas.microsoft.com/office/drawing/2014/chartex" xmlns:cx1="http://schemas.microsoft.com/office/drawing/2015/9/8/chartex" xmlns:cx2="http://schemas.microsoft.com/office/drawing/2015/10/21/chartex" xmlns:cx3="http://schemas.microsoft.com/office/drawing/2016/5/9/chartex" xmlns:cx4="http://schemas.microsoft.com/office/drawing/2016/5/10/chartex" xmlns:cx5="http://schemas.microsoft.com/office/drawing/2016/5/11/chartex" xmlns:cx6="http://schemas.microsoft.com/office/drawing/2016/5/12/chartex" xmlns:cx7="http://schemas.microsoft.com/office/drawing/2016/5/13/chartex" xmlns:cx8="http://schemas.microsoft.com/office/drawing/2016/5/14/chartex" xmlns:mc="http://schemas.openxmlformats.org/markup-compatibility/2006" xmlns:aink="http://schemas.microsoft.com/office/drawing/2016/ink" xmlns:am3d="http://schemas.microsoft.com/office/drawing/2017/model3d" xmlns:o="urn:schemas-microsoft-com:office:office" xmlns:oel="http://schemas.microsoft.com/office/2019/extlst" xmlns:r="http://schemas.openxmlformats.org/officeDocument/2006/relationships" xmlns:m="http://schemas.openxmlformats.org/officeDocument/2006/math" xmlns:v="urn:schemas-microsoft-com:vml" xmlns:wp14="http://schemas.microsoft.com/office/word/2010/wordprocessingDrawing" xmlns:wp="http://schemas.openxmlformats.org/drawingml/2006/wordprocessingDrawing" xmlns:w10="urn:schemas-microsoft-com:office:word" xmlns:w="http://schemas.openxmlformats.org/wordprocessingml/2006/main" xmlns:w14="http://schemas.microsoft.com/office/word/2010/wordml" xmlns:w15="http://schemas.microsoft.com/office/word/2012/wordml" xmlns:w16cex="http://schemas.microsoft.com/office/word/2018/wordml/cex" xmlns:w16cid="http://schemas.microsoft.com/office/word/2016/wordml/cid" xmlns:w16="http://schemas.microsoft.com/office/word/2018/wordml" xmlns:w16du="http://schemas.microsoft.com/office/word/2023/wordml/word16du" xmlns:w16sdtdh="http://schemas.microsoft.com/office/word/2020/wordml/sdtdatahash" xmlns:w16sdtfl="http://schemas.microsoft.com/office/word/2024/wordml/sdtformatlock" xmlns:w16se="http://schemas.microsoft.com/office/word/2015/wordml/symex" xmlns:wpg="http://schemas.microsoft.com/office/word/2010/wordprocessingGroup" xmlns:wpi="http://schemas.microsoft.com/office/word/2010/wordprocessingInk" xmlns:wne="http://schemas.microsoft.com/office/word/2006/wordml" xmlns:wps="http://schemas.microsoft.com/office/word/2010/wordprocessingShape" mc:Ignorable="w14 w15 w16se w16cid w16 w16cex w16sdtdh w16sdtfl w16du wp14">
+<w:ftr xmlns:wpc="http://schemas.microsoft.com/office/word/2010/wordprocessingCanvas" xmlns:cx="http://schemas.microsoft.com/office/drawing/2014/chartex" xmlns:cx1="http://schemas.microsoft.com/office/drawing/2015/9/8/chartex" xmlns:cx2="http://schemas.microsoft.com/office/drawing/2015/10/21/chartex" xmlns:cx3="http://schemas.microsoft.com/office/drawing/2016/5/9/chartex" xmlns:cx4="http://schemas.microsoft.com/office/drawing/2016/5/10/chartex" xmlns:cx5="http://schemas.microsoft.com/office/drawing/2016/5/11/chartex" xmlns:cx6="http://schemas.microsoft.com/office/drawing/2016/5/12/chartex" xmlns:cx7="http://schemas.microsoft.com/office/drawing/2016/5/13/chartex" xmlns:cx8="http://schemas.microsoft.com/office/drawing/2016/5/14/chartex" xmlns:mc="http://schemas.openxmlformats.org/markup-compatibility/2006" xmlns:aink="http://schemas.microsoft.com/office/drawing/2016/ink" xmlns:am3d="http://schemas.microsoft.com/office/drawing/2017/model3d" xmlns:o="urn:schemas-microsoft-com:office:office" xmlns:oel="http://schemas.microsoft.com/office/2019/extlst" xmlns:r="http://schemas.openxmlformats.org/officeDocument/2006/relationships" xmlns:m="http://schemas.openxmlformats.org/officeDocument/2006/math" xmlns:v="urn:schemas-microsoft-com:vml" xmlns:wp14="http://schemas.microsoft.com/office/word/2010/wordprocessingDrawing" xmlns:wp="http://schemas.openxmlformats.org/drawingml/2006/wordprocessingDrawing" xmlns:w10="urn:schemas-microsoft-com:office:word" xmlns:w="http://schemas.openxmlformats.org/wordprocessingml/2006/main" xmlns:w14="http://schemas.microsoft.com/office/word/2010/wordml" xmlns:w15="http://schemas.microsoft.com/office/word/2012/wordml" xmlns:w16cei="http://schemas.microsoft.com/office/word/2026/wordml/cei" xmlns:w16cex="http://schemas.microsoft.com/office/word/2018/wordml/cex" xmlns:w16cid="http://schemas.microsoft.com/office/word/2016/wordml/cid" xmlns:w16="http://schemas.microsoft.com/office/word/2018/wordml" xmlns:w16du="http://schemas.microsoft.com/office/word/2023/wordml/word16du" xmlns:w16sdtdh="http://schemas.microsoft.com/office/word/2020/wordml/sdtdatahash" xmlns:w16sdtfl="http://schemas.microsoft.com/office/word/2024/wordml/sdtformatlock" xmlns:w16se="http://schemas.microsoft.com/office/word/2015/wordml/symex" xmlns:wpg="http://schemas.microsoft.com/office/word/2010/wordprocessingGroup" xmlns:wpi="http://schemas.microsoft.com/office/word/2010/wordprocessingInk" xmlns:wne="http://schemas.microsoft.com/office/word/2006/wordml" xmlns:wps="http://schemas.microsoft.com/office/word/2010/wordprocessingShape" mc:Ignorable="w14 w15 w16se w16cid w16 w16cex w16sdtdh w16sdtfl w16du wp14">
   <w:tbl>
     <w:tblPr>
       <w:tblW w:w="0" w:type="auto"/>
@@ -6506,7 +3527,7 @@
 </file>
 
 <file path=word/footnotes.xml><?xml version="1.0" encoding="utf-8"?>
-<w:footnotes xmlns:wpc="http://schemas.microsoft.com/office/word/2010/wordprocessingCanvas" xmlns:cx="http://schemas.microsoft.com/office/drawing/2014/chartex" xmlns:cx1="http://schemas.microsoft.com/office/drawing/2015/9/8/chartex" xmlns:cx2="http://schemas.microsoft.com/office/drawing/2015/10/21/chartex" xmlns:cx3="http://schemas.microsoft.com/office/drawing/2016/5/9/chartex" xmlns:cx4="http://schemas.microsoft.com/office/drawing/2016/5/10/chartex" xmlns:cx5="http://schemas.microsoft.com/office/drawing/2016/5/11/chartex" xmlns:cx6="http://schemas.microsoft.com/office/drawing/2016/5/12/chartex" xmlns:cx7="http://schemas.microsoft.com/office/drawing/2016/5/13/chartex" xmlns:cx8="http://schemas.microsoft.com/office/drawing/2016/5/14/chartex" xmlns:mc="http://schemas.openxmlformats.org/markup-compatibility/2006" xmlns:aink="http://schemas.microsoft.com/office/drawing/2016/ink" xmlns:am3d="http://schemas.microsoft.com/office/drawing/2017/model3d" xmlns:o="urn:schemas-microsoft-com:office:office" xmlns:oel="http://schemas.microsoft.com/office/2019/extlst" xmlns:r="http://schemas.openxmlformats.org/officeDocument/2006/relationships" xmlns:m="http://schemas.openxmlformats.org/officeDocument/2006/math" xmlns:v="urn:schemas-microsoft-com:vml" xmlns:wp14="http://schemas.microsoft.com/office/word/2010/wordprocessingDrawing" xmlns:wp="http://schemas.openxmlformats.org/drawingml/2006/wordprocessingDrawing" xmlns:w10="urn:schemas-microsoft-com:office:word" xmlns:w="http://schemas.openxmlformats.org/wordprocessingml/2006/main" xmlns:w14="http://schemas.microsoft.com/office/word/2010/wordml" xmlns:w15="http://schemas.microsoft.com/office/word/2012/wordml" xmlns:w16cex="http://schemas.microsoft.com/office/word/2018/wordml/cex" xmlns:w16cid="http://schemas.microsoft.com/office/word/2016/wordml/cid" xmlns:w16="http://schemas.microsoft.com/office/word/2018/wordml" xmlns:w16du="http://schemas.microsoft.com/office/word/2023/wordml/word16du" xmlns:w16sdtdh="http://schemas.microsoft.com/office/word/2020/wordml/sdtdatahash" xmlns:w16sdtfl="http://schemas.microsoft.com/office/word/2024/wordml/sdtformatlock" xmlns:w16se="http://schemas.microsoft.com/office/word/2015/wordml/symex" xmlns:wpg="http://schemas.microsoft.com/office/word/2010/wordprocessingGroup" xmlns:wpi="http://schemas.microsoft.com/office/word/2010/wordprocessingInk" xmlns:wne="http://schemas.microsoft.com/office/word/2006/wordml" xmlns:wps="http://schemas.microsoft.com/office/word/2010/wordprocessingShape" mc:Ignorable="w14 w15 w16se w16cid w16 w16cex w16sdtdh w16sdtfl w16du wp14">
+<w:footnotes xmlns:wpc="http://schemas.microsoft.com/office/word/2010/wordprocessingCanvas" xmlns:cx="http://schemas.microsoft.com/office/drawing/2014/chartex" xmlns:cx1="http://schemas.microsoft.com/office/drawing/2015/9/8/chartex" xmlns:cx2="http://schemas.microsoft.com/office/drawing/2015/10/21/chartex" xmlns:cx3="http://schemas.microsoft.com/office/drawing/2016/5/9/chartex" xmlns:cx4="http://schemas.microsoft.com/office/drawing/2016/5/10/chartex" xmlns:cx5="http://schemas.microsoft.com/office/drawing/2016/5/11/chartex" xmlns:cx6="http://schemas.microsoft.com/office/drawing/2016/5/12/chartex" xmlns:cx7="http://schemas.microsoft.com/office/drawing/2016/5/13/chartex" xmlns:cx8="http://schemas.microsoft.com/office/drawing/2016/5/14/chartex" xmlns:mc="http://schemas.openxmlformats.org/markup-compatibility/2006" xmlns:aink="http://schemas.microsoft.com/office/drawing/2016/ink" xmlns:am3d="http://schemas.microsoft.com/office/drawing/2017/model3d" xmlns:o="urn:schemas-microsoft-com:office:office" xmlns:oel="http://schemas.microsoft.com/office/2019/extlst" xmlns:r="http://schemas.openxmlformats.org/officeDocument/2006/relationships" xmlns:m="http://schemas.openxmlformats.org/officeDocument/2006/math" xmlns:v="urn:schemas-microsoft-com:vml" xmlns:wp14="http://schemas.microsoft.com/office/word/2010/wordprocessingDrawing" xmlns:wp="http://schemas.openxmlformats.org/drawingml/2006/wordprocessingDrawing" xmlns:w10="urn:schemas-microsoft-com:office:word" xmlns:w="http://schemas.openxmlformats.org/wordprocessingml/2006/main" xmlns:w14="http://schemas.microsoft.com/office/word/2010/wordml" xmlns:w15="http://schemas.microsoft.com/office/word/2012/wordml" xmlns:w16cei="http://schemas.microsoft.com/office/word/2026/wordml/cei" xmlns:w16cex="http://schemas.microsoft.com/office/word/2018/wordml/cex" xmlns:w16cid="http://schemas.microsoft.com/office/word/2016/wordml/cid" xmlns:w16="http://schemas.microsoft.com/office/word/2018/wordml" xmlns:w16du="http://schemas.microsoft.com/office/word/2023/wordml/word16du" xmlns:w16sdtdh="http://schemas.microsoft.com/office/word/2020/wordml/sdtdatahash" xmlns:w16sdtfl="http://schemas.microsoft.com/office/word/2024/wordml/sdtformatlock" xmlns:w16se="http://schemas.microsoft.com/office/word/2015/wordml/symex" xmlns:wpg="http://schemas.microsoft.com/office/word/2010/wordprocessingGroup" xmlns:wpi="http://schemas.microsoft.com/office/word/2010/wordprocessingInk" xmlns:wne="http://schemas.microsoft.com/office/word/2006/wordml" xmlns:wps="http://schemas.microsoft.com/office/word/2010/wordprocessingShape" mc:Ignorable="w14 w15 w16se w16cid w16 w16cex w16sdtdh w16sdtfl w16du wp14">
   <w:footnote w:type="separator" w:id="-1">
     <w:p>
       <w:pPr>
@@ -6531,7 +3552,7 @@
 </file>
 
 <file path=word/header1.xml><?xml version="1.0" encoding="utf-8"?>
-<w:hdr xmlns:wpc="http://schemas.microsoft.com/office/word/2010/wordprocessingCanvas" xmlns:cx="http://schemas.microsoft.com/office/drawing/2014/chartex" xmlns:cx1="http://schemas.microsoft.com/office/drawing/2015/9/8/chartex" xmlns:cx2="http://schemas.microsoft.com/office/drawing/2015/10/21/chartex" xmlns:cx3="http://schemas.microsoft.com/office/drawing/2016/5/9/chartex" xmlns:cx4="http://schemas.microsoft.com/office/drawing/2016/5/10/chartex" xmlns:cx5="http://schemas.microsoft.com/office/drawing/2016/5/11/chartex" xmlns:cx6="http://schemas.microsoft.com/office/drawing/2016/5/12/chartex" xmlns:cx7="http://schemas.microsoft.com/office/drawing/2016/5/13/chartex" xmlns:cx8="http://schemas.microsoft.com/office/drawing/2016/5/14/chartex" xmlns:mc="http://schemas.openxmlformats.org/markup-compatibility/2006" xmlns:aink="http://schemas.microsoft.com/office/drawing/2016/ink" xmlns:am3d="http://schemas.microsoft.com/office/drawing/2017/model3d" xmlns:o="urn:schemas-microsoft-com:office:office" xmlns:oel="http://schemas.microsoft.com/office/2019/extlst" xmlns:r="http://schemas.openxmlformats.org/officeDocument/2006/relationships" xmlns:m="http://schemas.openxmlformats.org/officeDocument/2006/math" xmlns:v="urn:schemas-microsoft-com:vml" xmlns:wp14="http://schemas.microsoft.com/office/word/2010/wordprocessingDrawing" xmlns:wp="http://schemas.openxmlformats.org/drawingml/2006/wordprocessingDrawing" xmlns:w10="urn:schemas-microsoft-com:office:word" xmlns:w="http://schemas.openxmlformats.org/wordprocessingml/2006/main" xmlns:w14="http://schemas.microsoft.com/office/word/2010/wordml" xmlns:w15="http://schemas.microsoft.com/office/word/2012/wordml" xmlns:w16cex="http://schemas.microsoft.com/office/word/2018/wordml/cex" xmlns:w16cid="http://schemas.microsoft.com/office/word/2016/wordml/cid" xmlns:w16="http://schemas.microsoft.com/office/word/2018/wordml" xmlns:w16du="http://schemas.microsoft.com/office/word/2023/wordml/word16du" xmlns:w16sdtdh="http://schemas.microsoft.com/office/word/2020/wordml/sdtdatahash" xmlns:w16sdtfl="http://schemas.microsoft.com/office/word/2024/wordml/sdtformatlock" xmlns:w16se="http://schemas.microsoft.com/office/word/2015/wordml/symex" xmlns:wpg="http://schemas.microsoft.com/office/word/2010/wordprocessingGroup" xmlns:wpi="http://schemas.microsoft.com/office/word/2010/wordprocessingInk" xmlns:wne="http://schemas.microsoft.com/office/word/2006/wordml" xmlns:wps="http://schemas.microsoft.com/office/word/2010/wordprocessingShape" mc:Ignorable="w14 w15 w16se w16cid w16 w16cex w16sdtdh w16sdtfl w16du wp14">
+<w:hdr xmlns:wpc="http://schemas.microsoft.com/office/word/2010/wordprocessingCanvas" xmlns:cx="http://schemas.microsoft.com/office/drawing/2014/chartex" xmlns:cx1="http://schemas.microsoft.com/office/drawing/2015/9/8/chartex" xmlns:cx2="http://schemas.microsoft.com/office/drawing/2015/10/21/chartex" xmlns:cx3="http://schemas.microsoft.com/office/drawing/2016/5/9/chartex" xmlns:cx4="http://schemas.microsoft.com/office/drawing/2016/5/10/chartex" xmlns:cx5="http://schemas.microsoft.com/office/drawing/2016/5/11/chartex" xmlns:cx6="http://schemas.microsoft.com/office/drawing/2016/5/12/chartex" xmlns:cx7="http://schemas.microsoft.com/office/drawing/2016/5/13/chartex" xmlns:cx8="http://schemas.microsoft.com/office/drawing/2016/5/14/chartex" xmlns:mc="http://schemas.openxmlformats.org/markup-compatibility/2006" xmlns:aink="http://schemas.microsoft.com/office/drawing/2016/ink" xmlns:am3d="http://schemas.microsoft.com/office/drawing/2017/model3d" xmlns:o="urn:schemas-microsoft-com:office:office" xmlns:oel="http://schemas.microsoft.com/office/2019/extlst" xmlns:r="http://schemas.openxmlformats.org/officeDocument/2006/relationships" xmlns:m="http://schemas.openxmlformats.org/officeDocument/2006/math" xmlns:v="urn:schemas-microsoft-com:vml" xmlns:wp14="http://schemas.microsoft.com/office/word/2010/wordprocessingDrawing" xmlns:wp="http://schemas.openxmlformats.org/drawingml/2006/wordprocessingDrawing" xmlns:w10="urn:schemas-microsoft-com:office:word" xmlns:w="http://schemas.openxmlformats.org/wordprocessingml/2006/main" xmlns:w14="http://schemas.microsoft.com/office/word/2010/wordml" xmlns:w15="http://schemas.microsoft.com/office/word/2012/wordml" xmlns:w16cei="http://schemas.microsoft.com/office/word/2026/wordml/cei" xmlns:w16cex="http://schemas.microsoft.com/office/word/2018/wordml/cex" xmlns:w16cid="http://schemas.microsoft.com/office/word/2016/wordml/cid" xmlns:w16="http://schemas.microsoft.com/office/word/2018/wordml" xmlns:w16du="http://schemas.microsoft.com/office/word/2023/wordml/word16du" xmlns:w16sdtdh="http://schemas.microsoft.com/office/word/2020/wordml/sdtdatahash" xmlns:w16sdtfl="http://schemas.microsoft.com/office/word/2024/wordml/sdtformatlock" xmlns:w16se="http://schemas.microsoft.com/office/word/2015/wordml/symex" xmlns:wpg="http://schemas.microsoft.com/office/word/2010/wordprocessingGroup" xmlns:wpi="http://schemas.microsoft.com/office/word/2010/wordprocessingInk" xmlns:wne="http://schemas.microsoft.com/office/word/2006/wordml" xmlns:wps="http://schemas.microsoft.com/office/word/2010/wordprocessingShape" mc:Ignorable="w14 w15 w16se w16cid w16 w16cex w16sdtdh w16sdtfl w16du wp14">
   <w:tbl>
     <w:tblPr>
       <w:tblW w:w="10802" w:type="dxa"/>
@@ -6639,8 +3660,6 @@
             </w:rPr>
             <w:t>Report printed on {</w:t>
           </w:r>
-          <w:proofErr w:type="spellStart"/>
-          <w:proofErr w:type="gramStart"/>
           <w:r>
             <w:rPr>
               <w:rFonts w:ascii="BC Sans" w:eastAsia="BC Sans" w:hAnsi="BC Sans" w:cs="BC Sans"/>
@@ -6665,8 +3684,6 @@
             </w:rPr>
             <w:t>generatedOn</w:t>
           </w:r>
-          <w:proofErr w:type="spellEnd"/>
-          <w:proofErr w:type="gramEnd"/>
           <w:r>
             <w:rPr>
               <w:rFonts w:ascii="BC Sans" w:eastAsia="BC Sans" w:hAnsi="BC Sans" w:cs="BC Sans"/>

</xml_diff>

<commit_message>
fix: CE-2622 rename remarks to subject on tasks (#1695)
Co-authored-by: team-wolverine-nrm-repo-updater[bot] <203337993+team-wolverine-nrm-repo-updater[bot]@users.noreply.github.com>
</commit_message>
<xml_diff>
--- a/backend/templates/task/CDOGS-TDR-TEMPLATE-v1.docx
+++ b/backend/templates/task/CDOGS-TDR-TEMPLATE-v1.docx
@@ -112,6 +112,7 @@
               </w:rPr>
               <w:t>{</w:t>
             </w:r>
+            <w:proofErr w:type="spellStart"/>
             <w:r>
               <w:rPr>
                 <w:rFonts w:ascii="BC Sans" w:eastAsia="Times New Roman" w:hAnsi="BC Sans" w:cs="Times New Roman"/>
@@ -153,6 +154,7 @@
               </w:rPr>
               <w:t>Label</w:t>
             </w:r>
+            <w:proofErr w:type="spellEnd"/>
             <w:r>
               <w:rPr>
                 <w:rFonts w:ascii="BC Sans" w:eastAsia="Times New Roman" w:hAnsi="BC Sans" w:cs="Times New Roman"/>
@@ -197,6 +199,7 @@
               </w:rPr>
               <w:t>: {</w:t>
             </w:r>
+            <w:proofErr w:type="spellStart"/>
             <w:r>
               <w:rPr>
                 <w:rFonts w:ascii="BC Sans" w:eastAsia="Times New Roman" w:hAnsi="BC Sans" w:cs="Times New Roman"/>
@@ -229,6 +232,7 @@
               </w:rPr>
               <w:t>taskNumber</w:t>
             </w:r>
+            <w:proofErr w:type="spellEnd"/>
             <w:r>
               <w:rPr>
                 <w:rFonts w:ascii="BC Sans" w:eastAsia="Times New Roman" w:hAnsi="BC Sans" w:cs="Times New Roman"/>
@@ -403,6 +407,7 @@
               </w:rPr>
               <w:t>{</w:t>
             </w:r>
+            <w:proofErr w:type="spellStart"/>
             <w:r>
               <w:rPr>
                 <w:rFonts w:ascii="BC Sans" w:eastAsia="Times New Roman" w:hAnsi="BC Sans" w:cs="Times New Roman"/>
@@ -412,6 +417,7 @@
               </w:rPr>
               <w:t>d.taskCategory</w:t>
             </w:r>
+            <w:proofErr w:type="spellEnd"/>
             <w:r>
               <w:rPr>
                 <w:rFonts w:ascii="BC Sans" w:eastAsia="Times New Roman" w:hAnsi="BC Sans" w:cs="Times New Roman"/>
@@ -456,7 +462,7 @@
                 <w:sz w:val="20"/>
                 <w:szCs w:val="20"/>
               </w:rPr>
-              <w:t>Remarks</w:t>
+              <w:t>Subject</w:t>
             </w:r>
           </w:p>
         </w:tc>
@@ -486,6 +492,7 @@
               </w:rPr>
               <w:t>{</w:t>
             </w:r>
+            <w:proofErr w:type="spellStart"/>
             <w:r>
               <w:rPr>
                 <w:rFonts w:ascii="BC Sans" w:eastAsia="Times New Roman" w:hAnsi="BC Sans" w:cs="Times New Roman"/>
@@ -511,8 +518,9 @@
                 <w:sz w:val="20"/>
                 <w:szCs w:val="20"/>
               </w:rPr>
-              <w:t>remarks</w:t>
-            </w:r>
+              <w:t>subject</w:t>
+            </w:r>
+            <w:proofErr w:type="spellEnd"/>
             <w:r>
               <w:rPr>
                 <w:rFonts w:ascii="BC Sans" w:eastAsia="Times New Roman" w:hAnsi="BC Sans" w:cs="Times New Roman"/>
@@ -582,6 +590,7 @@
               </w:rPr>
               <w:t>{</w:t>
             </w:r>
+            <w:proofErr w:type="spellStart"/>
             <w:r>
               <w:rPr>
                 <w:rFonts w:ascii="BC Sans" w:eastAsia="Times New Roman" w:hAnsi="BC Sans" w:cs="Times New Roman"/>
@@ -611,6 +620,7 @@
               </w:rPr>
               <w:t>assignedUser.lastName</w:t>
             </w:r>
+            <w:proofErr w:type="spellEnd"/>
             <w:r>
               <w:rPr>
                 <w:rFonts w:ascii="BC Sans" w:eastAsia="Times New Roman" w:hAnsi="BC Sans" w:cs="Times New Roman"/>
@@ -631,7 +641,31 @@
                 <w:szCs w:val="20"/>
                 <w14:ligatures w14:val="none"/>
               </w:rPr>
-              <w:t>, {d.assignedUser.firstName}</w:t>
+              <w:t>, {</w:t>
+            </w:r>
+            <w:proofErr w:type="spellStart"/>
+            <w:r>
+              <w:rPr>
+                <w:rFonts w:ascii="BC Sans" w:eastAsia="Times New Roman" w:hAnsi="BC Sans" w:cs="Times New Roman"/>
+                <w:color w:val="000000"/>
+                <w:kern w:val="0"/>
+                <w:sz w:val="20"/>
+                <w:szCs w:val="20"/>
+                <w14:ligatures w14:val="none"/>
+              </w:rPr>
+              <w:t>d.assignedUser.firstName</w:t>
+            </w:r>
+            <w:proofErr w:type="spellEnd"/>
+            <w:r>
+              <w:rPr>
+                <w:rFonts w:ascii="BC Sans" w:eastAsia="Times New Roman" w:hAnsi="BC Sans" w:cs="Times New Roman"/>
+                <w:color w:val="000000"/>
+                <w:kern w:val="0"/>
+                <w:sz w:val="20"/>
+                <w:szCs w:val="20"/>
+                <w14:ligatures w14:val="none"/>
+              </w:rPr>
+              <w:t>}</w:t>
             </w:r>
           </w:p>
         </w:tc>
@@ -697,17 +731,35 @@
                 <w:sz w:val="20"/>
                 <w:szCs w:val="20"/>
               </w:rPr>
-              <w:t>{d.dueDate}</w:t>
-            </w:r>
-            <w:r>
-              <w:rPr>
-                <w:rFonts w:ascii="BC Sans" w:eastAsia="Times New Roman" w:hAnsi="BC Sans" w:cs="Times New Roman"/>
-                <w:color w:val="000000" w:themeColor="text1"/>
-                <w:sz w:val="20"/>
-                <w:szCs w:val="20"/>
-              </w:rPr>
               <w:t>{</w:t>
             </w:r>
+            <w:proofErr w:type="spellStart"/>
+            <w:r>
+              <w:rPr>
+                <w:rFonts w:ascii="BC Sans" w:hAnsi="BC Sans" w:cs="BC Sans Light"/>
+                <w:sz w:val="20"/>
+                <w:szCs w:val="20"/>
+              </w:rPr>
+              <w:t>d.dueDate</w:t>
+            </w:r>
+            <w:proofErr w:type="spellEnd"/>
+            <w:r>
+              <w:rPr>
+                <w:rFonts w:ascii="BC Sans" w:hAnsi="BC Sans" w:cs="BC Sans Light"/>
+                <w:sz w:val="20"/>
+                <w:szCs w:val="20"/>
+              </w:rPr>
+              <w:t>}</w:t>
+            </w:r>
+            <w:r>
+              <w:rPr>
+                <w:rFonts w:ascii="BC Sans" w:eastAsia="Times New Roman" w:hAnsi="BC Sans" w:cs="Times New Roman"/>
+                <w:color w:val="000000" w:themeColor="text1"/>
+                <w:sz w:val="20"/>
+                <w:szCs w:val="20"/>
+              </w:rPr>
+              <w:t>{</w:t>
+            </w:r>
             <w:r>
               <w:rPr>
                 <w:rFonts w:ascii="BC Sans" w:eastAsia="Times New Roman" w:hAnsi="BC Sans" w:cs="Times New Roman"/>
@@ -717,6 +769,7 @@
               </w:rPr>
               <w:t>d.</w:t>
             </w:r>
+            <w:proofErr w:type="spellStart"/>
             <w:r>
               <w:rPr>
                 <w:rFonts w:ascii="BC Sans" w:eastAsia="Times New Roman" w:hAnsi="BC Sans" w:cs="Times New Roman"/>
@@ -727,6 +780,7 @@
               </w:rPr>
               <w:t>description:ifEM:hideBegin</w:t>
             </w:r>
+            <w:proofErr w:type="spellEnd"/>
             <w:r>
               <w:rPr>
                 <w:rFonts w:ascii="BC Sans" w:hAnsi="BC Sans"/>
@@ -792,7 +846,25 @@
                 <w:sz w:val="20"/>
                 <w:szCs w:val="20"/>
               </w:rPr>
-              <w:t>{d.description}</w:t>
+              <w:t>{</w:t>
+            </w:r>
+            <w:proofErr w:type="spellStart"/>
+            <w:r>
+              <w:rPr>
+                <w:rFonts w:ascii="BC Sans" w:hAnsi="BC Sans" w:cs="BC Sans Light"/>
+                <w:sz w:val="20"/>
+                <w:szCs w:val="20"/>
+              </w:rPr>
+              <w:t>d.description</w:t>
+            </w:r>
+            <w:proofErr w:type="spellEnd"/>
+            <w:r>
+              <w:rPr>
+                <w:rFonts w:ascii="BC Sans" w:hAnsi="BC Sans" w:cs="BC Sans Light"/>
+                <w:sz w:val="20"/>
+                <w:szCs w:val="20"/>
+              </w:rPr>
+              <w:t>}</w:t>
             </w:r>
             <w:r>
               <w:rPr>
@@ -835,6 +907,7 @@
         </w:rPr>
         <w:t>d.</w:t>
       </w:r>
+      <w:proofErr w:type="spellStart"/>
       <w:r>
         <w:rPr>
           <w:rFonts w:ascii="BC Sans" w:eastAsia="Times New Roman" w:hAnsi="BC Sans" w:cs="Times New Roman"/>
@@ -845,6 +918,7 @@
         </w:rPr>
         <w:t>description:ifEM:hideEnd</w:t>
       </w:r>
+      <w:proofErr w:type="spellEnd"/>
       <w:r>
         <w:rPr>
           <w:rFonts w:ascii="BC Sans" w:hAnsi="BC Sans"/>
@@ -859,7 +933,43 @@
           <w:sz w:val="20"/>
           <w:szCs w:val="20"/>
         </w:rPr>
-        <w:t>{d.hasDiaryDates:ifEQ(true):showBegin}</w:t>
+        <w:t>{</w:t>
+      </w:r>
+      <w:proofErr w:type="spellStart"/>
+      <w:r>
+        <w:rPr>
+          <w:rFonts w:ascii="BC Sans" w:hAnsi="BC Sans"/>
+          <w:sz w:val="20"/>
+          <w:szCs w:val="20"/>
+        </w:rPr>
+        <w:t>d.hasDiaryDates:ifEQ</w:t>
+      </w:r>
+      <w:proofErr w:type="spellEnd"/>
+      <w:r>
+        <w:rPr>
+          <w:rFonts w:ascii="BC Sans" w:hAnsi="BC Sans"/>
+          <w:sz w:val="20"/>
+          <w:szCs w:val="20"/>
+        </w:rPr>
+        <w:t>(true):</w:t>
+      </w:r>
+      <w:proofErr w:type="spellStart"/>
+      <w:r>
+        <w:rPr>
+          <w:rFonts w:ascii="BC Sans" w:hAnsi="BC Sans"/>
+          <w:sz w:val="20"/>
+          <w:szCs w:val="20"/>
+        </w:rPr>
+        <w:t>showBegin</w:t>
+      </w:r>
+      <w:proofErr w:type="spellEnd"/>
+      <w:r>
+        <w:rPr>
+          <w:rFonts w:ascii="BC Sans" w:hAnsi="BC Sans"/>
+          <w:sz w:val="20"/>
+          <w:szCs w:val="20"/>
+        </w:rPr>
+        <w:t>}</w:t>
       </w:r>
     </w:p>
     <w:tbl>
@@ -1033,7 +1143,79 @@
                 <w:sz w:val="20"/>
                 <w:szCs w:val="20"/>
               </w:rPr>
-              <w:t>{d.diaryDates[i].dueDate}</w:t>
+              <w:t>{</w:t>
+            </w:r>
+            <w:proofErr w:type="spellStart"/>
+            <w:r>
+              <w:rPr>
+                <w:rFonts w:ascii="BC Sans" w:hAnsi="BC Sans"/>
+                <w:b w:val="0"/>
+                <w:bCs w:val="0"/>
+                <w:caps w:val="0"/>
+                <w:sz w:val="20"/>
+                <w:szCs w:val="20"/>
+              </w:rPr>
+              <w:t>d.diaryDates</w:t>
+            </w:r>
+            <w:proofErr w:type="spellEnd"/>
+            <w:r>
+              <w:rPr>
+                <w:rFonts w:ascii="BC Sans" w:hAnsi="BC Sans"/>
+                <w:b w:val="0"/>
+                <w:bCs w:val="0"/>
+                <w:caps w:val="0"/>
+                <w:sz w:val="20"/>
+                <w:szCs w:val="20"/>
+              </w:rPr>
+              <w:t>[</w:t>
+            </w:r>
+            <w:proofErr w:type="spellStart"/>
+            <w:r>
+              <w:rPr>
+                <w:rFonts w:ascii="BC Sans" w:hAnsi="BC Sans"/>
+                <w:b w:val="0"/>
+                <w:bCs w:val="0"/>
+                <w:caps w:val="0"/>
+                <w:sz w:val="20"/>
+                <w:szCs w:val="20"/>
+              </w:rPr>
+              <w:t>i</w:t>
+            </w:r>
+            <w:proofErr w:type="spellEnd"/>
+            <w:r>
+              <w:rPr>
+                <w:rFonts w:ascii="BC Sans" w:hAnsi="BC Sans"/>
+                <w:b w:val="0"/>
+                <w:bCs w:val="0"/>
+                <w:caps w:val="0"/>
+                <w:sz w:val="20"/>
+                <w:szCs w:val="20"/>
+              </w:rPr>
+              <w:t>].</w:t>
+            </w:r>
+            <w:proofErr w:type="spellStart"/>
+            <w:r>
+              <w:rPr>
+                <w:rFonts w:ascii="BC Sans" w:hAnsi="BC Sans"/>
+                <w:b w:val="0"/>
+                <w:bCs w:val="0"/>
+                <w:caps w:val="0"/>
+                <w:sz w:val="20"/>
+                <w:szCs w:val="20"/>
+              </w:rPr>
+              <w:t>dueDate</w:t>
+            </w:r>
+            <w:proofErr w:type="spellEnd"/>
+            <w:r>
+              <w:rPr>
+                <w:rFonts w:ascii="BC Sans" w:hAnsi="BC Sans"/>
+                <w:b w:val="0"/>
+                <w:bCs w:val="0"/>
+                <w:caps w:val="0"/>
+                <w:sz w:val="20"/>
+                <w:szCs w:val="20"/>
+              </w:rPr>
+              <w:t>}</w:t>
             </w:r>
           </w:p>
         </w:tc>
@@ -1061,7 +1243,47 @@
                 <w:sz w:val="18"/>
                 <w:szCs w:val="18"/>
               </w:rPr>
-              <w:t>{d.diaryDates[i].description}</w:t>
+              <w:t>{</w:t>
+            </w:r>
+            <w:proofErr w:type="spellStart"/>
+            <w:r>
+              <w:rPr>
+                <w:rFonts w:ascii="BC Sans" w:eastAsia="Times New Roman" w:hAnsi="BC Sans" w:cs="Times New Roman"/>
+                <w:color w:val="000000" w:themeColor="text1"/>
+                <w:sz w:val="18"/>
+                <w:szCs w:val="18"/>
+              </w:rPr>
+              <w:t>d.diaryDates</w:t>
+            </w:r>
+            <w:proofErr w:type="spellEnd"/>
+            <w:r>
+              <w:rPr>
+                <w:rFonts w:ascii="BC Sans" w:eastAsia="Times New Roman" w:hAnsi="BC Sans" w:cs="Times New Roman"/>
+                <w:color w:val="000000" w:themeColor="text1"/>
+                <w:sz w:val="18"/>
+                <w:szCs w:val="18"/>
+              </w:rPr>
+              <w:t>[</w:t>
+            </w:r>
+            <w:proofErr w:type="spellStart"/>
+            <w:r>
+              <w:rPr>
+                <w:rFonts w:ascii="BC Sans" w:eastAsia="Times New Roman" w:hAnsi="BC Sans" w:cs="Times New Roman"/>
+                <w:color w:val="000000" w:themeColor="text1"/>
+                <w:sz w:val="18"/>
+                <w:szCs w:val="18"/>
+              </w:rPr>
+              <w:t>i</w:t>
+            </w:r>
+            <w:proofErr w:type="spellEnd"/>
+            <w:r>
+              <w:rPr>
+                <w:rFonts w:ascii="BC Sans" w:eastAsia="Times New Roman" w:hAnsi="BC Sans" w:cs="Times New Roman"/>
+                <w:color w:val="000000" w:themeColor="text1"/>
+                <w:sz w:val="18"/>
+                <w:szCs w:val="18"/>
+              </w:rPr>
+              <w:t>].description}</w:t>
             </w:r>
           </w:p>
         </w:tc>
@@ -1097,7 +1319,55 @@
                 <w:sz w:val="20"/>
                 <w:szCs w:val="20"/>
               </w:rPr>
-              <w:t>{d.diaryDates[i+1].dueDate}</w:t>
+              <w:t>{</w:t>
+            </w:r>
+            <w:proofErr w:type="spellStart"/>
+            <w:r>
+              <w:rPr>
+                <w:rFonts w:ascii="BC Sans" w:hAnsi="BC Sans"/>
+                <w:b w:val="0"/>
+                <w:bCs w:val="0"/>
+                <w:caps w:val="0"/>
+                <w:sz w:val="20"/>
+                <w:szCs w:val="20"/>
+              </w:rPr>
+              <w:t>d.diaryDates</w:t>
+            </w:r>
+            <w:proofErr w:type="spellEnd"/>
+            <w:r>
+              <w:rPr>
+                <w:rFonts w:ascii="BC Sans" w:hAnsi="BC Sans"/>
+                <w:b w:val="0"/>
+                <w:bCs w:val="0"/>
+                <w:caps w:val="0"/>
+                <w:sz w:val="20"/>
+                <w:szCs w:val="20"/>
+              </w:rPr>
+              <w:t>[i+1].</w:t>
+            </w:r>
+            <w:proofErr w:type="spellStart"/>
+            <w:r>
+              <w:rPr>
+                <w:rFonts w:ascii="BC Sans" w:hAnsi="BC Sans"/>
+                <w:b w:val="0"/>
+                <w:bCs w:val="0"/>
+                <w:caps w:val="0"/>
+                <w:sz w:val="20"/>
+                <w:szCs w:val="20"/>
+              </w:rPr>
+              <w:t>dueDate</w:t>
+            </w:r>
+            <w:proofErr w:type="spellEnd"/>
+            <w:r>
+              <w:rPr>
+                <w:rFonts w:ascii="BC Sans" w:hAnsi="BC Sans"/>
+                <w:b w:val="0"/>
+                <w:bCs w:val="0"/>
+                <w:caps w:val="0"/>
+                <w:sz w:val="20"/>
+                <w:szCs w:val="20"/>
+              </w:rPr>
+              <w:t>}</w:t>
             </w:r>
           </w:p>
         </w:tc>
@@ -1124,7 +1394,27 @@
                 <w:sz w:val="18"/>
                 <w:szCs w:val="18"/>
               </w:rPr>
-              <w:t>{d.diaryDates[i+1].description}</w:t>
+              <w:t>{</w:t>
+            </w:r>
+            <w:proofErr w:type="spellStart"/>
+            <w:r>
+              <w:rPr>
+                <w:rFonts w:ascii="BC Sans" w:eastAsia="Times New Roman" w:hAnsi="BC Sans" w:cs="Times New Roman"/>
+                <w:color w:val="000000" w:themeColor="text1"/>
+                <w:sz w:val="18"/>
+                <w:szCs w:val="18"/>
+              </w:rPr>
+              <w:t>d.diaryDates</w:t>
+            </w:r>
+            <w:proofErr w:type="spellEnd"/>
+            <w:r>
+              <w:rPr>
+                <w:rFonts w:ascii="BC Sans" w:eastAsia="Times New Roman" w:hAnsi="BC Sans" w:cs="Times New Roman"/>
+                <w:color w:val="000000" w:themeColor="text1"/>
+                <w:sz w:val="18"/>
+                <w:szCs w:val="18"/>
+              </w:rPr>
+              <w:t>[i+1].description}</w:t>
             </w:r>
           </w:p>
         </w:tc>
@@ -1321,7 +1611,79 @@
                 <w:sz w:val="20"/>
                 <w:szCs w:val="20"/>
               </w:rPr>
-              <w:t>{d.activityNotes[i].contentText}</w:t>
+              <w:t>{</w:t>
+            </w:r>
+            <w:proofErr w:type="spellStart"/>
+            <w:r>
+              <w:rPr>
+                <w:rFonts w:ascii="BC Sans" w:hAnsi="BC Sans"/>
+                <w:b w:val="0"/>
+                <w:bCs w:val="0"/>
+                <w:caps w:val="0"/>
+                <w:sz w:val="20"/>
+                <w:szCs w:val="20"/>
+              </w:rPr>
+              <w:t>d.activityNotes</w:t>
+            </w:r>
+            <w:proofErr w:type="spellEnd"/>
+            <w:r>
+              <w:rPr>
+                <w:rFonts w:ascii="BC Sans" w:hAnsi="BC Sans"/>
+                <w:b w:val="0"/>
+                <w:bCs w:val="0"/>
+                <w:caps w:val="0"/>
+                <w:sz w:val="20"/>
+                <w:szCs w:val="20"/>
+              </w:rPr>
+              <w:t>[</w:t>
+            </w:r>
+            <w:proofErr w:type="spellStart"/>
+            <w:r>
+              <w:rPr>
+                <w:rFonts w:ascii="BC Sans" w:hAnsi="BC Sans"/>
+                <w:b w:val="0"/>
+                <w:bCs w:val="0"/>
+                <w:caps w:val="0"/>
+                <w:sz w:val="20"/>
+                <w:szCs w:val="20"/>
+              </w:rPr>
+              <w:t>i</w:t>
+            </w:r>
+            <w:proofErr w:type="spellEnd"/>
+            <w:r>
+              <w:rPr>
+                <w:rFonts w:ascii="BC Sans" w:hAnsi="BC Sans"/>
+                <w:b w:val="0"/>
+                <w:bCs w:val="0"/>
+                <w:caps w:val="0"/>
+                <w:sz w:val="20"/>
+                <w:szCs w:val="20"/>
+              </w:rPr>
+              <w:t>].</w:t>
+            </w:r>
+            <w:proofErr w:type="spellStart"/>
+            <w:r>
+              <w:rPr>
+                <w:rFonts w:ascii="BC Sans" w:hAnsi="BC Sans"/>
+                <w:b w:val="0"/>
+                <w:bCs w:val="0"/>
+                <w:caps w:val="0"/>
+                <w:sz w:val="20"/>
+                <w:szCs w:val="20"/>
+              </w:rPr>
+              <w:t>contentText</w:t>
+            </w:r>
+            <w:proofErr w:type="spellEnd"/>
+            <w:r>
+              <w:rPr>
+                <w:rFonts w:ascii="BC Sans" w:hAnsi="BC Sans"/>
+                <w:b w:val="0"/>
+                <w:bCs w:val="0"/>
+                <w:caps w:val="0"/>
+                <w:sz w:val="20"/>
+                <w:szCs w:val="20"/>
+              </w:rPr>
+              <w:t>}</w:t>
             </w:r>
           </w:p>
         </w:tc>
@@ -1352,8 +1714,9 @@
                 <w:sz w:val="18"/>
                 <w:szCs w:val="18"/>
               </w:rPr>
-              <w:t>{d.activityNotes[i].actionedDate}</w:t>
-            </w:r>
+              <w:t>{</w:t>
+            </w:r>
+            <w:proofErr w:type="spellStart"/>
             <w:r>
               <w:rPr>
                 <w:rFonts w:ascii="BC Sans" w:eastAsia="Times New Roman" w:hAnsi="BC Sans" w:cs="Times New Roman"/>
@@ -1361,7 +1724,126 @@
                 <w:sz w:val="18"/>
                 <w:szCs w:val="18"/>
               </w:rPr>
-              <w:t xml:space="preserve"> {d.activityNotes[i].actionedTime}</w:t>
+              <w:t>d.activityNotes</w:t>
+            </w:r>
+            <w:proofErr w:type="spellEnd"/>
+            <w:r>
+              <w:rPr>
+                <w:rFonts w:ascii="BC Sans" w:eastAsia="Times New Roman" w:hAnsi="BC Sans" w:cs="Times New Roman"/>
+                <w:color w:val="000000" w:themeColor="text1"/>
+                <w:sz w:val="18"/>
+                <w:szCs w:val="18"/>
+              </w:rPr>
+              <w:t>[</w:t>
+            </w:r>
+            <w:proofErr w:type="spellStart"/>
+            <w:r>
+              <w:rPr>
+                <w:rFonts w:ascii="BC Sans" w:eastAsia="Times New Roman" w:hAnsi="BC Sans" w:cs="Times New Roman"/>
+                <w:color w:val="000000" w:themeColor="text1"/>
+                <w:sz w:val="18"/>
+                <w:szCs w:val="18"/>
+              </w:rPr>
+              <w:t>i</w:t>
+            </w:r>
+            <w:proofErr w:type="spellEnd"/>
+            <w:r>
+              <w:rPr>
+                <w:rFonts w:ascii="BC Sans" w:eastAsia="Times New Roman" w:hAnsi="BC Sans" w:cs="Times New Roman"/>
+                <w:color w:val="000000" w:themeColor="text1"/>
+                <w:sz w:val="18"/>
+                <w:szCs w:val="18"/>
+              </w:rPr>
+              <w:t>].</w:t>
+            </w:r>
+            <w:proofErr w:type="spellStart"/>
+            <w:r>
+              <w:rPr>
+                <w:rFonts w:ascii="BC Sans" w:eastAsia="Times New Roman" w:hAnsi="BC Sans" w:cs="Times New Roman"/>
+                <w:color w:val="000000" w:themeColor="text1"/>
+                <w:sz w:val="18"/>
+                <w:szCs w:val="18"/>
+              </w:rPr>
+              <w:t>actionedDate</w:t>
+            </w:r>
+            <w:proofErr w:type="spellEnd"/>
+            <w:r>
+              <w:rPr>
+                <w:rFonts w:ascii="BC Sans" w:eastAsia="Times New Roman" w:hAnsi="BC Sans" w:cs="Times New Roman"/>
+                <w:color w:val="000000" w:themeColor="text1"/>
+                <w:sz w:val="18"/>
+                <w:szCs w:val="18"/>
+              </w:rPr>
+              <w:t>}</w:t>
+            </w:r>
+            <w:r>
+              <w:rPr>
+                <w:rFonts w:ascii="BC Sans" w:eastAsia="Times New Roman" w:hAnsi="BC Sans" w:cs="Times New Roman"/>
+                <w:color w:val="000000" w:themeColor="text1"/>
+                <w:sz w:val="18"/>
+                <w:szCs w:val="18"/>
+              </w:rPr>
+              <w:t xml:space="preserve"> {</w:t>
+            </w:r>
+            <w:proofErr w:type="spellStart"/>
+            <w:r>
+              <w:rPr>
+                <w:rFonts w:ascii="BC Sans" w:eastAsia="Times New Roman" w:hAnsi="BC Sans" w:cs="Times New Roman"/>
+                <w:color w:val="000000" w:themeColor="text1"/>
+                <w:sz w:val="18"/>
+                <w:szCs w:val="18"/>
+              </w:rPr>
+              <w:t>d.activityNotes</w:t>
+            </w:r>
+            <w:proofErr w:type="spellEnd"/>
+            <w:r>
+              <w:rPr>
+                <w:rFonts w:ascii="BC Sans" w:eastAsia="Times New Roman" w:hAnsi="BC Sans" w:cs="Times New Roman"/>
+                <w:color w:val="000000" w:themeColor="text1"/>
+                <w:sz w:val="18"/>
+                <w:szCs w:val="18"/>
+              </w:rPr>
+              <w:t>[</w:t>
+            </w:r>
+            <w:proofErr w:type="spellStart"/>
+            <w:r>
+              <w:rPr>
+                <w:rFonts w:ascii="BC Sans" w:eastAsia="Times New Roman" w:hAnsi="BC Sans" w:cs="Times New Roman"/>
+                <w:color w:val="000000" w:themeColor="text1"/>
+                <w:sz w:val="18"/>
+                <w:szCs w:val="18"/>
+              </w:rPr>
+              <w:t>i</w:t>
+            </w:r>
+            <w:proofErr w:type="spellEnd"/>
+            <w:r>
+              <w:rPr>
+                <w:rFonts w:ascii="BC Sans" w:eastAsia="Times New Roman" w:hAnsi="BC Sans" w:cs="Times New Roman"/>
+                <w:color w:val="000000" w:themeColor="text1"/>
+                <w:sz w:val="18"/>
+                <w:szCs w:val="18"/>
+              </w:rPr>
+              <w:t>].</w:t>
+            </w:r>
+            <w:proofErr w:type="spellStart"/>
+            <w:r>
+              <w:rPr>
+                <w:rFonts w:ascii="BC Sans" w:eastAsia="Times New Roman" w:hAnsi="BC Sans" w:cs="Times New Roman"/>
+                <w:color w:val="000000" w:themeColor="text1"/>
+                <w:sz w:val="18"/>
+                <w:szCs w:val="18"/>
+              </w:rPr>
+              <w:t>actionedTime</w:t>
+            </w:r>
+            <w:proofErr w:type="spellEnd"/>
+            <w:r>
+              <w:rPr>
+                <w:rFonts w:ascii="BC Sans" w:eastAsia="Times New Roman" w:hAnsi="BC Sans" w:cs="Times New Roman"/>
+                <w:color w:val="000000" w:themeColor="text1"/>
+                <w:sz w:val="18"/>
+                <w:szCs w:val="18"/>
+              </w:rPr>
+              <w:t>}</w:t>
             </w:r>
           </w:p>
         </w:tc>
@@ -1389,7 +1871,47 @@
                 <w:sz w:val="18"/>
                 <w:szCs w:val="18"/>
               </w:rPr>
-              <w:t>{d.activityNotes[i].</w:t>
+              <w:t>{</w:t>
+            </w:r>
+            <w:proofErr w:type="spellStart"/>
+            <w:r>
+              <w:rPr>
+                <w:rFonts w:ascii="BC Sans" w:eastAsia="Times New Roman" w:hAnsi="BC Sans" w:cs="Times New Roman"/>
+                <w:color w:val="000000" w:themeColor="text1"/>
+                <w:sz w:val="18"/>
+                <w:szCs w:val="18"/>
+              </w:rPr>
+              <w:t>d.activityNotes</w:t>
+            </w:r>
+            <w:proofErr w:type="spellEnd"/>
+            <w:r>
+              <w:rPr>
+                <w:rFonts w:ascii="BC Sans" w:eastAsia="Times New Roman" w:hAnsi="BC Sans" w:cs="Times New Roman"/>
+                <w:color w:val="000000" w:themeColor="text1"/>
+                <w:sz w:val="18"/>
+                <w:szCs w:val="18"/>
+              </w:rPr>
+              <w:t>[</w:t>
+            </w:r>
+            <w:proofErr w:type="spellStart"/>
+            <w:r>
+              <w:rPr>
+                <w:rFonts w:ascii="BC Sans" w:eastAsia="Times New Roman" w:hAnsi="BC Sans" w:cs="Times New Roman"/>
+                <w:color w:val="000000" w:themeColor="text1"/>
+                <w:sz w:val="18"/>
+                <w:szCs w:val="18"/>
+              </w:rPr>
+              <w:t>i</w:t>
+            </w:r>
+            <w:proofErr w:type="spellEnd"/>
+            <w:r>
+              <w:rPr>
+                <w:rFonts w:ascii="BC Sans" w:eastAsia="Times New Roman" w:hAnsi="BC Sans" w:cs="Times New Roman"/>
+                <w:color w:val="000000" w:themeColor="text1"/>
+                <w:sz w:val="18"/>
+                <w:szCs w:val="18"/>
+              </w:rPr>
+              <w:t>].</w:t>
             </w:r>
             <w:r>
               <w:rPr>
@@ -1402,6 +1924,7 @@
               </w:rPr>
               <w:t xml:space="preserve"> </w:t>
             </w:r>
+            <w:proofErr w:type="spellStart"/>
             <w:r>
               <w:rPr>
                 <w:rFonts w:ascii="BC Sans" w:eastAsia="Times New Roman" w:hAnsi="BC Sans" w:cs="Times New Roman"/>
@@ -1418,7 +1941,57 @@
                 <w:sz w:val="18"/>
                 <w:szCs w:val="18"/>
               </w:rPr>
-              <w:t>.lastName}, {d.activityNotes[i].</w:t>
+              <w:t>.lastName</w:t>
+            </w:r>
+            <w:proofErr w:type="spellEnd"/>
+            <w:r>
+              <w:rPr>
+                <w:rFonts w:ascii="BC Sans" w:eastAsia="Times New Roman" w:hAnsi="BC Sans" w:cs="Times New Roman"/>
+                <w:color w:val="000000" w:themeColor="text1"/>
+                <w:sz w:val="18"/>
+                <w:szCs w:val="18"/>
+              </w:rPr>
+              <w:t>}, {</w:t>
+            </w:r>
+            <w:proofErr w:type="spellStart"/>
+            <w:r>
+              <w:rPr>
+                <w:rFonts w:ascii="BC Sans" w:eastAsia="Times New Roman" w:hAnsi="BC Sans" w:cs="Times New Roman"/>
+                <w:color w:val="000000" w:themeColor="text1"/>
+                <w:sz w:val="18"/>
+                <w:szCs w:val="18"/>
+              </w:rPr>
+              <w:t>d.activityNotes</w:t>
+            </w:r>
+            <w:proofErr w:type="spellEnd"/>
+            <w:r>
+              <w:rPr>
+                <w:rFonts w:ascii="BC Sans" w:eastAsia="Times New Roman" w:hAnsi="BC Sans" w:cs="Times New Roman"/>
+                <w:color w:val="000000" w:themeColor="text1"/>
+                <w:sz w:val="18"/>
+                <w:szCs w:val="18"/>
+              </w:rPr>
+              <w:t>[</w:t>
+            </w:r>
+            <w:proofErr w:type="spellStart"/>
+            <w:r>
+              <w:rPr>
+                <w:rFonts w:ascii="BC Sans" w:eastAsia="Times New Roman" w:hAnsi="BC Sans" w:cs="Times New Roman"/>
+                <w:color w:val="000000" w:themeColor="text1"/>
+                <w:sz w:val="18"/>
+                <w:szCs w:val="18"/>
+              </w:rPr>
+              <w:t>i</w:t>
+            </w:r>
+            <w:proofErr w:type="spellEnd"/>
+            <w:r>
+              <w:rPr>
+                <w:rFonts w:ascii="BC Sans" w:eastAsia="Times New Roman" w:hAnsi="BC Sans" w:cs="Times New Roman"/>
+                <w:color w:val="000000" w:themeColor="text1"/>
+                <w:sz w:val="18"/>
+                <w:szCs w:val="18"/>
+              </w:rPr>
+              <w:t>].</w:t>
             </w:r>
             <w:r>
               <w:rPr>
@@ -1431,6 +2004,7 @@
               </w:rPr>
               <w:t xml:space="preserve"> </w:t>
             </w:r>
+            <w:proofErr w:type="spellStart"/>
             <w:r>
               <w:rPr>
                 <w:rFonts w:ascii="BC Sans" w:eastAsia="Times New Roman" w:hAnsi="BC Sans" w:cs="Times New Roman"/>
@@ -1447,7 +2021,17 @@
                 <w:sz w:val="18"/>
                 <w:szCs w:val="18"/>
               </w:rPr>
-              <w:t>.firstName}</w:t>
+              <w:t>.firstName</w:t>
+            </w:r>
+            <w:proofErr w:type="spellEnd"/>
+            <w:r>
+              <w:rPr>
+                <w:rFonts w:ascii="BC Sans" w:eastAsia="Times New Roman" w:hAnsi="BC Sans" w:cs="Times New Roman"/>
+                <w:color w:val="000000" w:themeColor="text1"/>
+                <w:sz w:val="18"/>
+                <w:szCs w:val="18"/>
+              </w:rPr>
+              <w:t>}</w:t>
             </w:r>
           </w:p>
         </w:tc>
@@ -1483,7 +2067,55 @@
                 <w:sz w:val="20"/>
                 <w:szCs w:val="20"/>
               </w:rPr>
-              <w:t>{d.activityNotes[i+1].contentText}</w:t>
+              <w:t>{</w:t>
+            </w:r>
+            <w:proofErr w:type="spellStart"/>
+            <w:r>
+              <w:rPr>
+                <w:rFonts w:ascii="BC Sans" w:hAnsi="BC Sans"/>
+                <w:b w:val="0"/>
+                <w:bCs w:val="0"/>
+                <w:caps w:val="0"/>
+                <w:sz w:val="20"/>
+                <w:szCs w:val="20"/>
+              </w:rPr>
+              <w:t>d.activityNotes</w:t>
+            </w:r>
+            <w:proofErr w:type="spellEnd"/>
+            <w:r>
+              <w:rPr>
+                <w:rFonts w:ascii="BC Sans" w:hAnsi="BC Sans"/>
+                <w:b w:val="0"/>
+                <w:bCs w:val="0"/>
+                <w:caps w:val="0"/>
+                <w:sz w:val="20"/>
+                <w:szCs w:val="20"/>
+              </w:rPr>
+              <w:t>[i+1].</w:t>
+            </w:r>
+            <w:proofErr w:type="spellStart"/>
+            <w:r>
+              <w:rPr>
+                <w:rFonts w:ascii="BC Sans" w:hAnsi="BC Sans"/>
+                <w:b w:val="0"/>
+                <w:bCs w:val="0"/>
+                <w:caps w:val="0"/>
+                <w:sz w:val="20"/>
+                <w:szCs w:val="20"/>
+              </w:rPr>
+              <w:t>contentText</w:t>
+            </w:r>
+            <w:proofErr w:type="spellEnd"/>
+            <w:r>
+              <w:rPr>
+                <w:rFonts w:ascii="BC Sans" w:hAnsi="BC Sans"/>
+                <w:b w:val="0"/>
+                <w:bCs w:val="0"/>
+                <w:caps w:val="0"/>
+                <w:sz w:val="20"/>
+                <w:szCs w:val="20"/>
+              </w:rPr>
+              <w:t>}</w:t>
             </w:r>
           </w:p>
         </w:tc>
@@ -1513,8 +2145,9 @@
                 <w:sz w:val="18"/>
                 <w:szCs w:val="18"/>
               </w:rPr>
-              <w:t>{d.activityNotes[i+1].actionedDate}</w:t>
-            </w:r>
+              <w:t>{</w:t>
+            </w:r>
+            <w:proofErr w:type="spellStart"/>
             <w:r>
               <w:rPr>
                 <w:rFonts w:ascii="BC Sans" w:eastAsia="Times New Roman" w:hAnsi="BC Sans" w:cs="Times New Roman"/>
@@ -1522,7 +2155,86 @@
                 <w:sz w:val="18"/>
                 <w:szCs w:val="18"/>
               </w:rPr>
-              <w:t xml:space="preserve"> {d.activityNotes[i+1].actionedTime}</w:t>
+              <w:t>d.activityNotes</w:t>
+            </w:r>
+            <w:proofErr w:type="spellEnd"/>
+            <w:r>
+              <w:rPr>
+                <w:rFonts w:ascii="BC Sans" w:eastAsia="Times New Roman" w:hAnsi="BC Sans" w:cs="Times New Roman"/>
+                <w:color w:val="000000" w:themeColor="text1"/>
+                <w:sz w:val="18"/>
+                <w:szCs w:val="18"/>
+              </w:rPr>
+              <w:t>[i+1].</w:t>
+            </w:r>
+            <w:proofErr w:type="spellStart"/>
+            <w:r>
+              <w:rPr>
+                <w:rFonts w:ascii="BC Sans" w:eastAsia="Times New Roman" w:hAnsi="BC Sans" w:cs="Times New Roman"/>
+                <w:color w:val="000000" w:themeColor="text1"/>
+                <w:sz w:val="18"/>
+                <w:szCs w:val="18"/>
+              </w:rPr>
+              <w:t>actionedDate</w:t>
+            </w:r>
+            <w:proofErr w:type="spellEnd"/>
+            <w:r>
+              <w:rPr>
+                <w:rFonts w:ascii="BC Sans" w:eastAsia="Times New Roman" w:hAnsi="BC Sans" w:cs="Times New Roman"/>
+                <w:color w:val="000000" w:themeColor="text1"/>
+                <w:sz w:val="18"/>
+                <w:szCs w:val="18"/>
+              </w:rPr>
+              <w:t>}</w:t>
+            </w:r>
+            <w:r>
+              <w:rPr>
+                <w:rFonts w:ascii="BC Sans" w:eastAsia="Times New Roman" w:hAnsi="BC Sans" w:cs="Times New Roman"/>
+                <w:color w:val="000000" w:themeColor="text1"/>
+                <w:sz w:val="18"/>
+                <w:szCs w:val="18"/>
+              </w:rPr>
+              <w:t xml:space="preserve"> {</w:t>
+            </w:r>
+            <w:proofErr w:type="spellStart"/>
+            <w:r>
+              <w:rPr>
+                <w:rFonts w:ascii="BC Sans" w:eastAsia="Times New Roman" w:hAnsi="BC Sans" w:cs="Times New Roman"/>
+                <w:color w:val="000000" w:themeColor="text1"/>
+                <w:sz w:val="18"/>
+                <w:szCs w:val="18"/>
+              </w:rPr>
+              <w:t>d.activityNotes</w:t>
+            </w:r>
+            <w:proofErr w:type="spellEnd"/>
+            <w:r>
+              <w:rPr>
+                <w:rFonts w:ascii="BC Sans" w:eastAsia="Times New Roman" w:hAnsi="BC Sans" w:cs="Times New Roman"/>
+                <w:color w:val="000000" w:themeColor="text1"/>
+                <w:sz w:val="18"/>
+                <w:szCs w:val="18"/>
+              </w:rPr>
+              <w:t>[i+1].</w:t>
+            </w:r>
+            <w:proofErr w:type="spellStart"/>
+            <w:r>
+              <w:rPr>
+                <w:rFonts w:ascii="BC Sans" w:eastAsia="Times New Roman" w:hAnsi="BC Sans" w:cs="Times New Roman"/>
+                <w:color w:val="000000" w:themeColor="text1"/>
+                <w:sz w:val="18"/>
+                <w:szCs w:val="18"/>
+              </w:rPr>
+              <w:t>actionedTime</w:t>
+            </w:r>
+            <w:proofErr w:type="spellEnd"/>
+            <w:r>
+              <w:rPr>
+                <w:rFonts w:ascii="BC Sans" w:eastAsia="Times New Roman" w:hAnsi="BC Sans" w:cs="Times New Roman"/>
+                <w:color w:val="000000" w:themeColor="text1"/>
+                <w:sz w:val="18"/>
+                <w:szCs w:val="18"/>
+              </w:rPr>
+              <w:t>}</w:t>
             </w:r>
           </w:p>
         </w:tc>
@@ -1550,7 +2262,27 @@
                 <w:sz w:val="18"/>
                 <w:szCs w:val="18"/>
               </w:rPr>
-              <w:t>{d.activityNotes[i+1].</w:t>
+              <w:t>{</w:t>
+            </w:r>
+            <w:proofErr w:type="spellStart"/>
+            <w:r>
+              <w:rPr>
+                <w:rFonts w:ascii="BC Sans" w:eastAsia="Times New Roman" w:hAnsi="BC Sans" w:cs="Times New Roman"/>
+                <w:color w:val="000000" w:themeColor="text1"/>
+                <w:sz w:val="18"/>
+                <w:szCs w:val="18"/>
+              </w:rPr>
+              <w:t>d.activityNotes</w:t>
+            </w:r>
+            <w:proofErr w:type="spellEnd"/>
+            <w:r>
+              <w:rPr>
+                <w:rFonts w:ascii="BC Sans" w:eastAsia="Times New Roman" w:hAnsi="BC Sans" w:cs="Times New Roman"/>
+                <w:color w:val="000000" w:themeColor="text1"/>
+                <w:sz w:val="18"/>
+                <w:szCs w:val="18"/>
+              </w:rPr>
+              <w:t>[i+1].</w:t>
             </w:r>
             <w:r>
               <w:rPr>
@@ -1563,6 +2295,7 @@
               </w:rPr>
               <w:t xml:space="preserve"> </w:t>
             </w:r>
+            <w:proofErr w:type="spellStart"/>
             <w:r>
               <w:rPr>
                 <w:rFonts w:ascii="BC Sans" w:eastAsia="Times New Roman" w:hAnsi="BC Sans" w:cs="Times New Roman"/>
@@ -1579,7 +2312,37 @@
                 <w:sz w:val="18"/>
                 <w:szCs w:val="18"/>
               </w:rPr>
-              <w:t>.lastName}, {d.activityNotes[i+1].</w:t>
+              <w:t>.lastName</w:t>
+            </w:r>
+            <w:proofErr w:type="spellEnd"/>
+            <w:r>
+              <w:rPr>
+                <w:rFonts w:ascii="BC Sans" w:eastAsia="Times New Roman" w:hAnsi="BC Sans" w:cs="Times New Roman"/>
+                <w:color w:val="000000" w:themeColor="text1"/>
+                <w:sz w:val="18"/>
+                <w:szCs w:val="18"/>
+              </w:rPr>
+              <w:t>}, {</w:t>
+            </w:r>
+            <w:proofErr w:type="spellStart"/>
+            <w:r>
+              <w:rPr>
+                <w:rFonts w:ascii="BC Sans" w:eastAsia="Times New Roman" w:hAnsi="BC Sans" w:cs="Times New Roman"/>
+                <w:color w:val="000000" w:themeColor="text1"/>
+                <w:sz w:val="18"/>
+                <w:szCs w:val="18"/>
+              </w:rPr>
+              <w:t>d.activityNotes</w:t>
+            </w:r>
+            <w:proofErr w:type="spellEnd"/>
+            <w:r>
+              <w:rPr>
+                <w:rFonts w:ascii="BC Sans" w:eastAsia="Times New Roman" w:hAnsi="BC Sans" w:cs="Times New Roman"/>
+                <w:color w:val="000000" w:themeColor="text1"/>
+                <w:sz w:val="18"/>
+                <w:szCs w:val="18"/>
+              </w:rPr>
+              <w:t>[i+1].</w:t>
             </w:r>
             <w:r>
               <w:rPr>
@@ -1592,6 +2355,7 @@
               </w:rPr>
               <w:t xml:space="preserve"> </w:t>
             </w:r>
+            <w:proofErr w:type="spellStart"/>
             <w:r>
               <w:rPr>
                 <w:rFonts w:ascii="BC Sans" w:eastAsia="Times New Roman" w:hAnsi="BC Sans" w:cs="Times New Roman"/>
@@ -1608,7 +2372,17 @@
                 <w:sz w:val="18"/>
                 <w:szCs w:val="18"/>
               </w:rPr>
-              <w:t>.firstName}</w:t>
+              <w:t>.firstName</w:t>
+            </w:r>
+            <w:proofErr w:type="spellEnd"/>
+            <w:r>
+              <w:rPr>
+                <w:rFonts w:ascii="BC Sans" w:eastAsia="Times New Roman" w:hAnsi="BC Sans" w:cs="Times New Roman"/>
+                <w:color w:val="000000" w:themeColor="text1"/>
+                <w:sz w:val="18"/>
+                <w:szCs w:val="18"/>
+              </w:rPr>
+              <w:t>}</w:t>
             </w:r>
           </w:p>
         </w:tc>
@@ -1629,7 +2403,16 @@
           <w:sz w:val="20"/>
           <w:szCs w:val="20"/>
         </w:rPr>
-        <w:t>{d.</w:t>
+        <w:t>{</w:t>
+      </w:r>
+      <w:proofErr w:type="spellStart"/>
+      <w:r>
+        <w:rPr>
+          <w:rFonts w:ascii="BC Sans" w:hAnsi="BC Sans"/>
+          <w:sz w:val="20"/>
+          <w:szCs w:val="20"/>
+        </w:rPr>
+        <w:t>d.</w:t>
       </w:r>
       <w:r>
         <w:rPr>
@@ -1645,7 +2428,16 @@
           <w:sz w:val="20"/>
           <w:szCs w:val="20"/>
         </w:rPr>
-        <w:t>:showEnd}</w:t>
+        <w:t>:showEnd</w:t>
+      </w:r>
+      <w:proofErr w:type="spellEnd"/>
+      <w:r>
+        <w:rPr>
+          <w:rFonts w:ascii="BC Sans" w:hAnsi="BC Sans"/>
+          <w:sz w:val="20"/>
+          <w:szCs w:val="20"/>
+        </w:rPr>
+        <w:t>}</w:t>
       </w:r>
     </w:p>
     <w:tbl>
@@ -1789,7 +2581,67 @@
                 <w:szCs w:val="20"/>
                 <w:lang w:val="en-CA"/>
               </w:rPr>
-              <w:t>{d.exhibits[i].propertyType}</w:t>
+              <w:t>{</w:t>
+            </w:r>
+            <w:proofErr w:type="spellStart"/>
+            <w:r>
+              <w:rPr>
+                <w:rFonts w:ascii="BC Sans" w:hAnsi="BC Sans"/>
+                <w:sz w:val="20"/>
+                <w:szCs w:val="20"/>
+                <w:lang w:val="en-CA"/>
+              </w:rPr>
+              <w:t>d.exhibits</w:t>
+            </w:r>
+            <w:proofErr w:type="spellEnd"/>
+            <w:r>
+              <w:rPr>
+                <w:rFonts w:ascii="BC Sans" w:hAnsi="BC Sans"/>
+                <w:sz w:val="20"/>
+                <w:szCs w:val="20"/>
+                <w:lang w:val="en-CA"/>
+              </w:rPr>
+              <w:t>[</w:t>
+            </w:r>
+            <w:proofErr w:type="spellStart"/>
+            <w:r>
+              <w:rPr>
+                <w:rFonts w:ascii="BC Sans" w:hAnsi="BC Sans"/>
+                <w:sz w:val="20"/>
+                <w:szCs w:val="20"/>
+                <w:lang w:val="en-CA"/>
+              </w:rPr>
+              <w:t>i</w:t>
+            </w:r>
+            <w:proofErr w:type="spellEnd"/>
+            <w:r>
+              <w:rPr>
+                <w:rFonts w:ascii="BC Sans" w:hAnsi="BC Sans"/>
+                <w:sz w:val="20"/>
+                <w:szCs w:val="20"/>
+                <w:lang w:val="en-CA"/>
+              </w:rPr>
+              <w:t>].</w:t>
+            </w:r>
+            <w:proofErr w:type="spellStart"/>
+            <w:r>
+              <w:rPr>
+                <w:rFonts w:ascii="BC Sans" w:hAnsi="BC Sans"/>
+                <w:sz w:val="20"/>
+                <w:szCs w:val="20"/>
+                <w:lang w:val="en-CA"/>
+              </w:rPr>
+              <w:t>propertyType</w:t>
+            </w:r>
+            <w:proofErr w:type="spellEnd"/>
+            <w:r>
+              <w:rPr>
+                <w:rFonts w:ascii="BC Sans" w:hAnsi="BC Sans"/>
+                <w:sz w:val="20"/>
+                <w:szCs w:val="20"/>
+                <w:lang w:val="en-CA"/>
+              </w:rPr>
+              <w:t>}</w:t>
             </w:r>
           </w:p>
         </w:tc>
@@ -1858,7 +2710,47 @@
                 <w:szCs w:val="20"/>
                 <w:lang w:val="en-CA"/>
               </w:rPr>
-              <w:t>{d.exhibits[i].description}</w:t>
+              <w:t>{</w:t>
+            </w:r>
+            <w:proofErr w:type="spellStart"/>
+            <w:r>
+              <w:rPr>
+                <w:rFonts w:ascii="BC Sans" w:hAnsi="BC Sans"/>
+                <w:sz w:val="20"/>
+                <w:szCs w:val="20"/>
+                <w:lang w:val="en-CA"/>
+              </w:rPr>
+              <w:t>d.exhibits</w:t>
+            </w:r>
+            <w:proofErr w:type="spellEnd"/>
+            <w:r>
+              <w:rPr>
+                <w:rFonts w:ascii="BC Sans" w:hAnsi="BC Sans"/>
+                <w:sz w:val="20"/>
+                <w:szCs w:val="20"/>
+                <w:lang w:val="en-CA"/>
+              </w:rPr>
+              <w:t>[</w:t>
+            </w:r>
+            <w:proofErr w:type="spellStart"/>
+            <w:r>
+              <w:rPr>
+                <w:rFonts w:ascii="BC Sans" w:hAnsi="BC Sans"/>
+                <w:sz w:val="20"/>
+                <w:szCs w:val="20"/>
+                <w:lang w:val="en-CA"/>
+              </w:rPr>
+              <w:t>i</w:t>
+            </w:r>
+            <w:proofErr w:type="spellEnd"/>
+            <w:r>
+              <w:rPr>
+                <w:rFonts w:ascii="BC Sans" w:hAnsi="BC Sans"/>
+                <w:sz w:val="20"/>
+                <w:szCs w:val="20"/>
+                <w:lang w:val="en-CA"/>
+              </w:rPr>
+              <w:t>].description}</w:t>
             </w:r>
           </w:p>
         </w:tc>
@@ -1927,7 +2819,47 @@
                 <w:szCs w:val="20"/>
                 <w:lang w:val="en-CA"/>
               </w:rPr>
-              <w:t>{d.exhibits[i].quantity}</w:t>
+              <w:t>{</w:t>
+            </w:r>
+            <w:proofErr w:type="spellStart"/>
+            <w:r>
+              <w:rPr>
+                <w:rFonts w:ascii="BC Sans" w:hAnsi="BC Sans"/>
+                <w:sz w:val="20"/>
+                <w:szCs w:val="20"/>
+                <w:lang w:val="en-CA"/>
+              </w:rPr>
+              <w:t>d.exhibits</w:t>
+            </w:r>
+            <w:proofErr w:type="spellEnd"/>
+            <w:r>
+              <w:rPr>
+                <w:rFonts w:ascii="BC Sans" w:hAnsi="BC Sans"/>
+                <w:sz w:val="20"/>
+                <w:szCs w:val="20"/>
+                <w:lang w:val="en-CA"/>
+              </w:rPr>
+              <w:t>[</w:t>
+            </w:r>
+            <w:proofErr w:type="spellStart"/>
+            <w:r>
+              <w:rPr>
+                <w:rFonts w:ascii="BC Sans" w:hAnsi="BC Sans"/>
+                <w:sz w:val="20"/>
+                <w:szCs w:val="20"/>
+                <w:lang w:val="en-CA"/>
+              </w:rPr>
+              <w:t>i</w:t>
+            </w:r>
+            <w:proofErr w:type="spellEnd"/>
+            <w:r>
+              <w:rPr>
+                <w:rFonts w:ascii="BC Sans" w:hAnsi="BC Sans"/>
+                <w:sz w:val="20"/>
+                <w:szCs w:val="20"/>
+                <w:lang w:val="en-CA"/>
+              </w:rPr>
+              <w:t>].quantity}</w:t>
             </w:r>
           </w:p>
         </w:tc>
@@ -1996,7 +2928,127 @@
                 <w:szCs w:val="20"/>
                 <w:lang w:val="en-CA"/>
               </w:rPr>
-              <w:t>{d.exhibits[i].collectedBy.lastName}, {d.exhibits[i].collectedBy.firstName}</w:t>
+              <w:t>{</w:t>
+            </w:r>
+            <w:proofErr w:type="spellStart"/>
+            <w:r>
+              <w:rPr>
+                <w:rFonts w:ascii="BC Sans" w:hAnsi="BC Sans"/>
+                <w:sz w:val="20"/>
+                <w:szCs w:val="20"/>
+                <w:lang w:val="en-CA"/>
+              </w:rPr>
+              <w:t>d.exhibits</w:t>
+            </w:r>
+            <w:proofErr w:type="spellEnd"/>
+            <w:r>
+              <w:rPr>
+                <w:rFonts w:ascii="BC Sans" w:hAnsi="BC Sans"/>
+                <w:sz w:val="20"/>
+                <w:szCs w:val="20"/>
+                <w:lang w:val="en-CA"/>
+              </w:rPr>
+              <w:t>[</w:t>
+            </w:r>
+            <w:proofErr w:type="spellStart"/>
+            <w:r>
+              <w:rPr>
+                <w:rFonts w:ascii="BC Sans" w:hAnsi="BC Sans"/>
+                <w:sz w:val="20"/>
+                <w:szCs w:val="20"/>
+                <w:lang w:val="en-CA"/>
+              </w:rPr>
+              <w:t>i</w:t>
+            </w:r>
+            <w:proofErr w:type="spellEnd"/>
+            <w:r>
+              <w:rPr>
+                <w:rFonts w:ascii="BC Sans" w:hAnsi="BC Sans"/>
+                <w:sz w:val="20"/>
+                <w:szCs w:val="20"/>
+                <w:lang w:val="en-CA"/>
+              </w:rPr>
+              <w:t>].</w:t>
+            </w:r>
+            <w:proofErr w:type="spellStart"/>
+            <w:r>
+              <w:rPr>
+                <w:rFonts w:ascii="BC Sans" w:hAnsi="BC Sans"/>
+                <w:sz w:val="20"/>
+                <w:szCs w:val="20"/>
+                <w:lang w:val="en-CA"/>
+              </w:rPr>
+              <w:t>collectedBy.lastName</w:t>
+            </w:r>
+            <w:proofErr w:type="spellEnd"/>
+            <w:r>
+              <w:rPr>
+                <w:rFonts w:ascii="BC Sans" w:hAnsi="BC Sans"/>
+                <w:sz w:val="20"/>
+                <w:szCs w:val="20"/>
+                <w:lang w:val="en-CA"/>
+              </w:rPr>
+              <w:t>}, {</w:t>
+            </w:r>
+            <w:proofErr w:type="spellStart"/>
+            <w:r>
+              <w:rPr>
+                <w:rFonts w:ascii="BC Sans" w:hAnsi="BC Sans"/>
+                <w:sz w:val="20"/>
+                <w:szCs w:val="20"/>
+                <w:lang w:val="en-CA"/>
+              </w:rPr>
+              <w:t>d.exhibits</w:t>
+            </w:r>
+            <w:proofErr w:type="spellEnd"/>
+            <w:r>
+              <w:rPr>
+                <w:rFonts w:ascii="BC Sans" w:hAnsi="BC Sans"/>
+                <w:sz w:val="20"/>
+                <w:szCs w:val="20"/>
+                <w:lang w:val="en-CA"/>
+              </w:rPr>
+              <w:t>[</w:t>
+            </w:r>
+            <w:proofErr w:type="spellStart"/>
+            <w:r>
+              <w:rPr>
+                <w:rFonts w:ascii="BC Sans" w:hAnsi="BC Sans"/>
+                <w:sz w:val="20"/>
+                <w:szCs w:val="20"/>
+                <w:lang w:val="en-CA"/>
+              </w:rPr>
+              <w:t>i</w:t>
+            </w:r>
+            <w:proofErr w:type="spellEnd"/>
+            <w:r>
+              <w:rPr>
+                <w:rFonts w:ascii="BC Sans" w:hAnsi="BC Sans"/>
+                <w:sz w:val="20"/>
+                <w:szCs w:val="20"/>
+                <w:lang w:val="en-CA"/>
+              </w:rPr>
+              <w:t>].</w:t>
+            </w:r>
+            <w:proofErr w:type="spellStart"/>
+            <w:r>
+              <w:rPr>
+                <w:rFonts w:ascii="BC Sans" w:hAnsi="BC Sans"/>
+                <w:sz w:val="20"/>
+                <w:szCs w:val="20"/>
+                <w:lang w:val="en-CA"/>
+              </w:rPr>
+              <w:t>collectedBy.firstName</w:t>
+            </w:r>
+            <w:proofErr w:type="spellEnd"/>
+            <w:r>
+              <w:rPr>
+                <w:rFonts w:ascii="BC Sans" w:hAnsi="BC Sans"/>
+                <w:sz w:val="20"/>
+                <w:szCs w:val="20"/>
+                <w:lang w:val="en-CA"/>
+              </w:rPr>
+              <w:t>}</w:t>
             </w:r>
           </w:p>
         </w:tc>
@@ -2065,16 +3117,136 @@
                 <w:szCs w:val="20"/>
                 <w:lang w:val="en-CA"/>
               </w:rPr>
-              <w:t>{d.exhibits[i].dateCollected}</w:t>
-            </w:r>
-            <w:r>
-              <w:rPr>
-                <w:rFonts w:ascii="BC Sans" w:hAnsi="BC Sans"/>
-                <w:sz w:val="20"/>
-                <w:szCs w:val="20"/>
-                <w:lang w:val="en-CA"/>
-              </w:rPr>
-              <w:t xml:space="preserve"> {d.exhibits[i].intakeTime }</w:t>
+              <w:t>{</w:t>
+            </w:r>
+            <w:proofErr w:type="spellStart"/>
+            <w:r>
+              <w:rPr>
+                <w:rFonts w:ascii="BC Sans" w:hAnsi="BC Sans"/>
+                <w:sz w:val="20"/>
+                <w:szCs w:val="20"/>
+                <w:lang w:val="en-CA"/>
+              </w:rPr>
+              <w:t>d.exhibits</w:t>
+            </w:r>
+            <w:proofErr w:type="spellEnd"/>
+            <w:r>
+              <w:rPr>
+                <w:rFonts w:ascii="BC Sans" w:hAnsi="BC Sans"/>
+                <w:sz w:val="20"/>
+                <w:szCs w:val="20"/>
+                <w:lang w:val="en-CA"/>
+              </w:rPr>
+              <w:t>[</w:t>
+            </w:r>
+            <w:proofErr w:type="spellStart"/>
+            <w:r>
+              <w:rPr>
+                <w:rFonts w:ascii="BC Sans" w:hAnsi="BC Sans"/>
+                <w:sz w:val="20"/>
+                <w:szCs w:val="20"/>
+                <w:lang w:val="en-CA"/>
+              </w:rPr>
+              <w:t>i</w:t>
+            </w:r>
+            <w:proofErr w:type="spellEnd"/>
+            <w:r>
+              <w:rPr>
+                <w:rFonts w:ascii="BC Sans" w:hAnsi="BC Sans"/>
+                <w:sz w:val="20"/>
+                <w:szCs w:val="20"/>
+                <w:lang w:val="en-CA"/>
+              </w:rPr>
+              <w:t>].</w:t>
+            </w:r>
+            <w:proofErr w:type="spellStart"/>
+            <w:r>
+              <w:rPr>
+                <w:rFonts w:ascii="BC Sans" w:hAnsi="BC Sans"/>
+                <w:sz w:val="20"/>
+                <w:szCs w:val="20"/>
+                <w:lang w:val="en-CA"/>
+              </w:rPr>
+              <w:t>dateCollected</w:t>
+            </w:r>
+            <w:proofErr w:type="spellEnd"/>
+            <w:r>
+              <w:rPr>
+                <w:rFonts w:ascii="BC Sans" w:hAnsi="BC Sans"/>
+                <w:sz w:val="20"/>
+                <w:szCs w:val="20"/>
+                <w:lang w:val="en-CA"/>
+              </w:rPr>
+              <w:t>}</w:t>
+            </w:r>
+            <w:r>
+              <w:rPr>
+                <w:rFonts w:ascii="BC Sans" w:hAnsi="BC Sans"/>
+                <w:sz w:val="20"/>
+                <w:szCs w:val="20"/>
+                <w:lang w:val="en-CA"/>
+              </w:rPr>
+              <w:t xml:space="preserve"> {</w:t>
+            </w:r>
+            <w:proofErr w:type="spellStart"/>
+            <w:r>
+              <w:rPr>
+                <w:rFonts w:ascii="BC Sans" w:hAnsi="BC Sans"/>
+                <w:sz w:val="20"/>
+                <w:szCs w:val="20"/>
+                <w:lang w:val="en-CA"/>
+              </w:rPr>
+              <w:t>d.exhibits</w:t>
+            </w:r>
+            <w:proofErr w:type="spellEnd"/>
+            <w:r>
+              <w:rPr>
+                <w:rFonts w:ascii="BC Sans" w:hAnsi="BC Sans"/>
+                <w:sz w:val="20"/>
+                <w:szCs w:val="20"/>
+                <w:lang w:val="en-CA"/>
+              </w:rPr>
+              <w:t>[</w:t>
+            </w:r>
+            <w:proofErr w:type="spellStart"/>
+            <w:r>
+              <w:rPr>
+                <w:rFonts w:ascii="BC Sans" w:hAnsi="BC Sans"/>
+                <w:sz w:val="20"/>
+                <w:szCs w:val="20"/>
+                <w:lang w:val="en-CA"/>
+              </w:rPr>
+              <w:t>i</w:t>
+            </w:r>
+            <w:proofErr w:type="spellEnd"/>
+            <w:r>
+              <w:rPr>
+                <w:rFonts w:ascii="BC Sans" w:hAnsi="BC Sans"/>
+                <w:sz w:val="20"/>
+                <w:szCs w:val="20"/>
+                <w:lang w:val="en-CA"/>
+              </w:rPr>
+              <w:t>].</w:t>
+            </w:r>
+            <w:proofErr w:type="spellStart"/>
+            <w:r>
+              <w:rPr>
+                <w:rFonts w:ascii="BC Sans" w:hAnsi="BC Sans"/>
+                <w:sz w:val="20"/>
+                <w:szCs w:val="20"/>
+                <w:lang w:val="en-CA"/>
+              </w:rPr>
+              <w:t>intakeTime</w:t>
+            </w:r>
+            <w:proofErr w:type="spellEnd"/>
+            <w:r>
+              <w:rPr>
+                <w:rFonts w:ascii="BC Sans" w:hAnsi="BC Sans"/>
+                <w:sz w:val="20"/>
+                <w:szCs w:val="20"/>
+                <w:lang w:val="en-CA"/>
+              </w:rPr>
+              <w:t xml:space="preserve"> }</w:t>
             </w:r>
           </w:p>
         </w:tc>
@@ -2143,7 +3315,67 @@
                 <w:szCs w:val="20"/>
                 <w:lang w:val="en-CA"/>
               </w:rPr>
-              <w:t>{d.exhibits[i].locationOfIntake}</w:t>
+              <w:t>{</w:t>
+            </w:r>
+            <w:proofErr w:type="spellStart"/>
+            <w:r>
+              <w:rPr>
+                <w:rFonts w:ascii="BC Sans" w:hAnsi="BC Sans"/>
+                <w:sz w:val="20"/>
+                <w:szCs w:val="20"/>
+                <w:lang w:val="en-CA"/>
+              </w:rPr>
+              <w:t>d.exhibits</w:t>
+            </w:r>
+            <w:proofErr w:type="spellEnd"/>
+            <w:r>
+              <w:rPr>
+                <w:rFonts w:ascii="BC Sans" w:hAnsi="BC Sans"/>
+                <w:sz w:val="20"/>
+                <w:szCs w:val="20"/>
+                <w:lang w:val="en-CA"/>
+              </w:rPr>
+              <w:t>[</w:t>
+            </w:r>
+            <w:proofErr w:type="spellStart"/>
+            <w:r>
+              <w:rPr>
+                <w:rFonts w:ascii="BC Sans" w:hAnsi="BC Sans"/>
+                <w:sz w:val="20"/>
+                <w:szCs w:val="20"/>
+                <w:lang w:val="en-CA"/>
+              </w:rPr>
+              <w:t>i</w:t>
+            </w:r>
+            <w:proofErr w:type="spellEnd"/>
+            <w:r>
+              <w:rPr>
+                <w:rFonts w:ascii="BC Sans" w:hAnsi="BC Sans"/>
+                <w:sz w:val="20"/>
+                <w:szCs w:val="20"/>
+                <w:lang w:val="en-CA"/>
+              </w:rPr>
+              <w:t>].</w:t>
+            </w:r>
+            <w:proofErr w:type="spellStart"/>
+            <w:r>
+              <w:rPr>
+                <w:rFonts w:ascii="BC Sans" w:hAnsi="BC Sans"/>
+                <w:sz w:val="20"/>
+                <w:szCs w:val="20"/>
+                <w:lang w:val="en-CA"/>
+              </w:rPr>
+              <w:t>locationOfIntake</w:t>
+            </w:r>
+            <w:proofErr w:type="spellEnd"/>
+            <w:r>
+              <w:rPr>
+                <w:rFonts w:ascii="BC Sans" w:hAnsi="BC Sans"/>
+                <w:sz w:val="20"/>
+                <w:szCs w:val="20"/>
+                <w:lang w:val="en-CA"/>
+              </w:rPr>
+              <w:t>}</w:t>
             </w:r>
           </w:p>
         </w:tc>
@@ -2345,7 +3577,67 @@
                 <w:szCs w:val="20"/>
                 <w:lang w:val="en-CA"/>
               </w:rPr>
-              <w:t>{d.exhibits[i].seizedFromFirstName}</w:t>
+              <w:t>{</w:t>
+            </w:r>
+            <w:proofErr w:type="spellStart"/>
+            <w:r>
+              <w:rPr>
+                <w:rFonts w:ascii="BC Sans" w:hAnsi="BC Sans"/>
+                <w:sz w:val="20"/>
+                <w:szCs w:val="20"/>
+                <w:lang w:val="en-CA"/>
+              </w:rPr>
+              <w:t>d.exhibits</w:t>
+            </w:r>
+            <w:proofErr w:type="spellEnd"/>
+            <w:r>
+              <w:rPr>
+                <w:rFonts w:ascii="BC Sans" w:hAnsi="BC Sans"/>
+                <w:sz w:val="20"/>
+                <w:szCs w:val="20"/>
+                <w:lang w:val="en-CA"/>
+              </w:rPr>
+              <w:t>[</w:t>
+            </w:r>
+            <w:proofErr w:type="spellStart"/>
+            <w:r>
+              <w:rPr>
+                <w:rFonts w:ascii="BC Sans" w:hAnsi="BC Sans"/>
+                <w:sz w:val="20"/>
+                <w:szCs w:val="20"/>
+                <w:lang w:val="en-CA"/>
+              </w:rPr>
+              <w:t>i</w:t>
+            </w:r>
+            <w:proofErr w:type="spellEnd"/>
+            <w:r>
+              <w:rPr>
+                <w:rFonts w:ascii="BC Sans" w:hAnsi="BC Sans"/>
+                <w:sz w:val="20"/>
+                <w:szCs w:val="20"/>
+                <w:lang w:val="en-CA"/>
+              </w:rPr>
+              <w:t>].</w:t>
+            </w:r>
+            <w:proofErr w:type="spellStart"/>
+            <w:r>
+              <w:rPr>
+                <w:rFonts w:ascii="BC Sans" w:hAnsi="BC Sans"/>
+                <w:sz w:val="20"/>
+                <w:szCs w:val="20"/>
+                <w:lang w:val="en-CA"/>
+              </w:rPr>
+              <w:t>seizedFromFirstName</w:t>
+            </w:r>
+            <w:proofErr w:type="spellEnd"/>
+            <w:r>
+              <w:rPr>
+                <w:rFonts w:ascii="BC Sans" w:hAnsi="BC Sans"/>
+                <w:sz w:val="20"/>
+                <w:szCs w:val="20"/>
+                <w:lang w:val="en-CA"/>
+              </w:rPr>
+              <w:t>}</w:t>
             </w:r>
           </w:p>
         </w:tc>
@@ -2414,7 +3706,67 @@
                 <w:szCs w:val="20"/>
                 <w:lang w:val="en-CA"/>
               </w:rPr>
-              <w:t>{d.exhibits[i].seizedFromLastName}</w:t>
+              <w:t>{</w:t>
+            </w:r>
+            <w:proofErr w:type="spellStart"/>
+            <w:r>
+              <w:rPr>
+                <w:rFonts w:ascii="BC Sans" w:hAnsi="BC Sans"/>
+                <w:sz w:val="20"/>
+                <w:szCs w:val="20"/>
+                <w:lang w:val="en-CA"/>
+              </w:rPr>
+              <w:t>d.exhibits</w:t>
+            </w:r>
+            <w:proofErr w:type="spellEnd"/>
+            <w:r>
+              <w:rPr>
+                <w:rFonts w:ascii="BC Sans" w:hAnsi="BC Sans"/>
+                <w:sz w:val="20"/>
+                <w:szCs w:val="20"/>
+                <w:lang w:val="en-CA"/>
+              </w:rPr>
+              <w:t>[</w:t>
+            </w:r>
+            <w:proofErr w:type="spellStart"/>
+            <w:r>
+              <w:rPr>
+                <w:rFonts w:ascii="BC Sans" w:hAnsi="BC Sans"/>
+                <w:sz w:val="20"/>
+                <w:szCs w:val="20"/>
+                <w:lang w:val="en-CA"/>
+              </w:rPr>
+              <w:t>i</w:t>
+            </w:r>
+            <w:proofErr w:type="spellEnd"/>
+            <w:r>
+              <w:rPr>
+                <w:rFonts w:ascii="BC Sans" w:hAnsi="BC Sans"/>
+                <w:sz w:val="20"/>
+                <w:szCs w:val="20"/>
+                <w:lang w:val="en-CA"/>
+              </w:rPr>
+              <w:t>].</w:t>
+            </w:r>
+            <w:proofErr w:type="spellStart"/>
+            <w:r>
+              <w:rPr>
+                <w:rFonts w:ascii="BC Sans" w:hAnsi="BC Sans"/>
+                <w:sz w:val="20"/>
+                <w:szCs w:val="20"/>
+                <w:lang w:val="en-CA"/>
+              </w:rPr>
+              <w:t>seizedFromLastName</w:t>
+            </w:r>
+            <w:proofErr w:type="spellEnd"/>
+            <w:r>
+              <w:rPr>
+                <w:rFonts w:ascii="BC Sans" w:hAnsi="BC Sans"/>
+                <w:sz w:val="20"/>
+                <w:szCs w:val="20"/>
+                <w:lang w:val="en-CA"/>
+              </w:rPr>
+              <w:t>}</w:t>
             </w:r>
           </w:p>
         </w:tc>
@@ -2483,7 +3835,67 @@
                 <w:szCs w:val="20"/>
                 <w:lang w:val="en-CA"/>
               </w:rPr>
-              <w:t>{d.exhibits[i].seizedFromAddress}</w:t>
+              <w:t>{</w:t>
+            </w:r>
+            <w:proofErr w:type="spellStart"/>
+            <w:r>
+              <w:rPr>
+                <w:rFonts w:ascii="BC Sans" w:hAnsi="BC Sans"/>
+                <w:sz w:val="20"/>
+                <w:szCs w:val="20"/>
+                <w:lang w:val="en-CA"/>
+              </w:rPr>
+              <w:t>d.exhibits</w:t>
+            </w:r>
+            <w:proofErr w:type="spellEnd"/>
+            <w:r>
+              <w:rPr>
+                <w:rFonts w:ascii="BC Sans" w:hAnsi="BC Sans"/>
+                <w:sz w:val="20"/>
+                <w:szCs w:val="20"/>
+                <w:lang w:val="en-CA"/>
+              </w:rPr>
+              <w:t>[</w:t>
+            </w:r>
+            <w:proofErr w:type="spellStart"/>
+            <w:r>
+              <w:rPr>
+                <w:rFonts w:ascii="BC Sans" w:hAnsi="BC Sans"/>
+                <w:sz w:val="20"/>
+                <w:szCs w:val="20"/>
+                <w:lang w:val="en-CA"/>
+              </w:rPr>
+              <w:t>i</w:t>
+            </w:r>
+            <w:proofErr w:type="spellEnd"/>
+            <w:r>
+              <w:rPr>
+                <w:rFonts w:ascii="BC Sans" w:hAnsi="BC Sans"/>
+                <w:sz w:val="20"/>
+                <w:szCs w:val="20"/>
+                <w:lang w:val="en-CA"/>
+              </w:rPr>
+              <w:t>].</w:t>
+            </w:r>
+            <w:proofErr w:type="spellStart"/>
+            <w:r>
+              <w:rPr>
+                <w:rFonts w:ascii="BC Sans" w:hAnsi="BC Sans"/>
+                <w:sz w:val="20"/>
+                <w:szCs w:val="20"/>
+                <w:lang w:val="en-CA"/>
+              </w:rPr>
+              <w:t>seizedFromAddress</w:t>
+            </w:r>
+            <w:proofErr w:type="spellEnd"/>
+            <w:r>
+              <w:rPr>
+                <w:rFonts w:ascii="BC Sans" w:hAnsi="BC Sans"/>
+                <w:sz w:val="20"/>
+                <w:szCs w:val="20"/>
+                <w:lang w:val="en-CA"/>
+              </w:rPr>
+              <w:t>}</w:t>
             </w:r>
           </w:p>
         </w:tc>
@@ -2646,7 +4058,16 @@
           <w:sz w:val="20"/>
           <w:szCs w:val="20"/>
         </w:rPr>
-        <w:t>{d.</w:t>
+        <w:t>{</w:t>
+      </w:r>
+      <w:proofErr w:type="spellStart"/>
+      <w:r>
+        <w:rPr>
+          <w:rFonts w:ascii="BC Sans" w:hAnsi="BC Sans"/>
+          <w:sz w:val="20"/>
+          <w:szCs w:val="20"/>
+        </w:rPr>
+        <w:t>d.</w:t>
       </w:r>
       <w:r>
         <w:rPr>
@@ -2656,6 +4077,7 @@
         </w:rPr>
         <w:t>exhibits</w:t>
       </w:r>
+      <w:proofErr w:type="spellEnd"/>
       <w:r>
         <w:rPr>
           <w:rFonts w:ascii="BC Sans" w:hAnsi="BC Sans"/>
@@ -2670,7 +4092,16 @@
           <w:sz w:val="20"/>
           <w:szCs w:val="20"/>
         </w:rPr>
-        <w:t>.exhibit</w:t>
+        <w:t>.</w:t>
+      </w:r>
+      <w:proofErr w:type="spellStart"/>
+      <w:r>
+        <w:rPr>
+          <w:rFonts w:ascii="BC Sans" w:hAnsi="BC Sans"/>
+          <w:sz w:val="20"/>
+          <w:szCs w:val="20"/>
+        </w:rPr>
+        <w:t>exhibit</w:t>
       </w:r>
       <w:r>
         <w:rPr>
@@ -2688,6 +4119,7 @@
         </w:rPr>
         <w:t>Number</w:t>
       </w:r>
+      <w:proofErr w:type="spellEnd"/>
       <w:r>
         <w:rPr>
           <w:rFonts w:ascii="BC Sans" w:hAnsi="BC Sans"/>
@@ -2739,7 +4171,47 @@
                 <w:sz w:val="20"/>
                 <w:szCs w:val="20"/>
               </w:rPr>
-              <w:t>Attachment {d.attachments[i].</w:t>
+              <w:t>Attachment {</w:t>
+            </w:r>
+            <w:proofErr w:type="spellStart"/>
+            <w:r>
+              <w:rPr>
+                <w:rFonts w:ascii="BC Sans" w:hAnsi="BC Sans"/>
+                <w:caps w:val="0"/>
+                <w:sz w:val="20"/>
+                <w:szCs w:val="20"/>
+              </w:rPr>
+              <w:t>d.attachments</w:t>
+            </w:r>
+            <w:proofErr w:type="spellEnd"/>
+            <w:r>
+              <w:rPr>
+                <w:rFonts w:ascii="BC Sans" w:hAnsi="BC Sans"/>
+                <w:caps w:val="0"/>
+                <w:sz w:val="20"/>
+                <w:szCs w:val="20"/>
+              </w:rPr>
+              <w:t>[</w:t>
+            </w:r>
+            <w:proofErr w:type="spellStart"/>
+            <w:r>
+              <w:rPr>
+                <w:rFonts w:ascii="BC Sans" w:hAnsi="BC Sans"/>
+                <w:caps w:val="0"/>
+                <w:sz w:val="20"/>
+                <w:szCs w:val="20"/>
+              </w:rPr>
+              <w:t>i</w:t>
+            </w:r>
+            <w:proofErr w:type="spellEnd"/>
+            <w:r>
+              <w:rPr>
+                <w:rFonts w:ascii="BC Sans" w:hAnsi="BC Sans"/>
+                <w:caps w:val="0"/>
+                <w:sz w:val="20"/>
+                <w:szCs w:val="20"/>
+              </w:rPr>
+              <w:t>].</w:t>
             </w:r>
             <w:r>
               <w:rPr>
@@ -2821,7 +4293,67 @@
                 <w:szCs w:val="20"/>
                 <w:lang w:val="en-CA"/>
               </w:rPr>
-              <w:t>{d.attachments[i].fileType}</w:t>
+              <w:t>{</w:t>
+            </w:r>
+            <w:proofErr w:type="spellStart"/>
+            <w:r>
+              <w:rPr>
+                <w:rFonts w:ascii="BC Sans" w:hAnsi="BC Sans"/>
+                <w:sz w:val="20"/>
+                <w:szCs w:val="20"/>
+                <w:lang w:val="en-CA"/>
+              </w:rPr>
+              <w:t>d.attachments</w:t>
+            </w:r>
+            <w:proofErr w:type="spellEnd"/>
+            <w:r>
+              <w:rPr>
+                <w:rFonts w:ascii="BC Sans" w:hAnsi="BC Sans"/>
+                <w:sz w:val="20"/>
+                <w:szCs w:val="20"/>
+                <w:lang w:val="en-CA"/>
+              </w:rPr>
+              <w:t>[</w:t>
+            </w:r>
+            <w:proofErr w:type="spellStart"/>
+            <w:r>
+              <w:rPr>
+                <w:rFonts w:ascii="BC Sans" w:hAnsi="BC Sans"/>
+                <w:sz w:val="20"/>
+                <w:szCs w:val="20"/>
+                <w:lang w:val="en-CA"/>
+              </w:rPr>
+              <w:t>i</w:t>
+            </w:r>
+            <w:proofErr w:type="spellEnd"/>
+            <w:r>
+              <w:rPr>
+                <w:rFonts w:ascii="BC Sans" w:hAnsi="BC Sans"/>
+                <w:sz w:val="20"/>
+                <w:szCs w:val="20"/>
+                <w:lang w:val="en-CA"/>
+              </w:rPr>
+              <w:t>].</w:t>
+            </w:r>
+            <w:proofErr w:type="spellStart"/>
+            <w:r>
+              <w:rPr>
+                <w:rFonts w:ascii="BC Sans" w:hAnsi="BC Sans"/>
+                <w:sz w:val="20"/>
+                <w:szCs w:val="20"/>
+                <w:lang w:val="en-CA"/>
+              </w:rPr>
+              <w:t>fileType</w:t>
+            </w:r>
+            <w:proofErr w:type="spellEnd"/>
+            <w:r>
+              <w:rPr>
+                <w:rFonts w:ascii="BC Sans" w:hAnsi="BC Sans"/>
+                <w:sz w:val="20"/>
+                <w:szCs w:val="20"/>
+                <w:lang w:val="en-CA"/>
+              </w:rPr>
+              <w:t>}</w:t>
             </w:r>
           </w:p>
         </w:tc>
@@ -2891,7 +4423,67 @@
                 <w:szCs w:val="20"/>
                 <w:lang w:val="en-CA"/>
               </w:rPr>
-              <w:t>{d.attachments[i].sequenceNumber}</w:t>
+              <w:t>{</w:t>
+            </w:r>
+            <w:proofErr w:type="spellStart"/>
+            <w:r>
+              <w:rPr>
+                <w:rFonts w:ascii="BC Sans" w:hAnsi="BC Sans"/>
+                <w:sz w:val="20"/>
+                <w:szCs w:val="20"/>
+                <w:lang w:val="en-CA"/>
+              </w:rPr>
+              <w:t>d.attachments</w:t>
+            </w:r>
+            <w:proofErr w:type="spellEnd"/>
+            <w:r>
+              <w:rPr>
+                <w:rFonts w:ascii="BC Sans" w:hAnsi="BC Sans"/>
+                <w:sz w:val="20"/>
+                <w:szCs w:val="20"/>
+                <w:lang w:val="en-CA"/>
+              </w:rPr>
+              <w:t>[</w:t>
+            </w:r>
+            <w:proofErr w:type="spellStart"/>
+            <w:r>
+              <w:rPr>
+                <w:rFonts w:ascii="BC Sans" w:hAnsi="BC Sans"/>
+                <w:sz w:val="20"/>
+                <w:szCs w:val="20"/>
+                <w:lang w:val="en-CA"/>
+              </w:rPr>
+              <w:t>i</w:t>
+            </w:r>
+            <w:proofErr w:type="spellEnd"/>
+            <w:r>
+              <w:rPr>
+                <w:rFonts w:ascii="BC Sans" w:hAnsi="BC Sans"/>
+                <w:sz w:val="20"/>
+                <w:szCs w:val="20"/>
+                <w:lang w:val="en-CA"/>
+              </w:rPr>
+              <w:t>].</w:t>
+            </w:r>
+            <w:proofErr w:type="spellStart"/>
+            <w:r>
+              <w:rPr>
+                <w:rFonts w:ascii="BC Sans" w:hAnsi="BC Sans"/>
+                <w:sz w:val="20"/>
+                <w:szCs w:val="20"/>
+                <w:lang w:val="en-CA"/>
+              </w:rPr>
+              <w:t>sequenceNumber</w:t>
+            </w:r>
+            <w:proofErr w:type="spellEnd"/>
+            <w:r>
+              <w:rPr>
+                <w:rFonts w:ascii="BC Sans" w:hAnsi="BC Sans"/>
+                <w:sz w:val="20"/>
+                <w:szCs w:val="20"/>
+                <w:lang w:val="en-CA"/>
+              </w:rPr>
+              <w:t>}</w:t>
             </w:r>
           </w:p>
         </w:tc>
@@ -2955,7 +4547,47 @@
                 <w:szCs w:val="20"/>
                 <w:lang w:val="en-CA"/>
               </w:rPr>
-              <w:t>{d.attachments[i].description}</w:t>
+              <w:t>{</w:t>
+            </w:r>
+            <w:proofErr w:type="spellStart"/>
+            <w:r>
+              <w:rPr>
+                <w:rFonts w:ascii="BC Sans" w:hAnsi="BC Sans"/>
+                <w:sz w:val="20"/>
+                <w:szCs w:val="20"/>
+                <w:lang w:val="en-CA"/>
+              </w:rPr>
+              <w:t>d.attachments</w:t>
+            </w:r>
+            <w:proofErr w:type="spellEnd"/>
+            <w:r>
+              <w:rPr>
+                <w:rFonts w:ascii="BC Sans" w:hAnsi="BC Sans"/>
+                <w:sz w:val="20"/>
+                <w:szCs w:val="20"/>
+                <w:lang w:val="en-CA"/>
+              </w:rPr>
+              <w:t>[</w:t>
+            </w:r>
+            <w:proofErr w:type="spellStart"/>
+            <w:r>
+              <w:rPr>
+                <w:rFonts w:ascii="BC Sans" w:hAnsi="BC Sans"/>
+                <w:sz w:val="20"/>
+                <w:szCs w:val="20"/>
+                <w:lang w:val="en-CA"/>
+              </w:rPr>
+              <w:t>i</w:t>
+            </w:r>
+            <w:proofErr w:type="spellEnd"/>
+            <w:r>
+              <w:rPr>
+                <w:rFonts w:ascii="BC Sans" w:hAnsi="BC Sans"/>
+                <w:sz w:val="20"/>
+                <w:szCs w:val="20"/>
+                <w:lang w:val="en-CA"/>
+              </w:rPr>
+              <w:t>].description}</w:t>
             </w:r>
           </w:p>
         </w:tc>
@@ -3018,7 +4650,47 @@
                 <w:szCs w:val="20"/>
                 <w:lang w:val="en-CA"/>
               </w:rPr>
-              <w:t>{d.attachments[i].title}</w:t>
+              <w:t>{</w:t>
+            </w:r>
+            <w:proofErr w:type="spellStart"/>
+            <w:r>
+              <w:rPr>
+                <w:rFonts w:ascii="BC Sans" w:hAnsi="BC Sans"/>
+                <w:sz w:val="20"/>
+                <w:szCs w:val="20"/>
+                <w:lang w:val="en-CA"/>
+              </w:rPr>
+              <w:t>d.attachments</w:t>
+            </w:r>
+            <w:proofErr w:type="spellEnd"/>
+            <w:r>
+              <w:rPr>
+                <w:rFonts w:ascii="BC Sans" w:hAnsi="BC Sans"/>
+                <w:sz w:val="20"/>
+                <w:szCs w:val="20"/>
+                <w:lang w:val="en-CA"/>
+              </w:rPr>
+              <w:t>[</w:t>
+            </w:r>
+            <w:proofErr w:type="spellStart"/>
+            <w:r>
+              <w:rPr>
+                <w:rFonts w:ascii="BC Sans" w:hAnsi="BC Sans"/>
+                <w:sz w:val="20"/>
+                <w:szCs w:val="20"/>
+                <w:lang w:val="en-CA"/>
+              </w:rPr>
+              <w:t>i</w:t>
+            </w:r>
+            <w:proofErr w:type="spellEnd"/>
+            <w:r>
+              <w:rPr>
+                <w:rFonts w:ascii="BC Sans" w:hAnsi="BC Sans"/>
+                <w:sz w:val="20"/>
+                <w:szCs w:val="20"/>
+                <w:lang w:val="en-CA"/>
+              </w:rPr>
+              <w:t>].title}</w:t>
             </w:r>
           </w:p>
         </w:tc>
@@ -3150,7 +4822,57 @@
                 <w:szCs w:val="20"/>
                 <w:lang w:val="en-CA"/>
               </w:rPr>
-              <w:t>{d.attachments[i].takenBy</w:t>
+              <w:t>{</w:t>
+            </w:r>
+            <w:proofErr w:type="spellStart"/>
+            <w:r>
+              <w:rPr>
+                <w:rFonts w:ascii="BC Sans" w:hAnsi="BC Sans"/>
+                <w:sz w:val="20"/>
+                <w:szCs w:val="20"/>
+                <w:lang w:val="en-CA"/>
+              </w:rPr>
+              <w:t>d.attachments</w:t>
+            </w:r>
+            <w:proofErr w:type="spellEnd"/>
+            <w:r>
+              <w:rPr>
+                <w:rFonts w:ascii="BC Sans" w:hAnsi="BC Sans"/>
+                <w:sz w:val="20"/>
+                <w:szCs w:val="20"/>
+                <w:lang w:val="en-CA"/>
+              </w:rPr>
+              <w:t>[</w:t>
+            </w:r>
+            <w:proofErr w:type="spellStart"/>
+            <w:r>
+              <w:rPr>
+                <w:rFonts w:ascii="BC Sans" w:hAnsi="BC Sans"/>
+                <w:sz w:val="20"/>
+                <w:szCs w:val="20"/>
+                <w:lang w:val="en-CA"/>
+              </w:rPr>
+              <w:t>i</w:t>
+            </w:r>
+            <w:proofErr w:type="spellEnd"/>
+            <w:r>
+              <w:rPr>
+                <w:rFonts w:ascii="BC Sans" w:hAnsi="BC Sans"/>
+                <w:sz w:val="20"/>
+                <w:szCs w:val="20"/>
+                <w:lang w:val="en-CA"/>
+              </w:rPr>
+              <w:t>].</w:t>
+            </w:r>
+            <w:proofErr w:type="spellStart"/>
+            <w:r>
+              <w:rPr>
+                <w:rFonts w:ascii="BC Sans" w:hAnsi="BC Sans"/>
+                <w:sz w:val="20"/>
+                <w:szCs w:val="20"/>
+                <w:lang w:val="en-CA"/>
+              </w:rPr>
+              <w:t>takenBy</w:t>
             </w:r>
             <w:r>
               <w:rPr>
@@ -3161,6 +4883,7 @@
               </w:rPr>
               <w:t>.lastName</w:t>
             </w:r>
+            <w:proofErr w:type="spellEnd"/>
             <w:r>
               <w:rPr>
                 <w:rFonts w:ascii="BC Sans" w:hAnsi="BC Sans"/>
@@ -3241,7 +4964,85 @@
                 <w:szCs w:val="20"/>
                 <w:lang w:val="en-CA"/>
               </w:rPr>
-              <w:t>{d.attachments[i].takenBy.lastName:hideEnd}</w:t>
+              <w:t>{</w:t>
+            </w:r>
+            <w:proofErr w:type="spellStart"/>
+            <w:r>
+              <w:rPr>
+                <w:rFonts w:ascii="BC Sans" w:hAnsi="BC Sans"/>
+                <w:b w:val="0"/>
+                <w:bCs w:val="0"/>
+                <w:caps w:val="0"/>
+                <w:sz w:val="20"/>
+                <w:szCs w:val="20"/>
+                <w:lang w:val="en-CA"/>
+              </w:rPr>
+              <w:t>d.attachments</w:t>
+            </w:r>
+            <w:proofErr w:type="spellEnd"/>
+            <w:r>
+              <w:rPr>
+                <w:rFonts w:ascii="BC Sans" w:hAnsi="BC Sans"/>
+                <w:b w:val="0"/>
+                <w:bCs w:val="0"/>
+                <w:caps w:val="0"/>
+                <w:sz w:val="20"/>
+                <w:szCs w:val="20"/>
+                <w:lang w:val="en-CA"/>
+              </w:rPr>
+              <w:t>[</w:t>
+            </w:r>
+            <w:proofErr w:type="spellStart"/>
+            <w:r>
+              <w:rPr>
+                <w:rFonts w:ascii="BC Sans" w:hAnsi="BC Sans"/>
+                <w:b w:val="0"/>
+                <w:bCs w:val="0"/>
+                <w:caps w:val="0"/>
+                <w:sz w:val="20"/>
+                <w:szCs w:val="20"/>
+                <w:lang w:val="en-CA"/>
+              </w:rPr>
+              <w:t>i</w:t>
+            </w:r>
+            <w:proofErr w:type="spellEnd"/>
+            <w:r>
+              <w:rPr>
+                <w:rFonts w:ascii="BC Sans" w:hAnsi="BC Sans"/>
+                <w:b w:val="0"/>
+                <w:bCs w:val="0"/>
+                <w:caps w:val="0"/>
+                <w:sz w:val="20"/>
+                <w:szCs w:val="20"/>
+                <w:lang w:val="en-CA"/>
+              </w:rPr>
+              <w:t>].</w:t>
+            </w:r>
+            <w:proofErr w:type="spellStart"/>
+            <w:r>
+              <w:rPr>
+                <w:rFonts w:ascii="BC Sans" w:hAnsi="BC Sans"/>
+                <w:b w:val="0"/>
+                <w:bCs w:val="0"/>
+                <w:caps w:val="0"/>
+                <w:sz w:val="20"/>
+                <w:szCs w:val="20"/>
+                <w:lang w:val="en-CA"/>
+              </w:rPr>
+              <w:t>takenBy.lastName:hideEnd</w:t>
+            </w:r>
+            <w:proofErr w:type="spellEnd"/>
+            <w:r>
+              <w:rPr>
+                <w:rFonts w:ascii="BC Sans" w:hAnsi="BC Sans"/>
+                <w:b w:val="0"/>
+                <w:bCs w:val="0"/>
+                <w:caps w:val="0"/>
+                <w:sz w:val="20"/>
+                <w:szCs w:val="20"/>
+                <w:lang w:val="en-CA"/>
+              </w:rPr>
+              <w:t>}</w:t>
             </w:r>
             <w:r>
               <w:rPr>
@@ -3355,7 +5156,16 @@
           <w:sz w:val="20"/>
           <w:szCs w:val="20"/>
         </w:rPr>
-        <w:t>{d.</w:t>
+        <w:t>{</w:t>
+      </w:r>
+      <w:proofErr w:type="spellStart"/>
+      <w:r>
+        <w:rPr>
+          <w:rFonts w:ascii="BC Sans" w:hAnsi="BC Sans"/>
+          <w:sz w:val="20"/>
+          <w:szCs w:val="20"/>
+        </w:rPr>
+        <w:t>d.</w:t>
       </w:r>
       <w:r>
         <w:rPr>
@@ -3365,6 +5175,7 @@
         </w:rPr>
         <w:t>attachments</w:t>
       </w:r>
+      <w:proofErr w:type="spellEnd"/>
       <w:r>
         <w:rPr>
           <w:rFonts w:ascii="BC Sans" w:hAnsi="BC Sans"/>
@@ -3660,6 +5471,7 @@
             </w:rPr>
             <w:t>Report printed on {</w:t>
           </w:r>
+          <w:proofErr w:type="spellStart"/>
           <w:r>
             <w:rPr>
               <w:rFonts w:ascii="BC Sans" w:eastAsia="BC Sans" w:hAnsi="BC Sans" w:cs="BC Sans"/>
@@ -3684,6 +5496,7 @@
             </w:rPr>
             <w:t>generatedOn</w:t>
           </w:r>
+          <w:proofErr w:type="spellEnd"/>
           <w:r>
             <w:rPr>
               <w:rFonts w:ascii="BC Sans" w:eastAsia="BC Sans" w:hAnsi="BC Sans" w:cs="BC Sans"/>
@@ -5228,15 +7041,6 @@
 </file>
 
 <file path=customXml/item2.xml><?xml version="1.0" encoding="utf-8"?>
-<?mso-contentType ?>
-<FormTemplates xmlns="http://schemas.microsoft.com/sharepoint/v3/contenttype/forms">
-  <Display>DocumentLibraryForm</Display>
-  <Edit>DocumentLibraryForm</Edit>
-  <New>DocumentLibraryForm</New>
-</FormTemplates>
-</file>
-
-<file path=customXml/item3.xml><?xml version="1.0" encoding="utf-8"?>
 <ct:contentTypeSchema xmlns:ct="http://schemas.microsoft.com/office/2006/metadata/contentType" xmlns:ma="http://schemas.microsoft.com/office/2006/metadata/properties/metaAttributes" ct:_="" ma:_="" ma:contentTypeName="Document" ma:contentTypeID="0x010100ED0089B3ED392A4CB3C10705735CFAD3" ma:contentTypeVersion="15" ma:contentTypeDescription="Create a new document." ma:contentTypeScope="" ma:versionID="e9715c4352d5d9c94cf397f6db7911f6">
   <xsd:schema xmlns:xsd="http://www.w3.org/2001/XMLSchema" xmlns:xs="http://www.w3.org/2001/XMLSchema" xmlns:p="http://schemas.microsoft.com/office/2006/metadata/properties" xmlns:ns2="aa9c99c1-69c1-4b58-9df5-4d4796c46f8a" xmlns:ns3="cbeac988-4fd5-47cf-ad03-89cc7678fa90" targetNamespace="http://schemas.microsoft.com/office/2006/metadata/properties" ma:root="true" ma:fieldsID="4a7b24a40f906d6832371abf7aef78d6" ns2:_="" ns3:_="">
     <xsd:import namespace="aa9c99c1-69c1-4b58-9df5-4d4796c46f8a"/>
@@ -5471,6 +7275,15 @@
 </ct:contentTypeSchema>
 </file>
 
+<file path=customXml/item3.xml><?xml version="1.0" encoding="utf-8"?>
+<?mso-contentType ?>
+<FormTemplates xmlns="http://schemas.microsoft.com/sharepoint/v3/contenttype/forms">
+  <Display>DocumentLibraryForm</Display>
+  <Edit>DocumentLibraryForm</Edit>
+  <New>DocumentLibraryForm</New>
+</FormTemplates>
+</file>
+
 <file path=customXml/itemProps1.xml><?xml version="1.0" encoding="utf-8"?>
 <ds:datastoreItem xmlns:ds="http://schemas.openxmlformats.org/officeDocument/2006/customXml" ds:itemID="{C6C5DCE0-D69C-4B6E-96D9-C69B23DE6D4A}">
   <ds:schemaRefs>
@@ -5483,14 +7296,6 @@
 </file>
 
 <file path=customXml/itemProps2.xml><?xml version="1.0" encoding="utf-8"?>
-<ds:datastoreItem xmlns:ds="http://schemas.openxmlformats.org/officeDocument/2006/customXml" ds:itemID="{4BECF9F2-3A10-48CC-8D31-4F6E8664527E}">
-  <ds:schemaRefs>
-    <ds:schemaRef ds:uri="http://schemas.microsoft.com/sharepoint/v3/contenttype/forms"/>
-  </ds:schemaRefs>
-</ds:datastoreItem>
-</file>
-
-<file path=customXml/itemProps3.xml><?xml version="1.0" encoding="utf-8"?>
 <ds:datastoreItem xmlns:ds="http://schemas.openxmlformats.org/officeDocument/2006/customXml" ds:itemID="{26FF9410-7F49-4DD5-9478-D670A139DF54}">
   <ds:schemaRefs>
     <ds:schemaRef ds:uri="http://schemas.microsoft.com/office/2006/metadata/contentType"/>
@@ -5507,4 +7312,12 @@
     <ds:schemaRef ds:uri="http://schemas.microsoft.com/internal/obd"/>
   </ds:schemaRefs>
 </ds:datastoreItem>
+</file>
+
+<file path=customXml/itemProps3.xml><?xml version="1.0" encoding="utf-8"?>
+<ds:datastoreItem xmlns:ds="http://schemas.openxmlformats.org/officeDocument/2006/customXml" ds:itemID="{4BECF9F2-3A10-48CC-8D31-4F6E8664527E}">
+  <ds:schemaRefs>
+    <ds:schemaRef ds:uri="http://schemas.microsoft.com/sharepoint/v3/contenttype/forms"/>
+  </ds:schemaRefs>
+</ds:datastoreItem>
 </file>
</xml_diff>